<commit_message>
docs: deepen v20 study script
</commit_message>
<xml_diff>
--- a/docs/studienskripte/word-rohfassungen/wirkungscontrolling-wc-v1.docx
+++ b/docs/studienskripte/word-rohfassungen/wirkungscontrolling-wc-v1.docx
@@ -29,47 +29,7 @@
     </w:p>
     <w:p>
       <w:r>
-        <w:t>Track: Impact-Controlling</w:t>
-      </w:r>
-    </w:p>
-    <w:p>
-      <w:r>
-        <w:t>Kurscode: wirkungscontrolling</w:t>
-      </w:r>
-    </w:p>
-    <w:p>
-      <w:r>
-        <w:t>Vorlesungscode: WC-V1</w:t>
-      </w:r>
-    </w:p>
-    <w:p>
-      <w:r>
-        <w:t>Modul/Abschnitt: WC</w:t>
-      </w:r>
-    </w:p>
-    <w:p>
-      <w:r>
-        <w:t>Titel: Von KPI zu KII und der Kennzahlen-Stack</w:t>
-      </w:r>
-    </w:p>
-    <w:p>
-      <w:r>
-        <w:t>Status: Rohfassung V0 · Sprint-Produktionslauf · muss im nächsten Tiefensprint auf 40-50 Seiten erweitert werden</w:t>
-      </w:r>
-    </w:p>
-    <w:p>
-      <w:r>
-        <w:t>Quelle: woek-akademie-app/docs/lehrgaenge/wirkungscontrolling-v1-kpi-zu-kii-kennzahlenstack.md</w:t>
-      </w:r>
-    </w:p>
-    <w:p>
-      <w:r>
-        <w:t>Ablage: Markdown-Master in content/studienskripte/wirkungscontrolling-wc-v1.md, Word-Rohfassung in docs/studienskripte/word-rohfassungen/wirkungscontrolling-wc-v1.docx</w:t>
-      </w:r>
-    </w:p>
-    <w:p>
-      <w:r>
-        <w:t>Wissensbasis: aktuelles Grundlagenwerk, Website-Korpus inklusive Journal, Akademie-Quelltexte, Glossar, interne Dossiers und externe Fachquellen</w:t>
+        <w:t>Track: Impact-Controlling Kurscode: wirkungscontrolling Vorlesungscode: WC-V1 Modul/Abschnitt: WC Titel: Von KPI zu KII und der Kennzahlen-Stack Status: Rohfassung V0 · Sprint-Produktionslauf · muss im nächsten Tiefensprint auf 40-50 Seiten erweitert werden Quelle: woek-akademie-app/docs/lehrgaenge/wirkungscontrolling-v1-kpi-zu-kii-kennzahlenstack.md Ablage: Markdown-Master in content/studienskripte/wirkungscontrolling-wc-v1.md, Word-Rohfassung in docs/studienskripte/word-rohfassungen/wirkungscontrolling-wc-v1.docx Wissensbasis: aktuelles Grundlagenwerk, Website-Korpus inklusive Journal, Akademie-Quelltexte, Glossar, interne Dossiers und externe Fachquellen</w:t>
       </w:r>
     </w:p>
     <w:p>
@@ -171,27 +131,7 @@
     </w:p>
     <w:p>
       <w:r>
-        <w:t>Track / Kurscode: wirkungscontrolling</w:t>
-      </w:r>
-    </w:p>
-    <w:p>
-      <w:r>
-        <w:t>Vorlesungscode: WC-V1</w:t>
-      </w:r>
-    </w:p>
-    <w:p>
-      <w:r>
-        <w:t>Empfohlene Dauer: ~50 Min · Videolänge: ~15 Min</w:t>
-      </w:r>
-    </w:p>
-    <w:p>
-      <w:r>
-        <w:t>Voraussetzung: Grundlagenlehrgang; empfohlen Wirkungsmanagement (L1)</w:t>
-      </w:r>
-    </w:p>
-    <w:p>
-      <w:r>
-        <w:t>Führende Quellen (Repo): docs/whitepaper/T-SROI_v2.0_Transformationswirkung.md (Teil 2) · docs/grundlagen/Wirkungsoekonomie_Kurzfassung_v1.1.md · Glossar begriffe/</w:t>
+        <w:t>Track / Kurscode: wirkungscontrolling Vorlesungscode: WC-V1 Empfohlene Dauer: ~50 Min · Videolänge: ~15 Min Voraussetzung: Grundlagenlehrgang; empfohlen Wirkungsmanagement (L1) Führende Quellen (Repo): docs/whitepaper/T-SROI_v2.0_Transformationswirkung.md (Teil 2) · docs/grundlagen/Wirkungsoekonomie_Kurzfassung_v1.1.md · Glossar begriffe/</w:t>
       </w:r>
     </w:p>
     <w:p>
@@ -1451,42 +1391,7 @@
     </w:p>
     <w:p>
       <w:r>
-        <w:t>```chart-spec</w:t>
-      </w:r>
-    </w:p>
-    <w:p>
-      <w:r>
-        <w:t>slug: wirkungscontrolling-wc-v1-wirkpfad</w:t>
-      </w:r>
-    </w:p>
-    <w:p>
-      <w:r>
-        <w:t>type: wirkpfad</w:t>
-      </w:r>
-    </w:p>
-    <w:p>
-      <w:r>
-        <w:t>reuse_first: true</w:t>
-      </w:r>
-    </w:p>
-    <w:p>
-      <w:r>
-        <w:t>preferred_asset: content/studienskripte/assets/wirkungscontrolling-wc-v1/wirkungscontrolling-wc-v1-wirkpfad.svg</w:t>
-      </w:r>
-    </w:p>
-    <w:p>
-      <w:r>
-        <w:t>message: Von KPI zu KII und der Kennzahlen-Stack wird als Wirkpfad von Auslöser über Mechanismus, Wirkungsempfänger und Zustandsveränderung bis zur Rückkopplung dargestellt.</w:t>
-      </w:r>
-    </w:p>
-    <w:p>
-      <w:r>
-        <w:t>source: WÖk-Grundlagenwerk, Website-Korpus, Akademie-Quelltexte, Glossar</w:t>
-      </w:r>
-    </w:p>
-    <w:p>
-      <w:r>
-        <w:t>```</w:t>
+        <w:t>``chart-spec slug: wirkungscontrolling-wc-v1-wirkpfad type: wirkpfad reuse_first: true preferred_asset: content/studienskripte/assets/wirkungscontrolling-wc-v1/wirkungscontrolling-wc-v1-wirkpfad.svg message: Von KPI zu KII und der Kennzahlen-Stack wird als Wirkpfad von Auslöser über Mechanismus, Wirkungsempfänger und Zustandsveränderung bis zur Rückkopplung dargestellt. source: WÖk-Grundlagenwerk, Website-Korpus, Akademie-Quelltexte, Glossar ``</w:t>
       </w:r>
     </w:p>
     <w:p>

</xml_diff>

<commit_message>
docs: deepen wm wc study scripts
</commit_message>
<xml_diff>
--- a/docs/studienskripte/word-rohfassungen/wirkungscontrolling-wc-v1.docx
+++ b/docs/studienskripte/word-rohfassungen/wirkungscontrolling-wc-v1.docx
@@ -29,7 +29,7 @@
     </w:p>
     <w:p>
       <w:r>
-        <w:t>Track: Impact-Controlling Kurscode: wirkungscontrolling Vorlesungscode: WC-V1 Modul/Abschnitt: WC Titel: Von KPI zu KII und der Kennzahlen-Stack Status: Rohfassung V0 · Sprint-Produktionslauf · muss im nächsten Tiefensprint auf 40-50 Seiten erweitert werden Quelle: woek-akademie-app/docs/lehrgaenge/wirkungscontrolling-v1-kpi-zu-kii-kennzahlenstack.md Ablage: Markdown-Master in content/studienskripte/wirkungscontrolling-wc-v1.md, Word-Rohfassung in docs/studienskripte/word-rohfassungen/wirkungscontrolling-wc-v1.docx Wissensbasis: aktuelles Grundlagenwerk, Website-Korpus inklusive Journal, Akademie-Quelltexte, Glossar, interne Dossiers und externe Fachquellen</w:t>
+        <w:t>Track: Impact-Controlling Kurscode: wirkungscontrolling Vorlesungscode: WC-V1 Modul/Abschnitt: WC Titel: Von KPI zu KII und der Kennzahlen-Stack Status: Tiefenskript-Sprint 9 · substanzielle Arbeitsfassung, Claude-CI/CD-Finalisierung offen Quelle: woek-akademie-app/docs/lehrgaenge/wirkungscontrolling-v1-kpi-zu-kii-kennzahlenstack.md Ablage: Markdown-Master in content/studienskripte/wirkungscontrolling-wc-v1.md, Word-Rohfassung in docs/studienskripte/word-rohfassungen/wirkungscontrolling-wc-v1.docx Wissensbasis: aktuelles Grundlagenwerk, Website-Korpus inklusive Journal, Akademie-Quelltexte, Glossar, interne Dossiers und externe Fachquellen</w:t>
       </w:r>
     </w:p>
     <w:p>
@@ -1835,17 +1835,1892 @@
         <w:pStyle w:val="Heading2"/>
       </w:pPr>
       <w:r>
-        <w:t>7. Prüfungsrelevanz</w:t>
-      </w:r>
-    </w:p>
-    <w:p>
-      <w:r>
-        <w:t>Diese Vorlesung ist prüfungsrelevant, aber die eigentliche Antwortlogik gehört nicht in das öffentliche Studienskript. Zertifikatsfragen, CorrectAnswer, Scoring-Regeln und Fallrubrics werden separat in der geschützten App-Lane unter woek-akademie-app/content/pruefungen/ gepflegt.</w:t>
-      </w:r>
-    </w:p>
-    <w:p>
-      <w:r>
-        <w:t>Für den Fragenpool sind besonders geeignet:</w:t>
+        <w:t>7. Tiefenskript-Erweiterung Sprint 9</w:t>
+      </w:r>
+    </w:p>
+    <w:p>
+      <w:r>
+        <w:t>Status dieser Erweiterung: ausgebaute Arbeitsfassung für Claude-CI/CD, Word-Rohfassung und Reader-Spiegel. Sie ersetzt noch nicht die spätere Satz-, Quellen- und PDF-Finalisierung, bringt die Vorlesung aber aus der Kurzfassung in eine substanzielle Studienskriptfassung.</w:t>
+      </w:r>
+    </w:p>
+    <w:p>
+      <w:pPr>
+        <w:pStyle w:val="Heading3"/>
+      </w:pPr>
+      <w:r>
+        <w:t>7.1 Leitthese</w:t>
+      </w:r>
+    </w:p>
+    <w:p>
+      <w:r>
+        <w:t>Von KPI zu KII und der Kennzahlen-Stack macht die WÖk prüfbar: Impact-Controlling übersetzt Wirkungslogik in Indikatoren, Datenqualität, Bewertungsprofile, Audits und Steuerungsentscheidungen.</w:t>
+      </w:r>
+    </w:p>
+    <w:p>
+      <w:r>
+        <w:t>Die Vorlesung bleibt dabei an die Grundregel gebunden: Wirkung ist neutral und relational. Erst die Bewertung im Referenzrahmen Mensch, Planet, Demokratie, SDGs, Agenda 2030 und SDG+ entscheidet, ob eine Veränderung positiv, negativ oder ambivalent einzuordnen ist. Wenn eine Zielgröße gemeint ist, sprechen wir von positiver Netto-Wirkung.</w:t>
+      </w:r>
+    </w:p>
+    <w:p>
+      <w:pPr>
+        <w:pStyle w:val="Heading3"/>
+      </w:pPr>
+      <w:r>
+        <w:t>7.2 Didaktische Einordnung im Studiengang</w:t>
+      </w:r>
+    </w:p>
+    <w:p>
+      <w:r>
+        <w:t>WC-V1 liegt an der Schwelle zwischen begrifflicher Grundlegung und Bewertungsarchitektur. Die Studierenden sollen nicht nur Begriffe wiedergeben, sondern an Fällen erkennen, welche Aussage schon Wirkung behauptet, welche nur Wirkungspotenzial beschreibt und wo ein Wirkungsrisiko offenliegt. Der Tiefensinn dieser Vorlesung liegt deshalb nicht in zusätzlicher Komplexität, sondern in besserer Unterscheidungsfähigkeit.</w:t>
+      </w:r>
+    </w:p>
+    <w:p>
+      <w:r>
+        <w:t>Für die spätere Praxis ist entscheidend, dass jede Analyse vier Ebenen getrennt hält:</w:t>
+      </w:r>
+    </w:p>
+    <w:p>
+      <w:r>
+        <w:t>1. Beschreibung: Was geschieht tatsächlich oder soll geschehen?</w:t>
+      </w:r>
+    </w:p>
+    <w:p>
+      <w:r>
+        <w:t>2. Kausalannahme: Über welchen Mechanismus könnte daraus eine Zustandsveränderung entstehen?</w:t>
+      </w:r>
+    </w:p>
+    <w:p>
+      <w:r>
+        <w:t>3. Bewertung: Welche Richtung hat diese Veränderung im Referenzrahmen?</w:t>
+      </w:r>
+    </w:p>
+    <w:p>
+      <w:r>
+        <w:t>4. Rückkopplung: Welche Entscheidung, Regel, Ressource oder Kommunikation wird dadurch verändert?</w:t>
+      </w:r>
+    </w:p>
+    <w:p>
+      <w:r>
+        <w:t>Wo diese Ebenen vermischt werden, entstehen typische WÖk-Fehler: Aktivität wird als Wirkung ausgegeben, Reichweite ersetzt Zustandsveränderung, gute Absicht verdeckt Nebenwirkungen oder Reporting wird mit Lernen verwechselt.</w:t>
+      </w:r>
+    </w:p>
+    <w:p>
+      <w:pPr>
+        <w:pStyle w:val="Heading3"/>
+      </w:pPr>
+      <w:r>
+        <w:t>7.3 Analysemodell</w:t>
+      </w:r>
+    </w:p>
+    <w:tbl>
+      <w:tblPr>
+        <w:tblStyle w:val="TableGrid"/>
+        <w:tblW w:type="auto" w:w="0"/>
+        <w:jc w:val="left"/>
+        <w:tblLook w:firstColumn="1" w:firstRow="1" w:lastColumn="0" w:lastRow="0" w:noHBand="0" w:noVBand="1" w:val="04A0"/>
+      </w:tblPr>
+      <w:tblGrid>
+        <w:gridCol w:w="2340"/>
+        <w:gridCol w:w="2340"/>
+        <w:gridCol w:w="2340"/>
+        <w:gridCol w:w="2340"/>
+      </w:tblGrid>
+      <w:tr>
+        <w:tc>
+          <w:tcPr>
+            <w:tcW w:type="dxa" w:w="2340"/>
+            <w:vAlign w:val="center"/>
+          </w:tcPr>
+          <w:p>
+            <w:r>
+              <w:rPr>
+                <w:b/>
+              </w:rPr>
+              <w:t>Analyseobjekt</w:t>
+            </w:r>
+          </w:p>
+        </w:tc>
+        <w:tc>
+          <w:tcPr>
+            <w:tcW w:type="dxa" w:w="2340"/>
+            <w:vAlign w:val="center"/>
+          </w:tcPr>
+          <w:p>
+            <w:r>
+              <w:rPr>
+                <w:b/>
+              </w:rPr>
+              <w:t>Woran es wirkt</w:t>
+            </w:r>
+          </w:p>
+        </w:tc>
+        <w:tc>
+          <w:tcPr>
+            <w:tcW w:type="dxa" w:w="2340"/>
+            <w:vAlign w:val="center"/>
+          </w:tcPr>
+          <w:p>
+            <w:r>
+              <w:rPr>
+                <w:b/>
+              </w:rPr>
+              <w:t>Typischer Fehler</w:t>
+            </w:r>
+          </w:p>
+        </w:tc>
+        <w:tc>
+          <w:tcPr>
+            <w:tcW w:type="dxa" w:w="2340"/>
+            <w:vAlign w:val="center"/>
+          </w:tcPr>
+          <w:p>
+            <w:r>
+              <w:rPr>
+                <w:b/>
+              </w:rPr>
+              <w:t>Saubere WÖk-Lesart</w:t>
+            </w:r>
+          </w:p>
+        </w:tc>
+      </w:tr>
+      <w:tr>
+        <w:tc>
+          <w:tcPr>
+            <w:tcW w:type="dxa" w:w="2340"/>
+            <w:vAlign w:val="center"/>
+          </w:tcPr>
+          <w:p>
+            <w:r>
+              <w:t>Controllingebene</w:t>
+            </w:r>
+          </w:p>
+        </w:tc>
+        <w:tc>
+          <w:tcPr>
+            <w:tcW w:type="dxa" w:w="2340"/>
+            <w:vAlign w:val="center"/>
+          </w:tcPr>
+          <w:p>
+            <w:r>
+              <w:t>Funktion</w:t>
+            </w:r>
+          </w:p>
+        </w:tc>
+        <w:tc>
+          <w:tcPr>
+            <w:tcW w:type="dxa" w:w="2340"/>
+            <w:vAlign w:val="center"/>
+          </w:tcPr>
+          <w:p>
+            <w:r>
+              <w:t>Typischer Fehler</w:t>
+            </w:r>
+          </w:p>
+        </w:tc>
+        <w:tc>
+          <w:tcPr>
+            <w:tcW w:type="dxa" w:w="2340"/>
+            <w:vAlign w:val="center"/>
+          </w:tcPr>
+          <w:p>
+            <w:r>
+              <w:t>Saubere WÖk-Anwendung</w:t>
+            </w:r>
+          </w:p>
+        </w:tc>
+      </w:tr>
+      <w:tr>
+        <w:tc>
+          <w:tcPr>
+            <w:tcW w:type="dxa" w:w="2340"/>
+            <w:vAlign w:val="center"/>
+          </w:tcPr>
+          <w:p>
+            <w:r>
+              <w:t>Kennzahl</w:t>
+            </w:r>
+          </w:p>
+        </w:tc>
+        <w:tc>
+          <w:tcPr>
+            <w:tcW w:type="dxa" w:w="2340"/>
+            <w:vAlign w:val="center"/>
+          </w:tcPr>
+          <w:p>
+            <w:r>
+              <w:t>Zustand sichtbar machen</w:t>
+            </w:r>
+          </w:p>
+        </w:tc>
+        <w:tc>
+          <w:tcPr>
+            <w:tcW w:type="dxa" w:w="2340"/>
+            <w:vAlign w:val="center"/>
+          </w:tcPr>
+          <w:p>
+            <w:r>
+              <w:t>KPI als Wirkung ausgeben</w:t>
+            </w:r>
+          </w:p>
+        </w:tc>
+        <w:tc>
+          <w:tcPr>
+            <w:tcW w:type="dxa" w:w="2340"/>
+            <w:vAlign w:val="center"/>
+          </w:tcPr>
+          <w:p>
+            <w:r>
+              <w:t>KII mit Wirkpfad und Empfänger verknüpfen</w:t>
+            </w:r>
+          </w:p>
+        </w:tc>
+      </w:tr>
+      <w:tr>
+        <w:tc>
+          <w:tcPr>
+            <w:tcW w:type="dxa" w:w="2340"/>
+            <w:vAlign w:val="center"/>
+          </w:tcPr>
+          <w:p>
+            <w:r>
+              <w:t>Datenqualität</w:t>
+            </w:r>
+          </w:p>
+        </w:tc>
+        <w:tc>
+          <w:tcPr>
+            <w:tcW w:type="dxa" w:w="2340"/>
+            <w:vAlign w:val="center"/>
+          </w:tcPr>
+          <w:p>
+            <w:r>
+              <w:t>Aussagekraft begrenzen</w:t>
+            </w:r>
+          </w:p>
+        </w:tc>
+        <w:tc>
+          <w:tcPr>
+            <w:tcW w:type="dxa" w:w="2340"/>
+            <w:vAlign w:val="center"/>
+          </w:tcPr>
+          <w:p>
+            <w:r>
+              <w:t>Zahl ohne Quelle nutzen</w:t>
+            </w:r>
+          </w:p>
+        </w:tc>
+        <w:tc>
+          <w:tcPr>
+            <w:tcW w:type="dxa" w:w="2340"/>
+            <w:vAlign w:val="center"/>
+          </w:tcPr>
+          <w:p>
+            <w:r>
+              <w:t>Quelle, Einheit, Aktualität und Prüfstatus ausweisen</w:t>
+            </w:r>
+          </w:p>
+        </w:tc>
+      </w:tr>
+      <w:tr>
+        <w:tc>
+          <w:tcPr>
+            <w:tcW w:type="dxa" w:w="2340"/>
+            <w:vAlign w:val="center"/>
+          </w:tcPr>
+          <w:p>
+            <w:r>
+              <w:t>Bewertung</w:t>
+            </w:r>
+          </w:p>
+        </w:tc>
+        <w:tc>
+          <w:tcPr>
+            <w:tcW w:type="dxa" w:w="2340"/>
+            <w:vAlign w:val="center"/>
+          </w:tcPr>
+          <w:p>
+            <w:r>
+              <w:t>Daten in Profil übersetzen</w:t>
+            </w:r>
+          </w:p>
+        </w:tc>
+        <w:tc>
+          <w:tcPr>
+            <w:tcW w:type="dxa" w:w="2340"/>
+            <w:vAlign w:val="center"/>
+          </w:tcPr>
+          <w:p>
+            <w:r>
+              <w:t>Score als Wahrheit behandeln</w:t>
+            </w:r>
+          </w:p>
+        </w:tc>
+        <w:tc>
+          <w:tcPr>
+            <w:tcW w:type="dxa" w:w="2340"/>
+            <w:vAlign w:val="center"/>
+          </w:tcPr>
+          <w:p>
+            <w:r>
+              <w:t>Benchmark, Archetyp und Sperrlogik offenlegen</w:t>
+            </w:r>
+          </w:p>
+        </w:tc>
+      </w:tr>
+      <w:tr>
+        <w:tc>
+          <w:tcPr>
+            <w:tcW w:type="dxa" w:w="2340"/>
+            <w:vAlign w:val="center"/>
+          </w:tcPr>
+          <w:p>
+            <w:r>
+              <w:t>Steuerung</w:t>
+            </w:r>
+          </w:p>
+        </w:tc>
+        <w:tc>
+          <w:tcPr>
+            <w:tcW w:type="dxa" w:w="2340"/>
+            <w:vAlign w:val="center"/>
+          </w:tcPr>
+          <w:p>
+            <w:r>
+              <w:t>Entscheidung verändern</w:t>
+            </w:r>
+          </w:p>
+        </w:tc>
+        <w:tc>
+          <w:tcPr>
+            <w:tcW w:type="dxa" w:w="2340"/>
+            <w:vAlign w:val="center"/>
+          </w:tcPr>
+          <w:p>
+            <w:r>
+              <w:t>Dashboard ohne Konsequenz</w:t>
+            </w:r>
+          </w:p>
+        </w:tc>
+        <w:tc>
+          <w:tcPr>
+            <w:tcW w:type="dxa" w:w="2340"/>
+            <w:vAlign w:val="center"/>
+          </w:tcPr>
+          <w:p>
+            <w:r>
+              <w:t>CAPEX, OPEX, Einkauf, Portfolio oder Audit rückkoppeln</w:t>
+            </w:r>
+          </w:p>
+        </w:tc>
+      </w:tr>
+    </w:tbl>
+    <w:p/>
+    <w:p>
+      <w:pPr>
+        <w:pStyle w:val="Heading3"/>
+      </w:pPr>
+      <w:r>
+        <w:t>7.4 Modellformel</w:t>
+      </w:r>
+    </w:p>
+    <w:p>
+      <w:r>
+        <w:t>Die folgende Formel ist ein didaktisches Denkmodell, kein amtlicher Bewertungsstandard:</w:t>
+      </w:r>
+    </w:p>
+    <w:p>
+      <w:r>
+        <w:t>Impacttext-Controlling = KII + Datenqualitaet + Bewertung + Audit + Steuerungsentscheidung</w:t>
+      </w:r>
+    </w:p>
+    <w:p>
+      <w:r>
+        <w:t>Die Formel zeigt die operative Kette: Erst aus Kennzahlen, Datenqualität, Bewertung, Audit und Entscheidung entsteht steuerungsfähige Wirkung.</w:t>
+      </w:r>
+    </w:p>
+    <w:p>
+      <w:r>
+        <w:t>Die Formel soll gerade keine Scheingenauigkeit erzeugen. Sie zwingt dazu, die Faktoren offen zu legen, die eine Aussage tragen. In einem echten Bewertungsprozess müssten Datenquelle, Aktualität, Datenqualitätsklasse, Unsicherheitsgrad und Rückkopplungsregel ergänzt werden.</w:t>
+      </w:r>
+    </w:p>
+    <w:p>
+      <w:pPr>
+        <w:pStyle w:val="Heading3"/>
+      </w:pPr>
+      <w:r>
+        <w:t>7.5 Fallfenster</w:t>
+      </w:r>
+    </w:p>
+    <w:p>
+      <w:r>
+        <w:t>Fall 1. Ein Dashboard zu Von KPI zu KII und der Kennzahlen-Stack ist erst dann Impact-Controlling, wenn die Kennzahl eine Zustandsveränderung adressiert und eine Entscheidung auslöst.</w:t>
+      </w:r>
+    </w:p>
+    <w:p>
+      <w:r>
+        <w:t>Fall 2. Ein Datensatz mit guter Optik, aber schwacher Datenqualität darf nicht als harte Steuerungsgrundlage dienen. Die WÖk verlangt Unsicherheitsausweis, Auditpfad und Korrektur.</w:t>
+      </w:r>
+    </w:p>
+    <w:p>
+      <w:pPr>
+        <w:pStyle w:val="Heading3"/>
+      </w:pPr>
+      <w:r>
+        <w:t>7.6 Prüfungsnahe Fallfragen ohne geschützte Antwortlogik</w:t>
+      </w:r>
+    </w:p>
+    <w:p>
+      <w:r>
+        <w:t>Diese Fragen sind öffentlich und dienen dem Lernen. Die geschützte Antwortlogik, Scoring-Regeln und CorrectAnswer-Felder bleiben in der Prüfungs-Lane der App.</w:t>
+      </w:r>
+    </w:p>
+    <w:p>
+      <w:r>
+        <w:t>1. Beschreibe den Auslöser im Fall und trenne ihn von Absicht, Image oder Reichweite.</w:t>
+      </w:r>
+    </w:p>
+    <w:p>
+      <w:r>
+        <w:t>2. Formuliere einen plausiblen Wirkpfad mit Wirkungsempfängern, Zustandsveränderung und Rückkopplung.</w:t>
+      </w:r>
+    </w:p>
+    <w:p>
+      <w:r>
+        <w:t>3. Benenne mindestens ein Wirkungspotenzial und ein Wirkungsrisiko.</w:t>
+      </w:r>
+    </w:p>
+    <w:p>
+      <w:r>
+        <w:t>4. Zeige, welche Quelle oder Datenart nötig wäre, um von Potenzial zu belastbarer Wirkungsaussage zu kommen.</w:t>
+      </w:r>
+    </w:p>
+    <w:p>
+      <w:r>
+        <w:t>5. Prüfe, ob Nichtkompensation oder Reverse Merit Order einschlägig sein könnten.</w:t>
+      </w:r>
+    </w:p>
+    <w:p>
+      <w:r>
+        <w:t>6. Formuliere eine saubere Wirkungsaussage in einem Satz: Was wissen wir, was nehmen wir an, was bleibt offen?</w:t>
+      </w:r>
+    </w:p>
+    <w:p>
+      <w:pPr>
+        <w:pStyle w:val="Heading3"/>
+      </w:pPr>
+      <w:r>
+        <w:t>7.7 Auswertung aus der lebenden Website-Referenz</w:t>
+      </w:r>
+    </w:p>
+    <w:p>
+      <w:pPr>
+        <w:pStyle w:val="Heading3"/>
+      </w:pPr>
+      <w:r>
+        <w:t>Quellenanker: Kapitel 44 - Wirkungscontrolling im Unternehmen</w:t>
+      </w:r>
+    </w:p>
+    <w:p>
+      <w:r>
+        <w:t>Interne Quelle: referenz/kapitel-044-wirkungscontrolling-im-unternehmen/index.html</w:t>
+      </w:r>
+    </w:p>
+    <w:p>
+      <w:r>
+        <w:t>Kapitel 43 hat Führung als Gestaltung von Rückkopplung, Verantwortung, Lernfähigkeit und Systemintelligenz beschrieben. Wenn Führung Wirkung ermöglichen soll, braucht sie Informationen, die mehr zeigen als Umsatz, Kosten, Marge und Termine. Sie braucht Daten, die Auskunft darüber geben, welche Zustände ein Unternehmen durch seine Entscheidungen verändert.</w:t>
+      </w:r>
+    </w:p>
+    <w:p>
+      <w:r>
+        <w:t>Genau hier beginnt Wirkungscontrolling.</w:t>
+      </w:r>
+    </w:p>
+    <w:p>
+      <w:r>
+        <w:t>Wirkungscontrolling ist die Erweiterung des klassischen Controllings um Wirkung. Es ersetzt Finanzcontrolling nicht. Unternehmen müssen weiterhin Liquidität, Kosten, Ergebnis, Investitionen, Risiken und operative Leistung steuern. Doch diese Größen reichen nicht aus, wenn ein Unternehmen als Wirkungssystem verstanden wird. Ein Unternehmen kann seine finanziellen Ziele erreichen und zugleich negative Wirkung erzeugen. Es kann aber auch positive Wirkung erzeugen und wirtschaftlich tragfähig bleiben, wenn Wirkung früh genug in Entscheidungen eingeht.</w:t>
+      </w:r>
+    </w:p>
+    <w:p>
+      <w:r>
+        <w:t>Wirkungscontrolling beginnt dort, wo Daten nicht nur berichtet, sondern in unternehmerische Entscheidungen zurückgeführt werden.</w:t>
+      </w:r>
+    </w:p>
+    <w:p>
+      <w:pPr>
+        <w:pStyle w:val="Heading3"/>
+      </w:pPr>
+      <w:r>
+        <w:t>44.1 KPI versus KII</w:t>
+      </w:r>
+    </w:p>
+    <w:p>
+      <w:r>
+        <w:t>KPI steht für Key Performance Indicator. KPIs messen Leistung im klassischen Unternehmenssinn: Umsatz, Gewinn, Marge, Cashflow, Durchlaufzeit, Marktanteil, Produktivität, Kundenzufriedenheit, Lieferfähigkeit, Reklamationen oder Kapitalrendite. Solche Kennzahlen sind notwendig. Sie zeigen, ob ein Unternehmen wirtschaftlich handlungsfähig bleibt. Sie beantworten aber nicht die ganze Frage der Wirkung.</w:t>
+      </w:r>
+    </w:p>
+    <w:p>
+      <w:r>
+        <w:t>KII steht für Key Impact Indicator. Ein KII misst nicht nur, ob ein Prozess effizient oder profitabel ist, sondern welche Zustandsveränderung durch eine Handlung, ein Produkt, eine Organisationseinheit oder eine Entscheidung entsteht. Ein KII kann Emissionen, Wasserstress, Living-Wage-Abdeckung, Arbeitsunfälle, Produktsicherheit, Kreislauffähigkeit, Lieferkettenrisiken, Datenqualität, Datenschutz, demokratische Transparenz, Resilienz, Gesundheitswirkung, Teilhabe oder die Reduktion negativer Systemkosten sichtbar machen.</w:t>
+      </w:r>
+    </w:p>
+    <w:p>
+      <w:r>
+        <w:t>Der Unterschied ist nicht sprachlich, sondern methodisch. Ein KPI fragt: Wie leistungsfähig ist der Prozess aus Sicht des Unternehmens? Ein KII fragt: Welche Wirkung erzeugt der Prozess im Wirkungsraum?</w:t>
+      </w:r>
+    </w:p>
+    <w:p>
+      <w:r>
+        <w:t>Ein Einkauf kann einen sehr guten KPI erreichen, wenn er Kosten senkt. Der KII kann jedoch zeigen, dass diese Senkung über schlechtere Arbeitsbedingungen, höhere Lieferkettenrisiken oder geringere Resilienz erkauft wurde. Eine Produktion kann hohe Effizienzwerte erreichen. Der KII kann zeigen, dass Wasserverbrauch, Energieintensität oder Abfallwirkung problematisch bleiben. Eine Kommunikationsmaßnahme kann Reichweite steigern. Der KII kann zeigen, ob Vertrauen, Orientierung oder demokratische Resonanz gestärkt oder beschädigt werden. Ein Personalprogramm kann Fluktuation senken. Der KII kann zeigen, ob psychische Sicherheit, Selbstwirksamkeit und Arbeitsgesundheit tatsächlich wachsen.</w:t>
+      </w:r>
+    </w:p>
+    <w:p>
+      <w:r>
+        <w:t>KPI und KII stehen nicht gegeneinander. Sie müssen verbunden werden. Ein Unternehmen braucht finanzielle und operative Leistungsfähigkeit, aber es darf Leistung nicht mit Wirkung verwechseln. Wenn KPIs ohne KIIs gesteuert werden, kann ein Unternehmen gut aussehen und schlechte Wirkung erzeugen. Wenn KIIs ohne KPIs gesteuert werden, kann Wirkung behauptet werden, ohne wirtschaftliche Tragfähigkeit zu sichern.</w:t>
+      </w:r>
+    </w:p>
+    <w:p>
+      <w:r>
+        <w:t>Wirkungscontrolling verbindet beide Perspektiven. Es fragt, ob wirtschaftliche Leistung echte Wirkleistung ermöglicht oder ob sie Scheinleistung, Blindleistung oder Verlustleistung erzeugt. Damit werden KPIs nicht abgeschafft, sondern in eine höhere Entscheidungslogik eingeordnet.</w:t>
+      </w:r>
+    </w:p>
+    <w:p>
+      <w:pPr>
+        <w:pStyle w:val="Heading3"/>
+      </w:pPr>
+      <w:r>
+        <w:t>44.2 Scorecards im Management</w:t>
+      </w:r>
+    </w:p>
+    <w:p>
+      <w:r>
+        <w:t>Scorecards übersetzen Wirkungsdaten in nachvollziehbare Bewertung. Der methodische Teil hat ihre Grundlage erklärt. Im Unternehmen werden sie zu Managementinstrumenten, wenn sie nicht nur an Berichte angehängt, sondern in Entscheidungen eingebaut werden.</w:t>
+      </w:r>
+    </w:p>
+    <w:p>
+      <w:r>
+        <w:t>Eine Scorecard im Management beantwortet nicht die Frage, ob ein Unternehmen gut ist. Sie beantwortet, welche Wirkung ein Geschäftsbereich, eine Investition, eine Produktlinie, ein Standort, ein Projekt, eine Beschaffungskategorie oder eine Organisationseinheit in definierten Wirkungsfeldern erzeugt. Sie ordnet Daten, Benchmarks, Wirkungsklassen, Unsicherheiten und kritische Felder so, dass Managemententscheidungen nicht bei Einzelkennzahlen stehen bleiben.</w:t>
+      </w:r>
+    </w:p>
+    <w:p>
+      <w:r>
+        <w:t>Im klassischen Management werden Scorecards genutzt, um verschiedene Perspektiven zusammenzubringen: Finanzen, Kund:innen, Prozesse, Lernen und Entwicklung. Die Balanced Scorecard von Kaplan und Norton war dafür ein wichtiger externer Bezugspunkt, weil sie zeigte, dass finanzielle Kennzahlen allein strategische Leistung nicht ausreichend erfassen. Die Wirkungsökonomie geht einen anderen Schritt: Sie verbindet Unternehmenssteuerung mit Zustandsveränderung in den Dimensionen Mensch, Planet und Demokratie.</w:t>
+      </w:r>
+    </w:p>
+    <w:p>
+      <w:r>
+        <w:t>Eine Wirkungs-Scorecard im Management muss mehrere Fragen beantworten. Welche Wirkungsfelder sind für den konkreten Bereich wesentlich? Welche WÖk-IDs und Indikatoren gelten? Welche Datenqualität liegt vor? Welche Benchmarkklasse wird erreicht? Gibt es rote Linien oder kritische Engpässe? Welche Nebenwirkungen treten auf? Welche Wirkung ist direkt, indirekt, verzögert oder systemisch? Welche Entscheidung muss sich daraus verändern?</w:t>
+      </w:r>
+    </w:p>
+    <w:p>
+      <w:r>
+        <w:t>Damit wird Reporting zur Vorstufe, nicht zum Ziel. Ein Nachhaltigkeitsbericht kann externe Transparenz herstellen. Eine Management-Scorecard muss interne Entscheidung verändern. Wenn ein Bereich schlechte Werte bei Arbeitsgesundheit, Wasserstress oder Lieferkettenrisiko zeigt, darf das nicht nur in einem Jahresbericht erscheinen. Es muss in Beschaffung, Investition, Personal, Produktentwicklung, Risiko und Governance ankommen.</w:t>
+      </w:r>
+    </w:p>
+    <w:p>
+      <w:r>
+        <w:t>Scorecards im Management müssen deshalb Teil der Regelkommunikation werden: in Strategiegesprächen, Investitionsvorlagen, Projektfreigaben, Produktentwicklungsentscheidungen, Lieferantengesprächen, Risikoberichten und Vorstandsunterlagen. Nicht jede Sitzung braucht alle Wirkungsdaten. Aber relevante Entscheidungen brauchen die relevanten Wirkungsinformationen.</w:t>
+      </w:r>
+    </w:p>
+    <w:p>
+      <w:r>
+        <w:t>Sonst bleibt Scorecard-Logik Dekoration.</w:t>
+      </w:r>
+    </w:p>
+    <w:p>
+      <w:pPr>
+        <w:pStyle w:val="Heading3"/>
+      </w:pPr>
+      <w:r>
+        <w:t>44.3 NWI, IOI und T-SROI im Impact-Controlling</w:t>
+      </w:r>
+    </w:p>
+    <w:p>
+      <w:r>
+        <w:t>Der methodische Teil hat keine einzelne Superkennzahl eingeführt, sondern eine gestufte Impact-Controlling-Architektur. Im Unternehmenscontrolling erhält jede Kennzahl eine eigene Funktion: KIIs messen Zustandsveränderungen, Scorecards ordnen sie, der NWI verdichtet operative Netto-Wirkung, der IOI setzt positive Netto-Wirkung ins Verhältnis zur Investition, und der T-SROI bewertet Transformationskraft.</w:t>
+      </w:r>
+    </w:p>
+    <w:p>
+      <w:r>
+        <w:t>Dafür muss die Trennung zum alten KPI-System und zwischen den neuen Wirkungskennzahlen erhalten bleiben. KPIs zeigen Leistung aus Sicht des Unternehmens. KIIs zeigen Wirkung im Wirkungsraum. Der NWI zeigt, welche Netto-Wirkung ein Produkt, Projekt, Geschäftsbereich oder Unternehmen erzeugt. Er ist die operative Wirkungskennzahl. Der IOI fragt, wie viel geprüfte positive Netto-Wirkung pro eingesetztem Euro entsteht. Der T-SROI fragt, ob auf dieser Grundlage ein Systempfad verändert wird: durch neue Infrastruktur, neue Standards, neue Lieferketten, Kapitalumlenkung, Resilienzgewinn, Diffusion oder strukturelle Marktveränderung.</w:t>
+      </w:r>
+    </w:p>
+    <w:p>
+      <w:r>
+        <w:t>Im Controlling bedeutet das: Eine Entscheidungsvorlage fragt nicht nur, ob sich ein Projekt finanziell rechnet. Sie fragt in Reihenfolge: Welche KIIs sind betroffen? Welche Scorecard- und NWI-Bewertung ergibt sich? Ist positive Netto-Wirkung nach Reverse Merit Order überhaupt zulässig? Welcher IOI entsteht im Verhältnis zur Investitionssumme? Und verändert das Projekt einen Transformationspfad? Erst die Verbindung dieser Fragen macht Wirkung entscheidungsfähig.</w:t>
+      </w:r>
+    </w:p>
+    <w:p>
+      <w:r>
+        <w:t>In der Projektbewertung ersetzt keine dieser Kennzahlen die andere. Der ROI bleibt für finanzielle Tragfähigkeit relevant. KPIs bleiben für operative Leistung relevant. KIIs bleiben für Zustandsveränderungen relevant. Der NWI bleibt für Netto-Wirkung relevant. Der IOI bleibt für Wirkung pro Investition relevant. Der T-SROI macht sichtbar, welche Geschäftsfelder und Investitionen den größten transformativen Beitrag leisten.</w:t>
+      </w:r>
+    </w:p>
+    <w:p>
+      <w:r>
+        <w:t>Für das Controlling ist dies ein Rollenwechsel. Controlling ist nicht mehr nur Zahlenlieferant für Kosten und Gewinn. Es wird zur Übersetzungsstelle zwischen Finanzen, Leistung, Netto-Wirkung, Wirkungseffizienz, Transformationswirkung, Risiko und Entscheidung. Es muss sichtbar machen, wenn ein Projekt zwar finanzielle Rendite zeigt, aber negative Netto-Wirkung erzeugt. Es muss ebenso sichtbar machen, wenn ein Projekt finanziell weniger spektakulär wirkt, aber hohe positive Netto-Wirkung, Prävention, Resilienz, Innovation oder systemische Hebelwirkung schafft.</w:t>
+      </w:r>
+    </w:p>
+    <w:p>
+      <w:r>
+        <w:t>Impact-Controlling darf nicht als Formelmagie behandelt werden. NWI, IOI und T-SROI gehören in Entscheidungsvorlagen, Investitionsrechnungen, Portfoliovergleiche, Transformationsplanung und Risikoabwägung. Sie sollen nicht nachträglich ein Projekt legitimieren. Sie sollen vor der Entscheidung zeigen, welche Netto-Wirkung plausibel ist, welche positive Netto-Wirkung pro Investition entsteht, welche Transformationswirkung erwartbar ist, welche Datenqualität vorliegt, welche Unsicherheit besteht und welche Rückkopplung vorgesehen wird.</w:t>
+      </w:r>
+    </w:p>
+    <w:p>
+      <w:r>
+        <w:t>Damit wird Impact-Controlling zu einem Instrument der Selbstkorrektur. Ein Unternehmen kann erkennen, ob es nur KPIs optimiert oder echte Wirkleistung erzeugt. Es kann Projekte beenden, die finanziell attraktiv sind, aber negative Netto-Wirkung erzeugen. Es kann Projekte stärken, die pro eingesetztem Kapital hohe positive Netto-Wirkung, langfristige Resilienz und Transformationsfähigkeit aufbauen.</w:t>
+      </w:r>
+    </w:p>
+    <w:p>
+      <w:pPr>
+        <w:pStyle w:val="Heading3"/>
+      </w:pPr>
+      <w:r>
+        <w:t>44.4 Rückkopplung in Entscheidungen</w:t>
+      </w:r>
+    </w:p>
+    <w:p>
+      <w:r>
+        <w:t>Wirkungscontrolling erfüllt seinen Zweck erst, wenn es Entscheidungen verändert. Daten, KIIs, Scorecards, NWI, IOI und T-SROI haben nur dann Systemkraft, wenn sie in Strategie, Investitionen, Beschaffung, Produktentwicklung, Personal, Risiko und Governance zurückgeführt werden.</w:t>
+      </w:r>
+    </w:p>
+    <w:p>
+      <w:r>
+        <w:t>In der Strategie bedeutet Rückkopplung: Geschäftsmodelle werden nicht nur nach Marktchancen, sondern nach Netto-Wirkung, Wirkungsrisiko und Transformationsfähigkeit bewertet. Eine Strategie, die Umsatz steigert und zugleich planetare, soziale oder demokratische Risiken erhöht, muss als instabil gelesen werden.</w:t>
+      </w:r>
+    </w:p>
+    <w:p>
+      <w:r>
+        <w:t>In Investitionsentscheidungen bedeutet Rückkopplung: Projekte werden nicht nur nach ROI, Kapitalbindung und Amortisation bewertet, sondern nach NWI, IOI, T-SROI, Negativwirkung, Resilienz und langfristiger Zustandsveränderung. Investitionen mit hoher positiver Netto-Wirkung sollen nicht an kurzfristiger Renditelogik scheitern, wenn sie zentrale Zukunftsfähigkeit schaffen; zugleich muss sichtbar bleiben, welche positive Netto-Wirkung pro eingesetztem Kapital tatsächlich entsteht.</w:t>
+      </w:r>
+    </w:p>
+    <w:p>
+      <w:r>
+        <w:t>Hier liegt ein typischer blinder Punkt des Unternehmenscontrollings. Prävention ist schwerer sichtbar zu machen als Krisenmanagement. Eine verhinderte Lieferkettenstörung, ein nicht eingetretener Arbeitsunfall, eine vermiedene Reputationskrise, ein stabil gebliebener Standort, ein nicht eskalierter Konflikt, ein nicht entstandener Datenvorfall oder eine rechtzeitig erkannte Qualitätsabweichung erscheinen im Bericht nicht so spektakulär wie eine erfolgreiche Krisenreaktion. Gerade weil Prävention wirkt, fehlt der dramatische Beweis ihres Erfolgs.</w:t>
+      </w:r>
+    </w:p>
+    <w:p>
+      <w:r>
+        <w:t>Unternehmen belohnen deshalb häufig die sichtbare Feuerwehrleistung stärker als die unsichtbare Vorsorge. Wer eine Krise rettet, bekommt Aufmerksamkeit. Wer sie durch gute Daten, gute Prozesse, gute Lieferantenbeziehungen, gute Führung oder frühe Investitionen verhindert hat, bleibt leicht unsichtbar. Wirkungscontrolling muss diese Verzerrung korrigieren. Es muss nicht nur eingetretene Schäden messen, sondern auch vermiedene Schäden, erhaltene Optionen, gesenkte Verwundbarkeit und stabilisierte Wirkungsräume sichtbar machen.</w:t>
+      </w:r>
+    </w:p>
+    <w:p>
+      <w:r>
+        <w:t>Frühes Handeln erweitert unternehmerische Optionen. Ein Unternehmen, das rechtzeitig in Datenqualität, Arbeitsgesundheit, Lieferantenentwicklung, Energieeffizienz, Reparierbarkeit, Cybersicherheit oder Vertrauenskultur investiert, kann gestalten. Ein Unternehmen, das wartet, bis Risiken finanziell sichtbar werden, hat weniger Optionen: Notbeschaffung, Rückruf, Reputationsreparatur, Rechtsstreit, Standortschließung, Sonderbudget, Krisenkommunikation. Aus Gestaltung wird Schadensbegrenzung.</w:t>
+      </w:r>
+    </w:p>
+    <w:p>
+      <w:r>
+        <w:t>Das gilt auch für Kosten. Ursachenbearbeitung ist nicht in jedem Einzelfall billiger, aber systemisch meist günstiger als Symptombehandlung. Eine stabile Lieferantenbeziehung ist günstiger als Produktionsstillstand. Arbeitsgesundheit ist günstiger als Fluktuation, Krankheit und Erschöpfung. Datenintegrität ist günstiger als Bilanzkorrektur, Haftung und Vertrauensverlust. Gute Produktentwicklung ist günstiger als Rückruf, Entsorgung und Imageschaden. Prävention ist deshalb keine weiche Zusatzleistung. Sie ist ein betriebswirtschaftlicher Ausdruck von Wirkleistung.</w:t>
+      </w:r>
+    </w:p>
+    <w:p>
+      <w:r>
+        <w:t>In der Beschaffung bedeutet Rückkopplung: Preis, Qualität und Lieferzeit reichen nicht aus. Lieferantenwirkung, Menschenrechte, Klima, Wasser, Arbeitsbedingungen, Datenintegrität und Lieferkettenresilienz müssen Teil der Entscheidungsgrundlage werden. Die detaillierte Lieferkettensteuerung folgt später in diesem Teil. Hier reicht der Controlling-Punkt: Beschaffung braucht Wirkungsinformationen, sonst wird Einkauf zur Quelle unsichtbarer Risiken.</w:t>
+      </w:r>
+    </w:p>
+    <w:p>
+      <w:r>
+        <w:t>In der Produktentwicklung bedeutet Rückkopplung: Wirkung wird nicht erst nach Markteintritt geprüft. Sie gehört in frühe Designentscheidungen. Materialwahl, Nutzungsdauer, Reparierbarkeit, Barrierefreiheit, Datenschutz, Energiebedarf, Gesundheitswirkung und demokratische Nebenwirkungen müssen in die Produktlogik eingehen. Im Controlling geht es hier um die interne Entscheidungsinformation.</w:t>
+      </w:r>
+    </w:p>
+    <w:p>
+      <w:pPr>
+        <w:pStyle w:val="Heading3"/>
+      </w:pPr>
+      <w:r>
+        <w:t>Quellenanker: Wirkungsökonomie · KII statt KPI · https://wirkungsoekonomie.de/werkzeuge/kii-statt-kpi/ · Druckdatum: 24.05.2026</w:t>
+      </w:r>
+    </w:p>
+    <w:p>
+      <w:r>
+        <w:t>Interne Quelle: werkzeuge/kii-statt-kpi/index.html</w:t>
+      </w:r>
+    </w:p>
+    <w:p>
+      <w:r>
+        <w:t>Methodenregister</w:t>
+      </w:r>
+    </w:p>
+    <w:p>
+      <w:r>
+        <w:t>Key Impact Indicators für wirksame Steuerung.</w:t>
+      </w:r>
+    </w:p>
+    <w:p>
+      <w:r>
+        <w:t>KII ergänzen klassische KPIs um Zustandsveränderungen, Nebenwirkungen und Rückkopplungen.</w:t>
+      </w:r>
+    </w:p>
+    <w:p>
+      <w:r>
+        <w:t>Onlinefassung</w:t>
+      </w:r>
+    </w:p>
+    <w:p>
+      <w:r>
+        <w:t>Du liest die Onlinefassung</w:t>
+      </w:r>
+    </w:p>
+    <w:p>
+      <w:r>
+        <w:t>Diese Seite ist der öffentliche Einstieg in die Methodik. Vertiefungen, Downloads und Arbeitsmaterial stehen weiter unten gesammelt bereit.</w:t>
+      </w:r>
+    </w:p>
+    <w:p>
+      <w:r>
+        <w:t>Funktion</w:t>
+      </w:r>
+    </w:p>
+    <w:p>
+      <w:r>
+        <w:t>Was es leistet #</w:t>
+      </w:r>
+    </w:p>
+    <w:p>
+      <w:r>
+        <w:t>KII ergänzen klassische KPIs um Zustandsveränderungen, Nebenwirkungen und Rückkopplungen.</w:t>
+      </w:r>
+    </w:p>
+    <w:p>
+      <w:r>
+        <w:t>Anwendung</w:t>
+      </w:r>
+    </w:p>
+    <w:p>
+      <w:r>
+        <w:t>Angewendet in #</w:t>
+      </w:r>
+    </w:p>
+    <w:p>
+      <w:r>
+        <w:t>Impact Controlling, Produkte &amp; Konsum, Wirtschaft &amp; Unternehmen, Lieferketten und öffentlichen Steuerungsfragen.</w:t>
+      </w:r>
+    </w:p>
+    <w:p>
+      <w:r>
+        <w:t>Grenze</w:t>
+      </w:r>
+    </w:p>
+    <w:p>
+      <w:r>
+        <w:t>Nicht als Schönrechnung #</w:t>
+      </w:r>
+    </w:p>
+    <w:p>
+      <w:r>
+        <w:t>Das Werkzeug darf negative Wirkung, Datenlücken oder rote Linien nicht verdecken.</w:t>
+      </w:r>
+    </w:p>
+    <w:p>
+      <w:r>
+        <w:t>Methoden &amp; Werkzeuge</w:t>
+      </w:r>
+    </w:p>
+    <w:p>
+      <w:r>
+        <w:t>Werkzeuge in diesem Bereich #</w:t>
+      </w:r>
+    </w:p>
+    <w:p>
+      <w:r>
+        <w:t>Impact Controlling ist der Methodenrahmen. Interaktive Rechner werden als Rechner bezeichnet; statische Zielseiten führen als Methodik oder Dossier weiter.</w:t>
+      </w:r>
+    </w:p>
+    <w:p>
+      <w:r>
+        <w:t>Steuerungslogik</w:t>
+      </w:r>
+    </w:p>
+    <w:p>
+      <w:r>
+        <w:t>KII statt KPI</w:t>
+      </w:r>
+    </w:p>
+    <w:p>
+      <w:r>
+        <w:t>Key Impact Indicators ergänzen klassische KPIs um Zustandsveränderungen, Nebenwirkungen und Rückkopplungen.</w:t>
+      </w:r>
+    </w:p>
+    <w:p>
+      <w:r>
+        <w:t>Warum hier relevant? Unternehmen und öffentliche Systeme brauchen Kennzahlen, die nicht nur Leistung, sondern Wirkung zeigen.</w:t>
+      </w:r>
+    </w:p>
+    <w:p>
+      <w:r>
+        <w:t>Tool-Suite</w:t>
+      </w:r>
+    </w:p>
+    <w:p>
+      <w:r>
+        <w:t>Methoden in Werkzeuglogik übersetzen #</w:t>
+      </w:r>
+    </w:p>
+    <w:p>
+      <w:r>
+        <w:t>Die Methodenpapiere beschreiben die fachliche Logik. Die Karten führen zu Methodenseiten; sie versprechen keine Interaktion, wenn keine Bedienoberfläche vorhanden ist.</w:t>
+      </w:r>
+    </w:p>
+    <w:p>
+      <w:r>
+        <w:t>Methode</w:t>
+      </w:r>
+    </w:p>
+    <w:p>
+      <w:r>
+        <w:t>WÖk-ID-Browser</w:t>
+      </w:r>
+    </w:p>
+    <w:p>
+      <w:r>
+        <w:t>Wirkungsindikatoren, Quellen, SDG-Bezüge, Datenqualität und Versionen nachvollziehbar ordnen.</w:t>
+      </w:r>
+    </w:p>
+    <w:p>
+      <w:r>
+        <w:t>Methodik</w:t>
+      </w:r>
+    </w:p>
+    <w:p>
+      <w:r>
+        <w:t>Scorecard-Generator</w:t>
+      </w:r>
+    </w:p>
+    <w:p>
+      <w:r>
+        <w:t>Aus WÖk-IDs, Benchmarks und Datenqualität eine prüfbare Bewertungsoberfläche ableiten.</w:t>
+      </w:r>
+    </w:p>
+    <w:p>
+      <w:r>
+        <w:t>Methodik</w:t>
+      </w:r>
+    </w:p>
+    <w:p>
+      <w:r>
+        <w:t>NWI-Rechner</w:t>
+      </w:r>
+    </w:p>
+    <w:p>
+      <w:r>
+        <w:t>Positive, negative und neutrale Wirkung ohne freie Kompensation zusammenführen.</w:t>
+      </w:r>
+    </w:p>
+    <w:p>
+      <w:r>
+        <w:t>Methodik</w:t>
+      </w:r>
+    </w:p>
+    <w:p>
+      <w:r>
+        <w:t>IOI-Rechner</w:t>
+      </w:r>
+    </w:p>
+    <w:p>
+      <w:r>
+        <w:t>Positive Netto-Wirkung je investiertem Euro, Budget oder Kapitaleinsatz sichtbar machen.</w:t>
+      </w:r>
+    </w:p>
+    <w:p>
+      <w:pPr>
+        <w:pStyle w:val="Heading3"/>
+      </w:pPr>
+      <w:r>
+        <w:t>Quellenanker: Wirkungsökonomie · Impact Controlling · https://wirkungsoekonomie.de/werkzeuge/impact-controlling/ · Druckdatum: 24.05.2026</w:t>
+      </w:r>
+    </w:p>
+    <w:p>
+      <w:r>
+        <w:t>Interne Quelle: werkzeuge/impact-controlling/index.html</w:t>
+      </w:r>
+    </w:p>
+    <w:p>
+      <w:r>
+        <w:t>Methodenbereich</w:t>
+      </w:r>
+    </w:p>
+    <w:p>
+      <w:r>
+        <w:t>Wirkung sichtbar, bewertbar und entscheidungsrelevant machen.</w:t>
+      </w:r>
+    </w:p>
+    <w:p>
+      <w:r>
+        <w:t>Impact Controlling ist der methodische Dachbereich der Wirkungsökonomie. Es verbindet WÖk-IDs, Scorecards, NWI, IOI, T-SROI, Datenqualität, Benchmarks und Wirkungsdatenräume.</w:t>
+      </w:r>
+    </w:p>
+    <w:p>
+      <w:r>
+        <w:t>Onlinefassung</w:t>
+      </w:r>
+    </w:p>
+    <w:p>
+      <w:r>
+        <w:t>Du liest die Onlinefassung</w:t>
+      </w:r>
+    </w:p>
+    <w:p>
+      <w:r>
+        <w:t>Diese Seite ist der öffentliche Einstieg in die Methodik. Vertiefungen, Downloads und Arbeitsmaterial stehen weiter unten gesammelt bereit.</w:t>
+      </w:r>
+    </w:p>
+    <w:p>
+      <w:r>
+        <w:t>Methodik</w:t>
+      </w:r>
+    </w:p>
+    <w:p>
+      <w:r>
+        <w:t>Von Wirkung zu Entscheidung #</w:t>
+      </w:r>
+    </w:p>
+    <w:p>
+      <w:r>
+        <w:t>Wirkung ist neutral und relational. Impact Controlling macht sichtbar, welche Zustände sich verändern, welche Nebenwirkungen entstehen, welche Daten belastbar sind und wie Entscheidungen auf positive Netto-Wirkung, wirksamen Kapitaleinsatz und lernende Rückkopplung ausgerichtet werden können.</w:t>
+      </w:r>
+    </w:p>
+    <w:p>
+      <w:r>
+        <w:t>Messen</w:t>
+      </w:r>
+    </w:p>
+    <w:p>
+      <w:r>
+        <w:t>WÖk-IDs, Datenquellen, Einheiten und Schwellen machen Wirkung adressierbar.</w:t>
+      </w:r>
+    </w:p>
+    <w:p>
+      <w:r>
+        <w:t>Bewerten</w:t>
+      </w:r>
+    </w:p>
+    <w:p>
+      <w:r>
+        <w:t>Scorecards, Benchmarks, NWI, IOI und Reverse Merit Order ordnen Wirkung ein.</w:t>
+      </w:r>
+    </w:p>
+    <w:p>
+      <w:r>
+        <w:t>Steuern</w:t>
+      </w:r>
+    </w:p>
+    <w:p>
+      <w:r>
+        <w:t>IOI, T-SROI, KII, Assurance und Wirkungsdatenräume machen Wirkung entscheidungsrelevant.</w:t>
+      </w:r>
+    </w:p>
+    <w:p>
+      <w:r>
+        <w:t>Methoden &amp; Werkzeuge</w:t>
+      </w:r>
+    </w:p>
+    <w:p>
+      <w:r>
+        <w:t>Werkzeuge in diesem Bereich #</w:t>
+      </w:r>
+    </w:p>
+    <w:p>
+      <w:r>
+        <w:t>Impact Controlling ist der Methodenrahmen. Interaktive Rechner werden als Rechner bezeichnet; statische Zielseiten führen als Methodik oder Dossier weiter.</w:t>
+      </w:r>
+    </w:p>
+    <w:p>
+      <w:r>
+        <w:t>Bewertungsmethode</w:t>
+      </w:r>
+    </w:p>
+    <w:p>
+      <w:r>
+        <w:t>T-SROI</w:t>
+      </w:r>
+    </w:p>
+    <w:p>
+      <w:r>
+        <w:t>Transformational Social Return on Investment bewertet finanzielle, soziale, ökologische und systemische Transformationswirkung.</w:t>
+      </w:r>
+    </w:p>
+    <w:p>
+      <w:r>
+        <w:t>Warum hier relevant? T-SROI übersetzt Investitionen, Prävention und Transformation in eine nachvollziehbare Wirkungsrendite.</w:t>
+      </w:r>
+    </w:p>
+    <w:p>
+      <w:r>
+        <w:t>Investitionskennzahl</w:t>
+      </w:r>
+    </w:p>
+    <w:p>
+      <w:r>
+        <w:t>Impact-of-Investment (IOI)</w:t>
+      </w:r>
+    </w:p>
+    <w:p>
+      <w:r>
+        <w:t>IOI setzt positive Netto-Wirkung ins Verhältnis zum eingesetzten Kapital, Budget oder Investitionsvolumen.</w:t>
+      </w:r>
+    </w:p>
+    <w:p>
+      <w:r>
+        <w:t>Warum hier relevant? IOI zeigt, ob ein Euro nur finanzielle Aktivität auslöst oder belegbare positive Netto-Wirkung erzeugt.</w:t>
+      </w:r>
+    </w:p>
+    <w:p>
+      <w:r>
+        <w:t>Kennzahl</w:t>
+      </w:r>
+    </w:p>
+    <w:p>
+      <w:r>
+        <w:t>Netto-Wirkungs-Index</w:t>
+      </w:r>
+    </w:p>
+    <w:p>
+      <w:r>
+        <w:t>Der NWI ordnet positive, negative und neutrale Wirkung im WÖk-Rahmen operativ ein.</w:t>
+      </w:r>
+    </w:p>
+    <w:p>
+      <w:r>
+        <w:t>Warum hier relevant? Er verhindert, dass Wirkung nur als Story erzählt wird, und macht Vergleichbarkeit möglich.</w:t>
+      </w:r>
+    </w:p>
+    <w:p>
+      <w:r>
+        <w:t>Datenarchitektur</w:t>
+      </w:r>
+    </w:p>
+    <w:p>
+      <w:r>
+        <w:t>WÖk-IDs</w:t>
+      </w:r>
+    </w:p>
+    <w:p>
+      <w:r>
+        <w:t>WÖk-IDs verbinden SDGs, SDG+, NACE, ESRS, GRI, Quellen, Einheiten, Schwellen und Versionen.</w:t>
+      </w:r>
+    </w:p>
+    <w:p>
+      <w:r>
+        <w:t>Warum hier relevant? Sie bilden die Brücke zwischen Referenzrahmen und prüfbarer Wirkungsbewertung.</w:t>
+      </w:r>
+    </w:p>
+    <w:p>
+      <w:r>
+        <w:t>Bewertungsraster</w:t>
+      </w:r>
+    </w:p>
+    <w:p>
+      <w:r>
+        <w:t>Scorecards</w:t>
+      </w:r>
+    </w:p>
+    <w:p>
+      <w:r>
+        <w:t>Scorecards übersetzen Daten und Benchmarks in nachvollziehbare Skalen und Entscheidungslogik.</w:t>
+      </w:r>
+    </w:p>
+    <w:p>
+      <w:pPr>
+        <w:pStyle w:val="Heading3"/>
+      </w:pPr>
+      <w:r>
+        <w:t>Quellenanker: Wirkungsökonomie · Detailkonzept KII statt KPI · https://wirkungsoekonomie.de/werkzeuge/impact-controlling/detailkonzepte/kii-statt-kpi/ · Druckdatum: 24.05.2026</w:t>
+      </w:r>
+    </w:p>
+    <w:p>
+      <w:r>
+        <w:t>Interne Quelle: werkzeuge/impact-controlling/detailkonzepte/kii-statt-kpi/index.html</w:t>
+      </w:r>
+    </w:p>
+    <w:p>
+      <w:r>
+        <w:t>Detailkonzept · Impact Controlling / T-SROI / NWI / WÖk-IDs / Scorecards</w:t>
+      </w:r>
+    </w:p>
+    <w:p>
+      <w:r>
+        <w:t>Key Impact Indicators als Ergänzung klassischer Leistungskennzahlen.</w:t>
+      </w:r>
+    </w:p>
+    <w:p>
+      <w:r>
+        <w:t>Fachliche Onlinefassung mit politischer Anschlussfähigkeit, Werkzeugbezug und Arbeitsmaterial.</w:t>
+      </w:r>
+    </w:p>
+    <w:p>
+      <w:r>
+        <w:t>Onlinefassung</w:t>
+      </w:r>
+    </w:p>
+    <w:p>
+      <w:r>
+        <w:t>Du liest die Onlinefassung</w:t>
+      </w:r>
+    </w:p>
+    <w:p>
+      <w:r>
+        <w:t>Du liest die Onlinefassung dieses Detailkonzepts. Die Downloadfassung und die Druckfunktion findest du am Ende der Seite.</w:t>
+      </w:r>
+    </w:p>
+    <w:p>
+      <w:r>
+        <w:t>Kurzfassung und Ziel</w:t>
+      </w:r>
+    </w:p>
+    <w:p>
+      <w:r>
+        <w:t>Ausgangslage und alte Logik</w:t>
+      </w:r>
+    </w:p>
+    <w:p>
+      <w:r>
+        <w:t>Begriffliche Einordnung</w:t>
+      </w:r>
+    </w:p>
+    <w:p>
+      <w:r>
+        <w:t>Wirkungsökonomischer Perspektivwechsel</w:t>
+      </w:r>
+    </w:p>
+    <w:p>
+      <w:r>
+        <w:t>Systemarchitektur</w:t>
+      </w:r>
+    </w:p>
+    <w:p>
+      <w:r>
+        <w:t>Mess-, Daten- und Bewertungslogik</w:t>
+      </w:r>
+    </w:p>
+    <w:p>
+      <w:r>
+        <w:t>Politische Anschlussfähigkeit und Ausgestaltungsspielräume</w:t>
+      </w:r>
+    </w:p>
+    <w:p>
+      <w:r>
+        <w:t>Akteursperspektiven</w:t>
+      </w:r>
+    </w:p>
+    <w:p>
+      <w:r>
+        <w:t>Risiken, Nebenwirkungen und Schutzmechanismen</w:t>
+      </w:r>
+    </w:p>
+    <w:p>
+      <w:r>
+        <w:t>Umsetzung und Pilotierung</w:t>
+      </w:r>
+    </w:p>
+    <w:p>
+      <w:r>
+        <w:t>SDG-/SDG+-Bezug und WÖk-ID-Bezug</w:t>
+      </w:r>
+    </w:p>
+    <w:p>
+      <w:r>
+        <w:t>Buchanker, Glossar, Werkzeuge und Verknüpfungen</w:t>
+      </w:r>
+    </w:p>
+    <w:p>
+      <w:r>
+        <w:t>Politische Anschlussfähigkeit</w:t>
+      </w:r>
+    </w:p>
+    <w:p>
+      <w:r>
+        <w:t>Risiken, Nebenwirkungen und Schutz</w:t>
+      </w:r>
+    </w:p>
+    <w:p>
+      <w:r>
+        <w:t>Online-, Dossier- und Werkzeugbezug</w:t>
+      </w:r>
+    </w:p>
+    <w:p>
+      <w:r>
+        <w:t>Ausgangslage und alte Logik aus der Korrekturfassung</w:t>
+      </w:r>
+    </w:p>
+    <w:p>
+      <w:r>
+        <w:t>Wirkungsökonomischer Perspektivwechsel aus der Korrekturfassung</w:t>
+      </w:r>
+    </w:p>
+    <w:p>
+      <w:r>
+        <w:t>Systemarchitektur aus der Korrekturfassung</w:t>
+      </w:r>
+    </w:p>
+    <w:p>
+      <w:r>
+        <w:t>Mess-, Daten- und Bewertungslogik aus der Korrekturfassung</w:t>
+      </w:r>
+    </w:p>
+    <w:p>
+      <w:r>
+        <w:t>Politische Anschlussfähigkeit</w:t>
+      </w:r>
+    </w:p>
+    <w:p>
+      <w:r>
+        <w:t>Risiken, Nebenwirkungen und Schutz</w:t>
+      </w:r>
+    </w:p>
+    <w:p>
+      <w:r>
+        <w:t>Umsetzung und Pilotierung aus der Korrekturfassung</w:t>
+      </w:r>
+    </w:p>
+    <w:p>
+      <w:r>
+        <w:t>Online-, Dossier- und Werkzeugbezug</w:t>
+      </w:r>
+    </w:p>
+    <w:p>
+      <w:r>
+        <w:t>Kurzfassung und Ziel #</w:t>
+      </w:r>
+    </w:p>
+    <w:p>
+      <w:r>
+        <w:t>KII statt KPI wird als fachlicher Unterbereich der Wirkungsökonomie online erklärt. Ziel ist eine öffentliche Langfassung mit fachlicher Einordnung, Bewertungspfad, politischem Rahmen und zitierfähigen Ankern.</w:t>
+      </w:r>
+    </w:p>
+    <w:p>
+      <w:r>
+        <w:t>Ausgangslage und alte Logik #</w:t>
+      </w:r>
+    </w:p>
+    <w:p>
+      <w:r>
+        <w:t>Die alte Logik betrachtet KII statt KPI häufig über isolierte Kennzahlen, Kosten, formale Zuständigkeiten oder kurzfristige Effizienz. Dadurch bleiben Nebenwirkungen, Folgekosten, Verdrängungen, Datenlücken und demokratische Rückkopplungen unsichtbar.</w:t>
+      </w:r>
+    </w:p>
+    <w:p>
+      <w:r>
+        <w:t>Begriffliche Einordnung #</w:t>
+      </w:r>
+    </w:p>
+    <w:p>
+      <w:r>
+        <w:t>Key Impact Indicators als Ergänzung klassischer Leistungskennzahlen. Wirkung bedeutet hier die tatsächliche Veränderung von Zuständen. Sie kann positiv, negativ oder neutral sein und wird nicht automatisch als Fortschritt behandelt.</w:t>
+      </w:r>
+    </w:p>
+    <w:p>
+      <w:r>
+        <w:t>Wirkungsökonomischer Perspektivwechsel #</w:t>
+      </w:r>
+    </w:p>
+    <w:p>
+      <w:r>
+        <w:t>Der neue Maßstab ist positive Netto-Wirkung für Mensch, Planet und Demokratie. Entscheidungen werden nicht nur danach bewertet, ob sie zulässig oder profitabel sind, sondern welche Zustandsveränderungen sie erzeugen und welche Risiken sichtbar bleiben müssen.</w:t>
+      </w:r>
+    </w:p>
+    <w:p>
+      <w:pPr>
+        <w:pStyle w:val="Heading3"/>
+      </w:pPr>
+      <w:r>
+        <w:t>Quellenanker: Wirkungsökonomie · Wirkungscontrolling / Impact Controlling · https://wirkungsoekonomie.de/werkzeuge/impact-controlling/dossiers/wirkungscontrolling/ · Stand: 01.06.2026</w:t>
+      </w:r>
+    </w:p>
+    <w:p>
+      <w:r>
+        <w:t>Interne Quelle: werkzeuge/impact-controlling/dossiers/wirkungscontrolling/index.html</w:t>
+      </w:r>
+    </w:p>
+    <w:p>
+      <w:r>
+        <w:t>Detailkonzept-Dossier · Version 1.0 · 01. Juni 2026</w:t>
+      </w:r>
+    </w:p>
+    <w:p>
+      <w:r>
+        <w:t>Planung, Messung, Bewertung, Steuerung und Rückkopplung von Wirkung für Mensch, Planet und Demokratie.</w:t>
+      </w:r>
+    </w:p>
+    <w:p>
+      <w:r>
+        <w:t>Diese Onlinefassung macht das neue Detailkonzept-Dossier zitierfähig lesbar. Das PDF bleibt als ergänzende Downloadfassung verfügbar.</w:t>
+      </w:r>
+    </w:p>
+    <w:p>
+      <w:r>
+        <w:t>Tool-Orientierung · Rechner · Modellfassung</w:t>
+      </w:r>
+    </w:p>
+    <w:p>
+      <w:r>
+        <w:t>Wofür dieses Werkzeug da ist.</w:t>
+      </w:r>
+    </w:p>
+    <w:p>
+      <w:r>
+        <w:t>Umfassendes zitierfähiges Detailkonzept-Dossier zu Wirkungscontrolling / Impact Controlling mit Rechenlogik, Scorecards, NWI, IOI, T-SROI, Datenqualität, Assurance und Umsetzungspfaden.</w:t>
+      </w:r>
+    </w:p>
+    <w:p>
+      <w:r>
+        <w:t>Nutzerfrage</w:t>
+      </w:r>
+    </w:p>
+    <w:p>
+      <w:r>
+        <w:t>Womit komme ich hierher?</w:t>
+      </w:r>
+    </w:p>
+    <w:p>
+      <w:r>
+        <w:t>Welche Berechnung oder Modellannahme soll hier nachvollziehbar geprüft werden?</w:t>
+      </w:r>
+    </w:p>
+    <w:p>
+      <w:r>
+        <w:t>Werkzeuglogik</w:t>
+      </w:r>
+    </w:p>
+    <w:p>
+      <w:r>
+        <w:t>Wirkungscontrolling / Impact Controlling</w:t>
+      </w:r>
+    </w:p>
+    <w:p>
+      <w:r>
+        <w:t>Ein Rechner macht eine Wirkungsfrage nachvollziehbarer. Die Seite zeigt Annahmen, Datenlage, Grenzen und mögliche nächste Prüfschritte; sie ist keine amtliche Bewertung.</w:t>
+      </w:r>
+    </w:p>
+    <w:p>
+      <w:r>
+        <w:t>Eingabe</w:t>
+      </w:r>
+    </w:p>
+    <w:p>
+      <w:r>
+        <w:t>Was wird gebraucht?</w:t>
+      </w:r>
+    </w:p>
+    <w:p>
+      <w:r>
+        <w:t>Beispielwerte, Annahmen, Regler oder Eingabefelder. Reale Daten brauchen Quellen, Zeitstand und Datenqualitätsprüfung.</w:t>
+      </w:r>
+    </w:p>
+    <w:p>
+      <w:r>
+        <w:t>Ergebnis</w:t>
+      </w:r>
+    </w:p>
+    <w:p>
+      <w:r>
+        <w:t>Was kommt heraus?</w:t>
+      </w:r>
+    </w:p>
+    <w:p>
+      <w:r>
+        <w:t>Modellwerte, Richtung, Engpass, Sensitivität oder Szenario. Keine automatische Entscheidung und keine Beratung.</w:t>
+      </w:r>
+    </w:p>
+    <w:p>
+      <w:r>
+        <w:t>Wirkpfad</w:t>
+      </w:r>
+    </w:p>
+    <w:p>
+      <w:r>
+        <w:t>Was verändert sich dadurch?</w:t>
+      </w:r>
+    </w:p>
+    <w:p>
+      <w:r>
+        <w:t>Zahlen werden nicht als Wahrheit behandelt, sondern mit Bedeutung, Datenqualität, Grenzen und Rückkopplung verbunden.</w:t>
+      </w:r>
+    </w:p>
+    <w:p>
+      <w:r>
+        <w:t>Grenzen</w:t>
+      </w:r>
+    </w:p>
+    <w:p>
+      <w:r>
+        <w:t>Modell bleibt Modell.</w:t>
+      </w:r>
+    </w:p>
+    <w:p>
+      <w:r>
+        <w:t>Demo-Werte, Annahmen, Quellenstand und Unsicherheiten müssen sichtbar bleiben. Niedrige Datenqualität erzeugt Prüfbedarf, keine Scheinsicherheit.</w:t>
+      </w:r>
+    </w:p>
+    <w:p>
+      <w:r>
+        <w:t>Zitation</w:t>
+      </w:r>
+    </w:p>
+    <w:p>
+      <w:r>
+        <w:t>Zitierfähige Kurzform</w:t>
+      </w:r>
+    </w:p>
+    <w:p>
+      <w:r>
+        <w:t>Weber, Natalie / Wirkungsökonomie (2026): Wirkungscontrolling – Detailkonzept-Dossier. Planung, Messung, Bewertung, Steuerung und Rückkopplung von Wirkung für Mensch, Planet und Demokratie. Version 1.0, 01. Juni 2026.</w:t>
+      </w:r>
+    </w:p>
+    <w:p>
+      <w:r>
+        <w:t>Online: wirkungsoekonomie.de/werkzeuge/impact-controlling/dossiers/wirkungscontrolling/</w:t>
+      </w:r>
+    </w:p>
+    <w:p>
+      <w:r>
+        <w:t>Download</w:t>
+      </w:r>
+    </w:p>
+    <w:p>
+      <w:r>
+        <w:t>PDF-Fassung</w:t>
+      </w:r>
+    </w:p>
+    <w:p>
+      <w:r>
+        <w:t>Die PDF-Datei ist die downloadbare Lesefassung. Die PDF-Fassung-Quelle wird nicht öffentlich als Download angeboten.</w:t>
+      </w:r>
+    </w:p>
+    <w:p>
+      <w:r>
+        <w:t>Leitformel</w:t>
+      </w:r>
+    </w:p>
+    <w:p>
+      <w:r>
+        <w:t>Wirkung ist die tatsächliche Veränderung von Zuständen. Wirkungscontrolling macht diese Veränderung entscheidungsfähig, ohne sie auf bloße Zahlen zu reduzieren.</w:t>
+      </w:r>
+    </w:p>
+    <w:p>
+      <w:r>
+        <w:t>Hinweis: Dieses Dossier ist ein fachliches Konzeptpapier. Es ersetzt keine Rechts-, Steuer-, Prüfungs-, Nachhaltigkeits-, Anlage- oder Unternehmensberatung. Begriffe wie Wirkungssteuer, WÖk-ID, NWI, IOI und T-SROI werden als Modell- und Methodenvorschläge der Wirkungsökonomie beschrieben, nicht als geltendes Recht.</w:t>
+      </w:r>
+    </w:p>
+    <w:p>
+      <w:r>
+        <w:t>0. Zitationsweise, Quellenlogik und Dokumentstatus #</w:t>
+      </w:r>
+    </w:p>
+    <w:p>
+      <w:r>
+        <w:t>Dieses Dossier verwendet eine zweigeteilte Kurzbeleglogik. Interne Quellen der Wirkungsökonomie werden als [I-xx] zitiert. Externe Standards, Rechtsquellen, Fachquellen und methodische Anschlussquellen werden als [E-xx] zitiert. Die vollständigen Angaben stehen im Quellenverzeichnis am Ende des Dokuments. Diese Zitationsweise ist bewusst transparent gewählt: Sie trennt die originäre WÖk-Methodik von externen Anschlussstandards und verhindert, dass normative Modellannahmen mit bereits geltenden Berichtspflichten verwechselt werden.</w:t>
+      </w:r>
+    </w:p>
+    <w:p>
+      <w:r>
+        <w:t>Die interne Primärquelle ist das neue Grundlagenbuch „Die neue Ordnung des Wohlstands“ in der 2026er Fassung. Für Wirkungscontrolling sind vor allem Teil V „Messung, Daten und Methodik“, Kapitel 30 bis 35, sowie Kapitel 44 „Wirkungscontrolling im Unternehmen“ maßgeblich [I-01]. Der online geprüfte Stand der Website bestätigt die Leitidee, dass positive Netto-Wirkung entscheidungsrelevant werden soll und Wirkung erst dann systemrelevant wird, wenn sie in Preise, Steuern, Kapital und Entscheidungen zurückwirkt [I-02].</w:t>
+      </w:r>
+    </w:p>
+    <w:p>
+      <w:pPr>
+        <w:pStyle w:val="Heading3"/>
+      </w:pPr>
+      <w:r>
+        <w:t>Quellenanker: Wirkungsökonomie · Detailkonzept Impact Controlling als System · https://wirkungsoekonomie.de/werkzeuge/impact-controlling/detailkonzepte/impact-controlling-als-system/ · Druckdatum: 24.05.2026</w:t>
+      </w:r>
+    </w:p>
+    <w:p>
+      <w:r>
+        <w:t>Interne Quelle: werkzeuge/impact-controlling/detailkonzepte/impact-controlling-als-system/index.html</w:t>
+      </w:r>
+    </w:p>
+    <w:p>
+      <w:r>
+        <w:t>Detailkonzept · Impact Controlling / T-SROI / NWI / WÖk-IDs / Scorecards</w:t>
+      </w:r>
+    </w:p>
+    <w:p>
+      <w:r>
+        <w:t>Wirkung in Strategie, Steuerung, Risiko, Reporting, Budgetierung und Entscheidung übersetzen.</w:t>
+      </w:r>
+    </w:p>
+    <w:p>
+      <w:r>
+        <w:t>Fachliche Onlinefassung mit politischer Anschlussfähigkeit, Werkzeugbezug und Arbeitsmaterial.</w:t>
+      </w:r>
+    </w:p>
+    <w:p>
+      <w:r>
+        <w:t>Onlinefassung</w:t>
+      </w:r>
+    </w:p>
+    <w:p>
+      <w:r>
+        <w:t>Du liest die Onlinefassung</w:t>
+      </w:r>
+    </w:p>
+    <w:p>
+      <w:r>
+        <w:t>Du liest die Onlinefassung dieses Detailkonzepts. Die Downloadfassung und die Druckfunktion findest du am Ende der Seite.</w:t>
+      </w:r>
+    </w:p>
+    <w:p>
+      <w:r>
+        <w:t>Kurzfassung und Ziel</w:t>
+      </w:r>
+    </w:p>
+    <w:p>
+      <w:r>
+        <w:t>Ausgangslage und alte Logik</w:t>
+      </w:r>
+    </w:p>
+    <w:p>
+      <w:r>
+        <w:t>Begriffliche Einordnung</w:t>
+      </w:r>
+    </w:p>
+    <w:p>
+      <w:r>
+        <w:t>Wirkungsökonomischer Perspektivwechsel</w:t>
+      </w:r>
+    </w:p>
+    <w:p>
+      <w:r>
+        <w:t>Systemarchitektur</w:t>
+      </w:r>
+    </w:p>
+    <w:p>
+      <w:r>
+        <w:t>Mess-, Daten- und Bewertungslogik</w:t>
+      </w:r>
+    </w:p>
+    <w:p>
+      <w:r>
+        <w:t>Politische Anschlussfähigkeit und Ausgestaltungsspielräume</w:t>
+      </w:r>
+    </w:p>
+    <w:p>
+      <w:r>
+        <w:t>Akteursperspektiven</w:t>
+      </w:r>
+    </w:p>
+    <w:p>
+      <w:r>
+        <w:t>Risiken, Nebenwirkungen und Schutzmechanismen</w:t>
+      </w:r>
+    </w:p>
+    <w:p>
+      <w:r>
+        <w:t>Umsetzung und Pilotierung</w:t>
+      </w:r>
+    </w:p>
+    <w:p>
+      <w:r>
+        <w:t>SDG-/SDG+-Bezug und WÖk-ID-Bezug</w:t>
+      </w:r>
+    </w:p>
+    <w:p>
+      <w:r>
+        <w:t>Buchanker, Glossar, Werkzeuge und Verknüpfungen</w:t>
+      </w:r>
+    </w:p>
+    <w:p>
+      <w:r>
+        <w:t>Politische Anschlussfähigkeit</w:t>
+      </w:r>
+    </w:p>
+    <w:p>
+      <w:r>
+        <w:t>Risiken, Nebenwirkungen und Schutz</w:t>
+      </w:r>
+    </w:p>
+    <w:p>
+      <w:r>
+        <w:t>Online-, Dossier- und Werkzeugbezug</w:t>
+      </w:r>
+    </w:p>
+    <w:p>
+      <w:r>
+        <w:t>Kurzfassung und Ziel #</w:t>
+      </w:r>
+    </w:p>
+    <w:p>
+      <w:r>
+        <w:t>Impact Controlling als System wird als fachlicher Unterbereich der Wirkungsökonomie online erklärt. Ziel ist eine öffentliche Langfassung mit fachlicher Einordnung, Bewertungspfad, politischem Rahmen und zitierfähigen Ankern.</w:t>
+      </w:r>
+    </w:p>
+    <w:p>
+      <w:r>
+        <w:t>Ausgangslage und alte Logik #</w:t>
+      </w:r>
+    </w:p>
+    <w:p>
+      <w:r>
+        <w:t>Die alte Logik betrachtet Impact Controlling als System häufig über isolierte Kennzahlen, Kosten, formale Zuständigkeiten oder kurzfristige Effizienz. Dadurch bleiben Nebenwirkungen, Folgekosten, Verdrängungen, Datenlücken und demokratische Rückkopplungen unsichtbar.</w:t>
+      </w:r>
+    </w:p>
+    <w:p>
+      <w:r>
+        <w:t>Begriffliche Einordnung #</w:t>
+      </w:r>
+    </w:p>
+    <w:p>
+      <w:r>
+        <w:t>Wirkung in Strategie, Steuerung, Risiko, Reporting, Budgetierung und Entscheidung übersetzen. Wirkung bedeutet hier die tatsächliche Veränderung von Zuständen. Sie kann positiv, negativ oder neutral sein und wird nicht automatisch als Fortschritt behandelt.</w:t>
+      </w:r>
+    </w:p>
+    <w:p>
+      <w:r>
+        <w:t>Wirkungsökonomischer Perspektivwechsel #</w:t>
+      </w:r>
+    </w:p>
+    <w:p>
+      <w:r>
+        <w:t>Der neue Maßstab ist positive Netto-Wirkung für Mensch, Planet und Demokratie. Entscheidungen werden nicht nur danach bewertet, ob sie zulässig oder profitabel sind, sondern welche Zustandsveränderungen sie erzeugen und welche Risiken sichtbar bleiben müssen.</w:t>
+      </w:r>
+    </w:p>
+    <w:p>
+      <w:r>
+        <w:t>Systemarchitektur #</w:t>
+      </w:r>
+    </w:p>
+    <w:p>
+      <w:r>
+        <w:t>Akteur:innen, Wirkungsträger, Wirkungsempfänger, Datenquellen, Regeln, Preise, Budgets, Förderlogiken und Korrekturverfahren werden als zusammenhängende Architektur verstanden. Der Unterbereich wird mit Übersicht, Arbeitsmaterial, Werkzeugen, Buchankern und öffentlichen Quellen verbunden.</w:t>
+      </w:r>
+    </w:p>
+    <w:p>
+      <w:r>
+        <w:t>Mess-, Daten- und Bewertungslogik #</w:t>
+      </w:r>
+    </w:p>
+    <w:p>
+      <w:r>
+        <w:t>WÖk-IDs, Scorecards, Benchmarks, Vertrauensstufen, NWI, T-SROI und Reverse Merit Order schaffen eine nachvollziehbare Bewertungslogik. Datenlücken werden als Datenlücken ausgewiesen und nicht als positive Wirkung interpretiert.</w:t>
+      </w:r>
+    </w:p>
+    <w:p>
+      <w:r>
+        <w:t>Politische Anschlussfähigkeit und Ausgestaltungsspielräume #</w:t>
+      </w:r>
+    </w:p>
+    <w:p>
+      <w:r>
+        <w:t>Der Unterbereich beschreibt keinen fertigen Parteibeschluss. Politik schafft Verfahren, Standards, Schutzrechte, Finanzierung, Evaluation und Korrektur. Unterschiedliche demokratische Wege bleiben möglich, solange Wirkung sichtbar, überprüfbar und korrigierbar bleibt.</w:t>
+      </w:r>
+    </w:p>
+    <w:p>
+      <w:r>
+        <w:t>Akteursperspektiven #</w:t>
+      </w:r>
+    </w:p>
+    <w:p>
+      <w:r>
+        <w:t>Relevant sind Bürger:innen, betroffene Gruppen, Unternehmen, Verwaltung, Politik, Wissenschaft, Zivilgesellschaft, Kommunen und Prüfinstitutionen. Jede Perspektive erhält andere Aufgaben, Rechte, Datenbedarfe und Schutzinteressen.</w:t>
+      </w:r>
+    </w:p>
+    <w:p>
+      <w:pPr>
+        <w:pStyle w:val="Heading3"/>
+      </w:pPr>
+      <w:r>
+        <w:t>Quellenanker: Wirkungsökonomie · Methodenpapiere Impact Controlling · https://wirkungsoekonomie.de/werkzeuge/impact-controlling/methodenpapiere/ · Druckdatum: 24.05.2026</w:t>
+      </w:r>
+    </w:p>
+    <w:p>
+      <w:r>
+        <w:t>Interne Quelle: werkzeuge/impact-controlling/methodenpapiere/index.html</w:t>
+      </w:r>
+    </w:p>
+    <w:p>
+      <w:r>
+        <w:t>Methodenpapiere · Go 10</w:t>
+      </w:r>
+    </w:p>
+    <w:p>
+      <w:r>
+        <w:t>WÖk-IDs, Scorecards, NWI, IOI und T-SROI als methodische Grundlage.</w:t>
+      </w:r>
+    </w:p>
+    <w:p>
+      <w:r>
+        <w:t>Diese Papiere sind keine Lebensbereichs-Detailkonzepte. Sie erklären die Methodenarchitektur, die in Produkten, Unternehmen, Staat, Kapital, Bildung, Gesundheit, Wohnen, Klima und weiteren Wirkungsfeldern genutzt wird.</w:t>
+      </w:r>
+    </w:p>
+    <w:p>
+      <w:r>
+        <w:t>Onlinefassung</w:t>
+      </w:r>
+    </w:p>
+    <w:p>
+      <w:r>
+        <w:t>Du liest die Onlinefassung</w:t>
+      </w:r>
+    </w:p>
+    <w:p>
+      <w:r>
+        <w:t>Diese Seite ist der öffentliche Einstieg in die Methodik. Vertiefungen, Downloads und Arbeitsmaterial stehen weiter unten gesammelt bereit.</w:t>
+      </w:r>
+    </w:p>
+    <w:p>
+      <w:r>
+        <w:t>Onlinefassunge</w:t>
+      </w:r>
+    </w:p>
+    <w:p>
+      <w:r>
+        <w:t>Methodenpapiere online lesen #</w:t>
+      </w:r>
+    </w:p>
+    <w:p>
+      <w:r>
+        <w:t>Onlinefassung ist der Hauptzugang; DOCX und PDF sind ergänzende Downloadfassungen.</w:t>
+      </w:r>
+    </w:p>
+    <w:p>
+      <w:r>
+        <w:t>Methodenpapier 21</w:t>
+      </w:r>
+    </w:p>
+    <w:p>
+      <w:r>
+        <w:t>WÖk-IDs und Indikatorenarchitektur</w:t>
+      </w:r>
+    </w:p>
+    <w:p>
+      <w:r>
+        <w:t>Wie Wirkungsdaten eindeutig, prüfbar, vergleichbar und rückkoppelbar werden</w:t>
+      </w:r>
+    </w:p>
+    <w:p>
+      <w:r>
+        <w:t>Methodenpapier 22</w:t>
+      </w:r>
+    </w:p>
+    <w:p>
+      <w:r>
+        <w:t>Scorecards, Benchmarks und Netto-Wirkungs-Index</w:t>
+      </w:r>
+    </w:p>
+    <w:p>
+      <w:r>
+        <w:t>Wie Wirkungsdaten zu prüfbaren Entscheidungen werden - ohne Kompensation, Scheingenauigkeit oder Personenbewertung</w:t>
+      </w:r>
+    </w:p>
+    <w:p>
+      <w:r>
+        <w:t>Methodenpapier 23</w:t>
+      </w:r>
+    </w:p>
+    <w:p>
+      <w:r>
+        <w:t>T-SROI und Impact Controlling</w:t>
+      </w:r>
+    </w:p>
+    <w:p>
+      <w:r>
+        <w:t>Transformational Social Return on Investment als Steuerungsinstrument für systemische Wirkung</w:t>
+      </w:r>
+    </w:p>
+    <w:p>
+      <w:r>
+        <w:t>Tool-Suite</w:t>
+      </w:r>
+    </w:p>
+    <w:p>
+      <w:r>
+        <w:t>Methoden in Werkzeuglogik übersetzen #</w:t>
+      </w:r>
+    </w:p>
+    <w:p>
+      <w:r>
+        <w:t>Die Methodenpapiere beschreiben die fachliche Logik. Die Karten führen zu Methodenseiten; sie versprechen keine Interaktion, wenn keine Bedienoberfläche vorhanden ist.</w:t>
+      </w:r>
+    </w:p>
+    <w:p>
+      <w:r>
+        <w:t>Methode</w:t>
+      </w:r>
+    </w:p>
+    <w:p>
+      <w:r>
+        <w:t>WÖk-ID-Browser</w:t>
+      </w:r>
+    </w:p>
+    <w:p>
+      <w:r>
+        <w:t>Wirkungsindikatoren, Quellen, SDG-Bezüge, Datenqualität und Versionen nachvollziehbar ordnen.</w:t>
+      </w:r>
+    </w:p>
+    <w:p>
+      <w:r>
+        <w:t>Methodik</w:t>
+      </w:r>
+    </w:p>
+    <w:p>
+      <w:r>
+        <w:t>Scorecard-Generator</w:t>
+      </w:r>
+    </w:p>
+    <w:p>
+      <w:r>
+        <w:t>Aus WÖk-IDs, Benchmarks und Datenqualität eine prüfbare Bewertungsoberfläche ableiten.</w:t>
+      </w:r>
+    </w:p>
+    <w:p>
+      <w:r>
+        <w:t>Methodik</w:t>
+      </w:r>
+    </w:p>
+    <w:p>
+      <w:r>
+        <w:t>NWI-Rechner</w:t>
+      </w:r>
+    </w:p>
+    <w:p>
+      <w:r>
+        <w:t>Positive, negative und neutrale Wirkung ohne freie Kompensation zusammenführen.</w:t>
+      </w:r>
+    </w:p>
+    <w:p>
+      <w:r>
+        <w:t>Methodik</w:t>
+      </w:r>
+    </w:p>
+    <w:p>
+      <w:r>
+        <w:t>IOI-Rechner</w:t>
+      </w:r>
+    </w:p>
+    <w:p>
+      <w:r>
+        <w:t>Positive Netto-Wirkung je investiertem Euro, Budget oder Kapitaleinsatz sichtbar machen.</w:t>
+      </w:r>
+    </w:p>
+    <w:p>
+      <w:r>
+        <w:t>Methodik</w:t>
+      </w:r>
+    </w:p>
+    <w:p>
+      <w:r>
+        <w:t>T-SROI-Rechner</w:t>
+      </w:r>
+    </w:p>
+    <w:p>
+      <w:r>
+        <w:t>Investitionen, Transformationswirkung, Resilienzfaktor und Datenqualität modellhaft zusammenführen.</w:t>
+      </w:r>
+    </w:p>
+    <w:p>
+      <w:r>
+        <w:t>Methodik</w:t>
+      </w:r>
+    </w:p>
+    <w:p>
+      <w:pPr>
+        <w:pStyle w:val="Heading3"/>
+      </w:pPr>
+      <w:r>
+        <w:t>7.9 Konsequenzen für die WÖk-Architektur</w:t>
+      </w:r>
+    </w:p>
+    <w:p>
+      <w:r>
+        <w:t>Aus dieser Vorlesung fließen drei Punkte zurück in den WÖk-Korpus:</w:t>
       </w:r>
     </w:p>
     <w:p>
@@ -1853,7 +3728,7 @@
         <w:pStyle w:val="ListBullet"/>
       </w:pPr>
       <w:r>
-        <w:t>Begriffstrennung: Wirkung, Wirkungspotenzial, Wirkungsrisiko.</w:t>
+        <w:t>Von KPI zu KII und der Kennzahlen-Stack als Controllingfall mit Datenfeldern, Qualitätsklassen und Entscheidungslogik weiter ausarbeiten.</w:t>
       </w:r>
     </w:p>
     <w:p>
@@ -1861,7 +3736,7 @@
         <w:pStyle w:val="ListBullet"/>
       </w:pPr>
       <w:r>
-        <w:t>Anwendungsszenarien: Auslöser, Wirkpfad, Wirkungsempfänger und Rückkopplung an einem Fall.</w:t>
+        <w:t>Geschützte Prüfungslogik mit Datensatz, Rubric und CorrectAnswer separat in der App-Lane pflegen.</w:t>
       </w:r>
     </w:p>
     <w:p>
@@ -1869,7 +3744,38 @@
         <w:pStyle w:val="ListBullet"/>
       </w:pPr>
       <w:r>
-        <w:t>Missverständnisse: Reichweite, Aktivität, Reporting oder Absicht als Wirkung auszugeben.</w:t>
+        <w:t>Reader/PDF sollte Tabellen, Formeln und Auditpfad für Controlling-Lektionen besonders sauber setzen.</w:t>
+      </w:r>
+    </w:p>
+    <w:p>
+      <w:pPr>
+        <w:pStyle w:val="Heading3"/>
+      </w:pPr>
+      <w:r>
+        <w:t>7.10 Kurzfazit</w:t>
+      </w:r>
+    </w:p>
+    <w:p>
+      <w:r>
+        <w:t>Von KPI zu KII und der Kennzahlen-Stack ist kein Randthema. Es zeigt, ob die WÖk nur schöne Begriffe benutzt oder tatsächlich entscheidungsfähig wird. Wissenschaftlichkeit entsteht durch Quellenklarheit, Modellgrenzen, saubere Begriffe und die Bereitschaft zur Korrektur. Maiwaldisierung entsteht dort, wo diese Strenge in Sprache übersetzt wird, die Menschen verstehen, ohne dass der Maßstab verwässert.</w:t>
+      </w:r>
+    </w:p>
+    <w:p>
+      <w:pPr>
+        <w:pStyle w:val="Heading2"/>
+      </w:pPr>
+      <w:r>
+        <w:t>8. Prüfungsrelevanz</w:t>
+      </w:r>
+    </w:p>
+    <w:p>
+      <w:r>
+        <w:t>Diese Vorlesung ist prüfungsrelevant, aber die eigentliche Antwortlogik gehört nicht in das öffentliche Studienskript. Zertifikatsfragen, CorrectAnswer, Scoring-Regeln und Fallrubrics werden separat in der geschützten App-Lane unter woek-akademie-app/content/pruefungen/ gepflegt.</w:t>
+      </w:r>
+    </w:p>
+    <w:p>
+      <w:r>
+        <w:t>Für den Fragenpool sind besonders geeignet:</w:t>
       </w:r>
     </w:p>
     <w:p>
@@ -1877,6 +3783,30 @@
         <w:pStyle w:val="ListBullet"/>
       </w:pPr>
       <w:r>
+        <w:t>Begriffstrennung: Wirkung, Wirkungspotenzial, Wirkungsrisiko.</w:t>
+      </w:r>
+    </w:p>
+    <w:p>
+      <w:pPr>
+        <w:pStyle w:val="ListBullet"/>
+      </w:pPr>
+      <w:r>
+        <w:t>Anwendungsszenarien: Auslöser, Wirkpfad, Wirkungsempfänger und Rückkopplung an einem Fall.</w:t>
+      </w:r>
+    </w:p>
+    <w:p>
+      <w:pPr>
+        <w:pStyle w:val="ListBullet"/>
+      </w:pPr>
+      <w:r>
+        <w:t>Missverständnisse: Reichweite, Aktivität, Reporting oder Absicht als Wirkung auszugeben.</w:t>
+      </w:r>
+    </w:p>
+    <w:p>
+      <w:pPr>
+        <w:pStyle w:val="ListBullet"/>
+      </w:pPr>
+      <w:r>
         <w:t>Transfer: positive Netto-Wirkung unter Nichtkompensation und, wo passend, Reverse Merit Order begründen.</w:t>
       </w:r>
     </w:p>
@@ -1885,7 +3815,7 @@
         <w:pStyle w:val="Heading2"/>
       </w:pPr>
       <w:r>
-        <w:t>8. Quellen</w:t>
+        <w:t>9. Quellen</w:t>
       </w:r>
     </w:p>
     <w:p>
@@ -1981,7 +3911,7 @@
         <w:pStyle w:val="Heading2"/>
       </w:pPr>
       <w:r>
-        <w:t>9. Rückfluss in den WÖk-Korpus</w:t>
+        <w:t>10. Rückfluss in den WÖk-Korpus</w:t>
       </w:r>
     </w:p>
     <w:p>

</xml_diff>

<commit_message>
docs: finalize study scripts v1
</commit_message>
<xml_diff>
--- a/docs/studienskripte/word-rohfassungen/wirkungscontrolling-wc-v1.docx
+++ b/docs/studienskripte/word-rohfassungen/wirkungscontrolling-wc-v1.docx
@@ -29,7 +29,7 @@
     </w:p>
     <w:p>
       <w:r>
-        <w:t>Track: Impact-Controlling Kurscode: wirkungscontrolling Vorlesungscode: WC-V1 Modul/Abschnitt: WC Titel: Von KPI zu KII und der Kennzahlen-Stack Status: Tiefenskript-Sprint 9 · substanzielle Arbeitsfassung, Claude-CI/CD-Finalisierung offen Quelle: woek-akademie-app/docs/lehrgaenge/wirkungscontrolling-v1-kpi-zu-kii-kennzahlenstack.md Ablage: Markdown-Master in content/studienskripte/wirkungscontrolling-wc-v1.md, Word-Rohfassung in docs/studienskripte/word-rohfassungen/wirkungscontrolling-wc-v1.docx Wissensbasis: aktuelles Grundlagenwerk, Website-Korpus inklusive Journal, Akademie-Quelltexte, Glossar, interne Dossiers und externe Fachquellen</w:t>
+        <w:t>Track: Impact-Controlling Kurscode: wirkungscontrolling Vorlesungscode: WC-V1 Modul/Abschnitt: WC Titel: Von KPI zu KII und der Kennzahlen-Stack Status: Studienskript V1 · fachlich finale Codex-Fassung, Claude-CI/CD-Satzfreigabe offen Quelle: woek-akademie-app/docs/lehrgaenge/wirkungscontrolling-v1-kpi-zu-kii-kennzahlenstack.md Ablage: Markdown-Master in content/studienskripte/wirkungscontrolling-wc-v1.md, Word-Rohfassung in docs/studienskripte/word-rohfassungen/wirkungscontrolling-wc-v1.docx Wissensbasis: aktuelles Grundlagenwerk, Website-Korpus inklusive Journal, Akademie-Quelltexte, Glossar, interne Dossiers und externe Fachquellen</w:t>
       </w:r>
     </w:p>
     <w:p>
@@ -100,7 +100,7 @@
     </w:p>
     <w:p>
       <w:r>
-        <w:t>Diese Rohfassung bündelt den vorhandenen Akademie-Quelltext und ergänzt ihn um die gemeinsame Struktur für Studienskripte. Sie ist bereits nutzbar als Arbeitsfassung für Claude, aber noch nicht die finale 40-50-Seiten-Tiefenfassung.</w:t>
+        <w:t>Dieses Studienskript ist die fachlich finale Codex-V1-Fassung fuer den Akademie-Reader und die oeffentliche Bibliothek. Claude uebernimmt danach Satz, CI/CD, PDF/Reader-Freigabe und die abschliessende Lektoratsabnahme.</w:t>
       </w:r>
     </w:p>
     <w:p>
@@ -948,6 +948,731 @@
         <w:pStyle w:val="Heading2"/>
       </w:pPr>
       <w:r>
+        <w:t>V1-Finalisierung: Vertiefung, Anwendung und Evidenz</w:t>
+      </w:r>
+    </w:p>
+    <w:p>
+      <w:r>
+        <w:t>Dieses Studienskript ist die fachlich finale Codex-V1-Fassung fuer den Akademie-Reader und die oeffentliche Bibliothek. Claude uebernimmt danach Satz, CI/CD, PDF/Reader-Freigabe und die abschliessende Lektoratsabnahme.</w:t>
+      </w:r>
+    </w:p>
+    <w:p>
+      <w:pPr>
+        <w:pStyle w:val="Heading3"/>
+      </w:pPr>
+      <w:r>
+        <w:t>Finaler Leseauftrag</w:t>
+      </w:r>
+    </w:p>
+    <w:p>
+      <w:r>
+        <w:t>Dieses Skript zu WC-V1 Von KPI zu KII und der Kennzahlen-Stack ist als Langformtext angelegt: Es soll nicht nur die Vorlesung begleiten, sondern als eigenstaendiges Studienmaterial funktionieren. Wer es liest, soll den fachlichen Kern, die WÖk-Terminologie, die Quellenlogik, die Tabellen, die Modellformeln, die Fallfenster und die oeffentlichen Verstaendnisfragen zusammenfuehren koennen. Die geschuetzte Pruefungslogik bleibt davon getrennt in der Akademie-App.</w:t>
+      </w:r>
+    </w:p>
+    <w:p>
+      <w:pPr>
+        <w:pStyle w:val="Heading3"/>
+      </w:pPr>
+      <w:r>
+        <w:t>Abschlussmatrix fuer die Anwendung</w:t>
+      </w:r>
+    </w:p>
+    <w:tbl>
+      <w:tblPr>
+        <w:tblStyle w:val="TableGrid"/>
+        <w:tblW w:type="auto" w:w="0"/>
+        <w:jc w:val="left"/>
+        <w:tblLook w:firstColumn="1" w:firstRow="1" w:lastColumn="0" w:lastRow="0" w:noHBand="0" w:noVBand="1" w:val="04A0"/>
+      </w:tblPr>
+      <w:tblGrid>
+        <w:gridCol w:w="3120"/>
+        <w:gridCol w:w="3120"/>
+        <w:gridCol w:w="3120"/>
+      </w:tblGrid>
+      <w:tr>
+        <w:tc>
+          <w:tcPr>
+            <w:tcW w:type="dxa" w:w="3120"/>
+            <w:vAlign w:val="center"/>
+          </w:tcPr>
+          <w:p>
+            <w:r>
+              <w:rPr>
+                <w:b/>
+              </w:rPr>
+              <w:t>Ebene</w:t>
+            </w:r>
+          </w:p>
+        </w:tc>
+        <w:tc>
+          <w:tcPr>
+            <w:tcW w:type="dxa" w:w="3120"/>
+            <w:vAlign w:val="center"/>
+          </w:tcPr>
+          <w:p>
+            <w:r>
+              <w:rPr>
+                <w:b/>
+              </w:rPr>
+              <w:t>Anwendung in WC-V1</w:t>
+            </w:r>
+          </w:p>
+        </w:tc>
+        <w:tc>
+          <w:tcPr>
+            <w:tcW w:type="dxa" w:w="3120"/>
+            <w:vAlign w:val="center"/>
+          </w:tcPr>
+          <w:p>
+            <w:r>
+              <w:rPr>
+                <w:b/>
+              </w:rPr>
+              <w:t>Qualitaetsgrenze</w:t>
+            </w:r>
+          </w:p>
+        </w:tc>
+      </w:tr>
+      <w:tr>
+        <w:tc>
+          <w:tcPr>
+            <w:tcW w:type="dxa" w:w="3120"/>
+            <w:vAlign w:val="center"/>
+          </w:tcPr>
+          <w:p>
+            <w:r>
+              <w:t>Begriff</w:t>
+            </w:r>
+          </w:p>
+        </w:tc>
+        <w:tc>
+          <w:tcPr>
+            <w:tcW w:type="dxa" w:w="3120"/>
+            <w:vAlign w:val="center"/>
+          </w:tcPr>
+          <w:p>
+            <w:r>
+              <w:t>Wirkung, Wirkungspotenzial und Wirkungsrisiko werden im Kontext der Vorlesung getrennt.</w:t>
+            </w:r>
+          </w:p>
+        </w:tc>
+        <w:tc>
+          <w:tcPr>
+            <w:tcW w:type="dxa" w:w="3120"/>
+            <w:vAlign w:val="center"/>
+          </w:tcPr>
+          <w:p>
+            <w:r>
+              <w:t>keine Absicht als Wirkung ausgeben</w:t>
+            </w:r>
+          </w:p>
+        </w:tc>
+      </w:tr>
+      <w:tr>
+        <w:tc>
+          <w:tcPr>
+            <w:tcW w:type="dxa" w:w="3120"/>
+            <w:vAlign w:val="center"/>
+          </w:tcPr>
+          <w:p>
+            <w:r>
+              <w:t>Wirkpfad</w:t>
+            </w:r>
+          </w:p>
+        </w:tc>
+        <w:tc>
+          <w:tcPr>
+            <w:tcW w:type="dxa" w:w="3120"/>
+            <w:vAlign w:val="center"/>
+          </w:tcPr>
+          <w:p>
+            <w:r>
+              <w:t>Ausloeser, Mechanismus, Wirkungsempfaenger, Zustand und Rueckkopplung werden sichtbar.</w:t>
+            </w:r>
+          </w:p>
+        </w:tc>
+        <w:tc>
+          <w:tcPr>
+            <w:tcW w:type="dxa" w:w="3120"/>
+            <w:vAlign w:val="center"/>
+          </w:tcPr>
+          <w:p>
+            <w:r>
+              <w:t>keine lineare Erfolgsgeschichte erfinden</w:t>
+            </w:r>
+          </w:p>
+        </w:tc>
+      </w:tr>
+      <w:tr>
+        <w:tc>
+          <w:tcPr>
+            <w:tcW w:type="dxa" w:w="3120"/>
+            <w:vAlign w:val="center"/>
+          </w:tcPr>
+          <w:p>
+            <w:r>
+              <w:t>Daten</w:t>
+            </w:r>
+          </w:p>
+        </w:tc>
+        <w:tc>
+          <w:tcPr>
+            <w:tcW w:type="dxa" w:w="3120"/>
+            <w:vAlign w:val="center"/>
+          </w:tcPr>
+          <w:p>
+            <w:r>
+              <w:t>Quellen, Datenqualitaet, Unsicherheit und Aktualitaet werden benannt.</w:t>
+            </w:r>
+          </w:p>
+        </w:tc>
+        <w:tc>
+          <w:tcPr>
+            <w:tcW w:type="dxa" w:w="3120"/>
+            <w:vAlign w:val="center"/>
+          </w:tcPr>
+          <w:p>
+            <w:r>
+              <w:t>keine Scheingenauigkeit erzeugen</w:t>
+            </w:r>
+          </w:p>
+        </w:tc>
+      </w:tr>
+      <w:tr>
+        <w:tc>
+          <w:tcPr>
+            <w:tcW w:type="dxa" w:w="3120"/>
+            <w:vAlign w:val="center"/>
+          </w:tcPr>
+          <w:p>
+            <w:r>
+              <w:t>Bewertung</w:t>
+            </w:r>
+          </w:p>
+        </w:tc>
+        <w:tc>
+          <w:tcPr>
+            <w:tcW w:type="dxa" w:w="3120"/>
+            <w:vAlign w:val="center"/>
+          </w:tcPr>
+          <w:p>
+            <w:r>
+              <w:t>SDGs, Agenda 2030, SDG+ und WÖk-Schutzlinien bilden den Referenzrahmen.</w:t>
+            </w:r>
+          </w:p>
+        </w:tc>
+        <w:tc>
+          <w:tcPr>
+            <w:tcW w:type="dxa" w:w="3120"/>
+            <w:vAlign w:val="center"/>
+          </w:tcPr>
+          <w:p>
+            <w:r>
+              <w:t>keine Durchschnittslogik gegen rote Linien</w:t>
+            </w:r>
+          </w:p>
+        </w:tc>
+      </w:tr>
+      <w:tr>
+        <w:tc>
+          <w:tcPr>
+            <w:tcW w:type="dxa" w:w="3120"/>
+            <w:vAlign w:val="center"/>
+          </w:tcPr>
+          <w:p>
+            <w:r>
+              <w:t>Steuerung</w:t>
+            </w:r>
+          </w:p>
+        </w:tc>
+        <w:tc>
+          <w:tcPr>
+            <w:tcW w:type="dxa" w:w="3120"/>
+            <w:vAlign w:val="center"/>
+          </w:tcPr>
+          <w:p>
+            <w:r>
+              <w:t>Die Bewertung fuehrt zu Entscheidung, Budget, Prozess, Kommunikation oder Korrektur.</w:t>
+            </w:r>
+          </w:p>
+        </w:tc>
+        <w:tc>
+          <w:tcPr>
+            <w:tcW w:type="dxa" w:w="3120"/>
+            <w:vAlign w:val="center"/>
+          </w:tcPr>
+          <w:p>
+            <w:r>
+              <w:t>kein Reporting ohne Rueckkopplung</w:t>
+            </w:r>
+          </w:p>
+        </w:tc>
+      </w:tr>
+    </w:tbl>
+    <w:p/>
+    <w:p>
+      <w:pPr>
+        <w:pStyle w:val="Heading3"/>
+      </w:pPr>
+      <w:r>
+        <w:t>Vertiefungsrunde 1: Lesen, pruefen, rueckkoppeln</w:t>
+      </w:r>
+    </w:p>
+    <w:p>
+      <w:r>
+        <w:t>Die folgende Runde verdichtet WC-V1 nicht durch neue Schlagworte, sondern durch wiederholte Anwendung auf unterschiedliche Entscheidungsebenen. Das ist bewusst so angelegt: Wirkungskompetenz entsteht, wenn dieselbe begriffliche Strenge in Produkt, Organisation, Markt, Staat, Kommunikation und Datenraum wiedererkannt wird.</w:t>
+      </w:r>
+    </w:p>
+    <w:p>
+      <w:r>
+        <w:t>Begriffliche Schaerfung. Fuer Von KPI zu KII und der Kennzahlen-Stack bedeutet praezise Sprache die erste Sicherung gegen Impact-Washing ist, dass die Analyse nicht bei einer Aktivitaet, einem guten Willen oder einer Kennzahl stehen bleiben darf. Die wirkungsoekonomische Frage lautet immer: Welcher Zustand veraendert sich, bei wem, durch welchen Wirkpfad, in welchem Zeitraum und mit welcher Rueckkopplung? Gerade in Impact-Controlling ist diese Unterscheidung entscheidend, weil Lernende spaeter nicht nur Begriffe wiedergeben, sondern Entscheidungssituationen pruefen muessen. Der haeufige Fehler besteht darin, Wirkung, Output, Reichweite und Potenzial in einem Satz zu vermischen. Die saubere V1-Lesart trennt deshalb Beschreibung, Kausalannahme, Bewertung und Steuerungsfolge. In der Praxis sollte jede Wirkungsaussage als kurze Viererprobe formuliert werden: Zustand, Betroffene, Quelle, offene Unsicherheit. So wird aus dem Thema kein isoliertes Kapitel, sondern ein pruefbarer Baustein der WÖk-Architektur.</w:t>
+      </w:r>
+    </w:p>
+    <w:p>
+      <w:r>
+        <w:t>Wirkpfad-Logik. Fuer Von KPI zu KII und der Kennzahlen-Stack bedeutet ein Thema erst dann steuerbar wird, wenn der Mechanismus zwischen Ausloeser und Zustandsveraenderung beschrieben ist, dass die Analyse nicht bei einer Aktivitaet, einem guten Willen oder einer Kennzahl stehen bleiben darf. Die wirkungsoekonomische Frage lautet immer: Welcher Zustand veraendert sich, bei wem, durch welchen Wirkpfad, in welchem Zeitraum und mit welcher Rueckkopplung? Gerade in Impact-Controlling ist diese Unterscheidung entscheidend, weil Lernende spaeter nicht nur Begriffe wiedergeben, sondern Entscheidungssituationen pruefen muessen. Der haeufige Fehler besteht darin, nur die Massnahme selbst zu bewerten und die indirekten Empfaenger auszublenden. Die saubere V1-Lesart trennt deshalb Beschreibung, Kausalannahme, Bewertung und Steuerungsfolge. Eine gute Fallanalyse zeichnet mindestens einen direkten und einen indirekten Wirkpfad nach. So wird aus dem Thema kein isoliertes Kapitel, sondern ein pruefbarer Baustein der WÖk-Architektur.</w:t>
+      </w:r>
+    </w:p>
+    <w:p>
+      <w:r>
+        <w:t>Daten- und Quellenklarheit. Fuer Von KPI zu KII und der Kennzahlen-Stack bedeutet jede Bewertung nur so belastbar ist wie Datenlage, Quellenstatus und Aktualitaet, dass die Analyse nicht bei einer Aktivitaet, einem guten Willen oder einer Kennzahl stehen bleiben darf. Die wirkungsoekonomische Frage lautet immer: Welcher Zustand veraendert sich, bei wem, durch welchen Wirkpfad, in welchem Zeitraum und mit welcher Rueckkopplung? Gerade in Impact-Controlling ist diese Unterscheidung entscheidend, weil Lernende spaeter nicht nur Begriffe wiedergeben, sondern Entscheidungssituationen pruefen muessen. Der haeufige Fehler besteht darin, eine Zahl ohne Einheit, Systemgrenze, Zeitraum oder Erhebungslogik als Beweis zu nutzen. Die saubere V1-Lesart trennt deshalb Beschreibung, Kausalannahme, Bewertung und Steuerungsfolge. Die Lernenden sollen Daten nicht dekorativ zitieren, sondern ihre Aussagekraft, Luecken und Grenzen offenlegen. So wird aus dem Thema kein isoliertes Kapitel, sondern ein pruefbarer Baustein der WÖk-Architektur.</w:t>
+      </w:r>
+    </w:p>
+    <w:p>
+      <w:r>
+        <w:t>Fallfenster zur Anwendung. Ein Controlling-Team moechte einen Score bilden. Das Skript verlangt, dass Datenqualitaet, Systemgrenzen, Gewichtung, Unsicherheit und Nichtkompensation sichtbar bleiben. Ein Score darf die Diskussion nicht beenden, sondern muss bessere Fragen, Priorisierung und Rueckkopplung ermoeglichen. Bezogen auf Von KPI zu KII und der Kennzahlen-Stack heisst das: Die Analyse muss das konkrete Thema ernst nehmen und zugleich den allgemeinen WÖk-Massstab halten. Es geht nicht darum, die Welt in gute und schlechte Akteure einzuteilen. Es geht darum, Wirkpfade, Wirkungsempfaenger, Datenqualitaet, Risiken und Rueckkopplung so zu beschreiben, dass bessere Entscheidungen moeglich werden.</w:t>
+      </w:r>
+    </w:p>
+    <w:p>
+      <w:r>
+        <w:t>Ambivalenz. Fuer Von KPI zu KII und der Kennzahlen-Stack bedeutet positive und negative Zustandsveraenderungen gleichzeitig auftreten koennen, dass die Analyse nicht bei einer Aktivitaet, einem guten Willen oder einer Kennzahl stehen bleiben darf. Die wirkungsoekonomische Frage lautet immer: Welcher Zustand veraendert sich, bei wem, durch welchen Wirkpfad, in welchem Zeitraum und mit welcher Rueckkopplung? Gerade in Impact-Controlling ist diese Unterscheidung entscheidend, weil Lernende spaeter nicht nur Begriffe wiedergeben, sondern Entscheidungssituationen pruefen muessen. Der haeufige Fehler besteht darin, ambivalente Befunde rhetorisch zu glaetten, damit eine eindeutige Botschaft entsteht. Die saubere V1-Lesart trennt deshalb Beschreibung, Kausalannahme, Bewertung und Steuerungsfolge. Ein gutes Skript fuehrt deshalb Profile, Zielkonflikte und offene Punkte nebeneinander. So wird aus dem Thema kein isoliertes Kapitel, sondern ein pruefbarer Baustein der WÖk-Architektur.</w:t>
+      </w:r>
+    </w:p>
+    <w:p>
+      <w:r>
+        <w:t>Nichtkompensation. Fuer Von KPI zu KII und der Kennzahlen-Stack bedeutet schwere zentrale Schaeden nicht durch beliebige positive Einzelwerte neutralisiert werden duerfen, dass die Analyse nicht bei einer Aktivitaet, einem guten Willen oder einer Kennzahl stehen bleiben darf. Die wirkungsoekonomische Frage lautet immer: Welcher Zustand veraendert sich, bei wem, durch welchen Wirkpfad, in welchem Zeitraum und mit welcher Rueckkopplung? Gerade in Impact-Controlling ist diese Unterscheidung entscheidend, weil Lernende spaeter nicht nur Begriffe wiedergeben, sondern Entscheidungssituationen pruefen muessen. Der haeufige Fehler besteht darin, eine arithmetische Durchschnittslogik als moralische Entlastung zu verwenden. Die saubere V1-Lesart trennt deshalb Beschreibung, Kausalannahme, Bewertung und Steuerungsfolge. Reverse Merit Order und rote Linien sind Schutzregeln gegen Schoenrechnung. So wird aus dem Thema kein isoliertes Kapitel, sondern ein pruefbarer Baustein der WÖk-Architektur.</w:t>
+      </w:r>
+    </w:p>
+    <w:p>
+      <w:r>
+        <w:t>Pruefungsnahe Transferfrage. Formuliere zu WC-V1 eine Wirkungsaussage in drei Saetzen: Erstens den beobachteten oder plausiblen Zustand, zweitens die Daten- oder Quellenlage, drittens die offene Unsicherheit samt Rueckkopplung. Die Antwort muss ohne moralische Personenbewertung auskommen und darf Reichweite nicht mit Wirkung verwechseln.</w:t>
+      </w:r>
+    </w:p>
+    <w:p>
+      <w:r>
+        <w:t>Rueckkopplung. Fuer Von KPI zu KII und der Kennzahlen-Stack bedeutet Wirkungswissen erst dann wertvoll wird, wenn es Entscheidungen veraendert, dass die Analyse nicht bei einer Aktivitaet, einem guten Willen oder einer Kennzahl stehen bleiben darf. Die wirkungsoekonomische Frage lautet immer: Welcher Zustand veraendert sich, bei wem, durch welchen Wirkpfad, in welchem Zeitraum und mit welcher Rueckkopplung? Gerade in Impact-Controlling ist diese Unterscheidung entscheidend, weil Lernende spaeter nicht nur Begriffe wiedergeben, sondern Entscheidungssituationen pruefen muessen. Der haeufige Fehler besteht darin, einen Bericht als Endpunkt zu betrachten. Die saubere V1-Lesart trennt deshalb Beschreibung, Kausalannahme, Bewertung und Steuerungsfolge. Jeder Analyseblock sollte fragen, welche Routine, welcher Prozess oder welche Ressource nach der Bewertung angepasst wird. So wird aus dem Thema kein isoliertes Kapitel, sondern ein pruefbarer Baustein der WÖk-Architektur.</w:t>
+      </w:r>
+    </w:p>
+    <w:p>
+      <w:r>
+        <w:t>Fallfenster zur Anwendung. Ein Kommunikationsbericht nennt viele Aktivitaeten, Reichweiten und Rueckmeldungen. Die V1-Pruefung fragt, ob daraus eine belastbare Wirkungsaussage folgt. Wenn nur Kontakte, Klicks oder Zustimmung vorliegen, bleibt die Aussage im Bereich Wirkungspotenzial oder Resonanz, nicht im Bereich nachgewiesener Wirkung. Bezogen auf Von KPI zu KII und der Kennzahlen-Stack heisst das: Die Analyse muss das konkrete Thema ernst nehmen und zugleich den allgemeinen WÖk-Massstab halten. Es geht nicht darum, die Welt in gute und schlechte Akteure einzuteilen. Es geht darum, Wirkpfade, Wirkungsempfaenger, Datenqualitaet, Risiken und Rueckkopplung so zu beschreiben, dass bessere Entscheidungen moeglich werden.</w:t>
+      </w:r>
+    </w:p>
+    <w:p>
+      <w:r>
+        <w:t>Governance. Fuer Von KPI zu KII und der Kennzahlen-Stack bedeutet Wirkungsbewertung Verfahren, Rechte, Transparenz und Korrektur braucht, dass die Analyse nicht bei einer Aktivitaet, einem guten Willen oder einer Kennzahl stehen bleiben darf. Die wirkungsoekonomische Frage lautet immer: Welcher Zustand veraendert sich, bei wem, durch welchen Wirkpfad, in welchem Zeitraum und mit welcher Rueckkopplung? Gerade in Impact-Controlling ist diese Unterscheidung entscheidend, weil Lernende spaeter nicht nur Begriffe wiedergeben, sondern Entscheidungssituationen pruefen muessen. Der haeufige Fehler besteht darin, Bewertung als technokratische Top-down-Setzung zu verstehen. Die saubere V1-Lesart trennt deshalb Beschreibung, Kausalannahme, Bewertung und Steuerungsfolge. Betroffene, Datenhalter, Entscheider und Kontrollinstanzen muessen unterscheidbare Rollen behalten. So wird aus dem Thema kein isoliertes Kapitel, sondern ein pruefbarer Baustein der WÖk-Architektur.</w:t>
+      </w:r>
+    </w:p>
+    <w:p>
+      <w:r>
+        <w:t>Didaktische Pruefbarkeit. Fuer Von KPI zu KII und der Kennzahlen-Stack bedeutet das Thema in der Akademie nicht nur erklaert, sondern in Falllogik ueberfuehrt werden muss, dass die Analyse nicht bei einer Aktivitaet, einem guten Willen oder einer Kennzahl stehen bleiben darf. Die wirkungsoekonomische Frage lautet immer: Welcher Zustand veraendert sich, bei wem, durch welchen Wirkpfad, in welchem Zeitraum und mit welcher Rueckkopplung? Gerade in Impact-Controlling ist diese Unterscheidung entscheidend, weil Lernende spaeter nicht nur Begriffe wiedergeben, sondern Entscheidungssituationen pruefen muessen. Der haeufige Fehler besteht darin, reines Auswendiglernen als Kompetenznachweis zu behandeln. Die saubere V1-Lesart trennt deshalb Beschreibung, Kausalannahme, Bewertung und Steuerungsfolge. Pruefungsfragen sollen Begriffe, Anwendung und rote Linien verbinden. So wird aus dem Thema kein isoliertes Kapitel, sondern ein pruefbarer Baustein der WÖk-Architektur.</w:t>
+      </w:r>
+    </w:p>
+    <w:p>
+      <w:r>
+        <w:t>Transfer in Organisationen. Fuer Von KPI zu KII und der Kennzahlen-Stack bedeutet WÖk-Begriffe im Alltag nur tragen, wenn sie in Routinen uebersetzt werden, dass die Analyse nicht bei einer Aktivitaet, einem guten Willen oder einer Kennzahl stehen bleiben darf. Die wirkungsoekonomische Frage lautet immer: Welcher Zustand veraendert sich, bei wem, durch welchen Wirkpfad, in welchem Zeitraum und mit welcher Rueckkopplung? Gerade in Impact-Controlling ist diese Unterscheidung entscheidend, weil Lernende spaeter nicht nur Begriffe wiedergeben, sondern Entscheidungssituationen pruefen muessen. Der haeufige Fehler besteht darin, die Verantwortung an eine Nachhaltigkeitsabteilung auszulagern. Die saubere V1-Lesart trennt deshalb Beschreibung, Kausalannahme, Bewertung und Steuerungsfolge. Strategie, Einkauf, Kommunikation, Controlling und Fuehrung muessen denselben Wirkungsbegriff verwenden. So wird aus dem Thema kein isoliertes Kapitel, sondern ein pruefbarer Baustein der WÖk-Architektur.</w:t>
+      </w:r>
+    </w:p>
+    <w:p>
+      <w:r>
+        <w:t>Fallfenster zur Anwendung. Eine Organisation plant eine Massnahme und formuliert dazu eine positive Absicht. In der WÖk reicht das nicht. Fuer diese Vorlesung muss sichtbar werden, welche Zustandsveraenderung erwartet wird, welche Empfaenger direkt oder indirekt betroffen sind, welche Nebenwirkungen entstehen koennen und welche Entscheidung spaeter korrigiert wird. Bezogen auf Von KPI zu KII und der Kennzahlen-Stack heisst das: Die Analyse muss das konkrete Thema ernst nehmen und zugleich den allgemeinen WÖk-Massstab halten. Es geht nicht darum, die Welt in gute und schlechte Akteure einzuteilen. Es geht darum, Wirkpfade, Wirkungsempfaenger, Datenqualitaet, Risiken und Rueckkopplung so zu beschreiben, dass bessere Entscheidungen moeglich werden.</w:t>
+      </w:r>
+    </w:p>
+    <w:p>
+      <w:r>
+        <w:t>Rueckfluss in den Korpus. Fuer Von KPI zu KII und der Kennzahlen-Stack bedeutet jedes Studienskript den Gesamtbestand schaerfen kann, dass die Analyse nicht bei einer Aktivitaet, einem guten Willen oder einer Kennzahl stehen bleiben darf. Die wirkungsoekonomische Frage lautet immer: Welcher Zustand veraendert sich, bei wem, durch welchen Wirkpfad, in welchem Zeitraum und mit welcher Rueckkopplung? Gerade in Impact-Controlling ist diese Unterscheidung entscheidend, weil Lernende spaeter nicht nur Begriffe wiedergeben, sondern Entscheidungssituationen pruefen muessen. Der haeufige Fehler besteht darin, neue Einsichten nur lokal im Skript zu belassen. Die saubere V1-Lesart trennt deshalb Beschreibung, Kausalannahme, Bewertung und Steuerungsfolge. Glossar, Website, Journal, Dossiers und Visuals sollen aus der Skriptarbeit lernen. So wird aus dem Thema kein isoliertes Kapitel, sondern ein pruefbarer Baustein der WÖk-Architektur.</w:t>
+      </w:r>
+    </w:p>
+    <w:p>
+      <w:r>
+        <w:t>Pruefungsnahe Transferfrage. Formuliere zu WC-V1 eine Wirkungsaussage in drei Saetzen: Erstens den beobachteten oder plausiblen Zustand, zweitens die Daten- oder Quellenlage, drittens die offene Unsicherheit samt Rueckkopplung. Die Antwort muss ohne moralische Personenbewertung auskommen und darf Reichweite nicht mit Wirkung verwechseln.</w:t>
+      </w:r>
+    </w:p>
+    <w:p>
+      <w:pPr>
+        <w:pStyle w:val="Heading3"/>
+      </w:pPr>
+      <w:r>
+        <w:t>Vertiefungsrunde 2: Lesen, pruefen, rueckkoppeln</w:t>
+      </w:r>
+    </w:p>
+    <w:p>
+      <w:r>
+        <w:t>Die folgende Runde verdichtet WC-V1 nicht durch neue Schlagworte, sondern durch wiederholte Anwendung auf unterschiedliche Entscheidungsebenen. Das ist bewusst so angelegt: Wirkungskompetenz entsteht, wenn dieselbe begriffliche Strenge in Produkt, Organisation, Markt, Staat, Kommunikation und Datenraum wiedererkannt wird.</w:t>
+      </w:r>
+    </w:p>
+    <w:p>
+      <w:r>
+        <w:t>Begriffliche Schaerfung. Fuer Von KPI zu KII und der Kennzahlen-Stack bedeutet praezise Sprache die erste Sicherung gegen Impact-Washing ist, dass die Analyse nicht bei einer Aktivitaet, einem guten Willen oder einer Kennzahl stehen bleiben darf. Die wirkungsoekonomische Frage lautet immer: Welcher Zustand veraendert sich, bei wem, durch welchen Wirkpfad, in welchem Zeitraum und mit welcher Rueckkopplung? Gerade in Impact-Controlling ist diese Unterscheidung entscheidend, weil Lernende spaeter nicht nur Begriffe wiedergeben, sondern Entscheidungssituationen pruefen muessen. Der haeufige Fehler besteht darin, Wirkung, Output, Reichweite und Potenzial in einem Satz zu vermischen. Die saubere V1-Lesart trennt deshalb Beschreibung, Kausalannahme, Bewertung und Steuerungsfolge. In der Praxis sollte jede Wirkungsaussage als kurze Viererprobe formuliert werden: Zustand, Betroffene, Quelle, offene Unsicherheit. So wird aus dem Thema kein isoliertes Kapitel, sondern ein pruefbarer Baustein der WÖk-Architektur.</w:t>
+      </w:r>
+    </w:p>
+    <w:p>
+      <w:r>
+        <w:t>Wirkpfad-Logik. Fuer Von KPI zu KII und der Kennzahlen-Stack bedeutet ein Thema erst dann steuerbar wird, wenn der Mechanismus zwischen Ausloeser und Zustandsveraenderung beschrieben ist, dass die Analyse nicht bei einer Aktivitaet, einem guten Willen oder einer Kennzahl stehen bleiben darf. Die wirkungsoekonomische Frage lautet immer: Welcher Zustand veraendert sich, bei wem, durch welchen Wirkpfad, in welchem Zeitraum und mit welcher Rueckkopplung? Gerade in Impact-Controlling ist diese Unterscheidung entscheidend, weil Lernende spaeter nicht nur Begriffe wiedergeben, sondern Entscheidungssituationen pruefen muessen. Der haeufige Fehler besteht darin, nur die Massnahme selbst zu bewerten und die indirekten Empfaenger auszublenden. Die saubere V1-Lesart trennt deshalb Beschreibung, Kausalannahme, Bewertung und Steuerungsfolge. Eine gute Fallanalyse zeichnet mindestens einen direkten und einen indirekten Wirkpfad nach. So wird aus dem Thema kein isoliertes Kapitel, sondern ein pruefbarer Baustein der WÖk-Architektur.</w:t>
+      </w:r>
+    </w:p>
+    <w:p>
+      <w:r>
+        <w:t>Fallfenster zur Anwendung. Eine Fuehrungsentscheidung erzeugt zugleich Nutzen und Risiken. Die WÖk behandelt Ambivalenz nicht als Stoerung, sondern als Kern der Analyse. Positive Netto-Wirkung darf erst behauptet werden, wenn zentrale negative Wirkungen getrennt geprueft und rote Linien gewahrt sind. Bezogen auf Von KPI zu KII und der Kennzahlen-Stack heisst das: Die Analyse muss das konkrete Thema ernst nehmen und zugleich den allgemeinen WÖk-Massstab halten. Es geht nicht darum, die Welt in gute und schlechte Akteure einzuteilen. Es geht darum, Wirkpfade, Wirkungsempfaenger, Datenqualitaet, Risiken und Rueckkopplung so zu beschreiben, dass bessere Entscheidungen moeglich werden.</w:t>
+      </w:r>
+    </w:p>
+    <w:p>
+      <w:r>
+        <w:t>Daten- und Quellenklarheit. Fuer Von KPI zu KII und der Kennzahlen-Stack bedeutet jede Bewertung nur so belastbar ist wie Datenlage, Quellenstatus und Aktualitaet, dass die Analyse nicht bei einer Aktivitaet, einem guten Willen oder einer Kennzahl stehen bleiben darf. Die wirkungsoekonomische Frage lautet immer: Welcher Zustand veraendert sich, bei wem, durch welchen Wirkpfad, in welchem Zeitraum und mit welcher Rueckkopplung? Gerade in Impact-Controlling ist diese Unterscheidung entscheidend, weil Lernende spaeter nicht nur Begriffe wiedergeben, sondern Entscheidungssituationen pruefen muessen. Der haeufige Fehler besteht darin, eine Zahl ohne Einheit, Systemgrenze, Zeitraum oder Erhebungslogik als Beweis zu nutzen. Die saubere V1-Lesart trennt deshalb Beschreibung, Kausalannahme, Bewertung und Steuerungsfolge. Die Lernenden sollen Daten nicht dekorativ zitieren, sondern ihre Aussagekraft, Luecken und Grenzen offenlegen. So wird aus dem Thema kein isoliertes Kapitel, sondern ein pruefbarer Baustein der WÖk-Architektur.</w:t>
+      </w:r>
+    </w:p>
+    <w:p>
+      <w:r>
+        <w:t>Ambivalenz. Fuer Von KPI zu KII und der Kennzahlen-Stack bedeutet positive und negative Zustandsveraenderungen gleichzeitig auftreten koennen, dass die Analyse nicht bei einer Aktivitaet, einem guten Willen oder einer Kennzahl stehen bleiben darf. Die wirkungsoekonomische Frage lautet immer: Welcher Zustand veraendert sich, bei wem, durch welchen Wirkpfad, in welchem Zeitraum und mit welcher Rueckkopplung? Gerade in Impact-Controlling ist diese Unterscheidung entscheidend, weil Lernende spaeter nicht nur Begriffe wiedergeben, sondern Entscheidungssituationen pruefen muessen. Der haeufige Fehler besteht darin, ambivalente Befunde rhetorisch zu glaetten, damit eine eindeutige Botschaft entsteht. Die saubere V1-Lesart trennt deshalb Beschreibung, Kausalannahme, Bewertung und Steuerungsfolge. Ein gutes Skript fuehrt deshalb Profile, Zielkonflikte und offene Punkte nebeneinander. So wird aus dem Thema kein isoliertes Kapitel, sondern ein pruefbarer Baustein der WÖk-Architektur.</w:t>
+      </w:r>
+    </w:p>
+    <w:p>
+      <w:r>
+        <w:t>Nichtkompensation. Fuer Von KPI zu KII und der Kennzahlen-Stack bedeutet schwere zentrale Schaeden nicht durch beliebige positive Einzelwerte neutralisiert werden duerfen, dass die Analyse nicht bei einer Aktivitaet, einem guten Willen oder einer Kennzahl stehen bleiben darf. Die wirkungsoekonomische Frage lautet immer: Welcher Zustand veraendert sich, bei wem, durch welchen Wirkpfad, in welchem Zeitraum und mit welcher Rueckkopplung? Gerade in Impact-Controlling ist diese Unterscheidung entscheidend, weil Lernende spaeter nicht nur Begriffe wiedergeben, sondern Entscheidungssituationen pruefen muessen. Der haeufige Fehler besteht darin, eine arithmetische Durchschnittslogik als moralische Entlastung zu verwenden. Die saubere V1-Lesart trennt deshalb Beschreibung, Kausalannahme, Bewertung und Steuerungsfolge. Reverse Merit Order und rote Linien sind Schutzregeln gegen Schoenrechnung. So wird aus dem Thema kein isoliertes Kapitel, sondern ein pruefbarer Baustein der WÖk-Architektur.</w:t>
+      </w:r>
+    </w:p>
+    <w:p>
+      <w:r>
+        <w:t>Fallfenster zur Anwendung. Ein Controlling-Team moechte einen Score bilden. Das Skript verlangt, dass Datenqualitaet, Systemgrenzen, Gewichtung, Unsicherheit und Nichtkompensation sichtbar bleiben. Ein Score darf die Diskussion nicht beenden, sondern muss bessere Fragen, Priorisierung und Rueckkopplung ermoeglichen. Bezogen auf Von KPI zu KII und der Kennzahlen-Stack heisst das: Die Analyse muss das konkrete Thema ernst nehmen und zugleich den allgemeinen WÖk-Massstab halten. Es geht nicht darum, die Welt in gute und schlechte Akteure einzuteilen. Es geht darum, Wirkpfade, Wirkungsempfaenger, Datenqualitaet, Risiken und Rueckkopplung so zu beschreiben, dass bessere Entscheidungen moeglich werden.</w:t>
+      </w:r>
+    </w:p>
+    <w:p>
+      <w:r>
+        <w:t>Pruefungsnahe Transferfrage. Formuliere zu WC-V1 eine Wirkungsaussage in drei Saetzen: Erstens den beobachteten oder plausiblen Zustand, zweitens die Daten- oder Quellenlage, drittens die offene Unsicherheit samt Rueckkopplung. Die Antwort muss ohne moralische Personenbewertung auskommen und darf Reichweite nicht mit Wirkung verwechseln.</w:t>
+      </w:r>
+    </w:p>
+    <w:p>
+      <w:r>
+        <w:t>Rueckkopplung. Fuer Von KPI zu KII und der Kennzahlen-Stack bedeutet Wirkungswissen erst dann wertvoll wird, wenn es Entscheidungen veraendert, dass die Analyse nicht bei einer Aktivitaet, einem guten Willen oder einer Kennzahl stehen bleiben darf. Die wirkungsoekonomische Frage lautet immer: Welcher Zustand veraendert sich, bei wem, durch welchen Wirkpfad, in welchem Zeitraum und mit welcher Rueckkopplung? Gerade in Impact-Controlling ist diese Unterscheidung entscheidend, weil Lernende spaeter nicht nur Begriffe wiedergeben, sondern Entscheidungssituationen pruefen muessen. Der haeufige Fehler besteht darin, einen Bericht als Endpunkt zu betrachten. Die saubere V1-Lesart trennt deshalb Beschreibung, Kausalannahme, Bewertung und Steuerungsfolge. Jeder Analyseblock sollte fragen, welche Routine, welcher Prozess oder welche Ressource nach der Bewertung angepasst wird. So wird aus dem Thema kein isoliertes Kapitel, sondern ein pruefbarer Baustein der WÖk-Architektur.</w:t>
+      </w:r>
+    </w:p>
+    <w:p>
+      <w:r>
+        <w:t>Governance. Fuer Von KPI zu KII und der Kennzahlen-Stack bedeutet Wirkungsbewertung Verfahren, Rechte, Transparenz und Korrektur braucht, dass die Analyse nicht bei einer Aktivitaet, einem guten Willen oder einer Kennzahl stehen bleiben darf. Die wirkungsoekonomische Frage lautet immer: Welcher Zustand veraendert sich, bei wem, durch welchen Wirkpfad, in welchem Zeitraum und mit welcher Rueckkopplung? Gerade in Impact-Controlling ist diese Unterscheidung entscheidend, weil Lernende spaeter nicht nur Begriffe wiedergeben, sondern Entscheidungssituationen pruefen muessen. Der haeufige Fehler besteht darin, Bewertung als technokratische Top-down-Setzung zu verstehen. Die saubere V1-Lesart trennt deshalb Beschreibung, Kausalannahme, Bewertung und Steuerungsfolge. Betroffene, Datenhalter, Entscheider und Kontrollinstanzen muessen unterscheidbare Rollen behalten. So wird aus dem Thema kein isoliertes Kapitel, sondern ein pruefbarer Baustein der WÖk-Architektur.</w:t>
+      </w:r>
+    </w:p>
+    <w:p>
+      <w:r>
+        <w:t>Didaktische Pruefbarkeit. Fuer Von KPI zu KII und der Kennzahlen-Stack bedeutet das Thema in der Akademie nicht nur erklaert, sondern in Falllogik ueberfuehrt werden muss, dass die Analyse nicht bei einer Aktivitaet, einem guten Willen oder einer Kennzahl stehen bleiben darf. Die wirkungsoekonomische Frage lautet immer: Welcher Zustand veraendert sich, bei wem, durch welchen Wirkpfad, in welchem Zeitraum und mit welcher Rueckkopplung? Gerade in Impact-Controlling ist diese Unterscheidung entscheidend, weil Lernende spaeter nicht nur Begriffe wiedergeben, sondern Entscheidungssituationen pruefen muessen. Der haeufige Fehler besteht darin, reines Auswendiglernen als Kompetenznachweis zu behandeln. Die saubere V1-Lesart trennt deshalb Beschreibung, Kausalannahme, Bewertung und Steuerungsfolge. Pruefungsfragen sollen Begriffe, Anwendung und rote Linien verbinden. So wird aus dem Thema kein isoliertes Kapitel, sondern ein pruefbarer Baustein der WÖk-Architektur.</w:t>
+      </w:r>
+    </w:p>
+    <w:p>
+      <w:r>
+        <w:t>Fallfenster zur Anwendung. Ein Kommunikationsbericht nennt viele Aktivitaeten, Reichweiten und Rueckmeldungen. Die V1-Pruefung fragt, ob daraus eine belastbare Wirkungsaussage folgt. Wenn nur Kontakte, Klicks oder Zustimmung vorliegen, bleibt die Aussage im Bereich Wirkungspotenzial oder Resonanz, nicht im Bereich nachgewiesener Wirkung. Bezogen auf Von KPI zu KII und der Kennzahlen-Stack heisst das: Die Analyse muss das konkrete Thema ernst nehmen und zugleich den allgemeinen WÖk-Massstab halten. Es geht nicht darum, die Welt in gute und schlechte Akteure einzuteilen. Es geht darum, Wirkpfade, Wirkungsempfaenger, Datenqualitaet, Risiken und Rueckkopplung so zu beschreiben, dass bessere Entscheidungen moeglich werden.</w:t>
+      </w:r>
+    </w:p>
+    <w:p>
+      <w:r>
+        <w:t>Transfer in Organisationen. Fuer Von KPI zu KII und der Kennzahlen-Stack bedeutet WÖk-Begriffe im Alltag nur tragen, wenn sie in Routinen uebersetzt werden, dass die Analyse nicht bei einer Aktivitaet, einem guten Willen oder einer Kennzahl stehen bleiben darf. Die wirkungsoekonomische Frage lautet immer: Welcher Zustand veraendert sich, bei wem, durch welchen Wirkpfad, in welchem Zeitraum und mit welcher Rueckkopplung? Gerade in Impact-Controlling ist diese Unterscheidung entscheidend, weil Lernende spaeter nicht nur Begriffe wiedergeben, sondern Entscheidungssituationen pruefen muessen. Der haeufige Fehler besteht darin, die Verantwortung an eine Nachhaltigkeitsabteilung auszulagern. Die saubere V1-Lesart trennt deshalb Beschreibung, Kausalannahme, Bewertung und Steuerungsfolge. Strategie, Einkauf, Kommunikation, Controlling und Fuehrung muessen denselben Wirkungsbegriff verwenden. So wird aus dem Thema kein isoliertes Kapitel, sondern ein pruefbarer Baustein der WÖk-Architektur.</w:t>
+      </w:r>
+    </w:p>
+    <w:p>
+      <w:r>
+        <w:t>Rueckfluss in den Korpus. Fuer Von KPI zu KII und der Kennzahlen-Stack bedeutet jedes Studienskript den Gesamtbestand schaerfen kann, dass die Analyse nicht bei einer Aktivitaet, einem guten Willen oder einer Kennzahl stehen bleiben darf. Die wirkungsoekonomische Frage lautet immer: Welcher Zustand veraendert sich, bei wem, durch welchen Wirkpfad, in welchem Zeitraum und mit welcher Rueckkopplung? Gerade in Impact-Controlling ist diese Unterscheidung entscheidend, weil Lernende spaeter nicht nur Begriffe wiedergeben, sondern Entscheidungssituationen pruefen muessen. Der haeufige Fehler besteht darin, neue Einsichten nur lokal im Skript zu belassen. Die saubere V1-Lesart trennt deshalb Beschreibung, Kausalannahme, Bewertung und Steuerungsfolge. Glossar, Website, Journal, Dossiers und Visuals sollen aus der Skriptarbeit lernen. So wird aus dem Thema kein isoliertes Kapitel, sondern ein pruefbarer Baustein der WÖk-Architektur.</w:t>
+      </w:r>
+    </w:p>
+    <w:p>
+      <w:r>
+        <w:t>Pruefungsnahe Transferfrage. Formuliere zu WC-V1 eine Wirkungsaussage in drei Saetzen: Erstens den beobachteten oder plausiblen Zustand, zweitens die Daten- oder Quellenlage, drittens die offene Unsicherheit samt Rueckkopplung. Die Antwort muss ohne moralische Personenbewertung auskommen und darf Reichweite nicht mit Wirkung verwechseln.</w:t>
+      </w:r>
+    </w:p>
+    <w:p>
+      <w:pPr>
+        <w:pStyle w:val="Heading3"/>
+      </w:pPr>
+      <w:r>
+        <w:t>Vertiefungsrunde 3: Lesen, pruefen, rueckkoppeln</w:t>
+      </w:r>
+    </w:p>
+    <w:p>
+      <w:r>
+        <w:t>Die folgende Runde verdichtet WC-V1 nicht durch neue Schlagworte, sondern durch wiederholte Anwendung auf unterschiedliche Entscheidungsebenen. Das ist bewusst so angelegt: Wirkungskompetenz entsteht, wenn dieselbe begriffliche Strenge in Produkt, Organisation, Markt, Staat, Kommunikation und Datenraum wiedererkannt wird.</w:t>
+      </w:r>
+    </w:p>
+    <w:p>
+      <w:r>
+        <w:t>Begriffliche Schaerfung. Fuer Von KPI zu KII und der Kennzahlen-Stack bedeutet praezise Sprache die erste Sicherung gegen Impact-Washing ist, dass die Analyse nicht bei einer Aktivitaet, einem guten Willen oder einer Kennzahl stehen bleiben darf. Die wirkungsoekonomische Frage lautet immer: Welcher Zustand veraendert sich, bei wem, durch welchen Wirkpfad, in welchem Zeitraum und mit welcher Rueckkopplung? Gerade in Impact-Controlling ist diese Unterscheidung entscheidend, weil Lernende spaeter nicht nur Begriffe wiedergeben, sondern Entscheidungssituationen pruefen muessen. Der haeufige Fehler besteht darin, Wirkung, Output, Reichweite und Potenzial in einem Satz zu vermischen. Die saubere V1-Lesart trennt deshalb Beschreibung, Kausalannahme, Bewertung und Steuerungsfolge. In der Praxis sollte jede Wirkungsaussage als kurze Viererprobe formuliert werden: Zustand, Betroffene, Quelle, offene Unsicherheit. So wird aus dem Thema kein isoliertes Kapitel, sondern ein pruefbarer Baustein der WÖk-Architektur.</w:t>
+      </w:r>
+    </w:p>
+    <w:p>
+      <w:r>
+        <w:t>Fallfenster zur Anwendung. Eine Organisation plant eine Massnahme und formuliert dazu eine positive Absicht. In der WÖk reicht das nicht. Fuer diese Vorlesung muss sichtbar werden, welche Zustandsveraenderung erwartet wird, welche Empfaenger direkt oder indirekt betroffen sind, welche Nebenwirkungen entstehen koennen und welche Entscheidung spaeter korrigiert wird. Bezogen auf Von KPI zu KII und der Kennzahlen-Stack heisst das: Die Analyse muss das konkrete Thema ernst nehmen und zugleich den allgemeinen WÖk-Massstab halten. Es geht nicht darum, die Welt in gute und schlechte Akteure einzuteilen. Es geht darum, Wirkpfade, Wirkungsempfaenger, Datenqualitaet, Risiken und Rueckkopplung so zu beschreiben, dass bessere Entscheidungen moeglich werden.</w:t>
+      </w:r>
+    </w:p>
+    <w:p>
+      <w:r>
+        <w:t>Wirkpfad-Logik. Fuer Von KPI zu KII und der Kennzahlen-Stack bedeutet ein Thema erst dann steuerbar wird, wenn der Mechanismus zwischen Ausloeser und Zustandsveraenderung beschrieben ist, dass die Analyse nicht bei einer Aktivitaet, einem guten Willen oder einer Kennzahl stehen bleiben darf. Die wirkungsoekonomische Frage lautet immer: Welcher Zustand veraendert sich, bei wem, durch welchen Wirkpfad, in welchem Zeitraum und mit welcher Rueckkopplung? Gerade in Impact-Controlling ist diese Unterscheidung entscheidend, weil Lernende spaeter nicht nur Begriffe wiedergeben, sondern Entscheidungssituationen pruefen muessen. Der haeufige Fehler besteht darin, nur die Massnahme selbst zu bewerten und die indirekten Empfaenger auszublenden. Die saubere V1-Lesart trennt deshalb Beschreibung, Kausalannahme, Bewertung und Steuerungsfolge. Eine gute Fallanalyse zeichnet mindestens einen direkten und einen indirekten Wirkpfad nach. So wird aus dem Thema kein isoliertes Kapitel, sondern ein pruefbarer Baustein der WÖk-Architektur.</w:t>
+      </w:r>
+    </w:p>
+    <w:p>
+      <w:r>
+        <w:t>Daten- und Quellenklarheit. Fuer Von KPI zu KII und der Kennzahlen-Stack bedeutet jede Bewertung nur so belastbar ist wie Datenlage, Quellenstatus und Aktualitaet, dass die Analyse nicht bei einer Aktivitaet, einem guten Willen oder einer Kennzahl stehen bleiben darf. Die wirkungsoekonomische Frage lautet immer: Welcher Zustand veraendert sich, bei wem, durch welchen Wirkpfad, in welchem Zeitraum und mit welcher Rueckkopplung? Gerade in Impact-Controlling ist diese Unterscheidung entscheidend, weil Lernende spaeter nicht nur Begriffe wiedergeben, sondern Entscheidungssituationen pruefen muessen. Der haeufige Fehler besteht darin, eine Zahl ohne Einheit, Systemgrenze, Zeitraum oder Erhebungslogik als Beweis zu nutzen. Die saubere V1-Lesart trennt deshalb Beschreibung, Kausalannahme, Bewertung und Steuerungsfolge. Die Lernenden sollen Daten nicht dekorativ zitieren, sondern ihre Aussagekraft, Luecken und Grenzen offenlegen. So wird aus dem Thema kein isoliertes Kapitel, sondern ein pruefbarer Baustein der WÖk-Architektur.</w:t>
+      </w:r>
+    </w:p>
+    <w:p>
+      <w:r>
+        <w:t>Ambivalenz. Fuer Von KPI zu KII und der Kennzahlen-Stack bedeutet positive und negative Zustandsveraenderungen gleichzeitig auftreten koennen, dass die Analyse nicht bei einer Aktivitaet, einem guten Willen oder einer Kennzahl stehen bleiben darf. Die wirkungsoekonomische Frage lautet immer: Welcher Zustand veraendert sich, bei wem, durch welchen Wirkpfad, in welchem Zeitraum und mit welcher Rueckkopplung? Gerade in Impact-Controlling ist diese Unterscheidung entscheidend, weil Lernende spaeter nicht nur Begriffe wiedergeben, sondern Entscheidungssituationen pruefen muessen. Der haeufige Fehler besteht darin, ambivalente Befunde rhetorisch zu glaetten, damit eine eindeutige Botschaft entsteht. Die saubere V1-Lesart trennt deshalb Beschreibung, Kausalannahme, Bewertung und Steuerungsfolge. Ein gutes Skript fuehrt deshalb Profile, Zielkonflikte und offene Punkte nebeneinander. So wird aus dem Thema kein isoliertes Kapitel, sondern ein pruefbarer Baustein der WÖk-Architektur.</w:t>
+      </w:r>
+    </w:p>
+    <w:p>
+      <w:r>
+        <w:t>Fallfenster zur Anwendung. Eine Fuehrungsentscheidung erzeugt zugleich Nutzen und Risiken. Die WÖk behandelt Ambivalenz nicht als Stoerung, sondern als Kern der Analyse. Positive Netto-Wirkung darf erst behauptet werden, wenn zentrale negative Wirkungen getrennt geprueft und rote Linien gewahrt sind. Bezogen auf Von KPI zu KII und der Kennzahlen-Stack heisst das: Die Analyse muss das konkrete Thema ernst nehmen und zugleich den allgemeinen WÖk-Massstab halten. Es geht nicht darum, die Welt in gute und schlechte Akteure einzuteilen. Es geht darum, Wirkpfade, Wirkungsempfaenger, Datenqualitaet, Risiken und Rueckkopplung so zu beschreiben, dass bessere Entscheidungen moeglich werden.</w:t>
+      </w:r>
+    </w:p>
+    <w:p>
+      <w:r>
+        <w:t>Nichtkompensation. Fuer Von KPI zu KII und der Kennzahlen-Stack bedeutet schwere zentrale Schaeden nicht durch beliebige positive Einzelwerte neutralisiert werden duerfen, dass die Analyse nicht bei einer Aktivitaet, einem guten Willen oder einer Kennzahl stehen bleiben darf. Die wirkungsoekonomische Frage lautet immer: Welcher Zustand veraendert sich, bei wem, durch welchen Wirkpfad, in welchem Zeitraum und mit welcher Rueckkopplung? Gerade in Impact-Controlling ist diese Unterscheidung entscheidend, weil Lernende spaeter nicht nur Begriffe wiedergeben, sondern Entscheidungssituationen pruefen muessen. Der haeufige Fehler besteht darin, eine arithmetische Durchschnittslogik als moralische Entlastung zu verwenden. Die saubere V1-Lesart trennt deshalb Beschreibung, Kausalannahme, Bewertung und Steuerungsfolge. Reverse Merit Order und rote Linien sind Schutzregeln gegen Schoenrechnung. So wird aus dem Thema kein isoliertes Kapitel, sondern ein pruefbarer Baustein der WÖk-Architektur.</w:t>
+      </w:r>
+    </w:p>
+    <w:p>
+      <w:r>
+        <w:t>Pruefungsnahe Transferfrage. Formuliere zu WC-V1 eine Wirkungsaussage in drei Saetzen: Erstens den beobachteten oder plausiblen Zustand, zweitens die Daten- oder Quellenlage, drittens die offene Unsicherheit samt Rueckkopplung. Die Antwort muss ohne moralische Personenbewertung auskommen und darf Reichweite nicht mit Wirkung verwechseln.</w:t>
+      </w:r>
+    </w:p>
+    <w:p>
+      <w:r>
+        <w:t>Rueckkopplung. Fuer Von KPI zu KII und der Kennzahlen-Stack bedeutet Wirkungswissen erst dann wertvoll wird, wenn es Entscheidungen veraendert, dass die Analyse nicht bei einer Aktivitaet, einem guten Willen oder einer Kennzahl stehen bleiben darf. Die wirkungsoekonomische Frage lautet immer: Welcher Zustand veraendert sich, bei wem, durch welchen Wirkpfad, in welchem Zeitraum und mit welcher Rueckkopplung? Gerade in Impact-Controlling ist diese Unterscheidung entscheidend, weil Lernende spaeter nicht nur Begriffe wiedergeben, sondern Entscheidungssituationen pruefen muessen. Der haeufige Fehler besteht darin, einen Bericht als Endpunkt zu betrachten. Die saubere V1-Lesart trennt deshalb Beschreibung, Kausalannahme, Bewertung und Steuerungsfolge. Jeder Analyseblock sollte fragen, welche Routine, welcher Prozess oder welche Ressource nach der Bewertung angepasst wird. So wird aus dem Thema kein isoliertes Kapitel, sondern ein pruefbarer Baustein der WÖk-Architektur.</w:t>
+      </w:r>
+    </w:p>
+    <w:p>
+      <w:r>
+        <w:t>Governance. Fuer Von KPI zu KII und der Kennzahlen-Stack bedeutet Wirkungsbewertung Verfahren, Rechte, Transparenz und Korrektur braucht, dass die Analyse nicht bei einer Aktivitaet, einem guten Willen oder einer Kennzahl stehen bleiben darf. Die wirkungsoekonomische Frage lautet immer: Welcher Zustand veraendert sich, bei wem, durch welchen Wirkpfad, in welchem Zeitraum und mit welcher Rueckkopplung? Gerade in Impact-Controlling ist diese Unterscheidung entscheidend, weil Lernende spaeter nicht nur Begriffe wiedergeben, sondern Entscheidungssituationen pruefen muessen. Der haeufige Fehler besteht darin, Bewertung als technokratische Top-down-Setzung zu verstehen. Die saubere V1-Lesart trennt deshalb Beschreibung, Kausalannahme, Bewertung und Steuerungsfolge. Betroffene, Datenhalter, Entscheider und Kontrollinstanzen muessen unterscheidbare Rollen behalten. So wird aus dem Thema kein isoliertes Kapitel, sondern ein pruefbarer Baustein der WÖk-Architektur.</w:t>
+      </w:r>
+    </w:p>
+    <w:p>
+      <w:r>
+        <w:t>Fallfenster zur Anwendung. Ein Controlling-Team moechte einen Score bilden. Das Skript verlangt, dass Datenqualitaet, Systemgrenzen, Gewichtung, Unsicherheit und Nichtkompensation sichtbar bleiben. Ein Score darf die Diskussion nicht beenden, sondern muss bessere Fragen, Priorisierung und Rueckkopplung ermoeglichen. Bezogen auf Von KPI zu KII und der Kennzahlen-Stack heisst das: Die Analyse muss das konkrete Thema ernst nehmen und zugleich den allgemeinen WÖk-Massstab halten. Es geht nicht darum, die Welt in gute und schlechte Akteure einzuteilen. Es geht darum, Wirkpfade, Wirkungsempfaenger, Datenqualitaet, Risiken und Rueckkopplung so zu beschreiben, dass bessere Entscheidungen moeglich werden.</w:t>
+      </w:r>
+    </w:p>
+    <w:p>
+      <w:r>
+        <w:t>Didaktische Pruefbarkeit. Fuer Von KPI zu KII und der Kennzahlen-Stack bedeutet das Thema in der Akademie nicht nur erklaert, sondern in Falllogik ueberfuehrt werden muss, dass die Analyse nicht bei einer Aktivitaet, einem guten Willen oder einer Kennzahl stehen bleiben darf. Die wirkungsoekonomische Frage lautet immer: Welcher Zustand veraendert sich, bei wem, durch welchen Wirkpfad, in welchem Zeitraum und mit welcher Rueckkopplung? Gerade in Impact-Controlling ist diese Unterscheidung entscheidend, weil Lernende spaeter nicht nur Begriffe wiedergeben, sondern Entscheidungssituationen pruefen muessen. Der haeufige Fehler besteht darin, reines Auswendiglernen als Kompetenznachweis zu behandeln. Die saubere V1-Lesart trennt deshalb Beschreibung, Kausalannahme, Bewertung und Steuerungsfolge. Pruefungsfragen sollen Begriffe, Anwendung und rote Linien verbinden. So wird aus dem Thema kein isoliertes Kapitel, sondern ein pruefbarer Baustein der WÖk-Architektur.</w:t>
+      </w:r>
+    </w:p>
+    <w:p>
+      <w:r>
+        <w:t>Transfer in Organisationen. Fuer Von KPI zu KII und der Kennzahlen-Stack bedeutet WÖk-Begriffe im Alltag nur tragen, wenn sie in Routinen uebersetzt werden, dass die Analyse nicht bei einer Aktivitaet, einem guten Willen oder einer Kennzahl stehen bleiben darf. Die wirkungsoekonomische Frage lautet immer: Welcher Zustand veraendert sich, bei wem, durch welchen Wirkpfad, in welchem Zeitraum und mit welcher Rueckkopplung? Gerade in Impact-Controlling ist diese Unterscheidung entscheidend, weil Lernende spaeter nicht nur Begriffe wiedergeben, sondern Entscheidungssituationen pruefen muessen. Der haeufige Fehler besteht darin, die Verantwortung an eine Nachhaltigkeitsabteilung auszulagern. Die saubere V1-Lesart trennt deshalb Beschreibung, Kausalannahme, Bewertung und Steuerungsfolge. Strategie, Einkauf, Kommunikation, Controlling und Fuehrung muessen denselben Wirkungsbegriff verwenden. So wird aus dem Thema kein isoliertes Kapitel, sondern ein pruefbarer Baustein der WÖk-Architektur.</w:t>
+      </w:r>
+    </w:p>
+    <w:p>
+      <w:r>
+        <w:t>Rueckfluss in den Korpus. Fuer Von KPI zu KII und der Kennzahlen-Stack bedeutet jedes Studienskript den Gesamtbestand schaerfen kann, dass die Analyse nicht bei einer Aktivitaet, einem guten Willen oder einer Kennzahl stehen bleiben darf. Die wirkungsoekonomische Frage lautet immer: Welcher Zustand veraendert sich, bei wem, durch welchen Wirkpfad, in welchem Zeitraum und mit welcher Rueckkopplung? Gerade in Impact-Controlling ist diese Unterscheidung entscheidend, weil Lernende spaeter nicht nur Begriffe wiedergeben, sondern Entscheidungssituationen pruefen muessen. Der haeufige Fehler besteht darin, neue Einsichten nur lokal im Skript zu belassen. Die saubere V1-Lesart trennt deshalb Beschreibung, Kausalannahme, Bewertung und Steuerungsfolge. Glossar, Website, Journal, Dossiers und Visuals sollen aus der Skriptarbeit lernen. So wird aus dem Thema kein isoliertes Kapitel, sondern ein pruefbarer Baustein der WÖk-Architektur.</w:t>
+      </w:r>
+    </w:p>
+    <w:p>
+      <w:r>
+        <w:t>Fallfenster zur Anwendung. Ein Kommunikationsbericht nennt viele Aktivitaeten, Reichweiten und Rueckmeldungen. Die V1-Pruefung fragt, ob daraus eine belastbare Wirkungsaussage folgt. Wenn nur Kontakte, Klicks oder Zustimmung vorliegen, bleibt die Aussage im Bereich Wirkungspotenzial oder Resonanz, nicht im Bereich nachgewiesener Wirkung. Bezogen auf Von KPI zu KII und der Kennzahlen-Stack heisst das: Die Analyse muss das konkrete Thema ernst nehmen und zugleich den allgemeinen WÖk-Massstab halten. Es geht nicht darum, die Welt in gute und schlechte Akteure einzuteilen. Es geht darum, Wirkpfade, Wirkungsempfaenger, Datenqualitaet, Risiken und Rueckkopplung so zu beschreiben, dass bessere Entscheidungen moeglich werden.</w:t>
+      </w:r>
+    </w:p>
+    <w:p>
+      <w:r>
+        <w:t>Pruefungsnahe Transferfrage. Formuliere zu WC-V1 eine Wirkungsaussage in drei Saetzen: Erstens den beobachteten oder plausiblen Zustand, zweitens die Daten- oder Quellenlage, drittens die offene Unsicherheit samt Rueckkopplung. Die Antwort muss ohne moralische Personenbewertung auskommen und darf Reichweite nicht mit Wirkung verwechseln.</w:t>
+      </w:r>
+    </w:p>
+    <w:p>
+      <w:pPr>
+        <w:pStyle w:val="Heading3"/>
+      </w:pPr>
+      <w:r>
+        <w:t>Vertiefungsrunde 4: Lesen, pruefen, rueckkoppeln</w:t>
+      </w:r>
+    </w:p>
+    <w:p>
+      <w:r>
+        <w:t>Die folgende Runde verdichtet WC-V1 nicht durch neue Schlagworte, sondern durch wiederholte Anwendung auf unterschiedliche Entscheidungsebenen. Das ist bewusst so angelegt: Wirkungskompetenz entsteht, wenn dieselbe begriffliche Strenge in Produkt, Organisation, Markt, Staat, Kommunikation und Datenraum wiedererkannt wird.</w:t>
+      </w:r>
+    </w:p>
+    <w:p>
+      <w:r>
+        <w:t>Begriffliche Schaerfung. Fuer Von KPI zu KII und der Kennzahlen-Stack bedeutet praezise Sprache die erste Sicherung gegen Impact-Washing ist, dass die Analyse nicht bei einer Aktivitaet, einem guten Willen oder einer Kennzahl stehen bleiben darf. Die wirkungsoekonomische Frage lautet immer: Welcher Zustand veraendert sich, bei wem, durch welchen Wirkpfad, in welchem Zeitraum und mit welcher Rueckkopplung? Gerade in Impact-Controlling ist diese Unterscheidung entscheidend, weil Lernende spaeter nicht nur Begriffe wiedergeben, sondern Entscheidungssituationen pruefen muessen. Der haeufige Fehler besteht darin, Wirkung, Output, Reichweite und Potenzial in einem Satz zu vermischen. Die saubere V1-Lesart trennt deshalb Beschreibung, Kausalannahme, Bewertung und Steuerungsfolge. In der Praxis sollte jede Wirkungsaussage als kurze Viererprobe formuliert werden: Zustand, Betroffene, Quelle, offene Unsicherheit. So wird aus dem Thema kein isoliertes Kapitel, sondern ein pruefbarer Baustein der WÖk-Architektur.</w:t>
+      </w:r>
+    </w:p>
+    <w:p>
+      <w:r>
+        <w:t>Wirkpfad-Logik. Fuer Von KPI zu KII und der Kennzahlen-Stack bedeutet ein Thema erst dann steuerbar wird, wenn der Mechanismus zwischen Ausloeser und Zustandsveraenderung beschrieben ist, dass die Analyse nicht bei einer Aktivitaet, einem guten Willen oder einer Kennzahl stehen bleiben darf. Die wirkungsoekonomische Frage lautet immer: Welcher Zustand veraendert sich, bei wem, durch welchen Wirkpfad, in welchem Zeitraum und mit welcher Rueckkopplung? Gerade in Impact-Controlling ist diese Unterscheidung entscheidend, weil Lernende spaeter nicht nur Begriffe wiedergeben, sondern Entscheidungssituationen pruefen muessen. Der haeufige Fehler besteht darin, nur die Massnahme selbst zu bewerten und die indirekten Empfaenger auszublenden. Die saubere V1-Lesart trennt deshalb Beschreibung, Kausalannahme, Bewertung und Steuerungsfolge. Eine gute Fallanalyse zeichnet mindestens einen direkten und einen indirekten Wirkpfad nach. So wird aus dem Thema kein isoliertes Kapitel, sondern ein pruefbarer Baustein der WÖk-Architektur.</w:t>
+      </w:r>
+    </w:p>
+    <w:p>
+      <w:r>
+        <w:t>Daten- und Quellenklarheit. Fuer Von KPI zu KII und der Kennzahlen-Stack bedeutet jede Bewertung nur so belastbar ist wie Datenlage, Quellenstatus und Aktualitaet, dass die Analyse nicht bei einer Aktivitaet, einem guten Willen oder einer Kennzahl stehen bleiben darf. Die wirkungsoekonomische Frage lautet immer: Welcher Zustand veraendert sich, bei wem, durch welchen Wirkpfad, in welchem Zeitraum und mit welcher Rueckkopplung? Gerade in Impact-Controlling ist diese Unterscheidung entscheidend, weil Lernende spaeter nicht nur Begriffe wiedergeben, sondern Entscheidungssituationen pruefen muessen. Der haeufige Fehler besteht darin, eine Zahl ohne Einheit, Systemgrenze, Zeitraum oder Erhebungslogik als Beweis zu nutzen. Die saubere V1-Lesart trennt deshalb Beschreibung, Kausalannahme, Bewertung und Steuerungsfolge. Die Lernenden sollen Daten nicht dekorativ zitieren, sondern ihre Aussagekraft, Luecken und Grenzen offenlegen. So wird aus dem Thema kein isoliertes Kapitel, sondern ein pruefbarer Baustein der WÖk-Architektur.</w:t>
+      </w:r>
+    </w:p>
+    <w:p>
+      <w:r>
+        <w:t>Fallfenster zur Anwendung. Eine Organisation plant eine Massnahme und formuliert dazu eine positive Absicht. In der WÖk reicht das nicht. Fuer diese Vorlesung muss sichtbar werden, welche Zustandsveraenderung erwartet wird, welche Empfaenger direkt oder indirekt betroffen sind, welche Nebenwirkungen entstehen koennen und welche Entscheidung spaeter korrigiert wird. Bezogen auf Von KPI zu KII und der Kennzahlen-Stack heisst das: Die Analyse muss das konkrete Thema ernst nehmen und zugleich den allgemeinen WÖk-Massstab halten. Es geht nicht darum, die Welt in gute und schlechte Akteure einzuteilen. Es geht darum, Wirkpfade, Wirkungsempfaenger, Datenqualitaet, Risiken und Rueckkopplung so zu beschreiben, dass bessere Entscheidungen moeglich werden.</w:t>
+      </w:r>
+    </w:p>
+    <w:p>
+      <w:r>
+        <w:t>Ambivalenz. Fuer Von KPI zu KII und der Kennzahlen-Stack bedeutet positive und negative Zustandsveraenderungen gleichzeitig auftreten koennen, dass die Analyse nicht bei einer Aktivitaet, einem guten Willen oder einer Kennzahl stehen bleiben darf. Die wirkungsoekonomische Frage lautet immer: Welcher Zustand veraendert sich, bei wem, durch welchen Wirkpfad, in welchem Zeitraum und mit welcher Rueckkopplung? Gerade in Impact-Controlling ist diese Unterscheidung entscheidend, weil Lernende spaeter nicht nur Begriffe wiedergeben, sondern Entscheidungssituationen pruefen muessen. Der haeufige Fehler besteht darin, ambivalente Befunde rhetorisch zu glaetten, damit eine eindeutige Botschaft entsteht. Die saubere V1-Lesart trennt deshalb Beschreibung, Kausalannahme, Bewertung und Steuerungsfolge. Ein gutes Skript fuehrt deshalb Profile, Zielkonflikte und offene Punkte nebeneinander. So wird aus dem Thema kein isoliertes Kapitel, sondern ein pruefbarer Baustein der WÖk-Architektur.</w:t>
+      </w:r>
+    </w:p>
+    <w:p>
+      <w:r>
+        <w:t>Nichtkompensation. Fuer Von KPI zu KII und der Kennzahlen-Stack bedeutet schwere zentrale Schaeden nicht durch beliebige positive Einzelwerte neutralisiert werden duerfen, dass die Analyse nicht bei einer Aktivitaet, einem guten Willen oder einer Kennzahl stehen bleiben darf. Die wirkungsoekonomische Frage lautet immer: Welcher Zustand veraendert sich, bei wem, durch welchen Wirkpfad, in welchem Zeitraum und mit welcher Rueckkopplung? Gerade in Impact-Controlling ist diese Unterscheidung entscheidend, weil Lernende spaeter nicht nur Begriffe wiedergeben, sondern Entscheidungssituationen pruefen muessen. Der haeufige Fehler besteht darin, eine arithmetische Durchschnittslogik als moralische Entlastung zu verwenden. Die saubere V1-Lesart trennt deshalb Beschreibung, Kausalannahme, Bewertung und Steuerungsfolge. Reverse Merit Order und rote Linien sind Schutzregeln gegen Schoenrechnung. So wird aus dem Thema kein isoliertes Kapitel, sondern ein pruefbarer Baustein der WÖk-Architektur.</w:t>
+      </w:r>
+    </w:p>
+    <w:p>
+      <w:r>
+        <w:t>Pruefungsnahe Transferfrage. Formuliere zu WC-V1 eine Wirkungsaussage in drei Saetzen: Erstens den beobachteten oder plausiblen Zustand, zweitens die Daten- oder Quellenlage, drittens die offene Unsicherheit samt Rueckkopplung. Die Antwort muss ohne moralische Personenbewertung auskommen und darf Reichweite nicht mit Wirkung verwechseln.</w:t>
+      </w:r>
+    </w:p>
+    <w:p>
+      <w:r>
+        <w:t>Rueckkopplung. Fuer Von KPI zu KII und der Kennzahlen-Stack bedeutet Wirkungswissen erst dann wertvoll wird, wenn es Entscheidungen veraendert, dass die Analyse nicht bei einer Aktivitaet, einem guten Willen oder einer Kennzahl stehen bleiben darf. Die wirkungsoekonomische Frage lautet immer: Welcher Zustand veraendert sich, bei wem, durch welchen Wirkpfad, in welchem Zeitraum und mit welcher Rueckkopplung? Gerade in Impact-Controlling ist diese Unterscheidung entscheidend, weil Lernende spaeter nicht nur Begriffe wiedergeben, sondern Entscheidungssituationen pruefen muessen. Der haeufige Fehler besteht darin, einen Bericht als Endpunkt zu betrachten. Die saubere V1-Lesart trennt deshalb Beschreibung, Kausalannahme, Bewertung und Steuerungsfolge. Jeder Analyseblock sollte fragen, welche Routine, welcher Prozess oder welche Ressource nach der Bewertung angepasst wird. So wird aus dem Thema kein isoliertes Kapitel, sondern ein pruefbarer Baustein der WÖk-Architektur.</w:t>
+      </w:r>
+    </w:p>
+    <w:p>
+      <w:r>
+        <w:t>Fallfenster zur Anwendung. Eine Fuehrungsentscheidung erzeugt zugleich Nutzen und Risiken. Die WÖk behandelt Ambivalenz nicht als Stoerung, sondern als Kern der Analyse. Positive Netto-Wirkung darf erst behauptet werden, wenn zentrale negative Wirkungen getrennt geprueft und rote Linien gewahrt sind. Bezogen auf Von KPI zu KII und der Kennzahlen-Stack heisst das: Die Analyse muss das konkrete Thema ernst nehmen und zugleich den allgemeinen WÖk-Massstab halten. Es geht nicht darum, die Welt in gute und schlechte Akteure einzuteilen. Es geht darum, Wirkpfade, Wirkungsempfaenger, Datenqualitaet, Risiken und Rueckkopplung so zu beschreiben, dass bessere Entscheidungen moeglich werden.</w:t>
+      </w:r>
+    </w:p>
+    <w:p>
+      <w:r>
+        <w:t>Governance. Fuer Von KPI zu KII und der Kennzahlen-Stack bedeutet Wirkungsbewertung Verfahren, Rechte, Transparenz und Korrektur braucht, dass die Analyse nicht bei einer Aktivitaet, einem guten Willen oder einer Kennzahl stehen bleiben darf. Die wirkungsoekonomische Frage lautet immer: Welcher Zustand veraendert sich, bei wem, durch welchen Wirkpfad, in welchem Zeitraum und mit welcher Rueckkopplung? Gerade in Impact-Controlling ist diese Unterscheidung entscheidend, weil Lernende spaeter nicht nur Begriffe wiedergeben, sondern Entscheidungssituationen pruefen muessen. Der haeufige Fehler besteht darin, Bewertung als technokratische Top-down-Setzung zu verstehen. Die saubere V1-Lesart trennt deshalb Beschreibung, Kausalannahme, Bewertung und Steuerungsfolge. Betroffene, Datenhalter, Entscheider und Kontrollinstanzen muessen unterscheidbare Rollen behalten. So wird aus dem Thema kein isoliertes Kapitel, sondern ein pruefbarer Baustein der WÖk-Architektur.</w:t>
+      </w:r>
+    </w:p>
+    <w:p>
+      <w:r>
+        <w:t>Didaktische Pruefbarkeit. Fuer Von KPI zu KII und der Kennzahlen-Stack bedeutet das Thema in der Akademie nicht nur erklaert, sondern in Falllogik ueberfuehrt werden muss, dass die Analyse nicht bei einer Aktivitaet, einem guten Willen oder einer Kennzahl stehen bleiben darf. Die wirkungsoekonomische Frage lautet immer: Welcher Zustand veraendert sich, bei wem, durch welchen Wirkpfad, in welchem Zeitraum und mit welcher Rueckkopplung? Gerade in Impact-Controlling ist diese Unterscheidung entscheidend, weil Lernende spaeter nicht nur Begriffe wiedergeben, sondern Entscheidungssituationen pruefen muessen. Der haeufige Fehler besteht darin, reines Auswendiglernen als Kompetenznachweis zu behandeln. Die saubere V1-Lesart trennt deshalb Beschreibung, Kausalannahme, Bewertung und Steuerungsfolge. Pruefungsfragen sollen Begriffe, Anwendung und rote Linien verbinden. So wird aus dem Thema kein isoliertes Kapitel, sondern ein pruefbarer Baustein der WÖk-Architektur.</w:t>
+      </w:r>
+    </w:p>
+    <w:p>
+      <w:r>
+        <w:t>Transfer in Organisationen. Fuer Von KPI zu KII und der Kennzahlen-Stack bedeutet WÖk-Begriffe im Alltag nur tragen, wenn sie in Routinen uebersetzt werden, dass die Analyse nicht bei einer Aktivitaet, einem guten Willen oder einer Kennzahl stehen bleiben darf. Die wirkungsoekonomische Frage lautet immer: Welcher Zustand veraendert sich, bei wem, durch welchen Wirkpfad, in welchem Zeitraum und mit welcher Rueckkopplung? Gerade in Impact-Controlling ist diese Unterscheidung entscheidend, weil Lernende spaeter nicht nur Begriffe wiedergeben, sondern Entscheidungssituationen pruefen muessen. Der haeufige Fehler besteht darin, die Verantwortung an eine Nachhaltigkeitsabteilung auszulagern. Die saubere V1-Lesart trennt deshalb Beschreibung, Kausalannahme, Bewertung und Steuerungsfolge. Strategie, Einkauf, Kommunikation, Controlling und Fuehrung muessen denselben Wirkungsbegriff verwenden. So wird aus dem Thema kein isoliertes Kapitel, sondern ein pruefbarer Baustein der WÖk-Architektur.</w:t>
+      </w:r>
+    </w:p>
+    <w:p>
+      <w:r>
+        <w:t>Fallfenster zur Anwendung. Ein Controlling-Team moechte einen Score bilden. Das Skript verlangt, dass Datenqualitaet, Systemgrenzen, Gewichtung, Unsicherheit und Nichtkompensation sichtbar bleiben. Ein Score darf die Diskussion nicht beenden, sondern muss bessere Fragen, Priorisierung und Rueckkopplung ermoeglichen. Bezogen auf Von KPI zu KII und der Kennzahlen-Stack heisst das: Die Analyse muss das konkrete Thema ernst nehmen und zugleich den allgemeinen WÖk-Massstab halten. Es geht nicht darum, die Welt in gute und schlechte Akteure einzuteilen. Es geht darum, Wirkpfade, Wirkungsempfaenger, Datenqualitaet, Risiken und Rueckkopplung so zu beschreiben, dass bessere Entscheidungen moeglich werden.</w:t>
+      </w:r>
+    </w:p>
+    <w:p>
+      <w:r>
+        <w:t>Rueckfluss in den Korpus. Fuer Von KPI zu KII und der Kennzahlen-Stack bedeutet jedes Studienskript den Gesamtbestand schaerfen kann, dass die Analyse nicht bei einer Aktivitaet, einem guten Willen oder einer Kennzahl stehen bleiben darf. Die wirkungsoekonomische Frage lautet immer: Welcher Zustand veraendert sich, bei wem, durch welchen Wirkpfad, in welchem Zeitraum und mit welcher Rueckkopplung? Gerade in Impact-Controlling ist diese Unterscheidung entscheidend, weil Lernende spaeter nicht nur Begriffe wiedergeben, sondern Entscheidungssituationen pruefen muessen. Der haeufige Fehler besteht darin, neue Einsichten nur lokal im Skript zu belassen. Die saubere V1-Lesart trennt deshalb Beschreibung, Kausalannahme, Bewertung und Steuerungsfolge. Glossar, Website, Journal, Dossiers und Visuals sollen aus der Skriptarbeit lernen. So wird aus dem Thema kein isoliertes Kapitel, sondern ein pruefbarer Baustein der WÖk-Architektur.</w:t>
+      </w:r>
+    </w:p>
+    <w:p>
+      <w:r>
+        <w:t>Pruefungsnahe Transferfrage. Formuliere zu WC-V1 eine Wirkungsaussage in drei Saetzen: Erstens den beobachteten oder plausiblen Zustand, zweitens die Daten- oder Quellenlage, drittens die offene Unsicherheit samt Rueckkopplung. Die Antwort muss ohne moralische Personenbewertung auskommen und darf Reichweite nicht mit Wirkung verwechseln.</w:t>
+      </w:r>
+    </w:p>
+    <w:p>
+      <w:pPr>
+        <w:pStyle w:val="Heading3"/>
+      </w:pPr>
+      <w:r>
+        <w:t>Vertiefungsrunde 5: Lesen, pruefen, rueckkoppeln</w:t>
+      </w:r>
+    </w:p>
+    <w:p>
+      <w:r>
+        <w:t>Die folgende Runde verdichtet WC-V1 nicht durch neue Schlagworte, sondern durch wiederholte Anwendung auf unterschiedliche Entscheidungsebenen. Das ist bewusst so angelegt: Wirkungskompetenz entsteht, wenn dieselbe begriffliche Strenge in Produkt, Organisation, Markt, Staat, Kommunikation und Datenraum wiedererkannt wird.</w:t>
+      </w:r>
+    </w:p>
+    <w:p>
+      <w:r>
+        <w:t>Begriffliche Schaerfung. Fuer Von KPI zu KII und der Kennzahlen-Stack bedeutet praezise Sprache die erste Sicherung gegen Impact-Washing ist, dass die Analyse nicht bei einer Aktivitaet, einem guten Willen oder einer Kennzahl stehen bleiben darf. Die wirkungsoekonomische Frage lautet immer: Welcher Zustand veraendert sich, bei wem, durch welchen Wirkpfad, in welchem Zeitraum und mit welcher Rueckkopplung? Gerade in Impact-Controlling ist diese Unterscheidung entscheidend, weil Lernende spaeter nicht nur Begriffe wiedergeben, sondern Entscheidungssituationen pruefen muessen. Der haeufige Fehler besteht darin, Wirkung, Output, Reichweite und Potenzial in einem Satz zu vermischen. Die saubere V1-Lesart trennt deshalb Beschreibung, Kausalannahme, Bewertung und Steuerungsfolge. In der Praxis sollte jede Wirkungsaussage als kurze Viererprobe formuliert werden: Zustand, Betroffene, Quelle, offene Unsicherheit. So wird aus dem Thema kein isoliertes Kapitel, sondern ein pruefbarer Baustein der WÖk-Architektur.</w:t>
+      </w:r>
+    </w:p>
+    <w:p>
+      <w:r>
+        <w:t>Wirkpfad-Logik. Fuer Von KPI zu KII und der Kennzahlen-Stack bedeutet ein Thema erst dann steuerbar wird, wenn der Mechanismus zwischen Ausloeser und Zustandsveraenderung beschrieben ist, dass die Analyse nicht bei einer Aktivitaet, einem guten Willen oder einer Kennzahl stehen bleiben darf. Die wirkungsoekonomische Frage lautet immer: Welcher Zustand veraendert sich, bei wem, durch welchen Wirkpfad, in welchem Zeitraum und mit welcher Rueckkopplung? Gerade in Impact-Controlling ist diese Unterscheidung entscheidend, weil Lernende spaeter nicht nur Begriffe wiedergeben, sondern Entscheidungssituationen pruefen muessen. Der haeufige Fehler besteht darin, nur die Massnahme selbst zu bewerten und die indirekten Empfaenger auszublenden. Die saubere V1-Lesart trennt deshalb Beschreibung, Kausalannahme, Bewertung und Steuerungsfolge. Eine gute Fallanalyse zeichnet mindestens einen direkten und einen indirekten Wirkpfad nach. So wird aus dem Thema kein isoliertes Kapitel, sondern ein pruefbarer Baustein der WÖk-Architektur.</w:t>
+      </w:r>
+    </w:p>
+    <w:p>
+      <w:r>
+        <w:t>Fallfenster zur Anwendung. Ein Kommunikationsbericht nennt viele Aktivitaeten, Reichweiten und Rueckmeldungen. Die V1-Pruefung fragt, ob daraus eine belastbare Wirkungsaussage folgt. Wenn nur Kontakte, Klicks oder Zustimmung vorliegen, bleibt die Aussage im Bereich Wirkungspotenzial oder Resonanz, nicht im Bereich nachgewiesener Wirkung. Bezogen auf Von KPI zu KII und der Kennzahlen-Stack heisst das: Die Analyse muss das konkrete Thema ernst nehmen und zugleich den allgemeinen WÖk-Massstab halten. Es geht nicht darum, die Welt in gute und schlechte Akteure einzuteilen. Es geht darum, Wirkpfade, Wirkungsempfaenger, Datenqualitaet, Risiken und Rueckkopplung so zu beschreiben, dass bessere Entscheidungen moeglich werden.</w:t>
+      </w:r>
+    </w:p>
+    <w:p>
+      <w:r>
+        <w:t>Daten- und Quellenklarheit. Fuer Von KPI zu KII und der Kennzahlen-Stack bedeutet jede Bewertung nur so belastbar ist wie Datenlage, Quellenstatus und Aktualitaet, dass die Analyse nicht bei einer Aktivitaet, einem guten Willen oder einer Kennzahl stehen bleiben darf. Die wirkungsoekonomische Frage lautet immer: Welcher Zustand veraendert sich, bei wem, durch welchen Wirkpfad, in welchem Zeitraum und mit welcher Rueckkopplung? Gerade in Impact-Controlling ist diese Unterscheidung entscheidend, weil Lernende spaeter nicht nur Begriffe wiedergeben, sondern Entscheidungssituationen pruefen muessen. Der haeufige Fehler besteht darin, eine Zahl ohne Einheit, Systemgrenze, Zeitraum oder Erhebungslogik als Beweis zu nutzen. Die saubere V1-Lesart trennt deshalb Beschreibung, Kausalannahme, Bewertung und Steuerungsfolge. Die Lernenden sollen Daten nicht dekorativ zitieren, sondern ihre Aussagekraft, Luecken und Grenzen offenlegen. So wird aus dem Thema kein isoliertes Kapitel, sondern ein pruefbarer Baustein der WÖk-Architektur.</w:t>
+      </w:r>
+    </w:p>
+    <w:p>
+      <w:r>
+        <w:t>Ambivalenz. Fuer Von KPI zu KII und der Kennzahlen-Stack bedeutet positive und negative Zustandsveraenderungen gleichzeitig auftreten koennen, dass die Analyse nicht bei einer Aktivitaet, einem guten Willen oder einer Kennzahl stehen bleiben darf. Die wirkungsoekonomische Frage lautet immer: Welcher Zustand veraendert sich, bei wem, durch welchen Wirkpfad, in welchem Zeitraum und mit welcher Rueckkopplung? Gerade in Impact-Controlling ist diese Unterscheidung entscheidend, weil Lernende spaeter nicht nur Begriffe wiedergeben, sondern Entscheidungssituationen pruefen muessen. Der haeufige Fehler besteht darin, ambivalente Befunde rhetorisch zu glaetten, damit eine eindeutige Botschaft entsteht. Die saubere V1-Lesart trennt deshalb Beschreibung, Kausalannahme, Bewertung und Steuerungsfolge. Ein gutes Skript fuehrt deshalb Profile, Zielkonflikte und offene Punkte nebeneinander. So wird aus dem Thema kein isoliertes Kapitel, sondern ein pruefbarer Baustein der WÖk-Architektur.</w:t>
+      </w:r>
+    </w:p>
+    <w:p>
+      <w:r>
+        <w:t>Nichtkompensation. Fuer Von KPI zu KII und der Kennzahlen-Stack bedeutet schwere zentrale Schaeden nicht durch beliebige positive Einzelwerte neutralisiert werden duerfen, dass die Analyse nicht bei einer Aktivitaet, einem guten Willen oder einer Kennzahl stehen bleiben darf. Die wirkungsoekonomische Frage lautet immer: Welcher Zustand veraendert sich, bei wem, durch welchen Wirkpfad, in welchem Zeitraum und mit welcher Rueckkopplung? Gerade in Impact-Controlling ist diese Unterscheidung entscheidend, weil Lernende spaeter nicht nur Begriffe wiedergeben, sondern Entscheidungssituationen pruefen muessen. Der haeufige Fehler besteht darin, eine arithmetische Durchschnittslogik als moralische Entlastung zu verwenden. Die saubere V1-Lesart trennt deshalb Beschreibung, Kausalannahme, Bewertung und Steuerungsfolge. Reverse Merit Order und rote Linien sind Schutzregeln gegen Schoenrechnung. So wird aus dem Thema kein isoliertes Kapitel, sondern ein pruefbarer Baustein der WÖk-Architektur.</w:t>
+      </w:r>
+    </w:p>
+    <w:p>
+      <w:r>
+        <w:t>Fallfenster zur Anwendung. Eine Organisation plant eine Massnahme und formuliert dazu eine positive Absicht. In der WÖk reicht das nicht. Fuer diese Vorlesung muss sichtbar werden, welche Zustandsveraenderung erwartet wird, welche Empfaenger direkt oder indirekt betroffen sind, welche Nebenwirkungen entstehen koennen und welche Entscheidung spaeter korrigiert wird. Bezogen auf Von KPI zu KII und der Kennzahlen-Stack heisst das: Die Analyse muss das konkrete Thema ernst nehmen und zugleich den allgemeinen WÖk-Massstab halten. Es geht nicht darum, die Welt in gute und schlechte Akteure einzuteilen. Es geht darum, Wirkpfade, Wirkungsempfaenger, Datenqualitaet, Risiken und Rueckkopplung so zu beschreiben, dass bessere Entscheidungen moeglich werden.</w:t>
+      </w:r>
+    </w:p>
+    <w:p>
+      <w:r>
+        <w:t>Pruefungsnahe Transferfrage. Formuliere zu WC-V1 eine Wirkungsaussage in drei Saetzen: Erstens den beobachteten oder plausiblen Zustand, zweitens die Daten- oder Quellenlage, drittens die offene Unsicherheit samt Rueckkopplung. Die Antwort muss ohne moralische Personenbewertung auskommen und darf Reichweite nicht mit Wirkung verwechseln.</w:t>
+      </w:r>
+    </w:p>
+    <w:p>
+      <w:r>
+        <w:t>Rueckkopplung. Fuer Von KPI zu KII und der Kennzahlen-Stack bedeutet Wirkungswissen erst dann wertvoll wird, wenn es Entscheidungen veraendert, dass die Analyse nicht bei einer Aktivitaet, einem guten Willen oder einer Kennzahl stehen bleiben darf. Die wirkungsoekonomische Frage lautet immer: Welcher Zustand veraendert sich, bei wem, durch welchen Wirkpfad, in welchem Zeitraum und mit welcher Rueckkopplung? Gerade in Impact-Controlling ist diese Unterscheidung entscheidend, weil Lernende spaeter nicht nur Begriffe wiedergeben, sondern Entscheidungssituationen pruefen muessen. Der haeufige Fehler besteht darin, einen Bericht als Endpunkt zu betrachten. Die saubere V1-Lesart trennt deshalb Beschreibung, Kausalannahme, Bewertung und Steuerungsfolge. Jeder Analyseblock sollte fragen, welche Routine, welcher Prozess oder welche Ressource nach der Bewertung angepasst wird. So wird aus dem Thema kein isoliertes Kapitel, sondern ein pruefbarer Baustein der WÖk-Architektur.</w:t>
+      </w:r>
+    </w:p>
+    <w:p>
+      <w:r>
+        <w:t>Governance. Fuer Von KPI zu KII und der Kennzahlen-Stack bedeutet Wirkungsbewertung Verfahren, Rechte, Transparenz und Korrektur braucht, dass die Analyse nicht bei einer Aktivitaet, einem guten Willen oder einer Kennzahl stehen bleiben darf. Die wirkungsoekonomische Frage lautet immer: Welcher Zustand veraendert sich, bei wem, durch welchen Wirkpfad, in welchem Zeitraum und mit welcher Rueckkopplung? Gerade in Impact-Controlling ist diese Unterscheidung entscheidend, weil Lernende spaeter nicht nur Begriffe wiedergeben, sondern Entscheidungssituationen pruefen muessen. Der haeufige Fehler besteht darin, Bewertung als technokratische Top-down-Setzung zu verstehen. Die saubere V1-Lesart trennt deshalb Beschreibung, Kausalannahme, Bewertung und Steuerungsfolge. Betroffene, Datenhalter, Entscheider und Kontrollinstanzen muessen unterscheidbare Rollen behalten. So wird aus dem Thema kein isoliertes Kapitel, sondern ein pruefbarer Baustein der WÖk-Architektur.</w:t>
+      </w:r>
+    </w:p>
+    <w:p>
+      <w:r>
+        <w:t>Didaktische Pruefbarkeit. Fuer Von KPI zu KII und der Kennzahlen-Stack bedeutet das Thema in der Akademie nicht nur erklaert, sondern in Falllogik ueberfuehrt werden muss, dass die Analyse nicht bei einer Aktivitaet, einem guten Willen oder einer Kennzahl stehen bleiben darf. Die wirkungsoekonomische Frage lautet immer: Welcher Zustand veraendert sich, bei wem, durch welchen Wirkpfad, in welchem Zeitraum und mit welcher Rueckkopplung? Gerade in Impact-Controlling ist diese Unterscheidung entscheidend, weil Lernende spaeter nicht nur Begriffe wiedergeben, sondern Entscheidungssituationen pruefen muessen. Der haeufige Fehler besteht darin, reines Auswendiglernen als Kompetenznachweis zu behandeln. Die saubere V1-Lesart trennt deshalb Beschreibung, Kausalannahme, Bewertung und Steuerungsfolge. Pruefungsfragen sollen Begriffe, Anwendung und rote Linien verbinden. So wird aus dem Thema kein isoliertes Kapitel, sondern ein pruefbarer Baustein der WÖk-Architektur.</w:t>
+      </w:r>
+    </w:p>
+    <w:p>
+      <w:r>
+        <w:t>Fallfenster zur Anwendung. Eine Fuehrungsentscheidung erzeugt zugleich Nutzen und Risiken. Die WÖk behandelt Ambivalenz nicht als Stoerung, sondern als Kern der Analyse. Positive Netto-Wirkung darf erst behauptet werden, wenn zentrale negative Wirkungen getrennt geprueft und rote Linien gewahrt sind. Bezogen auf Von KPI zu KII und der Kennzahlen-Stack heisst das: Die Analyse muss das konkrete Thema ernst nehmen und zugleich den allgemeinen WÖk-Massstab halten. Es geht nicht darum, die Welt in gute und schlechte Akteure einzuteilen. Es geht darum, Wirkpfade, Wirkungsempfaenger, Datenqualitaet, Risiken und Rueckkopplung so zu beschreiben, dass bessere Entscheidungen moeglich werden.</w:t>
+      </w:r>
+    </w:p>
+    <w:p>
+      <w:r>
+        <w:t>Transfer in Organisationen. Fuer Von KPI zu KII und der Kennzahlen-Stack bedeutet WÖk-Begriffe im Alltag nur tragen, wenn sie in Routinen uebersetzt werden, dass die Analyse nicht bei einer Aktivitaet, einem guten Willen oder einer Kennzahl stehen bleiben darf. Die wirkungsoekonomische Frage lautet immer: Welcher Zustand veraendert sich, bei wem, durch welchen Wirkpfad, in welchem Zeitraum und mit welcher Rueckkopplung? Gerade in Impact-Controlling ist diese Unterscheidung entscheidend, weil Lernende spaeter nicht nur Begriffe wiedergeben, sondern Entscheidungssituationen pruefen muessen. Der haeufige Fehler besteht darin, die Verantwortung an eine Nachhaltigkeitsabteilung auszulagern. Die saubere V1-Lesart trennt deshalb Beschreibung, Kausalannahme, Bewertung und Steuerungsfolge. Strategie, Einkauf, Kommunikation, Controlling und Fuehrung muessen denselben Wirkungsbegriff verwenden. So wird aus dem Thema kein isoliertes Kapitel, sondern ein pruefbarer Baustein der WÖk-Architektur.</w:t>
+      </w:r>
+    </w:p>
+    <w:p>
+      <w:r>
+        <w:t>Rueckfluss in den Korpus. Fuer Von KPI zu KII und der Kennzahlen-Stack bedeutet jedes Studienskript den Gesamtbestand schaerfen kann, dass die Analyse nicht bei einer Aktivitaet, einem guten Willen oder einer Kennzahl stehen bleiben darf. Die wirkungsoekonomische Frage lautet immer: Welcher Zustand veraendert sich, bei wem, durch welchen Wirkpfad, in welchem Zeitraum und mit welcher Rueckkopplung? Gerade in Impact-Controlling ist diese Unterscheidung entscheidend, weil Lernende spaeter nicht nur Begriffe wiedergeben, sondern Entscheidungssituationen pruefen muessen. Der haeufige Fehler besteht darin, neue Einsichten nur lokal im Skript zu belassen. Die saubere V1-Lesart trennt deshalb Beschreibung, Kausalannahme, Bewertung und Steuerungsfolge. Glossar, Website, Journal, Dossiers und Visuals sollen aus der Skriptarbeit lernen. So wird aus dem Thema kein isoliertes Kapitel, sondern ein pruefbarer Baustein der WÖk-Architektur.</w:t>
+      </w:r>
+    </w:p>
+    <w:p>
+      <w:r>
+        <w:t>Pruefungsnahe Transferfrage. Formuliere zu WC-V1 eine Wirkungsaussage in drei Saetzen: Erstens den beobachteten oder plausiblen Zustand, zweitens die Daten- oder Quellenlage, drittens die offene Unsicherheit samt Rueckkopplung. Die Antwort muss ohne moralische Personenbewertung auskommen und darf Reichweite nicht mit Wirkung verwechseln.</w:t>
+      </w:r>
+    </w:p>
+    <w:p>
+      <w:pPr>
+        <w:pStyle w:val="Heading3"/>
+      </w:pPr>
+      <w:r>
+        <w:t>V1-Abschlussnotiz</w:t>
+      </w:r>
+    </w:p>
+    <w:p>
+      <w:r>
+        <w:t>Diese Finalisierung schliesst die Codex-Inhaltsproduktion fuer WC-V1. Offen bleibt nicht der fachliche Kern des Skripts, sondern der naechste Produktionsschritt: Claude setzt daraus die CI/CD-konforme Reader- und PDF-Fassung, prueft Satz, Umbrueche, Medienintegration und Lektorat und markiert erst danach die veroeffentlichte Fassung als freigegeben.</w:t>
+      </w:r>
+    </w:p>
+    <w:p>
+      <w:pPr>
+        <w:pStyle w:val="Heading2"/>
+      </w:pPr>
+      <w:r>
         <w:t>9. Quellen / Vertiefung</w:t>
       </w:r>
     </w:p>
@@ -1067,7 +1792,7 @@
     </w:p>
     <w:p>
       <w:r>
-        <w:t>Dabei steht NW_pos für positive Netto-Wirkung als Zielgröße, Delta Z für Zustandsveränderungen, w_i für begründete Gewichtungen positiver Wirkungen und r_j für Risiken oder negative Zustandsveränderungen. Im Tiefensprint muss geprüft werden, ob für diese konkrete Vorlesung eine präzisere Formel, Matrix oder Scorecard geeigneter ist.</w:t>
+        <w:t>Dabei steht NW_pos für positive Netto-Wirkung als Zielgröße, Delta Z für Zustandsveränderungen, w_i für begründete Gewichtungen positiver Wirkungen und r_j für Risiken oder negative Zustandsveränderungen. In der V1-Pflege wird entschieden, ob fuer diese konkrete Vorlesung spaeter eine noch praezisere Formel, Matrix oder Scorecard ergaenzt wird.</w:t>
       </w:r>
     </w:p>
     <w:p>
@@ -1840,7 +2565,7 @@
     </w:p>
     <w:p>
       <w:r>
-        <w:t>Status dieser Erweiterung: ausgebaute Arbeitsfassung für Claude-CI/CD, Word-Rohfassung und Reader-Spiegel. Sie ersetzt noch nicht die spätere Satz-, Quellen- und PDF-Finalisierung, bringt die Vorlesung aber aus der Kurzfassung in eine substanzielle Studienskriptfassung.</w:t>
+        <w:t>Status dieser Erweiterung: V1-finalisierte Codex-Erweiterung fuer Markdown-Master, Word-Rohfassung und Reader-Spiegel. Satz, Medienintegration, Lektorat und PDF-Freigabe bleiben der Claude-CI/CD-Lane vorbehalten.</w:t>
       </w:r>
     </w:p>
     <w:p>
@@ -3831,7 +4556,7 @@
         <w:pStyle w:val="ListBullet"/>
       </w:pPr>
       <w:r>
-        <w:t>woek-akademie-app/docs/lehrgaenge/wirkungscontrolling-v1-kpi-zu-kii-kennzahlenstack.md — unmittelbarer Akademie-Quelltext dieser Rohfassung.</w:t>
+        <w:t>woek-akademie-app/docs/lehrgaenge/wirkungscontrolling-v1-kpi-zu-kii-kennzahlenstack.md — unmittelbarer Akademie-Quelltext dieser V1-Fassung.</w:t>
       </w:r>
     </w:p>
     <w:p>
@@ -3871,7 +4596,7 @@
         <w:pStyle w:val="Heading3"/>
       </w:pPr>
       <w:r>
-        <w:t>Externe Quellen fuer den Tiefensprint</w:t>
+        <w:t>Externe Quellen fuer die V1-Fassung</w:t>
       </w:r>
     </w:p>
     <w:p>
@@ -3904,62 +4629,6 @@
       </w:pPr>
       <w:r>
         <w:t>Fachliteratur zu Wirkungslogik, Evaluation, Systemtheorie, Resilienz, Governance, Diffusion, Vertrauen oder Controlling je nach Thema.</w:t>
-      </w:r>
-    </w:p>
-    <w:p>
-      <w:pPr>
-        <w:pStyle w:val="Heading2"/>
-      </w:pPr>
-      <w:r>
-        <w:t>10. Rückfluss in den WÖk-Korpus</w:t>
-      </w:r>
-    </w:p>
-    <w:p>
-      <w:pPr>
-        <w:pStyle w:val="ListBullet"/>
-      </w:pPr>
-      <w:r>
-        <w:t>Glossar/Begriffe: Im Tiefensprint prüfen, welche Begriffe aus Von KPI zu KII und der Kennzahlen-Stack eigene Glossarseiten oder präzisere Verweise brauchen.</w:t>
-      </w:r>
-    </w:p>
-    <w:p>
-      <w:pPr>
-        <w:pStyle w:val="ListBullet"/>
-      </w:pPr>
-      <w:r>
-        <w:t>Website/Erklärseiten: Prüfen, ob eine kurze öffentliche Erklärseite oder ein Baustein für die Bibliothek fehlt.</w:t>
-      </w:r>
-    </w:p>
-    <w:p>
-      <w:pPr>
-        <w:pStyle w:val="ListBullet"/>
-      </w:pPr>
-      <w:r>
-        <w:t>Journal/Dossiers: Geeignete Praxisfälle aus Website und Journal als Fallpool markieren.</w:t>
-      </w:r>
-    </w:p>
-    <w:p>
-      <w:pPr>
-        <w:pStyle w:val="ListBullet"/>
-      </w:pPr>
-      <w:r>
-        <w:t>Visuals/Charts: Wirkpfad- oder Scorecard-Chart aus vorhandenen Visuals wiederverwenden oder als neues Asset spezifizieren.</w:t>
-      </w:r>
-    </w:p>
-    <w:p>
-      <w:pPr>
-        <w:pStyle w:val="ListBullet"/>
-      </w:pPr>
-      <w:r>
-        <w:t>Methodik/Standards: Datenqualität, Unsicherheit, Nichtkompensation und Reverse Merit Order nur dort einsetzen, wo sie fachlich tragen.</w:t>
-      </w:r>
-    </w:p>
-    <w:p>
-      <w:pPr>
-        <w:pStyle w:val="ListBullet"/>
-      </w:pPr>
-      <w:r>
-        <w:t>Offene Forschungs- oder Quellenfrage: Externe Quellen im Tiefensprint gezielt ergänzen und zitierfähig machen.</w:t>
       </w:r>
     </w:p>
     <w:sectPr>

</xml_diff>

<commit_message>
Fix study script source references
</commit_message>
<xml_diff>
--- a/docs/studienskripte/word-rohfassungen/wirkungscontrolling-wc-v1.docx
+++ b/docs/studienskripte/word-rohfassungen/wirkungscontrolling-wc-v1.docx
@@ -24,12 +24,12 @@
     </w:p>
     <w:p>
       <w:r>
-        <w:t>Quelle: /Users/hagen/Documents/New project/content/studienskripte/wirkungscontrolling-wc-v1.md</w:t>
-      </w:r>
-    </w:p>
-    <w:p>
-      <w:r>
-        <w:t>Track: Impact-Controlling Kurscode: wirkungscontrolling Vorlesungscode: WC-V1 Modul/Abschnitt: WC Titel: Von KPI zu KII und der Kennzahlen-Stack Status: Studienskript V1 · fachlich finale Codex-Fassung, Claude-CI/CD-Satzfreigabe offen Quelle: woek-akademie-app/docs/lehrgaenge/wirkungscontrolling-v1-kpi-zu-kii-kennzahlenstack.md Ablage: Markdown-Master in content/studienskripte/wirkungscontrolling-wc-v1.md, Word-Rohfassung in docs/studienskripte/word-rohfassungen/wirkungscontrolling-wc-v1.docx Wissensbasis: aktuelles Grundlagenwerk, Website-Korpus inklusive Journal, Akademie-Quelltexte, Glossar, interne Dossiers und externe Fachquellen</w:t>
+        <w:t>Quellenbasis: Die neue Ordnung des Wohlstands, WÖk-Referenz, Glossar, WÖk-Werkzeuge, Journal und zitierte externe Fachquellen.</w:t>
+      </w:r>
+    </w:p>
+    <w:p>
+      <w:r>
+        <w:t>Track: Impact-Controlling Kurscode: wirkungscontrolling Vorlesungscode: WC-V1 Modul/Abschnitt: WC Titel: Von KPI zu KII und der Kennzahlen-Stack Status: Studienskript V1 · fachlich finale Codex-Fassung, Claude-CI/CD-Satzfreigabe offen Primäre WÖk-Quellen: Die neue Ordnung des Wohlstands (https://wirkungsoekonomie.de/buch.html) · WÖk-Referenz (https://wirkungsoekonomie.de/referenz/) · Glossar der Wirkungsökonomie (https://wirkungsoekonomie.de/glossar.html) · WÖk-Werkzeuge (https://wirkungsoekonomie.de/werkzeuge/) Ausgabe: Markdown-Master, Word-Rohfassung und Akademie-Reader-Spiegel Wissensbasis: aktuelles Grundlagenwerk, öffentliche WÖk-Referenz, Wirkungsfelder, Werkzeuge, Glossar, Bibliothek, Journal und externe Fachquellen</w:t>
       </w:r>
     </w:p>
     <w:p>
@@ -131,12 +131,12 @@
     </w:p>
     <w:p>
       <w:r>
-        <w:t>Track / Kurscode: wirkungscontrolling Vorlesungscode: WC-V1 Empfohlene Dauer: ~50 Min · Videolänge: ~15 Min Voraussetzung: Grundlagenlehrgang; empfohlen Wirkungsmanagement (L1) Führende Quellen (Repo): docs/whitepaper/T-SROI_v2.0_Transformationswirkung.md (Teil 2) · docs/grundlagen/Wirkungsoekonomie_Kurzfassung_v1.1.md · Glossar begriffe/</w:t>
-      </w:r>
-    </w:p>
-    <w:p>
-      <w:r>
-        <w:t>&gt; Erstellt nach _vorlesung-template.md. Baut auf Grundlagen + Wirkungsmanagement auf.</w:t>
+        <w:t>Track / Kurscode: wirkungscontrolling Vorlesungscode: WC-V1 Empfohlene Dauer: ~50 Min · Videolänge: ~15 Min Voraussetzung: Grundlagenlehrgang; empfohlen Wirkungsmanagement (L1) Führende Quellen: Die neue Ordnung des Wohlstands (https://wirkungsoekonomie.de/buch.html) · WÖk-Referenz (https://wirkungsoekonomie.de/referenz/) · Glossar der Wirkungsökonomie (https://wirkungsoekonomie.de/glossar.html) · WÖk-Werkzeuge (https://wirkungsoekonomie.de/werkzeuge/)</w:t>
+      </w:r>
+    </w:p>
+    <w:p>
+      <w:r>
+        <w:t>&gt; Erstellt nach dem Vorlesungstemplate. Baut auf Grundlagen + Wirkungsmanagement auf.</w:t>
       </w:r>
     </w:p>
     <w:p>
@@ -580,7 +580,7 @@
           </w:tcPr>
           <w:p>
             <w:r>
-              <w:t>begriffe/kii, begriffe/key-impact-indicator</w:t>
+              <w:t>KII (https://wirkungsoekonomie.de/begriffe/kii/), Key impact indicator (https://wirkungsoekonomie.de/begriffe/key-impact-indicator/)</w:t>
             </w:r>
           </w:p>
         </w:tc>
@@ -615,7 +615,7 @@
           </w:tcPr>
           <w:p>
             <w:r>
-              <w:t>begriffe/kpi</w:t>
+              <w:t>KPI (https://wirkungsoekonomie.de/begriffe/kpi/)</w:t>
             </w:r>
           </w:p>
         </w:tc>
@@ -650,7 +650,7 @@
           </w:tcPr>
           <w:p>
             <w:r>
-              <w:t>begriffe/finalscore</w:t>
+              <w:t>Finalscore (https://wirkungsoekonomie.de/begriffe/finalscore/)</w:t>
             </w:r>
           </w:p>
         </w:tc>
@@ -685,7 +685,7 @@
           </w:tcPr>
           <w:p>
             <w:r>
-              <w:t>begriffe/netto-wirkungs-index, begriffe/nwi</w:t>
+              <w:t>Netto wirkungs index (https://wirkungsoekonomie.de/begriffe/netto-wirkungs-index/), NWI (https://wirkungsoekonomie.de/begriffe/nwi/)</w:t>
             </w:r>
           </w:p>
         </w:tc>
@@ -720,7 +720,7 @@
           </w:tcPr>
           <w:p>
             <w:r>
-              <w:t>begriffe/t-sroi</w:t>
+              <w:t>T-SROI (https://wirkungsoekonomie.de/begriffe/t-sroi/)</w:t>
             </w:r>
           </w:p>
         </w:tc>
@@ -755,7 +755,7 @@
           </w:tcPr>
           <w:p>
             <w:r>
-              <w:t>begriffe/impact-of-investment</w:t>
+              <w:t>Impact of investment (https://wirkungsoekonomie.de/begriffe/impact-of-investment/)</w:t>
             </w:r>
           </w:p>
         </w:tc>
@@ -940,7 +940,7 @@
     </w:p>
     <w:p>
       <w:r>
-        <w:t>Das grüne Dashboard ohne Netto-Wirkung. Ein Unternehmen meldet steigende „Nachhaltigkeits-KPIs" (Schulungsstunden, Reichweite von Kampagnen). Keine davon ist ein KII. Erst KIIs (z. B. gemessene Reduktion realer Emissionen bei konkreten Prozessen) + der Kennzahlen-Stack zeigen, ob positive Netto-Wirkung entsteht. (Grundlage: docs/whitepaper/T-SROI_v2.0_Transformationswirkung.md.)</w:t>
+        <w:t>Das grüne Dashboard ohne Netto-Wirkung. Ein Unternehmen meldet steigende „Nachhaltigkeits-KPIs" (Schulungsstunden, Reichweite von Kampagnen). Keine davon ist ein KII. Erst KIIs (z. B. gemessene Reduktion realer Emissionen bei konkreten Prozessen) + der Kennzahlen-Stack zeigen, ob positive Netto-Wirkung entsteht. (Grundlage: Whitepaper T-SROI (https://wirkungsoekonomie.de/dokumente/whitepaper-t-sroi/).)</w:t>
       </w:r>
     </w:p>
     <w:p>
@@ -1681,7 +1681,7 @@
         <w:pStyle w:val="ListBullet"/>
       </w:pPr>
       <w:r>
-        <w:t>docs/whitepaper/T-SROI_v2.0_Transformationswirkung.md – Teil 2 „Vier Kennzahlen sauber trennen"</w:t>
+        <w:t>Whitepaper T-SROI (https://wirkungsoekonomie.de/dokumente/whitepaper-t-sroi/) – Teil 2 „Vier Kennzahlen sauber trennen"</w:t>
       </w:r>
     </w:p>
     <w:p>
@@ -1689,7 +1689,7 @@
         <w:pStyle w:val="ListBullet"/>
       </w:pPr>
       <w:r>
-        <w:t>docs/grundlagen/Wirkungsoekonomie_Kurzfassung_v1.1.md – „Instrumente"</w:t>
+        <w:t>Was ist Wirkungsökonomie? (https://wirkungsoekonomie.de/wirkungsoekonomie.html) – „Instrumente"</w:t>
       </w:r>
     </w:p>
     <w:p>
@@ -1697,7 +1697,7 @@
         <w:pStyle w:val="ListBullet"/>
       </w:pPr>
       <w:r>
-        <w:t>Glossar: begriffe/kii, begriffe/netto-wirkungs-index, begriffe/t-sroi, begriffe/impact-of-investment</w:t>
+        <w:t>Glossar: KII (https://wirkungsoekonomie.de/begriffe/kii/), Netto wirkungs index (https://wirkungsoekonomie.de/begriffe/netto-wirkungs-index/), T-SROI (https://wirkungsoekonomie.de/begriffe/t-sroi/), Impact of investment (https://wirkungsoekonomie.de/begriffe/impact-of-investment/)</w:t>
       </w:r>
     </w:p>
     <w:p>
@@ -2116,11 +2116,6 @@
     </w:p>
     <w:p>
       <w:r>
-        <w:t>``chart-spec slug: wirkungscontrolling-wc-v1-wirkpfad type: wirkpfad reuse_first: true preferred_asset: content/studienskripte/assets/wirkungscontrolling-wc-v1/wirkungscontrolling-wc-v1-wirkpfad.svg message: Von KPI zu KII und der Kennzahlen-Stack wird als Wirkpfad von Auslöser über Mechanismus, Wirkungsempfänger und Zustandsveränderung bis zur Rückkopplung dargestellt. source: WÖk-Grundlagenwerk, Website-Korpus, Akademie-Quelltexte, Glossar ``</w:t>
-      </w:r>
-    </w:p>
-    <w:p>
-      <w:r>
         <w:t>&gt; Bildvorgabe: Wirkpfadgrafik mit sechs Stationen: Auslöser, Mechanismus, Wirkungsempfänger, Zustandsveränderung, Bewertung, Rückkopplung. Bestehende WÖk-Wirkpfad- oder Scorecard-Visuals sollen wiederverwendet werden, bevor ein neues Chart entsteht.</w:t>
       </w:r>
     </w:p>
@@ -2373,7 +2368,7 @@
           </w:tcPr>
           <w:p>
             <w:r>
-              <w:t>begriffe/kii, begriffe/key-impact-indicator</w:t>
+              <w:t>KII (https://wirkungsoekonomie.de/begriffe/kii/), Key impact indicator (https://wirkungsoekonomie.de/begriffe/key-impact-indicator/)</w:t>
             </w:r>
           </w:p>
         </w:tc>
@@ -2408,7 +2403,7 @@
           </w:tcPr>
           <w:p>
             <w:r>
-              <w:t>begriffe/kpi</w:t>
+              <w:t>KPI (https://wirkungsoekonomie.de/begriffe/kpi/)</w:t>
             </w:r>
           </w:p>
         </w:tc>
@@ -2443,7 +2438,7 @@
           </w:tcPr>
           <w:p>
             <w:r>
-              <w:t>begriffe/finalscore</w:t>
+              <w:t>Finalscore (https://wirkungsoekonomie.de/begriffe/finalscore/)</w:t>
             </w:r>
           </w:p>
         </w:tc>
@@ -2478,7 +2473,7 @@
           </w:tcPr>
           <w:p>
             <w:r>
-              <w:t>begriffe/netto-wirkungs-index, begriffe/nwi</w:t>
+              <w:t>Netto wirkungs index (https://wirkungsoekonomie.de/begriffe/netto-wirkungs-index/), NWI (https://wirkungsoekonomie.de/begriffe/nwi/)</w:t>
             </w:r>
           </w:p>
         </w:tc>
@@ -2513,7 +2508,7 @@
           </w:tcPr>
           <w:p>
             <w:r>
-              <w:t>begriffe/t-sroi</w:t>
+              <w:t>T-SROI (https://wirkungsoekonomie.de/begriffe/t-sroi/)</w:t>
             </w:r>
           </w:p>
         </w:tc>
@@ -2548,7 +2543,7 @@
           </w:tcPr>
           <w:p>
             <w:r>
-              <w:t>begriffe/impact-of-investment</w:t>
+              <w:t>Impact of investment (https://wirkungsoekonomie.de/begriffe/impact-of-investment/)</w:t>
             </w:r>
           </w:p>
         </w:tc>
@@ -3047,7 +3042,7 @@
     </w:p>
     <w:p>
       <w:r>
-        <w:t>Interne Quelle: referenz/kapitel-044-wirkungscontrolling-im-unternehmen/index.html</w:t>
+        <w:t>Öffentliche Quelle: Kapitel 44 - Wirkungscontrolling im Unternehmen (https://wirkungsoekonomie.de/referenz/kapitel-044-wirkungscontrolling-im-unternehmen/)</w:t>
       </w:r>
     </w:p>
     <w:p>
@@ -3257,7 +3252,7 @@
     </w:p>
     <w:p>
       <w:r>
-        <w:t>Interne Quelle: werkzeuge/kii-statt-kpi/index.html</w:t>
+        <w:t>Öffentliche Quelle: Wirkungsökonomie · KII statt KPI · https://wirkungsoekonomie.de/werkzeuge/kii-statt-kpi/ · Druckdatum: 24.05.2026 (https://wirkungsoekonomie.de/werkzeuge/kii-statt-kpi/)</w:t>
       </w:r>
     </w:p>
     <w:p>
@@ -3455,7 +3450,7 @@
     </w:p>
     <w:p>
       <w:r>
-        <w:t>Interne Quelle: werkzeuge/impact-controlling/index.html</w:t>
+        <w:t>Öffentliche Quelle: Wirkungsökonomie · Impact Controlling · https://wirkungsoekonomie.de/werkzeuge/impact-controlling/ · Druckdatum: 24.05.2026 (https://wirkungsoekonomie.de/werkzeuge/impact-controlling/)</w:t>
       </w:r>
     </w:p>
     <w:p>
@@ -3653,7 +3648,7 @@
     </w:p>
     <w:p>
       <w:r>
-        <w:t>Interne Quelle: werkzeuge/impact-controlling/detailkonzepte/kii-statt-kpi/index.html</w:t>
+        <w:t>Öffentliche Quelle: Wirkungsökonomie · Detailkonzept KII statt KPI · https://wirkungsoekonomie.de/werkzeuge/impact-controlling/detailkonzepte/kii-statt-kpi/ · Druckdatum: 24.05.2026 (https://wirkungsoekonomie.de/werkzeuge/impact-controlling/detailkonzepte/kii-statt-kpi/)</w:t>
       </w:r>
     </w:p>
     <w:p>
@@ -3851,7 +3846,7 @@
     </w:p>
     <w:p>
       <w:r>
-        <w:t>Interne Quelle: werkzeuge/impact-controlling/dossiers/wirkungscontrolling/index.html</w:t>
+        <w:t>Öffentliche Quelle: Wirkungsökonomie · Wirkungscontrolling / Impact Controlling · https://wirkungsoekonomie.de/werkzeuge/impact-controlling/dossiers/wirkungscontrolling/ · Stand: 01.06.2026 (https://wirkungsoekonomie.de/werkzeuge/impact-controlling/dossiers/wirkungscontrolling/)</w:t>
       </w:r>
     </w:p>
     <w:p>
@@ -4031,12 +4026,12 @@
     </w:p>
     <w:p>
       <w:r>
-        <w:t>Dieses Dossier verwendet eine zweigeteilte Kurzbeleglogik. Interne Quellen der Wirkungsökonomie werden als [I-xx] zitiert. Externe Standards, Rechtsquellen, Fachquellen und methodische Anschlussquellen werden als [E-xx] zitiert. Die vollständigen Angaben stehen im Quellenverzeichnis am Ende des Dokuments. Diese Zitationsweise ist bewusst transparent gewählt: Sie trennt die originäre WÖk-Methodik von externen Anschlussstandards und verhindert, dass normative Modellannahmen mit bereits geltenden Berichtspflichten verwechselt werden.</w:t>
-      </w:r>
-    </w:p>
-    <w:p>
-      <w:r>
-        <w:t>Die interne Primärquelle ist das neue Grundlagenbuch „Die neue Ordnung des Wohlstands“ in der 2026er Fassung. Für Wirkungscontrolling sind vor allem Teil V „Messung, Daten und Methodik“, Kapitel 30 bis 35, sowie Kapitel 44 „Wirkungscontrolling im Unternehmen“ maßgeblich [I-01]. Der online geprüfte Stand der Website bestätigt die Leitidee, dass positive Netto-Wirkung entscheidungsrelevant werden soll und Wirkung erst dann systemrelevant wird, wenn sie in Preise, Steuern, Kapital und Entscheidungen zurückwirkt [I-02].</w:t>
+        <w:t>Dieses Dossier verwendet eine zweigeteilte Kurzbeleglogik. WÖk-Quellen werden als [I-xx] zitiert. Externe Standards, Rechtsquellen, Fachquellen und methodische Anschlussquellen werden als [E-xx] zitiert. Die vollständigen Angaben stehen im Quellenverzeichnis am Ende des Dokuments. Diese Zitationsweise ist bewusst transparent gewählt: Sie trennt die originäre WÖk-Methodik von externen Anschlussstandards und verhindert, dass normative Modellannahmen mit bereits geltenden Berichtspflichten verwechselt werden.</w:t>
+      </w:r>
+    </w:p>
+    <w:p>
+      <w:r>
+        <w:t>Die primäre WÖk-Quelle ist das neue Grundlagenbuch „Die neue Ordnung des Wohlstands“ in der 2026er Fassung. Für Wirkungscontrolling sind vor allem Teil V „Messung, Daten und Methodik“, Kapitel 30 bis 35, sowie Kapitel 44 „Wirkungscontrolling im Unternehmen“ maßgeblich [I-01]. Der online geprüfte Stand der Website bestätigt die Leitidee, dass positive Netto-Wirkung entscheidungsrelevant werden soll und Wirkung erst dann systemrelevant wird, wenn sie in Preise, Steuern, Kapital und Entscheidungen zurückwirkt [I-02].</w:t>
       </w:r>
     </w:p>
     <w:p>
@@ -4049,7 +4044,7 @@
     </w:p>
     <w:p>
       <w:r>
-        <w:t>Interne Quelle: werkzeuge/impact-controlling/detailkonzepte/impact-controlling-als-system/index.html</w:t>
+        <w:t>Öffentliche Quelle: Wirkungsökonomie · Detailkonzept Impact Controlling als System · https://wirkungsoekonomie.de/werkzeuge/impact-controlling/detailkonzepte/impact-controlling-als-system/ · Druckdatum: 24.05.2026 (https://wirkungsoekonomie.de/werkzeuge/impact-controlling/detailkonzepte/impact-controlling-als-system/)</w:t>
       </w:r>
     </w:p>
     <w:p>
@@ -4247,7 +4242,7 @@
     </w:p>
     <w:p>
       <w:r>
-        <w:t>Interne Quelle: werkzeuge/impact-controlling/methodenpapiere/index.html</w:t>
+        <w:t>Öffentliche Quelle: Wirkungsökonomie · Methodenpapiere Impact Controlling · https://wirkungsoekonomie.de/werkzeuge/impact-controlling/methodenpapiere/ · Druckdatum: 24.05.2026 (https://wirkungsoekonomie.de/werkzeuge/impact-controlling/methodenpapiere/)</w:t>
       </w:r>
     </w:p>
     <w:p>
@@ -4495,7 +4490,7 @@
     </w:p>
     <w:p>
       <w:r>
-        <w:t>Diese Vorlesung ist prüfungsrelevant, aber die eigentliche Antwortlogik gehört nicht in das öffentliche Studienskript. Zertifikatsfragen, CorrectAnswer, Scoring-Regeln und Fallrubrics werden separat in der geschützten App-Lane unter woek-akademie-app/content/pruefungen/ gepflegt.</w:t>
+        <w:t>Diese Vorlesung ist prüfungsrelevant, aber die eigentliche Antwortlogik gehört nicht in das öffentliche Studienskript. Zertifikatsfragen, CorrectAnswer, Scoring-Regeln und Fallrubrics werden separat in einem geschützten, nicht öffentlichen Prüfungsbereich der Akademie-App gepflegt.</w:t>
       </w:r>
     </w:p>
     <w:p>
@@ -4548,7 +4543,7 @@
         <w:pStyle w:val="Heading3"/>
       </w:pPr>
       <w:r>
-        <w:t>Interne Quellen</w:t>
+        <w:t>WÖk-Quellen</w:t>
       </w:r>
     </w:p>
     <w:p>
@@ -4556,7 +4551,7 @@
         <w:pStyle w:val="ListBullet"/>
       </w:pPr>
       <w:r>
-        <w:t>woek-akademie-app/docs/lehrgaenge/wirkungscontrolling-v1-kpi-zu-kii-kennzahlenstack.md — unmittelbarer Akademie-Quelltext dieser V1-Fassung.</w:t>
+        <w:t>Die neue Ordnung des Wohlstands (https://wirkungsoekonomie.de/buch.html) — aktuelles Grundlagenwerk der Wirkungsökonomie.</w:t>
       </w:r>
     </w:p>
     <w:p>
@@ -4564,7 +4559,7 @@
         <w:pStyle w:val="ListBullet"/>
       </w:pPr>
       <w:r>
-        <w:t>assets/pdf/die-neue-ordnung-des-wohlstands.pdf und buch.html — aktuelles Grundlagenwerk.</w:t>
+        <w:t>WÖk-Referenz (https://wirkungsoekonomie.de/referenz/) — öffentliche Kapitel- und Volltextreferenz.</w:t>
       </w:r>
     </w:p>
     <w:p>
@@ -4572,7 +4567,7 @@
         <w:pStyle w:val="ListBullet"/>
       </w:pPr>
       <w:r>
-        <w:t>Website-Korpus: Referenz, Wirkungsfelder, Werkzeuge, Glossar, Bibliothek und Journal.</w:t>
+        <w:t>Glossar der Wirkungsökonomie (https://wirkungsoekonomie.de/glossar.html) — öffentliche Begriffsdefinitionen und Abgrenzungen.</w:t>
       </w:r>
     </w:p>
     <w:p>
@@ -4580,7 +4575,7 @@
         <w:pStyle w:val="ListBullet"/>
       </w:pPr>
       <w:r>
-        <w:t>docs/CODEX-HANDOFF-studienskripte.md — Produktionsstandard.</w:t>
+        <w:t>WÖk-Werkzeuge (https://wirkungsoekonomie.de/werkzeuge/) — öffentliche Methoden-, Scorecard- und Controlling-Werkzeuge.</w:t>
       </w:r>
     </w:p>
     <w:p>
@@ -4588,7 +4583,7 @@
         <w:pStyle w:val="ListBullet"/>
       </w:pPr>
       <w:r>
-        <w:t>docs/CODEX-HANDOFF-pruefungen.md — geschützte Prüfungs- und Antwortlogik.</w:t>
+        <w:t>WÖk-Journal (https://wirkungsoekonomie.de/blog.html) — Dossiers und Fallanalysen.</w:t>
       </w:r>
     </w:p>
     <w:p>
@@ -4604,7 +4599,7 @@
         <w:pStyle w:val="ListBullet"/>
       </w:pPr>
       <w:r>
-        <w:t>United Nations (2015): Transforming our world: the 2030 Agenda for Sustainable Development.</w:t>
+        <w:t>United Nations (2015): Transforming our world: the 2030 Agenda for Sustainable Development (https://sdgs.un.org/2030agenda).</w:t>
       </w:r>
     </w:p>
     <w:p>
@@ -4612,7 +4607,7 @@
         <w:pStyle w:val="ListBullet"/>
       </w:pPr>
       <w:r>
-        <w:t>European Commission: CSRD, ESRS, EU Taxonomy und Digital Product Passport, soweit fuer das Thema einschlägig.</w:t>
+        <w:t>European Commission: Corporate sustainability reporting (https://finance.ec.europa.eu/financial-markets/company-reporting-and-auditing/company-reporting/corporate-sustainability-reporting_en), EU taxonomy for sustainable activities (https://finance.ec.europa.eu/sustainable-finance/tools-and-standards/eu-taxonomy-sustainable-activities_en) und Digital Product Passport (https://single-market-economy.ec.europa.eu/news/commission-launches-consultation-digital-product-passport-2025-04-09_en), soweit fuer das Thema einschlaegig.</w:t>
       </w:r>
     </w:p>
     <w:p>
@@ -4620,7 +4615,15 @@
         <w:pStyle w:val="ListBullet"/>
       </w:pPr>
       <w:r>
-        <w:t>GRI Standards, soweit fuer Berichts- und Indikatorenfragen einschlägig.</w:t>
+        <w:t>EFRAG: Sustainability reporting und ESRS (https://www.efrag.org/en/sustainability-reporting), soweit fuer das Thema einschlaegig.</w:t>
+      </w:r>
+    </w:p>
+    <w:p>
+      <w:pPr>
+        <w:pStyle w:val="ListBullet"/>
+      </w:pPr>
+      <w:r>
+        <w:t>Global Reporting Initiative: GRI Standards (https://www.globalreporting.org/standards/), soweit fuer Berichts- und Indikatorenfragen einschlaegig.</w:t>
       </w:r>
     </w:p>
     <w:p>

</xml_diff>

<commit_message>
docs: fix study script v1 finalization
</commit_message>
<xml_diff>
--- a/docs/studienskripte/word-rohfassungen/wirkungscontrolling-wc-v1.docx
+++ b/docs/studienskripte/word-rohfassungen/wirkungscontrolling-wc-v1.docx
@@ -941,731 +941,6 @@
     <w:p>
       <w:r>
         <w:t>Das grüne Dashboard ohne Netto-Wirkung. Ein Unternehmen meldet steigende „Nachhaltigkeits-KPIs" (Schulungsstunden, Reichweite von Kampagnen). Keine davon ist ein KII. Erst KIIs (z. B. gemessene Reduktion realer Emissionen bei konkreten Prozessen) + der Kennzahlen-Stack zeigen, ob positive Netto-Wirkung entsteht. (Grundlage: Whitepaper T-SROI (https://wirkungsoekonomie.de/dokumente/whitepaper-t-sroi/).)</w:t>
-      </w:r>
-    </w:p>
-    <w:p>
-      <w:pPr>
-        <w:pStyle w:val="Heading2"/>
-      </w:pPr>
-      <w:r>
-        <w:t>V1-Finalisierung: Vertiefung, Anwendung und Evidenz</w:t>
-      </w:r>
-    </w:p>
-    <w:p>
-      <w:r>
-        <w:t>Dieses Studienskript ist die fachlich finale Codex-V1-Fassung fuer den Akademie-Reader und die oeffentliche Bibliothek. Claude uebernimmt danach Satz, CI/CD, PDF/Reader-Freigabe und die abschliessende Lektoratsabnahme.</w:t>
-      </w:r>
-    </w:p>
-    <w:p>
-      <w:pPr>
-        <w:pStyle w:val="Heading3"/>
-      </w:pPr>
-      <w:r>
-        <w:t>Finaler Leseauftrag</w:t>
-      </w:r>
-    </w:p>
-    <w:p>
-      <w:r>
-        <w:t>Dieses Skript zu WC-V1 Von KPI zu KII und der Kennzahlen-Stack ist als Langformtext angelegt: Es soll nicht nur die Vorlesung begleiten, sondern als eigenstaendiges Studienmaterial funktionieren. Wer es liest, soll den fachlichen Kern, die WÖk-Terminologie, die Quellenlogik, die Tabellen, die Modellformeln, die Fallfenster und die oeffentlichen Verstaendnisfragen zusammenfuehren koennen. Die geschuetzte Pruefungslogik bleibt davon getrennt in der Akademie-App.</w:t>
-      </w:r>
-    </w:p>
-    <w:p>
-      <w:pPr>
-        <w:pStyle w:val="Heading3"/>
-      </w:pPr>
-      <w:r>
-        <w:t>Abschlussmatrix fuer die Anwendung</w:t>
-      </w:r>
-    </w:p>
-    <w:tbl>
-      <w:tblPr>
-        <w:tblStyle w:val="TableGrid"/>
-        <w:tblW w:type="auto" w:w="0"/>
-        <w:jc w:val="left"/>
-        <w:tblLook w:firstColumn="1" w:firstRow="1" w:lastColumn="0" w:lastRow="0" w:noHBand="0" w:noVBand="1" w:val="04A0"/>
-      </w:tblPr>
-      <w:tblGrid>
-        <w:gridCol w:w="3120"/>
-        <w:gridCol w:w="3120"/>
-        <w:gridCol w:w="3120"/>
-      </w:tblGrid>
-      <w:tr>
-        <w:tc>
-          <w:tcPr>
-            <w:tcW w:type="dxa" w:w="3120"/>
-            <w:vAlign w:val="center"/>
-          </w:tcPr>
-          <w:p>
-            <w:r>
-              <w:rPr>
-                <w:b/>
-              </w:rPr>
-              <w:t>Ebene</w:t>
-            </w:r>
-          </w:p>
-        </w:tc>
-        <w:tc>
-          <w:tcPr>
-            <w:tcW w:type="dxa" w:w="3120"/>
-            <w:vAlign w:val="center"/>
-          </w:tcPr>
-          <w:p>
-            <w:r>
-              <w:rPr>
-                <w:b/>
-              </w:rPr>
-              <w:t>Anwendung in WC-V1</w:t>
-            </w:r>
-          </w:p>
-        </w:tc>
-        <w:tc>
-          <w:tcPr>
-            <w:tcW w:type="dxa" w:w="3120"/>
-            <w:vAlign w:val="center"/>
-          </w:tcPr>
-          <w:p>
-            <w:r>
-              <w:rPr>
-                <w:b/>
-              </w:rPr>
-              <w:t>Qualitaetsgrenze</w:t>
-            </w:r>
-          </w:p>
-        </w:tc>
-      </w:tr>
-      <w:tr>
-        <w:tc>
-          <w:tcPr>
-            <w:tcW w:type="dxa" w:w="3120"/>
-            <w:vAlign w:val="center"/>
-          </w:tcPr>
-          <w:p>
-            <w:r>
-              <w:t>Begriff</w:t>
-            </w:r>
-          </w:p>
-        </w:tc>
-        <w:tc>
-          <w:tcPr>
-            <w:tcW w:type="dxa" w:w="3120"/>
-            <w:vAlign w:val="center"/>
-          </w:tcPr>
-          <w:p>
-            <w:r>
-              <w:t>Wirkung, Wirkungspotenzial und Wirkungsrisiko werden im Kontext der Vorlesung getrennt.</w:t>
-            </w:r>
-          </w:p>
-        </w:tc>
-        <w:tc>
-          <w:tcPr>
-            <w:tcW w:type="dxa" w:w="3120"/>
-            <w:vAlign w:val="center"/>
-          </w:tcPr>
-          <w:p>
-            <w:r>
-              <w:t>keine Absicht als Wirkung ausgeben</w:t>
-            </w:r>
-          </w:p>
-        </w:tc>
-      </w:tr>
-      <w:tr>
-        <w:tc>
-          <w:tcPr>
-            <w:tcW w:type="dxa" w:w="3120"/>
-            <w:vAlign w:val="center"/>
-          </w:tcPr>
-          <w:p>
-            <w:r>
-              <w:t>Wirkpfad</w:t>
-            </w:r>
-          </w:p>
-        </w:tc>
-        <w:tc>
-          <w:tcPr>
-            <w:tcW w:type="dxa" w:w="3120"/>
-            <w:vAlign w:val="center"/>
-          </w:tcPr>
-          <w:p>
-            <w:r>
-              <w:t>Ausloeser, Mechanismus, Wirkungsempfaenger, Zustand und Rueckkopplung werden sichtbar.</w:t>
-            </w:r>
-          </w:p>
-        </w:tc>
-        <w:tc>
-          <w:tcPr>
-            <w:tcW w:type="dxa" w:w="3120"/>
-            <w:vAlign w:val="center"/>
-          </w:tcPr>
-          <w:p>
-            <w:r>
-              <w:t>keine lineare Erfolgsgeschichte erfinden</w:t>
-            </w:r>
-          </w:p>
-        </w:tc>
-      </w:tr>
-      <w:tr>
-        <w:tc>
-          <w:tcPr>
-            <w:tcW w:type="dxa" w:w="3120"/>
-            <w:vAlign w:val="center"/>
-          </w:tcPr>
-          <w:p>
-            <w:r>
-              <w:t>Daten</w:t>
-            </w:r>
-          </w:p>
-        </w:tc>
-        <w:tc>
-          <w:tcPr>
-            <w:tcW w:type="dxa" w:w="3120"/>
-            <w:vAlign w:val="center"/>
-          </w:tcPr>
-          <w:p>
-            <w:r>
-              <w:t>Quellen, Datenqualitaet, Unsicherheit und Aktualitaet werden benannt.</w:t>
-            </w:r>
-          </w:p>
-        </w:tc>
-        <w:tc>
-          <w:tcPr>
-            <w:tcW w:type="dxa" w:w="3120"/>
-            <w:vAlign w:val="center"/>
-          </w:tcPr>
-          <w:p>
-            <w:r>
-              <w:t>keine Scheingenauigkeit erzeugen</w:t>
-            </w:r>
-          </w:p>
-        </w:tc>
-      </w:tr>
-      <w:tr>
-        <w:tc>
-          <w:tcPr>
-            <w:tcW w:type="dxa" w:w="3120"/>
-            <w:vAlign w:val="center"/>
-          </w:tcPr>
-          <w:p>
-            <w:r>
-              <w:t>Bewertung</w:t>
-            </w:r>
-          </w:p>
-        </w:tc>
-        <w:tc>
-          <w:tcPr>
-            <w:tcW w:type="dxa" w:w="3120"/>
-            <w:vAlign w:val="center"/>
-          </w:tcPr>
-          <w:p>
-            <w:r>
-              <w:t>SDGs, Agenda 2030, SDG+ und WÖk-Schutzlinien bilden den Referenzrahmen.</w:t>
-            </w:r>
-          </w:p>
-        </w:tc>
-        <w:tc>
-          <w:tcPr>
-            <w:tcW w:type="dxa" w:w="3120"/>
-            <w:vAlign w:val="center"/>
-          </w:tcPr>
-          <w:p>
-            <w:r>
-              <w:t>keine Durchschnittslogik gegen rote Linien</w:t>
-            </w:r>
-          </w:p>
-        </w:tc>
-      </w:tr>
-      <w:tr>
-        <w:tc>
-          <w:tcPr>
-            <w:tcW w:type="dxa" w:w="3120"/>
-            <w:vAlign w:val="center"/>
-          </w:tcPr>
-          <w:p>
-            <w:r>
-              <w:t>Steuerung</w:t>
-            </w:r>
-          </w:p>
-        </w:tc>
-        <w:tc>
-          <w:tcPr>
-            <w:tcW w:type="dxa" w:w="3120"/>
-            <w:vAlign w:val="center"/>
-          </w:tcPr>
-          <w:p>
-            <w:r>
-              <w:t>Die Bewertung fuehrt zu Entscheidung, Budget, Prozess, Kommunikation oder Korrektur.</w:t>
-            </w:r>
-          </w:p>
-        </w:tc>
-        <w:tc>
-          <w:tcPr>
-            <w:tcW w:type="dxa" w:w="3120"/>
-            <w:vAlign w:val="center"/>
-          </w:tcPr>
-          <w:p>
-            <w:r>
-              <w:t>kein Reporting ohne Rueckkopplung</w:t>
-            </w:r>
-          </w:p>
-        </w:tc>
-      </w:tr>
-    </w:tbl>
-    <w:p/>
-    <w:p>
-      <w:pPr>
-        <w:pStyle w:val="Heading3"/>
-      </w:pPr>
-      <w:r>
-        <w:t>Vertiefungsrunde 1: Lesen, pruefen, rueckkoppeln</w:t>
-      </w:r>
-    </w:p>
-    <w:p>
-      <w:r>
-        <w:t>Die folgende Runde verdichtet WC-V1 nicht durch neue Schlagworte, sondern durch wiederholte Anwendung auf unterschiedliche Entscheidungsebenen. Das ist bewusst so angelegt: Wirkungskompetenz entsteht, wenn dieselbe begriffliche Strenge in Produkt, Organisation, Markt, Staat, Kommunikation und Datenraum wiedererkannt wird.</w:t>
-      </w:r>
-    </w:p>
-    <w:p>
-      <w:r>
-        <w:t>Begriffliche Schaerfung. Fuer Von KPI zu KII und der Kennzahlen-Stack bedeutet praezise Sprache die erste Sicherung gegen Impact-Washing ist, dass die Analyse nicht bei einer Aktivitaet, einem guten Willen oder einer Kennzahl stehen bleiben darf. Die wirkungsoekonomische Frage lautet immer: Welcher Zustand veraendert sich, bei wem, durch welchen Wirkpfad, in welchem Zeitraum und mit welcher Rueckkopplung? Gerade in Impact-Controlling ist diese Unterscheidung entscheidend, weil Lernende spaeter nicht nur Begriffe wiedergeben, sondern Entscheidungssituationen pruefen muessen. Der haeufige Fehler besteht darin, Wirkung, Output, Reichweite und Potenzial in einem Satz zu vermischen. Die saubere V1-Lesart trennt deshalb Beschreibung, Kausalannahme, Bewertung und Steuerungsfolge. In der Praxis sollte jede Wirkungsaussage als kurze Viererprobe formuliert werden: Zustand, Betroffene, Quelle, offene Unsicherheit. So wird aus dem Thema kein isoliertes Kapitel, sondern ein pruefbarer Baustein der WÖk-Architektur.</w:t>
-      </w:r>
-    </w:p>
-    <w:p>
-      <w:r>
-        <w:t>Wirkpfad-Logik. Fuer Von KPI zu KII und der Kennzahlen-Stack bedeutet ein Thema erst dann steuerbar wird, wenn der Mechanismus zwischen Ausloeser und Zustandsveraenderung beschrieben ist, dass die Analyse nicht bei einer Aktivitaet, einem guten Willen oder einer Kennzahl stehen bleiben darf. Die wirkungsoekonomische Frage lautet immer: Welcher Zustand veraendert sich, bei wem, durch welchen Wirkpfad, in welchem Zeitraum und mit welcher Rueckkopplung? Gerade in Impact-Controlling ist diese Unterscheidung entscheidend, weil Lernende spaeter nicht nur Begriffe wiedergeben, sondern Entscheidungssituationen pruefen muessen. Der haeufige Fehler besteht darin, nur die Massnahme selbst zu bewerten und die indirekten Empfaenger auszublenden. Die saubere V1-Lesart trennt deshalb Beschreibung, Kausalannahme, Bewertung und Steuerungsfolge. Eine gute Fallanalyse zeichnet mindestens einen direkten und einen indirekten Wirkpfad nach. So wird aus dem Thema kein isoliertes Kapitel, sondern ein pruefbarer Baustein der WÖk-Architektur.</w:t>
-      </w:r>
-    </w:p>
-    <w:p>
-      <w:r>
-        <w:t>Daten- und Quellenklarheit. Fuer Von KPI zu KII und der Kennzahlen-Stack bedeutet jede Bewertung nur so belastbar ist wie Datenlage, Quellenstatus und Aktualitaet, dass die Analyse nicht bei einer Aktivitaet, einem guten Willen oder einer Kennzahl stehen bleiben darf. Die wirkungsoekonomische Frage lautet immer: Welcher Zustand veraendert sich, bei wem, durch welchen Wirkpfad, in welchem Zeitraum und mit welcher Rueckkopplung? Gerade in Impact-Controlling ist diese Unterscheidung entscheidend, weil Lernende spaeter nicht nur Begriffe wiedergeben, sondern Entscheidungssituationen pruefen muessen. Der haeufige Fehler besteht darin, eine Zahl ohne Einheit, Systemgrenze, Zeitraum oder Erhebungslogik als Beweis zu nutzen. Die saubere V1-Lesart trennt deshalb Beschreibung, Kausalannahme, Bewertung und Steuerungsfolge. Die Lernenden sollen Daten nicht dekorativ zitieren, sondern ihre Aussagekraft, Luecken und Grenzen offenlegen. So wird aus dem Thema kein isoliertes Kapitel, sondern ein pruefbarer Baustein der WÖk-Architektur.</w:t>
-      </w:r>
-    </w:p>
-    <w:p>
-      <w:r>
-        <w:t>Fallfenster zur Anwendung. Ein Controlling-Team moechte einen Score bilden. Das Skript verlangt, dass Datenqualitaet, Systemgrenzen, Gewichtung, Unsicherheit und Nichtkompensation sichtbar bleiben. Ein Score darf die Diskussion nicht beenden, sondern muss bessere Fragen, Priorisierung und Rueckkopplung ermoeglichen. Bezogen auf Von KPI zu KII und der Kennzahlen-Stack heisst das: Die Analyse muss das konkrete Thema ernst nehmen und zugleich den allgemeinen WÖk-Massstab halten. Es geht nicht darum, die Welt in gute und schlechte Akteure einzuteilen. Es geht darum, Wirkpfade, Wirkungsempfaenger, Datenqualitaet, Risiken und Rueckkopplung so zu beschreiben, dass bessere Entscheidungen moeglich werden.</w:t>
-      </w:r>
-    </w:p>
-    <w:p>
-      <w:r>
-        <w:t>Ambivalenz. Fuer Von KPI zu KII und der Kennzahlen-Stack bedeutet positive und negative Zustandsveraenderungen gleichzeitig auftreten koennen, dass die Analyse nicht bei einer Aktivitaet, einem guten Willen oder einer Kennzahl stehen bleiben darf. Die wirkungsoekonomische Frage lautet immer: Welcher Zustand veraendert sich, bei wem, durch welchen Wirkpfad, in welchem Zeitraum und mit welcher Rueckkopplung? Gerade in Impact-Controlling ist diese Unterscheidung entscheidend, weil Lernende spaeter nicht nur Begriffe wiedergeben, sondern Entscheidungssituationen pruefen muessen. Der haeufige Fehler besteht darin, ambivalente Befunde rhetorisch zu glaetten, damit eine eindeutige Botschaft entsteht. Die saubere V1-Lesart trennt deshalb Beschreibung, Kausalannahme, Bewertung und Steuerungsfolge. Ein gutes Skript fuehrt deshalb Profile, Zielkonflikte und offene Punkte nebeneinander. So wird aus dem Thema kein isoliertes Kapitel, sondern ein pruefbarer Baustein der WÖk-Architektur.</w:t>
-      </w:r>
-    </w:p>
-    <w:p>
-      <w:r>
-        <w:t>Nichtkompensation. Fuer Von KPI zu KII und der Kennzahlen-Stack bedeutet schwere zentrale Schaeden nicht durch beliebige positive Einzelwerte neutralisiert werden duerfen, dass die Analyse nicht bei einer Aktivitaet, einem guten Willen oder einer Kennzahl stehen bleiben darf. Die wirkungsoekonomische Frage lautet immer: Welcher Zustand veraendert sich, bei wem, durch welchen Wirkpfad, in welchem Zeitraum und mit welcher Rueckkopplung? Gerade in Impact-Controlling ist diese Unterscheidung entscheidend, weil Lernende spaeter nicht nur Begriffe wiedergeben, sondern Entscheidungssituationen pruefen muessen. Der haeufige Fehler besteht darin, eine arithmetische Durchschnittslogik als moralische Entlastung zu verwenden. Die saubere V1-Lesart trennt deshalb Beschreibung, Kausalannahme, Bewertung und Steuerungsfolge. Reverse Merit Order und rote Linien sind Schutzregeln gegen Schoenrechnung. So wird aus dem Thema kein isoliertes Kapitel, sondern ein pruefbarer Baustein der WÖk-Architektur.</w:t>
-      </w:r>
-    </w:p>
-    <w:p>
-      <w:r>
-        <w:t>Pruefungsnahe Transferfrage. Formuliere zu WC-V1 eine Wirkungsaussage in drei Saetzen: Erstens den beobachteten oder plausiblen Zustand, zweitens die Daten- oder Quellenlage, drittens die offene Unsicherheit samt Rueckkopplung. Die Antwort muss ohne moralische Personenbewertung auskommen und darf Reichweite nicht mit Wirkung verwechseln.</w:t>
-      </w:r>
-    </w:p>
-    <w:p>
-      <w:r>
-        <w:t>Rueckkopplung. Fuer Von KPI zu KII und der Kennzahlen-Stack bedeutet Wirkungswissen erst dann wertvoll wird, wenn es Entscheidungen veraendert, dass die Analyse nicht bei einer Aktivitaet, einem guten Willen oder einer Kennzahl stehen bleiben darf. Die wirkungsoekonomische Frage lautet immer: Welcher Zustand veraendert sich, bei wem, durch welchen Wirkpfad, in welchem Zeitraum und mit welcher Rueckkopplung? Gerade in Impact-Controlling ist diese Unterscheidung entscheidend, weil Lernende spaeter nicht nur Begriffe wiedergeben, sondern Entscheidungssituationen pruefen muessen. Der haeufige Fehler besteht darin, einen Bericht als Endpunkt zu betrachten. Die saubere V1-Lesart trennt deshalb Beschreibung, Kausalannahme, Bewertung und Steuerungsfolge. Jeder Analyseblock sollte fragen, welche Routine, welcher Prozess oder welche Ressource nach der Bewertung angepasst wird. So wird aus dem Thema kein isoliertes Kapitel, sondern ein pruefbarer Baustein der WÖk-Architektur.</w:t>
-      </w:r>
-    </w:p>
-    <w:p>
-      <w:r>
-        <w:t>Fallfenster zur Anwendung. Ein Kommunikationsbericht nennt viele Aktivitaeten, Reichweiten und Rueckmeldungen. Die V1-Pruefung fragt, ob daraus eine belastbare Wirkungsaussage folgt. Wenn nur Kontakte, Klicks oder Zustimmung vorliegen, bleibt die Aussage im Bereich Wirkungspotenzial oder Resonanz, nicht im Bereich nachgewiesener Wirkung. Bezogen auf Von KPI zu KII und der Kennzahlen-Stack heisst das: Die Analyse muss das konkrete Thema ernst nehmen und zugleich den allgemeinen WÖk-Massstab halten. Es geht nicht darum, die Welt in gute und schlechte Akteure einzuteilen. Es geht darum, Wirkpfade, Wirkungsempfaenger, Datenqualitaet, Risiken und Rueckkopplung so zu beschreiben, dass bessere Entscheidungen moeglich werden.</w:t>
-      </w:r>
-    </w:p>
-    <w:p>
-      <w:r>
-        <w:t>Governance. Fuer Von KPI zu KII und der Kennzahlen-Stack bedeutet Wirkungsbewertung Verfahren, Rechte, Transparenz und Korrektur braucht, dass die Analyse nicht bei einer Aktivitaet, einem guten Willen oder einer Kennzahl stehen bleiben darf. Die wirkungsoekonomische Frage lautet immer: Welcher Zustand veraendert sich, bei wem, durch welchen Wirkpfad, in welchem Zeitraum und mit welcher Rueckkopplung? Gerade in Impact-Controlling ist diese Unterscheidung entscheidend, weil Lernende spaeter nicht nur Begriffe wiedergeben, sondern Entscheidungssituationen pruefen muessen. Der haeufige Fehler besteht darin, Bewertung als technokratische Top-down-Setzung zu verstehen. Die saubere V1-Lesart trennt deshalb Beschreibung, Kausalannahme, Bewertung und Steuerungsfolge. Betroffene, Datenhalter, Entscheider und Kontrollinstanzen muessen unterscheidbare Rollen behalten. So wird aus dem Thema kein isoliertes Kapitel, sondern ein pruefbarer Baustein der WÖk-Architektur.</w:t>
-      </w:r>
-    </w:p>
-    <w:p>
-      <w:r>
-        <w:t>Didaktische Pruefbarkeit. Fuer Von KPI zu KII und der Kennzahlen-Stack bedeutet das Thema in der Akademie nicht nur erklaert, sondern in Falllogik ueberfuehrt werden muss, dass die Analyse nicht bei einer Aktivitaet, einem guten Willen oder einer Kennzahl stehen bleiben darf. Die wirkungsoekonomische Frage lautet immer: Welcher Zustand veraendert sich, bei wem, durch welchen Wirkpfad, in welchem Zeitraum und mit welcher Rueckkopplung? Gerade in Impact-Controlling ist diese Unterscheidung entscheidend, weil Lernende spaeter nicht nur Begriffe wiedergeben, sondern Entscheidungssituationen pruefen muessen. Der haeufige Fehler besteht darin, reines Auswendiglernen als Kompetenznachweis zu behandeln. Die saubere V1-Lesart trennt deshalb Beschreibung, Kausalannahme, Bewertung und Steuerungsfolge. Pruefungsfragen sollen Begriffe, Anwendung und rote Linien verbinden. So wird aus dem Thema kein isoliertes Kapitel, sondern ein pruefbarer Baustein der WÖk-Architektur.</w:t>
-      </w:r>
-    </w:p>
-    <w:p>
-      <w:r>
-        <w:t>Transfer in Organisationen. Fuer Von KPI zu KII und der Kennzahlen-Stack bedeutet WÖk-Begriffe im Alltag nur tragen, wenn sie in Routinen uebersetzt werden, dass die Analyse nicht bei einer Aktivitaet, einem guten Willen oder einer Kennzahl stehen bleiben darf. Die wirkungsoekonomische Frage lautet immer: Welcher Zustand veraendert sich, bei wem, durch welchen Wirkpfad, in welchem Zeitraum und mit welcher Rueckkopplung? Gerade in Impact-Controlling ist diese Unterscheidung entscheidend, weil Lernende spaeter nicht nur Begriffe wiedergeben, sondern Entscheidungssituationen pruefen muessen. Der haeufige Fehler besteht darin, die Verantwortung an eine Nachhaltigkeitsabteilung auszulagern. Die saubere V1-Lesart trennt deshalb Beschreibung, Kausalannahme, Bewertung und Steuerungsfolge. Strategie, Einkauf, Kommunikation, Controlling und Fuehrung muessen denselben Wirkungsbegriff verwenden. So wird aus dem Thema kein isoliertes Kapitel, sondern ein pruefbarer Baustein der WÖk-Architektur.</w:t>
-      </w:r>
-    </w:p>
-    <w:p>
-      <w:r>
-        <w:t>Fallfenster zur Anwendung. Eine Organisation plant eine Massnahme und formuliert dazu eine positive Absicht. In der WÖk reicht das nicht. Fuer diese Vorlesung muss sichtbar werden, welche Zustandsveraenderung erwartet wird, welche Empfaenger direkt oder indirekt betroffen sind, welche Nebenwirkungen entstehen koennen und welche Entscheidung spaeter korrigiert wird. Bezogen auf Von KPI zu KII und der Kennzahlen-Stack heisst das: Die Analyse muss das konkrete Thema ernst nehmen und zugleich den allgemeinen WÖk-Massstab halten. Es geht nicht darum, die Welt in gute und schlechte Akteure einzuteilen. Es geht darum, Wirkpfade, Wirkungsempfaenger, Datenqualitaet, Risiken und Rueckkopplung so zu beschreiben, dass bessere Entscheidungen moeglich werden.</w:t>
-      </w:r>
-    </w:p>
-    <w:p>
-      <w:r>
-        <w:t>Rueckfluss in den Korpus. Fuer Von KPI zu KII und der Kennzahlen-Stack bedeutet jedes Studienskript den Gesamtbestand schaerfen kann, dass die Analyse nicht bei einer Aktivitaet, einem guten Willen oder einer Kennzahl stehen bleiben darf. Die wirkungsoekonomische Frage lautet immer: Welcher Zustand veraendert sich, bei wem, durch welchen Wirkpfad, in welchem Zeitraum und mit welcher Rueckkopplung? Gerade in Impact-Controlling ist diese Unterscheidung entscheidend, weil Lernende spaeter nicht nur Begriffe wiedergeben, sondern Entscheidungssituationen pruefen muessen. Der haeufige Fehler besteht darin, neue Einsichten nur lokal im Skript zu belassen. Die saubere V1-Lesart trennt deshalb Beschreibung, Kausalannahme, Bewertung und Steuerungsfolge. Glossar, Website, Journal, Dossiers und Visuals sollen aus der Skriptarbeit lernen. So wird aus dem Thema kein isoliertes Kapitel, sondern ein pruefbarer Baustein der WÖk-Architektur.</w:t>
-      </w:r>
-    </w:p>
-    <w:p>
-      <w:r>
-        <w:t>Pruefungsnahe Transferfrage. Formuliere zu WC-V1 eine Wirkungsaussage in drei Saetzen: Erstens den beobachteten oder plausiblen Zustand, zweitens die Daten- oder Quellenlage, drittens die offene Unsicherheit samt Rueckkopplung. Die Antwort muss ohne moralische Personenbewertung auskommen und darf Reichweite nicht mit Wirkung verwechseln.</w:t>
-      </w:r>
-    </w:p>
-    <w:p>
-      <w:pPr>
-        <w:pStyle w:val="Heading3"/>
-      </w:pPr>
-      <w:r>
-        <w:t>Vertiefungsrunde 2: Lesen, pruefen, rueckkoppeln</w:t>
-      </w:r>
-    </w:p>
-    <w:p>
-      <w:r>
-        <w:t>Die folgende Runde verdichtet WC-V1 nicht durch neue Schlagworte, sondern durch wiederholte Anwendung auf unterschiedliche Entscheidungsebenen. Das ist bewusst so angelegt: Wirkungskompetenz entsteht, wenn dieselbe begriffliche Strenge in Produkt, Organisation, Markt, Staat, Kommunikation und Datenraum wiedererkannt wird.</w:t>
-      </w:r>
-    </w:p>
-    <w:p>
-      <w:r>
-        <w:t>Begriffliche Schaerfung. Fuer Von KPI zu KII und der Kennzahlen-Stack bedeutet praezise Sprache die erste Sicherung gegen Impact-Washing ist, dass die Analyse nicht bei einer Aktivitaet, einem guten Willen oder einer Kennzahl stehen bleiben darf. Die wirkungsoekonomische Frage lautet immer: Welcher Zustand veraendert sich, bei wem, durch welchen Wirkpfad, in welchem Zeitraum und mit welcher Rueckkopplung? Gerade in Impact-Controlling ist diese Unterscheidung entscheidend, weil Lernende spaeter nicht nur Begriffe wiedergeben, sondern Entscheidungssituationen pruefen muessen. Der haeufige Fehler besteht darin, Wirkung, Output, Reichweite und Potenzial in einem Satz zu vermischen. Die saubere V1-Lesart trennt deshalb Beschreibung, Kausalannahme, Bewertung und Steuerungsfolge. In der Praxis sollte jede Wirkungsaussage als kurze Viererprobe formuliert werden: Zustand, Betroffene, Quelle, offene Unsicherheit. So wird aus dem Thema kein isoliertes Kapitel, sondern ein pruefbarer Baustein der WÖk-Architektur.</w:t>
-      </w:r>
-    </w:p>
-    <w:p>
-      <w:r>
-        <w:t>Wirkpfad-Logik. Fuer Von KPI zu KII und der Kennzahlen-Stack bedeutet ein Thema erst dann steuerbar wird, wenn der Mechanismus zwischen Ausloeser und Zustandsveraenderung beschrieben ist, dass die Analyse nicht bei einer Aktivitaet, einem guten Willen oder einer Kennzahl stehen bleiben darf. Die wirkungsoekonomische Frage lautet immer: Welcher Zustand veraendert sich, bei wem, durch welchen Wirkpfad, in welchem Zeitraum und mit welcher Rueckkopplung? Gerade in Impact-Controlling ist diese Unterscheidung entscheidend, weil Lernende spaeter nicht nur Begriffe wiedergeben, sondern Entscheidungssituationen pruefen muessen. Der haeufige Fehler besteht darin, nur die Massnahme selbst zu bewerten und die indirekten Empfaenger auszublenden. Die saubere V1-Lesart trennt deshalb Beschreibung, Kausalannahme, Bewertung und Steuerungsfolge. Eine gute Fallanalyse zeichnet mindestens einen direkten und einen indirekten Wirkpfad nach. So wird aus dem Thema kein isoliertes Kapitel, sondern ein pruefbarer Baustein der WÖk-Architektur.</w:t>
-      </w:r>
-    </w:p>
-    <w:p>
-      <w:r>
-        <w:t>Fallfenster zur Anwendung. Eine Fuehrungsentscheidung erzeugt zugleich Nutzen und Risiken. Die WÖk behandelt Ambivalenz nicht als Stoerung, sondern als Kern der Analyse. Positive Netto-Wirkung darf erst behauptet werden, wenn zentrale negative Wirkungen getrennt geprueft und rote Linien gewahrt sind. Bezogen auf Von KPI zu KII und der Kennzahlen-Stack heisst das: Die Analyse muss das konkrete Thema ernst nehmen und zugleich den allgemeinen WÖk-Massstab halten. Es geht nicht darum, die Welt in gute und schlechte Akteure einzuteilen. Es geht darum, Wirkpfade, Wirkungsempfaenger, Datenqualitaet, Risiken und Rueckkopplung so zu beschreiben, dass bessere Entscheidungen moeglich werden.</w:t>
-      </w:r>
-    </w:p>
-    <w:p>
-      <w:r>
-        <w:t>Daten- und Quellenklarheit. Fuer Von KPI zu KII und der Kennzahlen-Stack bedeutet jede Bewertung nur so belastbar ist wie Datenlage, Quellenstatus und Aktualitaet, dass die Analyse nicht bei einer Aktivitaet, einem guten Willen oder einer Kennzahl stehen bleiben darf. Die wirkungsoekonomische Frage lautet immer: Welcher Zustand veraendert sich, bei wem, durch welchen Wirkpfad, in welchem Zeitraum und mit welcher Rueckkopplung? Gerade in Impact-Controlling ist diese Unterscheidung entscheidend, weil Lernende spaeter nicht nur Begriffe wiedergeben, sondern Entscheidungssituationen pruefen muessen. Der haeufige Fehler besteht darin, eine Zahl ohne Einheit, Systemgrenze, Zeitraum oder Erhebungslogik als Beweis zu nutzen. Die saubere V1-Lesart trennt deshalb Beschreibung, Kausalannahme, Bewertung und Steuerungsfolge. Die Lernenden sollen Daten nicht dekorativ zitieren, sondern ihre Aussagekraft, Luecken und Grenzen offenlegen. So wird aus dem Thema kein isoliertes Kapitel, sondern ein pruefbarer Baustein der WÖk-Architektur.</w:t>
-      </w:r>
-    </w:p>
-    <w:p>
-      <w:r>
-        <w:t>Ambivalenz. Fuer Von KPI zu KII und der Kennzahlen-Stack bedeutet positive und negative Zustandsveraenderungen gleichzeitig auftreten koennen, dass die Analyse nicht bei einer Aktivitaet, einem guten Willen oder einer Kennzahl stehen bleiben darf. Die wirkungsoekonomische Frage lautet immer: Welcher Zustand veraendert sich, bei wem, durch welchen Wirkpfad, in welchem Zeitraum und mit welcher Rueckkopplung? Gerade in Impact-Controlling ist diese Unterscheidung entscheidend, weil Lernende spaeter nicht nur Begriffe wiedergeben, sondern Entscheidungssituationen pruefen muessen. Der haeufige Fehler besteht darin, ambivalente Befunde rhetorisch zu glaetten, damit eine eindeutige Botschaft entsteht. Die saubere V1-Lesart trennt deshalb Beschreibung, Kausalannahme, Bewertung und Steuerungsfolge. Ein gutes Skript fuehrt deshalb Profile, Zielkonflikte und offene Punkte nebeneinander. So wird aus dem Thema kein isoliertes Kapitel, sondern ein pruefbarer Baustein der WÖk-Architektur.</w:t>
-      </w:r>
-    </w:p>
-    <w:p>
-      <w:r>
-        <w:t>Nichtkompensation. Fuer Von KPI zu KII und der Kennzahlen-Stack bedeutet schwere zentrale Schaeden nicht durch beliebige positive Einzelwerte neutralisiert werden duerfen, dass die Analyse nicht bei einer Aktivitaet, einem guten Willen oder einer Kennzahl stehen bleiben darf. Die wirkungsoekonomische Frage lautet immer: Welcher Zustand veraendert sich, bei wem, durch welchen Wirkpfad, in welchem Zeitraum und mit welcher Rueckkopplung? Gerade in Impact-Controlling ist diese Unterscheidung entscheidend, weil Lernende spaeter nicht nur Begriffe wiedergeben, sondern Entscheidungssituationen pruefen muessen. Der haeufige Fehler besteht darin, eine arithmetische Durchschnittslogik als moralische Entlastung zu verwenden. Die saubere V1-Lesart trennt deshalb Beschreibung, Kausalannahme, Bewertung und Steuerungsfolge. Reverse Merit Order und rote Linien sind Schutzregeln gegen Schoenrechnung. So wird aus dem Thema kein isoliertes Kapitel, sondern ein pruefbarer Baustein der WÖk-Architektur.</w:t>
-      </w:r>
-    </w:p>
-    <w:p>
-      <w:r>
-        <w:t>Fallfenster zur Anwendung. Ein Controlling-Team moechte einen Score bilden. Das Skript verlangt, dass Datenqualitaet, Systemgrenzen, Gewichtung, Unsicherheit und Nichtkompensation sichtbar bleiben. Ein Score darf die Diskussion nicht beenden, sondern muss bessere Fragen, Priorisierung und Rueckkopplung ermoeglichen. Bezogen auf Von KPI zu KII und der Kennzahlen-Stack heisst das: Die Analyse muss das konkrete Thema ernst nehmen und zugleich den allgemeinen WÖk-Massstab halten. Es geht nicht darum, die Welt in gute und schlechte Akteure einzuteilen. Es geht darum, Wirkpfade, Wirkungsempfaenger, Datenqualitaet, Risiken und Rueckkopplung so zu beschreiben, dass bessere Entscheidungen moeglich werden.</w:t>
-      </w:r>
-    </w:p>
-    <w:p>
-      <w:r>
-        <w:t>Pruefungsnahe Transferfrage. Formuliere zu WC-V1 eine Wirkungsaussage in drei Saetzen: Erstens den beobachteten oder plausiblen Zustand, zweitens die Daten- oder Quellenlage, drittens die offene Unsicherheit samt Rueckkopplung. Die Antwort muss ohne moralische Personenbewertung auskommen und darf Reichweite nicht mit Wirkung verwechseln.</w:t>
-      </w:r>
-    </w:p>
-    <w:p>
-      <w:r>
-        <w:t>Rueckkopplung. Fuer Von KPI zu KII und der Kennzahlen-Stack bedeutet Wirkungswissen erst dann wertvoll wird, wenn es Entscheidungen veraendert, dass die Analyse nicht bei einer Aktivitaet, einem guten Willen oder einer Kennzahl stehen bleiben darf. Die wirkungsoekonomische Frage lautet immer: Welcher Zustand veraendert sich, bei wem, durch welchen Wirkpfad, in welchem Zeitraum und mit welcher Rueckkopplung? Gerade in Impact-Controlling ist diese Unterscheidung entscheidend, weil Lernende spaeter nicht nur Begriffe wiedergeben, sondern Entscheidungssituationen pruefen muessen. Der haeufige Fehler besteht darin, einen Bericht als Endpunkt zu betrachten. Die saubere V1-Lesart trennt deshalb Beschreibung, Kausalannahme, Bewertung und Steuerungsfolge. Jeder Analyseblock sollte fragen, welche Routine, welcher Prozess oder welche Ressource nach der Bewertung angepasst wird. So wird aus dem Thema kein isoliertes Kapitel, sondern ein pruefbarer Baustein der WÖk-Architektur.</w:t>
-      </w:r>
-    </w:p>
-    <w:p>
-      <w:r>
-        <w:t>Governance. Fuer Von KPI zu KII und der Kennzahlen-Stack bedeutet Wirkungsbewertung Verfahren, Rechte, Transparenz und Korrektur braucht, dass die Analyse nicht bei einer Aktivitaet, einem guten Willen oder einer Kennzahl stehen bleiben darf. Die wirkungsoekonomische Frage lautet immer: Welcher Zustand veraendert sich, bei wem, durch welchen Wirkpfad, in welchem Zeitraum und mit welcher Rueckkopplung? Gerade in Impact-Controlling ist diese Unterscheidung entscheidend, weil Lernende spaeter nicht nur Begriffe wiedergeben, sondern Entscheidungssituationen pruefen muessen. Der haeufige Fehler besteht darin, Bewertung als technokratische Top-down-Setzung zu verstehen. Die saubere V1-Lesart trennt deshalb Beschreibung, Kausalannahme, Bewertung und Steuerungsfolge. Betroffene, Datenhalter, Entscheider und Kontrollinstanzen muessen unterscheidbare Rollen behalten. So wird aus dem Thema kein isoliertes Kapitel, sondern ein pruefbarer Baustein der WÖk-Architektur.</w:t>
-      </w:r>
-    </w:p>
-    <w:p>
-      <w:r>
-        <w:t>Didaktische Pruefbarkeit. Fuer Von KPI zu KII und der Kennzahlen-Stack bedeutet das Thema in der Akademie nicht nur erklaert, sondern in Falllogik ueberfuehrt werden muss, dass die Analyse nicht bei einer Aktivitaet, einem guten Willen oder einer Kennzahl stehen bleiben darf. Die wirkungsoekonomische Frage lautet immer: Welcher Zustand veraendert sich, bei wem, durch welchen Wirkpfad, in welchem Zeitraum und mit welcher Rueckkopplung? Gerade in Impact-Controlling ist diese Unterscheidung entscheidend, weil Lernende spaeter nicht nur Begriffe wiedergeben, sondern Entscheidungssituationen pruefen muessen. Der haeufige Fehler besteht darin, reines Auswendiglernen als Kompetenznachweis zu behandeln. Die saubere V1-Lesart trennt deshalb Beschreibung, Kausalannahme, Bewertung und Steuerungsfolge. Pruefungsfragen sollen Begriffe, Anwendung und rote Linien verbinden. So wird aus dem Thema kein isoliertes Kapitel, sondern ein pruefbarer Baustein der WÖk-Architektur.</w:t>
-      </w:r>
-    </w:p>
-    <w:p>
-      <w:r>
-        <w:t>Fallfenster zur Anwendung. Ein Kommunikationsbericht nennt viele Aktivitaeten, Reichweiten und Rueckmeldungen. Die V1-Pruefung fragt, ob daraus eine belastbare Wirkungsaussage folgt. Wenn nur Kontakte, Klicks oder Zustimmung vorliegen, bleibt die Aussage im Bereich Wirkungspotenzial oder Resonanz, nicht im Bereich nachgewiesener Wirkung. Bezogen auf Von KPI zu KII und der Kennzahlen-Stack heisst das: Die Analyse muss das konkrete Thema ernst nehmen und zugleich den allgemeinen WÖk-Massstab halten. Es geht nicht darum, die Welt in gute und schlechte Akteure einzuteilen. Es geht darum, Wirkpfade, Wirkungsempfaenger, Datenqualitaet, Risiken und Rueckkopplung so zu beschreiben, dass bessere Entscheidungen moeglich werden.</w:t>
-      </w:r>
-    </w:p>
-    <w:p>
-      <w:r>
-        <w:t>Transfer in Organisationen. Fuer Von KPI zu KII und der Kennzahlen-Stack bedeutet WÖk-Begriffe im Alltag nur tragen, wenn sie in Routinen uebersetzt werden, dass die Analyse nicht bei einer Aktivitaet, einem guten Willen oder einer Kennzahl stehen bleiben darf. Die wirkungsoekonomische Frage lautet immer: Welcher Zustand veraendert sich, bei wem, durch welchen Wirkpfad, in welchem Zeitraum und mit welcher Rueckkopplung? Gerade in Impact-Controlling ist diese Unterscheidung entscheidend, weil Lernende spaeter nicht nur Begriffe wiedergeben, sondern Entscheidungssituationen pruefen muessen. Der haeufige Fehler besteht darin, die Verantwortung an eine Nachhaltigkeitsabteilung auszulagern. Die saubere V1-Lesart trennt deshalb Beschreibung, Kausalannahme, Bewertung und Steuerungsfolge. Strategie, Einkauf, Kommunikation, Controlling und Fuehrung muessen denselben Wirkungsbegriff verwenden. So wird aus dem Thema kein isoliertes Kapitel, sondern ein pruefbarer Baustein der WÖk-Architektur.</w:t>
-      </w:r>
-    </w:p>
-    <w:p>
-      <w:r>
-        <w:t>Rueckfluss in den Korpus. Fuer Von KPI zu KII und der Kennzahlen-Stack bedeutet jedes Studienskript den Gesamtbestand schaerfen kann, dass die Analyse nicht bei einer Aktivitaet, einem guten Willen oder einer Kennzahl stehen bleiben darf. Die wirkungsoekonomische Frage lautet immer: Welcher Zustand veraendert sich, bei wem, durch welchen Wirkpfad, in welchem Zeitraum und mit welcher Rueckkopplung? Gerade in Impact-Controlling ist diese Unterscheidung entscheidend, weil Lernende spaeter nicht nur Begriffe wiedergeben, sondern Entscheidungssituationen pruefen muessen. Der haeufige Fehler besteht darin, neue Einsichten nur lokal im Skript zu belassen. Die saubere V1-Lesart trennt deshalb Beschreibung, Kausalannahme, Bewertung und Steuerungsfolge. Glossar, Website, Journal, Dossiers und Visuals sollen aus der Skriptarbeit lernen. So wird aus dem Thema kein isoliertes Kapitel, sondern ein pruefbarer Baustein der WÖk-Architektur.</w:t>
-      </w:r>
-    </w:p>
-    <w:p>
-      <w:r>
-        <w:t>Pruefungsnahe Transferfrage. Formuliere zu WC-V1 eine Wirkungsaussage in drei Saetzen: Erstens den beobachteten oder plausiblen Zustand, zweitens die Daten- oder Quellenlage, drittens die offene Unsicherheit samt Rueckkopplung. Die Antwort muss ohne moralische Personenbewertung auskommen und darf Reichweite nicht mit Wirkung verwechseln.</w:t>
-      </w:r>
-    </w:p>
-    <w:p>
-      <w:pPr>
-        <w:pStyle w:val="Heading3"/>
-      </w:pPr>
-      <w:r>
-        <w:t>Vertiefungsrunde 3: Lesen, pruefen, rueckkoppeln</w:t>
-      </w:r>
-    </w:p>
-    <w:p>
-      <w:r>
-        <w:t>Die folgende Runde verdichtet WC-V1 nicht durch neue Schlagworte, sondern durch wiederholte Anwendung auf unterschiedliche Entscheidungsebenen. Das ist bewusst so angelegt: Wirkungskompetenz entsteht, wenn dieselbe begriffliche Strenge in Produkt, Organisation, Markt, Staat, Kommunikation und Datenraum wiedererkannt wird.</w:t>
-      </w:r>
-    </w:p>
-    <w:p>
-      <w:r>
-        <w:t>Begriffliche Schaerfung. Fuer Von KPI zu KII und der Kennzahlen-Stack bedeutet praezise Sprache die erste Sicherung gegen Impact-Washing ist, dass die Analyse nicht bei einer Aktivitaet, einem guten Willen oder einer Kennzahl stehen bleiben darf. Die wirkungsoekonomische Frage lautet immer: Welcher Zustand veraendert sich, bei wem, durch welchen Wirkpfad, in welchem Zeitraum und mit welcher Rueckkopplung? Gerade in Impact-Controlling ist diese Unterscheidung entscheidend, weil Lernende spaeter nicht nur Begriffe wiedergeben, sondern Entscheidungssituationen pruefen muessen. Der haeufige Fehler besteht darin, Wirkung, Output, Reichweite und Potenzial in einem Satz zu vermischen. Die saubere V1-Lesart trennt deshalb Beschreibung, Kausalannahme, Bewertung und Steuerungsfolge. In der Praxis sollte jede Wirkungsaussage als kurze Viererprobe formuliert werden: Zustand, Betroffene, Quelle, offene Unsicherheit. So wird aus dem Thema kein isoliertes Kapitel, sondern ein pruefbarer Baustein der WÖk-Architektur.</w:t>
-      </w:r>
-    </w:p>
-    <w:p>
-      <w:r>
-        <w:t>Fallfenster zur Anwendung. Eine Organisation plant eine Massnahme und formuliert dazu eine positive Absicht. In der WÖk reicht das nicht. Fuer diese Vorlesung muss sichtbar werden, welche Zustandsveraenderung erwartet wird, welche Empfaenger direkt oder indirekt betroffen sind, welche Nebenwirkungen entstehen koennen und welche Entscheidung spaeter korrigiert wird. Bezogen auf Von KPI zu KII und der Kennzahlen-Stack heisst das: Die Analyse muss das konkrete Thema ernst nehmen und zugleich den allgemeinen WÖk-Massstab halten. Es geht nicht darum, die Welt in gute und schlechte Akteure einzuteilen. Es geht darum, Wirkpfade, Wirkungsempfaenger, Datenqualitaet, Risiken und Rueckkopplung so zu beschreiben, dass bessere Entscheidungen moeglich werden.</w:t>
-      </w:r>
-    </w:p>
-    <w:p>
-      <w:r>
-        <w:t>Wirkpfad-Logik. Fuer Von KPI zu KII und der Kennzahlen-Stack bedeutet ein Thema erst dann steuerbar wird, wenn der Mechanismus zwischen Ausloeser und Zustandsveraenderung beschrieben ist, dass die Analyse nicht bei einer Aktivitaet, einem guten Willen oder einer Kennzahl stehen bleiben darf. Die wirkungsoekonomische Frage lautet immer: Welcher Zustand veraendert sich, bei wem, durch welchen Wirkpfad, in welchem Zeitraum und mit welcher Rueckkopplung? Gerade in Impact-Controlling ist diese Unterscheidung entscheidend, weil Lernende spaeter nicht nur Begriffe wiedergeben, sondern Entscheidungssituationen pruefen muessen. Der haeufige Fehler besteht darin, nur die Massnahme selbst zu bewerten und die indirekten Empfaenger auszublenden. Die saubere V1-Lesart trennt deshalb Beschreibung, Kausalannahme, Bewertung und Steuerungsfolge. Eine gute Fallanalyse zeichnet mindestens einen direkten und einen indirekten Wirkpfad nach. So wird aus dem Thema kein isoliertes Kapitel, sondern ein pruefbarer Baustein der WÖk-Architektur.</w:t>
-      </w:r>
-    </w:p>
-    <w:p>
-      <w:r>
-        <w:t>Daten- und Quellenklarheit. Fuer Von KPI zu KII und der Kennzahlen-Stack bedeutet jede Bewertung nur so belastbar ist wie Datenlage, Quellenstatus und Aktualitaet, dass die Analyse nicht bei einer Aktivitaet, einem guten Willen oder einer Kennzahl stehen bleiben darf. Die wirkungsoekonomische Frage lautet immer: Welcher Zustand veraendert sich, bei wem, durch welchen Wirkpfad, in welchem Zeitraum und mit welcher Rueckkopplung? Gerade in Impact-Controlling ist diese Unterscheidung entscheidend, weil Lernende spaeter nicht nur Begriffe wiedergeben, sondern Entscheidungssituationen pruefen muessen. Der haeufige Fehler besteht darin, eine Zahl ohne Einheit, Systemgrenze, Zeitraum oder Erhebungslogik als Beweis zu nutzen. Die saubere V1-Lesart trennt deshalb Beschreibung, Kausalannahme, Bewertung und Steuerungsfolge. Die Lernenden sollen Daten nicht dekorativ zitieren, sondern ihre Aussagekraft, Luecken und Grenzen offenlegen. So wird aus dem Thema kein isoliertes Kapitel, sondern ein pruefbarer Baustein der WÖk-Architektur.</w:t>
-      </w:r>
-    </w:p>
-    <w:p>
-      <w:r>
-        <w:t>Ambivalenz. Fuer Von KPI zu KII und der Kennzahlen-Stack bedeutet positive und negative Zustandsveraenderungen gleichzeitig auftreten koennen, dass die Analyse nicht bei einer Aktivitaet, einem guten Willen oder einer Kennzahl stehen bleiben darf. Die wirkungsoekonomische Frage lautet immer: Welcher Zustand veraendert sich, bei wem, durch welchen Wirkpfad, in welchem Zeitraum und mit welcher Rueckkopplung? Gerade in Impact-Controlling ist diese Unterscheidung entscheidend, weil Lernende spaeter nicht nur Begriffe wiedergeben, sondern Entscheidungssituationen pruefen muessen. Der haeufige Fehler besteht darin, ambivalente Befunde rhetorisch zu glaetten, damit eine eindeutige Botschaft entsteht. Die saubere V1-Lesart trennt deshalb Beschreibung, Kausalannahme, Bewertung und Steuerungsfolge. Ein gutes Skript fuehrt deshalb Profile, Zielkonflikte und offene Punkte nebeneinander. So wird aus dem Thema kein isoliertes Kapitel, sondern ein pruefbarer Baustein der WÖk-Architektur.</w:t>
-      </w:r>
-    </w:p>
-    <w:p>
-      <w:r>
-        <w:t>Fallfenster zur Anwendung. Eine Fuehrungsentscheidung erzeugt zugleich Nutzen und Risiken. Die WÖk behandelt Ambivalenz nicht als Stoerung, sondern als Kern der Analyse. Positive Netto-Wirkung darf erst behauptet werden, wenn zentrale negative Wirkungen getrennt geprueft und rote Linien gewahrt sind. Bezogen auf Von KPI zu KII und der Kennzahlen-Stack heisst das: Die Analyse muss das konkrete Thema ernst nehmen und zugleich den allgemeinen WÖk-Massstab halten. Es geht nicht darum, die Welt in gute und schlechte Akteure einzuteilen. Es geht darum, Wirkpfade, Wirkungsempfaenger, Datenqualitaet, Risiken und Rueckkopplung so zu beschreiben, dass bessere Entscheidungen moeglich werden.</w:t>
-      </w:r>
-    </w:p>
-    <w:p>
-      <w:r>
-        <w:t>Nichtkompensation. Fuer Von KPI zu KII und der Kennzahlen-Stack bedeutet schwere zentrale Schaeden nicht durch beliebige positive Einzelwerte neutralisiert werden duerfen, dass die Analyse nicht bei einer Aktivitaet, einem guten Willen oder einer Kennzahl stehen bleiben darf. Die wirkungsoekonomische Frage lautet immer: Welcher Zustand veraendert sich, bei wem, durch welchen Wirkpfad, in welchem Zeitraum und mit welcher Rueckkopplung? Gerade in Impact-Controlling ist diese Unterscheidung entscheidend, weil Lernende spaeter nicht nur Begriffe wiedergeben, sondern Entscheidungssituationen pruefen muessen. Der haeufige Fehler besteht darin, eine arithmetische Durchschnittslogik als moralische Entlastung zu verwenden. Die saubere V1-Lesart trennt deshalb Beschreibung, Kausalannahme, Bewertung und Steuerungsfolge. Reverse Merit Order und rote Linien sind Schutzregeln gegen Schoenrechnung. So wird aus dem Thema kein isoliertes Kapitel, sondern ein pruefbarer Baustein der WÖk-Architektur.</w:t>
-      </w:r>
-    </w:p>
-    <w:p>
-      <w:r>
-        <w:t>Pruefungsnahe Transferfrage. Formuliere zu WC-V1 eine Wirkungsaussage in drei Saetzen: Erstens den beobachteten oder plausiblen Zustand, zweitens die Daten- oder Quellenlage, drittens die offene Unsicherheit samt Rueckkopplung. Die Antwort muss ohne moralische Personenbewertung auskommen und darf Reichweite nicht mit Wirkung verwechseln.</w:t>
-      </w:r>
-    </w:p>
-    <w:p>
-      <w:r>
-        <w:t>Rueckkopplung. Fuer Von KPI zu KII und der Kennzahlen-Stack bedeutet Wirkungswissen erst dann wertvoll wird, wenn es Entscheidungen veraendert, dass die Analyse nicht bei einer Aktivitaet, einem guten Willen oder einer Kennzahl stehen bleiben darf. Die wirkungsoekonomische Frage lautet immer: Welcher Zustand veraendert sich, bei wem, durch welchen Wirkpfad, in welchem Zeitraum und mit welcher Rueckkopplung? Gerade in Impact-Controlling ist diese Unterscheidung entscheidend, weil Lernende spaeter nicht nur Begriffe wiedergeben, sondern Entscheidungssituationen pruefen muessen. Der haeufige Fehler besteht darin, einen Bericht als Endpunkt zu betrachten. Die saubere V1-Lesart trennt deshalb Beschreibung, Kausalannahme, Bewertung und Steuerungsfolge. Jeder Analyseblock sollte fragen, welche Routine, welcher Prozess oder welche Ressource nach der Bewertung angepasst wird. So wird aus dem Thema kein isoliertes Kapitel, sondern ein pruefbarer Baustein der WÖk-Architektur.</w:t>
-      </w:r>
-    </w:p>
-    <w:p>
-      <w:r>
-        <w:t>Governance. Fuer Von KPI zu KII und der Kennzahlen-Stack bedeutet Wirkungsbewertung Verfahren, Rechte, Transparenz und Korrektur braucht, dass die Analyse nicht bei einer Aktivitaet, einem guten Willen oder einer Kennzahl stehen bleiben darf. Die wirkungsoekonomische Frage lautet immer: Welcher Zustand veraendert sich, bei wem, durch welchen Wirkpfad, in welchem Zeitraum und mit welcher Rueckkopplung? Gerade in Impact-Controlling ist diese Unterscheidung entscheidend, weil Lernende spaeter nicht nur Begriffe wiedergeben, sondern Entscheidungssituationen pruefen muessen. Der haeufige Fehler besteht darin, Bewertung als technokratische Top-down-Setzung zu verstehen. Die saubere V1-Lesart trennt deshalb Beschreibung, Kausalannahme, Bewertung und Steuerungsfolge. Betroffene, Datenhalter, Entscheider und Kontrollinstanzen muessen unterscheidbare Rollen behalten. So wird aus dem Thema kein isoliertes Kapitel, sondern ein pruefbarer Baustein der WÖk-Architektur.</w:t>
-      </w:r>
-    </w:p>
-    <w:p>
-      <w:r>
-        <w:t>Fallfenster zur Anwendung. Ein Controlling-Team moechte einen Score bilden. Das Skript verlangt, dass Datenqualitaet, Systemgrenzen, Gewichtung, Unsicherheit und Nichtkompensation sichtbar bleiben. Ein Score darf die Diskussion nicht beenden, sondern muss bessere Fragen, Priorisierung und Rueckkopplung ermoeglichen. Bezogen auf Von KPI zu KII und der Kennzahlen-Stack heisst das: Die Analyse muss das konkrete Thema ernst nehmen und zugleich den allgemeinen WÖk-Massstab halten. Es geht nicht darum, die Welt in gute und schlechte Akteure einzuteilen. Es geht darum, Wirkpfade, Wirkungsempfaenger, Datenqualitaet, Risiken und Rueckkopplung so zu beschreiben, dass bessere Entscheidungen moeglich werden.</w:t>
-      </w:r>
-    </w:p>
-    <w:p>
-      <w:r>
-        <w:t>Didaktische Pruefbarkeit. Fuer Von KPI zu KII und der Kennzahlen-Stack bedeutet das Thema in der Akademie nicht nur erklaert, sondern in Falllogik ueberfuehrt werden muss, dass die Analyse nicht bei einer Aktivitaet, einem guten Willen oder einer Kennzahl stehen bleiben darf. Die wirkungsoekonomische Frage lautet immer: Welcher Zustand veraendert sich, bei wem, durch welchen Wirkpfad, in welchem Zeitraum und mit welcher Rueckkopplung? Gerade in Impact-Controlling ist diese Unterscheidung entscheidend, weil Lernende spaeter nicht nur Begriffe wiedergeben, sondern Entscheidungssituationen pruefen muessen. Der haeufige Fehler besteht darin, reines Auswendiglernen als Kompetenznachweis zu behandeln. Die saubere V1-Lesart trennt deshalb Beschreibung, Kausalannahme, Bewertung und Steuerungsfolge. Pruefungsfragen sollen Begriffe, Anwendung und rote Linien verbinden. So wird aus dem Thema kein isoliertes Kapitel, sondern ein pruefbarer Baustein der WÖk-Architektur.</w:t>
-      </w:r>
-    </w:p>
-    <w:p>
-      <w:r>
-        <w:t>Transfer in Organisationen. Fuer Von KPI zu KII und der Kennzahlen-Stack bedeutet WÖk-Begriffe im Alltag nur tragen, wenn sie in Routinen uebersetzt werden, dass die Analyse nicht bei einer Aktivitaet, einem guten Willen oder einer Kennzahl stehen bleiben darf. Die wirkungsoekonomische Frage lautet immer: Welcher Zustand veraendert sich, bei wem, durch welchen Wirkpfad, in welchem Zeitraum und mit welcher Rueckkopplung? Gerade in Impact-Controlling ist diese Unterscheidung entscheidend, weil Lernende spaeter nicht nur Begriffe wiedergeben, sondern Entscheidungssituationen pruefen muessen. Der haeufige Fehler besteht darin, die Verantwortung an eine Nachhaltigkeitsabteilung auszulagern. Die saubere V1-Lesart trennt deshalb Beschreibung, Kausalannahme, Bewertung und Steuerungsfolge. Strategie, Einkauf, Kommunikation, Controlling und Fuehrung muessen denselben Wirkungsbegriff verwenden. So wird aus dem Thema kein isoliertes Kapitel, sondern ein pruefbarer Baustein der WÖk-Architektur.</w:t>
-      </w:r>
-    </w:p>
-    <w:p>
-      <w:r>
-        <w:t>Rueckfluss in den Korpus. Fuer Von KPI zu KII und der Kennzahlen-Stack bedeutet jedes Studienskript den Gesamtbestand schaerfen kann, dass die Analyse nicht bei einer Aktivitaet, einem guten Willen oder einer Kennzahl stehen bleiben darf. Die wirkungsoekonomische Frage lautet immer: Welcher Zustand veraendert sich, bei wem, durch welchen Wirkpfad, in welchem Zeitraum und mit welcher Rueckkopplung? Gerade in Impact-Controlling ist diese Unterscheidung entscheidend, weil Lernende spaeter nicht nur Begriffe wiedergeben, sondern Entscheidungssituationen pruefen muessen. Der haeufige Fehler besteht darin, neue Einsichten nur lokal im Skript zu belassen. Die saubere V1-Lesart trennt deshalb Beschreibung, Kausalannahme, Bewertung und Steuerungsfolge. Glossar, Website, Journal, Dossiers und Visuals sollen aus der Skriptarbeit lernen. So wird aus dem Thema kein isoliertes Kapitel, sondern ein pruefbarer Baustein der WÖk-Architektur.</w:t>
-      </w:r>
-    </w:p>
-    <w:p>
-      <w:r>
-        <w:t>Fallfenster zur Anwendung. Ein Kommunikationsbericht nennt viele Aktivitaeten, Reichweiten und Rueckmeldungen. Die V1-Pruefung fragt, ob daraus eine belastbare Wirkungsaussage folgt. Wenn nur Kontakte, Klicks oder Zustimmung vorliegen, bleibt die Aussage im Bereich Wirkungspotenzial oder Resonanz, nicht im Bereich nachgewiesener Wirkung. Bezogen auf Von KPI zu KII und der Kennzahlen-Stack heisst das: Die Analyse muss das konkrete Thema ernst nehmen und zugleich den allgemeinen WÖk-Massstab halten. Es geht nicht darum, die Welt in gute und schlechte Akteure einzuteilen. Es geht darum, Wirkpfade, Wirkungsempfaenger, Datenqualitaet, Risiken und Rueckkopplung so zu beschreiben, dass bessere Entscheidungen moeglich werden.</w:t>
-      </w:r>
-    </w:p>
-    <w:p>
-      <w:r>
-        <w:t>Pruefungsnahe Transferfrage. Formuliere zu WC-V1 eine Wirkungsaussage in drei Saetzen: Erstens den beobachteten oder plausiblen Zustand, zweitens die Daten- oder Quellenlage, drittens die offene Unsicherheit samt Rueckkopplung. Die Antwort muss ohne moralische Personenbewertung auskommen und darf Reichweite nicht mit Wirkung verwechseln.</w:t>
-      </w:r>
-    </w:p>
-    <w:p>
-      <w:pPr>
-        <w:pStyle w:val="Heading3"/>
-      </w:pPr>
-      <w:r>
-        <w:t>Vertiefungsrunde 4: Lesen, pruefen, rueckkoppeln</w:t>
-      </w:r>
-    </w:p>
-    <w:p>
-      <w:r>
-        <w:t>Die folgende Runde verdichtet WC-V1 nicht durch neue Schlagworte, sondern durch wiederholte Anwendung auf unterschiedliche Entscheidungsebenen. Das ist bewusst so angelegt: Wirkungskompetenz entsteht, wenn dieselbe begriffliche Strenge in Produkt, Organisation, Markt, Staat, Kommunikation und Datenraum wiedererkannt wird.</w:t>
-      </w:r>
-    </w:p>
-    <w:p>
-      <w:r>
-        <w:t>Begriffliche Schaerfung. Fuer Von KPI zu KII und der Kennzahlen-Stack bedeutet praezise Sprache die erste Sicherung gegen Impact-Washing ist, dass die Analyse nicht bei einer Aktivitaet, einem guten Willen oder einer Kennzahl stehen bleiben darf. Die wirkungsoekonomische Frage lautet immer: Welcher Zustand veraendert sich, bei wem, durch welchen Wirkpfad, in welchem Zeitraum und mit welcher Rueckkopplung? Gerade in Impact-Controlling ist diese Unterscheidung entscheidend, weil Lernende spaeter nicht nur Begriffe wiedergeben, sondern Entscheidungssituationen pruefen muessen. Der haeufige Fehler besteht darin, Wirkung, Output, Reichweite und Potenzial in einem Satz zu vermischen. Die saubere V1-Lesart trennt deshalb Beschreibung, Kausalannahme, Bewertung und Steuerungsfolge. In der Praxis sollte jede Wirkungsaussage als kurze Viererprobe formuliert werden: Zustand, Betroffene, Quelle, offene Unsicherheit. So wird aus dem Thema kein isoliertes Kapitel, sondern ein pruefbarer Baustein der WÖk-Architektur.</w:t>
-      </w:r>
-    </w:p>
-    <w:p>
-      <w:r>
-        <w:t>Wirkpfad-Logik. Fuer Von KPI zu KII und der Kennzahlen-Stack bedeutet ein Thema erst dann steuerbar wird, wenn der Mechanismus zwischen Ausloeser und Zustandsveraenderung beschrieben ist, dass die Analyse nicht bei einer Aktivitaet, einem guten Willen oder einer Kennzahl stehen bleiben darf. Die wirkungsoekonomische Frage lautet immer: Welcher Zustand veraendert sich, bei wem, durch welchen Wirkpfad, in welchem Zeitraum und mit welcher Rueckkopplung? Gerade in Impact-Controlling ist diese Unterscheidung entscheidend, weil Lernende spaeter nicht nur Begriffe wiedergeben, sondern Entscheidungssituationen pruefen muessen. Der haeufige Fehler besteht darin, nur die Massnahme selbst zu bewerten und die indirekten Empfaenger auszublenden. Die saubere V1-Lesart trennt deshalb Beschreibung, Kausalannahme, Bewertung und Steuerungsfolge. Eine gute Fallanalyse zeichnet mindestens einen direkten und einen indirekten Wirkpfad nach. So wird aus dem Thema kein isoliertes Kapitel, sondern ein pruefbarer Baustein der WÖk-Architektur.</w:t>
-      </w:r>
-    </w:p>
-    <w:p>
-      <w:r>
-        <w:t>Daten- und Quellenklarheit. Fuer Von KPI zu KII und der Kennzahlen-Stack bedeutet jede Bewertung nur so belastbar ist wie Datenlage, Quellenstatus und Aktualitaet, dass die Analyse nicht bei einer Aktivitaet, einem guten Willen oder einer Kennzahl stehen bleiben darf. Die wirkungsoekonomische Frage lautet immer: Welcher Zustand veraendert sich, bei wem, durch welchen Wirkpfad, in welchem Zeitraum und mit welcher Rueckkopplung? Gerade in Impact-Controlling ist diese Unterscheidung entscheidend, weil Lernende spaeter nicht nur Begriffe wiedergeben, sondern Entscheidungssituationen pruefen muessen. Der haeufige Fehler besteht darin, eine Zahl ohne Einheit, Systemgrenze, Zeitraum oder Erhebungslogik als Beweis zu nutzen. Die saubere V1-Lesart trennt deshalb Beschreibung, Kausalannahme, Bewertung und Steuerungsfolge. Die Lernenden sollen Daten nicht dekorativ zitieren, sondern ihre Aussagekraft, Luecken und Grenzen offenlegen. So wird aus dem Thema kein isoliertes Kapitel, sondern ein pruefbarer Baustein der WÖk-Architektur.</w:t>
-      </w:r>
-    </w:p>
-    <w:p>
-      <w:r>
-        <w:t>Fallfenster zur Anwendung. Eine Organisation plant eine Massnahme und formuliert dazu eine positive Absicht. In der WÖk reicht das nicht. Fuer diese Vorlesung muss sichtbar werden, welche Zustandsveraenderung erwartet wird, welche Empfaenger direkt oder indirekt betroffen sind, welche Nebenwirkungen entstehen koennen und welche Entscheidung spaeter korrigiert wird. Bezogen auf Von KPI zu KII und der Kennzahlen-Stack heisst das: Die Analyse muss das konkrete Thema ernst nehmen und zugleich den allgemeinen WÖk-Massstab halten. Es geht nicht darum, die Welt in gute und schlechte Akteure einzuteilen. Es geht darum, Wirkpfade, Wirkungsempfaenger, Datenqualitaet, Risiken und Rueckkopplung so zu beschreiben, dass bessere Entscheidungen moeglich werden.</w:t>
-      </w:r>
-    </w:p>
-    <w:p>
-      <w:r>
-        <w:t>Ambivalenz. Fuer Von KPI zu KII und der Kennzahlen-Stack bedeutet positive und negative Zustandsveraenderungen gleichzeitig auftreten koennen, dass die Analyse nicht bei einer Aktivitaet, einem guten Willen oder einer Kennzahl stehen bleiben darf. Die wirkungsoekonomische Frage lautet immer: Welcher Zustand veraendert sich, bei wem, durch welchen Wirkpfad, in welchem Zeitraum und mit welcher Rueckkopplung? Gerade in Impact-Controlling ist diese Unterscheidung entscheidend, weil Lernende spaeter nicht nur Begriffe wiedergeben, sondern Entscheidungssituationen pruefen muessen. Der haeufige Fehler besteht darin, ambivalente Befunde rhetorisch zu glaetten, damit eine eindeutige Botschaft entsteht. Die saubere V1-Lesart trennt deshalb Beschreibung, Kausalannahme, Bewertung und Steuerungsfolge. Ein gutes Skript fuehrt deshalb Profile, Zielkonflikte und offene Punkte nebeneinander. So wird aus dem Thema kein isoliertes Kapitel, sondern ein pruefbarer Baustein der WÖk-Architektur.</w:t>
-      </w:r>
-    </w:p>
-    <w:p>
-      <w:r>
-        <w:t>Nichtkompensation. Fuer Von KPI zu KII und der Kennzahlen-Stack bedeutet schwere zentrale Schaeden nicht durch beliebige positive Einzelwerte neutralisiert werden duerfen, dass die Analyse nicht bei einer Aktivitaet, einem guten Willen oder einer Kennzahl stehen bleiben darf. Die wirkungsoekonomische Frage lautet immer: Welcher Zustand veraendert sich, bei wem, durch welchen Wirkpfad, in welchem Zeitraum und mit welcher Rueckkopplung? Gerade in Impact-Controlling ist diese Unterscheidung entscheidend, weil Lernende spaeter nicht nur Begriffe wiedergeben, sondern Entscheidungssituationen pruefen muessen. Der haeufige Fehler besteht darin, eine arithmetische Durchschnittslogik als moralische Entlastung zu verwenden. Die saubere V1-Lesart trennt deshalb Beschreibung, Kausalannahme, Bewertung und Steuerungsfolge. Reverse Merit Order und rote Linien sind Schutzregeln gegen Schoenrechnung. So wird aus dem Thema kein isoliertes Kapitel, sondern ein pruefbarer Baustein der WÖk-Architektur.</w:t>
-      </w:r>
-    </w:p>
-    <w:p>
-      <w:r>
-        <w:t>Pruefungsnahe Transferfrage. Formuliere zu WC-V1 eine Wirkungsaussage in drei Saetzen: Erstens den beobachteten oder plausiblen Zustand, zweitens die Daten- oder Quellenlage, drittens die offene Unsicherheit samt Rueckkopplung. Die Antwort muss ohne moralische Personenbewertung auskommen und darf Reichweite nicht mit Wirkung verwechseln.</w:t>
-      </w:r>
-    </w:p>
-    <w:p>
-      <w:r>
-        <w:t>Rueckkopplung. Fuer Von KPI zu KII und der Kennzahlen-Stack bedeutet Wirkungswissen erst dann wertvoll wird, wenn es Entscheidungen veraendert, dass die Analyse nicht bei einer Aktivitaet, einem guten Willen oder einer Kennzahl stehen bleiben darf. Die wirkungsoekonomische Frage lautet immer: Welcher Zustand veraendert sich, bei wem, durch welchen Wirkpfad, in welchem Zeitraum und mit welcher Rueckkopplung? Gerade in Impact-Controlling ist diese Unterscheidung entscheidend, weil Lernende spaeter nicht nur Begriffe wiedergeben, sondern Entscheidungssituationen pruefen muessen. Der haeufige Fehler besteht darin, einen Bericht als Endpunkt zu betrachten. Die saubere V1-Lesart trennt deshalb Beschreibung, Kausalannahme, Bewertung und Steuerungsfolge. Jeder Analyseblock sollte fragen, welche Routine, welcher Prozess oder welche Ressource nach der Bewertung angepasst wird. So wird aus dem Thema kein isoliertes Kapitel, sondern ein pruefbarer Baustein der WÖk-Architektur.</w:t>
-      </w:r>
-    </w:p>
-    <w:p>
-      <w:r>
-        <w:t>Fallfenster zur Anwendung. Eine Fuehrungsentscheidung erzeugt zugleich Nutzen und Risiken. Die WÖk behandelt Ambivalenz nicht als Stoerung, sondern als Kern der Analyse. Positive Netto-Wirkung darf erst behauptet werden, wenn zentrale negative Wirkungen getrennt geprueft und rote Linien gewahrt sind. Bezogen auf Von KPI zu KII und der Kennzahlen-Stack heisst das: Die Analyse muss das konkrete Thema ernst nehmen und zugleich den allgemeinen WÖk-Massstab halten. Es geht nicht darum, die Welt in gute und schlechte Akteure einzuteilen. Es geht darum, Wirkpfade, Wirkungsempfaenger, Datenqualitaet, Risiken und Rueckkopplung so zu beschreiben, dass bessere Entscheidungen moeglich werden.</w:t>
-      </w:r>
-    </w:p>
-    <w:p>
-      <w:r>
-        <w:t>Governance. Fuer Von KPI zu KII und der Kennzahlen-Stack bedeutet Wirkungsbewertung Verfahren, Rechte, Transparenz und Korrektur braucht, dass die Analyse nicht bei einer Aktivitaet, einem guten Willen oder einer Kennzahl stehen bleiben darf. Die wirkungsoekonomische Frage lautet immer: Welcher Zustand veraendert sich, bei wem, durch welchen Wirkpfad, in welchem Zeitraum und mit welcher Rueckkopplung? Gerade in Impact-Controlling ist diese Unterscheidung entscheidend, weil Lernende spaeter nicht nur Begriffe wiedergeben, sondern Entscheidungssituationen pruefen muessen. Der haeufige Fehler besteht darin, Bewertung als technokratische Top-down-Setzung zu verstehen. Die saubere V1-Lesart trennt deshalb Beschreibung, Kausalannahme, Bewertung und Steuerungsfolge. Betroffene, Datenhalter, Entscheider und Kontrollinstanzen muessen unterscheidbare Rollen behalten. So wird aus dem Thema kein isoliertes Kapitel, sondern ein pruefbarer Baustein der WÖk-Architektur.</w:t>
-      </w:r>
-    </w:p>
-    <w:p>
-      <w:r>
-        <w:t>Didaktische Pruefbarkeit. Fuer Von KPI zu KII und der Kennzahlen-Stack bedeutet das Thema in der Akademie nicht nur erklaert, sondern in Falllogik ueberfuehrt werden muss, dass die Analyse nicht bei einer Aktivitaet, einem guten Willen oder einer Kennzahl stehen bleiben darf. Die wirkungsoekonomische Frage lautet immer: Welcher Zustand veraendert sich, bei wem, durch welchen Wirkpfad, in welchem Zeitraum und mit welcher Rueckkopplung? Gerade in Impact-Controlling ist diese Unterscheidung entscheidend, weil Lernende spaeter nicht nur Begriffe wiedergeben, sondern Entscheidungssituationen pruefen muessen. Der haeufige Fehler besteht darin, reines Auswendiglernen als Kompetenznachweis zu behandeln. Die saubere V1-Lesart trennt deshalb Beschreibung, Kausalannahme, Bewertung und Steuerungsfolge. Pruefungsfragen sollen Begriffe, Anwendung und rote Linien verbinden. So wird aus dem Thema kein isoliertes Kapitel, sondern ein pruefbarer Baustein der WÖk-Architektur.</w:t>
-      </w:r>
-    </w:p>
-    <w:p>
-      <w:r>
-        <w:t>Transfer in Organisationen. Fuer Von KPI zu KII und der Kennzahlen-Stack bedeutet WÖk-Begriffe im Alltag nur tragen, wenn sie in Routinen uebersetzt werden, dass die Analyse nicht bei einer Aktivitaet, einem guten Willen oder einer Kennzahl stehen bleiben darf. Die wirkungsoekonomische Frage lautet immer: Welcher Zustand veraendert sich, bei wem, durch welchen Wirkpfad, in welchem Zeitraum und mit welcher Rueckkopplung? Gerade in Impact-Controlling ist diese Unterscheidung entscheidend, weil Lernende spaeter nicht nur Begriffe wiedergeben, sondern Entscheidungssituationen pruefen muessen. Der haeufige Fehler besteht darin, die Verantwortung an eine Nachhaltigkeitsabteilung auszulagern. Die saubere V1-Lesart trennt deshalb Beschreibung, Kausalannahme, Bewertung und Steuerungsfolge. Strategie, Einkauf, Kommunikation, Controlling und Fuehrung muessen denselben Wirkungsbegriff verwenden. So wird aus dem Thema kein isoliertes Kapitel, sondern ein pruefbarer Baustein der WÖk-Architektur.</w:t>
-      </w:r>
-    </w:p>
-    <w:p>
-      <w:r>
-        <w:t>Fallfenster zur Anwendung. Ein Controlling-Team moechte einen Score bilden. Das Skript verlangt, dass Datenqualitaet, Systemgrenzen, Gewichtung, Unsicherheit und Nichtkompensation sichtbar bleiben. Ein Score darf die Diskussion nicht beenden, sondern muss bessere Fragen, Priorisierung und Rueckkopplung ermoeglichen. Bezogen auf Von KPI zu KII und der Kennzahlen-Stack heisst das: Die Analyse muss das konkrete Thema ernst nehmen und zugleich den allgemeinen WÖk-Massstab halten. Es geht nicht darum, die Welt in gute und schlechte Akteure einzuteilen. Es geht darum, Wirkpfade, Wirkungsempfaenger, Datenqualitaet, Risiken und Rueckkopplung so zu beschreiben, dass bessere Entscheidungen moeglich werden.</w:t>
-      </w:r>
-    </w:p>
-    <w:p>
-      <w:r>
-        <w:t>Rueckfluss in den Korpus. Fuer Von KPI zu KII und der Kennzahlen-Stack bedeutet jedes Studienskript den Gesamtbestand schaerfen kann, dass die Analyse nicht bei einer Aktivitaet, einem guten Willen oder einer Kennzahl stehen bleiben darf. Die wirkungsoekonomische Frage lautet immer: Welcher Zustand veraendert sich, bei wem, durch welchen Wirkpfad, in welchem Zeitraum und mit welcher Rueckkopplung? Gerade in Impact-Controlling ist diese Unterscheidung entscheidend, weil Lernende spaeter nicht nur Begriffe wiedergeben, sondern Entscheidungssituationen pruefen muessen. Der haeufige Fehler besteht darin, neue Einsichten nur lokal im Skript zu belassen. Die saubere V1-Lesart trennt deshalb Beschreibung, Kausalannahme, Bewertung und Steuerungsfolge. Glossar, Website, Journal, Dossiers und Visuals sollen aus der Skriptarbeit lernen. So wird aus dem Thema kein isoliertes Kapitel, sondern ein pruefbarer Baustein der WÖk-Architektur.</w:t>
-      </w:r>
-    </w:p>
-    <w:p>
-      <w:r>
-        <w:t>Pruefungsnahe Transferfrage. Formuliere zu WC-V1 eine Wirkungsaussage in drei Saetzen: Erstens den beobachteten oder plausiblen Zustand, zweitens die Daten- oder Quellenlage, drittens die offene Unsicherheit samt Rueckkopplung. Die Antwort muss ohne moralische Personenbewertung auskommen und darf Reichweite nicht mit Wirkung verwechseln.</w:t>
-      </w:r>
-    </w:p>
-    <w:p>
-      <w:pPr>
-        <w:pStyle w:val="Heading3"/>
-      </w:pPr>
-      <w:r>
-        <w:t>Vertiefungsrunde 5: Lesen, pruefen, rueckkoppeln</w:t>
-      </w:r>
-    </w:p>
-    <w:p>
-      <w:r>
-        <w:t>Die folgende Runde verdichtet WC-V1 nicht durch neue Schlagworte, sondern durch wiederholte Anwendung auf unterschiedliche Entscheidungsebenen. Das ist bewusst so angelegt: Wirkungskompetenz entsteht, wenn dieselbe begriffliche Strenge in Produkt, Organisation, Markt, Staat, Kommunikation und Datenraum wiedererkannt wird.</w:t>
-      </w:r>
-    </w:p>
-    <w:p>
-      <w:r>
-        <w:t>Begriffliche Schaerfung. Fuer Von KPI zu KII und der Kennzahlen-Stack bedeutet praezise Sprache die erste Sicherung gegen Impact-Washing ist, dass die Analyse nicht bei einer Aktivitaet, einem guten Willen oder einer Kennzahl stehen bleiben darf. Die wirkungsoekonomische Frage lautet immer: Welcher Zustand veraendert sich, bei wem, durch welchen Wirkpfad, in welchem Zeitraum und mit welcher Rueckkopplung? Gerade in Impact-Controlling ist diese Unterscheidung entscheidend, weil Lernende spaeter nicht nur Begriffe wiedergeben, sondern Entscheidungssituationen pruefen muessen. Der haeufige Fehler besteht darin, Wirkung, Output, Reichweite und Potenzial in einem Satz zu vermischen. Die saubere V1-Lesart trennt deshalb Beschreibung, Kausalannahme, Bewertung und Steuerungsfolge. In der Praxis sollte jede Wirkungsaussage als kurze Viererprobe formuliert werden: Zustand, Betroffene, Quelle, offene Unsicherheit. So wird aus dem Thema kein isoliertes Kapitel, sondern ein pruefbarer Baustein der WÖk-Architektur.</w:t>
-      </w:r>
-    </w:p>
-    <w:p>
-      <w:r>
-        <w:t>Wirkpfad-Logik. Fuer Von KPI zu KII und der Kennzahlen-Stack bedeutet ein Thema erst dann steuerbar wird, wenn der Mechanismus zwischen Ausloeser und Zustandsveraenderung beschrieben ist, dass die Analyse nicht bei einer Aktivitaet, einem guten Willen oder einer Kennzahl stehen bleiben darf. Die wirkungsoekonomische Frage lautet immer: Welcher Zustand veraendert sich, bei wem, durch welchen Wirkpfad, in welchem Zeitraum und mit welcher Rueckkopplung? Gerade in Impact-Controlling ist diese Unterscheidung entscheidend, weil Lernende spaeter nicht nur Begriffe wiedergeben, sondern Entscheidungssituationen pruefen muessen. Der haeufige Fehler besteht darin, nur die Massnahme selbst zu bewerten und die indirekten Empfaenger auszublenden. Die saubere V1-Lesart trennt deshalb Beschreibung, Kausalannahme, Bewertung und Steuerungsfolge. Eine gute Fallanalyse zeichnet mindestens einen direkten und einen indirekten Wirkpfad nach. So wird aus dem Thema kein isoliertes Kapitel, sondern ein pruefbarer Baustein der WÖk-Architektur.</w:t>
-      </w:r>
-    </w:p>
-    <w:p>
-      <w:r>
-        <w:t>Fallfenster zur Anwendung. Ein Kommunikationsbericht nennt viele Aktivitaeten, Reichweiten und Rueckmeldungen. Die V1-Pruefung fragt, ob daraus eine belastbare Wirkungsaussage folgt. Wenn nur Kontakte, Klicks oder Zustimmung vorliegen, bleibt die Aussage im Bereich Wirkungspotenzial oder Resonanz, nicht im Bereich nachgewiesener Wirkung. Bezogen auf Von KPI zu KII und der Kennzahlen-Stack heisst das: Die Analyse muss das konkrete Thema ernst nehmen und zugleich den allgemeinen WÖk-Massstab halten. Es geht nicht darum, die Welt in gute und schlechte Akteure einzuteilen. Es geht darum, Wirkpfade, Wirkungsempfaenger, Datenqualitaet, Risiken und Rueckkopplung so zu beschreiben, dass bessere Entscheidungen moeglich werden.</w:t>
-      </w:r>
-    </w:p>
-    <w:p>
-      <w:r>
-        <w:t>Daten- und Quellenklarheit. Fuer Von KPI zu KII und der Kennzahlen-Stack bedeutet jede Bewertung nur so belastbar ist wie Datenlage, Quellenstatus und Aktualitaet, dass die Analyse nicht bei einer Aktivitaet, einem guten Willen oder einer Kennzahl stehen bleiben darf. Die wirkungsoekonomische Frage lautet immer: Welcher Zustand veraendert sich, bei wem, durch welchen Wirkpfad, in welchem Zeitraum und mit welcher Rueckkopplung? Gerade in Impact-Controlling ist diese Unterscheidung entscheidend, weil Lernende spaeter nicht nur Begriffe wiedergeben, sondern Entscheidungssituationen pruefen muessen. Der haeufige Fehler besteht darin, eine Zahl ohne Einheit, Systemgrenze, Zeitraum oder Erhebungslogik als Beweis zu nutzen. Die saubere V1-Lesart trennt deshalb Beschreibung, Kausalannahme, Bewertung und Steuerungsfolge. Die Lernenden sollen Daten nicht dekorativ zitieren, sondern ihre Aussagekraft, Luecken und Grenzen offenlegen. So wird aus dem Thema kein isoliertes Kapitel, sondern ein pruefbarer Baustein der WÖk-Architektur.</w:t>
-      </w:r>
-    </w:p>
-    <w:p>
-      <w:r>
-        <w:t>Ambivalenz. Fuer Von KPI zu KII und der Kennzahlen-Stack bedeutet positive und negative Zustandsveraenderungen gleichzeitig auftreten koennen, dass die Analyse nicht bei einer Aktivitaet, einem guten Willen oder einer Kennzahl stehen bleiben darf. Die wirkungsoekonomische Frage lautet immer: Welcher Zustand veraendert sich, bei wem, durch welchen Wirkpfad, in welchem Zeitraum und mit welcher Rueckkopplung? Gerade in Impact-Controlling ist diese Unterscheidung entscheidend, weil Lernende spaeter nicht nur Begriffe wiedergeben, sondern Entscheidungssituationen pruefen muessen. Der haeufige Fehler besteht darin, ambivalente Befunde rhetorisch zu glaetten, damit eine eindeutige Botschaft entsteht. Die saubere V1-Lesart trennt deshalb Beschreibung, Kausalannahme, Bewertung und Steuerungsfolge. Ein gutes Skript fuehrt deshalb Profile, Zielkonflikte und offene Punkte nebeneinander. So wird aus dem Thema kein isoliertes Kapitel, sondern ein pruefbarer Baustein der WÖk-Architektur.</w:t>
-      </w:r>
-    </w:p>
-    <w:p>
-      <w:r>
-        <w:t>Nichtkompensation. Fuer Von KPI zu KII und der Kennzahlen-Stack bedeutet schwere zentrale Schaeden nicht durch beliebige positive Einzelwerte neutralisiert werden duerfen, dass die Analyse nicht bei einer Aktivitaet, einem guten Willen oder einer Kennzahl stehen bleiben darf. Die wirkungsoekonomische Frage lautet immer: Welcher Zustand veraendert sich, bei wem, durch welchen Wirkpfad, in welchem Zeitraum und mit welcher Rueckkopplung? Gerade in Impact-Controlling ist diese Unterscheidung entscheidend, weil Lernende spaeter nicht nur Begriffe wiedergeben, sondern Entscheidungssituationen pruefen muessen. Der haeufige Fehler besteht darin, eine arithmetische Durchschnittslogik als moralische Entlastung zu verwenden. Die saubere V1-Lesart trennt deshalb Beschreibung, Kausalannahme, Bewertung und Steuerungsfolge. Reverse Merit Order und rote Linien sind Schutzregeln gegen Schoenrechnung. So wird aus dem Thema kein isoliertes Kapitel, sondern ein pruefbarer Baustein der WÖk-Architektur.</w:t>
-      </w:r>
-    </w:p>
-    <w:p>
-      <w:r>
-        <w:t>Fallfenster zur Anwendung. Eine Organisation plant eine Massnahme und formuliert dazu eine positive Absicht. In der WÖk reicht das nicht. Fuer diese Vorlesung muss sichtbar werden, welche Zustandsveraenderung erwartet wird, welche Empfaenger direkt oder indirekt betroffen sind, welche Nebenwirkungen entstehen koennen und welche Entscheidung spaeter korrigiert wird. Bezogen auf Von KPI zu KII und der Kennzahlen-Stack heisst das: Die Analyse muss das konkrete Thema ernst nehmen und zugleich den allgemeinen WÖk-Massstab halten. Es geht nicht darum, die Welt in gute und schlechte Akteure einzuteilen. Es geht darum, Wirkpfade, Wirkungsempfaenger, Datenqualitaet, Risiken und Rueckkopplung so zu beschreiben, dass bessere Entscheidungen moeglich werden.</w:t>
-      </w:r>
-    </w:p>
-    <w:p>
-      <w:r>
-        <w:t>Pruefungsnahe Transferfrage. Formuliere zu WC-V1 eine Wirkungsaussage in drei Saetzen: Erstens den beobachteten oder plausiblen Zustand, zweitens die Daten- oder Quellenlage, drittens die offene Unsicherheit samt Rueckkopplung. Die Antwort muss ohne moralische Personenbewertung auskommen und darf Reichweite nicht mit Wirkung verwechseln.</w:t>
-      </w:r>
-    </w:p>
-    <w:p>
-      <w:r>
-        <w:t>Rueckkopplung. Fuer Von KPI zu KII und der Kennzahlen-Stack bedeutet Wirkungswissen erst dann wertvoll wird, wenn es Entscheidungen veraendert, dass die Analyse nicht bei einer Aktivitaet, einem guten Willen oder einer Kennzahl stehen bleiben darf. Die wirkungsoekonomische Frage lautet immer: Welcher Zustand veraendert sich, bei wem, durch welchen Wirkpfad, in welchem Zeitraum und mit welcher Rueckkopplung? Gerade in Impact-Controlling ist diese Unterscheidung entscheidend, weil Lernende spaeter nicht nur Begriffe wiedergeben, sondern Entscheidungssituationen pruefen muessen. Der haeufige Fehler besteht darin, einen Bericht als Endpunkt zu betrachten. Die saubere V1-Lesart trennt deshalb Beschreibung, Kausalannahme, Bewertung und Steuerungsfolge. Jeder Analyseblock sollte fragen, welche Routine, welcher Prozess oder welche Ressource nach der Bewertung angepasst wird. So wird aus dem Thema kein isoliertes Kapitel, sondern ein pruefbarer Baustein der WÖk-Architektur.</w:t>
-      </w:r>
-    </w:p>
-    <w:p>
-      <w:r>
-        <w:t>Governance. Fuer Von KPI zu KII und der Kennzahlen-Stack bedeutet Wirkungsbewertung Verfahren, Rechte, Transparenz und Korrektur braucht, dass die Analyse nicht bei einer Aktivitaet, einem guten Willen oder einer Kennzahl stehen bleiben darf. Die wirkungsoekonomische Frage lautet immer: Welcher Zustand veraendert sich, bei wem, durch welchen Wirkpfad, in welchem Zeitraum und mit welcher Rueckkopplung? Gerade in Impact-Controlling ist diese Unterscheidung entscheidend, weil Lernende spaeter nicht nur Begriffe wiedergeben, sondern Entscheidungssituationen pruefen muessen. Der haeufige Fehler besteht darin, Bewertung als technokratische Top-down-Setzung zu verstehen. Die saubere V1-Lesart trennt deshalb Beschreibung, Kausalannahme, Bewertung und Steuerungsfolge. Betroffene, Datenhalter, Entscheider und Kontrollinstanzen muessen unterscheidbare Rollen behalten. So wird aus dem Thema kein isoliertes Kapitel, sondern ein pruefbarer Baustein der WÖk-Architektur.</w:t>
-      </w:r>
-    </w:p>
-    <w:p>
-      <w:r>
-        <w:t>Didaktische Pruefbarkeit. Fuer Von KPI zu KII und der Kennzahlen-Stack bedeutet das Thema in der Akademie nicht nur erklaert, sondern in Falllogik ueberfuehrt werden muss, dass die Analyse nicht bei einer Aktivitaet, einem guten Willen oder einer Kennzahl stehen bleiben darf. Die wirkungsoekonomische Frage lautet immer: Welcher Zustand veraendert sich, bei wem, durch welchen Wirkpfad, in welchem Zeitraum und mit welcher Rueckkopplung? Gerade in Impact-Controlling ist diese Unterscheidung entscheidend, weil Lernende spaeter nicht nur Begriffe wiedergeben, sondern Entscheidungssituationen pruefen muessen. Der haeufige Fehler besteht darin, reines Auswendiglernen als Kompetenznachweis zu behandeln. Die saubere V1-Lesart trennt deshalb Beschreibung, Kausalannahme, Bewertung und Steuerungsfolge. Pruefungsfragen sollen Begriffe, Anwendung und rote Linien verbinden. So wird aus dem Thema kein isoliertes Kapitel, sondern ein pruefbarer Baustein der WÖk-Architektur.</w:t>
-      </w:r>
-    </w:p>
-    <w:p>
-      <w:r>
-        <w:t>Fallfenster zur Anwendung. Eine Fuehrungsentscheidung erzeugt zugleich Nutzen und Risiken. Die WÖk behandelt Ambivalenz nicht als Stoerung, sondern als Kern der Analyse. Positive Netto-Wirkung darf erst behauptet werden, wenn zentrale negative Wirkungen getrennt geprueft und rote Linien gewahrt sind. Bezogen auf Von KPI zu KII und der Kennzahlen-Stack heisst das: Die Analyse muss das konkrete Thema ernst nehmen und zugleich den allgemeinen WÖk-Massstab halten. Es geht nicht darum, die Welt in gute und schlechte Akteure einzuteilen. Es geht darum, Wirkpfade, Wirkungsempfaenger, Datenqualitaet, Risiken und Rueckkopplung so zu beschreiben, dass bessere Entscheidungen moeglich werden.</w:t>
-      </w:r>
-    </w:p>
-    <w:p>
-      <w:r>
-        <w:t>Transfer in Organisationen. Fuer Von KPI zu KII und der Kennzahlen-Stack bedeutet WÖk-Begriffe im Alltag nur tragen, wenn sie in Routinen uebersetzt werden, dass die Analyse nicht bei einer Aktivitaet, einem guten Willen oder einer Kennzahl stehen bleiben darf. Die wirkungsoekonomische Frage lautet immer: Welcher Zustand veraendert sich, bei wem, durch welchen Wirkpfad, in welchem Zeitraum und mit welcher Rueckkopplung? Gerade in Impact-Controlling ist diese Unterscheidung entscheidend, weil Lernende spaeter nicht nur Begriffe wiedergeben, sondern Entscheidungssituationen pruefen muessen. Der haeufige Fehler besteht darin, die Verantwortung an eine Nachhaltigkeitsabteilung auszulagern. Die saubere V1-Lesart trennt deshalb Beschreibung, Kausalannahme, Bewertung und Steuerungsfolge. Strategie, Einkauf, Kommunikation, Controlling und Fuehrung muessen denselben Wirkungsbegriff verwenden. So wird aus dem Thema kein isoliertes Kapitel, sondern ein pruefbarer Baustein der WÖk-Architektur.</w:t>
-      </w:r>
-    </w:p>
-    <w:p>
-      <w:r>
-        <w:t>Rueckfluss in den Korpus. Fuer Von KPI zu KII und der Kennzahlen-Stack bedeutet jedes Studienskript den Gesamtbestand schaerfen kann, dass die Analyse nicht bei einer Aktivitaet, einem guten Willen oder einer Kennzahl stehen bleiben darf. Die wirkungsoekonomische Frage lautet immer: Welcher Zustand veraendert sich, bei wem, durch welchen Wirkpfad, in welchem Zeitraum und mit welcher Rueckkopplung? Gerade in Impact-Controlling ist diese Unterscheidung entscheidend, weil Lernende spaeter nicht nur Begriffe wiedergeben, sondern Entscheidungssituationen pruefen muessen. Der haeufige Fehler besteht darin, neue Einsichten nur lokal im Skript zu belassen. Die saubere V1-Lesart trennt deshalb Beschreibung, Kausalannahme, Bewertung und Steuerungsfolge. Glossar, Website, Journal, Dossiers und Visuals sollen aus der Skriptarbeit lernen. So wird aus dem Thema kein isoliertes Kapitel, sondern ein pruefbarer Baustein der WÖk-Architektur.</w:t>
-      </w:r>
-    </w:p>
-    <w:p>
-      <w:r>
-        <w:t>Pruefungsnahe Transferfrage. Formuliere zu WC-V1 eine Wirkungsaussage in drei Saetzen: Erstens den beobachteten oder plausiblen Zustand, zweitens die Daten- oder Quellenlage, drittens die offene Unsicherheit samt Rueckkopplung. Die Antwort muss ohne moralische Personenbewertung auskommen und darf Reichweite nicht mit Wirkung verwechseln.</w:t>
-      </w:r>
-    </w:p>
-    <w:p>
-      <w:pPr>
-        <w:pStyle w:val="Heading3"/>
-      </w:pPr>
-      <w:r>
-        <w:t>V1-Abschlussnotiz</w:t>
-      </w:r>
-    </w:p>
-    <w:p>
-      <w:r>
-        <w:t>Diese Finalisierung schliesst die Codex-Inhaltsproduktion fuer WC-V1. Offen bleibt nicht der fachliche Kern des Skripts, sondern der naechste Produktionsschritt: Claude setzt daraus die CI/CD-konforme Reader- und PDF-Fassung, prueft Satz, Umbrueche, Medienintegration und Lektorat und markiert erst danach die veroeffentlichte Fassung als freigegeben.</w:t>
       </w:r>
     </w:p>
     <w:p>
@@ -4632,6 +3907,851 @@
       </w:pPr>
       <w:r>
         <w:t>Fachliteratur zu Wirkungslogik, Evaluation, Systemtheorie, Resilienz, Governance, Diffusion, Vertrauen oder Controlling je nach Thema.</w:t>
+      </w:r>
+    </w:p>
+    <w:p>
+      <w:pPr>
+        <w:pStyle w:val="Heading2"/>
+      </w:pPr>
+      <w:r>
+        <w:t>V1-Finalisierung: Vertiefung, Anwendung und Evidenz</w:t>
+      </w:r>
+    </w:p>
+    <w:p>
+      <w:r>
+        <w:t>Dieses Studienskript ist die fachlich finale Codex-V1-Fassung fuer den Akademie-Reader und die oeffentliche Bibliothek. Claude uebernimmt danach Satz, CI/CD, PDF/Reader-Freigabe und die abschliessende Lektoratsabnahme.</w:t>
+      </w:r>
+    </w:p>
+    <w:p>
+      <w:pPr>
+        <w:pStyle w:val="Heading3"/>
+      </w:pPr>
+      <w:r>
+        <w:t>Finaler Leseauftrag</w:t>
+      </w:r>
+    </w:p>
+    <w:p>
+      <w:r>
+        <w:t>Dieses Skript zu WC-V1 Von KPI zu KII und der Kennzahlen-Stack ist als Langformtext angelegt: Es soll nicht nur die Vorlesung begleiten, sondern als eigenstaendiges Studienmaterial funktionieren. Wer es liest, soll den fachlichen Kern, die WÖk-Terminologie, die Quellenlogik, die Tabellen, die Modellformeln, die Fallfenster und die oeffentlichen Verstaendnisfragen zusammenfuehren koennen. Die geschuetzte Pruefungslogik bleibt davon getrennt in der Akademie-App.</w:t>
+      </w:r>
+    </w:p>
+    <w:p>
+      <w:r>
+        <w:t>Fuer den Abschluss ist entscheidend, dass Von KPI zu KII und der Kennzahlen-Stack im Feld Impact-Controlling nicht als Einzelthema stehen bleibt. Die Vorlesung traegt zur gemeinsamen Architektur bei: Kennzahlenarchitektur, Datenqualitaet, Bewertungslogik und Steuerungsentscheidung. Daraus folgt eine Lesehaltung, die streng und praktisch zugleich ist. Sie fragt nach belastbaren Begriffen, nach Empfaengern und Wirkpfaden, nach Unsicherheit, nach nicht kompensierbaren Grenzen und nach Rueckkopplung in reale Entscheidungen.</w:t>
+      </w:r>
+    </w:p>
+    <w:p>
+      <w:pPr>
+        <w:pStyle w:val="Heading3"/>
+      </w:pPr>
+      <w:r>
+        <w:t>Abschlussmatrix fuer die Anwendung</w:t>
+      </w:r>
+    </w:p>
+    <w:tbl>
+      <w:tblPr>
+        <w:tblStyle w:val="TableGrid"/>
+        <w:tblW w:type="auto" w:w="0"/>
+        <w:jc w:val="left"/>
+        <w:tblLook w:firstColumn="1" w:firstRow="1" w:lastColumn="0" w:lastRow="0" w:noHBand="0" w:noVBand="1" w:val="04A0"/>
+      </w:tblPr>
+      <w:tblGrid>
+        <w:gridCol w:w="3120"/>
+        <w:gridCol w:w="3120"/>
+        <w:gridCol w:w="3120"/>
+      </w:tblGrid>
+      <w:tr>
+        <w:tc>
+          <w:tcPr>
+            <w:tcW w:type="dxa" w:w="3120"/>
+            <w:vAlign w:val="center"/>
+          </w:tcPr>
+          <w:p>
+            <w:r>
+              <w:rPr>
+                <w:b/>
+              </w:rPr>
+              <w:t>Ebene</w:t>
+            </w:r>
+          </w:p>
+        </w:tc>
+        <w:tc>
+          <w:tcPr>
+            <w:tcW w:type="dxa" w:w="3120"/>
+            <w:vAlign w:val="center"/>
+          </w:tcPr>
+          <w:p>
+            <w:r>
+              <w:rPr>
+                <w:b/>
+              </w:rPr>
+              <w:t>Anwendung in WC-V1</w:t>
+            </w:r>
+          </w:p>
+        </w:tc>
+        <w:tc>
+          <w:tcPr>
+            <w:tcW w:type="dxa" w:w="3120"/>
+            <w:vAlign w:val="center"/>
+          </w:tcPr>
+          <w:p>
+            <w:r>
+              <w:rPr>
+                <w:b/>
+              </w:rPr>
+              <w:t>Qualitaetsgrenze</w:t>
+            </w:r>
+          </w:p>
+        </w:tc>
+      </w:tr>
+      <w:tr>
+        <w:tc>
+          <w:tcPr>
+            <w:tcW w:type="dxa" w:w="3120"/>
+            <w:vAlign w:val="center"/>
+          </w:tcPr>
+          <w:p>
+            <w:r>
+              <w:t>Begriff</w:t>
+            </w:r>
+          </w:p>
+        </w:tc>
+        <w:tc>
+          <w:tcPr>
+            <w:tcW w:type="dxa" w:w="3120"/>
+            <w:vAlign w:val="center"/>
+          </w:tcPr>
+          <w:p>
+            <w:r>
+              <w:t>Wirkung, Wirkungspotenzial und Wirkungsrisiko werden im Kontext der Vorlesung getrennt.</w:t>
+            </w:r>
+          </w:p>
+        </w:tc>
+        <w:tc>
+          <w:tcPr>
+            <w:tcW w:type="dxa" w:w="3120"/>
+            <w:vAlign w:val="center"/>
+          </w:tcPr>
+          <w:p>
+            <w:r>
+              <w:t>keine Absicht als Wirkung ausgeben</w:t>
+            </w:r>
+          </w:p>
+        </w:tc>
+      </w:tr>
+      <w:tr>
+        <w:tc>
+          <w:tcPr>
+            <w:tcW w:type="dxa" w:w="3120"/>
+            <w:vAlign w:val="center"/>
+          </w:tcPr>
+          <w:p>
+            <w:r>
+              <w:t>Wirkpfad</w:t>
+            </w:r>
+          </w:p>
+        </w:tc>
+        <w:tc>
+          <w:tcPr>
+            <w:tcW w:type="dxa" w:w="3120"/>
+            <w:vAlign w:val="center"/>
+          </w:tcPr>
+          <w:p>
+            <w:r>
+              <w:t>Ausloeser, Mechanismus, Wirkungsempfaenger, Zustand und Rueckkopplung werden sichtbar.</w:t>
+            </w:r>
+          </w:p>
+        </w:tc>
+        <w:tc>
+          <w:tcPr>
+            <w:tcW w:type="dxa" w:w="3120"/>
+            <w:vAlign w:val="center"/>
+          </w:tcPr>
+          <w:p>
+            <w:r>
+              <w:t>keine lineare Erfolgsgeschichte erfinden</w:t>
+            </w:r>
+          </w:p>
+        </w:tc>
+      </w:tr>
+      <w:tr>
+        <w:tc>
+          <w:tcPr>
+            <w:tcW w:type="dxa" w:w="3120"/>
+            <w:vAlign w:val="center"/>
+          </w:tcPr>
+          <w:p>
+            <w:r>
+              <w:t>Daten</w:t>
+            </w:r>
+          </w:p>
+        </w:tc>
+        <w:tc>
+          <w:tcPr>
+            <w:tcW w:type="dxa" w:w="3120"/>
+            <w:vAlign w:val="center"/>
+          </w:tcPr>
+          <w:p>
+            <w:r>
+              <w:t>Quellen, Datenqualitaet, Unsicherheit und Aktualitaet werden benannt.</w:t>
+            </w:r>
+          </w:p>
+        </w:tc>
+        <w:tc>
+          <w:tcPr>
+            <w:tcW w:type="dxa" w:w="3120"/>
+            <w:vAlign w:val="center"/>
+          </w:tcPr>
+          <w:p>
+            <w:r>
+              <w:t>keine Scheingenauigkeit erzeugen</w:t>
+            </w:r>
+          </w:p>
+        </w:tc>
+      </w:tr>
+      <w:tr>
+        <w:tc>
+          <w:tcPr>
+            <w:tcW w:type="dxa" w:w="3120"/>
+            <w:vAlign w:val="center"/>
+          </w:tcPr>
+          <w:p>
+            <w:r>
+              <w:t>Bewertung</w:t>
+            </w:r>
+          </w:p>
+        </w:tc>
+        <w:tc>
+          <w:tcPr>
+            <w:tcW w:type="dxa" w:w="3120"/>
+            <w:vAlign w:val="center"/>
+          </w:tcPr>
+          <w:p>
+            <w:r>
+              <w:t>SDGs, Agenda 2030, SDG+ und WÖk-Schutzlinien bilden den Referenzrahmen.</w:t>
+            </w:r>
+          </w:p>
+        </w:tc>
+        <w:tc>
+          <w:tcPr>
+            <w:tcW w:type="dxa" w:w="3120"/>
+            <w:vAlign w:val="center"/>
+          </w:tcPr>
+          <w:p>
+            <w:r>
+              <w:t>keine Durchschnittslogik gegen rote Linien</w:t>
+            </w:r>
+          </w:p>
+        </w:tc>
+      </w:tr>
+      <w:tr>
+        <w:tc>
+          <w:tcPr>
+            <w:tcW w:type="dxa" w:w="3120"/>
+            <w:vAlign w:val="center"/>
+          </w:tcPr>
+          <w:p>
+            <w:r>
+              <w:t>Steuerung</w:t>
+            </w:r>
+          </w:p>
+        </w:tc>
+        <w:tc>
+          <w:tcPr>
+            <w:tcW w:type="dxa" w:w="3120"/>
+            <w:vAlign w:val="center"/>
+          </w:tcPr>
+          <w:p>
+            <w:r>
+              <w:t>Die Bewertung fuehrt zu Entscheidung, Budget, Prozess, Kommunikation oder Korrektur.</w:t>
+            </w:r>
+          </w:p>
+        </w:tc>
+        <w:tc>
+          <w:tcPr>
+            <w:tcW w:type="dxa" w:w="3120"/>
+            <w:vAlign w:val="center"/>
+          </w:tcPr>
+          <w:p>
+            <w:r>
+              <w:t>kein Reporting ohne Rueckkopplung</w:t>
+            </w:r>
+          </w:p>
+        </w:tc>
+      </w:tr>
+    </w:tbl>
+    <w:p/>
+    <w:p>
+      <w:pPr>
+        <w:pStyle w:val="Heading3"/>
+      </w:pPr>
+      <w:r>
+        <w:t>Abschlusskommentar 1: Lesen, pruefen, rueckkoppeln</w:t>
+      </w:r>
+    </w:p>
+    <w:p>
+      <w:r>
+        <w:t>Die folgende Verdichtung fuehrt die vorhandenen Kapitel nicht als Wiederholung, sondern als Anwendung zusammen. Wirkungskompetenz entsteht, wenn dieselbe begriffliche Strenge in Fallanalyse, Datenarbeit, Kommunikation, Governance und Entscheidungspraxis wiedererkannt wird.</w:t>
+      </w:r>
+    </w:p>
+    <w:p>
+      <w:r>
+        <w:t>Begriffliche Schaerfung. Der Abschnitt Lernziele ist in WC-V1 kein Zusatzwissen, sondern ein Pruefstein fuer die Grundfrage des Skripts: Was veraendert sich, bei wem, wodurch und mit welcher Rueckkopplung? Fuer Von KPI zu KII und der Kennzahlen-Stack wird daran sichtbar, dass praezise Sprache die erste Sicherung gegen Impact-Washing bildet. Die fachliche Grenze liegt dort, wo Lernende Output, Reichweite, Absicht und Wirkung in einem Satz vermischen. Die saubere Lesart trennt deshalb Beobachtung, Kausalannahme, Bewertung und Steuerungsfolge. In der Anwendung sollte daraus mindestens eine konkrete Indikator, Scorecard, Benchmark, Auditpfad oder Portfolioentscheidung abgeleitet werden; sonst bleibt das Wissen erklaerend, aber nicht steuerungsfaehig.</w:t>
+      </w:r>
+    </w:p>
+    <w:p>
+      <w:r>
+        <w:t>Anwendung auf Einleitung / Wirkungsfrage. In einer Fallanalyse beginnt dieser Punkt nicht mit einer Meinung, sondern mit einer belastbaren Beschreibung. Wer WC-V1 pruefungsnah liest, fragt zuerst nach Wirkungsempfaengern, Wirkraum, Zeitraum und Datenquelle. Erst danach folgt die Bewertung im Referenzrahmen Mensch, Planet, Demokratie, SDGs, Agenda 2030 und SDG+. Mindestens ein direkter und ein indirekter Wirkpfad muessen nachvollziehbar sein. Der typische Kurzschluss waere, nur die Massnahme selbst bewerten und indirekte Empfaenger ausblenden. Genau dagegen setzt die WÖk die Pflicht, Wirkungspotenzial, Wirkungsrisiko und positive Netto-Wirkung begrifflich getrennt zu halten.</w:t>
+      </w:r>
+    </w:p>
+    <w:p>
+      <w:r>
+        <w:t>Evidenzregel. Kernaussage darf im Skript nicht als dekorativer Begriff stehen bleiben. Der Abschnitt traegt nur dann, wenn er eine pruefbare Aussage erlaubt: Welche Quelle stuetzt die Annahme, welche Unsicherheit bleibt offen und welche Gegenbeobachtung wuerde die Bewertung veraendern? Fuer Von KPI zu KII und der Kennzahlen-Stack heisst das, dass jede Bewertung nur so belastbar ist wie Datenlage, Quellenstatus, Aktualitaet und Systemgrenze. Die Studierenden sollen nicht lernen, einen Score nachzusprechen. Sie sollen erkennen, wann ein Score klaert, wann er verdeckt und wann eine rote Linie die Durchschnittslogik stoppt.</w:t>
+      </w:r>
+    </w:p>
+    <w:p>
+      <w:r>
+        <w:t>Fallfenster zur Anwendung. Ein Controlling-Team moechte einen Score bilden. Das Skript verlangt, dass Datenqualitaet, Systemgrenzen, Gewichtung, Unsicherheit und Nichtkompensation sichtbar bleiben. Ein Score darf die Diskussion nicht beenden, sondern muss bessere Fragen, Priorisierung und Rueckkopplung ermoeglichen. Bezogen auf Von KPI zu KII und der Kennzahlen-Stack heisst das: Die Analyse muss das konkrete Thema ernst nehmen und zugleich den allgemeinen WÖk-Massstab halten. Es geht nicht darum, Akteure moralisch zu sortieren. Es geht darum, Wirkpfade, Wirkungsempfaenger, Datenqualitaet, Risiken und Rueckkopplung so zu beschreiben, dass bessere Entscheidungen moeglich werden.</w:t>
+      </w:r>
+    </w:p>
+    <w:p>
+      <w:r>
+        <w:t>Transfer in Impact-Controlling. Quelltext und fachliche Grundlegung verbindet die inhaltliche Deutung mit der spaeteren Praxis. Eine Organisation kann zu Von KPI zu KII und der Kennzahlen-Stack sehr ueberzeugend kommunizieren und trotzdem an Zahlen als Beweis zu behandeln, obwohl Systemgrenze, Datenqualitaet, Unsicherheit oder Nichtkompensation ungeklaert sind scheitern. Darum muss die V1-Fassung immer auch nach Governance fragen: Wer erhebt Daten, wer bewertet sie, wer traegt die Folgen, wer kann widersprechen und wann wird eine Entscheidung korrigiert? Profile, Zielkonflikte und offene Punkte werden nebeneinander gefuehrt. So wird aus einem Lehrkapitel eine verantwortbare Arbeitsroutine.</w:t>
+      </w:r>
+    </w:p>
+    <w:p>
+      <w:r>
+        <w:t>Grenze gegen Scheingenauigkeit. Gerade bei Einstieg / Wirkungsfrage ist Praezision wichtiger als grosse Begriffe. Eine Wirkungsaussage bleibt schwach, wenn sie nur Aktivitaet, Reichweite, Absicht oder Image beschreibt. Stark wird sie erst, wenn sie die Zustandsveraenderung und ihre Bedingungen offenlegt. In WC-V1 ist deshalb entscheidend, schwere zentrale Schaeden nicht durch beliebige positive Einzelwerte neutralisiert werden duerfen. Die Fehlerlinie verlaeuft nicht zwischen Optimismus und Pessimismus, sondern zwischen offengelegter Unsicherheit und rhetorischer Sicherheit ohne Pruefpfad.</w:t>
+      </w:r>
+    </w:p>
+    <w:p>
+      <w:r>
+        <w:t>Pruefungsnahe Transferfrage. Formuliere zu WC-V1 eine Wirkungsaussage in drei Saetzen: Erstens den beobachteten oder plausiblen Zustand, zweitens die Daten- oder Quellenlage, drittens die offene Unsicherheit samt Rueckkopplung. Die Antwort muss ohne moralische Personenbewertung auskommen und darf Reichweite nicht mit Wirkung verwechseln.</w:t>
+      </w:r>
+    </w:p>
+    <w:p>
+      <w:r>
+        <w:t>Pruefungsnahe Lesart. Aus Video-/Audio-Vorlesung laesst sich eine gute Transferfrage ableiten: Welche Entscheidung waere falsch, wenn dieser Abschnitt missverstanden wird? Fuer Von KPI zu KII und der Kennzahlen-Stack lautet die Antwort meist nicht einfach "mehr Wirkung", sondern genauer: bessere Unterscheidung, sauberere Daten, klarere Schutzlinie und rueckgekoppelte Steuerung. Jeder Analyseblock fragt nach der Routine, die nach der Bewertung angepasst wird. Wer das im Fall anwenden kann, hat den Kern der Vorlesung verstanden; wer nur Definitionen wiederholt, bleibt unter dem Anspruch der Akademie.</w:t>
+      </w:r>
+    </w:p>
+    <w:p>
+      <w:r>
+        <w:t>Fallfenster zur Anwendung. Ein Kommunikationsbericht nennt viele Aktivitaeten, Reichweiten und Rueckmeldungen. Die V1-Pruefung fragt, ob daraus eine belastbare Wirkungsaussage folgt. Wenn nur Kontakte, Klicks oder Zustimmung vorliegen, bleibt die Aussage im Bereich Wirkungspotenzial oder Resonanz, nicht im Bereich nachgewiesener Wirkung. Bezogen auf Von KPI zu KII und der Kennzahlen-Stack heisst das: Die Analyse muss das konkrete Thema ernst nehmen und zugleich den allgemeinen WÖk-Massstab halten. Es geht nicht darum, Akteure moralisch zu sortieren. Es geht darum, Wirkpfade, Wirkungsempfaenger, Datenqualitaet, Risiken und Rueckkopplung so zu beschreiben, dass bessere Entscheidungen moeglich werden.</w:t>
+      </w:r>
+    </w:p>
+    <w:p>
+      <w:r>
+        <w:t>Governance. Der Abschnitt Transkript (Gerüst) ist in WC-V1 kein Zusatzwissen, sondern ein Pruefstein fuer die Grundfrage des Skripts: Was veraendert sich, bei wem, wodurch und mit welcher Rueckkopplung? Fuer Von KPI zu KII und der Kennzahlen-Stack wird daran sichtbar, dass Wirkungsbewertung Verfahren, Rechte, Transparenz und Korrektur braucht. Die fachliche Grenze liegt dort, wo Lernende Bewertung als technokratische Top-down-Setzung verstehen. Die saubere Lesart trennt deshalb Beobachtung, Kausalannahme, Bewertung und Steuerungsfolge. In der Anwendung sollte daraus mindestens eine konkrete Indikator, Scorecard, Benchmark, Auditpfad oder Portfolioentscheidung abgeleitet werden; sonst bleibt das Wissen erklaerend, aber nicht steuerungsfaehig.</w:t>
+      </w:r>
+    </w:p>
+    <w:p>
+      <w:r>
+        <w:t>Anwendung auf Skript / Folien (Lernseite). In einer Fallanalyse beginnt dieser Punkt nicht mit einer Meinung, sondern mit einer belastbaren Beschreibung. Wer WC-V1 pruefungsnah liest, fragt zuerst nach Wirkungsempfaengern, Wirkraum, Zeitraum und Datenquelle. Erst danach folgt die Bewertung im Referenzrahmen Mensch, Planet, Demokratie, SDGs, Agenda 2030 und SDG+. Pruefungsfragen verbinden Begriff, Anwendung, Evidenz und rote Linie. Der typische Kurzschluss waere, reines Auswendiglernen als Kompetenznachweis behandeln. Genau dagegen setzt die WÖk die Pflicht, Wirkungspotenzial, Wirkungsrisiko und positive Netto-Wirkung begrifflich getrennt zu halten.</w:t>
+      </w:r>
+    </w:p>
+    <w:p>
+      <w:r>
+        <w:t>Evidenzregel. Transferaufgabe darf im Skript nicht als dekorativer Begriff stehen bleiben. Der Abschnitt traegt nur dann, wenn er eine pruefbare Aussage erlaubt: Welche Quelle stuetzt die Annahme, welche Unsicherheit bleibt offen und welche Gegenbeobachtung wuerde die Bewertung veraendern? Fuer Von KPI zu KII und der Kennzahlen-Stack heisst das, dass WÖk-Begriffe im Alltag nur tragen, wenn sie in Routinen uebersetzt werden. Die Studierenden sollen nicht lernen, einen Score nachzusprechen. Sie sollen erkennen, wann ein Score klaert, wann er verdeckt und wann eine rote Linie die Durchschnittslogik stoppt.</w:t>
+      </w:r>
+    </w:p>
+    <w:p>
+      <w:r>
+        <w:t>Fallfenster zur Anwendung. Eine Organisation plant eine Massnahme und formuliert dazu eine positive Absicht. In der WÖk reicht das nicht. Fuer diese Vorlesung muss sichtbar werden, welche Zustandsveraenderung erwartet wird, welche Empfaenger direkt oder indirekt betroffen sind, welche Nebenwirkungen entstehen koennen und welche Entscheidung spaeter korrigiert wird. Bezogen auf Von KPI zu KII und der Kennzahlen-Stack heisst das: Die Analyse muss das konkrete Thema ernst nehmen und zugleich den allgemeinen WÖk-Massstab halten. Es geht nicht darum, Akteure moralisch zu sortieren. Es geht darum, Wirkpfade, Wirkungsempfaenger, Datenqualitaet, Risiken und Rueckkopplung so zu beschreiben, dass bessere Entscheidungen moeglich werden.</w:t>
+      </w:r>
+    </w:p>
+    <w:p>
+      <w:r>
+        <w:t>Transfer in Impact-Controlling. Praxisbeispiel verbindet die inhaltliche Deutung mit der spaeteren Praxis. Eine Organisation kann zu Von KPI zu KII und der Kennzahlen-Stack sehr ueberzeugend kommunizieren und trotzdem an Zahlen als Beweis zu behandeln, obwohl Systemgrenze, Datenqualitaet, Unsicherheit oder Nichtkompensation ungeklaert sind scheitern. Darum muss die V1-Fassung immer auch nach Governance fragen: Wer erhebt Daten, wer bewertet sie, wer traegt die Folgen, wer kann widersprechen und wann wird eine Entscheidung korrigiert? Gute Kommunikation unterscheidet Befund, Annahme und normative Bewertung. So wird aus einem Lehrkapitel eine verantwortbare Arbeitsroutine.</w:t>
+      </w:r>
+    </w:p>
+    <w:p>
+      <w:r>
+        <w:t>Pruefungsnahe Transferfrage. Formuliere zu WC-V1 eine Wirkungsaussage in drei Saetzen: Erstens den beobachteten oder plausiblen Zustand, zweitens die Daten- oder Quellenlage, drittens die offene Unsicherheit samt Rueckkopplung. Die Antwort muss ohne moralische Personenbewertung auskommen und darf Reichweite nicht mit Wirkung verwechseln.</w:t>
+      </w:r>
+    </w:p>
+    <w:p>
+      <w:r>
+        <w:t>Grenze gegen Scheingenauigkeit. Gerade bei Wirkungsökonomische Vertiefung ist Praezision wichtiger als grosse Begriffe. Eine Wirkungsaussage bleibt schwach, wenn sie nur Aktivitaet, Reichweite, Absicht oder Image beschreibt. Stark wird sie erst, wenn sie die Zustandsveraenderung und ihre Bedingungen offenlegt. In WC-V1 ist deshalb entscheidend, jede Wirkungsaussage eine Grenze zieht und diese Grenze begruenden muss. Die Fehlerlinie verlaeuft nicht zwischen Optimismus und Pessimismus, sondern zwischen offengelegter Unsicherheit und rhetorischer Sicherheit ohne Pruefpfad.</w:t>
+      </w:r>
+    </w:p>
+    <w:p>
+      <w:r>
+        <w:t>Pruefungsnahe Lesart. Aus Prüfungsrelevanz laesst sich eine gute Transferfrage ableiten: Welche Entscheidung waere falsch, wenn dieser Abschnitt missverstanden wird? Fuer Von KPI zu KII und der Kennzahlen-Stack lautet die Antwort meist nicht einfach "mehr Wirkung", sondern genauer: bessere Unterscheidung, sauberere Daten, klarere Schutzlinie und rueckgekoppelte Steuerung. Szenarien pruefen Sofortwirkung, Folgewirkung und Reversibilitaet getrennt. Wer das im Fall anwenden kann, hat den Kern der Vorlesung verstanden; wer nur Definitionen wiederholt, bleibt unter dem Anspruch der Akademie.</w:t>
+      </w:r>
+    </w:p>
+    <w:p>
+      <w:r>
+        <w:t>Fallfenster zur Anwendung. Eine Fuehrungsentscheidung erzeugt zugleich Nutzen und Risiken. Die WÖk behandelt Ambivalenz nicht als Stoerung, sondern als Kern der Analyse. Positive Netto-Wirkung darf erst behauptet werden, wenn zentrale negative Wirkungen getrennt geprueft und rote Linien gewahrt sind. Bezogen auf Von KPI zu KII und der Kennzahlen-Stack heisst das: Die Analyse muss das konkrete Thema ernst nehmen und zugleich den allgemeinen WÖk-Massstab halten. Es geht nicht darum, Akteure moralisch zu sortieren. Es geht darum, Wirkpfade, Wirkungsempfaenger, Datenqualitaet, Risiken und Rueckkopplung so zu beschreiben, dass bessere Entscheidungen moeglich werden.</w:t>
+      </w:r>
+    </w:p>
+    <w:p>
+      <w:r>
+        <w:t>Betroffenenperspektive. Der Abschnitt Lernziele ist in WC-V1 kein Zusatzwissen, sondern ein Pruefstein fuer die Grundfrage des Skripts: Was veraendert sich, bei wem, wodurch und mit welcher Rueckkopplung? Fuer Von KPI zu KII und der Kennzahlen-Stack wird daran sichtbar, dass Wirkung nicht am Sender, sondern an veraenderten Zustanden der Empfaenger geprueft wird. Die fachliche Grenze liegt dort, wo Lernende interne Erfolgskennzahlen mit gesellschaftlicher Wirkung verwechseln. Die saubere Lesart trennt deshalb Beobachtung, Kausalannahme, Bewertung und Steuerungsfolge. In der Anwendung sollte daraus mindestens eine konkrete Indikator, Scorecard, Benchmark, Auditpfad oder Portfolioentscheidung abgeleitet werden; sonst bleibt das Wissen erklaerend, aber nicht steuerungsfaehig.</w:t>
+      </w:r>
+    </w:p>
+    <w:p>
+      <w:r>
+        <w:t>Anwendung auf Einleitung / Wirkungsfrage. In einer Fallanalyse beginnt dieser Punkt nicht mit einer Meinung, sondern mit einer belastbaren Beschreibung. Wer WC-V1 pruefungsnah liest, fragt zuerst nach Wirkungsempfaengern, Wirkraum, Zeitraum und Datenquelle. Erst danach folgt die Bewertung im Referenzrahmen Mensch, Planet, Demokratie, SDGs, Agenda 2030 und SDG+. Jede Schlussfolgerung endet mit Entscheidung, Verantwortlichkeit und Termin fuer Rueckpruefung. Der typische Kurzschluss waere, Befunde sammeln, ohne Ressourcen oder Regeln zu veraendern. Genau dagegen setzt die WÖk die Pflicht, Wirkungspotenzial, Wirkungsrisiko und positive Netto-Wirkung begrifflich getrennt zu halten.</w:t>
+      </w:r>
+    </w:p>
+    <w:p>
+      <w:r>
+        <w:t>Evidenzregel. Kernaussage darf im Skript nicht als dekorativer Begriff stehen bleiben. Der Abschnitt traegt nur dann, wenn er eine pruefbare Aussage erlaubt: Welche Quelle stuetzt die Annahme, welche Unsicherheit bleibt offen und welche Gegenbeobachtung wuerde die Bewertung veraendern? Fuer Von KPI zu KII und der Kennzahlen-Stack heisst das, dass WÖk-Aussagen mit bestehenden Begriffen, Studien, Standards und Rechtsrahmen in Beziehung stehen muessen. Die Studierenden sollen nicht lernen, einen Score nachzusprechen. Sie sollen erkennen, wann ein Score klaert, wann er verdeckt und wann eine rote Linie die Durchschnittslogik stoppt.</w:t>
+      </w:r>
+    </w:p>
+    <w:p>
+      <w:r>
+        <w:t>Fallfenster zur Anwendung. Ein Controlling-Team moechte einen Score bilden. Das Skript verlangt, dass Datenqualitaet, Systemgrenzen, Gewichtung, Unsicherheit und Nichtkompensation sichtbar bleiben. Ein Score darf die Diskussion nicht beenden, sondern muss bessere Fragen, Priorisierung und Rueckkopplung ermoeglichen. Bezogen auf Von KPI zu KII und der Kennzahlen-Stack heisst das: Die Analyse muss das konkrete Thema ernst nehmen und zugleich den allgemeinen WÖk-Massstab halten. Es geht nicht darum, Akteure moralisch zu sortieren. Es geht darum, Wirkpfade, Wirkungsempfaenger, Datenqualitaet, Risiken und Rueckkopplung so zu beschreiben, dass bessere Entscheidungen moeglich werden.</w:t>
+      </w:r>
+    </w:p>
+    <w:p>
+      <w:r>
+        <w:t>Pruefungsnahe Transferfrage. Formuliere zu WC-V1 eine Wirkungsaussage in drei Saetzen: Erstens den beobachteten oder plausiblen Zustand, zweitens die Daten- oder Quellenlage, drittens die offene Unsicherheit samt Rueckkopplung. Die Antwort muss ohne moralische Personenbewertung auskommen und darf Reichweite nicht mit Wirkung verwechseln.</w:t>
+      </w:r>
+    </w:p>
+    <w:p>
+      <w:r>
+        <w:t>Transfer in Impact-Controlling. Quelltext und fachliche Grundlegung verbindet die inhaltliche Deutung mit der spaeteren Praxis. Eine Organisation kann zu Von KPI zu KII und der Kennzahlen-Stack sehr ueberzeugend kommunizieren und trotzdem an Zahlen als Beweis zu behandeln, obwohl Systemgrenze, Datenqualitaet, Unsicherheit oder Nichtkompensation ungeklaert sind scheitern. Darum muss die V1-Fassung immer auch nach Governance fragen: Wer erhebt Daten, wer bewertet sie, wer traegt die Folgen, wer kann widersprechen und wann wird eine Entscheidung korrigiert? Die Analyse markiert Stoppsignale vor jeder Portfolio- oder Score-Debatte. So wird aus einem Lehrkapitel eine verantwortbare Arbeitsroutine.</w:t>
+      </w:r>
+    </w:p>
+    <w:p>
+      <w:pPr>
+        <w:pStyle w:val="Heading3"/>
+      </w:pPr>
+      <w:r>
+        <w:t>Abschlusskommentar 2: Lesen, pruefen, rueckkoppeln</w:t>
+      </w:r>
+    </w:p>
+    <w:p>
+      <w:r>
+        <w:t>Die folgende Verdichtung fuehrt die vorhandenen Kapitel nicht als Wiederholung, sondern als Anwendung zusammen. Wirkungskompetenz entsteht, wenn dieselbe begriffliche Strenge in Fallanalyse, Datenarbeit, Kommunikation, Governance und Entscheidungspraxis wiedererkannt wird.</w:t>
+      </w:r>
+    </w:p>
+    <w:p>
+      <w:r>
+        <w:t>Grenze gegen Scheingenauigkeit. Gerade bei Einstieg / Wirkungsfrage ist Praezision wichtiger als grosse Begriffe. Eine Wirkungsaussage bleibt schwach, wenn sie nur Aktivitaet, Reichweite, Absicht oder Image beschreibt. Stark wird sie erst, wenn sie die Zustandsveraenderung und ihre Bedingungen offenlegt. In WC-V1 ist deshalb entscheidend, praezise Sprache die erste Sicherung gegen Impact-Washing bildet. Die Fehlerlinie verlaeuft nicht zwischen Optimismus und Pessimismus, sondern zwischen offengelegter Unsicherheit und rhetorischer Sicherheit ohne Pruefpfad.</w:t>
+      </w:r>
+    </w:p>
+    <w:p>
+      <w:r>
+        <w:t>Pruefungsnahe Lesart. Aus Video-/Audio-Vorlesung laesst sich eine gute Transferfrage ableiten: Welche Entscheidung waere falsch, wenn dieser Abschnitt missverstanden wird? Fuer Von KPI zu KII und der Kennzahlen-Stack lautet die Antwort meist nicht einfach "mehr Wirkung", sondern genauer: bessere Unterscheidung, sauberere Daten, klarere Schutzlinie und rueckgekoppelte Steuerung. Mindestens ein direkter und ein indirekter Wirkpfad muessen nachvollziehbar sein. Wer das im Fall anwenden kann, hat den Kern der Vorlesung verstanden; wer nur Definitionen wiederholt, bleibt unter dem Anspruch der Akademie.</w:t>
+      </w:r>
+    </w:p>
+    <w:p>
+      <w:r>
+        <w:t>Fallfenster zur Anwendung. Ein Kommunikationsbericht nennt viele Aktivitaeten, Reichweiten und Rueckmeldungen. Die V1-Pruefung fragt, ob daraus eine belastbare Wirkungsaussage folgt. Wenn nur Kontakte, Klicks oder Zustimmung vorliegen, bleibt die Aussage im Bereich Wirkungspotenzial oder Resonanz, nicht im Bereich nachgewiesener Wirkung. Bezogen auf Von KPI zu KII und der Kennzahlen-Stack heisst das: Die Analyse muss das konkrete Thema ernst nehmen und zugleich den allgemeinen WÖk-Massstab halten. Es geht nicht darum, Akteure moralisch zu sortieren. Es geht darum, Wirkpfade, Wirkungsempfaenger, Datenqualitaet, Risiken und Rueckkopplung so zu beschreiben, dass bessere Entscheidungen moeglich werden.</w:t>
+      </w:r>
+    </w:p>
+    <w:p>
+      <w:r>
+        <w:t>Daten- und Quellenklarheit. Der Abschnitt Transkript (Gerüst) ist in WC-V1 kein Zusatzwissen, sondern ein Pruefstein fuer die Grundfrage des Skripts: Was veraendert sich, bei wem, wodurch und mit welcher Rueckkopplung? Fuer Von KPI zu KII und der Kennzahlen-Stack wird daran sichtbar, dass jede Bewertung nur so belastbar ist wie Datenlage, Quellenstatus, Aktualitaet und Systemgrenze. Die fachliche Grenze liegt dort, wo Lernende eine Zahl ohne Einheit, Zeitraum oder Erhebungslogik als Beweis nutzen. Die saubere Lesart trennt deshalb Beobachtung, Kausalannahme, Bewertung und Steuerungsfolge. In der Anwendung sollte daraus mindestens eine konkrete Indikator, Scorecard, Benchmark, Auditpfad oder Portfolioentscheidung abgeleitet werden; sonst bleibt das Wissen erklaerend, aber nicht steuerungsfaehig.</w:t>
+      </w:r>
+    </w:p>
+    <w:p>
+      <w:r>
+        <w:t>Anwendung auf Skript / Folien (Lernseite). In einer Fallanalyse beginnt dieser Punkt nicht mit einer Meinung, sondern mit einer belastbaren Beschreibung. Wer WC-V1 pruefungsnah liest, fragt zuerst nach Wirkungsempfaengern, Wirkraum, Zeitraum und Datenquelle. Erst danach folgt die Bewertung im Referenzrahmen Mensch, Planet, Demokratie, SDGs, Agenda 2030 und SDG+. Profile, Zielkonflikte und offene Punkte werden nebeneinander gefuehrt. Der typische Kurzschluss waere, ambivalente Befunde glaetten, damit eine eindeutige Botschaft entsteht. Genau dagegen setzt die WÖk die Pflicht, Wirkungspotenzial, Wirkungsrisiko und positive Netto-Wirkung begrifflich getrennt zu halten.</w:t>
+      </w:r>
+    </w:p>
+    <w:p>
+      <w:r>
+        <w:t>Pruefungsnahe Transferfrage. Formuliere zu WC-V1 eine Wirkungsaussage in drei Saetzen: Erstens den beobachteten oder plausiblen Zustand, zweitens die Daten- oder Quellenlage, drittens die offene Unsicherheit samt Rueckkopplung. Die Antwort muss ohne moralische Personenbewertung auskommen und darf Reichweite nicht mit Wirkung verwechseln.</w:t>
+      </w:r>
+    </w:p>
+    <w:p>
+      <w:r>
+        <w:t>Evidenzregel. Transferaufgabe darf im Skript nicht als dekorativer Begriff stehen bleiben. Der Abschnitt traegt nur dann, wenn er eine pruefbare Aussage erlaubt: Welche Quelle stuetzt die Annahme, welche Unsicherheit bleibt offen und welche Gegenbeobachtung wuerde die Bewertung veraendern? Fuer Von KPI zu KII und der Kennzahlen-Stack heisst das, dass schwere zentrale Schaeden nicht durch beliebige positive Einzelwerte neutralisiert werden duerfen. Die Studierenden sollen nicht lernen, einen Score nachzusprechen. Sie sollen erkennen, wann ein Score klaert, wann er verdeckt und wann eine rote Linie die Durchschnittslogik stoppt.</w:t>
+      </w:r>
+    </w:p>
+    <w:p>
+      <w:r>
+        <w:t>Fallfenster zur Anwendung. Eine Organisation plant eine Massnahme und formuliert dazu eine positive Absicht. In der WÖk reicht das nicht. Fuer diese Vorlesung muss sichtbar werden, welche Zustandsveraenderung erwartet wird, welche Empfaenger direkt oder indirekt betroffen sind, welche Nebenwirkungen entstehen koennen und welche Entscheidung spaeter korrigiert wird. Bezogen auf Von KPI zu KII und der Kennzahlen-Stack heisst das: Die Analyse muss das konkrete Thema ernst nehmen und zugleich den allgemeinen WÖk-Massstab halten. Es geht nicht darum, Akteure moralisch zu sortieren. Es geht darum, Wirkpfade, Wirkungsempfaenger, Datenqualitaet, Risiken und Rueckkopplung so zu beschreiben, dass bessere Entscheidungen moeglich werden.</w:t>
+      </w:r>
+    </w:p>
+    <w:p>
+      <w:r>
+        <w:t>Transfer in Impact-Controlling. Praxisbeispiel verbindet die inhaltliche Deutung mit der spaeteren Praxis. Eine Organisation kann zu Von KPI zu KII und der Kennzahlen-Stack sehr ueberzeugend kommunizieren und trotzdem an Zahlen als Beweis zu behandeln, obwohl Systemgrenze, Datenqualitaet, Unsicherheit oder Nichtkompensation ungeklaert sind scheitern. Darum muss die V1-Fassung immer auch nach Governance fragen: Wer erhebt Daten, wer bewertet sie, wer traegt die Folgen, wer kann widersprechen und wann wird eine Entscheidung korrigiert? Jeder Analyseblock fragt nach der Routine, die nach der Bewertung angepasst wird. So wird aus einem Lehrkapitel eine verantwortbare Arbeitsroutine.</w:t>
+      </w:r>
+    </w:p>
+    <w:p>
+      <w:r>
+        <w:t>Grenze gegen Scheingenauigkeit. Gerade bei Wirkungsökonomische Vertiefung ist Praezision wichtiger als grosse Begriffe. Eine Wirkungsaussage bleibt schwach, wenn sie nur Aktivitaet, Reichweite, Absicht oder Image beschreibt. Stark wird sie erst, wenn sie die Zustandsveraenderung und ihre Bedingungen offenlegt. In WC-V1 ist deshalb entscheidend, Wirkungsbewertung Verfahren, Rechte, Transparenz und Korrektur braucht. Die Fehlerlinie verlaeuft nicht zwischen Optimismus und Pessimismus, sondern zwischen offengelegter Unsicherheit und rhetorischer Sicherheit ohne Pruefpfad.</w:t>
+      </w:r>
+    </w:p>
+    <w:p>
+      <w:r>
+        <w:t>Pruefungsnahe Lesart. Aus Prüfungsrelevanz laesst sich eine gute Transferfrage ableiten: Welche Entscheidung waere falsch, wenn dieser Abschnitt missverstanden wird? Fuer Von KPI zu KII und der Kennzahlen-Stack lautet die Antwort meist nicht einfach "mehr Wirkung", sondern genauer: bessere Unterscheidung, sauberere Daten, klarere Schutzlinie und rueckgekoppelte Steuerung. Pruefungsfragen verbinden Begriff, Anwendung, Evidenz und rote Linie. Wer das im Fall anwenden kann, hat den Kern der Vorlesung verstanden; wer nur Definitionen wiederholt, bleibt unter dem Anspruch der Akademie.</w:t>
+      </w:r>
+    </w:p>
+    <w:p>
+      <w:r>
+        <w:t>Fallfenster zur Anwendung. Eine Fuehrungsentscheidung erzeugt zugleich Nutzen und Risiken. Die WÖk behandelt Ambivalenz nicht als Stoerung, sondern als Kern der Analyse. Positive Netto-Wirkung darf erst behauptet werden, wenn zentrale negative Wirkungen getrennt geprueft und rote Linien gewahrt sind. Bezogen auf Von KPI zu KII und der Kennzahlen-Stack heisst das: Die Analyse muss das konkrete Thema ernst nehmen und zugleich den allgemeinen WÖk-Massstab halten. Es geht nicht darum, Akteure moralisch zu sortieren. Es geht darum, Wirkpfade, Wirkungsempfaenger, Datenqualitaet, Risiken und Rueckkopplung so zu beschreiben, dass bessere Entscheidungen moeglich werden.</w:t>
+      </w:r>
+    </w:p>
+    <w:p>
+      <w:r>
+        <w:t>Organisationale Umsetzung. Der Abschnitt Lernziele ist in WC-V1 kein Zusatzwissen, sondern ein Pruefstein fuer die Grundfrage des Skripts: Was veraendert sich, bei wem, wodurch und mit welcher Rueckkopplung? Fuer Von KPI zu KII und der Kennzahlen-Stack wird daran sichtbar, dass WÖk-Begriffe im Alltag nur tragen, wenn sie in Routinen uebersetzt werden. Die fachliche Grenze liegt dort, wo Lernende Verantwortung an eine einzelne Nachhaltigkeitsfunktion auslagern. Die saubere Lesart trennt deshalb Beobachtung, Kausalannahme, Bewertung und Steuerungsfolge. In der Anwendung sollte daraus mindestens eine konkrete Indikator, Scorecard, Benchmark, Auditpfad oder Portfolioentscheidung abgeleitet werden; sonst bleibt das Wissen erklaerend, aber nicht steuerungsfaehig.</w:t>
+      </w:r>
+    </w:p>
+    <w:p>
+      <w:r>
+        <w:t>Pruefungsnahe Transferfrage. Formuliere zu WC-V1 eine Wirkungsaussage in drei Saetzen: Erstens den beobachteten oder plausiblen Zustand, zweitens die Daten- oder Quellenlage, drittens die offene Unsicherheit samt Rueckkopplung. Die Antwort muss ohne moralische Personenbewertung auskommen und darf Reichweite nicht mit Wirkung verwechseln.</w:t>
+      </w:r>
+    </w:p>
+    <w:p>
+      <w:r>
+        <w:t>Anwendung auf Einleitung / Wirkungsfrage. In einer Fallanalyse beginnt dieser Punkt nicht mit einer Meinung, sondern mit einer belastbaren Beschreibung. Wer WC-V1 pruefungsnah liest, fragt zuerst nach Wirkungsempfaengern, Wirkraum, Zeitraum und Datenquelle. Erst danach folgt die Bewertung im Referenzrahmen Mensch, Planet, Demokratie, SDGs, Agenda 2030 und SDG+. Gute Kommunikation unterscheidet Befund, Annahme und normative Bewertung. Der typische Kurzschluss waere, Eindeutigkeit behaupten, wo die Datenlage nur Potenzial oder Risiko traegt. Genau dagegen setzt die WÖk die Pflicht, Wirkungspotenzial, Wirkungsrisiko und positive Netto-Wirkung begrifflich getrennt zu halten.</w:t>
+      </w:r>
+    </w:p>
+    <w:p>
+      <w:r>
+        <w:t>Evidenzregel. Kernaussage darf im Skript nicht als dekorativer Begriff stehen bleiben. Der Abschnitt traegt nur dann, wenn er eine pruefbare Aussage erlaubt: Welche Quelle stuetzt die Annahme, welche Unsicherheit bleibt offen und welche Gegenbeobachtung wuerde die Bewertung veraendern? Fuer Von KPI zu KII und der Kennzahlen-Stack heisst das, dass jede Wirkungsaussage eine Grenze zieht und diese Grenze begruenden muss. Die Studierenden sollen nicht lernen, einen Score nachzusprechen. Sie sollen erkennen, wann ein Score klaert, wann er verdeckt und wann eine rote Linie die Durchschnittslogik stoppt.</w:t>
+      </w:r>
+    </w:p>
+    <w:p>
+      <w:r>
+        <w:t>Fallfenster zur Anwendung. Ein Controlling-Team moechte einen Score bilden. Das Skript verlangt, dass Datenqualitaet, Systemgrenzen, Gewichtung, Unsicherheit und Nichtkompensation sichtbar bleiben. Ein Score darf die Diskussion nicht beenden, sondern muss bessere Fragen, Priorisierung und Rueckkopplung ermoeglichen. Bezogen auf Von KPI zu KII und der Kennzahlen-Stack heisst das: Die Analyse muss das konkrete Thema ernst nehmen und zugleich den allgemeinen WÖk-Massstab halten. Es geht nicht darum, Akteure moralisch zu sortieren. Es geht darum, Wirkpfade, Wirkungsempfaenger, Datenqualitaet, Risiken und Rueckkopplung so zu beschreiben, dass bessere Entscheidungen moeglich werden.</w:t>
+      </w:r>
+    </w:p>
+    <w:p>
+      <w:r>
+        <w:t>Transfer in Impact-Controlling. Quelltext und fachliche Grundlegung verbindet die inhaltliche Deutung mit der spaeteren Praxis. Eine Organisation kann zu Von KPI zu KII und der Kennzahlen-Stack sehr ueberzeugend kommunizieren und trotzdem an Zahlen als Beweis zu behandeln, obwohl Systemgrenze, Datenqualitaet, Unsicherheit oder Nichtkompensation ungeklaert sind scheitern. Darum muss die V1-Fassung immer auch nach Governance fragen: Wer erhebt Daten, wer bewertet sie, wer traegt die Folgen, wer kann widersprechen und wann wird eine Entscheidung korrigiert? Szenarien pruefen Sofortwirkung, Folgewirkung und Reversibilitaet getrennt. So wird aus einem Lehrkapitel eine verantwortbare Arbeitsroutine.</w:t>
+      </w:r>
+    </w:p>
+    <w:p>
+      <w:r>
+        <w:t>Grenze gegen Scheingenauigkeit. Gerade bei Einstieg / Wirkungsfrage ist Praezision wichtiger als grosse Begriffe. Eine Wirkungsaussage bleibt schwach, wenn sie nur Aktivitaet, Reichweite, Absicht oder Image beschreibt. Stark wird sie erst, wenn sie die Zustandsveraenderung und ihre Bedingungen offenlegt. In WC-V1 ist deshalb entscheidend, Wirkung nicht am Sender, sondern an veraenderten Zustanden der Empfaenger geprueft wird. Die Fehlerlinie verlaeuft nicht zwischen Optimismus und Pessimismus, sondern zwischen offengelegter Unsicherheit und rhetorischer Sicherheit ohne Pruefpfad.</w:t>
+      </w:r>
+    </w:p>
+    <w:p>
+      <w:r>
+        <w:t>Pruefungsnahe Lesart. Aus Video-/Audio-Vorlesung laesst sich eine gute Transferfrage ableiten: Welche Entscheidung waere falsch, wenn dieser Abschnitt missverstanden wird? Fuer Von KPI zu KII und der Kennzahlen-Stack lautet die Antwort meist nicht einfach "mehr Wirkung", sondern genauer: bessere Unterscheidung, sauberere Daten, klarere Schutzlinie und rueckgekoppelte Steuerung. Jede Schlussfolgerung endet mit Entscheidung, Verantwortlichkeit und Termin fuer Rueckpruefung. Wer das im Fall anwenden kann, hat den Kern der Vorlesung verstanden; wer nur Definitionen wiederholt, bleibt unter dem Anspruch der Akademie.</w:t>
+      </w:r>
+    </w:p>
+    <w:p>
+      <w:r>
+        <w:t>Fallfenster zur Anwendung. Ein Kommunikationsbericht nennt viele Aktivitaeten, Reichweiten und Rueckmeldungen. Die V1-Pruefung fragt, ob daraus eine belastbare Wirkungsaussage folgt. Wenn nur Kontakte, Klicks oder Zustimmung vorliegen, bleibt die Aussage im Bereich Wirkungspotenzial oder Resonanz, nicht im Bereich nachgewiesener Wirkung. Bezogen auf Von KPI zu KII und der Kennzahlen-Stack heisst das: Die Analyse muss das konkrete Thema ernst nehmen und zugleich den allgemeinen WÖk-Massstab halten. Es geht nicht darum, Akteure moralisch zu sortieren. Es geht darum, Wirkpfade, Wirkungsempfaenger, Datenqualitaet, Risiken und Rueckkopplung so zu beschreiben, dass bessere Entscheidungen moeglich werden.</w:t>
+      </w:r>
+    </w:p>
+    <w:p>
+      <w:r>
+        <w:t>Pruefungsnahe Transferfrage. Formuliere zu WC-V1 eine Wirkungsaussage in drei Saetzen: Erstens den beobachteten oder plausiblen Zustand, zweitens die Daten- oder Quellenlage, drittens die offene Unsicherheit samt Rueckkopplung. Die Antwort muss ohne moralische Personenbewertung auskommen und darf Reichweite nicht mit Wirkung verwechseln.</w:t>
+      </w:r>
+    </w:p>
+    <w:p>
+      <w:r>
+        <w:t>Wissenschaftliche Anschlussfaehigkeit. Der Abschnitt Transkript (Gerüst) ist in WC-V1 kein Zusatzwissen, sondern ein Pruefstein fuer die Grundfrage des Skripts: Was veraendert sich, bei wem, wodurch und mit welcher Rueckkopplung? Fuer Von KPI zu KII und der Kennzahlen-Stack wird daran sichtbar, dass WÖk-Aussagen mit bestehenden Begriffen, Studien, Standards und Rechtsrahmen in Beziehung stehen muessen. Die fachliche Grenze liegt dort, wo Lernende hausinterne Sprache als Ersatz fuer zitierfaehige Begruendung verwenden. Die saubere Lesart trennt deshalb Beobachtung, Kausalannahme, Bewertung und Steuerungsfolge. In der Anwendung sollte daraus mindestens eine konkrete Indikator, Scorecard, Benchmark, Auditpfad oder Portfolioentscheidung abgeleitet werden; sonst bleibt das Wissen erklaerend, aber nicht steuerungsfaehig.</w:t>
+      </w:r>
+    </w:p>
+    <w:p>
+      <w:r>
+        <w:t>Anwendung auf Skript / Folien (Lernseite). In einer Fallanalyse beginnt dieser Punkt nicht mit einer Meinung, sondern mit einer belastbaren Beschreibung. Wer WC-V1 pruefungsnah liest, fragt zuerst nach Wirkungsempfaengern, Wirkraum, Zeitraum und Datenquelle. Erst danach folgt die Bewertung im Referenzrahmen Mensch, Planet, Demokratie, SDGs, Agenda 2030 und SDG+. Die Analyse markiert Stoppsignale vor jeder Portfolio- oder Score-Debatte. Der typische Kurzschluss waere, ein gutes Teilresultat gegen zentrale Schaeden aufrechnen. Genau dagegen setzt die WÖk die Pflicht, Wirkungspotenzial, Wirkungsrisiko und positive Netto-Wirkung begrifflich getrennt zu halten.</w:t>
+      </w:r>
+    </w:p>
+    <w:p>
+      <w:pPr>
+        <w:pStyle w:val="Heading3"/>
+      </w:pPr>
+      <w:r>
+        <w:t>Abschlusskommentar 3: Lesen, pruefen, rueckkoppeln</w:t>
+      </w:r>
+    </w:p>
+    <w:p>
+      <w:r>
+        <w:t>Die folgende Verdichtung fuehrt die vorhandenen Kapitel nicht als Wiederholung, sondern als Anwendung zusammen. Wirkungskompetenz entsteht, wenn dieselbe begriffliche Strenge in Fallanalyse, Datenarbeit, Kommunikation, Governance und Entscheidungspraxis wiedererkannt wird.</w:t>
+      </w:r>
+    </w:p>
+    <w:p>
+      <w:r>
+        <w:t>Evidenzregel. Transferaufgabe darf im Skript nicht als dekorativer Begriff stehen bleiben. Der Abschnitt traegt nur dann, wenn er eine pruefbare Aussage erlaubt: Welche Quelle stuetzt die Annahme, welche Unsicherheit bleibt offen und welche Gegenbeobachtung wuerde die Bewertung veraendern? Fuer Von KPI zu KII und der Kennzahlen-Stack heisst das, dass praezise Sprache die erste Sicherung gegen Impact-Washing bildet. Die Studierenden sollen nicht lernen, einen Score nachzusprechen. Sie sollen erkennen, wann ein Score klaert, wann er verdeckt und wann eine rote Linie die Durchschnittslogik stoppt.</w:t>
+      </w:r>
+    </w:p>
+    <w:p>
+      <w:r>
+        <w:t>Fallfenster zur Anwendung. Eine Organisation plant eine Massnahme und formuliert dazu eine positive Absicht. In der WÖk reicht das nicht. Fuer diese Vorlesung muss sichtbar werden, welche Zustandsveraenderung erwartet wird, welche Empfaenger direkt oder indirekt betroffen sind, welche Nebenwirkungen entstehen koennen und welche Entscheidung spaeter korrigiert wird. Bezogen auf Von KPI zu KII und der Kennzahlen-Stack heisst das: Die Analyse muss das konkrete Thema ernst nehmen und zugleich den allgemeinen WÖk-Massstab halten. Es geht nicht darum, Akteure moralisch zu sortieren. Es geht darum, Wirkpfade, Wirkungsempfaenger, Datenqualitaet, Risiken und Rueckkopplung so zu beschreiben, dass bessere Entscheidungen moeglich werden.</w:t>
+      </w:r>
+    </w:p>
+    <w:p>
+      <w:r>
+        <w:t>Transfer in Impact-Controlling. Praxisbeispiel verbindet die inhaltliche Deutung mit der spaeteren Praxis. Eine Organisation kann zu Von KPI zu KII und der Kennzahlen-Stack sehr ueberzeugend kommunizieren und trotzdem an Zahlen als Beweis zu behandeln, obwohl Systemgrenze, Datenqualitaet, Unsicherheit oder Nichtkompensation ungeklaert sind scheitern. Darum muss die V1-Fassung immer auch nach Governance fragen: Wer erhebt Daten, wer bewertet sie, wer traegt die Folgen, wer kann widersprechen und wann wird eine Entscheidung korrigiert? Mindestens ein direkter und ein indirekter Wirkpfad muessen nachvollziehbar sein. So wird aus einem Lehrkapitel eine verantwortbare Arbeitsroutine.</w:t>
+      </w:r>
+    </w:p>
+    <w:p>
+      <w:r>
+        <w:t>Grenze gegen Scheingenauigkeit. Gerade bei Wirkungsökonomische Vertiefung ist Praezision wichtiger als grosse Begriffe. Eine Wirkungsaussage bleibt schwach, wenn sie nur Aktivitaet, Reichweite, Absicht oder Image beschreibt. Stark wird sie erst, wenn sie die Zustandsveraenderung und ihre Bedingungen offenlegt. In WC-V1 ist deshalb entscheidend, jede Bewertung nur so belastbar ist wie Datenlage, Quellenstatus, Aktualitaet und Systemgrenze. Die Fehlerlinie verlaeuft nicht zwischen Optimismus und Pessimismus, sondern zwischen offengelegter Unsicherheit und rhetorischer Sicherheit ohne Pruefpfad.</w:t>
+      </w:r>
+    </w:p>
+    <w:p>
+      <w:r>
+        <w:t>Pruefungsnahe Transferfrage. Formuliere zu WC-V1 eine Wirkungsaussage in drei Saetzen: Erstens den beobachteten oder plausiblen Zustand, zweitens die Daten- oder Quellenlage, drittens die offene Unsicherheit samt Rueckkopplung. Die Antwort muss ohne moralische Personenbewertung auskommen und darf Reichweite nicht mit Wirkung verwechseln.</w:t>
+      </w:r>
+    </w:p>
+    <w:p>
+      <w:r>
+        <w:t>Pruefungsnahe Lesart. Aus Prüfungsrelevanz laesst sich eine gute Transferfrage ableiten: Welche Entscheidung waere falsch, wenn dieser Abschnitt missverstanden wird? Fuer Von KPI zu KII und der Kennzahlen-Stack lautet die Antwort meist nicht einfach "mehr Wirkung", sondern genauer: bessere Unterscheidung, sauberere Daten, klarere Schutzlinie und rueckgekoppelte Steuerung. Profile, Zielkonflikte und offene Punkte werden nebeneinander gefuehrt. Wer das im Fall anwenden kann, hat den Kern der Vorlesung verstanden; wer nur Definitionen wiederholt, bleibt unter dem Anspruch der Akademie.</w:t>
+      </w:r>
+    </w:p>
+    <w:p>
+      <w:r>
+        <w:t>Fallfenster zur Anwendung. Eine Fuehrungsentscheidung erzeugt zugleich Nutzen und Risiken. Die WÖk behandelt Ambivalenz nicht als Stoerung, sondern als Kern der Analyse. Positive Netto-Wirkung darf erst behauptet werden, wenn zentrale negative Wirkungen getrennt geprueft und rote Linien gewahrt sind. Bezogen auf Von KPI zu KII und der Kennzahlen-Stack heisst das: Die Analyse muss das konkrete Thema ernst nehmen und zugleich den allgemeinen WÖk-Massstab halten. Es geht nicht darum, Akteure moralisch zu sortieren. Es geht darum, Wirkpfade, Wirkungsempfaenger, Datenqualitaet, Risiken und Rueckkopplung so zu beschreiben, dass bessere Entscheidungen moeglich werden.</w:t>
+      </w:r>
+    </w:p>
+    <w:p>
+      <w:r>
+        <w:t>Nichtkompensation. Der Abschnitt Lernziele ist in WC-V1 kein Zusatzwissen, sondern ein Pruefstein fuer die Grundfrage des Skripts: Was veraendert sich, bei wem, wodurch und mit welcher Rueckkopplung? Fuer Von KPI zu KII und der Kennzahlen-Stack wird daran sichtbar, dass schwere zentrale Schaeden nicht durch beliebige positive Einzelwerte neutralisiert werden duerfen. Die fachliche Grenze liegt dort, wo Lernende eine Durchschnittslogik als moralische Entlastung verwenden. Die saubere Lesart trennt deshalb Beobachtung, Kausalannahme, Bewertung und Steuerungsfolge. In der Anwendung sollte daraus mindestens eine konkrete Indikator, Scorecard, Benchmark, Auditpfad oder Portfolioentscheidung abgeleitet werden; sonst bleibt das Wissen erklaerend, aber nicht steuerungsfaehig.</w:t>
+      </w:r>
+    </w:p>
+    <w:p>
+      <w:r>
+        <w:t>Anwendung auf Einleitung / Wirkungsfrage. In einer Fallanalyse beginnt dieser Punkt nicht mit einer Meinung, sondern mit einer belastbaren Beschreibung. Wer WC-V1 pruefungsnah liest, fragt zuerst nach Wirkungsempfaengern, Wirkraum, Zeitraum und Datenquelle. Erst danach folgt die Bewertung im Referenzrahmen Mensch, Planet, Demokratie, SDGs, Agenda 2030 und SDG+. Jeder Analyseblock fragt nach der Routine, die nach der Bewertung angepasst wird. Der typische Kurzschluss waere, Reporting als Abschluss behandeln. Genau dagegen setzt die WÖk die Pflicht, Wirkungspotenzial, Wirkungsrisiko und positive Netto-Wirkung begrifflich getrennt zu halten.</w:t>
+      </w:r>
+    </w:p>
+    <w:p>
+      <w:r>
+        <w:t>Evidenzregel. Kernaussage darf im Skript nicht als dekorativer Begriff stehen bleiben. Der Abschnitt traegt nur dann, wenn er eine pruefbare Aussage erlaubt: Welche Quelle stuetzt die Annahme, welche Unsicherheit bleibt offen und welche Gegenbeobachtung wuerde die Bewertung veraendern? Fuer Von KPI zu KII und der Kennzahlen-Stack heisst das, dass Wirkungsbewertung Verfahren, Rechte, Transparenz und Korrektur braucht. Die Studierenden sollen nicht lernen, einen Score nachzusprechen. Sie sollen erkennen, wann ein Score klaert, wann er verdeckt und wann eine rote Linie die Durchschnittslogik stoppt.</w:t>
+      </w:r>
+    </w:p>
+    <w:p>
+      <w:r>
+        <w:t>Fallfenster zur Anwendung. Ein Controlling-Team moechte einen Score bilden. Das Skript verlangt, dass Datenqualitaet, Systemgrenzen, Gewichtung, Unsicherheit und Nichtkompensation sichtbar bleiben. Ein Score darf die Diskussion nicht beenden, sondern muss bessere Fragen, Priorisierung und Rueckkopplung ermoeglichen. Bezogen auf Von KPI zu KII und der Kennzahlen-Stack heisst das: Die Analyse muss das konkrete Thema ernst nehmen und zugleich den allgemeinen WÖk-Massstab halten. Es geht nicht darum, Akteure moralisch zu sortieren. Es geht darum, Wirkpfade, Wirkungsempfaenger, Datenqualitaet, Risiken und Rueckkopplung so zu beschreiben, dass bessere Entscheidungen moeglich werden.</w:t>
+      </w:r>
+    </w:p>
+    <w:p>
+      <w:r>
+        <w:t>Transfer in Impact-Controlling. Quelltext und fachliche Grundlegung verbindet die inhaltliche Deutung mit der spaeteren Praxis. Eine Organisation kann zu Von KPI zu KII und der Kennzahlen-Stack sehr ueberzeugend kommunizieren und trotzdem an Zahlen als Beweis zu behandeln, obwohl Systemgrenze, Datenqualitaet, Unsicherheit oder Nichtkompensation ungeklaert sind scheitern. Darum muss die V1-Fassung immer auch nach Governance fragen: Wer erhebt Daten, wer bewertet sie, wer traegt die Folgen, wer kann widersprechen und wann wird eine Entscheidung korrigiert? Pruefungsfragen verbinden Begriff, Anwendung, Evidenz und rote Linie. So wird aus einem Lehrkapitel eine verantwortbare Arbeitsroutine.</w:t>
+      </w:r>
+    </w:p>
+    <w:p>
+      <w:r>
+        <w:t>Pruefungsnahe Transferfrage. Formuliere zu WC-V1 eine Wirkungsaussage in drei Saetzen: Erstens den beobachteten oder plausiblen Zustand, zweitens die Daten- oder Quellenlage, drittens die offene Unsicherheit samt Rueckkopplung. Die Antwort muss ohne moralische Personenbewertung auskommen und darf Reichweite nicht mit Wirkung verwechseln.</w:t>
+      </w:r>
+    </w:p>
+    <w:p>
+      <w:r>
+        <w:t>Grenze gegen Scheingenauigkeit. Gerade bei Einstieg / Wirkungsfrage ist Praezision wichtiger als grosse Begriffe. Eine Wirkungsaussage bleibt schwach, wenn sie nur Aktivitaet, Reichweite, Absicht oder Image beschreibt. Stark wird sie erst, wenn sie die Zustandsveraenderung und ihre Bedingungen offenlegt. In WC-V1 ist deshalb entscheidend, WÖk-Begriffe im Alltag nur tragen, wenn sie in Routinen uebersetzt werden. Die Fehlerlinie verlaeuft nicht zwischen Optimismus und Pessimismus, sondern zwischen offengelegter Unsicherheit und rhetorischer Sicherheit ohne Pruefpfad.</w:t>
+      </w:r>
+    </w:p>
+    <w:p>
+      <w:r>
+        <w:t>Pruefungsnahe Lesart. Aus Video-/Audio-Vorlesung laesst sich eine gute Transferfrage ableiten: Welche Entscheidung waere falsch, wenn dieser Abschnitt missverstanden wird? Fuer Von KPI zu KII und der Kennzahlen-Stack lautet die Antwort meist nicht einfach "mehr Wirkung", sondern genauer: bessere Unterscheidung, sauberere Daten, klarere Schutzlinie und rueckgekoppelte Steuerung. Gute Kommunikation unterscheidet Befund, Annahme und normative Bewertung. Wer das im Fall anwenden kann, hat den Kern der Vorlesung verstanden; wer nur Definitionen wiederholt, bleibt unter dem Anspruch der Akademie.</w:t>
+      </w:r>
+    </w:p>
+    <w:p>
+      <w:r>
+        <w:t>Fallfenster zur Anwendung. Ein Kommunikationsbericht nennt viele Aktivitaeten, Reichweiten und Rueckmeldungen. Die V1-Pruefung fragt, ob daraus eine belastbare Wirkungsaussage folgt. Wenn nur Kontakte, Klicks oder Zustimmung vorliegen, bleibt die Aussage im Bereich Wirkungspotenzial oder Resonanz, nicht im Bereich nachgewiesener Wirkung. Bezogen auf Von KPI zu KII und der Kennzahlen-Stack heisst das: Die Analyse muss das konkrete Thema ernst nehmen und zugleich den allgemeinen WÖk-Massstab halten. Es geht nicht darum, Akteure moralisch zu sortieren. Es geht darum, Wirkpfade, Wirkungsempfaenger, Datenqualitaet, Risiken und Rueckkopplung so zu beschreiben, dass bessere Entscheidungen moeglich werden.</w:t>
+      </w:r>
+    </w:p>
+    <w:p>
+      <w:r>
+        <w:t>Systemgrenze. Der Abschnitt Transkript (Gerüst) ist in WC-V1 kein Zusatzwissen, sondern ein Pruefstein fuer die Grundfrage des Skripts: Was veraendert sich, bei wem, wodurch und mit welcher Rueckkopplung? Fuer Von KPI zu KII und der Kennzahlen-Stack wird daran sichtbar, dass jede Wirkungsaussage eine Grenze zieht und diese Grenze begruenden muss. Die fachliche Grenze liegt dort, wo Lernende nur den bequemen Ausschnitt betrachten. Die saubere Lesart trennt deshalb Beobachtung, Kausalannahme, Bewertung und Steuerungsfolge. In der Anwendung sollte daraus mindestens eine konkrete Indikator, Scorecard, Benchmark, Auditpfad oder Portfolioentscheidung abgeleitet werden; sonst bleibt das Wissen erklaerend, aber nicht steuerungsfaehig.</w:t>
+      </w:r>
+    </w:p>
+    <w:p>
+      <w:r>
+        <w:t>Anwendung auf Skript / Folien (Lernseite). In einer Fallanalyse beginnt dieser Punkt nicht mit einer Meinung, sondern mit einer belastbaren Beschreibung. Wer WC-V1 pruefungsnah liest, fragt zuerst nach Wirkungsempfaengern, Wirkraum, Zeitraum und Datenquelle. Erst danach folgt die Bewertung im Referenzrahmen Mensch, Planet, Demokratie, SDGs, Agenda 2030 und SDG+. Szenarien pruefen Sofortwirkung, Folgewirkung und Reversibilitaet getrennt. Der typische Kurzschluss waere, Momentnutzen als dauerhafte positive Netto-Wirkung verkaufen. Genau dagegen setzt die WÖk die Pflicht, Wirkungspotenzial, Wirkungsrisiko und positive Netto-Wirkung begrifflich getrennt zu halten.</w:t>
+      </w:r>
+    </w:p>
+    <w:p>
+      <w:r>
+        <w:t>Evidenzregel. Transferaufgabe darf im Skript nicht als dekorativer Begriff stehen bleiben. Der Abschnitt traegt nur dann, wenn er eine pruefbare Aussage erlaubt: Welche Quelle stuetzt die Annahme, welche Unsicherheit bleibt offen und welche Gegenbeobachtung wuerde die Bewertung veraendern? Fuer Von KPI zu KII und der Kennzahlen-Stack heisst das, dass Wirkung nicht am Sender, sondern an veraenderten Zustanden der Empfaenger geprueft wird. Die Studierenden sollen nicht lernen, einen Score nachzusprechen. Sie sollen erkennen, wann ein Score klaert, wann er verdeckt und wann eine rote Linie die Durchschnittslogik stoppt.</w:t>
+      </w:r>
+    </w:p>
+    <w:p>
+      <w:r>
+        <w:t>Fallfenster zur Anwendung. Eine Organisation plant eine Massnahme und formuliert dazu eine positive Absicht. In der WÖk reicht das nicht. Fuer diese Vorlesung muss sichtbar werden, welche Zustandsveraenderung erwartet wird, welche Empfaenger direkt oder indirekt betroffen sind, welche Nebenwirkungen entstehen koennen und welche Entscheidung spaeter korrigiert wird. Bezogen auf Von KPI zu KII und der Kennzahlen-Stack heisst das: Die Analyse muss das konkrete Thema ernst nehmen und zugleich den allgemeinen WÖk-Massstab halten. Es geht nicht darum, Akteure moralisch zu sortieren. Es geht darum, Wirkpfade, Wirkungsempfaenger, Datenqualitaet, Risiken und Rueckkopplung so zu beschreiben, dass bessere Entscheidungen moeglich werden.</w:t>
+      </w:r>
+    </w:p>
+    <w:p>
+      <w:r>
+        <w:t>Pruefungsnahe Transferfrage. Formuliere zu WC-V1 eine Wirkungsaussage in drei Saetzen: Erstens den beobachteten oder plausiblen Zustand, zweitens die Daten- oder Quellenlage, drittens die offene Unsicherheit samt Rueckkopplung. Die Antwort muss ohne moralische Personenbewertung auskommen und darf Reichweite nicht mit Wirkung verwechseln.</w:t>
+      </w:r>
+    </w:p>
+    <w:p>
+      <w:r>
+        <w:t>Transfer in Impact-Controlling. Praxisbeispiel verbindet die inhaltliche Deutung mit der spaeteren Praxis. Eine Organisation kann zu Von KPI zu KII und der Kennzahlen-Stack sehr ueberzeugend kommunizieren und trotzdem an Zahlen als Beweis zu behandeln, obwohl Systemgrenze, Datenqualitaet, Unsicherheit oder Nichtkompensation ungeklaert sind scheitern. Darum muss die V1-Fassung immer auch nach Governance fragen: Wer erhebt Daten, wer bewertet sie, wer traegt die Folgen, wer kann widersprechen und wann wird eine Entscheidung korrigiert? Jede Schlussfolgerung endet mit Entscheidung, Verantwortlichkeit und Termin fuer Rueckpruefung. So wird aus einem Lehrkapitel eine verantwortbare Arbeitsroutine.</w:t>
+      </w:r>
+    </w:p>
+    <w:p>
+      <w:r>
+        <w:t>Grenze gegen Scheingenauigkeit. Gerade bei Wirkungsökonomische Vertiefung ist Praezision wichtiger als grosse Begriffe. Eine Wirkungsaussage bleibt schwach, wenn sie nur Aktivitaet, Reichweite, Absicht oder Image beschreibt. Stark wird sie erst, wenn sie die Zustandsveraenderung und ihre Bedingungen offenlegt. In WC-V1 ist deshalb entscheidend, WÖk-Aussagen mit bestehenden Begriffen, Studien, Standards und Rechtsrahmen in Beziehung stehen muessen. Die Fehlerlinie verlaeuft nicht zwischen Optimismus und Pessimismus, sondern zwischen offengelegter Unsicherheit und rhetorischer Sicherheit ohne Pruefpfad.</w:t>
+      </w:r>
+    </w:p>
+    <w:p>
+      <w:r>
+        <w:t>Pruefungsnahe Lesart. Aus Prüfungsrelevanz laesst sich eine gute Transferfrage ableiten: Welche Entscheidung waere falsch, wenn dieser Abschnitt missverstanden wird? Fuer Von KPI zu KII und der Kennzahlen-Stack lautet die Antwort meist nicht einfach "mehr Wirkung", sondern genauer: bessere Unterscheidung, sauberere Daten, klarere Schutzlinie und rueckgekoppelte Steuerung. Die Analyse markiert Stoppsignale vor jeder Portfolio- oder Score-Debatte. Wer das im Fall anwenden kann, hat den Kern der Vorlesung verstanden; wer nur Definitionen wiederholt, bleibt unter dem Anspruch der Akademie.</w:t>
+      </w:r>
+    </w:p>
+    <w:p>
+      <w:r>
+        <w:t>Fallfenster zur Anwendung. Eine Fuehrungsentscheidung erzeugt zugleich Nutzen und Risiken. Die WÖk behandelt Ambivalenz nicht als Stoerung, sondern als Kern der Analyse. Positive Netto-Wirkung darf erst behauptet werden, wenn zentrale negative Wirkungen getrennt geprueft und rote Linien gewahrt sind. Bezogen auf Von KPI zu KII und der Kennzahlen-Stack heisst das: Die Analyse muss das konkrete Thema ernst nehmen und zugleich den allgemeinen WÖk-Massstab halten. Es geht nicht darum, Akteure moralisch zu sortieren. Es geht darum, Wirkpfade, Wirkungsempfaenger, Datenqualitaet, Risiken und Rueckkopplung so zu beschreiben, dass bessere Entscheidungen moeglich werden.</w:t>
+      </w:r>
+    </w:p>
+    <w:p>
+      <w:pPr>
+        <w:pStyle w:val="Heading3"/>
+      </w:pPr>
+      <w:r>
+        <w:t>Abschlusskommentar 4: Lesen, pruefen, rueckkoppeln</w:t>
+      </w:r>
+    </w:p>
+    <w:p>
+      <w:r>
+        <w:t>Die folgende Verdichtung fuehrt die vorhandenen Kapitel nicht als Wiederholung, sondern als Anwendung zusammen. Wirkungskompetenz entsteht, wenn dieselbe begriffliche Strenge in Fallanalyse, Datenarbeit, Kommunikation, Governance und Entscheidungspraxis wiedererkannt wird.</w:t>
+      </w:r>
+    </w:p>
+    <w:p>
+      <w:r>
+        <w:t>Begriffliche Schaerfung. Der Abschnitt Lernziele ist in WC-V1 kein Zusatzwissen, sondern ein Pruefstein fuer die Grundfrage des Skripts: Was veraendert sich, bei wem, wodurch und mit welcher Rueckkopplung? Fuer Von KPI zu KII und der Kennzahlen-Stack wird daran sichtbar, dass praezise Sprache die erste Sicherung gegen Impact-Washing bildet. Die fachliche Grenze liegt dort, wo Lernende Output, Reichweite, Absicht und Wirkung in einem Satz vermischen. Die saubere Lesart trennt deshalb Beobachtung, Kausalannahme, Bewertung und Steuerungsfolge. In der Anwendung sollte daraus mindestens eine konkrete Indikator, Scorecard, Benchmark, Auditpfad oder Portfolioentscheidung abgeleitet werden; sonst bleibt das Wissen erklaerend, aber nicht steuerungsfaehig.</w:t>
+      </w:r>
+    </w:p>
+    <w:p>
+      <w:r>
+        <w:t>Anwendung auf Einleitung / Wirkungsfrage. In einer Fallanalyse beginnt dieser Punkt nicht mit einer Meinung, sondern mit einer belastbaren Beschreibung. Wer WC-V1 pruefungsnah liest, fragt zuerst nach Wirkungsempfaengern, Wirkraum, Zeitraum und Datenquelle. Erst danach folgt die Bewertung im Referenzrahmen Mensch, Planet, Demokratie, SDGs, Agenda 2030 und SDG+. Mindestens ein direkter und ein indirekter Wirkpfad muessen nachvollziehbar sein. Der typische Kurzschluss waere, nur die Massnahme selbst bewerten und indirekte Empfaenger ausblenden. Genau dagegen setzt die WÖk die Pflicht, Wirkungspotenzial, Wirkungsrisiko und positive Netto-Wirkung begrifflich getrennt zu halten.</w:t>
+      </w:r>
+    </w:p>
+    <w:p>
+      <w:r>
+        <w:t>Pruefungsnahe Transferfrage. Formuliere zu WC-V1 eine Wirkungsaussage in drei Saetzen: Erstens den beobachteten oder plausiblen Zustand, zweitens die Daten- oder Quellenlage, drittens die offene Unsicherheit samt Rueckkopplung. Die Antwort muss ohne moralische Personenbewertung auskommen und darf Reichweite nicht mit Wirkung verwechseln.</w:t>
+      </w:r>
+    </w:p>
+    <w:p>
+      <w:r>
+        <w:t>Evidenzregel. Kernaussage darf im Skript nicht als dekorativer Begriff stehen bleiben. Der Abschnitt traegt nur dann, wenn er eine pruefbare Aussage erlaubt: Welche Quelle stuetzt die Annahme, welche Unsicherheit bleibt offen und welche Gegenbeobachtung wuerde die Bewertung veraendern? Fuer Von KPI zu KII und der Kennzahlen-Stack heisst das, dass jede Bewertung nur so belastbar ist wie Datenlage, Quellenstatus, Aktualitaet und Systemgrenze. Die Studierenden sollen nicht lernen, einen Score nachzusprechen. Sie sollen erkennen, wann ein Score klaert, wann er verdeckt und wann eine rote Linie die Durchschnittslogik stoppt.</w:t>
+      </w:r>
+    </w:p>
+    <w:p>
+      <w:r>
+        <w:t>Fallfenster zur Anwendung. Ein Controlling-Team moechte einen Score bilden. Das Skript verlangt, dass Datenqualitaet, Systemgrenzen, Gewichtung, Unsicherheit und Nichtkompensation sichtbar bleiben. Ein Score darf die Diskussion nicht beenden, sondern muss bessere Fragen, Priorisierung und Rueckkopplung ermoeglichen. Bezogen auf Von KPI zu KII und der Kennzahlen-Stack heisst das: Die Analyse muss das konkrete Thema ernst nehmen und zugleich den allgemeinen WÖk-Massstab halten. Es geht nicht darum, Akteure moralisch zu sortieren. Es geht darum, Wirkpfade, Wirkungsempfaenger, Datenqualitaet, Risiken und Rueckkopplung so zu beschreiben, dass bessere Entscheidungen moeglich werden.</w:t>
+      </w:r>
+    </w:p>
+    <w:p>
+      <w:r>
+        <w:t>Transfer in Impact-Controlling. Quelltext und fachliche Grundlegung verbindet die inhaltliche Deutung mit der spaeteren Praxis. Eine Organisation kann zu Von KPI zu KII und der Kennzahlen-Stack sehr ueberzeugend kommunizieren und trotzdem an Zahlen als Beweis zu behandeln, obwohl Systemgrenze, Datenqualitaet, Unsicherheit oder Nichtkompensation ungeklaert sind scheitern. Darum muss die V1-Fassung immer auch nach Governance fragen: Wer erhebt Daten, wer bewertet sie, wer traegt die Folgen, wer kann widersprechen und wann wird eine Entscheidung korrigiert? Profile, Zielkonflikte und offene Punkte werden nebeneinander gefuehrt. So wird aus einem Lehrkapitel eine verantwortbare Arbeitsroutine.</w:t>
+      </w:r>
+    </w:p>
+    <w:p>
+      <w:r>
+        <w:t>Grenze gegen Scheingenauigkeit. Gerade bei Einstieg / Wirkungsfrage ist Praezision wichtiger als grosse Begriffe. Eine Wirkungsaussage bleibt schwach, wenn sie nur Aktivitaet, Reichweite, Absicht oder Image beschreibt. Stark wird sie erst, wenn sie die Zustandsveraenderung und ihre Bedingungen offenlegt. In WC-V1 ist deshalb entscheidend, schwere zentrale Schaeden nicht durch beliebige positive Einzelwerte neutralisiert werden duerfen. Die Fehlerlinie verlaeuft nicht zwischen Optimismus und Pessimismus, sondern zwischen offengelegter Unsicherheit und rhetorischer Sicherheit ohne Pruefpfad.</w:t>
+      </w:r>
+    </w:p>
+    <w:p>
+      <w:r>
+        <w:t>Pruefungsnahe Lesart. Aus Video-/Audio-Vorlesung laesst sich eine gute Transferfrage ableiten: Welche Entscheidung waere falsch, wenn dieser Abschnitt missverstanden wird? Fuer Von KPI zu KII und der Kennzahlen-Stack lautet die Antwort meist nicht einfach "mehr Wirkung", sondern genauer: bessere Unterscheidung, sauberere Daten, klarere Schutzlinie und rueckgekoppelte Steuerung. Jeder Analyseblock fragt nach der Routine, die nach der Bewertung angepasst wird. Wer das im Fall anwenden kann, hat den Kern der Vorlesung verstanden; wer nur Definitionen wiederholt, bleibt unter dem Anspruch der Akademie.</w:t>
+      </w:r>
+    </w:p>
+    <w:p>
+      <w:r>
+        <w:t>Fallfenster zur Anwendung. Ein Kommunikationsbericht nennt viele Aktivitaeten, Reichweiten und Rueckmeldungen. Die V1-Pruefung fragt, ob daraus eine belastbare Wirkungsaussage folgt. Wenn nur Kontakte, Klicks oder Zustimmung vorliegen, bleibt die Aussage im Bereich Wirkungspotenzial oder Resonanz, nicht im Bereich nachgewiesener Wirkung. Bezogen auf Von KPI zu KII und der Kennzahlen-Stack heisst das: Die Analyse muss das konkrete Thema ernst nehmen und zugleich den allgemeinen WÖk-Massstab halten. Es geht nicht darum, Akteure moralisch zu sortieren. Es geht darum, Wirkpfade, Wirkungsempfaenger, Datenqualitaet, Risiken und Rueckkopplung so zu beschreiben, dass bessere Entscheidungen moeglich werden.</w:t>
+      </w:r>
+    </w:p>
+    <w:p>
+      <w:r>
+        <w:t>Governance. Der Abschnitt Transkript (Gerüst) ist in WC-V1 kein Zusatzwissen, sondern ein Pruefstein fuer die Grundfrage des Skripts: Was veraendert sich, bei wem, wodurch und mit welcher Rueckkopplung? Fuer Von KPI zu KII und der Kennzahlen-Stack wird daran sichtbar, dass Wirkungsbewertung Verfahren, Rechte, Transparenz und Korrektur braucht. Die fachliche Grenze liegt dort, wo Lernende Bewertung als technokratische Top-down-Setzung verstehen. Die saubere Lesart trennt deshalb Beobachtung, Kausalannahme, Bewertung und Steuerungsfolge. In der Anwendung sollte daraus mindestens eine konkrete Indikator, Scorecard, Benchmark, Auditpfad oder Portfolioentscheidung abgeleitet werden; sonst bleibt das Wissen erklaerend, aber nicht steuerungsfaehig.</w:t>
+      </w:r>
+    </w:p>
+    <w:p>
+      <w:r>
+        <w:t>Pruefungsnahe Transferfrage. Formuliere zu WC-V1 eine Wirkungsaussage in drei Saetzen: Erstens den beobachteten oder plausiblen Zustand, zweitens die Daten- oder Quellenlage, drittens die offene Unsicherheit samt Rueckkopplung. Die Antwort muss ohne moralische Personenbewertung auskommen und darf Reichweite nicht mit Wirkung verwechseln.</w:t>
+      </w:r>
+    </w:p>
+    <w:p>
+      <w:r>
+        <w:t>Anwendung auf Skript / Folien (Lernseite). In einer Fallanalyse beginnt dieser Punkt nicht mit einer Meinung, sondern mit einer belastbaren Beschreibung. Wer WC-V1 pruefungsnah liest, fragt zuerst nach Wirkungsempfaengern, Wirkraum, Zeitraum und Datenquelle. Erst danach folgt die Bewertung im Referenzrahmen Mensch, Planet, Demokratie, SDGs, Agenda 2030 und SDG+. Pruefungsfragen verbinden Begriff, Anwendung, Evidenz und rote Linie. Der typische Kurzschluss waere, reines Auswendiglernen als Kompetenznachweis behandeln. Genau dagegen setzt die WÖk die Pflicht, Wirkungspotenzial, Wirkungsrisiko und positive Netto-Wirkung begrifflich getrennt zu halten.</w:t>
+      </w:r>
+    </w:p>
+    <w:p>
+      <w:r>
+        <w:t>Evidenzregel. Transferaufgabe darf im Skript nicht als dekorativer Begriff stehen bleiben. Der Abschnitt traegt nur dann, wenn er eine pruefbare Aussage erlaubt: Welche Quelle stuetzt die Annahme, welche Unsicherheit bleibt offen und welche Gegenbeobachtung wuerde die Bewertung veraendern? Fuer Von KPI zu KII und der Kennzahlen-Stack heisst das, dass WÖk-Begriffe im Alltag nur tragen, wenn sie in Routinen uebersetzt werden. Die Studierenden sollen nicht lernen, einen Score nachzusprechen. Sie sollen erkennen, wann ein Score klaert, wann er verdeckt und wann eine rote Linie die Durchschnittslogik stoppt.</w:t>
+      </w:r>
+    </w:p>
+    <w:p>
+      <w:r>
+        <w:t>Fallfenster zur Anwendung. Eine Organisation plant eine Massnahme und formuliert dazu eine positive Absicht. In der WÖk reicht das nicht. Fuer diese Vorlesung muss sichtbar werden, welche Zustandsveraenderung erwartet wird, welche Empfaenger direkt oder indirekt betroffen sind, welche Nebenwirkungen entstehen koennen und welche Entscheidung spaeter korrigiert wird. Bezogen auf Von KPI zu KII und der Kennzahlen-Stack heisst das: Die Analyse muss das konkrete Thema ernst nehmen und zugleich den allgemeinen WÖk-Massstab halten. Es geht nicht darum, Akteure moralisch zu sortieren. Es geht darum, Wirkpfade, Wirkungsempfaenger, Datenqualitaet, Risiken und Rueckkopplung so zu beschreiben, dass bessere Entscheidungen moeglich werden.</w:t>
+      </w:r>
+    </w:p>
+    <w:p>
+      <w:r>
+        <w:t>Transfer in Impact-Controlling. Praxisbeispiel verbindet die inhaltliche Deutung mit der spaeteren Praxis. Eine Organisation kann zu Von KPI zu KII und der Kennzahlen-Stack sehr ueberzeugend kommunizieren und trotzdem an Zahlen als Beweis zu behandeln, obwohl Systemgrenze, Datenqualitaet, Unsicherheit oder Nichtkompensation ungeklaert sind scheitern. Darum muss die V1-Fassung immer auch nach Governance fragen: Wer erhebt Daten, wer bewertet sie, wer traegt die Folgen, wer kann widersprechen und wann wird eine Entscheidung korrigiert? Gute Kommunikation unterscheidet Befund, Annahme und normative Bewertung. So wird aus einem Lehrkapitel eine verantwortbare Arbeitsroutine.</w:t>
+      </w:r>
+    </w:p>
+    <w:p>
+      <w:r>
+        <w:t>Grenze gegen Scheingenauigkeit. Gerade bei Wirkungsökonomische Vertiefung ist Praezision wichtiger als grosse Begriffe. Eine Wirkungsaussage bleibt schwach, wenn sie nur Aktivitaet, Reichweite, Absicht oder Image beschreibt. Stark wird sie erst, wenn sie die Zustandsveraenderung und ihre Bedingungen offenlegt. In WC-V1 ist deshalb entscheidend, jede Wirkungsaussage eine Grenze zieht und diese Grenze begruenden muss. Die Fehlerlinie verlaeuft nicht zwischen Optimismus und Pessimismus, sondern zwischen offengelegter Unsicherheit und rhetorischer Sicherheit ohne Pruefpfad.</w:t>
+      </w:r>
+    </w:p>
+    <w:p>
+      <w:r>
+        <w:t>Pruefungsnahe Lesart. Aus Prüfungsrelevanz laesst sich eine gute Transferfrage ableiten: Welche Entscheidung waere falsch, wenn dieser Abschnitt missverstanden wird? Fuer Von KPI zu KII und der Kennzahlen-Stack lautet die Antwort meist nicht einfach "mehr Wirkung", sondern genauer: bessere Unterscheidung, sauberere Daten, klarere Schutzlinie und rueckgekoppelte Steuerung. Szenarien pruefen Sofortwirkung, Folgewirkung und Reversibilitaet getrennt. Wer das im Fall anwenden kann, hat den Kern der Vorlesung verstanden; wer nur Definitionen wiederholt, bleibt unter dem Anspruch der Akademie.</w:t>
+      </w:r>
+    </w:p>
+    <w:p>
+      <w:r>
+        <w:t>Fallfenster zur Anwendung. Eine Fuehrungsentscheidung erzeugt zugleich Nutzen und Risiken. Die WÖk behandelt Ambivalenz nicht als Stoerung, sondern als Kern der Analyse. Positive Netto-Wirkung darf erst behauptet werden, wenn zentrale negative Wirkungen getrennt geprueft und rote Linien gewahrt sind. Bezogen auf Von KPI zu KII und der Kennzahlen-Stack heisst das: Die Analyse muss das konkrete Thema ernst nehmen und zugleich den allgemeinen WÖk-Massstab halten. Es geht nicht darum, Akteure moralisch zu sortieren. Es geht darum, Wirkpfade, Wirkungsempfaenger, Datenqualitaet, Risiken und Rueckkopplung so zu beschreiben, dass bessere Entscheidungen moeglich werden.</w:t>
+      </w:r>
+    </w:p>
+    <w:p>
+      <w:r>
+        <w:t>Pruefungsnahe Transferfrage. Formuliere zu WC-V1 eine Wirkungsaussage in drei Saetzen: Erstens den beobachteten oder plausiblen Zustand, zweitens die Daten- oder Quellenlage, drittens die offene Unsicherheit samt Rueckkopplung. Die Antwort muss ohne moralische Personenbewertung auskommen und darf Reichweite nicht mit Wirkung verwechseln.</w:t>
+      </w:r>
+    </w:p>
+    <w:p>
+      <w:r>
+        <w:t>Betroffenenperspektive. Der Abschnitt Lernziele ist in WC-V1 kein Zusatzwissen, sondern ein Pruefstein fuer die Grundfrage des Skripts: Was veraendert sich, bei wem, wodurch und mit welcher Rueckkopplung? Fuer Von KPI zu KII und der Kennzahlen-Stack wird daran sichtbar, dass Wirkung nicht am Sender, sondern an veraenderten Zustanden der Empfaenger geprueft wird. Die fachliche Grenze liegt dort, wo Lernende interne Erfolgskennzahlen mit gesellschaftlicher Wirkung verwechseln. Die saubere Lesart trennt deshalb Beobachtung, Kausalannahme, Bewertung und Steuerungsfolge. In der Anwendung sollte daraus mindestens eine konkrete Indikator, Scorecard, Benchmark, Auditpfad oder Portfolioentscheidung abgeleitet werden; sonst bleibt das Wissen erklaerend, aber nicht steuerungsfaehig.</w:t>
+      </w:r>
+    </w:p>
+    <w:p>
+      <w:r>
+        <w:t>Anwendung auf Einleitung / Wirkungsfrage. In einer Fallanalyse beginnt dieser Punkt nicht mit einer Meinung, sondern mit einer belastbaren Beschreibung. Wer WC-V1 pruefungsnah liest, fragt zuerst nach Wirkungsempfaengern, Wirkraum, Zeitraum und Datenquelle. Erst danach folgt die Bewertung im Referenzrahmen Mensch, Planet, Demokratie, SDGs, Agenda 2030 und SDG+. Jede Schlussfolgerung endet mit Entscheidung, Verantwortlichkeit und Termin fuer Rueckpruefung. Der typische Kurzschluss waere, Befunde sammeln, ohne Ressourcen oder Regeln zu veraendern. Genau dagegen setzt die WÖk die Pflicht, Wirkungspotenzial, Wirkungsrisiko und positive Netto-Wirkung begrifflich getrennt zu halten.</w:t>
+      </w:r>
+    </w:p>
+    <w:p>
+      <w:r>
+        <w:t>Evidenzregel. Kernaussage darf im Skript nicht als dekorativer Begriff stehen bleiben. Der Abschnitt traegt nur dann, wenn er eine pruefbare Aussage erlaubt: Welche Quelle stuetzt die Annahme, welche Unsicherheit bleibt offen und welche Gegenbeobachtung wuerde die Bewertung veraendern? Fuer Von KPI zu KII und der Kennzahlen-Stack heisst das, dass WÖk-Aussagen mit bestehenden Begriffen, Studien, Standards und Rechtsrahmen in Beziehung stehen muessen. Die Studierenden sollen nicht lernen, einen Score nachzusprechen. Sie sollen erkennen, wann ein Score klaert, wann er verdeckt und wann eine rote Linie die Durchschnittslogik stoppt.</w:t>
+      </w:r>
+    </w:p>
+    <w:p>
+      <w:r>
+        <w:t>Fallfenster zur Anwendung. Ein Controlling-Team moechte einen Score bilden. Das Skript verlangt, dass Datenqualitaet, Systemgrenzen, Gewichtung, Unsicherheit und Nichtkompensation sichtbar bleiben. Ein Score darf die Diskussion nicht beenden, sondern muss bessere Fragen, Priorisierung und Rueckkopplung ermoeglichen. Bezogen auf Von KPI zu KII und der Kennzahlen-Stack heisst das: Die Analyse muss das konkrete Thema ernst nehmen und zugleich den allgemeinen WÖk-Massstab halten. Es geht nicht darum, Akteure moralisch zu sortieren. Es geht darum, Wirkpfade, Wirkungsempfaenger, Datenqualitaet, Risiken und Rueckkopplung so zu beschreiben, dass bessere Entscheidungen moeglich werden.</w:t>
+      </w:r>
+    </w:p>
+    <w:p>
+      <w:r>
+        <w:t>Transfer in Impact-Controlling. Quelltext und fachliche Grundlegung verbindet die inhaltliche Deutung mit der spaeteren Praxis. Eine Organisation kann zu Von KPI zu KII und der Kennzahlen-Stack sehr ueberzeugend kommunizieren und trotzdem an Zahlen als Beweis zu behandeln, obwohl Systemgrenze, Datenqualitaet, Unsicherheit oder Nichtkompensation ungeklaert sind scheitern. Darum muss die V1-Fassung immer auch nach Governance fragen: Wer erhebt Daten, wer bewertet sie, wer traegt die Folgen, wer kann widersprechen und wann wird eine Entscheidung korrigiert? Die Analyse markiert Stoppsignale vor jeder Portfolio- oder Score-Debatte. So wird aus einem Lehrkapitel eine verantwortbare Arbeitsroutine.</w:t>
+      </w:r>
+    </w:p>
+    <w:p>
+      <w:pPr>
+        <w:pStyle w:val="Heading3"/>
+      </w:pPr>
+      <w:r>
+        <w:t>Abschlusskommentar 5: Lesen, pruefen, rueckkoppeln</w:t>
+      </w:r>
+    </w:p>
+    <w:p>
+      <w:r>
+        <w:t>Die folgende Verdichtung fuehrt die vorhandenen Kapitel nicht als Wiederholung, sondern als Anwendung zusammen. Wirkungskompetenz entsteht, wenn dieselbe begriffliche Strenge in Fallanalyse, Datenarbeit, Kommunikation, Governance und Entscheidungspraxis wiedererkannt wird.</w:t>
+      </w:r>
+    </w:p>
+    <w:p>
+      <w:r>
+        <w:t>Grenze gegen Scheingenauigkeit. Gerade bei Einstieg / Wirkungsfrage ist Praezision wichtiger als grosse Begriffe. Eine Wirkungsaussage bleibt schwach, wenn sie nur Aktivitaet, Reichweite, Absicht oder Image beschreibt. Stark wird sie erst, wenn sie die Zustandsveraenderung und ihre Bedingungen offenlegt. In WC-V1 ist deshalb entscheidend, praezise Sprache die erste Sicherung gegen Impact-Washing bildet. Die Fehlerlinie verlaeuft nicht zwischen Optimismus und Pessimismus, sondern zwischen offengelegter Unsicherheit und rhetorischer Sicherheit ohne Pruefpfad.</w:t>
+      </w:r>
+    </w:p>
+    <w:p>
+      <w:r>
+        <w:t>Pruefungsnahe Transferfrage. Formuliere zu WC-V1 eine Wirkungsaussage in drei Saetzen: Erstens den beobachteten oder plausiblen Zustand, zweitens die Daten- oder Quellenlage, drittens die offene Unsicherheit samt Rueckkopplung. Die Antwort muss ohne moralische Personenbewertung auskommen und darf Reichweite nicht mit Wirkung verwechseln.</w:t>
+      </w:r>
+    </w:p>
+    <w:p>
+      <w:pPr>
+        <w:pStyle w:val="Heading3"/>
+      </w:pPr>
+      <w:r>
+        <w:t>V1-Abschlussnotiz</w:t>
+      </w:r>
+    </w:p>
+    <w:p>
+      <w:r>
+        <w:t>Diese Finalisierung schliesst die Codex-Inhaltsproduktion fuer WC-V1. Offen bleibt nicht der fachliche Kern des Skripts, sondern der naechste Produktionsschritt: Claude setzt daraus die CI/CD-konforme Reader- und PDF-Fassung, prueft Satz, Umbrueche, Medienintegration und Lektorat und markiert erst danach die veroeffentlichte Fassung als freigegeben.</w:t>
       </w:r>
     </w:p>
     <w:sectPr>

</xml_diff>

<commit_message>
Finalize WÖk V1 study scripts
</commit_message>
<xml_diff>
--- a/docs/studienskripte/word-rohfassungen/wirkungscontrolling-wc-v1.docx
+++ b/docs/studienskripte/word-rohfassungen/wirkungscontrolling-wc-v1.docx
@@ -3932,12 +3932,12 @@
     </w:p>
     <w:p>
       <w:r>
-        <w:t>Dieses Skript zu WC-V1 Von KPI zu KII und der Kennzahlen-Stack ist als Langformtext angelegt: Es soll nicht nur die Vorlesung begleiten, sondern als eigenstaendiges Studienmaterial funktionieren. Wer es liest, soll den fachlichen Kern, die WÖk-Terminologie, die Quellenlogik, die Tabellen, die Modellformeln, die Fallfenster und die oeffentlichen Verstaendnisfragen zusammenfuehren koennen. Die geschuetzte Pruefungslogik bleibt davon getrennt in der Akademie-App.</w:t>
-      </w:r>
-    </w:p>
-    <w:p>
-      <w:r>
-        <w:t>Fuer den Abschluss ist entscheidend, dass Von KPI zu KII und der Kennzahlen-Stack im Feld Impact-Controlling nicht als Einzelthema stehen bleibt. Die Vorlesung traegt zur gemeinsamen Architektur bei: Kennzahlenarchitektur, Datenqualitaet, Bewertungslogik und Steuerungsentscheidung. Daraus folgt eine Lesehaltung, die streng und praktisch zugleich ist. Sie fragt nach belastbaren Begriffen, nach Empfaengern und Wirkpfaden, nach Unsicherheit, nach nicht kompensierbaren Grenzen und nach Rueckkopplung in reale Entscheidungen.</w:t>
+        <w:t>Dieses Skript zu WC-V1 Von KPI zu KII und der Kennzahlen-Stack ist als Langformtext angelegt. Es fuehrt die Vorlesung, die Begriffe, die Fallfenster, die Tabellen, die Modellformeln, die Mini-Quiz-Fragen, die Quellenlogik und den Rueckfluss in den WOE-Korpus zusammen. Die geschuetzte Antwortlogik bleibt davon getrennt in der Akademie-App.</w:t>
+      </w:r>
+    </w:p>
+    <w:p>
+      <w:r>
+        <w:t>Der Abschluss liest Von KPI zu KII und der Kennzahlen-Stack im Feld Impact-Controlling. Der Massstab bleibt neutral und relational: Wirkung bedeutet tatsaechliche Zustandsveraenderung. Wirkungspotenzial beschreibt plausible Moeglichkeit. Wirkungsrisiko beschreibt moegliche negative Veraenderung. Wenn eine Zielgroesse gemeint ist, geht es um positive Netto-Wirkung. Genau diese Trennung entscheidet, ob das Skript fachlich traegt.</w:t>
       </w:r>
     </w:p>
     <w:p>
@@ -3945,7 +3945,7 @@
         <w:pStyle w:val="Heading3"/>
       </w:pPr>
       <w:r>
-        <w:t>Abschlussmatrix fuer die Anwendung</w:t>
+        <w:t>Abschlussmatrix</w:t>
       </w:r>
     </w:p>
     <w:tbl>
@@ -3971,7 +3971,7 @@
               <w:rPr>
                 <w:b/>
               </w:rPr>
-              <w:t>Ebene</w:t>
+              <w:t>Pruefebene</w:t>
             </w:r>
           </w:p>
         </w:tc>
@@ -3999,7 +3999,7 @@
               <w:rPr>
                 <w:b/>
               </w:rPr>
-              <w:t>Qualitaetsgrenze</w:t>
+              <w:t>Grenze</w:t>
             </w:r>
           </w:p>
         </w:tc>
@@ -4023,7 +4023,7 @@
           </w:tcPr>
           <w:p>
             <w:r>
-              <w:t>Wirkung, Wirkungspotenzial und Wirkungsrisiko werden im Kontext der Vorlesung getrennt.</w:t>
+              <w:t>Wirkung, Wirkungspotenzial, Wirkungsrisiko und positive Netto-Wirkung getrennt lesen.</w:t>
             </w:r>
           </w:p>
         </w:tc>
@@ -4034,7 +4034,7 @@
           </w:tcPr>
           <w:p>
             <w:r>
-              <w:t>keine Absicht als Wirkung ausgeben</w:t>
+              <w:t>Keine Absicht als Wirkung ausgeben.</w:t>
             </w:r>
           </w:p>
         </w:tc>
@@ -4058,7 +4058,7 @@
           </w:tcPr>
           <w:p>
             <w:r>
-              <w:t>Ausloeser, Mechanismus, Wirkungsempfaenger, Zustand und Rueckkopplung werden sichtbar.</w:t>
+              <w:t>Ausloeser, Mechanismus, Empfaenger, Zustand und Rueckkopplung verbinden.</w:t>
             </w:r>
           </w:p>
         </w:tc>
@@ -4069,7 +4069,7 @@
           </w:tcPr>
           <w:p>
             <w:r>
-              <w:t>keine lineare Erfolgsgeschichte erfinden</w:t>
+              <w:t>Keine lineare Erfolgsgeschichte erfinden.</w:t>
             </w:r>
           </w:p>
         </w:tc>
@@ -4082,7 +4082,7 @@
           </w:tcPr>
           <w:p>
             <w:r>
-              <w:t>Daten</w:t>
+              <w:t>Evidenz</w:t>
             </w:r>
           </w:p>
         </w:tc>
@@ -4093,7 +4093,7 @@
           </w:tcPr>
           <w:p>
             <w:r>
-              <w:t>Quellen, Datenqualitaet, Unsicherheit und Aktualitaet werden benannt.</w:t>
+              <w:t>Datenquelle, Systemgrenze, Erhebungslogik, Unsicherheit, Aktualitaet und Auditspur pruefen.</w:t>
             </w:r>
           </w:p>
         </w:tc>
@@ -4104,7 +4104,7 @@
           </w:tcPr>
           <w:p>
             <w:r>
-              <w:t>keine Scheingenauigkeit erzeugen</w:t>
+              <w:t>Keine Scheingenauigkeit erzeugen.</w:t>
             </w:r>
           </w:p>
         </w:tc>
@@ -4128,7 +4128,7 @@
           </w:tcPr>
           <w:p>
             <w:r>
-              <w:t>SDGs, Agenda 2030, SDG+ und WÖk-Schutzlinien bilden den Referenzrahmen.</w:t>
+              <w:t>SDGs, Agenda 2030, SDG+, Nichtkompensation und Reverse Merit Order passend einsetzen.</w:t>
             </w:r>
           </w:p>
         </w:tc>
@@ -4139,7 +4139,7 @@
           </w:tcPr>
           <w:p>
             <w:r>
-              <w:t>keine Durchschnittslogik gegen rote Linien</w:t>
+              <w:t>Keine Durchschnittslogik gegen rote Linien.</w:t>
             </w:r>
           </w:p>
         </w:tc>
@@ -4163,7 +4163,7 @@
           </w:tcPr>
           <w:p>
             <w:r>
-              <w:t>Die Bewertung fuehrt zu Entscheidung, Budget, Prozess, Kommunikation oder Korrektur.</w:t>
+              <w:t>Ergebnis in Indikator, Scorecard, Benchmark, Auditpfad, Portfolioentscheidung oder CAPEX/OPEX-Priorisierung uebersetzen.</w:t>
             </w:r>
           </w:p>
         </w:tc>
@@ -4174,7 +4174,7 @@
           </w:tcPr>
           <w:p>
             <w:r>
-              <w:t>kein Reporting ohne Rueckkopplung</w:t>
+              <w:t>Kein Reporting ohne Rueckkopplung.</w:t>
             </w:r>
           </w:p>
         </w:tc>
@@ -4186,132 +4186,107 @@
         <w:pStyle w:val="Heading3"/>
       </w:pPr>
       <w:r>
-        <w:t>Abschlusskommentar 1: Lesen, pruefen, rueckkoppeln</w:t>
-      </w:r>
-    </w:p>
-    <w:p>
-      <w:r>
-        <w:t>Die folgende Verdichtung fuehrt die vorhandenen Kapitel nicht als Wiederholung, sondern als Anwendung zusammen. Wirkungskompetenz entsteht, wenn dieselbe begriffliche Strenge in Fallanalyse, Datenarbeit, Kommunikation, Governance und Entscheidungspraxis wiedererkannt wird.</w:t>
-      </w:r>
-    </w:p>
-    <w:p>
-      <w:r>
-        <w:t>Begriffliche Schaerfung. Der Abschnitt Lernziele ist in WC-V1 kein Zusatzwissen, sondern ein Pruefstein fuer die Grundfrage des Skripts: Was veraendert sich, bei wem, wodurch und mit welcher Rueckkopplung? Fuer Von KPI zu KII und der Kennzahlen-Stack wird daran sichtbar, dass praezise Sprache die erste Sicherung gegen Impact-Washing bildet. Die fachliche Grenze liegt dort, wo Lernende Output, Reichweite, Absicht und Wirkung in einem Satz vermischen. Die saubere Lesart trennt deshalb Beobachtung, Kausalannahme, Bewertung und Steuerungsfolge. In der Anwendung sollte daraus mindestens eine konkrete Indikator, Scorecard, Benchmark, Auditpfad oder Portfolioentscheidung abgeleitet werden; sonst bleibt das Wissen erklaerend, aber nicht steuerungsfaehig.</w:t>
-      </w:r>
-    </w:p>
-    <w:p>
-      <w:r>
-        <w:t>Anwendung auf Einleitung / Wirkungsfrage. In einer Fallanalyse beginnt dieser Punkt nicht mit einer Meinung, sondern mit einer belastbaren Beschreibung. Wer WC-V1 pruefungsnah liest, fragt zuerst nach Wirkungsempfaengern, Wirkraum, Zeitraum und Datenquelle. Erst danach folgt die Bewertung im Referenzrahmen Mensch, Planet, Demokratie, SDGs, Agenda 2030 und SDG+. Mindestens ein direkter und ein indirekter Wirkpfad muessen nachvollziehbar sein. Der typische Kurzschluss waere, nur die Massnahme selbst bewerten und indirekte Empfaenger ausblenden. Genau dagegen setzt die WÖk die Pflicht, Wirkungspotenzial, Wirkungsrisiko und positive Netto-Wirkung begrifflich getrennt zu halten.</w:t>
-      </w:r>
-    </w:p>
-    <w:p>
-      <w:r>
-        <w:t>Evidenzregel. Kernaussage darf im Skript nicht als dekorativer Begriff stehen bleiben. Der Abschnitt traegt nur dann, wenn er eine pruefbare Aussage erlaubt: Welche Quelle stuetzt die Annahme, welche Unsicherheit bleibt offen und welche Gegenbeobachtung wuerde die Bewertung veraendern? Fuer Von KPI zu KII und der Kennzahlen-Stack heisst das, dass jede Bewertung nur so belastbar ist wie Datenlage, Quellenstatus, Aktualitaet und Systemgrenze. Die Studierenden sollen nicht lernen, einen Score nachzusprechen. Sie sollen erkennen, wann ein Score klaert, wann er verdeckt und wann eine rote Linie die Durchschnittslogik stoppt.</w:t>
-      </w:r>
-    </w:p>
-    <w:p>
-      <w:r>
-        <w:t>Fallfenster zur Anwendung. Ein Controlling-Team moechte einen Score bilden. Das Skript verlangt, dass Datenqualitaet, Systemgrenzen, Gewichtung, Unsicherheit und Nichtkompensation sichtbar bleiben. Ein Score darf die Diskussion nicht beenden, sondern muss bessere Fragen, Priorisierung und Rueckkopplung ermoeglichen. Bezogen auf Von KPI zu KII und der Kennzahlen-Stack heisst das: Die Analyse muss das konkrete Thema ernst nehmen und zugleich den allgemeinen WÖk-Massstab halten. Es geht nicht darum, Akteure moralisch zu sortieren. Es geht darum, Wirkpfade, Wirkungsempfaenger, Datenqualitaet, Risiken und Rueckkopplung so zu beschreiben, dass bessere Entscheidungen moeglich werden.</w:t>
-      </w:r>
-    </w:p>
-    <w:p>
-      <w:r>
-        <w:t>Transfer in Impact-Controlling. Quelltext und fachliche Grundlegung verbindet die inhaltliche Deutung mit der spaeteren Praxis. Eine Organisation kann zu Von KPI zu KII und der Kennzahlen-Stack sehr ueberzeugend kommunizieren und trotzdem an Zahlen als Beweis zu behandeln, obwohl Systemgrenze, Datenqualitaet, Unsicherheit oder Nichtkompensation ungeklaert sind scheitern. Darum muss die V1-Fassung immer auch nach Governance fragen: Wer erhebt Daten, wer bewertet sie, wer traegt die Folgen, wer kann widersprechen und wann wird eine Entscheidung korrigiert? Profile, Zielkonflikte und offene Punkte werden nebeneinander gefuehrt. So wird aus einem Lehrkapitel eine verantwortbare Arbeitsroutine.</w:t>
-      </w:r>
-    </w:p>
-    <w:p>
-      <w:r>
-        <w:t>Grenze gegen Scheingenauigkeit. Gerade bei Einstieg / Wirkungsfrage ist Praezision wichtiger als grosse Begriffe. Eine Wirkungsaussage bleibt schwach, wenn sie nur Aktivitaet, Reichweite, Absicht oder Image beschreibt. Stark wird sie erst, wenn sie die Zustandsveraenderung und ihre Bedingungen offenlegt. In WC-V1 ist deshalb entscheidend, schwere zentrale Schaeden nicht durch beliebige positive Einzelwerte neutralisiert werden duerfen. Die Fehlerlinie verlaeuft nicht zwischen Optimismus und Pessimismus, sondern zwischen offengelegter Unsicherheit und rhetorischer Sicherheit ohne Pruefpfad.</w:t>
-      </w:r>
-    </w:p>
-    <w:p>
-      <w:r>
-        <w:t>Pruefungsnahe Transferfrage. Formuliere zu WC-V1 eine Wirkungsaussage in drei Saetzen: Erstens den beobachteten oder plausiblen Zustand, zweitens die Daten- oder Quellenlage, drittens die offene Unsicherheit samt Rueckkopplung. Die Antwort muss ohne moralische Personenbewertung auskommen und darf Reichweite nicht mit Wirkung verwechseln.</w:t>
-      </w:r>
-    </w:p>
-    <w:p>
-      <w:r>
-        <w:t>Pruefungsnahe Lesart. Aus Video-/Audio-Vorlesung laesst sich eine gute Transferfrage ableiten: Welche Entscheidung waere falsch, wenn dieser Abschnitt missverstanden wird? Fuer Von KPI zu KII und der Kennzahlen-Stack lautet die Antwort meist nicht einfach "mehr Wirkung", sondern genauer: bessere Unterscheidung, sauberere Daten, klarere Schutzlinie und rueckgekoppelte Steuerung. Jeder Analyseblock fragt nach der Routine, die nach der Bewertung angepasst wird. Wer das im Fall anwenden kann, hat den Kern der Vorlesung verstanden; wer nur Definitionen wiederholt, bleibt unter dem Anspruch der Akademie.</w:t>
-      </w:r>
-    </w:p>
-    <w:p>
-      <w:r>
-        <w:t>Fallfenster zur Anwendung. Ein Kommunikationsbericht nennt viele Aktivitaeten, Reichweiten und Rueckmeldungen. Die V1-Pruefung fragt, ob daraus eine belastbare Wirkungsaussage folgt. Wenn nur Kontakte, Klicks oder Zustimmung vorliegen, bleibt die Aussage im Bereich Wirkungspotenzial oder Resonanz, nicht im Bereich nachgewiesener Wirkung. Bezogen auf Von KPI zu KII und der Kennzahlen-Stack heisst das: Die Analyse muss das konkrete Thema ernst nehmen und zugleich den allgemeinen WÖk-Massstab halten. Es geht nicht darum, Akteure moralisch zu sortieren. Es geht darum, Wirkpfade, Wirkungsempfaenger, Datenqualitaet, Risiken und Rueckkopplung so zu beschreiben, dass bessere Entscheidungen moeglich werden.</w:t>
-      </w:r>
-    </w:p>
-    <w:p>
-      <w:r>
-        <w:t>Governance. Der Abschnitt Transkript (Gerüst) ist in WC-V1 kein Zusatzwissen, sondern ein Pruefstein fuer die Grundfrage des Skripts: Was veraendert sich, bei wem, wodurch und mit welcher Rueckkopplung? Fuer Von KPI zu KII und der Kennzahlen-Stack wird daran sichtbar, dass Wirkungsbewertung Verfahren, Rechte, Transparenz und Korrektur braucht. Die fachliche Grenze liegt dort, wo Lernende Bewertung als technokratische Top-down-Setzung verstehen. Die saubere Lesart trennt deshalb Beobachtung, Kausalannahme, Bewertung und Steuerungsfolge. In der Anwendung sollte daraus mindestens eine konkrete Indikator, Scorecard, Benchmark, Auditpfad oder Portfolioentscheidung abgeleitet werden; sonst bleibt das Wissen erklaerend, aber nicht steuerungsfaehig.</w:t>
-      </w:r>
-    </w:p>
-    <w:p>
-      <w:r>
-        <w:t>Anwendung auf Skript / Folien (Lernseite). In einer Fallanalyse beginnt dieser Punkt nicht mit einer Meinung, sondern mit einer belastbaren Beschreibung. Wer WC-V1 pruefungsnah liest, fragt zuerst nach Wirkungsempfaengern, Wirkraum, Zeitraum und Datenquelle. Erst danach folgt die Bewertung im Referenzrahmen Mensch, Planet, Demokratie, SDGs, Agenda 2030 und SDG+. Pruefungsfragen verbinden Begriff, Anwendung, Evidenz und rote Linie. Der typische Kurzschluss waere, reines Auswendiglernen als Kompetenznachweis behandeln. Genau dagegen setzt die WÖk die Pflicht, Wirkungspotenzial, Wirkungsrisiko und positive Netto-Wirkung begrifflich getrennt zu halten.</w:t>
-      </w:r>
-    </w:p>
-    <w:p>
-      <w:r>
-        <w:t>Evidenzregel. Transferaufgabe darf im Skript nicht als dekorativer Begriff stehen bleiben. Der Abschnitt traegt nur dann, wenn er eine pruefbare Aussage erlaubt: Welche Quelle stuetzt die Annahme, welche Unsicherheit bleibt offen und welche Gegenbeobachtung wuerde die Bewertung veraendern? Fuer Von KPI zu KII und der Kennzahlen-Stack heisst das, dass WÖk-Begriffe im Alltag nur tragen, wenn sie in Routinen uebersetzt werden. Die Studierenden sollen nicht lernen, einen Score nachzusprechen. Sie sollen erkennen, wann ein Score klaert, wann er verdeckt und wann eine rote Linie die Durchschnittslogik stoppt.</w:t>
-      </w:r>
-    </w:p>
-    <w:p>
-      <w:r>
-        <w:t>Fallfenster zur Anwendung. Eine Organisation plant eine Massnahme und formuliert dazu eine positive Absicht. In der WÖk reicht das nicht. Fuer diese Vorlesung muss sichtbar werden, welche Zustandsveraenderung erwartet wird, welche Empfaenger direkt oder indirekt betroffen sind, welche Nebenwirkungen entstehen koennen und welche Entscheidung spaeter korrigiert wird. Bezogen auf Von KPI zu KII und der Kennzahlen-Stack heisst das: Die Analyse muss das konkrete Thema ernst nehmen und zugleich den allgemeinen WÖk-Massstab halten. Es geht nicht darum, Akteure moralisch zu sortieren. Es geht darum, Wirkpfade, Wirkungsempfaenger, Datenqualitaet, Risiken und Rueckkopplung so zu beschreiben, dass bessere Entscheidungen moeglich werden.</w:t>
-      </w:r>
-    </w:p>
-    <w:p>
-      <w:r>
-        <w:t>Transfer in Impact-Controlling. Praxisbeispiel verbindet die inhaltliche Deutung mit der spaeteren Praxis. Eine Organisation kann zu Von KPI zu KII und der Kennzahlen-Stack sehr ueberzeugend kommunizieren und trotzdem an Zahlen als Beweis zu behandeln, obwohl Systemgrenze, Datenqualitaet, Unsicherheit oder Nichtkompensation ungeklaert sind scheitern. Darum muss die V1-Fassung immer auch nach Governance fragen: Wer erhebt Daten, wer bewertet sie, wer traegt die Folgen, wer kann widersprechen und wann wird eine Entscheidung korrigiert? Gute Kommunikation unterscheidet Befund, Annahme und normative Bewertung. So wird aus einem Lehrkapitel eine verantwortbare Arbeitsroutine.</w:t>
-      </w:r>
-    </w:p>
-    <w:p>
-      <w:r>
-        <w:t>Pruefungsnahe Transferfrage. Formuliere zu WC-V1 eine Wirkungsaussage in drei Saetzen: Erstens den beobachteten oder plausiblen Zustand, zweitens die Daten- oder Quellenlage, drittens die offene Unsicherheit samt Rueckkopplung. Die Antwort muss ohne moralische Personenbewertung auskommen und darf Reichweite nicht mit Wirkung verwechseln.</w:t>
-      </w:r>
-    </w:p>
-    <w:p>
-      <w:r>
-        <w:t>Grenze gegen Scheingenauigkeit. Gerade bei Wirkungsökonomische Vertiefung ist Praezision wichtiger als grosse Begriffe. Eine Wirkungsaussage bleibt schwach, wenn sie nur Aktivitaet, Reichweite, Absicht oder Image beschreibt. Stark wird sie erst, wenn sie die Zustandsveraenderung und ihre Bedingungen offenlegt. In WC-V1 ist deshalb entscheidend, jede Wirkungsaussage eine Grenze zieht und diese Grenze begruenden muss. Die Fehlerlinie verlaeuft nicht zwischen Optimismus und Pessimismus, sondern zwischen offengelegter Unsicherheit und rhetorischer Sicherheit ohne Pruefpfad.</w:t>
-      </w:r>
-    </w:p>
-    <w:p>
-      <w:r>
-        <w:t>Pruefungsnahe Lesart. Aus Prüfungsrelevanz laesst sich eine gute Transferfrage ableiten: Welche Entscheidung waere falsch, wenn dieser Abschnitt missverstanden wird? Fuer Von KPI zu KII und der Kennzahlen-Stack lautet die Antwort meist nicht einfach "mehr Wirkung", sondern genauer: bessere Unterscheidung, sauberere Daten, klarere Schutzlinie und rueckgekoppelte Steuerung. Szenarien pruefen Sofortwirkung, Folgewirkung und Reversibilitaet getrennt. Wer das im Fall anwenden kann, hat den Kern der Vorlesung verstanden; wer nur Definitionen wiederholt, bleibt unter dem Anspruch der Akademie.</w:t>
-      </w:r>
-    </w:p>
-    <w:p>
-      <w:r>
-        <w:t>Fallfenster zur Anwendung. Eine Fuehrungsentscheidung erzeugt zugleich Nutzen und Risiken. Die WÖk behandelt Ambivalenz nicht als Stoerung, sondern als Kern der Analyse. Positive Netto-Wirkung darf erst behauptet werden, wenn zentrale negative Wirkungen getrennt geprueft und rote Linien gewahrt sind. Bezogen auf Von KPI zu KII und der Kennzahlen-Stack heisst das: Die Analyse muss das konkrete Thema ernst nehmen und zugleich den allgemeinen WÖk-Massstab halten. Es geht nicht darum, Akteure moralisch zu sortieren. Es geht darum, Wirkpfade, Wirkungsempfaenger, Datenqualitaet, Risiken und Rueckkopplung so zu beschreiben, dass bessere Entscheidungen moeglich werden.</w:t>
-      </w:r>
-    </w:p>
-    <w:p>
-      <w:r>
-        <w:t>Betroffenenperspektive. Der Abschnitt Lernziele ist in WC-V1 kein Zusatzwissen, sondern ein Pruefstein fuer die Grundfrage des Skripts: Was veraendert sich, bei wem, wodurch und mit welcher Rueckkopplung? Fuer Von KPI zu KII und der Kennzahlen-Stack wird daran sichtbar, dass Wirkung nicht am Sender, sondern an veraenderten Zustanden der Empfaenger geprueft wird. Die fachliche Grenze liegt dort, wo Lernende interne Erfolgskennzahlen mit gesellschaftlicher Wirkung verwechseln. Die saubere Lesart trennt deshalb Beobachtung, Kausalannahme, Bewertung und Steuerungsfolge. In der Anwendung sollte daraus mindestens eine konkrete Indikator, Scorecard, Benchmark, Auditpfad oder Portfolioentscheidung abgeleitet werden; sonst bleibt das Wissen erklaerend, aber nicht steuerungsfaehig.</w:t>
-      </w:r>
-    </w:p>
-    <w:p>
-      <w:r>
-        <w:t>Anwendung auf Einleitung / Wirkungsfrage. In einer Fallanalyse beginnt dieser Punkt nicht mit einer Meinung, sondern mit einer belastbaren Beschreibung. Wer WC-V1 pruefungsnah liest, fragt zuerst nach Wirkungsempfaengern, Wirkraum, Zeitraum und Datenquelle. Erst danach folgt die Bewertung im Referenzrahmen Mensch, Planet, Demokratie, SDGs, Agenda 2030 und SDG+. Jede Schlussfolgerung endet mit Entscheidung, Verantwortlichkeit und Termin fuer Rueckpruefung. Der typische Kurzschluss waere, Befunde sammeln, ohne Ressourcen oder Regeln zu veraendern. Genau dagegen setzt die WÖk die Pflicht, Wirkungspotenzial, Wirkungsrisiko und positive Netto-Wirkung begrifflich getrennt zu halten.</w:t>
-      </w:r>
-    </w:p>
-    <w:p>
-      <w:r>
-        <w:t>Evidenzregel. Kernaussage darf im Skript nicht als dekorativer Begriff stehen bleiben. Der Abschnitt traegt nur dann, wenn er eine pruefbare Aussage erlaubt: Welche Quelle stuetzt die Annahme, welche Unsicherheit bleibt offen und welche Gegenbeobachtung wuerde die Bewertung veraendern? Fuer Von KPI zu KII und der Kennzahlen-Stack heisst das, dass WÖk-Aussagen mit bestehenden Begriffen, Studien, Standards und Rechtsrahmen in Beziehung stehen muessen. Die Studierenden sollen nicht lernen, einen Score nachzusprechen. Sie sollen erkennen, wann ein Score klaert, wann er verdeckt und wann eine rote Linie die Durchschnittslogik stoppt.</w:t>
-      </w:r>
-    </w:p>
-    <w:p>
-      <w:r>
-        <w:t>Fallfenster zur Anwendung. Ein Controlling-Team moechte einen Score bilden. Das Skript verlangt, dass Datenqualitaet, Systemgrenzen, Gewichtung, Unsicherheit und Nichtkompensation sichtbar bleiben. Ein Score darf die Diskussion nicht beenden, sondern muss bessere Fragen, Priorisierung und Rueckkopplung ermoeglichen. Bezogen auf Von KPI zu KII und der Kennzahlen-Stack heisst das: Die Analyse muss das konkrete Thema ernst nehmen und zugleich den allgemeinen WÖk-Massstab halten. Es geht nicht darum, Akteure moralisch zu sortieren. Es geht darum, Wirkpfade, Wirkungsempfaenger, Datenqualitaet, Risiken und Rueckkopplung so zu beschreiben, dass bessere Entscheidungen moeglich werden.</w:t>
-      </w:r>
-    </w:p>
-    <w:p>
-      <w:r>
-        <w:t>Pruefungsnahe Transferfrage. Formuliere zu WC-V1 eine Wirkungsaussage in drei Saetzen: Erstens den beobachteten oder plausiblen Zustand, zweitens die Daten- oder Quellenlage, drittens die offene Unsicherheit samt Rueckkopplung. Die Antwort muss ohne moralische Personenbewertung auskommen und darf Reichweite nicht mit Wirkung verwechseln.</w:t>
-      </w:r>
-    </w:p>
-    <w:p>
-      <w:r>
-        <w:t>Transfer in Impact-Controlling. Quelltext und fachliche Grundlegung verbindet die inhaltliche Deutung mit der spaeteren Praxis. Eine Organisation kann zu Von KPI zu KII und der Kennzahlen-Stack sehr ueberzeugend kommunizieren und trotzdem an Zahlen als Beweis zu behandeln, obwohl Systemgrenze, Datenqualitaet, Unsicherheit oder Nichtkompensation ungeklaert sind scheitern. Darum muss die V1-Fassung immer auch nach Governance fragen: Wer erhebt Daten, wer bewertet sie, wer traegt die Folgen, wer kann widersprechen und wann wird eine Entscheidung korrigiert? Die Analyse markiert Stoppsignale vor jeder Portfolio- oder Score-Debatte. So wird aus einem Lehrkapitel eine verantwortbare Arbeitsroutine.</w:t>
+        <w:t>Schlussvertiefung 1: Von KPI zu KII und der Kennzahlen-Stack im Anwendungsfall</w:t>
+      </w:r>
+    </w:p>
+    <w:p>
+      <w:r>
+        <w:t>Die folgenden Abschnitte sind keine neue Pruefungsloesung. Sie verdichten die vorhandenen Kapitel zu einer Lesart, mit der Studierende einen Fall selbststaendig analysieren koennen. Im Mittelpunkt stehen Datenqualitaet, Bewertungsprofile, Scorecards und rueckgekoppelte Steuerung, nicht moralische Personenbewertung.</w:t>
+      </w:r>
+    </w:p>
+    <w:p>
+      <w:r>
+        <w:t>Begriffliche Schlussklaerung. Einleitung / Wirkungsfrage zeigt, warum Von KPI zu KII und der Kennzahlen-Stack mehr ist als ein Schlagwort im Feld Datenqualitaet, Bewertungsprofile, Scorecards und rueckgekoppelte Steuerung. Die wirkungsoekonomische Frage lautet: Welche reale Veraenderung wird moeglich, welche bleibt nur Potenzial und wo entsteht ein Wirkungsrisiko? Diese Unterscheidung schuetzt vor Impact-Washing, weil sie Absicht, Aktivitaet, Reichweite und Wirkung auseinanderhaelt.</w:t>
+      </w:r>
+    </w:p>
+    <w:p>
+      <w:r>
+        <w:t>Eine Kommune, ein Unternehmen oder eine Bildungsorganisation will Von KPI zu KII und der Kennzahlen-Stack praktisch anwenden. Der erste Schritt ist nicht die Auswahl eines Instruments, sondern die Klaerung der Zustandsveraenderung. Bei Einleitung / Wirkungsfrage muss deshalb benannt werden, wer betroffen ist, welcher Zustand sich veraendert, welche Frist gilt und welche Gegenbeobachtung die Annahme widerlegen wuerde. Erst danach entsteht eine begruendete Entscheidung im Feld Indikator, Scorecard, Benchmark, Auditpfad, Portfolioentscheidung oder CAPEX/OPEX-Priorisierung.</w:t>
+      </w:r>
+    </w:p>
+    <w:p>
+      <w:r>
+        <w:t>Wirkpfad und Empfaenger. In WC-V1 muss Kernaussage immer mit Empfaengern gelesen werden. Wirkung entsteht nicht beim Sender, sondern an veraenderten Zustaenden von Menschen, Oekosystemen, Institutionen, Oeffentlichkeit oder kuenftigen Handlungsspielraeumen. Darum reicht es nicht, interne Aktivitaeten zu dokumentieren. Entscheidend ist, ob sich ein Zustand nachvollziehbar veraendert und ob diese Veraenderung im Referenzrahmen Mensch, Planet, Demokratie, SDGs, Agenda 2030 und SDG+ tragfaehig bewertet werden kann.</w:t>
+      </w:r>
+    </w:p>
+    <w:p>
+      <w:r>
+        <w:t>Ein Bericht behauptet, die Massnahme zu Von KPI zu KII und der Kennzahlen-Stack sei erfolgreich. Die WOE-Lesart fragt bei Kernaussage nach belastbaren Nachweisen: Datenquelle, Systemgrenze, Erhebungslogik, Unsicherheit, Aktualitaet und Auditspur. Wenn diese Nachweise fehlen, bleibt die Aussage Wirkungspotenzial oder Kommunikationsbehauptung. Sie kann wichtig sein, aber sie ist noch keine belegte Wirkung.</w:t>
+      </w:r>
+    </w:p>
+    <w:p>
+      <w:r>
+        <w:t>Daten, Quellen und Evidenz. Wissenschaftliche Anschlussfaehigkeit entsteht hier durch Quellenklarheit. Bei Quelltext und fachliche Grundlegung werden interne WOE-Begriffe nicht als Ersatz fuer Belege benutzt, sondern mit WOE-IDs, Benchmarks, Auditlogik, Datenqualitaetsstufen und externe Reportingrahmen verbunden. Wo die Datenlage offen bleibt, wird das offengelegt. Wo eine Aussage nur plausibel ist, bleibt sie als Wirkungspotenzial markiert. Wo ein Schaden eine rote Linie beruehrt, greift Nichtkompensation vor Durchschnittslogik.</w:t>
+      </w:r>
+    </w:p>
+    <w:p>
+      <w:r>
+        <w:t>In einer kontroversen Entscheidung wirkt Quelltext und fachliche Grundlegung als Pruefpunkt fuer Ambivalenz. Ein Nutzen fuer eine Gruppe kann mit Risiken fuer andere Wirkungsempfaenger einhergehen. Das Skript verlangt deshalb, positive und negative Zustandsveraenderungen getrennt zu fuehren, bevor von positiver Netto-Wirkung gesprochen wird.</w:t>
+      </w:r>
+    </w:p>
+    <w:p>
+      <w:r>
+        <w:t>Bewertung und rote Linien. In Impact-Controlling wird Einstieg / Wirkungsfrage erst steuerungsfaehig, wenn daraus eine Entscheidung folgt. Kennzahlen muessen Entscheidungen verbessern, nicht nur Berichte fuellen. Ohne diese Rueckkopplung bleibt Reporting eine Beschreibung. Mit Rueckkopplung wird aus Bewertung eine veraenderte Routine: ein anderer Prozess, ein geaenderter Anreiz, eine bessere Datenpflicht, eine korrigierte Kommunikation oder eine neue Priorisierung.</w:t>
+      </w:r>
+    </w:p>
+    <w:p>
+      <w:r>
+        <w:t>Die typische Fehlstelle bei Von KPI zu KII und der Kennzahlen-Stack liegt darin, Messbarkeit als Wahrheit zu behandeln. Bei Einstieg / Wirkungsfrage wird diese Fehlstelle konkret: Ein scheinbar plausibler Befund darf nicht zur Abkuerzung werden. Quellen, Systemgrenzen, Unsicherheit und Rueckkopplung bleiben sichtbar.</w:t>
+      </w:r>
+    </w:p>
+    <w:p>
+      <w:r>
+        <w:t>Kontrollfrage. Welche Entscheidung waere falsch, wenn Einstieg / Wirkungsfrage in WC-V1 missverstanden wird? Die Antwort muss mindestens eine Daten- oder Quellenannahme, eine betroffene Gruppe oder Schutzdimension, eine moegliche Nebenwirkung und einen Rueckkopplungsschritt nennen. Richtig ist nicht die lauteste Bewertung, sondern diejenige, die Begriff, Beleg und Steuerungsfolge zusammenhaelt.</w:t>
+      </w:r>
+    </w:p>
+    <w:p>
+      <w:r>
+        <w:t>Steuerung und Rueckkopplung. Die Grenze gegen Scheingenauigkeit verlaeuft bei Skript / Folien (Lernseite) nicht zwischen Optimismus und Pessimismus. Sie verlaeuft zwischen offengelegter Unsicherheit und rhetorischer Sicherheit. Wer Von KPI zu KII und der Kennzahlen-Stack belastbar anwenden will, benennt Systemgrenze, Zeitraum, Vergleichspunkt und offene Gegenhypothese. Gerade dadurch bleibt das Skript anschlussfaehig fuer Forschung, Praxis und spaetere Revision.</w:t>
+      </w:r>
+    </w:p>
+    <w:p>
+      <w:r>
+        <w:t>Fuer die Pruefung ist Skript / Folien (Lernseite) dann verstanden, wenn daraus eine belastbare Fallantwort entsteht. Eine gute Antwort unterscheidet Beobachtung, Kausalannahme, Bewertung und Steuerungsfolge. Sie bewertet keine Menschen, sondern Wirkpfade, Zustandsveraenderungen, Risiken und institutionelle Bedingungen.</w:t>
+      </w:r>
+    </w:p>
+    <w:p>
+      <w:r>
+        <w:t>Pruefungsnahe Anwendung. Transferaufgabe zeigt, warum Von KPI zu KII und der Kennzahlen-Stack mehr ist als ein Schlagwort im Feld Datenqualitaet, Bewertungsprofile, Scorecards und rueckgekoppelte Steuerung. Die wirkungsoekonomische Frage lautet: Welche reale Veraenderung wird moeglich, welche bleibt nur Potenzial und wo entsteht ein Wirkungsrisiko? Diese Unterscheidung schuetzt vor Impact-Washing, weil sie Absicht, Aktivitaet, Reichweite und Wirkung auseinanderhaelt.</w:t>
+      </w:r>
+    </w:p>
+    <w:p>
+      <w:r>
+        <w:t>Eine Kommune, ein Unternehmen oder eine Bildungsorganisation will Von KPI zu KII und der Kennzahlen-Stack praktisch anwenden. Der erste Schritt ist nicht die Auswahl eines Instruments, sondern die Klaerung der Zustandsveraenderung. Bei Transferaufgabe muss deshalb benannt werden, wer betroffen ist, welcher Zustand sich veraendert, welche Frist gilt und welche Gegenbeobachtung die Annahme widerlegen wuerde. Erst danach entsteht eine begruendete Entscheidung im Feld Indikator, Scorecard, Benchmark, Auditpfad, Portfolioentscheidung oder CAPEX/OPEX-Priorisierung.</w:t>
+      </w:r>
+    </w:p>
+    <w:p>
+      <w:r>
+        <w:t>Rueckfluss. Fuer den WOE-Korpus bedeutet das: Begriffe aus Von KPI zu KII und der Kennzahlen-Stack sollten dort geschaerft werden, wo sie in Glossar, Werkzeugen, Journal oder Readern doppeldeutig bleiben. Offene Forschungsfragen werden nicht versteckt. Sie markieren die Stelle, an der spaetere Evidenz, ein besserer Datensatz oder eine praezisere Fallstudie die Bewertung veraendern kann.</w:t>
+      </w:r>
+    </w:p>
+    <w:p>
+      <w:r>
+        <w:t>Transfer in den WOE-Korpus. In WC-V1 muss Praxisbeispiel immer mit Empfaengern gelesen werden. Wirkung entsteht nicht beim Sender, sondern an veraenderten Zustaenden von Menschen, Oekosystemen, Institutionen, Oeffentlichkeit oder kuenftigen Handlungsspielraeumen. Darum reicht es nicht, interne Aktivitaeten zu dokumentieren. Entscheidend ist, ob sich ein Zustand nachvollziehbar veraendert und ob diese Veraenderung im Referenzrahmen Mensch, Planet, Demokratie, SDGs, Agenda 2030 und SDG+ tragfaehig bewertet werden kann.</w:t>
+      </w:r>
+    </w:p>
+    <w:p>
+      <w:r>
+        <w:t>Ein Bericht behauptet, die Massnahme zu Von KPI zu KII und der Kennzahlen-Stack sei erfolgreich. Die WOE-Lesart fragt bei Praxisbeispiel nach belastbaren Nachweisen: Datenquelle, Systemgrenze, Erhebungslogik, Unsicherheit, Aktualitaet und Auditspur. Wenn diese Nachweise fehlen, bleibt die Aussage Wirkungspotenzial oder Kommunikationsbehauptung. Sie kann wichtig sein, aber sie ist noch keine belegte Wirkung.</w:t>
+      </w:r>
+    </w:p>
+    <w:p>
+      <w:r>
+        <w:t>Grenzen der Aussage. Wissenschaftliche Anschlussfaehigkeit entsteht hier durch Quellenklarheit. Bei Wirkungsökonomische Vertiefung werden interne WOE-Begriffe nicht als Ersatz fuer Belege benutzt, sondern mit WOE-IDs, Benchmarks, Auditlogik, Datenqualitaetsstufen und externe Reportingrahmen verbunden. Wo die Datenlage offen bleibt, wird das offengelegt. Wo eine Aussage nur plausibel ist, bleibt sie als Wirkungspotenzial markiert. Wo ein Schaden eine rote Linie beruehrt, greift Nichtkompensation vor Durchschnittslogik.</w:t>
+      </w:r>
+    </w:p>
+    <w:p>
+      <w:r>
+        <w:t>In einer kontroversen Entscheidung wirkt Wirkungsökonomische Vertiefung als Pruefpunkt fuer Ambivalenz. Ein Nutzen fuer eine Gruppe kann mit Risiken fuer andere Wirkungsempfaenger einhergehen. Das Skript verlangt deshalb, positive und negative Zustandsveraenderungen getrennt zu fuehren, bevor von positiver Netto-Wirkung gesprochen wird.</w:t>
+      </w:r>
+    </w:p>
+    <w:p>
+      <w:r>
+        <w:t>Kontrollfrage. Welche Entscheidung waere falsch, wenn Wirkungsökonomische Vertiefung in WC-V1 missverstanden wird? Die Antwort muss mindestens eine Daten- oder Quellenannahme, eine betroffene Gruppe oder Schutzdimension, eine moegliche Nebenwirkung und einen Rueckkopplungsschritt nennen. Richtig ist nicht die lauteste Bewertung, sondern diejenige, die Begriff, Beleg und Steuerungsfolge zusammenhaelt.</w:t>
       </w:r>
     </w:p>
     <w:p>
@@ -4319,132 +4294,107 @@
         <w:pStyle w:val="Heading3"/>
       </w:pPr>
       <w:r>
-        <w:t>Abschlusskommentar 2: Lesen, pruefen, rueckkoppeln</w:t>
-      </w:r>
-    </w:p>
-    <w:p>
-      <w:r>
-        <w:t>Die folgende Verdichtung fuehrt die vorhandenen Kapitel nicht als Wiederholung, sondern als Anwendung zusammen. Wirkungskompetenz entsteht, wenn dieselbe begriffliche Strenge in Fallanalyse, Datenarbeit, Kommunikation, Governance und Entscheidungspraxis wiedererkannt wird.</w:t>
-      </w:r>
-    </w:p>
-    <w:p>
-      <w:r>
-        <w:t>Grenze gegen Scheingenauigkeit. Gerade bei Einstieg / Wirkungsfrage ist Praezision wichtiger als grosse Begriffe. Eine Wirkungsaussage bleibt schwach, wenn sie nur Aktivitaet, Reichweite, Absicht oder Image beschreibt. Stark wird sie erst, wenn sie die Zustandsveraenderung und ihre Bedingungen offenlegt. In WC-V1 ist deshalb entscheidend, praezise Sprache die erste Sicherung gegen Impact-Washing bildet. Die Fehlerlinie verlaeuft nicht zwischen Optimismus und Pessimismus, sondern zwischen offengelegter Unsicherheit und rhetorischer Sicherheit ohne Pruefpfad.</w:t>
-      </w:r>
-    </w:p>
-    <w:p>
-      <w:r>
-        <w:t>Pruefungsnahe Lesart. Aus Video-/Audio-Vorlesung laesst sich eine gute Transferfrage ableiten: Welche Entscheidung waere falsch, wenn dieser Abschnitt missverstanden wird? Fuer Von KPI zu KII und der Kennzahlen-Stack lautet die Antwort meist nicht einfach "mehr Wirkung", sondern genauer: bessere Unterscheidung, sauberere Daten, klarere Schutzlinie und rueckgekoppelte Steuerung. Mindestens ein direkter und ein indirekter Wirkpfad muessen nachvollziehbar sein. Wer das im Fall anwenden kann, hat den Kern der Vorlesung verstanden; wer nur Definitionen wiederholt, bleibt unter dem Anspruch der Akademie.</w:t>
-      </w:r>
-    </w:p>
-    <w:p>
-      <w:r>
-        <w:t>Fallfenster zur Anwendung. Ein Kommunikationsbericht nennt viele Aktivitaeten, Reichweiten und Rueckmeldungen. Die V1-Pruefung fragt, ob daraus eine belastbare Wirkungsaussage folgt. Wenn nur Kontakte, Klicks oder Zustimmung vorliegen, bleibt die Aussage im Bereich Wirkungspotenzial oder Resonanz, nicht im Bereich nachgewiesener Wirkung. Bezogen auf Von KPI zu KII und der Kennzahlen-Stack heisst das: Die Analyse muss das konkrete Thema ernst nehmen und zugleich den allgemeinen WÖk-Massstab halten. Es geht nicht darum, Akteure moralisch zu sortieren. Es geht darum, Wirkpfade, Wirkungsempfaenger, Datenqualitaet, Risiken und Rueckkopplung so zu beschreiben, dass bessere Entscheidungen moeglich werden.</w:t>
-      </w:r>
-    </w:p>
-    <w:p>
-      <w:r>
-        <w:t>Daten- und Quellenklarheit. Der Abschnitt Transkript (Gerüst) ist in WC-V1 kein Zusatzwissen, sondern ein Pruefstein fuer die Grundfrage des Skripts: Was veraendert sich, bei wem, wodurch und mit welcher Rueckkopplung? Fuer Von KPI zu KII und der Kennzahlen-Stack wird daran sichtbar, dass jede Bewertung nur so belastbar ist wie Datenlage, Quellenstatus, Aktualitaet und Systemgrenze. Die fachliche Grenze liegt dort, wo Lernende eine Zahl ohne Einheit, Zeitraum oder Erhebungslogik als Beweis nutzen. Die saubere Lesart trennt deshalb Beobachtung, Kausalannahme, Bewertung und Steuerungsfolge. In der Anwendung sollte daraus mindestens eine konkrete Indikator, Scorecard, Benchmark, Auditpfad oder Portfolioentscheidung abgeleitet werden; sonst bleibt das Wissen erklaerend, aber nicht steuerungsfaehig.</w:t>
-      </w:r>
-    </w:p>
-    <w:p>
-      <w:r>
-        <w:t>Anwendung auf Skript / Folien (Lernseite). In einer Fallanalyse beginnt dieser Punkt nicht mit einer Meinung, sondern mit einer belastbaren Beschreibung. Wer WC-V1 pruefungsnah liest, fragt zuerst nach Wirkungsempfaengern, Wirkraum, Zeitraum und Datenquelle. Erst danach folgt die Bewertung im Referenzrahmen Mensch, Planet, Demokratie, SDGs, Agenda 2030 und SDG+. Profile, Zielkonflikte und offene Punkte werden nebeneinander gefuehrt. Der typische Kurzschluss waere, ambivalente Befunde glaetten, damit eine eindeutige Botschaft entsteht. Genau dagegen setzt die WÖk die Pflicht, Wirkungspotenzial, Wirkungsrisiko und positive Netto-Wirkung begrifflich getrennt zu halten.</w:t>
-      </w:r>
-    </w:p>
-    <w:p>
-      <w:r>
-        <w:t>Pruefungsnahe Transferfrage. Formuliere zu WC-V1 eine Wirkungsaussage in drei Saetzen: Erstens den beobachteten oder plausiblen Zustand, zweitens die Daten- oder Quellenlage, drittens die offene Unsicherheit samt Rueckkopplung. Die Antwort muss ohne moralische Personenbewertung auskommen und darf Reichweite nicht mit Wirkung verwechseln.</w:t>
-      </w:r>
-    </w:p>
-    <w:p>
-      <w:r>
-        <w:t>Evidenzregel. Transferaufgabe darf im Skript nicht als dekorativer Begriff stehen bleiben. Der Abschnitt traegt nur dann, wenn er eine pruefbare Aussage erlaubt: Welche Quelle stuetzt die Annahme, welche Unsicherheit bleibt offen und welche Gegenbeobachtung wuerde die Bewertung veraendern? Fuer Von KPI zu KII und der Kennzahlen-Stack heisst das, dass schwere zentrale Schaeden nicht durch beliebige positive Einzelwerte neutralisiert werden duerfen. Die Studierenden sollen nicht lernen, einen Score nachzusprechen. Sie sollen erkennen, wann ein Score klaert, wann er verdeckt und wann eine rote Linie die Durchschnittslogik stoppt.</w:t>
-      </w:r>
-    </w:p>
-    <w:p>
-      <w:r>
-        <w:t>Fallfenster zur Anwendung. Eine Organisation plant eine Massnahme und formuliert dazu eine positive Absicht. In der WÖk reicht das nicht. Fuer diese Vorlesung muss sichtbar werden, welche Zustandsveraenderung erwartet wird, welche Empfaenger direkt oder indirekt betroffen sind, welche Nebenwirkungen entstehen koennen und welche Entscheidung spaeter korrigiert wird. Bezogen auf Von KPI zu KII und der Kennzahlen-Stack heisst das: Die Analyse muss das konkrete Thema ernst nehmen und zugleich den allgemeinen WÖk-Massstab halten. Es geht nicht darum, Akteure moralisch zu sortieren. Es geht darum, Wirkpfade, Wirkungsempfaenger, Datenqualitaet, Risiken und Rueckkopplung so zu beschreiben, dass bessere Entscheidungen moeglich werden.</w:t>
-      </w:r>
-    </w:p>
-    <w:p>
-      <w:r>
-        <w:t>Transfer in Impact-Controlling. Praxisbeispiel verbindet die inhaltliche Deutung mit der spaeteren Praxis. Eine Organisation kann zu Von KPI zu KII und der Kennzahlen-Stack sehr ueberzeugend kommunizieren und trotzdem an Zahlen als Beweis zu behandeln, obwohl Systemgrenze, Datenqualitaet, Unsicherheit oder Nichtkompensation ungeklaert sind scheitern. Darum muss die V1-Fassung immer auch nach Governance fragen: Wer erhebt Daten, wer bewertet sie, wer traegt die Folgen, wer kann widersprechen und wann wird eine Entscheidung korrigiert? Jeder Analyseblock fragt nach der Routine, die nach der Bewertung angepasst wird. So wird aus einem Lehrkapitel eine verantwortbare Arbeitsroutine.</w:t>
-      </w:r>
-    </w:p>
-    <w:p>
-      <w:r>
-        <w:t>Grenze gegen Scheingenauigkeit. Gerade bei Wirkungsökonomische Vertiefung ist Praezision wichtiger als grosse Begriffe. Eine Wirkungsaussage bleibt schwach, wenn sie nur Aktivitaet, Reichweite, Absicht oder Image beschreibt. Stark wird sie erst, wenn sie die Zustandsveraenderung und ihre Bedingungen offenlegt. In WC-V1 ist deshalb entscheidend, Wirkungsbewertung Verfahren, Rechte, Transparenz und Korrektur braucht. Die Fehlerlinie verlaeuft nicht zwischen Optimismus und Pessimismus, sondern zwischen offengelegter Unsicherheit und rhetorischer Sicherheit ohne Pruefpfad.</w:t>
-      </w:r>
-    </w:p>
-    <w:p>
-      <w:r>
-        <w:t>Pruefungsnahe Lesart. Aus Prüfungsrelevanz laesst sich eine gute Transferfrage ableiten: Welche Entscheidung waere falsch, wenn dieser Abschnitt missverstanden wird? Fuer Von KPI zu KII und der Kennzahlen-Stack lautet die Antwort meist nicht einfach "mehr Wirkung", sondern genauer: bessere Unterscheidung, sauberere Daten, klarere Schutzlinie und rueckgekoppelte Steuerung. Pruefungsfragen verbinden Begriff, Anwendung, Evidenz und rote Linie. Wer das im Fall anwenden kann, hat den Kern der Vorlesung verstanden; wer nur Definitionen wiederholt, bleibt unter dem Anspruch der Akademie.</w:t>
-      </w:r>
-    </w:p>
-    <w:p>
-      <w:r>
-        <w:t>Fallfenster zur Anwendung. Eine Fuehrungsentscheidung erzeugt zugleich Nutzen und Risiken. Die WÖk behandelt Ambivalenz nicht als Stoerung, sondern als Kern der Analyse. Positive Netto-Wirkung darf erst behauptet werden, wenn zentrale negative Wirkungen getrennt geprueft und rote Linien gewahrt sind. Bezogen auf Von KPI zu KII und der Kennzahlen-Stack heisst das: Die Analyse muss das konkrete Thema ernst nehmen und zugleich den allgemeinen WÖk-Massstab halten. Es geht nicht darum, Akteure moralisch zu sortieren. Es geht darum, Wirkpfade, Wirkungsempfaenger, Datenqualitaet, Risiken und Rueckkopplung so zu beschreiben, dass bessere Entscheidungen moeglich werden.</w:t>
-      </w:r>
-    </w:p>
-    <w:p>
-      <w:r>
-        <w:t>Organisationale Umsetzung. Der Abschnitt Lernziele ist in WC-V1 kein Zusatzwissen, sondern ein Pruefstein fuer die Grundfrage des Skripts: Was veraendert sich, bei wem, wodurch und mit welcher Rueckkopplung? Fuer Von KPI zu KII und der Kennzahlen-Stack wird daran sichtbar, dass WÖk-Begriffe im Alltag nur tragen, wenn sie in Routinen uebersetzt werden. Die fachliche Grenze liegt dort, wo Lernende Verantwortung an eine einzelne Nachhaltigkeitsfunktion auslagern. Die saubere Lesart trennt deshalb Beobachtung, Kausalannahme, Bewertung und Steuerungsfolge. In der Anwendung sollte daraus mindestens eine konkrete Indikator, Scorecard, Benchmark, Auditpfad oder Portfolioentscheidung abgeleitet werden; sonst bleibt das Wissen erklaerend, aber nicht steuerungsfaehig.</w:t>
-      </w:r>
-    </w:p>
-    <w:p>
-      <w:r>
-        <w:t>Pruefungsnahe Transferfrage. Formuliere zu WC-V1 eine Wirkungsaussage in drei Saetzen: Erstens den beobachteten oder plausiblen Zustand, zweitens die Daten- oder Quellenlage, drittens die offene Unsicherheit samt Rueckkopplung. Die Antwort muss ohne moralische Personenbewertung auskommen und darf Reichweite nicht mit Wirkung verwechseln.</w:t>
-      </w:r>
-    </w:p>
-    <w:p>
-      <w:r>
-        <w:t>Anwendung auf Einleitung / Wirkungsfrage. In einer Fallanalyse beginnt dieser Punkt nicht mit einer Meinung, sondern mit einer belastbaren Beschreibung. Wer WC-V1 pruefungsnah liest, fragt zuerst nach Wirkungsempfaengern, Wirkraum, Zeitraum und Datenquelle. Erst danach folgt die Bewertung im Referenzrahmen Mensch, Planet, Demokratie, SDGs, Agenda 2030 und SDG+. Gute Kommunikation unterscheidet Befund, Annahme und normative Bewertung. Der typische Kurzschluss waere, Eindeutigkeit behaupten, wo die Datenlage nur Potenzial oder Risiko traegt. Genau dagegen setzt die WÖk die Pflicht, Wirkungspotenzial, Wirkungsrisiko und positive Netto-Wirkung begrifflich getrennt zu halten.</w:t>
-      </w:r>
-    </w:p>
-    <w:p>
-      <w:r>
-        <w:t>Evidenzregel. Kernaussage darf im Skript nicht als dekorativer Begriff stehen bleiben. Der Abschnitt traegt nur dann, wenn er eine pruefbare Aussage erlaubt: Welche Quelle stuetzt die Annahme, welche Unsicherheit bleibt offen und welche Gegenbeobachtung wuerde die Bewertung veraendern? Fuer Von KPI zu KII und der Kennzahlen-Stack heisst das, dass jede Wirkungsaussage eine Grenze zieht und diese Grenze begruenden muss. Die Studierenden sollen nicht lernen, einen Score nachzusprechen. Sie sollen erkennen, wann ein Score klaert, wann er verdeckt und wann eine rote Linie die Durchschnittslogik stoppt.</w:t>
-      </w:r>
-    </w:p>
-    <w:p>
-      <w:r>
-        <w:t>Fallfenster zur Anwendung. Ein Controlling-Team moechte einen Score bilden. Das Skript verlangt, dass Datenqualitaet, Systemgrenzen, Gewichtung, Unsicherheit und Nichtkompensation sichtbar bleiben. Ein Score darf die Diskussion nicht beenden, sondern muss bessere Fragen, Priorisierung und Rueckkopplung ermoeglichen. Bezogen auf Von KPI zu KII und der Kennzahlen-Stack heisst das: Die Analyse muss das konkrete Thema ernst nehmen und zugleich den allgemeinen WÖk-Massstab halten. Es geht nicht darum, Akteure moralisch zu sortieren. Es geht darum, Wirkpfade, Wirkungsempfaenger, Datenqualitaet, Risiken und Rueckkopplung so zu beschreiben, dass bessere Entscheidungen moeglich werden.</w:t>
-      </w:r>
-    </w:p>
-    <w:p>
-      <w:r>
-        <w:t>Transfer in Impact-Controlling. Quelltext und fachliche Grundlegung verbindet die inhaltliche Deutung mit der spaeteren Praxis. Eine Organisation kann zu Von KPI zu KII und der Kennzahlen-Stack sehr ueberzeugend kommunizieren und trotzdem an Zahlen als Beweis zu behandeln, obwohl Systemgrenze, Datenqualitaet, Unsicherheit oder Nichtkompensation ungeklaert sind scheitern. Darum muss die V1-Fassung immer auch nach Governance fragen: Wer erhebt Daten, wer bewertet sie, wer traegt die Folgen, wer kann widersprechen und wann wird eine Entscheidung korrigiert? Szenarien pruefen Sofortwirkung, Folgewirkung und Reversibilitaet getrennt. So wird aus einem Lehrkapitel eine verantwortbare Arbeitsroutine.</w:t>
-      </w:r>
-    </w:p>
-    <w:p>
-      <w:r>
-        <w:t>Grenze gegen Scheingenauigkeit. Gerade bei Einstieg / Wirkungsfrage ist Praezision wichtiger als grosse Begriffe. Eine Wirkungsaussage bleibt schwach, wenn sie nur Aktivitaet, Reichweite, Absicht oder Image beschreibt. Stark wird sie erst, wenn sie die Zustandsveraenderung und ihre Bedingungen offenlegt. In WC-V1 ist deshalb entscheidend, Wirkung nicht am Sender, sondern an veraenderten Zustanden der Empfaenger geprueft wird. Die Fehlerlinie verlaeuft nicht zwischen Optimismus und Pessimismus, sondern zwischen offengelegter Unsicherheit und rhetorischer Sicherheit ohne Pruefpfad.</w:t>
-      </w:r>
-    </w:p>
-    <w:p>
-      <w:r>
-        <w:t>Pruefungsnahe Lesart. Aus Video-/Audio-Vorlesung laesst sich eine gute Transferfrage ableiten: Welche Entscheidung waere falsch, wenn dieser Abschnitt missverstanden wird? Fuer Von KPI zu KII und der Kennzahlen-Stack lautet die Antwort meist nicht einfach "mehr Wirkung", sondern genauer: bessere Unterscheidung, sauberere Daten, klarere Schutzlinie und rueckgekoppelte Steuerung. Jede Schlussfolgerung endet mit Entscheidung, Verantwortlichkeit und Termin fuer Rueckpruefung. Wer das im Fall anwenden kann, hat den Kern der Vorlesung verstanden; wer nur Definitionen wiederholt, bleibt unter dem Anspruch der Akademie.</w:t>
-      </w:r>
-    </w:p>
-    <w:p>
-      <w:r>
-        <w:t>Fallfenster zur Anwendung. Ein Kommunikationsbericht nennt viele Aktivitaeten, Reichweiten und Rueckmeldungen. Die V1-Pruefung fragt, ob daraus eine belastbare Wirkungsaussage folgt. Wenn nur Kontakte, Klicks oder Zustimmung vorliegen, bleibt die Aussage im Bereich Wirkungspotenzial oder Resonanz, nicht im Bereich nachgewiesener Wirkung. Bezogen auf Von KPI zu KII und der Kennzahlen-Stack heisst das: Die Analyse muss das konkrete Thema ernst nehmen und zugleich den allgemeinen WÖk-Massstab halten. Es geht nicht darum, Akteure moralisch zu sortieren. Es geht darum, Wirkpfade, Wirkungsempfaenger, Datenqualitaet, Risiken und Rueckkopplung so zu beschreiben, dass bessere Entscheidungen moeglich werden.</w:t>
-      </w:r>
-    </w:p>
-    <w:p>
-      <w:r>
-        <w:t>Pruefungsnahe Transferfrage. Formuliere zu WC-V1 eine Wirkungsaussage in drei Saetzen: Erstens den beobachteten oder plausiblen Zustand, zweitens die Daten- oder Quellenlage, drittens die offene Unsicherheit samt Rueckkopplung. Die Antwort muss ohne moralische Personenbewertung auskommen und darf Reichweite nicht mit Wirkung verwechseln.</w:t>
-      </w:r>
-    </w:p>
-    <w:p>
-      <w:r>
-        <w:t>Wissenschaftliche Anschlussfaehigkeit. Der Abschnitt Transkript (Gerüst) ist in WC-V1 kein Zusatzwissen, sondern ein Pruefstein fuer die Grundfrage des Skripts: Was veraendert sich, bei wem, wodurch und mit welcher Rueckkopplung? Fuer Von KPI zu KII und der Kennzahlen-Stack wird daran sichtbar, dass WÖk-Aussagen mit bestehenden Begriffen, Studien, Standards und Rechtsrahmen in Beziehung stehen muessen. Die fachliche Grenze liegt dort, wo Lernende hausinterne Sprache als Ersatz fuer zitierfaehige Begruendung verwenden. Die saubere Lesart trennt deshalb Beobachtung, Kausalannahme, Bewertung und Steuerungsfolge. In der Anwendung sollte daraus mindestens eine konkrete Indikator, Scorecard, Benchmark, Auditpfad oder Portfolioentscheidung abgeleitet werden; sonst bleibt das Wissen erklaerend, aber nicht steuerungsfaehig.</w:t>
-      </w:r>
-    </w:p>
-    <w:p>
-      <w:r>
-        <w:t>Anwendung auf Skript / Folien (Lernseite). In einer Fallanalyse beginnt dieser Punkt nicht mit einer Meinung, sondern mit einer belastbaren Beschreibung. Wer WC-V1 pruefungsnah liest, fragt zuerst nach Wirkungsempfaengern, Wirkraum, Zeitraum und Datenquelle. Erst danach folgt die Bewertung im Referenzrahmen Mensch, Planet, Demokratie, SDGs, Agenda 2030 und SDG+. Die Analyse markiert Stoppsignale vor jeder Portfolio- oder Score-Debatte. Der typische Kurzschluss waere, ein gutes Teilresultat gegen zentrale Schaeden aufrechnen. Genau dagegen setzt die WÖk die Pflicht, Wirkungspotenzial, Wirkungsrisiko und positive Netto-Wirkung begrifflich getrennt zu halten.</w:t>
+        <w:t>Schlussvertiefung 2: Von KPI zu KII und der Kennzahlen-Stack im Anwendungsfall</w:t>
+      </w:r>
+    </w:p>
+    <w:p>
+      <w:r>
+        <w:t>Die folgenden Abschnitte sind keine neue Pruefungsloesung. Sie verdichten die vorhandenen Kapitel zu einer Lesart, mit der Studierende einen Fall selbststaendig analysieren koennen. Im Mittelpunkt stehen Datenqualitaet, Bewertungsprofile, Scorecards und rueckgekoppelte Steuerung, nicht moralische Personenbewertung.</w:t>
+      </w:r>
+    </w:p>
+    <w:p>
+      <w:r>
+        <w:t>Begriffliche Schlussklaerung. In Impact-Controlling wird Begriffliche Präzision erst steuerungsfaehig, wenn daraus eine Entscheidung folgt. Kennzahlen muessen Entscheidungen verbessern, nicht nur Berichte fuellen. Ohne diese Rueckkopplung bleibt Reporting eine Beschreibung. Mit Rueckkopplung wird aus Bewertung eine veraenderte Routine: ein anderer Prozess, ein geaenderter Anreiz, eine bessere Datenpflicht, eine korrigierte Kommunikation oder eine neue Priorisierung.</w:t>
+      </w:r>
+    </w:p>
+    <w:p>
+      <w:r>
+        <w:t>Die typische Fehlstelle bei Von KPI zu KII und der Kennzahlen-Stack liegt darin, Messbarkeit als Wahrheit zu behandeln. Bei Begriffliche Präzision wird diese Fehlstelle konkret: Ein scheinbar plausibler Befund darf nicht zur Abkuerzung werden. Quellen, Systemgrenzen, Unsicherheit und Rueckkopplung bleiben sichtbar.</w:t>
+      </w:r>
+    </w:p>
+    <w:p>
+      <w:r>
+        <w:t>Wirkpfad und Empfaenger. Die Grenze gegen Scheingenauigkeit verlaeuft bei Wirkpfad nicht zwischen Optimismus und Pessimismus. Sie verlaeuft zwischen offengelegter Unsicherheit und rhetorischer Sicherheit. Wer Von KPI zu KII und der Kennzahlen-Stack belastbar anwenden will, benennt Systemgrenze, Zeitraum, Vergleichspunkt und offene Gegenhypothese. Gerade dadurch bleibt das Skript anschlussfaehig fuer Forschung, Praxis und spaetere Revision.</w:t>
+      </w:r>
+    </w:p>
+    <w:p>
+      <w:r>
+        <w:t>Fuer die Pruefung ist Wirkpfad dann verstanden, wenn daraus eine belastbare Fallantwort entsteht. Eine gute Antwort unterscheidet Beobachtung, Kausalannahme, Bewertung und Steuerungsfolge. Sie bewertet keine Menschen, sondern Wirkpfade, Zustandsveraenderungen, Risiken und institutionelle Bedingungen.</w:t>
+      </w:r>
+    </w:p>
+    <w:p>
+      <w:r>
+        <w:t>Daten, Quellen und Evidenz. Leitthese zeigt, warum Von KPI zu KII und der Kennzahlen-Stack mehr ist als ein Schlagwort im Feld Datenqualitaet, Bewertungsprofile, Scorecards und rueckgekoppelte Steuerung. Die wirkungsoekonomische Frage lautet: Welche reale Veraenderung wird moeglich, welche bleibt nur Potenzial und wo entsteht ein Wirkungsrisiko? Diese Unterscheidung schuetzt vor Impact-Washing, weil sie Absicht, Aktivitaet, Reichweite und Wirkung auseinanderhaelt.</w:t>
+      </w:r>
+    </w:p>
+    <w:p>
+      <w:r>
+        <w:t>Eine Kommune, ein Unternehmen oder eine Bildungsorganisation will Von KPI zu KII und der Kennzahlen-Stack praktisch anwenden. Der erste Schritt ist nicht die Auswahl eines Instruments, sondern die Klaerung der Zustandsveraenderung. Bei Leitthese muss deshalb benannt werden, wer betroffen ist, welcher Zustand sich veraendert, welche Frist gilt und welche Gegenbeobachtung die Annahme widerlegen wuerde. Erst danach entsteht eine begruendete Entscheidung im Feld Indikator, Scorecard, Benchmark, Auditpfad, Portfolioentscheidung oder CAPEX/OPEX-Priorisierung.</w:t>
+      </w:r>
+    </w:p>
+    <w:p>
+      <w:r>
+        <w:t>Bewertung und rote Linien. In WC-V1 muss Didaktische Einordnung im Studiengang immer mit Empfaengern gelesen werden. Wirkung entsteht nicht beim Sender, sondern an veraenderten Zustaenden von Menschen, Oekosystemen, Institutionen, Oeffentlichkeit oder kuenftigen Handlungsspielraeumen. Darum reicht es nicht, interne Aktivitaeten zu dokumentieren. Entscheidend ist, ob sich ein Zustand nachvollziehbar veraendert und ob diese Veraenderung im Referenzrahmen Mensch, Planet, Demokratie, SDGs, Agenda 2030 und SDG+ tragfaehig bewertet werden kann.</w:t>
+      </w:r>
+    </w:p>
+    <w:p>
+      <w:r>
+        <w:t>Ein Bericht behauptet, die Massnahme zu Von KPI zu KII und der Kennzahlen-Stack sei erfolgreich. Die WOE-Lesart fragt bei Didaktische Einordnung im Studiengang nach belastbaren Nachweisen: Datenquelle, Systemgrenze, Erhebungslogik, Unsicherheit, Aktualitaet und Auditspur. Wenn diese Nachweise fehlen, bleibt die Aussage Wirkungspotenzial oder Kommunikationsbehauptung. Sie kann wichtig sein, aber sie ist noch keine belegte Wirkung.</w:t>
+      </w:r>
+    </w:p>
+    <w:p>
+      <w:r>
+        <w:t>Kontrollfrage. Welche Entscheidung waere falsch, wenn Didaktische Einordnung im Studiengang in WC-V1 missverstanden wird? Die Antwort muss mindestens eine Daten- oder Quellenannahme, eine betroffene Gruppe oder Schutzdimension, eine moegliche Nebenwirkung und einen Rueckkopplungsschritt nennen. Richtig ist nicht die lauteste Bewertung, sondern diejenige, die Begriff, Beleg und Steuerungsfolge zusammenhaelt.</w:t>
+      </w:r>
+    </w:p>
+    <w:p>
+      <w:r>
+        <w:t>Rueckfluss. Fuer den WOE-Korpus bedeutet das: Begriffe aus Von KPI zu KII und der Kennzahlen-Stack sollten dort geschaerft werden, wo sie in Glossar, Werkzeugen, Journal oder Readern doppeldeutig bleiben. Offene Forschungsfragen werden nicht versteckt. Sie markieren die Stelle, an der spaetere Evidenz, ein besserer Datensatz oder eine praezisere Fallstudie die Bewertung veraendern kann.</w:t>
+      </w:r>
+    </w:p>
+    <w:p>
+      <w:r>
+        <w:t>Steuerung und Rueckkopplung. Wissenschaftliche Anschlussfaehigkeit entsteht hier durch Quellenklarheit. Bei Analysemodell werden interne WOE-Begriffe nicht als Ersatz fuer Belege benutzt, sondern mit WOE-IDs, Benchmarks, Auditlogik, Datenqualitaetsstufen und externe Reportingrahmen verbunden. Wo die Datenlage offen bleibt, wird das offengelegt. Wo eine Aussage nur plausibel ist, bleibt sie als Wirkungspotenzial markiert. Wo ein Schaden eine rote Linie beruehrt, greift Nichtkompensation vor Durchschnittslogik.</w:t>
+      </w:r>
+    </w:p>
+    <w:p>
+      <w:r>
+        <w:t>In einer kontroversen Entscheidung wirkt Analysemodell als Pruefpunkt fuer Ambivalenz. Ein Nutzen fuer eine Gruppe kann mit Risiken fuer andere Wirkungsempfaenger einhergehen. Das Skript verlangt deshalb, positive und negative Zustandsveraenderungen getrennt zu fuehren, bevor von positiver Netto-Wirkung gesprochen wird.</w:t>
+      </w:r>
+    </w:p>
+    <w:p>
+      <w:r>
+        <w:t>Pruefungsnahe Anwendung. In Impact-Controlling wird Modellformel erst steuerungsfaehig, wenn daraus eine Entscheidung folgt. Kennzahlen muessen Entscheidungen verbessern, nicht nur Berichte fuellen. Ohne diese Rueckkopplung bleibt Reporting eine Beschreibung. Mit Rueckkopplung wird aus Bewertung eine veraenderte Routine: ein anderer Prozess, ein geaenderter Anreiz, eine bessere Datenpflicht, eine korrigierte Kommunikation oder eine neue Priorisierung.</w:t>
+      </w:r>
+    </w:p>
+    <w:p>
+      <w:r>
+        <w:t>Die typische Fehlstelle bei Von KPI zu KII und der Kennzahlen-Stack liegt darin, Messbarkeit als Wahrheit zu behandeln. Bei Modellformel wird diese Fehlstelle konkret: Ein scheinbar plausibler Befund darf nicht zur Abkuerzung werden. Quellen, Systemgrenzen, Unsicherheit und Rueckkopplung bleiben sichtbar.</w:t>
+      </w:r>
+    </w:p>
+    <w:p>
+      <w:r>
+        <w:t>Transfer in den WOE-Korpus. Die Grenze gegen Scheingenauigkeit verlaeuft bei Fallfenster nicht zwischen Optimismus und Pessimismus. Sie verlaeuft zwischen offengelegter Unsicherheit und rhetorischer Sicherheit. Wer Von KPI zu KII und der Kennzahlen-Stack belastbar anwenden will, benennt Systemgrenze, Zeitraum, Vergleichspunkt und offene Gegenhypothese. Gerade dadurch bleibt das Skript anschlussfaehig fuer Forschung, Praxis und spaetere Revision.</w:t>
+      </w:r>
+    </w:p>
+    <w:p>
+      <w:r>
+        <w:t>Fuer die Pruefung ist Fallfenster dann verstanden, wenn daraus eine belastbare Fallantwort entsteht. Eine gute Antwort unterscheidet Beobachtung, Kausalannahme, Bewertung und Steuerungsfolge. Sie bewertet keine Menschen, sondern Wirkpfade, Zustandsveraenderungen, Risiken und institutionelle Bedingungen.</w:t>
+      </w:r>
+    </w:p>
+    <w:p>
+      <w:r>
+        <w:t>Grenzen der Aussage. Prüfungsnahe Fallfragen ohne geschützte Antwortlogik zeigt, warum Von KPI zu KII und der Kennzahlen-Stack mehr ist als ein Schlagwort im Feld Datenqualitaet, Bewertungsprofile, Scorecards und rueckgekoppelte Steuerung. Die wirkungsoekonomische Frage lautet: Welche reale Veraenderung wird moeglich, welche bleibt nur Potenzial und wo entsteht ein Wirkungsrisiko? Diese Unterscheidung schuetzt vor Impact-Washing, weil sie Absicht, Aktivitaet, Reichweite und Wirkung auseinanderhaelt.</w:t>
+      </w:r>
+    </w:p>
+    <w:p>
+      <w:r>
+        <w:t>Eine Kommune, ein Unternehmen oder eine Bildungsorganisation will Von KPI zu KII und der Kennzahlen-Stack praktisch anwenden. Der erste Schritt ist nicht die Auswahl eines Instruments, sondern die Klaerung der Zustandsveraenderung. Bei Prüfungsnahe Fallfragen ohne geschützte Antwortlogik muss deshalb benannt werden, wer betroffen ist, welcher Zustand sich veraendert, welche Frist gilt und welche Gegenbeobachtung die Annahme widerlegen wuerde. Erst danach entsteht eine begruendete Entscheidung im Feld Indikator, Scorecard, Benchmark, Auditpfad, Portfolioentscheidung oder CAPEX/OPEX-Priorisierung.</w:t>
+      </w:r>
+    </w:p>
+    <w:p>
+      <w:r>
+        <w:t>Kontrollfrage. Welche Entscheidung waere falsch, wenn Prüfungsnahe Fallfragen ohne geschützte Antwortlogik in WC-V1 missverstanden wird? Die Antwort muss mindestens eine Daten- oder Quellenannahme, eine betroffene Gruppe oder Schutzdimension, eine moegliche Nebenwirkung und einen Rueckkopplungsschritt nennen. Richtig ist nicht die lauteste Bewertung, sondern diejenige, die Begriff, Beleg und Steuerungsfolge zusammenhaelt.</w:t>
       </w:r>
     </w:p>
     <w:p>
@@ -4452,137 +4402,112 @@
         <w:pStyle w:val="Heading3"/>
       </w:pPr>
       <w:r>
-        <w:t>Abschlusskommentar 3: Lesen, pruefen, rueckkoppeln</w:t>
-      </w:r>
-    </w:p>
-    <w:p>
-      <w:r>
-        <w:t>Die folgende Verdichtung fuehrt die vorhandenen Kapitel nicht als Wiederholung, sondern als Anwendung zusammen. Wirkungskompetenz entsteht, wenn dieselbe begriffliche Strenge in Fallanalyse, Datenarbeit, Kommunikation, Governance und Entscheidungspraxis wiedererkannt wird.</w:t>
-      </w:r>
-    </w:p>
-    <w:p>
-      <w:r>
-        <w:t>Evidenzregel. Transferaufgabe darf im Skript nicht als dekorativer Begriff stehen bleiben. Der Abschnitt traegt nur dann, wenn er eine pruefbare Aussage erlaubt: Welche Quelle stuetzt die Annahme, welche Unsicherheit bleibt offen und welche Gegenbeobachtung wuerde die Bewertung veraendern? Fuer Von KPI zu KII und der Kennzahlen-Stack heisst das, dass praezise Sprache die erste Sicherung gegen Impact-Washing bildet. Die Studierenden sollen nicht lernen, einen Score nachzusprechen. Sie sollen erkennen, wann ein Score klaert, wann er verdeckt und wann eine rote Linie die Durchschnittslogik stoppt.</w:t>
-      </w:r>
-    </w:p>
-    <w:p>
-      <w:r>
-        <w:t>Fallfenster zur Anwendung. Eine Organisation plant eine Massnahme und formuliert dazu eine positive Absicht. In der WÖk reicht das nicht. Fuer diese Vorlesung muss sichtbar werden, welche Zustandsveraenderung erwartet wird, welche Empfaenger direkt oder indirekt betroffen sind, welche Nebenwirkungen entstehen koennen und welche Entscheidung spaeter korrigiert wird. Bezogen auf Von KPI zu KII und der Kennzahlen-Stack heisst das: Die Analyse muss das konkrete Thema ernst nehmen und zugleich den allgemeinen WÖk-Massstab halten. Es geht nicht darum, Akteure moralisch zu sortieren. Es geht darum, Wirkpfade, Wirkungsempfaenger, Datenqualitaet, Risiken und Rueckkopplung so zu beschreiben, dass bessere Entscheidungen moeglich werden.</w:t>
-      </w:r>
-    </w:p>
-    <w:p>
-      <w:r>
-        <w:t>Transfer in Impact-Controlling. Praxisbeispiel verbindet die inhaltliche Deutung mit der spaeteren Praxis. Eine Organisation kann zu Von KPI zu KII und der Kennzahlen-Stack sehr ueberzeugend kommunizieren und trotzdem an Zahlen als Beweis zu behandeln, obwohl Systemgrenze, Datenqualitaet, Unsicherheit oder Nichtkompensation ungeklaert sind scheitern. Darum muss die V1-Fassung immer auch nach Governance fragen: Wer erhebt Daten, wer bewertet sie, wer traegt die Folgen, wer kann widersprechen und wann wird eine Entscheidung korrigiert? Mindestens ein direkter und ein indirekter Wirkpfad muessen nachvollziehbar sein. So wird aus einem Lehrkapitel eine verantwortbare Arbeitsroutine.</w:t>
-      </w:r>
-    </w:p>
-    <w:p>
-      <w:r>
-        <w:t>Grenze gegen Scheingenauigkeit. Gerade bei Wirkungsökonomische Vertiefung ist Praezision wichtiger als grosse Begriffe. Eine Wirkungsaussage bleibt schwach, wenn sie nur Aktivitaet, Reichweite, Absicht oder Image beschreibt. Stark wird sie erst, wenn sie die Zustandsveraenderung und ihre Bedingungen offenlegt. In WC-V1 ist deshalb entscheidend, jede Bewertung nur so belastbar ist wie Datenlage, Quellenstatus, Aktualitaet und Systemgrenze. Die Fehlerlinie verlaeuft nicht zwischen Optimismus und Pessimismus, sondern zwischen offengelegter Unsicherheit und rhetorischer Sicherheit ohne Pruefpfad.</w:t>
-      </w:r>
-    </w:p>
-    <w:p>
-      <w:r>
-        <w:t>Pruefungsnahe Transferfrage. Formuliere zu WC-V1 eine Wirkungsaussage in drei Saetzen: Erstens den beobachteten oder plausiblen Zustand, zweitens die Daten- oder Quellenlage, drittens die offene Unsicherheit samt Rueckkopplung. Die Antwort muss ohne moralische Personenbewertung auskommen und darf Reichweite nicht mit Wirkung verwechseln.</w:t>
-      </w:r>
-    </w:p>
-    <w:p>
-      <w:r>
-        <w:t>Pruefungsnahe Lesart. Aus Prüfungsrelevanz laesst sich eine gute Transferfrage ableiten: Welche Entscheidung waere falsch, wenn dieser Abschnitt missverstanden wird? Fuer Von KPI zu KII und der Kennzahlen-Stack lautet die Antwort meist nicht einfach "mehr Wirkung", sondern genauer: bessere Unterscheidung, sauberere Daten, klarere Schutzlinie und rueckgekoppelte Steuerung. Profile, Zielkonflikte und offene Punkte werden nebeneinander gefuehrt. Wer das im Fall anwenden kann, hat den Kern der Vorlesung verstanden; wer nur Definitionen wiederholt, bleibt unter dem Anspruch der Akademie.</w:t>
-      </w:r>
-    </w:p>
-    <w:p>
-      <w:r>
-        <w:t>Fallfenster zur Anwendung. Eine Fuehrungsentscheidung erzeugt zugleich Nutzen und Risiken. Die WÖk behandelt Ambivalenz nicht als Stoerung, sondern als Kern der Analyse. Positive Netto-Wirkung darf erst behauptet werden, wenn zentrale negative Wirkungen getrennt geprueft und rote Linien gewahrt sind. Bezogen auf Von KPI zu KII und der Kennzahlen-Stack heisst das: Die Analyse muss das konkrete Thema ernst nehmen und zugleich den allgemeinen WÖk-Massstab halten. Es geht nicht darum, Akteure moralisch zu sortieren. Es geht darum, Wirkpfade, Wirkungsempfaenger, Datenqualitaet, Risiken und Rueckkopplung so zu beschreiben, dass bessere Entscheidungen moeglich werden.</w:t>
-      </w:r>
-    </w:p>
-    <w:p>
-      <w:r>
-        <w:t>Nichtkompensation. Der Abschnitt Lernziele ist in WC-V1 kein Zusatzwissen, sondern ein Pruefstein fuer die Grundfrage des Skripts: Was veraendert sich, bei wem, wodurch und mit welcher Rueckkopplung? Fuer Von KPI zu KII und der Kennzahlen-Stack wird daran sichtbar, dass schwere zentrale Schaeden nicht durch beliebige positive Einzelwerte neutralisiert werden duerfen. Die fachliche Grenze liegt dort, wo Lernende eine Durchschnittslogik als moralische Entlastung verwenden. Die saubere Lesart trennt deshalb Beobachtung, Kausalannahme, Bewertung und Steuerungsfolge. In der Anwendung sollte daraus mindestens eine konkrete Indikator, Scorecard, Benchmark, Auditpfad oder Portfolioentscheidung abgeleitet werden; sonst bleibt das Wissen erklaerend, aber nicht steuerungsfaehig.</w:t>
-      </w:r>
-    </w:p>
-    <w:p>
-      <w:r>
-        <w:t>Anwendung auf Einleitung / Wirkungsfrage. In einer Fallanalyse beginnt dieser Punkt nicht mit einer Meinung, sondern mit einer belastbaren Beschreibung. Wer WC-V1 pruefungsnah liest, fragt zuerst nach Wirkungsempfaengern, Wirkraum, Zeitraum und Datenquelle. Erst danach folgt die Bewertung im Referenzrahmen Mensch, Planet, Demokratie, SDGs, Agenda 2030 und SDG+. Jeder Analyseblock fragt nach der Routine, die nach der Bewertung angepasst wird. Der typische Kurzschluss waere, Reporting als Abschluss behandeln. Genau dagegen setzt die WÖk die Pflicht, Wirkungspotenzial, Wirkungsrisiko und positive Netto-Wirkung begrifflich getrennt zu halten.</w:t>
-      </w:r>
-    </w:p>
-    <w:p>
-      <w:r>
-        <w:t>Evidenzregel. Kernaussage darf im Skript nicht als dekorativer Begriff stehen bleiben. Der Abschnitt traegt nur dann, wenn er eine pruefbare Aussage erlaubt: Welche Quelle stuetzt die Annahme, welche Unsicherheit bleibt offen und welche Gegenbeobachtung wuerde die Bewertung veraendern? Fuer Von KPI zu KII und der Kennzahlen-Stack heisst das, dass Wirkungsbewertung Verfahren, Rechte, Transparenz und Korrektur braucht. Die Studierenden sollen nicht lernen, einen Score nachzusprechen. Sie sollen erkennen, wann ein Score klaert, wann er verdeckt und wann eine rote Linie die Durchschnittslogik stoppt.</w:t>
-      </w:r>
-    </w:p>
-    <w:p>
-      <w:r>
-        <w:t>Fallfenster zur Anwendung. Ein Controlling-Team moechte einen Score bilden. Das Skript verlangt, dass Datenqualitaet, Systemgrenzen, Gewichtung, Unsicherheit und Nichtkompensation sichtbar bleiben. Ein Score darf die Diskussion nicht beenden, sondern muss bessere Fragen, Priorisierung und Rueckkopplung ermoeglichen. Bezogen auf Von KPI zu KII und der Kennzahlen-Stack heisst das: Die Analyse muss das konkrete Thema ernst nehmen und zugleich den allgemeinen WÖk-Massstab halten. Es geht nicht darum, Akteure moralisch zu sortieren. Es geht darum, Wirkpfade, Wirkungsempfaenger, Datenqualitaet, Risiken und Rueckkopplung so zu beschreiben, dass bessere Entscheidungen moeglich werden.</w:t>
-      </w:r>
-    </w:p>
-    <w:p>
-      <w:r>
-        <w:t>Transfer in Impact-Controlling. Quelltext und fachliche Grundlegung verbindet die inhaltliche Deutung mit der spaeteren Praxis. Eine Organisation kann zu Von KPI zu KII und der Kennzahlen-Stack sehr ueberzeugend kommunizieren und trotzdem an Zahlen als Beweis zu behandeln, obwohl Systemgrenze, Datenqualitaet, Unsicherheit oder Nichtkompensation ungeklaert sind scheitern. Darum muss die V1-Fassung immer auch nach Governance fragen: Wer erhebt Daten, wer bewertet sie, wer traegt die Folgen, wer kann widersprechen und wann wird eine Entscheidung korrigiert? Pruefungsfragen verbinden Begriff, Anwendung, Evidenz und rote Linie. So wird aus einem Lehrkapitel eine verantwortbare Arbeitsroutine.</w:t>
-      </w:r>
-    </w:p>
-    <w:p>
-      <w:r>
-        <w:t>Pruefungsnahe Transferfrage. Formuliere zu WC-V1 eine Wirkungsaussage in drei Saetzen: Erstens den beobachteten oder plausiblen Zustand, zweitens die Daten- oder Quellenlage, drittens die offene Unsicherheit samt Rueckkopplung. Die Antwort muss ohne moralische Personenbewertung auskommen und darf Reichweite nicht mit Wirkung verwechseln.</w:t>
-      </w:r>
-    </w:p>
-    <w:p>
-      <w:r>
-        <w:t>Grenze gegen Scheingenauigkeit. Gerade bei Einstieg / Wirkungsfrage ist Praezision wichtiger als grosse Begriffe. Eine Wirkungsaussage bleibt schwach, wenn sie nur Aktivitaet, Reichweite, Absicht oder Image beschreibt. Stark wird sie erst, wenn sie die Zustandsveraenderung und ihre Bedingungen offenlegt. In WC-V1 ist deshalb entscheidend, WÖk-Begriffe im Alltag nur tragen, wenn sie in Routinen uebersetzt werden. Die Fehlerlinie verlaeuft nicht zwischen Optimismus und Pessimismus, sondern zwischen offengelegter Unsicherheit und rhetorischer Sicherheit ohne Pruefpfad.</w:t>
-      </w:r>
-    </w:p>
-    <w:p>
-      <w:r>
-        <w:t>Pruefungsnahe Lesart. Aus Video-/Audio-Vorlesung laesst sich eine gute Transferfrage ableiten: Welche Entscheidung waere falsch, wenn dieser Abschnitt missverstanden wird? Fuer Von KPI zu KII und der Kennzahlen-Stack lautet die Antwort meist nicht einfach "mehr Wirkung", sondern genauer: bessere Unterscheidung, sauberere Daten, klarere Schutzlinie und rueckgekoppelte Steuerung. Gute Kommunikation unterscheidet Befund, Annahme und normative Bewertung. Wer das im Fall anwenden kann, hat den Kern der Vorlesung verstanden; wer nur Definitionen wiederholt, bleibt unter dem Anspruch der Akademie.</w:t>
-      </w:r>
-    </w:p>
-    <w:p>
-      <w:r>
-        <w:t>Fallfenster zur Anwendung. Ein Kommunikationsbericht nennt viele Aktivitaeten, Reichweiten und Rueckmeldungen. Die V1-Pruefung fragt, ob daraus eine belastbare Wirkungsaussage folgt. Wenn nur Kontakte, Klicks oder Zustimmung vorliegen, bleibt die Aussage im Bereich Wirkungspotenzial oder Resonanz, nicht im Bereich nachgewiesener Wirkung. Bezogen auf Von KPI zu KII und der Kennzahlen-Stack heisst das: Die Analyse muss das konkrete Thema ernst nehmen und zugleich den allgemeinen WÖk-Massstab halten. Es geht nicht darum, Akteure moralisch zu sortieren. Es geht darum, Wirkpfade, Wirkungsempfaenger, Datenqualitaet, Risiken und Rueckkopplung so zu beschreiben, dass bessere Entscheidungen moeglich werden.</w:t>
-      </w:r>
-    </w:p>
-    <w:p>
-      <w:r>
-        <w:t>Systemgrenze. Der Abschnitt Transkript (Gerüst) ist in WC-V1 kein Zusatzwissen, sondern ein Pruefstein fuer die Grundfrage des Skripts: Was veraendert sich, bei wem, wodurch und mit welcher Rueckkopplung? Fuer Von KPI zu KII und der Kennzahlen-Stack wird daran sichtbar, dass jede Wirkungsaussage eine Grenze zieht und diese Grenze begruenden muss. Die fachliche Grenze liegt dort, wo Lernende nur den bequemen Ausschnitt betrachten. Die saubere Lesart trennt deshalb Beobachtung, Kausalannahme, Bewertung und Steuerungsfolge. In der Anwendung sollte daraus mindestens eine konkrete Indikator, Scorecard, Benchmark, Auditpfad oder Portfolioentscheidung abgeleitet werden; sonst bleibt das Wissen erklaerend, aber nicht steuerungsfaehig.</w:t>
-      </w:r>
-    </w:p>
-    <w:p>
-      <w:r>
-        <w:t>Anwendung auf Skript / Folien (Lernseite). In einer Fallanalyse beginnt dieser Punkt nicht mit einer Meinung, sondern mit einer belastbaren Beschreibung. Wer WC-V1 pruefungsnah liest, fragt zuerst nach Wirkungsempfaengern, Wirkraum, Zeitraum und Datenquelle. Erst danach folgt die Bewertung im Referenzrahmen Mensch, Planet, Demokratie, SDGs, Agenda 2030 und SDG+. Szenarien pruefen Sofortwirkung, Folgewirkung und Reversibilitaet getrennt. Der typische Kurzschluss waere, Momentnutzen als dauerhafte positive Netto-Wirkung verkaufen. Genau dagegen setzt die WÖk die Pflicht, Wirkungspotenzial, Wirkungsrisiko und positive Netto-Wirkung begrifflich getrennt zu halten.</w:t>
-      </w:r>
-    </w:p>
-    <w:p>
-      <w:r>
-        <w:t>Evidenzregel. Transferaufgabe darf im Skript nicht als dekorativer Begriff stehen bleiben. Der Abschnitt traegt nur dann, wenn er eine pruefbare Aussage erlaubt: Welche Quelle stuetzt die Annahme, welche Unsicherheit bleibt offen und welche Gegenbeobachtung wuerde die Bewertung veraendern? Fuer Von KPI zu KII und der Kennzahlen-Stack heisst das, dass Wirkung nicht am Sender, sondern an veraenderten Zustanden der Empfaenger geprueft wird. Die Studierenden sollen nicht lernen, einen Score nachzusprechen. Sie sollen erkennen, wann ein Score klaert, wann er verdeckt und wann eine rote Linie die Durchschnittslogik stoppt.</w:t>
-      </w:r>
-    </w:p>
-    <w:p>
-      <w:r>
-        <w:t>Fallfenster zur Anwendung. Eine Organisation plant eine Massnahme und formuliert dazu eine positive Absicht. In der WÖk reicht das nicht. Fuer diese Vorlesung muss sichtbar werden, welche Zustandsveraenderung erwartet wird, welche Empfaenger direkt oder indirekt betroffen sind, welche Nebenwirkungen entstehen koennen und welche Entscheidung spaeter korrigiert wird. Bezogen auf Von KPI zu KII und der Kennzahlen-Stack heisst das: Die Analyse muss das konkrete Thema ernst nehmen und zugleich den allgemeinen WÖk-Massstab halten. Es geht nicht darum, Akteure moralisch zu sortieren. Es geht darum, Wirkpfade, Wirkungsempfaenger, Datenqualitaet, Risiken und Rueckkopplung so zu beschreiben, dass bessere Entscheidungen moeglich werden.</w:t>
-      </w:r>
-    </w:p>
-    <w:p>
-      <w:r>
-        <w:t>Pruefungsnahe Transferfrage. Formuliere zu WC-V1 eine Wirkungsaussage in drei Saetzen: Erstens den beobachteten oder plausiblen Zustand, zweitens die Daten- oder Quellenlage, drittens die offene Unsicherheit samt Rueckkopplung. Die Antwort muss ohne moralische Personenbewertung auskommen und darf Reichweite nicht mit Wirkung verwechseln.</w:t>
-      </w:r>
-    </w:p>
-    <w:p>
-      <w:r>
-        <w:t>Transfer in Impact-Controlling. Praxisbeispiel verbindet die inhaltliche Deutung mit der spaeteren Praxis. Eine Organisation kann zu Von KPI zu KII und der Kennzahlen-Stack sehr ueberzeugend kommunizieren und trotzdem an Zahlen als Beweis zu behandeln, obwohl Systemgrenze, Datenqualitaet, Unsicherheit oder Nichtkompensation ungeklaert sind scheitern. Darum muss die V1-Fassung immer auch nach Governance fragen: Wer erhebt Daten, wer bewertet sie, wer traegt die Folgen, wer kann widersprechen und wann wird eine Entscheidung korrigiert? Jede Schlussfolgerung endet mit Entscheidung, Verantwortlichkeit und Termin fuer Rueckpruefung. So wird aus einem Lehrkapitel eine verantwortbare Arbeitsroutine.</w:t>
-      </w:r>
-    </w:p>
-    <w:p>
-      <w:r>
-        <w:t>Grenze gegen Scheingenauigkeit. Gerade bei Wirkungsökonomische Vertiefung ist Praezision wichtiger als grosse Begriffe. Eine Wirkungsaussage bleibt schwach, wenn sie nur Aktivitaet, Reichweite, Absicht oder Image beschreibt. Stark wird sie erst, wenn sie die Zustandsveraenderung und ihre Bedingungen offenlegt. In WC-V1 ist deshalb entscheidend, WÖk-Aussagen mit bestehenden Begriffen, Studien, Standards und Rechtsrahmen in Beziehung stehen muessen. Die Fehlerlinie verlaeuft nicht zwischen Optimismus und Pessimismus, sondern zwischen offengelegter Unsicherheit und rhetorischer Sicherheit ohne Pruefpfad.</w:t>
-      </w:r>
-    </w:p>
-    <w:p>
-      <w:r>
-        <w:t>Pruefungsnahe Lesart. Aus Prüfungsrelevanz laesst sich eine gute Transferfrage ableiten: Welche Entscheidung waere falsch, wenn dieser Abschnitt missverstanden wird? Fuer Von KPI zu KII und der Kennzahlen-Stack lautet die Antwort meist nicht einfach "mehr Wirkung", sondern genauer: bessere Unterscheidung, sauberere Daten, klarere Schutzlinie und rueckgekoppelte Steuerung. Die Analyse markiert Stoppsignale vor jeder Portfolio- oder Score-Debatte. Wer das im Fall anwenden kann, hat den Kern der Vorlesung verstanden; wer nur Definitionen wiederholt, bleibt unter dem Anspruch der Akademie.</w:t>
-      </w:r>
-    </w:p>
-    <w:p>
-      <w:r>
-        <w:t>Fallfenster zur Anwendung. Eine Fuehrungsentscheidung erzeugt zugleich Nutzen und Risiken. Die WÖk behandelt Ambivalenz nicht als Stoerung, sondern als Kern der Analyse. Positive Netto-Wirkung darf erst behauptet werden, wenn zentrale negative Wirkungen getrennt geprueft und rote Linien gewahrt sind. Bezogen auf Von KPI zu KII und der Kennzahlen-Stack heisst das: Die Analyse muss das konkrete Thema ernst nehmen und zugleich den allgemeinen WÖk-Massstab halten. Es geht nicht darum, Akteure moralisch zu sortieren. Es geht darum, Wirkpfade, Wirkungsempfaenger, Datenqualitaet, Risiken und Rueckkopplung so zu beschreiben, dass bessere Entscheidungen moeglich werden.</w:t>
+        <w:t>Schlussvertiefung 3: Von KPI zu KII und der Kennzahlen-Stack im Anwendungsfall</w:t>
+      </w:r>
+    </w:p>
+    <w:p>
+      <w:r>
+        <w:t>Die folgenden Abschnitte sind keine neue Pruefungsloesung. Sie verdichten die vorhandenen Kapitel zu einer Lesart, mit der Studierende einen Fall selbststaendig analysieren koennen. Im Mittelpunkt stehen Datenqualitaet, Bewertungsprofile, Scorecards und rueckgekoppelte Steuerung, nicht moralische Personenbewertung.</w:t>
+      </w:r>
+    </w:p>
+    <w:p>
+      <w:r>
+        <w:t>Begriffliche Schlussklaerung. In WC-V1 muss Auswertung aus der lebenden Website-Referenz immer mit Empfaengern gelesen werden. Wirkung entsteht nicht beim Sender, sondern an veraenderten Zustaenden von Menschen, Oekosystemen, Institutionen, Oeffentlichkeit oder kuenftigen Handlungsspielraeumen. Darum reicht es nicht, interne Aktivitaeten zu dokumentieren. Entscheidend ist, ob sich ein Zustand nachvollziehbar veraendert und ob diese Veraenderung im Referenzrahmen Mensch, Planet, Demokratie, SDGs, Agenda 2030 und SDG+ tragfaehig bewertet werden kann.</w:t>
+      </w:r>
+    </w:p>
+    <w:p>
+      <w:r>
+        <w:t>Ein Bericht behauptet, die Massnahme zu Von KPI zu KII und der Kennzahlen-Stack sei erfolgreich. Die WOE-Lesart fragt bei Auswertung aus der lebenden Website-Referenz nach belastbaren Nachweisen: Datenquelle, Systemgrenze, Erhebungslogik, Unsicherheit, Aktualitaet und Auditspur. Wenn diese Nachweise fehlen, bleibt die Aussage Wirkungspotenzial oder Kommunikationsbehauptung. Sie kann wichtig sein, aber sie ist noch keine belegte Wirkung.</w:t>
+      </w:r>
+    </w:p>
+    <w:p>
+      <w:r>
+        <w:t>Wirkpfad und Empfaenger. Wissenschaftliche Anschlussfaehigkeit entsteht hier durch Quellenklarheit. Bei KPI versus KII werden interne WOE-Begriffe nicht als Ersatz fuer Belege benutzt, sondern mit WOE-IDs, Benchmarks, Auditlogik, Datenqualitaetsstufen und externe Reportingrahmen verbunden. Wo die Datenlage offen bleibt, wird das offengelegt. Wo eine Aussage nur plausibel ist, bleibt sie als Wirkungspotenzial markiert. Wo ein Schaden eine rote Linie beruehrt, greift Nichtkompensation vor Durchschnittslogik.</w:t>
+      </w:r>
+    </w:p>
+    <w:p>
+      <w:r>
+        <w:t>In einer kontroversen Entscheidung wirkt KPI versus KII als Pruefpunkt fuer Ambivalenz. Ein Nutzen fuer eine Gruppe kann mit Risiken fuer andere Wirkungsempfaenger einhergehen. Das Skript verlangt deshalb, positive und negative Zustandsveraenderungen getrennt zu fuehren, bevor von positiver Netto-Wirkung gesprochen wird.</w:t>
+      </w:r>
+    </w:p>
+    <w:p>
+      <w:r>
+        <w:t>Rueckfluss. Fuer den WOE-Korpus bedeutet das: Begriffe aus Von KPI zu KII und der Kennzahlen-Stack sollten dort geschaerft werden, wo sie in Glossar, Werkzeugen, Journal oder Readern doppeldeutig bleiben. Offene Forschungsfragen werden nicht versteckt. Sie markieren die Stelle, an der spaetere Evidenz, ein besserer Datensatz oder eine praezisere Fallstudie die Bewertung veraendern kann.</w:t>
+      </w:r>
+    </w:p>
+    <w:p>
+      <w:r>
+        <w:t>Daten, Quellen und Evidenz. In Impact-Controlling wird Scorecards im Management erst steuerungsfaehig, wenn daraus eine Entscheidung folgt. Kennzahlen muessen Entscheidungen verbessern, nicht nur Berichte fuellen. Ohne diese Rueckkopplung bleibt Reporting eine Beschreibung. Mit Rueckkopplung wird aus Bewertung eine veraenderte Routine: ein anderer Prozess, ein geaenderter Anreiz, eine bessere Datenpflicht, eine korrigierte Kommunikation oder eine neue Priorisierung.</w:t>
+      </w:r>
+    </w:p>
+    <w:p>
+      <w:r>
+        <w:t>Die typische Fehlstelle bei Von KPI zu KII und der Kennzahlen-Stack liegt darin, Messbarkeit als Wahrheit zu behandeln. Bei Scorecards im Management wird diese Fehlstelle konkret: Ein scheinbar plausibler Befund darf nicht zur Abkuerzung werden. Quellen, Systemgrenzen, Unsicherheit und Rueckkopplung bleiben sichtbar.</w:t>
+      </w:r>
+    </w:p>
+    <w:p>
+      <w:r>
+        <w:t>Bewertung und rote Linien. Die Grenze gegen Scheingenauigkeit verlaeuft bei NWI, IOI und T-SROI im Impact-Controlling nicht zwischen Optimismus und Pessimismus. Sie verlaeuft zwischen offengelegter Unsicherheit und rhetorischer Sicherheit. Wer Von KPI zu KII und der Kennzahlen-Stack belastbar anwenden will, benennt Systemgrenze, Zeitraum, Vergleichspunkt und offene Gegenhypothese. Gerade dadurch bleibt das Skript anschlussfaehig fuer Forschung, Praxis und spaetere Revision.</w:t>
+      </w:r>
+    </w:p>
+    <w:p>
+      <w:r>
+        <w:t>Fuer die Pruefung ist NWI, IOI und T-SROI im Impact-Controlling dann verstanden, wenn daraus eine belastbare Fallantwort entsteht. Eine gute Antwort unterscheidet Beobachtung, Kausalannahme, Bewertung und Steuerungsfolge. Sie bewertet keine Menschen, sondern Wirkpfade, Zustandsveraenderungen, Risiken und institutionelle Bedingungen.</w:t>
+      </w:r>
+    </w:p>
+    <w:p>
+      <w:r>
+        <w:t>Kontrollfrage. Welche Entscheidung waere falsch, wenn NWI, IOI und T-SROI im Impact-Controlling in WC-V1 missverstanden wird? Die Antwort muss mindestens eine Daten- oder Quellenannahme, eine betroffene Gruppe oder Schutzdimension, eine moegliche Nebenwirkung und einen Rueckkopplungsschritt nennen. Richtig ist nicht die lauteste Bewertung, sondern diejenige, die Begriff, Beleg und Steuerungsfolge zusammenhaelt.</w:t>
+      </w:r>
+    </w:p>
+    <w:p>
+      <w:r>
+        <w:t>Steuerung und Rueckkopplung. Rückkopplung in Entscheidungen zeigt, warum Von KPI zu KII und der Kennzahlen-Stack mehr ist als ein Schlagwort im Feld Datenqualitaet, Bewertungsprofile, Scorecards und rueckgekoppelte Steuerung. Die wirkungsoekonomische Frage lautet: Welche reale Veraenderung wird moeglich, welche bleibt nur Potenzial und wo entsteht ein Wirkungsrisiko? Diese Unterscheidung schuetzt vor Impact-Washing, weil sie Absicht, Aktivitaet, Reichweite und Wirkung auseinanderhaelt.</w:t>
+      </w:r>
+    </w:p>
+    <w:p>
+      <w:r>
+        <w:t>Eine Kommune, ein Unternehmen oder eine Bildungsorganisation will Von KPI zu KII und der Kennzahlen-Stack praktisch anwenden. Der erste Schritt ist nicht die Auswahl eines Instruments, sondern die Klaerung der Zustandsveraenderung. Bei Rückkopplung in Entscheidungen muss deshalb benannt werden, wer betroffen ist, welcher Zustand sich veraendert, welche Frist gilt und welche Gegenbeobachtung die Annahme widerlegen wuerde. Erst danach entsteht eine begruendete Entscheidung im Feld Indikator, Scorecard, Benchmark, Auditpfad, Portfolioentscheidung oder CAPEX/OPEX-Priorisierung.</w:t>
+      </w:r>
+    </w:p>
+    <w:p>
+      <w:r>
+        <w:t>Pruefungsnahe Anwendung. In WC-V1 muss Konsequenzen für die WÖk-Architektur immer mit Empfaengern gelesen werden. Wirkung entsteht nicht beim Sender, sondern an veraenderten Zustaenden von Menschen, Oekosystemen, Institutionen, Oeffentlichkeit oder kuenftigen Handlungsspielraeumen. Darum reicht es nicht, interne Aktivitaeten zu dokumentieren. Entscheidend ist, ob sich ein Zustand nachvollziehbar veraendert und ob diese Veraenderung im Referenzrahmen Mensch, Planet, Demokratie, SDGs, Agenda 2030 und SDG+ tragfaehig bewertet werden kann.</w:t>
+      </w:r>
+    </w:p>
+    <w:p>
+      <w:r>
+        <w:t>Ein Bericht behauptet, die Massnahme zu Von KPI zu KII und der Kennzahlen-Stack sei erfolgreich. Die WOE-Lesart fragt bei Konsequenzen für die WÖk-Architektur nach belastbaren Nachweisen: Datenquelle, Systemgrenze, Erhebungslogik, Unsicherheit, Aktualitaet und Auditspur. Wenn diese Nachweise fehlen, bleibt die Aussage Wirkungspotenzial oder Kommunikationsbehauptung. Sie kann wichtig sein, aber sie ist noch keine belegte Wirkung.</w:t>
+      </w:r>
+    </w:p>
+    <w:p>
+      <w:r>
+        <w:t>Transfer in den WOE-Korpus. Wissenschaftliche Anschlussfaehigkeit entsteht hier durch Quellenklarheit. Bei Einleitung / Wirkungsfrage werden interne WOE-Begriffe nicht als Ersatz fuer Belege benutzt, sondern mit WOE-IDs, Benchmarks, Auditlogik, Datenqualitaetsstufen und externe Reportingrahmen verbunden. Wo die Datenlage offen bleibt, wird das offengelegt. Wo eine Aussage nur plausibel ist, bleibt sie als Wirkungspotenzial markiert. Wo ein Schaden eine rote Linie beruehrt, greift Nichtkompensation vor Durchschnittslogik.</w:t>
+      </w:r>
+    </w:p>
+    <w:p>
+      <w:r>
+        <w:t>In einer kontroversen Entscheidung wirkt Einleitung / Wirkungsfrage als Pruefpunkt fuer Ambivalenz. Ein Nutzen fuer eine Gruppe kann mit Risiken fuer andere Wirkungsempfaenger einhergehen. Das Skript verlangt deshalb, positive und negative Zustandsveraenderungen getrennt zu fuehren, bevor von positiver Netto-Wirkung gesprochen wird.</w:t>
+      </w:r>
+    </w:p>
+    <w:p>
+      <w:r>
+        <w:t>Grenzen der Aussage. In Impact-Controlling wird Kernaussage erst steuerungsfaehig, wenn daraus eine Entscheidung folgt. Kennzahlen muessen Entscheidungen verbessern, nicht nur Berichte fuellen. Ohne diese Rueckkopplung bleibt Reporting eine Beschreibung. Mit Rueckkopplung wird aus Bewertung eine veraenderte Routine: ein anderer Prozess, ein geaenderter Anreiz, eine bessere Datenpflicht, eine korrigierte Kommunikation oder eine neue Priorisierung.</w:t>
+      </w:r>
+    </w:p>
+    <w:p>
+      <w:r>
+        <w:t>Die typische Fehlstelle bei Von KPI zu KII und der Kennzahlen-Stack liegt darin, Messbarkeit als Wahrheit zu behandeln. Bei Kernaussage wird diese Fehlstelle konkret: Ein scheinbar plausibler Befund darf nicht zur Abkuerzung werden. Quellen, Systemgrenzen, Unsicherheit und Rueckkopplung bleiben sichtbar.</w:t>
+      </w:r>
+    </w:p>
+    <w:p>
+      <w:r>
+        <w:t>Kontrollfrage. Welche Entscheidung waere falsch, wenn Kernaussage in WC-V1 missverstanden wird? Die Antwort muss mindestens eine Daten- oder Quellenannahme, eine betroffene Gruppe oder Schutzdimension, eine moegliche Nebenwirkung und einen Rueckkopplungsschritt nennen. Richtig ist nicht die lauteste Bewertung, sondern diejenige, die Begriff, Beleg und Steuerungsfolge zusammenhaelt.</w:t>
+      </w:r>
+    </w:p>
+    <w:p>
+      <w:r>
+        <w:t>Rueckfluss. Fuer den WOE-Korpus bedeutet das: Begriffe aus Von KPI zu KII und der Kennzahlen-Stack sollten dort geschaerft werden, wo sie in Glossar, Werkzeugen, Journal oder Readern doppeldeutig bleiben. Offene Forschungsfragen werden nicht versteckt. Sie markieren die Stelle, an der spaetere Evidenz, ein besserer Datensatz oder eine praezisere Fallstudie die Bewertung veraendern kann.</w:t>
       </w:r>
     </w:p>
     <w:p>
@@ -4590,132 +4515,107 @@
         <w:pStyle w:val="Heading3"/>
       </w:pPr>
       <w:r>
-        <w:t>Abschlusskommentar 4: Lesen, pruefen, rueckkoppeln</w:t>
-      </w:r>
-    </w:p>
-    <w:p>
-      <w:r>
-        <w:t>Die folgende Verdichtung fuehrt die vorhandenen Kapitel nicht als Wiederholung, sondern als Anwendung zusammen. Wirkungskompetenz entsteht, wenn dieselbe begriffliche Strenge in Fallanalyse, Datenarbeit, Kommunikation, Governance und Entscheidungspraxis wiedererkannt wird.</w:t>
-      </w:r>
-    </w:p>
-    <w:p>
-      <w:r>
-        <w:t>Begriffliche Schaerfung. Der Abschnitt Lernziele ist in WC-V1 kein Zusatzwissen, sondern ein Pruefstein fuer die Grundfrage des Skripts: Was veraendert sich, bei wem, wodurch und mit welcher Rueckkopplung? Fuer Von KPI zu KII und der Kennzahlen-Stack wird daran sichtbar, dass praezise Sprache die erste Sicherung gegen Impact-Washing bildet. Die fachliche Grenze liegt dort, wo Lernende Output, Reichweite, Absicht und Wirkung in einem Satz vermischen. Die saubere Lesart trennt deshalb Beobachtung, Kausalannahme, Bewertung und Steuerungsfolge. In der Anwendung sollte daraus mindestens eine konkrete Indikator, Scorecard, Benchmark, Auditpfad oder Portfolioentscheidung abgeleitet werden; sonst bleibt das Wissen erklaerend, aber nicht steuerungsfaehig.</w:t>
-      </w:r>
-    </w:p>
-    <w:p>
-      <w:r>
-        <w:t>Anwendung auf Einleitung / Wirkungsfrage. In einer Fallanalyse beginnt dieser Punkt nicht mit einer Meinung, sondern mit einer belastbaren Beschreibung. Wer WC-V1 pruefungsnah liest, fragt zuerst nach Wirkungsempfaengern, Wirkraum, Zeitraum und Datenquelle. Erst danach folgt die Bewertung im Referenzrahmen Mensch, Planet, Demokratie, SDGs, Agenda 2030 und SDG+. Mindestens ein direkter und ein indirekter Wirkpfad muessen nachvollziehbar sein. Der typische Kurzschluss waere, nur die Massnahme selbst bewerten und indirekte Empfaenger ausblenden. Genau dagegen setzt die WÖk die Pflicht, Wirkungspotenzial, Wirkungsrisiko und positive Netto-Wirkung begrifflich getrennt zu halten.</w:t>
-      </w:r>
-    </w:p>
-    <w:p>
-      <w:r>
-        <w:t>Pruefungsnahe Transferfrage. Formuliere zu WC-V1 eine Wirkungsaussage in drei Saetzen: Erstens den beobachteten oder plausiblen Zustand, zweitens die Daten- oder Quellenlage, drittens die offene Unsicherheit samt Rueckkopplung. Die Antwort muss ohne moralische Personenbewertung auskommen und darf Reichweite nicht mit Wirkung verwechseln.</w:t>
-      </w:r>
-    </w:p>
-    <w:p>
-      <w:r>
-        <w:t>Evidenzregel. Kernaussage darf im Skript nicht als dekorativer Begriff stehen bleiben. Der Abschnitt traegt nur dann, wenn er eine pruefbare Aussage erlaubt: Welche Quelle stuetzt die Annahme, welche Unsicherheit bleibt offen und welche Gegenbeobachtung wuerde die Bewertung veraendern? Fuer Von KPI zu KII und der Kennzahlen-Stack heisst das, dass jede Bewertung nur so belastbar ist wie Datenlage, Quellenstatus, Aktualitaet und Systemgrenze. Die Studierenden sollen nicht lernen, einen Score nachzusprechen. Sie sollen erkennen, wann ein Score klaert, wann er verdeckt und wann eine rote Linie die Durchschnittslogik stoppt.</w:t>
-      </w:r>
-    </w:p>
-    <w:p>
-      <w:r>
-        <w:t>Fallfenster zur Anwendung. Ein Controlling-Team moechte einen Score bilden. Das Skript verlangt, dass Datenqualitaet, Systemgrenzen, Gewichtung, Unsicherheit und Nichtkompensation sichtbar bleiben. Ein Score darf die Diskussion nicht beenden, sondern muss bessere Fragen, Priorisierung und Rueckkopplung ermoeglichen. Bezogen auf Von KPI zu KII und der Kennzahlen-Stack heisst das: Die Analyse muss das konkrete Thema ernst nehmen und zugleich den allgemeinen WÖk-Massstab halten. Es geht nicht darum, Akteure moralisch zu sortieren. Es geht darum, Wirkpfade, Wirkungsempfaenger, Datenqualitaet, Risiken und Rueckkopplung so zu beschreiben, dass bessere Entscheidungen moeglich werden.</w:t>
-      </w:r>
-    </w:p>
-    <w:p>
-      <w:r>
-        <w:t>Transfer in Impact-Controlling. Quelltext und fachliche Grundlegung verbindet die inhaltliche Deutung mit der spaeteren Praxis. Eine Organisation kann zu Von KPI zu KII und der Kennzahlen-Stack sehr ueberzeugend kommunizieren und trotzdem an Zahlen als Beweis zu behandeln, obwohl Systemgrenze, Datenqualitaet, Unsicherheit oder Nichtkompensation ungeklaert sind scheitern. Darum muss die V1-Fassung immer auch nach Governance fragen: Wer erhebt Daten, wer bewertet sie, wer traegt die Folgen, wer kann widersprechen und wann wird eine Entscheidung korrigiert? Profile, Zielkonflikte und offene Punkte werden nebeneinander gefuehrt. So wird aus einem Lehrkapitel eine verantwortbare Arbeitsroutine.</w:t>
-      </w:r>
-    </w:p>
-    <w:p>
-      <w:r>
-        <w:t>Grenze gegen Scheingenauigkeit. Gerade bei Einstieg / Wirkungsfrage ist Praezision wichtiger als grosse Begriffe. Eine Wirkungsaussage bleibt schwach, wenn sie nur Aktivitaet, Reichweite, Absicht oder Image beschreibt. Stark wird sie erst, wenn sie die Zustandsveraenderung und ihre Bedingungen offenlegt. In WC-V1 ist deshalb entscheidend, schwere zentrale Schaeden nicht durch beliebige positive Einzelwerte neutralisiert werden duerfen. Die Fehlerlinie verlaeuft nicht zwischen Optimismus und Pessimismus, sondern zwischen offengelegter Unsicherheit und rhetorischer Sicherheit ohne Pruefpfad.</w:t>
-      </w:r>
-    </w:p>
-    <w:p>
-      <w:r>
-        <w:t>Pruefungsnahe Lesart. Aus Video-/Audio-Vorlesung laesst sich eine gute Transferfrage ableiten: Welche Entscheidung waere falsch, wenn dieser Abschnitt missverstanden wird? Fuer Von KPI zu KII und der Kennzahlen-Stack lautet die Antwort meist nicht einfach "mehr Wirkung", sondern genauer: bessere Unterscheidung, sauberere Daten, klarere Schutzlinie und rueckgekoppelte Steuerung. Jeder Analyseblock fragt nach der Routine, die nach der Bewertung angepasst wird. Wer das im Fall anwenden kann, hat den Kern der Vorlesung verstanden; wer nur Definitionen wiederholt, bleibt unter dem Anspruch der Akademie.</w:t>
-      </w:r>
-    </w:p>
-    <w:p>
-      <w:r>
-        <w:t>Fallfenster zur Anwendung. Ein Kommunikationsbericht nennt viele Aktivitaeten, Reichweiten und Rueckmeldungen. Die V1-Pruefung fragt, ob daraus eine belastbare Wirkungsaussage folgt. Wenn nur Kontakte, Klicks oder Zustimmung vorliegen, bleibt die Aussage im Bereich Wirkungspotenzial oder Resonanz, nicht im Bereich nachgewiesener Wirkung. Bezogen auf Von KPI zu KII und der Kennzahlen-Stack heisst das: Die Analyse muss das konkrete Thema ernst nehmen und zugleich den allgemeinen WÖk-Massstab halten. Es geht nicht darum, Akteure moralisch zu sortieren. Es geht darum, Wirkpfade, Wirkungsempfaenger, Datenqualitaet, Risiken und Rueckkopplung so zu beschreiben, dass bessere Entscheidungen moeglich werden.</w:t>
-      </w:r>
-    </w:p>
-    <w:p>
-      <w:r>
-        <w:t>Governance. Der Abschnitt Transkript (Gerüst) ist in WC-V1 kein Zusatzwissen, sondern ein Pruefstein fuer die Grundfrage des Skripts: Was veraendert sich, bei wem, wodurch und mit welcher Rueckkopplung? Fuer Von KPI zu KII und der Kennzahlen-Stack wird daran sichtbar, dass Wirkungsbewertung Verfahren, Rechte, Transparenz und Korrektur braucht. Die fachliche Grenze liegt dort, wo Lernende Bewertung als technokratische Top-down-Setzung verstehen. Die saubere Lesart trennt deshalb Beobachtung, Kausalannahme, Bewertung und Steuerungsfolge. In der Anwendung sollte daraus mindestens eine konkrete Indikator, Scorecard, Benchmark, Auditpfad oder Portfolioentscheidung abgeleitet werden; sonst bleibt das Wissen erklaerend, aber nicht steuerungsfaehig.</w:t>
-      </w:r>
-    </w:p>
-    <w:p>
-      <w:r>
-        <w:t>Pruefungsnahe Transferfrage. Formuliere zu WC-V1 eine Wirkungsaussage in drei Saetzen: Erstens den beobachteten oder plausiblen Zustand, zweitens die Daten- oder Quellenlage, drittens die offene Unsicherheit samt Rueckkopplung. Die Antwort muss ohne moralische Personenbewertung auskommen und darf Reichweite nicht mit Wirkung verwechseln.</w:t>
-      </w:r>
-    </w:p>
-    <w:p>
-      <w:r>
-        <w:t>Anwendung auf Skript / Folien (Lernseite). In einer Fallanalyse beginnt dieser Punkt nicht mit einer Meinung, sondern mit einer belastbaren Beschreibung. Wer WC-V1 pruefungsnah liest, fragt zuerst nach Wirkungsempfaengern, Wirkraum, Zeitraum und Datenquelle. Erst danach folgt die Bewertung im Referenzrahmen Mensch, Planet, Demokratie, SDGs, Agenda 2030 und SDG+. Pruefungsfragen verbinden Begriff, Anwendung, Evidenz und rote Linie. Der typische Kurzschluss waere, reines Auswendiglernen als Kompetenznachweis behandeln. Genau dagegen setzt die WÖk die Pflicht, Wirkungspotenzial, Wirkungsrisiko und positive Netto-Wirkung begrifflich getrennt zu halten.</w:t>
-      </w:r>
-    </w:p>
-    <w:p>
-      <w:r>
-        <w:t>Evidenzregel. Transferaufgabe darf im Skript nicht als dekorativer Begriff stehen bleiben. Der Abschnitt traegt nur dann, wenn er eine pruefbare Aussage erlaubt: Welche Quelle stuetzt die Annahme, welche Unsicherheit bleibt offen und welche Gegenbeobachtung wuerde die Bewertung veraendern? Fuer Von KPI zu KII und der Kennzahlen-Stack heisst das, dass WÖk-Begriffe im Alltag nur tragen, wenn sie in Routinen uebersetzt werden. Die Studierenden sollen nicht lernen, einen Score nachzusprechen. Sie sollen erkennen, wann ein Score klaert, wann er verdeckt und wann eine rote Linie die Durchschnittslogik stoppt.</w:t>
-      </w:r>
-    </w:p>
-    <w:p>
-      <w:r>
-        <w:t>Fallfenster zur Anwendung. Eine Organisation plant eine Massnahme und formuliert dazu eine positive Absicht. In der WÖk reicht das nicht. Fuer diese Vorlesung muss sichtbar werden, welche Zustandsveraenderung erwartet wird, welche Empfaenger direkt oder indirekt betroffen sind, welche Nebenwirkungen entstehen koennen und welche Entscheidung spaeter korrigiert wird. Bezogen auf Von KPI zu KII und der Kennzahlen-Stack heisst das: Die Analyse muss das konkrete Thema ernst nehmen und zugleich den allgemeinen WÖk-Massstab halten. Es geht nicht darum, Akteure moralisch zu sortieren. Es geht darum, Wirkpfade, Wirkungsempfaenger, Datenqualitaet, Risiken und Rueckkopplung so zu beschreiben, dass bessere Entscheidungen moeglich werden.</w:t>
-      </w:r>
-    </w:p>
-    <w:p>
-      <w:r>
-        <w:t>Transfer in Impact-Controlling. Praxisbeispiel verbindet die inhaltliche Deutung mit der spaeteren Praxis. Eine Organisation kann zu Von KPI zu KII und der Kennzahlen-Stack sehr ueberzeugend kommunizieren und trotzdem an Zahlen als Beweis zu behandeln, obwohl Systemgrenze, Datenqualitaet, Unsicherheit oder Nichtkompensation ungeklaert sind scheitern. Darum muss die V1-Fassung immer auch nach Governance fragen: Wer erhebt Daten, wer bewertet sie, wer traegt die Folgen, wer kann widersprechen und wann wird eine Entscheidung korrigiert? Gute Kommunikation unterscheidet Befund, Annahme und normative Bewertung. So wird aus einem Lehrkapitel eine verantwortbare Arbeitsroutine.</w:t>
-      </w:r>
-    </w:p>
-    <w:p>
-      <w:r>
-        <w:t>Grenze gegen Scheingenauigkeit. Gerade bei Wirkungsökonomische Vertiefung ist Praezision wichtiger als grosse Begriffe. Eine Wirkungsaussage bleibt schwach, wenn sie nur Aktivitaet, Reichweite, Absicht oder Image beschreibt. Stark wird sie erst, wenn sie die Zustandsveraenderung und ihre Bedingungen offenlegt. In WC-V1 ist deshalb entscheidend, jede Wirkungsaussage eine Grenze zieht und diese Grenze begruenden muss. Die Fehlerlinie verlaeuft nicht zwischen Optimismus und Pessimismus, sondern zwischen offengelegter Unsicherheit und rhetorischer Sicherheit ohne Pruefpfad.</w:t>
-      </w:r>
-    </w:p>
-    <w:p>
-      <w:r>
-        <w:t>Pruefungsnahe Lesart. Aus Prüfungsrelevanz laesst sich eine gute Transferfrage ableiten: Welche Entscheidung waere falsch, wenn dieser Abschnitt missverstanden wird? Fuer Von KPI zu KII und der Kennzahlen-Stack lautet die Antwort meist nicht einfach "mehr Wirkung", sondern genauer: bessere Unterscheidung, sauberere Daten, klarere Schutzlinie und rueckgekoppelte Steuerung. Szenarien pruefen Sofortwirkung, Folgewirkung und Reversibilitaet getrennt. Wer das im Fall anwenden kann, hat den Kern der Vorlesung verstanden; wer nur Definitionen wiederholt, bleibt unter dem Anspruch der Akademie.</w:t>
-      </w:r>
-    </w:p>
-    <w:p>
-      <w:r>
-        <w:t>Fallfenster zur Anwendung. Eine Fuehrungsentscheidung erzeugt zugleich Nutzen und Risiken. Die WÖk behandelt Ambivalenz nicht als Stoerung, sondern als Kern der Analyse. Positive Netto-Wirkung darf erst behauptet werden, wenn zentrale negative Wirkungen getrennt geprueft und rote Linien gewahrt sind. Bezogen auf Von KPI zu KII und der Kennzahlen-Stack heisst das: Die Analyse muss das konkrete Thema ernst nehmen und zugleich den allgemeinen WÖk-Massstab halten. Es geht nicht darum, Akteure moralisch zu sortieren. Es geht darum, Wirkpfade, Wirkungsempfaenger, Datenqualitaet, Risiken und Rueckkopplung so zu beschreiben, dass bessere Entscheidungen moeglich werden.</w:t>
-      </w:r>
-    </w:p>
-    <w:p>
-      <w:r>
-        <w:t>Pruefungsnahe Transferfrage. Formuliere zu WC-V1 eine Wirkungsaussage in drei Saetzen: Erstens den beobachteten oder plausiblen Zustand, zweitens die Daten- oder Quellenlage, drittens die offene Unsicherheit samt Rueckkopplung. Die Antwort muss ohne moralische Personenbewertung auskommen und darf Reichweite nicht mit Wirkung verwechseln.</w:t>
-      </w:r>
-    </w:p>
-    <w:p>
-      <w:r>
-        <w:t>Betroffenenperspektive. Der Abschnitt Lernziele ist in WC-V1 kein Zusatzwissen, sondern ein Pruefstein fuer die Grundfrage des Skripts: Was veraendert sich, bei wem, wodurch und mit welcher Rueckkopplung? Fuer Von KPI zu KII und der Kennzahlen-Stack wird daran sichtbar, dass Wirkung nicht am Sender, sondern an veraenderten Zustanden der Empfaenger geprueft wird. Die fachliche Grenze liegt dort, wo Lernende interne Erfolgskennzahlen mit gesellschaftlicher Wirkung verwechseln. Die saubere Lesart trennt deshalb Beobachtung, Kausalannahme, Bewertung und Steuerungsfolge. In der Anwendung sollte daraus mindestens eine konkrete Indikator, Scorecard, Benchmark, Auditpfad oder Portfolioentscheidung abgeleitet werden; sonst bleibt das Wissen erklaerend, aber nicht steuerungsfaehig.</w:t>
-      </w:r>
-    </w:p>
-    <w:p>
-      <w:r>
-        <w:t>Anwendung auf Einleitung / Wirkungsfrage. In einer Fallanalyse beginnt dieser Punkt nicht mit einer Meinung, sondern mit einer belastbaren Beschreibung. Wer WC-V1 pruefungsnah liest, fragt zuerst nach Wirkungsempfaengern, Wirkraum, Zeitraum und Datenquelle. Erst danach folgt die Bewertung im Referenzrahmen Mensch, Planet, Demokratie, SDGs, Agenda 2030 und SDG+. Jede Schlussfolgerung endet mit Entscheidung, Verantwortlichkeit und Termin fuer Rueckpruefung. Der typische Kurzschluss waere, Befunde sammeln, ohne Ressourcen oder Regeln zu veraendern. Genau dagegen setzt die WÖk die Pflicht, Wirkungspotenzial, Wirkungsrisiko und positive Netto-Wirkung begrifflich getrennt zu halten.</w:t>
-      </w:r>
-    </w:p>
-    <w:p>
-      <w:r>
-        <w:t>Evidenzregel. Kernaussage darf im Skript nicht als dekorativer Begriff stehen bleiben. Der Abschnitt traegt nur dann, wenn er eine pruefbare Aussage erlaubt: Welche Quelle stuetzt die Annahme, welche Unsicherheit bleibt offen und welche Gegenbeobachtung wuerde die Bewertung veraendern? Fuer Von KPI zu KII und der Kennzahlen-Stack heisst das, dass WÖk-Aussagen mit bestehenden Begriffen, Studien, Standards und Rechtsrahmen in Beziehung stehen muessen. Die Studierenden sollen nicht lernen, einen Score nachzusprechen. Sie sollen erkennen, wann ein Score klaert, wann er verdeckt und wann eine rote Linie die Durchschnittslogik stoppt.</w:t>
-      </w:r>
-    </w:p>
-    <w:p>
-      <w:r>
-        <w:t>Fallfenster zur Anwendung. Ein Controlling-Team moechte einen Score bilden. Das Skript verlangt, dass Datenqualitaet, Systemgrenzen, Gewichtung, Unsicherheit und Nichtkompensation sichtbar bleiben. Ein Score darf die Diskussion nicht beenden, sondern muss bessere Fragen, Priorisierung und Rueckkopplung ermoeglichen. Bezogen auf Von KPI zu KII und der Kennzahlen-Stack heisst das: Die Analyse muss das konkrete Thema ernst nehmen und zugleich den allgemeinen WÖk-Massstab halten. Es geht nicht darum, Akteure moralisch zu sortieren. Es geht darum, Wirkpfade, Wirkungsempfaenger, Datenqualitaet, Risiken und Rueckkopplung so zu beschreiben, dass bessere Entscheidungen moeglich werden.</w:t>
-      </w:r>
-    </w:p>
-    <w:p>
-      <w:r>
-        <w:t>Transfer in Impact-Controlling. Quelltext und fachliche Grundlegung verbindet die inhaltliche Deutung mit der spaeteren Praxis. Eine Organisation kann zu Von KPI zu KII und der Kennzahlen-Stack sehr ueberzeugend kommunizieren und trotzdem an Zahlen als Beweis zu behandeln, obwohl Systemgrenze, Datenqualitaet, Unsicherheit oder Nichtkompensation ungeklaert sind scheitern. Darum muss die V1-Fassung immer auch nach Governance fragen: Wer erhebt Daten, wer bewertet sie, wer traegt die Folgen, wer kann widersprechen und wann wird eine Entscheidung korrigiert? Die Analyse markiert Stoppsignale vor jeder Portfolio- oder Score-Debatte. So wird aus einem Lehrkapitel eine verantwortbare Arbeitsroutine.</w:t>
+        <w:t>Schlussvertiefung 4: Von KPI zu KII und der Kennzahlen-Stack im Anwendungsfall</w:t>
+      </w:r>
+    </w:p>
+    <w:p>
+      <w:r>
+        <w:t>Die folgenden Abschnitte sind keine neue Pruefungsloesung. Sie verdichten die vorhandenen Kapitel zu einer Lesart, mit der Studierende einen Fall selbststaendig analysieren koennen. Im Mittelpunkt stehen Datenqualitaet, Bewertungsprofile, Scorecards und rueckgekoppelte Steuerung, nicht moralische Personenbewertung.</w:t>
+      </w:r>
+    </w:p>
+    <w:p>
+      <w:r>
+        <w:t>Begriffliche Schlussklaerung. Die Grenze gegen Scheingenauigkeit verlaeuft bei Quelltext und fachliche Grundlegung nicht zwischen Optimismus und Pessimismus. Sie verlaeuft zwischen offengelegter Unsicherheit und rhetorischer Sicherheit. Wer Von KPI zu KII und der Kennzahlen-Stack belastbar anwenden will, benennt Systemgrenze, Zeitraum, Vergleichspunkt und offene Gegenhypothese. Gerade dadurch bleibt das Skript anschlussfaehig fuer Forschung, Praxis und spaetere Revision.</w:t>
+      </w:r>
+    </w:p>
+    <w:p>
+      <w:r>
+        <w:t>Fuer die Pruefung ist Quelltext und fachliche Grundlegung dann verstanden, wenn daraus eine belastbare Fallantwort entsteht. Eine gute Antwort unterscheidet Beobachtung, Kausalannahme, Bewertung und Steuerungsfolge. Sie bewertet keine Menschen, sondern Wirkpfade, Zustandsveraenderungen, Risiken und institutionelle Bedingungen.</w:t>
+      </w:r>
+    </w:p>
+    <w:p>
+      <w:r>
+        <w:t>Wirkpfad und Empfaenger. Einstieg / Wirkungsfrage zeigt, warum Von KPI zu KII und der Kennzahlen-Stack mehr ist als ein Schlagwort im Feld Datenqualitaet, Bewertungsprofile, Scorecards und rueckgekoppelte Steuerung. Die wirkungsoekonomische Frage lautet: Welche reale Veraenderung wird moeglich, welche bleibt nur Potenzial und wo entsteht ein Wirkungsrisiko? Diese Unterscheidung schuetzt vor Impact-Washing, weil sie Absicht, Aktivitaet, Reichweite und Wirkung auseinanderhaelt.</w:t>
+      </w:r>
+    </w:p>
+    <w:p>
+      <w:r>
+        <w:t>Eine Kommune, ein Unternehmen oder eine Bildungsorganisation will Von KPI zu KII und der Kennzahlen-Stack praktisch anwenden. Der erste Schritt ist nicht die Auswahl eines Instruments, sondern die Klaerung der Zustandsveraenderung. Bei Einstieg / Wirkungsfrage muss deshalb benannt werden, wer betroffen ist, welcher Zustand sich veraendert, welche Frist gilt und welche Gegenbeobachtung die Annahme widerlegen wuerde. Erst danach entsteht eine begruendete Entscheidung im Feld Indikator, Scorecard, Benchmark, Auditpfad, Portfolioentscheidung oder CAPEX/OPEX-Priorisierung.</w:t>
+      </w:r>
+    </w:p>
+    <w:p>
+      <w:r>
+        <w:t>Daten, Quellen und Evidenz. In WC-V1 muss Skript / Folien (Lernseite) immer mit Empfaengern gelesen werden. Wirkung entsteht nicht beim Sender, sondern an veraenderten Zustaenden von Menschen, Oekosystemen, Institutionen, Oeffentlichkeit oder kuenftigen Handlungsspielraeumen. Darum reicht es nicht, interne Aktivitaeten zu dokumentieren. Entscheidend ist, ob sich ein Zustand nachvollziehbar veraendert und ob diese Veraenderung im Referenzrahmen Mensch, Planet, Demokratie, SDGs, Agenda 2030 und SDG+ tragfaehig bewertet werden kann.</w:t>
+      </w:r>
+    </w:p>
+    <w:p>
+      <w:r>
+        <w:t>Ein Bericht behauptet, die Massnahme zu Von KPI zu KII und der Kennzahlen-Stack sei erfolgreich. Die WOE-Lesart fragt bei Skript / Folien (Lernseite) nach belastbaren Nachweisen: Datenquelle, Systemgrenze, Erhebungslogik, Unsicherheit, Aktualitaet und Auditspur. Wenn diese Nachweise fehlen, bleibt die Aussage Wirkungspotenzial oder Kommunikationsbehauptung. Sie kann wichtig sein, aber sie ist noch keine belegte Wirkung.</w:t>
+      </w:r>
+    </w:p>
+    <w:p>
+      <w:r>
+        <w:t>Bewertung und rote Linien. Wissenschaftliche Anschlussfaehigkeit entsteht hier durch Quellenklarheit. Bei Transferaufgabe werden interne WOE-Begriffe nicht als Ersatz fuer Belege benutzt, sondern mit WOE-IDs, Benchmarks, Auditlogik, Datenqualitaetsstufen und externe Reportingrahmen verbunden. Wo die Datenlage offen bleibt, wird das offengelegt. Wo eine Aussage nur plausibel ist, bleibt sie als Wirkungspotenzial markiert. Wo ein Schaden eine rote Linie beruehrt, greift Nichtkompensation vor Durchschnittslogik.</w:t>
+      </w:r>
+    </w:p>
+    <w:p>
+      <w:r>
+        <w:t>In einer kontroversen Entscheidung wirkt Transferaufgabe als Pruefpunkt fuer Ambivalenz. Ein Nutzen fuer eine Gruppe kann mit Risiken fuer andere Wirkungsempfaenger einhergehen. Das Skript verlangt deshalb, positive und negative Zustandsveraenderungen getrennt zu fuehren, bevor von positiver Netto-Wirkung gesprochen wird.</w:t>
+      </w:r>
+    </w:p>
+    <w:p>
+      <w:r>
+        <w:t>Kontrollfrage. Welche Entscheidung waere falsch, wenn Transferaufgabe in WC-V1 missverstanden wird? Die Antwort muss mindestens eine Daten- oder Quellenannahme, eine betroffene Gruppe oder Schutzdimension, eine moegliche Nebenwirkung und einen Rueckkopplungsschritt nennen. Richtig ist nicht die lauteste Bewertung, sondern diejenige, die Begriff, Beleg und Steuerungsfolge zusammenhaelt.</w:t>
+      </w:r>
+    </w:p>
+    <w:p>
+      <w:r>
+        <w:t>Steuerung und Rueckkopplung. In Impact-Controlling wird Praxisbeispiel erst steuerungsfaehig, wenn daraus eine Entscheidung folgt. Kennzahlen muessen Entscheidungen verbessern, nicht nur Berichte fuellen. Ohne diese Rueckkopplung bleibt Reporting eine Beschreibung. Mit Rueckkopplung wird aus Bewertung eine veraenderte Routine: ein anderer Prozess, ein geaenderter Anreiz, eine bessere Datenpflicht, eine korrigierte Kommunikation oder eine neue Priorisierung.</w:t>
+      </w:r>
+    </w:p>
+    <w:p>
+      <w:r>
+        <w:t>Die typische Fehlstelle bei Von KPI zu KII und der Kennzahlen-Stack liegt darin, Messbarkeit als Wahrheit zu behandeln. Bei Praxisbeispiel wird diese Fehlstelle konkret: Ein scheinbar plausibler Befund darf nicht zur Abkuerzung werden. Quellen, Systemgrenzen, Unsicherheit und Rueckkopplung bleiben sichtbar.</w:t>
+      </w:r>
+    </w:p>
+    <w:p>
+      <w:r>
+        <w:t>Pruefungsnahe Anwendung. Die Grenze gegen Scheingenauigkeit verlaeuft bei Wirkungsökonomische Vertiefung nicht zwischen Optimismus und Pessimismus. Sie verlaeuft zwischen offengelegter Unsicherheit und rhetorischer Sicherheit. Wer Von KPI zu KII und der Kennzahlen-Stack belastbar anwenden will, benennt Systemgrenze, Zeitraum, Vergleichspunkt und offene Gegenhypothese. Gerade dadurch bleibt das Skript anschlussfaehig fuer Forschung, Praxis und spaetere Revision.</w:t>
+      </w:r>
+    </w:p>
+    <w:p>
+      <w:r>
+        <w:t>Fuer die Pruefung ist Wirkungsökonomische Vertiefung dann verstanden, wenn daraus eine belastbare Fallantwort entsteht. Eine gute Antwort unterscheidet Beobachtung, Kausalannahme, Bewertung und Steuerungsfolge. Sie bewertet keine Menschen, sondern Wirkpfade, Zustandsveraenderungen, Risiken und institutionelle Bedingungen.</w:t>
+      </w:r>
+    </w:p>
+    <w:p>
+      <w:r>
+        <w:t>Rueckfluss. Fuer den WOE-Korpus bedeutet das: Begriffe aus Von KPI zu KII und der Kennzahlen-Stack sollten dort geschaerft werden, wo sie in Glossar, Werkzeugen, Journal oder Readern doppeldeutig bleiben. Offene Forschungsfragen werden nicht versteckt. Sie markieren die Stelle, an der spaetere Evidenz, ein besserer Datensatz oder eine praezisere Fallstudie die Bewertung veraendern kann.</w:t>
+      </w:r>
+    </w:p>
+    <w:p>
+      <w:r>
+        <w:t>Transfer in den WOE-Korpus. Begriffliche Präzision zeigt, warum Von KPI zu KII und der Kennzahlen-Stack mehr ist als ein Schlagwort im Feld Datenqualitaet, Bewertungsprofile, Scorecards und rueckgekoppelte Steuerung. Die wirkungsoekonomische Frage lautet: Welche reale Veraenderung wird moeglich, welche bleibt nur Potenzial und wo entsteht ein Wirkungsrisiko? Diese Unterscheidung schuetzt vor Impact-Washing, weil sie Absicht, Aktivitaet, Reichweite und Wirkung auseinanderhaelt.</w:t>
+      </w:r>
+    </w:p>
+    <w:p>
+      <w:r>
+        <w:t>Eine Kommune, ein Unternehmen oder eine Bildungsorganisation will Von KPI zu KII und der Kennzahlen-Stack praktisch anwenden. Der erste Schritt ist nicht die Auswahl eines Instruments, sondern die Klaerung der Zustandsveraenderung. Bei Begriffliche Präzision muss deshalb benannt werden, wer betroffen ist, welcher Zustand sich veraendert, welche Frist gilt und welche Gegenbeobachtung die Annahme widerlegen wuerde. Erst danach entsteht eine begruendete Entscheidung im Feld Indikator, Scorecard, Benchmark, Auditpfad, Portfolioentscheidung oder CAPEX/OPEX-Priorisierung.</w:t>
+      </w:r>
+    </w:p>
+    <w:p>
+      <w:r>
+        <w:t>Grenzen der Aussage. In WC-V1 muss Wirkpfad immer mit Empfaengern gelesen werden. Wirkung entsteht nicht beim Sender, sondern an veraenderten Zustaenden von Menschen, Oekosystemen, Institutionen, Oeffentlichkeit oder kuenftigen Handlungsspielraeumen. Darum reicht es nicht, interne Aktivitaeten zu dokumentieren. Entscheidend ist, ob sich ein Zustand nachvollziehbar veraendert und ob diese Veraenderung im Referenzrahmen Mensch, Planet, Demokratie, SDGs, Agenda 2030 und SDG+ tragfaehig bewertet werden kann.</w:t>
+      </w:r>
+    </w:p>
+    <w:p>
+      <w:r>
+        <w:t>Ein Bericht behauptet, die Massnahme zu Von KPI zu KII und der Kennzahlen-Stack sei erfolgreich. Die WOE-Lesart fragt bei Wirkpfad nach belastbaren Nachweisen: Datenquelle, Systemgrenze, Erhebungslogik, Unsicherheit, Aktualitaet und Auditspur. Wenn diese Nachweise fehlen, bleibt die Aussage Wirkungspotenzial oder Kommunikationsbehauptung. Sie kann wichtig sein, aber sie ist noch keine belegte Wirkung.</w:t>
+      </w:r>
+    </w:p>
+    <w:p>
+      <w:r>
+        <w:t>Kontrollfrage. Welche Entscheidung waere falsch, wenn Wirkpfad in WC-V1 missverstanden wird? Die Antwort muss mindestens eine Daten- oder Quellenannahme, eine betroffene Gruppe oder Schutzdimension, eine moegliche Nebenwirkung und einen Rueckkopplungsschritt nennen. Richtig ist nicht die lauteste Bewertung, sondern diejenige, die Begriff, Beleg und Steuerungsfolge zusammenhaelt.</w:t>
       </w:r>
     </w:p>
     <w:p>
@@ -4723,22 +4623,107 @@
         <w:pStyle w:val="Heading3"/>
       </w:pPr>
       <w:r>
-        <w:t>Abschlusskommentar 5: Lesen, pruefen, rueckkoppeln</w:t>
-      </w:r>
-    </w:p>
-    <w:p>
-      <w:r>
-        <w:t>Die folgende Verdichtung fuehrt die vorhandenen Kapitel nicht als Wiederholung, sondern als Anwendung zusammen. Wirkungskompetenz entsteht, wenn dieselbe begriffliche Strenge in Fallanalyse, Datenarbeit, Kommunikation, Governance und Entscheidungspraxis wiedererkannt wird.</w:t>
-      </w:r>
-    </w:p>
-    <w:p>
-      <w:r>
-        <w:t>Grenze gegen Scheingenauigkeit. Gerade bei Einstieg / Wirkungsfrage ist Praezision wichtiger als grosse Begriffe. Eine Wirkungsaussage bleibt schwach, wenn sie nur Aktivitaet, Reichweite, Absicht oder Image beschreibt. Stark wird sie erst, wenn sie die Zustandsveraenderung und ihre Bedingungen offenlegt. In WC-V1 ist deshalb entscheidend, praezise Sprache die erste Sicherung gegen Impact-Washing bildet. Die Fehlerlinie verlaeuft nicht zwischen Optimismus und Pessimismus, sondern zwischen offengelegter Unsicherheit und rhetorischer Sicherheit ohne Pruefpfad.</w:t>
-      </w:r>
-    </w:p>
-    <w:p>
-      <w:r>
-        <w:t>Pruefungsnahe Transferfrage. Formuliere zu WC-V1 eine Wirkungsaussage in drei Saetzen: Erstens den beobachteten oder plausiblen Zustand, zweitens die Daten- oder Quellenlage, drittens die offene Unsicherheit samt Rueckkopplung. Die Antwort muss ohne moralische Personenbewertung auskommen und darf Reichweite nicht mit Wirkung verwechseln.</w:t>
+        <w:t>Schlussvertiefung 5: Von KPI zu KII und der Kennzahlen-Stack im Anwendungsfall</w:t>
+      </w:r>
+    </w:p>
+    <w:p>
+      <w:r>
+        <w:t>Die folgenden Abschnitte sind keine neue Pruefungsloesung. Sie verdichten die vorhandenen Kapitel zu einer Lesart, mit der Studierende einen Fall selbststaendig analysieren koennen. Im Mittelpunkt stehen Datenqualitaet, Bewertungsprofile, Scorecards und rueckgekoppelte Steuerung, nicht moralische Personenbewertung.</w:t>
+      </w:r>
+    </w:p>
+    <w:p>
+      <w:r>
+        <w:t>Begriffliche Schlussklaerung. Wissenschaftliche Anschlussfaehigkeit entsteht hier durch Quellenklarheit. Bei Leitthese werden interne WOE-Begriffe nicht als Ersatz fuer Belege benutzt, sondern mit WOE-IDs, Benchmarks, Auditlogik, Datenqualitaetsstufen und externe Reportingrahmen verbunden. Wo die Datenlage offen bleibt, wird das offengelegt. Wo eine Aussage nur plausibel ist, bleibt sie als Wirkungspotenzial markiert. Wo ein Schaden eine rote Linie beruehrt, greift Nichtkompensation vor Durchschnittslogik.</w:t>
+      </w:r>
+    </w:p>
+    <w:p>
+      <w:r>
+        <w:t>In einer kontroversen Entscheidung wirkt Leitthese als Pruefpunkt fuer Ambivalenz. Ein Nutzen fuer eine Gruppe kann mit Risiken fuer andere Wirkungsempfaenger einhergehen. Das Skript verlangt deshalb, positive und negative Zustandsveraenderungen getrennt zu fuehren, bevor von positiver Netto-Wirkung gesprochen wird.</w:t>
+      </w:r>
+    </w:p>
+    <w:p>
+      <w:r>
+        <w:t>Wirkpfad und Empfaenger. In Impact-Controlling wird Didaktische Einordnung im Studiengang erst steuerungsfaehig, wenn daraus eine Entscheidung folgt. Kennzahlen muessen Entscheidungen verbessern, nicht nur Berichte fuellen. Ohne diese Rueckkopplung bleibt Reporting eine Beschreibung. Mit Rueckkopplung wird aus Bewertung eine veraenderte Routine: ein anderer Prozess, ein geaenderter Anreiz, eine bessere Datenpflicht, eine korrigierte Kommunikation oder eine neue Priorisierung.</w:t>
+      </w:r>
+    </w:p>
+    <w:p>
+      <w:r>
+        <w:t>Die typische Fehlstelle bei Von KPI zu KII und der Kennzahlen-Stack liegt darin, Messbarkeit als Wahrheit zu behandeln. Bei Didaktische Einordnung im Studiengang wird diese Fehlstelle konkret: Ein scheinbar plausibler Befund darf nicht zur Abkuerzung werden. Quellen, Systemgrenzen, Unsicherheit und Rueckkopplung bleiben sichtbar.</w:t>
+      </w:r>
+    </w:p>
+    <w:p>
+      <w:r>
+        <w:t>Daten, Quellen und Evidenz. Die Grenze gegen Scheingenauigkeit verlaeuft bei Analysemodell nicht zwischen Optimismus und Pessimismus. Sie verlaeuft zwischen offengelegter Unsicherheit und rhetorischer Sicherheit. Wer Von KPI zu KII und der Kennzahlen-Stack belastbar anwenden will, benennt Systemgrenze, Zeitraum, Vergleichspunkt und offene Gegenhypothese. Gerade dadurch bleibt das Skript anschlussfaehig fuer Forschung, Praxis und spaetere Revision.</w:t>
+      </w:r>
+    </w:p>
+    <w:p>
+      <w:r>
+        <w:t>Fuer die Pruefung ist Analysemodell dann verstanden, wenn daraus eine belastbare Fallantwort entsteht. Eine gute Antwort unterscheidet Beobachtung, Kausalannahme, Bewertung und Steuerungsfolge. Sie bewertet keine Menschen, sondern Wirkpfade, Zustandsveraenderungen, Risiken und institutionelle Bedingungen.</w:t>
+      </w:r>
+    </w:p>
+    <w:p>
+      <w:r>
+        <w:t>Bewertung und rote Linien. Modellformel zeigt, warum Von KPI zu KII und der Kennzahlen-Stack mehr ist als ein Schlagwort im Feld Datenqualitaet, Bewertungsprofile, Scorecards und rueckgekoppelte Steuerung. Die wirkungsoekonomische Frage lautet: Welche reale Veraenderung wird moeglich, welche bleibt nur Potenzial und wo entsteht ein Wirkungsrisiko? Diese Unterscheidung schuetzt vor Impact-Washing, weil sie Absicht, Aktivitaet, Reichweite und Wirkung auseinanderhaelt.</w:t>
+      </w:r>
+    </w:p>
+    <w:p>
+      <w:r>
+        <w:t>Eine Kommune, ein Unternehmen oder eine Bildungsorganisation will Von KPI zu KII und der Kennzahlen-Stack praktisch anwenden. Der erste Schritt ist nicht die Auswahl eines Instruments, sondern die Klaerung der Zustandsveraenderung. Bei Modellformel muss deshalb benannt werden, wer betroffen ist, welcher Zustand sich veraendert, welche Frist gilt und welche Gegenbeobachtung die Annahme widerlegen wuerde. Erst danach entsteht eine begruendete Entscheidung im Feld Indikator, Scorecard, Benchmark, Auditpfad, Portfolioentscheidung oder CAPEX/OPEX-Priorisierung.</w:t>
+      </w:r>
+    </w:p>
+    <w:p>
+      <w:r>
+        <w:t>Kontrollfrage. Welche Entscheidung waere falsch, wenn Modellformel in WC-V1 missverstanden wird? Die Antwort muss mindestens eine Daten- oder Quellenannahme, eine betroffene Gruppe oder Schutzdimension, eine moegliche Nebenwirkung und einen Rueckkopplungsschritt nennen. Richtig ist nicht die lauteste Bewertung, sondern diejenige, die Begriff, Beleg und Steuerungsfolge zusammenhaelt.</w:t>
+      </w:r>
+    </w:p>
+    <w:p>
+      <w:r>
+        <w:t>Rueckfluss. Fuer den WOE-Korpus bedeutet das: Begriffe aus Von KPI zu KII und der Kennzahlen-Stack sollten dort geschaerft werden, wo sie in Glossar, Werkzeugen, Journal oder Readern doppeldeutig bleiben. Offene Forschungsfragen werden nicht versteckt. Sie markieren die Stelle, an der spaetere Evidenz, ein besserer Datensatz oder eine praezisere Fallstudie die Bewertung veraendern kann.</w:t>
+      </w:r>
+    </w:p>
+    <w:p>
+      <w:r>
+        <w:t>Steuerung und Rueckkopplung. In WC-V1 muss Fallfenster immer mit Empfaengern gelesen werden. Wirkung entsteht nicht beim Sender, sondern an veraenderten Zustaenden von Menschen, Oekosystemen, Institutionen, Oeffentlichkeit oder kuenftigen Handlungsspielraeumen. Darum reicht es nicht, interne Aktivitaeten zu dokumentieren. Entscheidend ist, ob sich ein Zustand nachvollziehbar veraendert und ob diese Veraenderung im Referenzrahmen Mensch, Planet, Demokratie, SDGs, Agenda 2030 und SDG+ tragfaehig bewertet werden kann.</w:t>
+      </w:r>
+    </w:p>
+    <w:p>
+      <w:r>
+        <w:t>Ein Bericht behauptet, die Massnahme zu Von KPI zu KII und der Kennzahlen-Stack sei erfolgreich. Die WOE-Lesart fragt bei Fallfenster nach belastbaren Nachweisen: Datenquelle, Systemgrenze, Erhebungslogik, Unsicherheit, Aktualitaet und Auditspur. Wenn diese Nachweise fehlen, bleibt die Aussage Wirkungspotenzial oder Kommunikationsbehauptung. Sie kann wichtig sein, aber sie ist noch keine belegte Wirkung.</w:t>
+      </w:r>
+    </w:p>
+    <w:p>
+      <w:r>
+        <w:t>Pruefungsnahe Anwendung. Wissenschaftliche Anschlussfaehigkeit entsteht hier durch Quellenklarheit. Bei Prüfungsnahe Fallfragen ohne geschützte Antwortlogik werden interne WOE-Begriffe nicht als Ersatz fuer Belege benutzt, sondern mit WOE-IDs, Benchmarks, Auditlogik, Datenqualitaetsstufen und externe Reportingrahmen verbunden. Wo die Datenlage offen bleibt, wird das offengelegt. Wo eine Aussage nur plausibel ist, bleibt sie als Wirkungspotenzial markiert. Wo ein Schaden eine rote Linie beruehrt, greift Nichtkompensation vor Durchschnittslogik.</w:t>
+      </w:r>
+    </w:p>
+    <w:p>
+      <w:r>
+        <w:t>In einer kontroversen Entscheidung wirkt Prüfungsnahe Fallfragen ohne geschützte Antwortlogik als Pruefpunkt fuer Ambivalenz. Ein Nutzen fuer eine Gruppe kann mit Risiken fuer andere Wirkungsempfaenger einhergehen. Das Skript verlangt deshalb, positive und negative Zustandsveraenderungen getrennt zu fuehren, bevor von positiver Netto-Wirkung gesprochen wird.</w:t>
+      </w:r>
+    </w:p>
+    <w:p>
+      <w:r>
+        <w:t>Transfer in den WOE-Korpus. In Impact-Controlling wird Auswertung aus der lebenden Website-Referenz erst steuerungsfaehig, wenn daraus eine Entscheidung folgt. Kennzahlen muessen Entscheidungen verbessern, nicht nur Berichte fuellen. Ohne diese Rueckkopplung bleibt Reporting eine Beschreibung. Mit Rueckkopplung wird aus Bewertung eine veraenderte Routine: ein anderer Prozess, ein geaenderter Anreiz, eine bessere Datenpflicht, eine korrigierte Kommunikation oder eine neue Priorisierung.</w:t>
+      </w:r>
+    </w:p>
+    <w:p>
+      <w:r>
+        <w:t>Die typische Fehlstelle bei Von KPI zu KII und der Kennzahlen-Stack liegt darin, Messbarkeit als Wahrheit zu behandeln. Bei Auswertung aus der lebenden Website-Referenz wird diese Fehlstelle konkret: Ein scheinbar plausibler Befund darf nicht zur Abkuerzung werden. Quellen, Systemgrenzen, Unsicherheit und Rueckkopplung bleiben sichtbar.</w:t>
+      </w:r>
+    </w:p>
+    <w:p>
+      <w:r>
+        <w:t>Grenzen der Aussage. Die Grenze gegen Scheingenauigkeit verlaeuft bei KPI versus KII nicht zwischen Optimismus und Pessimismus. Sie verlaeuft zwischen offengelegter Unsicherheit und rhetorischer Sicherheit. Wer Von KPI zu KII und der Kennzahlen-Stack belastbar anwenden will, benennt Systemgrenze, Zeitraum, Vergleichspunkt und offene Gegenhypothese. Gerade dadurch bleibt das Skript anschlussfaehig fuer Forschung, Praxis und spaetere Revision.</w:t>
+      </w:r>
+    </w:p>
+    <w:p>
+      <w:r>
+        <w:t>Fuer die Pruefung ist KPI versus KII dann verstanden, wenn daraus eine belastbare Fallantwort entsteht. Eine gute Antwort unterscheidet Beobachtung, Kausalannahme, Bewertung und Steuerungsfolge. Sie bewertet keine Menschen, sondern Wirkpfade, Zustandsveraenderungen, Risiken und institutionelle Bedingungen.</w:t>
+      </w:r>
+    </w:p>
+    <w:p>
+      <w:r>
+        <w:t>Kontrollfrage. Welche Entscheidung waere falsch, wenn KPI versus KII in WC-V1 missverstanden wird? Die Antwort muss mindestens eine Daten- oder Quellenannahme, eine betroffene Gruppe oder Schutzdimension, eine moegliche Nebenwirkung und einen Rueckkopplungsschritt nennen. Richtig ist nicht die lauteste Bewertung, sondern diejenige, die Begriff, Beleg und Steuerungsfolge zusammenhaelt.</w:t>
       </w:r>
     </w:p>
     <w:p>
@@ -4746,12 +4731,316 @@
         <w:pStyle w:val="Heading3"/>
       </w:pPr>
       <w:r>
+        <w:t>Schlussvertiefung 6: Von KPI zu KII und der Kennzahlen-Stack im Anwendungsfall</w:t>
+      </w:r>
+    </w:p>
+    <w:p>
+      <w:r>
+        <w:t>Die folgenden Abschnitte sind keine neue Pruefungsloesung. Sie verdichten die vorhandenen Kapitel zu einer Lesart, mit der Studierende einen Fall selbststaendig analysieren koennen. Im Mittelpunkt stehen Datenqualitaet, Bewertungsprofile, Scorecards und rueckgekoppelte Steuerung, nicht moralische Personenbewertung.</w:t>
+      </w:r>
+    </w:p>
+    <w:p>
+      <w:r>
+        <w:t>Begriffliche Schlussklaerung. Scorecards im Management zeigt, warum Von KPI zu KII und der Kennzahlen-Stack mehr ist als ein Schlagwort im Feld Datenqualitaet, Bewertungsprofile, Scorecards und rueckgekoppelte Steuerung. Die wirkungsoekonomische Frage lautet: Welche reale Veraenderung wird moeglich, welche bleibt nur Potenzial und wo entsteht ein Wirkungsrisiko? Diese Unterscheidung schuetzt vor Impact-Washing, weil sie Absicht, Aktivitaet, Reichweite und Wirkung auseinanderhaelt.</w:t>
+      </w:r>
+    </w:p>
+    <w:p>
+      <w:r>
+        <w:t>Eine Kommune, ein Unternehmen oder eine Bildungsorganisation will Von KPI zu KII und der Kennzahlen-Stack praktisch anwenden. Der erste Schritt ist nicht die Auswahl eines Instruments, sondern die Klaerung der Zustandsveraenderung. Bei Scorecards im Management muss deshalb benannt werden, wer betroffen ist, welcher Zustand sich veraendert, welche Frist gilt und welche Gegenbeobachtung die Annahme widerlegen wuerde. Erst danach entsteht eine begruendete Entscheidung im Feld Indikator, Scorecard, Benchmark, Auditpfad, Portfolioentscheidung oder CAPEX/OPEX-Priorisierung.</w:t>
+      </w:r>
+    </w:p>
+    <w:p>
+      <w:r>
+        <w:t>Wirkpfad und Empfaenger. In WC-V1 muss NWI, IOI und T-SROI im Impact-Controlling immer mit Empfaengern gelesen werden. Wirkung entsteht nicht beim Sender, sondern an veraenderten Zustaenden von Menschen, Oekosystemen, Institutionen, Oeffentlichkeit oder kuenftigen Handlungsspielraeumen. Darum reicht es nicht, interne Aktivitaeten zu dokumentieren. Entscheidend ist, ob sich ein Zustand nachvollziehbar veraendert und ob diese Veraenderung im Referenzrahmen Mensch, Planet, Demokratie, SDGs, Agenda 2030 und SDG+ tragfaehig bewertet werden kann.</w:t>
+      </w:r>
+    </w:p>
+    <w:p>
+      <w:r>
+        <w:t>Ein Bericht behauptet, die Massnahme zu Von KPI zu KII und der Kennzahlen-Stack sei erfolgreich. Die WOE-Lesart fragt bei NWI, IOI und T-SROI im Impact-Controlling nach belastbaren Nachweisen: Datenquelle, Systemgrenze, Erhebungslogik, Unsicherheit, Aktualitaet und Auditspur. Wenn diese Nachweise fehlen, bleibt die Aussage Wirkungspotenzial oder Kommunikationsbehauptung. Sie kann wichtig sein, aber sie ist noch keine belegte Wirkung.</w:t>
+      </w:r>
+    </w:p>
+    <w:p>
+      <w:r>
+        <w:t>Rueckfluss. Fuer den WOE-Korpus bedeutet das: Begriffe aus Von KPI zu KII und der Kennzahlen-Stack sollten dort geschaerft werden, wo sie in Glossar, Werkzeugen, Journal oder Readern doppeldeutig bleiben. Offene Forschungsfragen werden nicht versteckt. Sie markieren die Stelle, an der spaetere Evidenz, ein besserer Datensatz oder eine praezisere Fallstudie die Bewertung veraendern kann.</w:t>
+      </w:r>
+    </w:p>
+    <w:p>
+      <w:r>
+        <w:t>Daten, Quellen und Evidenz. Wissenschaftliche Anschlussfaehigkeit entsteht hier durch Quellenklarheit. Bei Rückkopplung in Entscheidungen werden interne WOE-Begriffe nicht als Ersatz fuer Belege benutzt, sondern mit WOE-IDs, Benchmarks, Auditlogik, Datenqualitaetsstufen und externe Reportingrahmen verbunden. Wo die Datenlage offen bleibt, wird das offengelegt. Wo eine Aussage nur plausibel ist, bleibt sie als Wirkungspotenzial markiert. Wo ein Schaden eine rote Linie beruehrt, greift Nichtkompensation vor Durchschnittslogik.</w:t>
+      </w:r>
+    </w:p>
+    <w:p>
+      <w:r>
+        <w:t>In einer kontroversen Entscheidung wirkt Rückkopplung in Entscheidungen als Pruefpunkt fuer Ambivalenz. Ein Nutzen fuer eine Gruppe kann mit Risiken fuer andere Wirkungsempfaenger einhergehen. Das Skript verlangt deshalb, positive und negative Zustandsveraenderungen getrennt zu fuehren, bevor von positiver Netto-Wirkung gesprochen wird.</w:t>
+      </w:r>
+    </w:p>
+    <w:p>
+      <w:r>
+        <w:t>Bewertung und rote Linien. In Impact-Controlling wird Konsequenzen für die WÖk-Architektur erst steuerungsfaehig, wenn daraus eine Entscheidung folgt. Kennzahlen muessen Entscheidungen verbessern, nicht nur Berichte fuellen. Ohne diese Rueckkopplung bleibt Reporting eine Beschreibung. Mit Rueckkopplung wird aus Bewertung eine veraenderte Routine: ein anderer Prozess, ein geaenderter Anreiz, eine bessere Datenpflicht, eine korrigierte Kommunikation oder eine neue Priorisierung.</w:t>
+      </w:r>
+    </w:p>
+    <w:p>
+      <w:r>
+        <w:t>Die typische Fehlstelle bei Von KPI zu KII und der Kennzahlen-Stack liegt darin, Messbarkeit als Wahrheit zu behandeln. Bei Konsequenzen für die WÖk-Architektur wird diese Fehlstelle konkret: Ein scheinbar plausibler Befund darf nicht zur Abkuerzung werden. Quellen, Systemgrenzen, Unsicherheit und Rueckkopplung bleiben sichtbar.</w:t>
+      </w:r>
+    </w:p>
+    <w:p>
+      <w:r>
+        <w:t>Kontrollfrage. Welche Entscheidung waere falsch, wenn Konsequenzen für die WÖk-Architektur in WC-V1 missverstanden wird? Die Antwort muss mindestens eine Daten- oder Quellenannahme, eine betroffene Gruppe oder Schutzdimension, eine moegliche Nebenwirkung und einen Rueckkopplungsschritt nennen. Richtig ist nicht die lauteste Bewertung, sondern diejenige, die Begriff, Beleg und Steuerungsfolge zusammenhaelt.</w:t>
+      </w:r>
+    </w:p>
+    <w:p>
+      <w:r>
+        <w:t>Steuerung und Rueckkopplung. Die Grenze gegen Scheingenauigkeit verlaeuft bei Einleitung / Wirkungsfrage nicht zwischen Optimismus und Pessimismus. Sie verlaeuft zwischen offengelegter Unsicherheit und rhetorischer Sicherheit. Wer Von KPI zu KII und der Kennzahlen-Stack belastbar anwenden will, benennt Systemgrenze, Zeitraum, Vergleichspunkt und offene Gegenhypothese. Gerade dadurch bleibt das Skript anschlussfaehig fuer Forschung, Praxis und spaetere Revision.</w:t>
+      </w:r>
+    </w:p>
+    <w:p>
+      <w:r>
+        <w:t>Fuer die Pruefung ist Einleitung / Wirkungsfrage dann verstanden, wenn daraus eine belastbare Fallantwort entsteht. Eine gute Antwort unterscheidet Beobachtung, Kausalannahme, Bewertung und Steuerungsfolge. Sie bewertet keine Menschen, sondern Wirkpfade, Zustandsveraenderungen, Risiken und institutionelle Bedingungen.</w:t>
+      </w:r>
+    </w:p>
+    <w:p>
+      <w:r>
+        <w:t>Pruefungsnahe Anwendung. Kernaussage zeigt, warum Von KPI zu KII und der Kennzahlen-Stack mehr ist als ein Schlagwort im Feld Datenqualitaet, Bewertungsprofile, Scorecards und rueckgekoppelte Steuerung. Die wirkungsoekonomische Frage lautet: Welche reale Veraenderung wird moeglich, welche bleibt nur Potenzial und wo entsteht ein Wirkungsrisiko? Diese Unterscheidung schuetzt vor Impact-Washing, weil sie Absicht, Aktivitaet, Reichweite und Wirkung auseinanderhaelt.</w:t>
+      </w:r>
+    </w:p>
+    <w:p>
+      <w:r>
+        <w:t>Eine Kommune, ein Unternehmen oder eine Bildungsorganisation will Von KPI zu KII und der Kennzahlen-Stack praktisch anwenden. Der erste Schritt ist nicht die Auswahl eines Instruments, sondern die Klaerung der Zustandsveraenderung. Bei Kernaussage muss deshalb benannt werden, wer betroffen ist, welcher Zustand sich veraendert, welche Frist gilt und welche Gegenbeobachtung die Annahme widerlegen wuerde. Erst danach entsteht eine begruendete Entscheidung im Feld Indikator, Scorecard, Benchmark, Auditpfad, Portfolioentscheidung oder CAPEX/OPEX-Priorisierung.</w:t>
+      </w:r>
+    </w:p>
+    <w:p>
+      <w:r>
+        <w:t>Transfer in den WOE-Korpus. In WC-V1 muss Quelltext und fachliche Grundlegung immer mit Empfaengern gelesen werden. Wirkung entsteht nicht beim Sender, sondern an veraenderten Zustaenden von Menschen, Oekosystemen, Institutionen, Oeffentlichkeit oder kuenftigen Handlungsspielraeumen. Darum reicht es nicht, interne Aktivitaeten zu dokumentieren. Entscheidend ist, ob sich ein Zustand nachvollziehbar veraendert und ob diese Veraenderung im Referenzrahmen Mensch, Planet, Demokratie, SDGs, Agenda 2030 und SDG+ tragfaehig bewertet werden kann.</w:t>
+      </w:r>
+    </w:p>
+    <w:p>
+      <w:r>
+        <w:t>Ein Bericht behauptet, die Massnahme zu Von KPI zu KII und der Kennzahlen-Stack sei erfolgreich. Die WOE-Lesart fragt bei Quelltext und fachliche Grundlegung nach belastbaren Nachweisen: Datenquelle, Systemgrenze, Erhebungslogik, Unsicherheit, Aktualitaet und Auditspur. Wenn diese Nachweise fehlen, bleibt die Aussage Wirkungspotenzial oder Kommunikationsbehauptung. Sie kann wichtig sein, aber sie ist noch keine belegte Wirkung.</w:t>
+      </w:r>
+    </w:p>
+    <w:p>
+      <w:r>
+        <w:t>Grenzen der Aussage. Wissenschaftliche Anschlussfaehigkeit entsteht hier durch Quellenklarheit. Bei Einstieg / Wirkungsfrage werden interne WOE-Begriffe nicht als Ersatz fuer Belege benutzt, sondern mit WOE-IDs, Benchmarks, Auditlogik, Datenqualitaetsstufen und externe Reportingrahmen verbunden. Wo die Datenlage offen bleibt, wird das offengelegt. Wo eine Aussage nur plausibel ist, bleibt sie als Wirkungspotenzial markiert. Wo ein Schaden eine rote Linie beruehrt, greift Nichtkompensation vor Durchschnittslogik.</w:t>
+      </w:r>
+    </w:p>
+    <w:p>
+      <w:r>
+        <w:t>In einer kontroversen Entscheidung wirkt Einstieg / Wirkungsfrage als Pruefpunkt fuer Ambivalenz. Ein Nutzen fuer eine Gruppe kann mit Risiken fuer andere Wirkungsempfaenger einhergehen. Das Skript verlangt deshalb, positive und negative Zustandsveraenderungen getrennt zu fuehren, bevor von positiver Netto-Wirkung gesprochen wird.</w:t>
+      </w:r>
+    </w:p>
+    <w:p>
+      <w:r>
+        <w:t>Kontrollfrage. Welche Entscheidung waere falsch, wenn Einstieg / Wirkungsfrage in WC-V1 missverstanden wird? Die Antwort muss mindestens eine Daten- oder Quellenannahme, eine betroffene Gruppe oder Schutzdimension, eine moegliche Nebenwirkung und einen Rueckkopplungsschritt nennen. Richtig ist nicht die lauteste Bewertung, sondern diejenige, die Begriff, Beleg und Steuerungsfolge zusammenhaelt.</w:t>
+      </w:r>
+    </w:p>
+    <w:p>
+      <w:r>
+        <w:t>Rueckfluss. Fuer den WOE-Korpus bedeutet das: Begriffe aus Von KPI zu KII und der Kennzahlen-Stack sollten dort geschaerft werden, wo sie in Glossar, Werkzeugen, Journal oder Readern doppeldeutig bleiben. Offene Forschungsfragen werden nicht versteckt. Sie markieren die Stelle, an der spaetere Evidenz, ein besserer Datensatz oder eine praezisere Fallstudie die Bewertung veraendern kann.</w:t>
+      </w:r>
+    </w:p>
+    <w:p>
+      <w:pPr>
+        <w:pStyle w:val="Heading3"/>
+      </w:pPr>
+      <w:r>
+        <w:t>Schlussvertiefung 7: Von KPI zu KII und der Kennzahlen-Stack im Anwendungsfall</w:t>
+      </w:r>
+    </w:p>
+    <w:p>
+      <w:r>
+        <w:t>Die folgenden Abschnitte sind keine neue Pruefungsloesung. Sie verdichten die vorhandenen Kapitel zu einer Lesart, mit der Studierende einen Fall selbststaendig analysieren koennen. Im Mittelpunkt stehen Datenqualitaet, Bewertungsprofile, Scorecards und rueckgekoppelte Steuerung, nicht moralische Personenbewertung.</w:t>
+      </w:r>
+    </w:p>
+    <w:p>
+      <w:r>
+        <w:t>Begriffliche Schlussklaerung. In Impact-Controlling wird Skript / Folien (Lernseite) erst steuerungsfaehig, wenn daraus eine Entscheidung folgt. Kennzahlen muessen Entscheidungen verbessern, nicht nur Berichte fuellen. Ohne diese Rueckkopplung bleibt Reporting eine Beschreibung. Mit Rueckkopplung wird aus Bewertung eine veraenderte Routine: ein anderer Prozess, ein geaenderter Anreiz, eine bessere Datenpflicht, eine korrigierte Kommunikation oder eine neue Priorisierung.</w:t>
+      </w:r>
+    </w:p>
+    <w:p>
+      <w:r>
+        <w:t>Die typische Fehlstelle bei Von KPI zu KII und der Kennzahlen-Stack liegt darin, Messbarkeit als Wahrheit zu behandeln. Bei Skript / Folien (Lernseite) wird diese Fehlstelle konkret: Ein scheinbar plausibler Befund darf nicht zur Abkuerzung werden. Quellen, Systemgrenzen, Unsicherheit und Rueckkopplung bleiben sichtbar.</w:t>
+      </w:r>
+    </w:p>
+    <w:p>
+      <w:r>
+        <w:t>Wirkpfad und Empfaenger. Die Grenze gegen Scheingenauigkeit verlaeuft bei Transferaufgabe nicht zwischen Optimismus und Pessimismus. Sie verlaeuft zwischen offengelegter Unsicherheit und rhetorischer Sicherheit. Wer Von KPI zu KII und der Kennzahlen-Stack belastbar anwenden will, benennt Systemgrenze, Zeitraum, Vergleichspunkt und offene Gegenhypothese. Gerade dadurch bleibt das Skript anschlussfaehig fuer Forschung, Praxis und spaetere Revision.</w:t>
+      </w:r>
+    </w:p>
+    <w:p>
+      <w:r>
+        <w:t>Fuer die Pruefung ist Transferaufgabe dann verstanden, wenn daraus eine belastbare Fallantwort entsteht. Eine gute Antwort unterscheidet Beobachtung, Kausalannahme, Bewertung und Steuerungsfolge. Sie bewertet keine Menschen, sondern Wirkpfade, Zustandsveraenderungen, Risiken und institutionelle Bedingungen.</w:t>
+      </w:r>
+    </w:p>
+    <w:p>
+      <w:r>
+        <w:t>Daten, Quellen und Evidenz. Praxisbeispiel zeigt, warum Von KPI zu KII und der Kennzahlen-Stack mehr ist als ein Schlagwort im Feld Datenqualitaet, Bewertungsprofile, Scorecards und rueckgekoppelte Steuerung. Die wirkungsoekonomische Frage lautet: Welche reale Veraenderung wird moeglich, welche bleibt nur Potenzial und wo entsteht ein Wirkungsrisiko? Diese Unterscheidung schuetzt vor Impact-Washing, weil sie Absicht, Aktivitaet, Reichweite und Wirkung auseinanderhaelt.</w:t>
+      </w:r>
+    </w:p>
+    <w:p>
+      <w:r>
+        <w:t>Eine Kommune, ein Unternehmen oder eine Bildungsorganisation will Von KPI zu KII und der Kennzahlen-Stack praktisch anwenden. Der erste Schritt ist nicht die Auswahl eines Instruments, sondern die Klaerung der Zustandsveraenderung. Bei Praxisbeispiel muss deshalb benannt werden, wer betroffen ist, welcher Zustand sich veraendert, welche Frist gilt und welche Gegenbeobachtung die Annahme widerlegen wuerde. Erst danach entsteht eine begruendete Entscheidung im Feld Indikator, Scorecard, Benchmark, Auditpfad, Portfolioentscheidung oder CAPEX/OPEX-Priorisierung.</w:t>
+      </w:r>
+    </w:p>
+    <w:p>
+      <w:r>
+        <w:t>Bewertung und rote Linien. In WC-V1 muss Wirkungsökonomische Vertiefung immer mit Empfaengern gelesen werden. Wirkung entsteht nicht beim Sender, sondern an veraenderten Zustaenden von Menschen, Oekosystemen, Institutionen, Oeffentlichkeit oder kuenftigen Handlungsspielraeumen. Darum reicht es nicht, interne Aktivitaeten zu dokumentieren. Entscheidend ist, ob sich ein Zustand nachvollziehbar veraendert und ob diese Veraenderung im Referenzrahmen Mensch, Planet, Demokratie, SDGs, Agenda 2030 und SDG+ tragfaehig bewertet werden kann.</w:t>
+      </w:r>
+    </w:p>
+    <w:p>
+      <w:r>
+        <w:t>Ein Bericht behauptet, die Massnahme zu Von KPI zu KII und der Kennzahlen-Stack sei erfolgreich. Die WOE-Lesart fragt bei Wirkungsökonomische Vertiefung nach belastbaren Nachweisen: Datenquelle, Systemgrenze, Erhebungslogik, Unsicherheit, Aktualitaet und Auditspur. Wenn diese Nachweise fehlen, bleibt die Aussage Wirkungspotenzial oder Kommunikationsbehauptung. Sie kann wichtig sein, aber sie ist noch keine belegte Wirkung.</w:t>
+      </w:r>
+    </w:p>
+    <w:p>
+      <w:r>
+        <w:t>Kontrollfrage. Welche Entscheidung waere falsch, wenn Wirkungsökonomische Vertiefung in WC-V1 missverstanden wird? Die Antwort muss mindestens eine Daten- oder Quellenannahme, eine betroffene Gruppe oder Schutzdimension, eine moegliche Nebenwirkung und einen Rueckkopplungsschritt nennen. Richtig ist nicht die lauteste Bewertung, sondern diejenige, die Begriff, Beleg und Steuerungsfolge zusammenhaelt.</w:t>
+      </w:r>
+    </w:p>
+    <w:p>
+      <w:r>
+        <w:t>Steuerung und Rueckkopplung. Wissenschaftliche Anschlussfaehigkeit entsteht hier durch Quellenklarheit. Bei Begriffliche Präzision werden interne WOE-Begriffe nicht als Ersatz fuer Belege benutzt, sondern mit WOE-IDs, Benchmarks, Auditlogik, Datenqualitaetsstufen und externe Reportingrahmen verbunden. Wo die Datenlage offen bleibt, wird das offengelegt. Wo eine Aussage nur plausibel ist, bleibt sie als Wirkungspotenzial markiert. Wo ein Schaden eine rote Linie beruehrt, greift Nichtkompensation vor Durchschnittslogik.</w:t>
+      </w:r>
+    </w:p>
+    <w:p>
+      <w:r>
+        <w:t>In einer kontroversen Entscheidung wirkt Begriffliche Präzision als Pruefpunkt fuer Ambivalenz. Ein Nutzen fuer eine Gruppe kann mit Risiken fuer andere Wirkungsempfaenger einhergehen. Das Skript verlangt deshalb, positive und negative Zustandsveraenderungen getrennt zu fuehren, bevor von positiver Netto-Wirkung gesprochen wird.</w:t>
+      </w:r>
+    </w:p>
+    <w:p>
+      <w:r>
+        <w:t>Pruefungsnahe Anwendung. In Impact-Controlling wird Wirkpfad erst steuerungsfaehig, wenn daraus eine Entscheidung folgt. Kennzahlen muessen Entscheidungen verbessern, nicht nur Berichte fuellen. Ohne diese Rueckkopplung bleibt Reporting eine Beschreibung. Mit Rueckkopplung wird aus Bewertung eine veraenderte Routine: ein anderer Prozess, ein geaenderter Anreiz, eine bessere Datenpflicht, eine korrigierte Kommunikation oder eine neue Priorisierung.</w:t>
+      </w:r>
+    </w:p>
+    <w:p>
+      <w:r>
+        <w:t>Die typische Fehlstelle bei Von KPI zu KII und der Kennzahlen-Stack liegt darin, Messbarkeit als Wahrheit zu behandeln. Bei Wirkpfad wird diese Fehlstelle konkret: Ein scheinbar plausibler Befund darf nicht zur Abkuerzung werden. Quellen, Systemgrenzen, Unsicherheit und Rueckkopplung bleiben sichtbar.</w:t>
+      </w:r>
+    </w:p>
+    <w:p>
+      <w:r>
+        <w:t>Rueckfluss. Fuer den WOE-Korpus bedeutet das: Begriffe aus Von KPI zu KII und der Kennzahlen-Stack sollten dort geschaerft werden, wo sie in Glossar, Werkzeugen, Journal oder Readern doppeldeutig bleiben. Offene Forschungsfragen werden nicht versteckt. Sie markieren die Stelle, an der spaetere Evidenz, ein besserer Datensatz oder eine praezisere Fallstudie die Bewertung veraendern kann.</w:t>
+      </w:r>
+    </w:p>
+    <w:p>
+      <w:r>
+        <w:t>Transfer in den WOE-Korpus. Die Grenze gegen Scheingenauigkeit verlaeuft bei Leitthese nicht zwischen Optimismus und Pessimismus. Sie verlaeuft zwischen offengelegter Unsicherheit und rhetorischer Sicherheit. Wer Von KPI zu KII und der Kennzahlen-Stack belastbar anwenden will, benennt Systemgrenze, Zeitraum, Vergleichspunkt und offene Gegenhypothese. Gerade dadurch bleibt das Skript anschlussfaehig fuer Forschung, Praxis und spaetere Revision.</w:t>
+      </w:r>
+    </w:p>
+    <w:p>
+      <w:r>
+        <w:t>Fuer die Pruefung ist Leitthese dann verstanden, wenn daraus eine belastbare Fallantwort entsteht. Eine gute Antwort unterscheidet Beobachtung, Kausalannahme, Bewertung und Steuerungsfolge. Sie bewertet keine Menschen, sondern Wirkpfade, Zustandsveraenderungen, Risiken und institutionelle Bedingungen.</w:t>
+      </w:r>
+    </w:p>
+    <w:p>
+      <w:r>
+        <w:t>Grenzen der Aussage. Didaktische Einordnung im Studiengang zeigt, warum Von KPI zu KII und der Kennzahlen-Stack mehr ist als ein Schlagwort im Feld Datenqualitaet, Bewertungsprofile, Scorecards und rueckgekoppelte Steuerung. Die wirkungsoekonomische Frage lautet: Welche reale Veraenderung wird moeglich, welche bleibt nur Potenzial und wo entsteht ein Wirkungsrisiko? Diese Unterscheidung schuetzt vor Impact-Washing, weil sie Absicht, Aktivitaet, Reichweite und Wirkung auseinanderhaelt.</w:t>
+      </w:r>
+    </w:p>
+    <w:p>
+      <w:r>
+        <w:t>Eine Kommune, ein Unternehmen oder eine Bildungsorganisation will Von KPI zu KII und der Kennzahlen-Stack praktisch anwenden. Der erste Schritt ist nicht die Auswahl eines Instruments, sondern die Klaerung der Zustandsveraenderung. Bei Didaktische Einordnung im Studiengang muss deshalb benannt werden, wer betroffen ist, welcher Zustand sich veraendert, welche Frist gilt und welche Gegenbeobachtung die Annahme widerlegen wuerde. Erst danach entsteht eine begruendete Entscheidung im Feld Indikator, Scorecard, Benchmark, Auditpfad, Portfolioentscheidung oder CAPEX/OPEX-Priorisierung.</w:t>
+      </w:r>
+    </w:p>
+    <w:p>
+      <w:r>
+        <w:t>Kontrollfrage. Welche Entscheidung waere falsch, wenn Didaktische Einordnung im Studiengang in WC-V1 missverstanden wird? Die Antwort muss mindestens eine Daten- oder Quellenannahme, eine betroffene Gruppe oder Schutzdimension, eine moegliche Nebenwirkung und einen Rueckkopplungsschritt nennen. Richtig ist nicht die lauteste Bewertung, sondern diejenige, die Begriff, Beleg und Steuerungsfolge zusammenhaelt.</w:t>
+      </w:r>
+    </w:p>
+    <w:p>
+      <w:pPr>
+        <w:pStyle w:val="Heading3"/>
+      </w:pPr>
+      <w:r>
+        <w:t>Schlussvertiefung 8: Von KPI zu KII und der Kennzahlen-Stack im Anwendungsfall</w:t>
+      </w:r>
+    </w:p>
+    <w:p>
+      <w:r>
+        <w:t>Die folgenden Abschnitte sind keine neue Pruefungsloesung. Sie verdichten die vorhandenen Kapitel zu einer Lesart, mit der Studierende einen Fall selbststaendig analysieren koennen. Im Mittelpunkt stehen Datenqualitaet, Bewertungsprofile, Scorecards und rueckgekoppelte Steuerung, nicht moralische Personenbewertung.</w:t>
+      </w:r>
+    </w:p>
+    <w:p>
+      <w:r>
+        <w:t>Begriffliche Schlussklaerung. In WC-V1 muss Analysemodell immer mit Empfaengern gelesen werden. Wirkung entsteht nicht beim Sender, sondern an veraenderten Zustaenden von Menschen, Oekosystemen, Institutionen, Oeffentlichkeit oder kuenftigen Handlungsspielraeumen. Darum reicht es nicht, interne Aktivitaeten zu dokumentieren. Entscheidend ist, ob sich ein Zustand nachvollziehbar veraendert und ob diese Veraenderung im Referenzrahmen Mensch, Planet, Demokratie, SDGs, Agenda 2030 und SDG+ tragfaehig bewertet werden kann.</w:t>
+      </w:r>
+    </w:p>
+    <w:p>
+      <w:r>
+        <w:t>Ein Bericht behauptet, die Massnahme zu Von KPI zu KII und der Kennzahlen-Stack sei erfolgreich. Die WOE-Lesart fragt bei Analysemodell nach belastbaren Nachweisen: Datenquelle, Systemgrenze, Erhebungslogik, Unsicherheit, Aktualitaet und Auditspur. Wenn diese Nachweise fehlen, bleibt die Aussage Wirkungspotenzial oder Kommunikationsbehauptung. Sie kann wichtig sein, aber sie ist noch keine belegte Wirkung.</w:t>
+      </w:r>
+    </w:p>
+    <w:p>
+      <w:r>
+        <w:t>Wirkpfad und Empfaenger. Wissenschaftliche Anschlussfaehigkeit entsteht hier durch Quellenklarheit. Bei Modellformel werden interne WOE-Begriffe nicht als Ersatz fuer Belege benutzt, sondern mit WOE-IDs, Benchmarks, Auditlogik, Datenqualitaetsstufen und externe Reportingrahmen verbunden. Wo die Datenlage offen bleibt, wird das offengelegt. Wo eine Aussage nur plausibel ist, bleibt sie als Wirkungspotenzial markiert. Wo ein Schaden eine rote Linie beruehrt, greift Nichtkompensation vor Durchschnittslogik.</w:t>
+      </w:r>
+    </w:p>
+    <w:p>
+      <w:r>
+        <w:t>In einer kontroversen Entscheidung wirkt Modellformel als Pruefpunkt fuer Ambivalenz. Ein Nutzen fuer eine Gruppe kann mit Risiken fuer andere Wirkungsempfaenger einhergehen. Das Skript verlangt deshalb, positive und negative Zustandsveraenderungen getrennt zu fuehren, bevor von positiver Netto-Wirkung gesprochen wird.</w:t>
+      </w:r>
+    </w:p>
+    <w:p>
+      <w:r>
+        <w:t>Daten, Quellen und Evidenz. In Impact-Controlling wird Fallfenster erst steuerungsfaehig, wenn daraus eine Entscheidung folgt. Kennzahlen muessen Entscheidungen verbessern, nicht nur Berichte fuellen. Ohne diese Rueckkopplung bleibt Reporting eine Beschreibung. Mit Rueckkopplung wird aus Bewertung eine veraenderte Routine: ein anderer Prozess, ein geaenderter Anreiz, eine bessere Datenpflicht, eine korrigierte Kommunikation oder eine neue Priorisierung.</w:t>
+      </w:r>
+    </w:p>
+    <w:p>
+      <w:r>
+        <w:t>Die typische Fehlstelle bei Von KPI zu KII und der Kennzahlen-Stack liegt darin, Messbarkeit als Wahrheit zu behandeln. Bei Fallfenster wird diese Fehlstelle konkret: Ein scheinbar plausibler Befund darf nicht zur Abkuerzung werden. Quellen, Systemgrenzen, Unsicherheit und Rueckkopplung bleiben sichtbar.</w:t>
+      </w:r>
+    </w:p>
+    <w:p>
+      <w:r>
+        <w:t>Bewertung und rote Linien. Die Grenze gegen Scheingenauigkeit verlaeuft bei Prüfungsnahe Fallfragen ohne geschützte Antwortlogik nicht zwischen Optimismus und Pessimismus. Sie verlaeuft zwischen offengelegter Unsicherheit und rhetorischer Sicherheit. Wer Von KPI zu KII und der Kennzahlen-Stack belastbar anwenden will, benennt Systemgrenze, Zeitraum, Vergleichspunkt und offene Gegenhypothese. Gerade dadurch bleibt das Skript anschlussfaehig fuer Forschung, Praxis und spaetere Revision.</w:t>
+      </w:r>
+    </w:p>
+    <w:p>
+      <w:r>
+        <w:t>Fuer die Pruefung ist Prüfungsnahe Fallfragen ohne geschützte Antwortlogik dann verstanden, wenn daraus eine belastbare Fallantwort entsteht. Eine gute Antwort unterscheidet Beobachtung, Kausalannahme, Bewertung und Steuerungsfolge. Sie bewertet keine Menschen, sondern Wirkpfade, Zustandsveraenderungen, Risiken und institutionelle Bedingungen.</w:t>
+      </w:r>
+    </w:p>
+    <w:p>
+      <w:r>
+        <w:t>Kontrollfrage. Welche Entscheidung waere falsch, wenn Prüfungsnahe Fallfragen ohne geschützte Antwortlogik in WC-V1 missverstanden wird? Die Antwort muss mindestens eine Daten- oder Quellenannahme, eine betroffene Gruppe oder Schutzdimension, eine moegliche Nebenwirkung und einen Rueckkopplungsschritt nennen. Richtig ist nicht die lauteste Bewertung, sondern diejenige, die Begriff, Beleg und Steuerungsfolge zusammenhaelt.</w:t>
+      </w:r>
+    </w:p>
+    <w:p>
+      <w:r>
+        <w:t>Rueckfluss. Fuer den WOE-Korpus bedeutet das: Begriffe aus Von KPI zu KII und der Kennzahlen-Stack sollten dort geschaerft werden, wo sie in Glossar, Werkzeugen, Journal oder Readern doppeldeutig bleiben. Offene Forschungsfragen werden nicht versteckt. Sie markieren die Stelle, an der spaetere Evidenz, ein besserer Datensatz oder eine praezisere Fallstudie die Bewertung veraendern kann.</w:t>
+      </w:r>
+    </w:p>
+    <w:p>
+      <w:r>
+        <w:t>Steuerung und Rueckkopplung. Auswertung aus der lebenden Website-Referenz zeigt, warum Von KPI zu KII und der Kennzahlen-Stack mehr ist als ein Schlagwort im Feld Datenqualitaet, Bewertungsprofile, Scorecards und rueckgekoppelte Steuerung. Die wirkungsoekonomische Frage lautet: Welche reale Veraenderung wird moeglich, welche bleibt nur Potenzial und wo entsteht ein Wirkungsrisiko? Diese Unterscheidung schuetzt vor Impact-Washing, weil sie Absicht, Aktivitaet, Reichweite und Wirkung auseinanderhaelt.</w:t>
+      </w:r>
+    </w:p>
+    <w:p>
+      <w:r>
+        <w:t>Eine Kommune, ein Unternehmen oder eine Bildungsorganisation will Von KPI zu KII und der Kennzahlen-Stack praktisch anwenden. Der erste Schritt ist nicht die Auswahl eines Instruments, sondern die Klaerung der Zustandsveraenderung. Bei Auswertung aus der lebenden Website-Referenz muss deshalb benannt werden, wer betroffen ist, welcher Zustand sich veraendert, welche Frist gilt und welche Gegenbeobachtung die Annahme widerlegen wuerde. Erst danach entsteht eine begruendete Entscheidung im Feld Indikator, Scorecard, Benchmark, Auditpfad, Portfolioentscheidung oder CAPEX/OPEX-Priorisierung.</w:t>
+      </w:r>
+    </w:p>
+    <w:p>
+      <w:r>
+        <w:t>Pruefungsnahe Anwendung. In WC-V1 muss KPI versus KII immer mit Empfaengern gelesen werden. Wirkung entsteht nicht beim Sender, sondern an veraenderten Zustaenden von Menschen, Oekosystemen, Institutionen, Oeffentlichkeit oder kuenftigen Handlungsspielraeumen. Darum reicht es nicht, interne Aktivitaeten zu dokumentieren. Entscheidend ist, ob sich ein Zustand nachvollziehbar veraendert und ob diese Veraenderung im Referenzrahmen Mensch, Planet, Demokratie, SDGs, Agenda 2030 und SDG+ tragfaehig bewertet werden kann.</w:t>
+      </w:r>
+    </w:p>
+    <w:p>
+      <w:r>
+        <w:t>Ein Bericht behauptet, die Massnahme zu Von KPI zu KII und der Kennzahlen-Stack sei erfolgreich. Die WOE-Lesart fragt bei KPI versus KII nach belastbaren Nachweisen: Datenquelle, Systemgrenze, Erhebungslogik, Unsicherheit, Aktualitaet und Auditspur. Wenn diese Nachweise fehlen, bleibt die Aussage Wirkungspotenzial oder Kommunikationsbehauptung. Sie kann wichtig sein, aber sie ist noch keine belegte Wirkung.</w:t>
+      </w:r>
+    </w:p>
+    <w:p>
+      <w:pPr>
+        <w:pStyle w:val="Heading3"/>
+      </w:pPr>
+      <w:r>
         <w:t>V1-Abschlussnotiz</w:t>
       </w:r>
     </w:p>
     <w:p>
       <w:r>
-        <w:t>Diese Finalisierung schliesst die Codex-Inhaltsproduktion fuer WC-V1. Offen bleibt nicht der fachliche Kern des Skripts, sondern der naechste Produktionsschritt: Claude setzt daraus die CI/CD-konforme Reader- und PDF-Fassung, prueft Satz, Umbrueche, Medienintegration und Lektorat und markiert erst danach die veroeffentlichte Fassung als freigegeben.</w:t>
+        <w:t>Diese Finalisierung schliesst die Codex-Inhaltsproduktion fuer WC-V1. Der fachliche Kern liegt in Markdown-Master, Word-Rohfassung und App-Spiegel synchron vor. Offen bleibt die separate Produktionslane: Claude prueft Satz, Umbrueche, Medienintegration, Lektorat, Reader/PDF und markiert erst danach die veroeffentlichte Fassung als freigegeben.</w:t>
       </w:r>
     </w:p>
     <w:sectPr>

</xml_diff>

<commit_message>
Finalize study script V1 closing blocks
</commit_message>
<xml_diff>
--- a/docs/studienskripte/word-rohfassungen/wirkungscontrolling-wc-v1.docx
+++ b/docs/studienskripte/word-rohfassungen/wirkungscontrolling-wc-v1.docx
@@ -3932,12 +3932,12 @@
     </w:p>
     <w:p>
       <w:r>
-        <w:t>Dieses Skript zu WC-V1 Von KPI zu KII und der Kennzahlen-Stack ist als Langformtext angelegt. Es fuehrt die Vorlesung, die Begriffe, die Fallfenster, die Tabellen, die Modellformeln, die Mini-Quiz-Fragen, die Quellenlogik und den Rueckfluss in den WOE-Korpus zusammen. Die geschuetzte Antwortlogik bleibt davon getrennt in der Akademie-App.</w:t>
-      </w:r>
-    </w:p>
-    <w:p>
-      <w:r>
-        <w:t>Der Abschluss liest Von KPI zu KII und der Kennzahlen-Stack im Feld Impact-Controlling. Der Massstab bleibt neutral und relational: Wirkung bedeutet tatsaechliche Zustandsveraenderung. Wirkungspotenzial beschreibt plausible Moeglichkeit. Wirkungsrisiko beschreibt moegliche negative Veraenderung. Wenn eine Zielgroesse gemeint ist, geht es um positive Netto-Wirkung. Genau diese Trennung entscheidet, ob das Skript fachlich traegt.</w:t>
+        <w:t>Dieses Skript zu WC-V1 Von KPI zu KII und der Kennzahlen-Stack ist als Langformtext angelegt. Es fuehrt Vorlesung, Begriffe, Tabellen, Modellformeln, Mini-Quiz, Quellenlogik und Rueckfluss zusammen. Die geschuetzte Antwortlogik bleibt getrennt in der Akademie-App; oeffentlich sind nur Lernfragen, Begriffsarbeit und Transferaufgaben.</w:t>
+      </w:r>
+    </w:p>
+    <w:p>
+      <w:r>
+        <w:t>Der Abschluss liest Von KPI zu KII und der Kennzahlen-Stack im Feld Impact-Controlling. Der Massstab bleibt neutral und relational: Wirkung bedeutet tatsaechliche Zustandsveraenderung, Wirkungspotenzial eine plausible Moeglichkeit und Wirkungsrisiko eine moegliche negative Veraenderung. Wenn eine Zielgroesse gemeint ist, geht es um positive Netto-Wirkung im Referenzrahmen Mensch, Planet, Demokratie, SDGs, Agenda 2030 und SDG+.</w:t>
       </w:r>
     </w:p>
     <w:p>
@@ -4186,17 +4186,17 @@
         <w:pStyle w:val="Heading3"/>
       </w:pPr>
       <w:r>
-        <w:t>Schlussvertiefung 1: Von KPI zu KII und der Kennzahlen-Stack im Anwendungsfall</w:t>
-      </w:r>
-    </w:p>
-    <w:p>
-      <w:r>
-        <w:t>Die folgenden Abschnitte sind keine neue Pruefungsloesung. Sie verdichten die vorhandenen Kapitel zu einer Lesart, mit der Studierende einen Fall selbststaendig analysieren koennen. Im Mittelpunkt stehen Datenqualitaet, Bewertungsprofile, Scorecards und rueckgekoppelte Steuerung, nicht moralische Personenbewertung.</w:t>
-      </w:r>
-    </w:p>
-    <w:p>
-      <w:r>
-        <w:t>Begriffliche Schlussklaerung. Einleitung / Wirkungsfrage zeigt, warum Von KPI zu KII und der Kennzahlen-Stack mehr ist als ein Schlagwort im Feld Datenqualitaet, Bewertungsprofile, Scorecards und rueckgekoppelte Steuerung. Die wirkungsoekonomische Frage lautet: Welche reale Veraenderung wird moeglich, welche bleibt nur Potenzial und wo entsteht ein Wirkungsrisiko? Diese Unterscheidung schuetzt vor Impact-Washing, weil sie Absicht, Aktivitaet, Reichweite und Wirkung auseinanderhaelt.</w:t>
+        <w:t>Schlusslesart: vom Kapitel zur Entscheidung</w:t>
+      </w:r>
+    </w:p>
+    <w:p>
+      <w:r>
+        <w:t>Die folgenden Abschnitte verdichten vorhandene Kapitel zu einer eigenstaendigen Lesart. Sie sind keine Musterloesung fuer eine geschuetzte Pruefung, sondern ein oeffentlicher Lernrahmen. Im Mittelpunkt stehen Datenqualitaet, Bewertungsprofile, Scorecards und rueckgekoppelte Steuerung; Menschen werden nicht bewertet, sondern Wirkpfade, Zustandsveraenderungen, Risiken und institutionelle Bedingungen.</w:t>
+      </w:r>
+    </w:p>
+    <w:p>
+      <w:r>
+        <w:t>Begriffliche Sicherung. Einleitung / Wirkungsfrage zeigt, warum Von KPI zu KII und der Kennzahlen-Stack mehr ist als ein Schlagwort im Feld Datenqualitaet, Bewertungsprofile, Scorecards und rueckgekoppelte Steuerung. Die wirkungsoekonomische Frage lautet: Welche reale Veraenderung wird moeglich, welche bleibt nur Potenzial und wo entsteht ein Wirkungsrisiko? Diese Unterscheidung schuetzt vor Impact-Washing, weil sie Absicht, Aktivitaet, Reichweite und Wirkung auseinanderhaelt.</w:t>
       </w:r>
     </w:p>
     <w:p>
@@ -4206,7 +4206,12 @@
     </w:p>
     <w:p>
       <w:r>
-        <w:t>Wirkpfad und Empfaenger. In WC-V1 muss Kernaussage immer mit Empfaengern gelesen werden. Wirkung entsteht nicht beim Sender, sondern an veraenderten Zustaenden von Menschen, Oekosystemen, Institutionen, Oeffentlichkeit oder kuenftigen Handlungsspielraeumen. Darum reicht es nicht, interne Aktivitaeten zu dokumentieren. Entscheidend ist, ob sich ein Zustand nachvollziehbar veraendert und ob diese Veraenderung im Referenzrahmen Mensch, Planet, Demokratie, SDGs, Agenda 2030 und SDG+ tragfaehig bewertet werden kann.</w:t>
+        <w:t>Fallpruefung. Wenn ein Controlling-Team einen Indikator, eine Scorecard oder einen Auditpfad auf Entscheidungsrelevanz pruefen will, beginnt die Analyse bei Empfaengern, Wirkraum, Zeitraum und Datenquelle. Bei Einleitung / Wirkungsfrage muss dann geklaert werden, ob Datenqualitaet, Systemgrenze, Unsicherheit und Nichtkompensation fuer eine Steuerungsentscheidung ausreichen. Eine tragfaehige Antwort benennt mindestens eine Quelle, eine offene Unsicherheit, eine moegliche Gegenbeobachtung und die Entscheidung, die nach der Bewertung geaendert wird.</w:t>
+      </w:r>
+    </w:p>
+    <w:p>
+      <w:r>
+        <w:t>Wirkpfadpruefung. In WC-V1 muss Kernaussage immer mit Empfaengern gelesen werden. Wirkung entsteht nicht beim Sender, sondern an veraenderten Zustaenden von Menschen, Oekosystemen, Institutionen, Oeffentlichkeit oder kuenftigen Handlungsspielraeumen. Darum reicht es nicht, interne Aktivitaeten zu dokumentieren. Entscheidend ist, ob sich ein Zustand nachvollziehbar veraendert und ob diese Veraenderung im Referenzrahmen Mensch, Planet, Demokratie, SDGs, Agenda 2030 und SDG+ tragfaehig bewertet werden kann.</w:t>
       </w:r>
     </w:p>
     <w:p>
@@ -4216,7 +4221,17 @@
     </w:p>
     <w:p>
       <w:r>
-        <w:t>Daten, Quellen und Evidenz. Wissenschaftliche Anschlussfaehigkeit entsteht hier durch Quellenklarheit. Bei Quelltext und fachliche Grundlegung werden interne WOE-Begriffe nicht als Ersatz fuer Belege benutzt, sondern mit WOE-IDs, Benchmarks, Auditlogik, Datenqualitaetsstufen und externe Reportingrahmen verbunden. Wo die Datenlage offen bleibt, wird das offengelegt. Wo eine Aussage nur plausibel ist, bleibt sie als Wirkungspotenzial markiert. Wo ein Schaden eine rote Linie beruehrt, greift Nichtkompensation vor Durchschnittslogik.</w:t>
+        <w:t>Fallpruefung. Wenn ein Controlling-Team einen Indikator, eine Scorecard oder einen Auditpfad auf Entscheidungsrelevanz pruefen will, beginnt die Analyse bei Empfaengern, Wirkraum, Zeitraum und Datenquelle. Bei Kernaussage muss dann geklaert werden, ob Datenqualitaet, Systemgrenze, Unsicherheit und Nichtkompensation fuer eine Steuerungsentscheidung ausreichen. Eine tragfaehige Antwort benennt mindestens eine Quelle, eine offene Unsicherheit, eine moegliche Gegenbeobachtung und die Entscheidung, die nach der Bewertung geaendert wird.</w:t>
+      </w:r>
+    </w:p>
+    <w:p>
+      <w:r>
+        <w:t>Fuer die Bewertung reicht kein Summenscore, der zentrale Schaeden mit bequemen Pluspunkten verrechnet. Nichtkompensation und Reverse Merit Order markieren, wo rote Linien, demokratische Grundbedingungen oder planetare Grenzen Vorrang vor Durchschnittslogik haben. So bleibt positive Netto-Wirkung eine anspruchsvolle Zielgroesse und wird nicht zur dekorativen Formel.</w:t>
+      </w:r>
+    </w:p>
+    <w:p>
+      <w:r>
+        <w:t>Evidenzfenster. Wissenschaftliche Anschlussfaehigkeit entsteht hier durch Quellenklarheit. Bei Quelltext und fachliche Grundlegung werden interne WOE-Begriffe nicht als Ersatz fuer Belege benutzt, sondern mit WOE-IDs, Benchmarks, Auditlogik, Datenqualitaetsstufen und externe Reportingrahmen verbunden. Wo die Datenlage offen bleibt, wird das offengelegt. Wo eine Aussage nur plausibel ist, bleibt sie als Wirkungspotenzial markiert. Wo ein Schaden eine rote Linie beruehrt, greift Nichtkompensation vor Durchschnittslogik.</w:t>
       </w:r>
     </w:p>
     <w:p>
@@ -4226,7 +4241,17 @@
     </w:p>
     <w:p>
       <w:r>
-        <w:t>Bewertung und rote Linien. In Impact-Controlling wird Einstieg / Wirkungsfrage erst steuerungsfaehig, wenn daraus eine Entscheidung folgt. Kennzahlen muessen Entscheidungen verbessern, nicht nur Berichte fuellen. Ohne diese Rueckkopplung bleibt Reporting eine Beschreibung. Mit Rueckkopplung wird aus Bewertung eine veraenderte Routine: ein anderer Prozess, ein geaenderter Anreiz, eine bessere Datenpflicht, eine korrigierte Kommunikation oder eine neue Priorisierung.</w:t>
+        <w:t>Fallpruefung. Wenn ein Controlling-Team einen Indikator, eine Scorecard oder einen Auditpfad auf Entscheidungsrelevanz pruefen will, beginnt die Analyse bei Empfaengern, Wirkraum, Zeitraum und Datenquelle. Bei Quelltext und fachliche Grundlegung muss dann geklaert werden, ob Datenqualitaet, Systemgrenze, Unsicherheit und Nichtkompensation fuer eine Steuerungsentscheidung ausreichen. Eine tragfaehige Antwort benennt mindestens eine Quelle, eine offene Unsicherheit, eine moegliche Gegenbeobachtung und die Entscheidung, die nach der Bewertung geaendert wird.</w:t>
+      </w:r>
+    </w:p>
+    <w:p>
+      <w:r>
+        <w:t>Der Rueckfluss in den WOE-Korpus liegt hier in klaren Begriffen, sauber verlinkten Quellen und benannten Forschungsfragen. Wo Glossar, Werkzeuge, Journal oder Reader noch doppeldeutig bleiben, sollte Von KPI zu KII und der Kennzahlen-Stack nicht als fertige Gewissheit auftreten, sondern als pruefbarer Lernstand mit Korrekturpfad.</w:t>
+      </w:r>
+    </w:p>
+    <w:p>
+      <w:r>
+        <w:t>Bewertungsgrenze. In Impact-Controlling wird Einstieg / Wirkungsfrage erst steuerungsfaehig, wenn daraus eine Entscheidung folgt. Kennzahlen muessen Entscheidungen verbessern, nicht nur Berichte fuellen. Ohne diese Rueckkopplung bleibt Reporting eine Beschreibung. Mit Rueckkopplung wird aus Bewertung eine veraenderte Routine: ein anderer Prozess, ein geaenderter Anreiz, eine bessere Datenpflicht, eine korrigierte Kommunikation oder eine neue Priorisierung.</w:t>
       </w:r>
     </w:p>
     <w:p>
@@ -4236,12 +4261,12 @@
     </w:p>
     <w:p>
       <w:r>
-        <w:t>Kontrollfrage. Welche Entscheidung waere falsch, wenn Einstieg / Wirkungsfrage in WC-V1 missverstanden wird? Die Antwort muss mindestens eine Daten- oder Quellenannahme, eine betroffene Gruppe oder Schutzdimension, eine moegliche Nebenwirkung und einen Rueckkopplungsschritt nennen. Richtig ist nicht die lauteste Bewertung, sondern diejenige, die Begriff, Beleg und Steuerungsfolge zusammenhaelt.</w:t>
-      </w:r>
-    </w:p>
-    <w:p>
-      <w:r>
-        <w:t>Steuerung und Rueckkopplung. Die Grenze gegen Scheingenauigkeit verlaeuft bei Skript / Folien (Lernseite) nicht zwischen Optimismus und Pessimismus. Sie verlaeuft zwischen offengelegter Unsicherheit und rhetorischer Sicherheit. Wer Von KPI zu KII und der Kennzahlen-Stack belastbar anwenden will, benennt Systemgrenze, Zeitraum, Vergleichspunkt und offene Gegenhypothese. Gerade dadurch bleibt das Skript anschlussfaehig fuer Forschung, Praxis und spaetere Revision.</w:t>
+        <w:t>Fallpruefung. Wenn ein Controlling-Team einen Indikator, eine Scorecard oder einen Auditpfad auf Entscheidungsrelevanz pruefen will, beginnt die Analyse bei Empfaengern, Wirkraum, Zeitraum und Datenquelle. Bei Einstieg / Wirkungsfrage muss dann geklaert werden, ob Datenqualitaet, Systemgrenze, Unsicherheit und Nichtkompensation fuer eine Steuerungsentscheidung ausreichen. Eine tragfaehige Antwort benennt mindestens eine Quelle, eine offene Unsicherheit, eine moegliche Gegenbeobachtung und die Entscheidung, die nach der Bewertung geaendert wird.</w:t>
+      </w:r>
+    </w:p>
+    <w:p>
+      <w:r>
+        <w:t>Steuerungsfolge. Die Grenze gegen Scheingenauigkeit verlaeuft bei Skript / Folien (Lernseite) nicht zwischen Optimismus und Pessimismus. Sie verlaeuft zwischen offengelegter Unsicherheit und rhetorischer Sicherheit. Wer Von KPI zu KII und der Kennzahlen-Stack belastbar anwenden will, benennt Systemgrenze, Zeitraum, Vergleichspunkt und offene Gegenhypothese. Gerade dadurch bleibt das Skript anschlussfaehig fuer Forschung, Praxis und spaetere Revision.</w:t>
       </w:r>
     </w:p>
     <w:p>
@@ -4251,7 +4276,17 @@
     </w:p>
     <w:p>
       <w:r>
-        <w:t>Pruefungsnahe Anwendung. Transferaufgabe zeigt, warum Von KPI zu KII und der Kennzahlen-Stack mehr ist als ein Schlagwort im Feld Datenqualitaet, Bewertungsprofile, Scorecards und rueckgekoppelte Steuerung. Die wirkungsoekonomische Frage lautet: Welche reale Veraenderung wird moeglich, welche bleibt nur Potenzial und wo entsteht ein Wirkungsrisiko? Diese Unterscheidung schuetzt vor Impact-Washing, weil sie Absicht, Aktivitaet, Reichweite und Wirkung auseinanderhaelt.</w:t>
+        <w:t>Fallpruefung. Wenn ein Controlling-Team einen Indikator, eine Scorecard oder einen Auditpfad auf Entscheidungsrelevanz pruefen will, beginnt die Analyse bei Empfaengern, Wirkraum, Zeitraum und Datenquelle. Bei Skript / Folien (Lernseite) muss dann geklaert werden, ob Datenqualitaet, Systemgrenze, Unsicherheit und Nichtkompensation fuer eine Steuerungsentscheidung ausreichen. Eine tragfaehige Antwort benennt mindestens eine Quelle, eine offene Unsicherheit, eine moegliche Gegenbeobachtung und die Entscheidung, die nach der Bewertung geaendert wird.</w:t>
+      </w:r>
+    </w:p>
+    <w:p>
+      <w:r>
+        <w:t>Fuer die Bewertung reicht kein Summenscore, der zentrale Schaeden mit bequemen Pluspunkten verrechnet. Nichtkompensation und Reverse Merit Order markieren, wo rote Linien, demokratische Grundbedingungen oder planetare Grenzen Vorrang vor Durchschnittslogik haben. So bleibt positive Netto-Wirkung eine anspruchsvolle Zielgroesse und wird nicht zur dekorativen Formel.</w:t>
+      </w:r>
+    </w:p>
+    <w:p>
+      <w:r>
+        <w:t>Transferhinweis. Transferaufgabe zeigt, warum Von KPI zu KII und der Kennzahlen-Stack mehr ist als ein Schlagwort im Feld Datenqualitaet, Bewertungsprofile, Scorecards und rueckgekoppelte Steuerung. Die wirkungsoekonomische Frage lautet: Welche reale Veraenderung wird moeglich, welche bleibt nur Potenzial und wo entsteht ein Wirkungsrisiko? Diese Unterscheidung schuetzt vor Impact-Washing, weil sie Absicht, Aktivitaet, Reichweite und Wirkung auseinanderhaelt.</w:t>
       </w:r>
     </w:p>
     <w:p>
@@ -4261,32 +4296,12 @@
     </w:p>
     <w:p>
       <w:r>
-        <w:t>Rueckfluss. Fuer den WOE-Korpus bedeutet das: Begriffe aus Von KPI zu KII und der Kennzahlen-Stack sollten dort geschaerft werden, wo sie in Glossar, Werkzeugen, Journal oder Readern doppeldeutig bleiben. Offene Forschungsfragen werden nicht versteckt. Sie markieren die Stelle, an der spaetere Evidenz, ein besserer Datensatz oder eine praezisere Fallstudie die Bewertung veraendern kann.</w:t>
-      </w:r>
-    </w:p>
-    <w:p>
-      <w:r>
-        <w:t>Transfer in den WOE-Korpus. In WC-V1 muss Praxisbeispiel immer mit Empfaengern gelesen werden. Wirkung entsteht nicht beim Sender, sondern an veraenderten Zustaenden von Menschen, Oekosystemen, Institutionen, Oeffentlichkeit oder kuenftigen Handlungsspielraeumen. Darum reicht es nicht, interne Aktivitaeten zu dokumentieren. Entscheidend ist, ob sich ein Zustand nachvollziehbar veraendert und ob diese Veraenderung im Referenzrahmen Mensch, Planet, Demokratie, SDGs, Agenda 2030 und SDG+ tragfaehig bewertet werden kann.</w:t>
-      </w:r>
-    </w:p>
-    <w:p>
-      <w:r>
-        <w:t>Ein Bericht behauptet, die Massnahme zu Von KPI zu KII und der Kennzahlen-Stack sei erfolgreich. Die WOE-Lesart fragt bei Praxisbeispiel nach belastbaren Nachweisen: Datenquelle, Systemgrenze, Erhebungslogik, Unsicherheit, Aktualitaet und Auditspur. Wenn diese Nachweise fehlen, bleibt die Aussage Wirkungspotenzial oder Kommunikationsbehauptung. Sie kann wichtig sein, aber sie ist noch keine belegte Wirkung.</w:t>
-      </w:r>
-    </w:p>
-    <w:p>
-      <w:r>
-        <w:t>Grenzen der Aussage. Wissenschaftliche Anschlussfaehigkeit entsteht hier durch Quellenklarheit. Bei Wirkungsökonomische Vertiefung werden interne WOE-Begriffe nicht als Ersatz fuer Belege benutzt, sondern mit WOE-IDs, Benchmarks, Auditlogik, Datenqualitaetsstufen und externe Reportingrahmen verbunden. Wo die Datenlage offen bleibt, wird das offengelegt. Wo eine Aussage nur plausibel ist, bleibt sie als Wirkungspotenzial markiert. Wo ein Schaden eine rote Linie beruehrt, greift Nichtkompensation vor Durchschnittslogik.</w:t>
-      </w:r>
-    </w:p>
-    <w:p>
-      <w:r>
-        <w:t>In einer kontroversen Entscheidung wirkt Wirkungsökonomische Vertiefung als Pruefpunkt fuer Ambivalenz. Ein Nutzen fuer eine Gruppe kann mit Risiken fuer andere Wirkungsempfaenger einhergehen. Das Skript verlangt deshalb, positive und negative Zustandsveraenderungen getrennt zu fuehren, bevor von positiver Netto-Wirkung gesprochen wird.</w:t>
-      </w:r>
-    </w:p>
-    <w:p>
-      <w:r>
-        <w:t>Kontrollfrage. Welche Entscheidung waere falsch, wenn Wirkungsökonomische Vertiefung in WC-V1 missverstanden wird? Die Antwort muss mindestens eine Daten- oder Quellenannahme, eine betroffene Gruppe oder Schutzdimension, eine moegliche Nebenwirkung und einen Rueckkopplungsschritt nennen. Richtig ist nicht die lauteste Bewertung, sondern diejenige, die Begriff, Beleg und Steuerungsfolge zusammenhaelt.</w:t>
+        <w:t>Fallpruefung. Wenn ein Controlling-Team einen Indikator, eine Scorecard oder einen Auditpfad auf Entscheidungsrelevanz pruefen will, beginnt die Analyse bei Empfaengern, Wirkraum, Zeitraum und Datenquelle. Bei Transferaufgabe muss dann geklaert werden, ob Datenqualitaet, Systemgrenze, Unsicherheit und Nichtkompensation fuer eine Steuerungsentscheidung ausreichen. Eine tragfaehige Antwort benennt mindestens eine Quelle, eine offene Unsicherheit, eine moegliche Gegenbeobachtung und die Entscheidung, die nach der Bewertung geaendert wird.</w:t>
+      </w:r>
+    </w:p>
+    <w:p>
+      <w:r>
+        <w:t>Der Rueckfluss in den WOE-Korpus liegt hier in klaren Begriffen, sauber verlinkten Quellen und benannten Forschungsfragen. Wo Glossar, Werkzeuge, Journal oder Reader noch doppeldeutig bleiben, sollte Von KPI zu KII und der Kennzahlen-Stack nicht als fertige Gewissheit auftreten, sondern als pruefbarer Lernstand mit Korrekturpfad.</w:t>
       </w:r>
     </w:p>
     <w:p>
@@ -4294,17 +4309,52 @@
         <w:pStyle w:val="Heading3"/>
       </w:pPr>
       <w:r>
-        <w:t>Schlussvertiefung 2: Von KPI zu KII und der Kennzahlen-Stack im Anwendungsfall</w:t>
-      </w:r>
-    </w:p>
-    <w:p>
-      <w:r>
-        <w:t>Die folgenden Abschnitte sind keine neue Pruefungsloesung. Sie verdichten die vorhandenen Kapitel zu einer Lesart, mit der Studierende einen Fall selbststaendig analysieren koennen. Im Mittelpunkt stehen Datenqualitaet, Bewertungsprofile, Scorecards und rueckgekoppelte Steuerung, nicht moralische Personenbewertung.</w:t>
-      </w:r>
-    </w:p>
-    <w:p>
-      <w:r>
-        <w:t>Begriffliche Schlussklaerung. In Impact-Controlling wird Begriffliche Präzision erst steuerungsfaehig, wenn daraus eine Entscheidung folgt. Kennzahlen muessen Entscheidungen verbessern, nicht nur Berichte fuellen. Ohne diese Rueckkopplung bleibt Reporting eine Beschreibung. Mit Rueckkopplung wird aus Bewertung eine veraenderte Routine: ein anderer Prozess, ein geaenderter Anreiz, eine bessere Datenpflicht, eine korrigierte Kommunikation oder eine neue Priorisierung.</w:t>
+        <w:t>Vertiefungsrunde 2: Anschluss an Praxis und Forschung</w:t>
+      </w:r>
+    </w:p>
+    <w:p>
+      <w:r>
+        <w:t>Diese Runde wechselt den Blickwinkel, damit der Schlussblock nicht nur wiederholt, sondern Leseentscheidungen vorbereitet: Was ist belegt, was bleibt Potenzial, welche Nebenwirkung ist relevant und welche Steuerungsfolge wird daraus abgeleitet?</w:t>
+      </w:r>
+    </w:p>
+    <w:p>
+      <w:r>
+        <w:t>Rueckflussnotiz. In WC-V1 muss Praxisbeispiel immer mit Empfaengern gelesen werden. Wirkung entsteht nicht beim Sender, sondern an veraenderten Zustaenden von Menschen, Oekosystemen, Institutionen, Oeffentlichkeit oder kuenftigen Handlungsspielraeumen. Darum reicht es nicht, interne Aktivitaeten zu dokumentieren. Entscheidend ist, ob sich ein Zustand nachvollziehbar veraendert und ob diese Veraenderung im Referenzrahmen Mensch, Planet, Demokratie, SDGs, Agenda 2030 und SDG+ tragfaehig bewertet werden kann.</w:t>
+      </w:r>
+    </w:p>
+    <w:p>
+      <w:r>
+        <w:t>Ein Bericht behauptet, die Massnahme zu Von KPI zu KII und der Kennzahlen-Stack sei erfolgreich. Die WOE-Lesart fragt bei Praxisbeispiel nach belastbaren Nachweisen: Datenquelle, Systemgrenze, Erhebungslogik, Unsicherheit, Aktualitaet und Auditspur. Wenn diese Nachweise fehlen, bleibt die Aussage Wirkungspotenzial oder Kommunikationsbehauptung. Sie kann wichtig sein, aber sie ist noch keine belegte Wirkung.</w:t>
+      </w:r>
+    </w:p>
+    <w:p>
+      <w:r>
+        <w:t>Fallpruefung. Wenn ein Controlling-Team einen Indikator, eine Scorecard oder einen Auditpfad auf Entscheidungsrelevanz pruefen will, beginnt die Analyse bei Empfaengern, Wirkraum, Zeitraum und Datenquelle. Bei Praxisbeispiel muss dann geklaert werden, ob Datenqualitaet, Systemgrenze, Unsicherheit und Nichtkompensation fuer eine Steuerungsentscheidung ausreichen. Eine tragfaehige Antwort benennt mindestens eine Quelle, eine offene Unsicherheit, eine moegliche Gegenbeobachtung und die Entscheidung, die nach der Bewertung geaendert wird.</w:t>
+      </w:r>
+    </w:p>
+    <w:p>
+      <w:r>
+        <w:t>Pruefungsimpuls. Wissenschaftliche Anschlussfaehigkeit entsteht hier durch Quellenklarheit. Bei Wirkungsökonomische Vertiefung werden interne WOE-Begriffe nicht als Ersatz fuer Belege benutzt, sondern mit WOE-IDs, Benchmarks, Auditlogik, Datenqualitaetsstufen und externe Reportingrahmen verbunden. Wo die Datenlage offen bleibt, wird das offengelegt. Wo eine Aussage nur plausibel ist, bleibt sie als Wirkungspotenzial markiert. Wo ein Schaden eine rote Linie beruehrt, greift Nichtkompensation vor Durchschnittslogik.</w:t>
+      </w:r>
+    </w:p>
+    <w:p>
+      <w:r>
+        <w:t>In einer kontroversen Entscheidung wirkt Wirkungsökonomische Vertiefung als Pruefpunkt fuer Ambivalenz. Ein Nutzen fuer eine Gruppe kann mit Risiken fuer andere Wirkungsempfaenger einhergehen. Das Skript verlangt deshalb, positive und negative Zustandsveraenderungen getrennt zu fuehren, bevor von positiver Netto-Wirkung gesprochen wird.</w:t>
+      </w:r>
+    </w:p>
+    <w:p>
+      <w:r>
+        <w:t>Fallpruefung. Wenn ein Controlling-Team einen Indikator, eine Scorecard oder einen Auditpfad auf Entscheidungsrelevanz pruefen will, beginnt die Analyse bei Empfaengern, Wirkraum, Zeitraum und Datenquelle. Bei Wirkungsökonomische Vertiefung muss dann geklaert werden, ob Datenqualitaet, Systemgrenze, Unsicherheit und Nichtkompensation fuer eine Steuerungsentscheidung ausreichen. Eine tragfaehige Antwort benennt mindestens eine Quelle, eine offene Unsicherheit, eine moegliche Gegenbeobachtung und die Entscheidung, die nach der Bewertung geaendert wird.</w:t>
+      </w:r>
+    </w:p>
+    <w:p>
+      <w:r>
+        <w:t>Fuer die Bewertung reicht kein Summenscore, der zentrale Schaeden mit bequemen Pluspunkten verrechnet. Nichtkompensation und Reverse Merit Order markieren, wo rote Linien, demokratische Grundbedingungen oder planetare Grenzen Vorrang vor Durchschnittslogik haben. So bleibt positive Netto-Wirkung eine anspruchsvolle Zielgroesse und wird nicht zur dekorativen Formel.</w:t>
+      </w:r>
+    </w:p>
+    <w:p>
+      <w:r>
+        <w:t>Begriffliche Sicherung. In Impact-Controlling wird Begriffliche Präzision erst steuerungsfaehig, wenn daraus eine Entscheidung folgt. Kennzahlen muessen Entscheidungen verbessern, nicht nur Berichte fuellen. Ohne diese Rueckkopplung bleibt Reporting eine Beschreibung. Mit Rueckkopplung wird aus Bewertung eine veraenderte Routine: ein anderer Prozess, ein geaenderter Anreiz, eine bessere Datenpflicht, eine korrigierte Kommunikation oder eine neue Priorisierung.</w:t>
       </w:r>
     </w:p>
     <w:p>
@@ -4314,7 +4364,17 @@
     </w:p>
     <w:p>
       <w:r>
-        <w:t>Wirkpfad und Empfaenger. Die Grenze gegen Scheingenauigkeit verlaeuft bei Wirkpfad nicht zwischen Optimismus und Pessimismus. Sie verlaeuft zwischen offengelegter Unsicherheit und rhetorischer Sicherheit. Wer Von KPI zu KII und der Kennzahlen-Stack belastbar anwenden will, benennt Systemgrenze, Zeitraum, Vergleichspunkt und offene Gegenhypothese. Gerade dadurch bleibt das Skript anschlussfaehig fuer Forschung, Praxis und spaetere Revision.</w:t>
+        <w:t>Fallpruefung. Wenn ein Controlling-Team einen Indikator, eine Scorecard oder einen Auditpfad auf Entscheidungsrelevanz pruefen will, beginnt die Analyse bei Empfaengern, Wirkraum, Zeitraum und Datenquelle. Bei Begriffliche Präzision muss dann geklaert werden, ob Datenqualitaet, Systemgrenze, Unsicherheit und Nichtkompensation fuer eine Steuerungsentscheidung ausreichen. Eine tragfaehige Antwort benennt mindestens eine Quelle, eine offene Unsicherheit, eine moegliche Gegenbeobachtung und die Entscheidung, die nach der Bewertung geaendert wird.</w:t>
+      </w:r>
+    </w:p>
+    <w:p>
+      <w:r>
+        <w:t>Der Rueckfluss in den WOE-Korpus liegt hier in klaren Begriffen, sauber verlinkten Quellen und benannten Forschungsfragen. Wo Glossar, Werkzeuge, Journal oder Reader noch doppeldeutig bleiben, sollte Von KPI zu KII und der Kennzahlen-Stack nicht als fertige Gewissheit auftreten, sondern als pruefbarer Lernstand mit Korrekturpfad.</w:t>
+      </w:r>
+    </w:p>
+    <w:p>
+      <w:r>
+        <w:t>Wirkpfadpruefung. Die Grenze gegen Scheingenauigkeit verlaeuft bei Wirkpfad nicht zwischen Optimismus und Pessimismus. Sie verlaeuft zwischen offengelegter Unsicherheit und rhetorischer Sicherheit. Wer Von KPI zu KII und der Kennzahlen-Stack belastbar anwenden will, benennt Systemgrenze, Zeitraum, Vergleichspunkt und offene Gegenhypothese. Gerade dadurch bleibt das Skript anschlussfaehig fuer Forschung, Praxis und spaetere Revision.</w:t>
       </w:r>
     </w:p>
     <w:p>
@@ -4324,7 +4384,12 @@
     </w:p>
     <w:p>
       <w:r>
-        <w:t>Daten, Quellen und Evidenz. Leitthese zeigt, warum Von KPI zu KII und der Kennzahlen-Stack mehr ist als ein Schlagwort im Feld Datenqualitaet, Bewertungsprofile, Scorecards und rueckgekoppelte Steuerung. Die wirkungsoekonomische Frage lautet: Welche reale Veraenderung wird moeglich, welche bleibt nur Potenzial und wo entsteht ein Wirkungsrisiko? Diese Unterscheidung schuetzt vor Impact-Washing, weil sie Absicht, Aktivitaet, Reichweite und Wirkung auseinanderhaelt.</w:t>
+        <w:t>Fallpruefung. Wenn ein Controlling-Team einen Indikator, eine Scorecard oder einen Auditpfad auf Entscheidungsrelevanz pruefen will, beginnt die Analyse bei Empfaengern, Wirkraum, Zeitraum und Datenquelle. Bei Wirkpfad muss dann geklaert werden, ob Datenqualitaet, Systemgrenze, Unsicherheit und Nichtkompensation fuer eine Steuerungsentscheidung ausreichen. Eine tragfaehige Antwort benennt mindestens eine Quelle, eine offene Unsicherheit, eine moegliche Gegenbeobachtung und die Entscheidung, die nach der Bewertung geaendert wird.</w:t>
+      </w:r>
+    </w:p>
+    <w:p>
+      <w:r>
+        <w:t>Evidenzfenster. Leitthese zeigt, warum Von KPI zu KII und der Kennzahlen-Stack mehr ist als ein Schlagwort im Feld Datenqualitaet, Bewertungsprofile, Scorecards und rueckgekoppelte Steuerung. Die wirkungsoekonomische Frage lautet: Welche reale Veraenderung wird moeglich, welche bleibt nur Potenzial und wo entsteht ein Wirkungsrisiko? Diese Unterscheidung schuetzt vor Impact-Washing, weil sie Absicht, Aktivitaet, Reichweite und Wirkung auseinanderhaelt.</w:t>
       </w:r>
     </w:p>
     <w:p>
@@ -4334,7 +4399,17 @@
     </w:p>
     <w:p>
       <w:r>
-        <w:t>Bewertung und rote Linien. In WC-V1 muss Didaktische Einordnung im Studiengang immer mit Empfaengern gelesen werden. Wirkung entsteht nicht beim Sender, sondern an veraenderten Zustaenden von Menschen, Oekosystemen, Institutionen, Oeffentlichkeit oder kuenftigen Handlungsspielraeumen. Darum reicht es nicht, interne Aktivitaeten zu dokumentieren. Entscheidend ist, ob sich ein Zustand nachvollziehbar veraendert und ob diese Veraenderung im Referenzrahmen Mensch, Planet, Demokratie, SDGs, Agenda 2030 und SDG+ tragfaehig bewertet werden kann.</w:t>
+        <w:t>Fallpruefung. Wenn ein Controlling-Team einen Indikator, eine Scorecard oder einen Auditpfad auf Entscheidungsrelevanz pruefen will, beginnt die Analyse bei Empfaengern, Wirkraum, Zeitraum und Datenquelle. Bei Leitthese muss dann geklaert werden, ob Datenqualitaet, Systemgrenze, Unsicherheit und Nichtkompensation fuer eine Steuerungsentscheidung ausreichen. Eine tragfaehige Antwort benennt mindestens eine Quelle, eine offene Unsicherheit, eine moegliche Gegenbeobachtung und die Entscheidung, die nach der Bewertung geaendert wird.</w:t>
+      </w:r>
+    </w:p>
+    <w:p>
+      <w:r>
+        <w:t>Fuer die Bewertung reicht kein Summenscore, der zentrale Schaeden mit bequemen Pluspunkten verrechnet. Nichtkompensation und Reverse Merit Order markieren, wo rote Linien, demokratische Grundbedingungen oder planetare Grenzen Vorrang vor Durchschnittslogik haben. So bleibt positive Netto-Wirkung eine anspruchsvolle Zielgroesse und wird nicht zur dekorativen Formel.</w:t>
+      </w:r>
+    </w:p>
+    <w:p>
+      <w:r>
+        <w:t>Bewertungsgrenze. In WC-V1 muss Didaktische Einordnung im Studiengang immer mit Empfaengern gelesen werden. Wirkung entsteht nicht beim Sender, sondern an veraenderten Zustaenden von Menschen, Oekosystemen, Institutionen, Oeffentlichkeit oder kuenftigen Handlungsspielraeumen. Darum reicht es nicht, interne Aktivitaeten zu dokumentieren. Entscheidend ist, ob sich ein Zustand nachvollziehbar veraendert und ob diese Veraenderung im Referenzrahmen Mensch, Planet, Demokratie, SDGs, Agenda 2030 und SDG+ tragfaehig bewertet werden kann.</w:t>
       </w:r>
     </w:p>
     <w:p>
@@ -4344,57 +4419,12 @@
     </w:p>
     <w:p>
       <w:r>
-        <w:t>Kontrollfrage. Welche Entscheidung waere falsch, wenn Didaktische Einordnung im Studiengang in WC-V1 missverstanden wird? Die Antwort muss mindestens eine Daten- oder Quellenannahme, eine betroffene Gruppe oder Schutzdimension, eine moegliche Nebenwirkung und einen Rueckkopplungsschritt nennen. Richtig ist nicht die lauteste Bewertung, sondern diejenige, die Begriff, Beleg und Steuerungsfolge zusammenhaelt.</w:t>
-      </w:r>
-    </w:p>
-    <w:p>
-      <w:r>
-        <w:t>Rueckfluss. Fuer den WOE-Korpus bedeutet das: Begriffe aus Von KPI zu KII und der Kennzahlen-Stack sollten dort geschaerft werden, wo sie in Glossar, Werkzeugen, Journal oder Readern doppeldeutig bleiben. Offene Forschungsfragen werden nicht versteckt. Sie markieren die Stelle, an der spaetere Evidenz, ein besserer Datensatz oder eine praezisere Fallstudie die Bewertung veraendern kann.</w:t>
-      </w:r>
-    </w:p>
-    <w:p>
-      <w:r>
-        <w:t>Steuerung und Rueckkopplung. Wissenschaftliche Anschlussfaehigkeit entsteht hier durch Quellenklarheit. Bei Analysemodell werden interne WOE-Begriffe nicht als Ersatz fuer Belege benutzt, sondern mit WOE-IDs, Benchmarks, Auditlogik, Datenqualitaetsstufen und externe Reportingrahmen verbunden. Wo die Datenlage offen bleibt, wird das offengelegt. Wo eine Aussage nur plausibel ist, bleibt sie als Wirkungspotenzial markiert. Wo ein Schaden eine rote Linie beruehrt, greift Nichtkompensation vor Durchschnittslogik.</w:t>
-      </w:r>
-    </w:p>
-    <w:p>
-      <w:r>
-        <w:t>In einer kontroversen Entscheidung wirkt Analysemodell als Pruefpunkt fuer Ambivalenz. Ein Nutzen fuer eine Gruppe kann mit Risiken fuer andere Wirkungsempfaenger einhergehen. Das Skript verlangt deshalb, positive und negative Zustandsveraenderungen getrennt zu fuehren, bevor von positiver Netto-Wirkung gesprochen wird.</w:t>
-      </w:r>
-    </w:p>
-    <w:p>
-      <w:r>
-        <w:t>Pruefungsnahe Anwendung. In Impact-Controlling wird Modellformel erst steuerungsfaehig, wenn daraus eine Entscheidung folgt. Kennzahlen muessen Entscheidungen verbessern, nicht nur Berichte fuellen. Ohne diese Rueckkopplung bleibt Reporting eine Beschreibung. Mit Rueckkopplung wird aus Bewertung eine veraenderte Routine: ein anderer Prozess, ein geaenderter Anreiz, eine bessere Datenpflicht, eine korrigierte Kommunikation oder eine neue Priorisierung.</w:t>
-      </w:r>
-    </w:p>
-    <w:p>
-      <w:r>
-        <w:t>Die typische Fehlstelle bei Von KPI zu KII und der Kennzahlen-Stack liegt darin, Messbarkeit als Wahrheit zu behandeln. Bei Modellformel wird diese Fehlstelle konkret: Ein scheinbar plausibler Befund darf nicht zur Abkuerzung werden. Quellen, Systemgrenzen, Unsicherheit und Rueckkopplung bleiben sichtbar.</w:t>
-      </w:r>
-    </w:p>
-    <w:p>
-      <w:r>
-        <w:t>Transfer in den WOE-Korpus. Die Grenze gegen Scheingenauigkeit verlaeuft bei Fallfenster nicht zwischen Optimismus und Pessimismus. Sie verlaeuft zwischen offengelegter Unsicherheit und rhetorischer Sicherheit. Wer Von KPI zu KII und der Kennzahlen-Stack belastbar anwenden will, benennt Systemgrenze, Zeitraum, Vergleichspunkt und offene Gegenhypothese. Gerade dadurch bleibt das Skript anschlussfaehig fuer Forschung, Praxis und spaetere Revision.</w:t>
-      </w:r>
-    </w:p>
-    <w:p>
-      <w:r>
-        <w:t>Fuer die Pruefung ist Fallfenster dann verstanden, wenn daraus eine belastbare Fallantwort entsteht. Eine gute Antwort unterscheidet Beobachtung, Kausalannahme, Bewertung und Steuerungsfolge. Sie bewertet keine Menschen, sondern Wirkpfade, Zustandsveraenderungen, Risiken und institutionelle Bedingungen.</w:t>
-      </w:r>
-    </w:p>
-    <w:p>
-      <w:r>
-        <w:t>Grenzen der Aussage. Prüfungsnahe Fallfragen ohne geschützte Antwortlogik zeigt, warum Von KPI zu KII und der Kennzahlen-Stack mehr ist als ein Schlagwort im Feld Datenqualitaet, Bewertungsprofile, Scorecards und rueckgekoppelte Steuerung. Die wirkungsoekonomische Frage lautet: Welche reale Veraenderung wird moeglich, welche bleibt nur Potenzial und wo entsteht ein Wirkungsrisiko? Diese Unterscheidung schuetzt vor Impact-Washing, weil sie Absicht, Aktivitaet, Reichweite und Wirkung auseinanderhaelt.</w:t>
-      </w:r>
-    </w:p>
-    <w:p>
-      <w:r>
-        <w:t>Eine Kommune, ein Unternehmen oder eine Bildungsorganisation will Von KPI zu KII und der Kennzahlen-Stack praktisch anwenden. Der erste Schritt ist nicht die Auswahl eines Instruments, sondern die Klaerung der Zustandsveraenderung. Bei Prüfungsnahe Fallfragen ohne geschützte Antwortlogik muss deshalb benannt werden, wer betroffen ist, welcher Zustand sich veraendert, welche Frist gilt und welche Gegenbeobachtung die Annahme widerlegen wuerde. Erst danach entsteht eine begruendete Entscheidung im Feld Indikator, Scorecard, Benchmark, Auditpfad, Portfolioentscheidung oder CAPEX/OPEX-Priorisierung.</w:t>
-      </w:r>
-    </w:p>
-    <w:p>
-      <w:r>
-        <w:t>Kontrollfrage. Welche Entscheidung waere falsch, wenn Prüfungsnahe Fallfragen ohne geschützte Antwortlogik in WC-V1 missverstanden wird? Die Antwort muss mindestens eine Daten- oder Quellenannahme, eine betroffene Gruppe oder Schutzdimension, eine moegliche Nebenwirkung und einen Rueckkopplungsschritt nennen. Richtig ist nicht die lauteste Bewertung, sondern diejenige, die Begriff, Beleg und Steuerungsfolge zusammenhaelt.</w:t>
+        <w:t>Fallpruefung. Wenn ein Controlling-Team einen Indikator, eine Scorecard oder einen Auditpfad auf Entscheidungsrelevanz pruefen will, beginnt die Analyse bei Empfaengern, Wirkraum, Zeitraum und Datenquelle. Bei Didaktische Einordnung im Studiengang muss dann geklaert werden, ob Datenqualitaet, Systemgrenze, Unsicherheit und Nichtkompensation fuer eine Steuerungsentscheidung ausreichen. Eine tragfaehige Antwort benennt mindestens eine Quelle, eine offene Unsicherheit, eine moegliche Gegenbeobachtung und die Entscheidung, die nach der Bewertung geaendert wird.</w:t>
+      </w:r>
+    </w:p>
+    <w:p>
+      <w:r>
+        <w:t>Der Rueckfluss in den WOE-Korpus liegt hier in klaren Begriffen, sauber verlinkten Quellen und benannten Forschungsfragen. Wo Glossar, Werkzeuge, Journal oder Reader noch doppeldeutig bleiben, sollte Von KPI zu KII und der Kennzahlen-Stack nicht als fertige Gewissheit auftreten, sondern als pruefbarer Lernstand mit Korrekturpfad.</w:t>
       </w:r>
     </w:p>
     <w:p>
@@ -4402,17 +4432,87 @@
         <w:pStyle w:val="Heading3"/>
       </w:pPr>
       <w:r>
-        <w:t>Schlussvertiefung 3: Von KPI zu KII und der Kennzahlen-Stack im Anwendungsfall</w:t>
-      </w:r>
-    </w:p>
-    <w:p>
-      <w:r>
-        <w:t>Die folgenden Abschnitte sind keine neue Pruefungsloesung. Sie verdichten die vorhandenen Kapitel zu einer Lesart, mit der Studierende einen Fall selbststaendig analysieren koennen. Im Mittelpunkt stehen Datenqualitaet, Bewertungsprofile, Scorecards und rueckgekoppelte Steuerung, nicht moralische Personenbewertung.</w:t>
-      </w:r>
-    </w:p>
-    <w:p>
-      <w:r>
-        <w:t>Begriffliche Schlussklaerung. In WC-V1 muss Auswertung aus der lebenden Website-Referenz immer mit Empfaengern gelesen werden. Wirkung entsteht nicht beim Sender, sondern an veraenderten Zustaenden von Menschen, Oekosystemen, Institutionen, Oeffentlichkeit oder kuenftigen Handlungsspielraeumen. Darum reicht es nicht, interne Aktivitaeten zu dokumentieren. Entscheidend ist, ob sich ein Zustand nachvollziehbar veraendert und ob diese Veraenderung im Referenzrahmen Mensch, Planet, Demokratie, SDGs, Agenda 2030 und SDG+ tragfaehig bewertet werden kann.</w:t>
+        <w:t>Vertiefungsrunde 3: Anschluss an Praxis und Forschung</w:t>
+      </w:r>
+    </w:p>
+    <w:p>
+      <w:r>
+        <w:t>Diese Runde wechselt den Blickwinkel, damit der Schlussblock nicht nur wiederholt, sondern Leseentscheidungen vorbereitet: Was ist belegt, was bleibt Potenzial, welche Nebenwirkung ist relevant und welche Steuerungsfolge wird daraus abgeleitet?</w:t>
+      </w:r>
+    </w:p>
+    <w:p>
+      <w:r>
+        <w:t>Steuerungsfolge. Wissenschaftliche Anschlussfaehigkeit entsteht hier durch Quellenklarheit. Bei Analysemodell werden interne WOE-Begriffe nicht als Ersatz fuer Belege benutzt, sondern mit WOE-IDs, Benchmarks, Auditlogik, Datenqualitaetsstufen und externe Reportingrahmen verbunden. Wo die Datenlage offen bleibt, wird das offengelegt. Wo eine Aussage nur plausibel ist, bleibt sie als Wirkungspotenzial markiert. Wo ein Schaden eine rote Linie beruehrt, greift Nichtkompensation vor Durchschnittslogik.</w:t>
+      </w:r>
+    </w:p>
+    <w:p>
+      <w:r>
+        <w:t>In einer kontroversen Entscheidung wirkt Analysemodell als Pruefpunkt fuer Ambivalenz. Ein Nutzen fuer eine Gruppe kann mit Risiken fuer andere Wirkungsempfaenger einhergehen. Das Skript verlangt deshalb, positive und negative Zustandsveraenderungen getrennt zu fuehren, bevor von positiver Netto-Wirkung gesprochen wird.</w:t>
+      </w:r>
+    </w:p>
+    <w:p>
+      <w:r>
+        <w:t>Fallpruefung. Wenn ein Controlling-Team einen Indikator, eine Scorecard oder einen Auditpfad auf Entscheidungsrelevanz pruefen will, beginnt die Analyse bei Empfaengern, Wirkraum, Zeitraum und Datenquelle. Bei Analysemodell muss dann geklaert werden, ob Datenqualitaet, Systemgrenze, Unsicherheit und Nichtkompensation fuer eine Steuerungsentscheidung ausreichen. Eine tragfaehige Antwort benennt mindestens eine Quelle, eine offene Unsicherheit, eine moegliche Gegenbeobachtung und die Entscheidung, die nach der Bewertung geaendert wird.</w:t>
+      </w:r>
+    </w:p>
+    <w:p>
+      <w:r>
+        <w:t>Transferhinweis. In Impact-Controlling wird Modellformel erst steuerungsfaehig, wenn daraus eine Entscheidung folgt. Kennzahlen muessen Entscheidungen verbessern, nicht nur Berichte fuellen. Ohne diese Rueckkopplung bleibt Reporting eine Beschreibung. Mit Rueckkopplung wird aus Bewertung eine veraenderte Routine: ein anderer Prozess, ein geaenderter Anreiz, eine bessere Datenpflicht, eine korrigierte Kommunikation oder eine neue Priorisierung.</w:t>
+      </w:r>
+    </w:p>
+    <w:p>
+      <w:r>
+        <w:t>Die typische Fehlstelle bei Von KPI zu KII und der Kennzahlen-Stack liegt darin, Messbarkeit als Wahrheit zu behandeln. Bei Modellformel wird diese Fehlstelle konkret: Ein scheinbar plausibler Befund darf nicht zur Abkuerzung werden. Quellen, Systemgrenzen, Unsicherheit und Rueckkopplung bleiben sichtbar.</w:t>
+      </w:r>
+    </w:p>
+    <w:p>
+      <w:r>
+        <w:t>Fallpruefung. Wenn ein Controlling-Team einen Indikator, eine Scorecard oder einen Auditpfad auf Entscheidungsrelevanz pruefen will, beginnt die Analyse bei Empfaengern, Wirkraum, Zeitraum und Datenquelle. Bei Modellformel muss dann geklaert werden, ob Datenqualitaet, Systemgrenze, Unsicherheit und Nichtkompensation fuer eine Steuerungsentscheidung ausreichen. Eine tragfaehige Antwort benennt mindestens eine Quelle, eine offene Unsicherheit, eine moegliche Gegenbeobachtung und die Entscheidung, die nach der Bewertung geaendert wird.</w:t>
+      </w:r>
+    </w:p>
+    <w:p>
+      <w:r>
+        <w:t>Fuer die Bewertung reicht kein Summenscore, der zentrale Schaeden mit bequemen Pluspunkten verrechnet. Nichtkompensation und Reverse Merit Order markieren, wo rote Linien, demokratische Grundbedingungen oder planetare Grenzen Vorrang vor Durchschnittslogik haben. So bleibt positive Netto-Wirkung eine anspruchsvolle Zielgroesse und wird nicht zur dekorativen Formel.</w:t>
+      </w:r>
+    </w:p>
+    <w:p>
+      <w:r>
+        <w:t>Rueckflussnotiz. Die Grenze gegen Scheingenauigkeit verlaeuft bei Fallfenster nicht zwischen Optimismus und Pessimismus. Sie verlaeuft zwischen offengelegter Unsicherheit und rhetorischer Sicherheit. Wer Von KPI zu KII und der Kennzahlen-Stack belastbar anwenden will, benennt Systemgrenze, Zeitraum, Vergleichspunkt und offene Gegenhypothese. Gerade dadurch bleibt das Skript anschlussfaehig fuer Forschung, Praxis und spaetere Revision.</w:t>
+      </w:r>
+    </w:p>
+    <w:p>
+      <w:r>
+        <w:t>Fuer die Pruefung ist Fallfenster dann verstanden, wenn daraus eine belastbare Fallantwort entsteht. Eine gute Antwort unterscheidet Beobachtung, Kausalannahme, Bewertung und Steuerungsfolge. Sie bewertet keine Menschen, sondern Wirkpfade, Zustandsveraenderungen, Risiken und institutionelle Bedingungen.</w:t>
+      </w:r>
+    </w:p>
+    <w:p>
+      <w:r>
+        <w:t>Fallpruefung. Wenn ein Controlling-Team einen Indikator, eine Scorecard oder einen Auditpfad auf Entscheidungsrelevanz pruefen will, beginnt die Analyse bei Empfaengern, Wirkraum, Zeitraum und Datenquelle. Bei Fallfenster muss dann geklaert werden, ob Datenqualitaet, Systemgrenze, Unsicherheit und Nichtkompensation fuer eine Steuerungsentscheidung ausreichen. Eine tragfaehige Antwort benennt mindestens eine Quelle, eine offene Unsicherheit, eine moegliche Gegenbeobachtung und die Entscheidung, die nach der Bewertung geaendert wird.</w:t>
+      </w:r>
+    </w:p>
+    <w:p>
+      <w:r>
+        <w:t>Der Rueckfluss in den WOE-Korpus liegt hier in klaren Begriffen, sauber verlinkten Quellen und benannten Forschungsfragen. Wo Glossar, Werkzeuge, Journal oder Reader noch doppeldeutig bleiben, sollte Von KPI zu KII und der Kennzahlen-Stack nicht als fertige Gewissheit auftreten, sondern als pruefbarer Lernstand mit Korrekturpfad.</w:t>
+      </w:r>
+    </w:p>
+    <w:p>
+      <w:r>
+        <w:t>Pruefungsimpuls. Prüfungsnahe Fallfragen ohne geschützte Antwortlogik zeigt, warum Von KPI zu KII und der Kennzahlen-Stack mehr ist als ein Schlagwort im Feld Datenqualitaet, Bewertungsprofile, Scorecards und rueckgekoppelte Steuerung. Die wirkungsoekonomische Frage lautet: Welche reale Veraenderung wird moeglich, welche bleibt nur Potenzial und wo entsteht ein Wirkungsrisiko? Diese Unterscheidung schuetzt vor Impact-Washing, weil sie Absicht, Aktivitaet, Reichweite und Wirkung auseinanderhaelt.</w:t>
+      </w:r>
+    </w:p>
+    <w:p>
+      <w:r>
+        <w:t>Eine Kommune, ein Unternehmen oder eine Bildungsorganisation will Von KPI zu KII und der Kennzahlen-Stack praktisch anwenden. Der erste Schritt ist nicht die Auswahl eines Instruments, sondern die Klaerung der Zustandsveraenderung. Bei Prüfungsnahe Fallfragen ohne geschützte Antwortlogik muss deshalb benannt werden, wer betroffen ist, welcher Zustand sich veraendert, welche Frist gilt und welche Gegenbeobachtung die Annahme widerlegen wuerde. Erst danach entsteht eine begruendete Entscheidung im Feld Indikator, Scorecard, Benchmark, Auditpfad, Portfolioentscheidung oder CAPEX/OPEX-Priorisierung.</w:t>
+      </w:r>
+    </w:p>
+    <w:p>
+      <w:r>
+        <w:t>Fallpruefung. Wenn ein Controlling-Team einen Indikator, eine Scorecard oder einen Auditpfad auf Entscheidungsrelevanz pruefen will, beginnt die Analyse bei Empfaengern, Wirkraum, Zeitraum und Datenquelle. Bei Prüfungsnahe Fallfragen ohne geschützte Antwortlogik muss dann geklaert werden, ob Datenqualitaet, Systemgrenze, Unsicherheit und Nichtkompensation fuer eine Steuerungsentscheidung ausreichen. Eine tragfaehige Antwort benennt mindestens eine Quelle, eine offene Unsicherheit, eine moegliche Gegenbeobachtung und die Entscheidung, die nach der Bewertung geaendert wird.</w:t>
+      </w:r>
+    </w:p>
+    <w:p>
+      <w:r>
+        <w:t>Begriffliche Sicherung. In WC-V1 muss Auswertung aus der lebenden Website-Referenz immer mit Empfaengern gelesen werden. Wirkung entsteht nicht beim Sender, sondern an veraenderten Zustaenden von Menschen, Oekosystemen, Institutionen, Oeffentlichkeit oder kuenftigen Handlungsspielraeumen. Darum reicht es nicht, interne Aktivitaeten zu dokumentieren. Entscheidend ist, ob sich ein Zustand nachvollziehbar veraendert und ob diese Veraenderung im Referenzrahmen Mensch, Planet, Demokratie, SDGs, Agenda 2030 und SDG+ tragfaehig bewertet werden kann.</w:t>
       </w:r>
     </w:p>
     <w:p>
@@ -4422,7 +4522,17 @@
     </w:p>
     <w:p>
       <w:r>
-        <w:t>Wirkpfad und Empfaenger. Wissenschaftliche Anschlussfaehigkeit entsteht hier durch Quellenklarheit. Bei KPI versus KII werden interne WOE-Begriffe nicht als Ersatz fuer Belege benutzt, sondern mit WOE-IDs, Benchmarks, Auditlogik, Datenqualitaetsstufen und externe Reportingrahmen verbunden. Wo die Datenlage offen bleibt, wird das offengelegt. Wo eine Aussage nur plausibel ist, bleibt sie als Wirkungspotenzial markiert. Wo ein Schaden eine rote Linie beruehrt, greift Nichtkompensation vor Durchschnittslogik.</w:t>
+        <w:t>Fallpruefung. Wenn ein Controlling-Team einen Indikator, eine Scorecard oder einen Auditpfad auf Entscheidungsrelevanz pruefen will, beginnt die Analyse bei Empfaengern, Wirkraum, Zeitraum und Datenquelle. Bei Auswertung aus der lebenden Website-Referenz muss dann geklaert werden, ob Datenqualitaet, Systemgrenze, Unsicherheit und Nichtkompensation fuer eine Steuerungsentscheidung ausreichen. Eine tragfaehige Antwort benennt mindestens eine Quelle, eine offene Unsicherheit, eine moegliche Gegenbeobachtung und die Entscheidung, die nach der Bewertung geaendert wird.</w:t>
+      </w:r>
+    </w:p>
+    <w:p>
+      <w:r>
+        <w:t>Fuer die Bewertung reicht kein Summenscore, der zentrale Schaeden mit bequemen Pluspunkten verrechnet. Nichtkompensation und Reverse Merit Order markieren, wo rote Linien, demokratische Grundbedingungen oder planetare Grenzen Vorrang vor Durchschnittslogik haben. So bleibt positive Netto-Wirkung eine anspruchsvolle Zielgroesse und wird nicht zur dekorativen Formel.</w:t>
+      </w:r>
+    </w:p>
+    <w:p>
+      <w:r>
+        <w:t>Wirkpfadpruefung. Wissenschaftliche Anschlussfaehigkeit entsteht hier durch Quellenklarheit. Bei KPI versus KII werden interne WOE-Begriffe nicht als Ersatz fuer Belege benutzt, sondern mit WOE-IDs, Benchmarks, Auditlogik, Datenqualitaetsstufen und externe Reportingrahmen verbunden. Wo die Datenlage offen bleibt, wird das offengelegt. Wo eine Aussage nur plausibel ist, bleibt sie als Wirkungspotenzial markiert. Wo ein Schaden eine rote Linie beruehrt, greift Nichtkompensation vor Durchschnittslogik.</w:t>
       </w:r>
     </w:p>
     <w:p>
@@ -4432,82 +4542,12 @@
     </w:p>
     <w:p>
       <w:r>
-        <w:t>Rueckfluss. Fuer den WOE-Korpus bedeutet das: Begriffe aus Von KPI zu KII und der Kennzahlen-Stack sollten dort geschaerft werden, wo sie in Glossar, Werkzeugen, Journal oder Readern doppeldeutig bleiben. Offene Forschungsfragen werden nicht versteckt. Sie markieren die Stelle, an der spaetere Evidenz, ein besserer Datensatz oder eine praezisere Fallstudie die Bewertung veraendern kann.</w:t>
-      </w:r>
-    </w:p>
-    <w:p>
-      <w:r>
-        <w:t>Daten, Quellen und Evidenz. In Impact-Controlling wird Scorecards im Management erst steuerungsfaehig, wenn daraus eine Entscheidung folgt. Kennzahlen muessen Entscheidungen verbessern, nicht nur Berichte fuellen. Ohne diese Rueckkopplung bleibt Reporting eine Beschreibung. Mit Rueckkopplung wird aus Bewertung eine veraenderte Routine: ein anderer Prozess, ein geaenderter Anreiz, eine bessere Datenpflicht, eine korrigierte Kommunikation oder eine neue Priorisierung.</w:t>
-      </w:r>
-    </w:p>
-    <w:p>
-      <w:r>
-        <w:t>Die typische Fehlstelle bei Von KPI zu KII und der Kennzahlen-Stack liegt darin, Messbarkeit als Wahrheit zu behandeln. Bei Scorecards im Management wird diese Fehlstelle konkret: Ein scheinbar plausibler Befund darf nicht zur Abkuerzung werden. Quellen, Systemgrenzen, Unsicherheit und Rueckkopplung bleiben sichtbar.</w:t>
-      </w:r>
-    </w:p>
-    <w:p>
-      <w:r>
-        <w:t>Bewertung und rote Linien. Die Grenze gegen Scheingenauigkeit verlaeuft bei NWI, IOI und T-SROI im Impact-Controlling nicht zwischen Optimismus und Pessimismus. Sie verlaeuft zwischen offengelegter Unsicherheit und rhetorischer Sicherheit. Wer Von KPI zu KII und der Kennzahlen-Stack belastbar anwenden will, benennt Systemgrenze, Zeitraum, Vergleichspunkt und offene Gegenhypothese. Gerade dadurch bleibt das Skript anschlussfaehig fuer Forschung, Praxis und spaetere Revision.</w:t>
-      </w:r>
-    </w:p>
-    <w:p>
-      <w:r>
-        <w:t>Fuer die Pruefung ist NWI, IOI und T-SROI im Impact-Controlling dann verstanden, wenn daraus eine belastbare Fallantwort entsteht. Eine gute Antwort unterscheidet Beobachtung, Kausalannahme, Bewertung und Steuerungsfolge. Sie bewertet keine Menschen, sondern Wirkpfade, Zustandsveraenderungen, Risiken und institutionelle Bedingungen.</w:t>
-      </w:r>
-    </w:p>
-    <w:p>
-      <w:r>
-        <w:t>Kontrollfrage. Welche Entscheidung waere falsch, wenn NWI, IOI und T-SROI im Impact-Controlling in WC-V1 missverstanden wird? Die Antwort muss mindestens eine Daten- oder Quellenannahme, eine betroffene Gruppe oder Schutzdimension, eine moegliche Nebenwirkung und einen Rueckkopplungsschritt nennen. Richtig ist nicht die lauteste Bewertung, sondern diejenige, die Begriff, Beleg und Steuerungsfolge zusammenhaelt.</w:t>
-      </w:r>
-    </w:p>
-    <w:p>
-      <w:r>
-        <w:t>Steuerung und Rueckkopplung. Rückkopplung in Entscheidungen zeigt, warum Von KPI zu KII und der Kennzahlen-Stack mehr ist als ein Schlagwort im Feld Datenqualitaet, Bewertungsprofile, Scorecards und rueckgekoppelte Steuerung. Die wirkungsoekonomische Frage lautet: Welche reale Veraenderung wird moeglich, welche bleibt nur Potenzial und wo entsteht ein Wirkungsrisiko? Diese Unterscheidung schuetzt vor Impact-Washing, weil sie Absicht, Aktivitaet, Reichweite und Wirkung auseinanderhaelt.</w:t>
-      </w:r>
-    </w:p>
-    <w:p>
-      <w:r>
-        <w:t>Eine Kommune, ein Unternehmen oder eine Bildungsorganisation will Von KPI zu KII und der Kennzahlen-Stack praktisch anwenden. Der erste Schritt ist nicht die Auswahl eines Instruments, sondern die Klaerung der Zustandsveraenderung. Bei Rückkopplung in Entscheidungen muss deshalb benannt werden, wer betroffen ist, welcher Zustand sich veraendert, welche Frist gilt und welche Gegenbeobachtung die Annahme widerlegen wuerde. Erst danach entsteht eine begruendete Entscheidung im Feld Indikator, Scorecard, Benchmark, Auditpfad, Portfolioentscheidung oder CAPEX/OPEX-Priorisierung.</w:t>
-      </w:r>
-    </w:p>
-    <w:p>
-      <w:r>
-        <w:t>Pruefungsnahe Anwendung. In WC-V1 muss Konsequenzen für die WÖk-Architektur immer mit Empfaengern gelesen werden. Wirkung entsteht nicht beim Sender, sondern an veraenderten Zustaenden von Menschen, Oekosystemen, Institutionen, Oeffentlichkeit oder kuenftigen Handlungsspielraeumen. Darum reicht es nicht, interne Aktivitaeten zu dokumentieren. Entscheidend ist, ob sich ein Zustand nachvollziehbar veraendert und ob diese Veraenderung im Referenzrahmen Mensch, Planet, Demokratie, SDGs, Agenda 2030 und SDG+ tragfaehig bewertet werden kann.</w:t>
-      </w:r>
-    </w:p>
-    <w:p>
-      <w:r>
-        <w:t>Ein Bericht behauptet, die Massnahme zu Von KPI zu KII und der Kennzahlen-Stack sei erfolgreich. Die WOE-Lesart fragt bei Konsequenzen für die WÖk-Architektur nach belastbaren Nachweisen: Datenquelle, Systemgrenze, Erhebungslogik, Unsicherheit, Aktualitaet und Auditspur. Wenn diese Nachweise fehlen, bleibt die Aussage Wirkungspotenzial oder Kommunikationsbehauptung. Sie kann wichtig sein, aber sie ist noch keine belegte Wirkung.</w:t>
-      </w:r>
-    </w:p>
-    <w:p>
-      <w:r>
-        <w:t>Transfer in den WOE-Korpus. Wissenschaftliche Anschlussfaehigkeit entsteht hier durch Quellenklarheit. Bei Einleitung / Wirkungsfrage werden interne WOE-Begriffe nicht als Ersatz fuer Belege benutzt, sondern mit WOE-IDs, Benchmarks, Auditlogik, Datenqualitaetsstufen und externe Reportingrahmen verbunden. Wo die Datenlage offen bleibt, wird das offengelegt. Wo eine Aussage nur plausibel ist, bleibt sie als Wirkungspotenzial markiert. Wo ein Schaden eine rote Linie beruehrt, greift Nichtkompensation vor Durchschnittslogik.</w:t>
-      </w:r>
-    </w:p>
-    <w:p>
-      <w:r>
-        <w:t>In einer kontroversen Entscheidung wirkt Einleitung / Wirkungsfrage als Pruefpunkt fuer Ambivalenz. Ein Nutzen fuer eine Gruppe kann mit Risiken fuer andere Wirkungsempfaenger einhergehen. Das Skript verlangt deshalb, positive und negative Zustandsveraenderungen getrennt zu fuehren, bevor von positiver Netto-Wirkung gesprochen wird.</w:t>
-      </w:r>
-    </w:p>
-    <w:p>
-      <w:r>
-        <w:t>Grenzen der Aussage. In Impact-Controlling wird Kernaussage erst steuerungsfaehig, wenn daraus eine Entscheidung folgt. Kennzahlen muessen Entscheidungen verbessern, nicht nur Berichte fuellen. Ohne diese Rueckkopplung bleibt Reporting eine Beschreibung. Mit Rueckkopplung wird aus Bewertung eine veraenderte Routine: ein anderer Prozess, ein geaenderter Anreiz, eine bessere Datenpflicht, eine korrigierte Kommunikation oder eine neue Priorisierung.</w:t>
-      </w:r>
-    </w:p>
-    <w:p>
-      <w:r>
-        <w:t>Die typische Fehlstelle bei Von KPI zu KII und der Kennzahlen-Stack liegt darin, Messbarkeit als Wahrheit zu behandeln. Bei Kernaussage wird diese Fehlstelle konkret: Ein scheinbar plausibler Befund darf nicht zur Abkuerzung werden. Quellen, Systemgrenzen, Unsicherheit und Rueckkopplung bleiben sichtbar.</w:t>
-      </w:r>
-    </w:p>
-    <w:p>
-      <w:r>
-        <w:t>Kontrollfrage. Welche Entscheidung waere falsch, wenn Kernaussage in WC-V1 missverstanden wird? Die Antwort muss mindestens eine Daten- oder Quellenannahme, eine betroffene Gruppe oder Schutzdimension, eine moegliche Nebenwirkung und einen Rueckkopplungsschritt nennen. Richtig ist nicht die lauteste Bewertung, sondern diejenige, die Begriff, Beleg und Steuerungsfolge zusammenhaelt.</w:t>
-      </w:r>
-    </w:p>
-    <w:p>
-      <w:r>
-        <w:t>Rueckfluss. Fuer den WOE-Korpus bedeutet das: Begriffe aus Von KPI zu KII und der Kennzahlen-Stack sollten dort geschaerft werden, wo sie in Glossar, Werkzeugen, Journal oder Readern doppeldeutig bleiben. Offene Forschungsfragen werden nicht versteckt. Sie markieren die Stelle, an der spaetere Evidenz, ein besserer Datensatz oder eine praezisere Fallstudie die Bewertung veraendern kann.</w:t>
+        <w:t>Fallpruefung. Wenn ein Controlling-Team einen Indikator, eine Scorecard oder einen Auditpfad auf Entscheidungsrelevanz pruefen will, beginnt die Analyse bei Empfaengern, Wirkraum, Zeitraum und Datenquelle. Bei KPI versus KII muss dann geklaert werden, ob Datenqualitaet, Systemgrenze, Unsicherheit und Nichtkompensation fuer eine Steuerungsentscheidung ausreichen. Eine tragfaehige Antwort benennt mindestens eine Quelle, eine offene Unsicherheit, eine moegliche Gegenbeobachtung und die Entscheidung, die nach der Bewertung geaendert wird.</w:t>
+      </w:r>
+    </w:p>
+    <w:p>
+      <w:r>
+        <w:t>Der Rueckfluss in den WOE-Korpus liegt hier in klaren Begriffen, sauber verlinkten Quellen und benannten Forschungsfragen. Wo Glossar, Werkzeuge, Journal oder Reader noch doppeldeutig bleiben, sollte Von KPI zu KII und der Kennzahlen-Stack nicht als fertige Gewissheit auftreten, sondern als pruefbarer Lernstand mit Korrekturpfad.</w:t>
       </w:r>
     </w:p>
     <w:p>
@@ -4515,107 +4555,122 @@
         <w:pStyle w:val="Heading3"/>
       </w:pPr>
       <w:r>
-        <w:t>Schlussvertiefung 4: Von KPI zu KII und der Kennzahlen-Stack im Anwendungsfall</w:t>
-      </w:r>
-    </w:p>
-    <w:p>
-      <w:r>
-        <w:t>Die folgenden Abschnitte sind keine neue Pruefungsloesung. Sie verdichten die vorhandenen Kapitel zu einer Lesart, mit der Studierende einen Fall selbststaendig analysieren koennen. Im Mittelpunkt stehen Datenqualitaet, Bewertungsprofile, Scorecards und rueckgekoppelte Steuerung, nicht moralische Personenbewertung.</w:t>
-      </w:r>
-    </w:p>
-    <w:p>
-      <w:r>
-        <w:t>Begriffliche Schlussklaerung. Die Grenze gegen Scheingenauigkeit verlaeuft bei Quelltext und fachliche Grundlegung nicht zwischen Optimismus und Pessimismus. Sie verlaeuft zwischen offengelegter Unsicherheit und rhetorischer Sicherheit. Wer Von KPI zu KII und der Kennzahlen-Stack belastbar anwenden will, benennt Systemgrenze, Zeitraum, Vergleichspunkt und offene Gegenhypothese. Gerade dadurch bleibt das Skript anschlussfaehig fuer Forschung, Praxis und spaetere Revision.</w:t>
-      </w:r>
-    </w:p>
-    <w:p>
-      <w:r>
-        <w:t>Fuer die Pruefung ist Quelltext und fachliche Grundlegung dann verstanden, wenn daraus eine belastbare Fallantwort entsteht. Eine gute Antwort unterscheidet Beobachtung, Kausalannahme, Bewertung und Steuerungsfolge. Sie bewertet keine Menschen, sondern Wirkpfade, Zustandsveraenderungen, Risiken und institutionelle Bedingungen.</w:t>
-      </w:r>
-    </w:p>
-    <w:p>
-      <w:r>
-        <w:t>Wirkpfad und Empfaenger. Einstieg / Wirkungsfrage zeigt, warum Von KPI zu KII und der Kennzahlen-Stack mehr ist als ein Schlagwort im Feld Datenqualitaet, Bewertungsprofile, Scorecards und rueckgekoppelte Steuerung. Die wirkungsoekonomische Frage lautet: Welche reale Veraenderung wird moeglich, welche bleibt nur Potenzial und wo entsteht ein Wirkungsrisiko? Diese Unterscheidung schuetzt vor Impact-Washing, weil sie Absicht, Aktivitaet, Reichweite und Wirkung auseinanderhaelt.</w:t>
-      </w:r>
-    </w:p>
-    <w:p>
-      <w:r>
-        <w:t>Eine Kommune, ein Unternehmen oder eine Bildungsorganisation will Von KPI zu KII und der Kennzahlen-Stack praktisch anwenden. Der erste Schritt ist nicht die Auswahl eines Instruments, sondern die Klaerung der Zustandsveraenderung. Bei Einstieg / Wirkungsfrage muss deshalb benannt werden, wer betroffen ist, welcher Zustand sich veraendert, welche Frist gilt und welche Gegenbeobachtung die Annahme widerlegen wuerde. Erst danach entsteht eine begruendete Entscheidung im Feld Indikator, Scorecard, Benchmark, Auditpfad, Portfolioentscheidung oder CAPEX/OPEX-Priorisierung.</w:t>
-      </w:r>
-    </w:p>
-    <w:p>
-      <w:r>
-        <w:t>Daten, Quellen und Evidenz. In WC-V1 muss Skript / Folien (Lernseite) immer mit Empfaengern gelesen werden. Wirkung entsteht nicht beim Sender, sondern an veraenderten Zustaenden von Menschen, Oekosystemen, Institutionen, Oeffentlichkeit oder kuenftigen Handlungsspielraeumen. Darum reicht es nicht, interne Aktivitaeten zu dokumentieren. Entscheidend ist, ob sich ein Zustand nachvollziehbar veraendert und ob diese Veraenderung im Referenzrahmen Mensch, Planet, Demokratie, SDGs, Agenda 2030 und SDG+ tragfaehig bewertet werden kann.</w:t>
-      </w:r>
-    </w:p>
-    <w:p>
-      <w:r>
-        <w:t>Ein Bericht behauptet, die Massnahme zu Von KPI zu KII und der Kennzahlen-Stack sei erfolgreich. Die WOE-Lesart fragt bei Skript / Folien (Lernseite) nach belastbaren Nachweisen: Datenquelle, Systemgrenze, Erhebungslogik, Unsicherheit, Aktualitaet und Auditspur. Wenn diese Nachweise fehlen, bleibt die Aussage Wirkungspotenzial oder Kommunikationsbehauptung. Sie kann wichtig sein, aber sie ist noch keine belegte Wirkung.</w:t>
-      </w:r>
-    </w:p>
-    <w:p>
-      <w:r>
-        <w:t>Bewertung und rote Linien. Wissenschaftliche Anschlussfaehigkeit entsteht hier durch Quellenklarheit. Bei Transferaufgabe werden interne WOE-Begriffe nicht als Ersatz fuer Belege benutzt, sondern mit WOE-IDs, Benchmarks, Auditlogik, Datenqualitaetsstufen und externe Reportingrahmen verbunden. Wo die Datenlage offen bleibt, wird das offengelegt. Wo eine Aussage nur plausibel ist, bleibt sie als Wirkungspotenzial markiert. Wo ein Schaden eine rote Linie beruehrt, greift Nichtkompensation vor Durchschnittslogik.</w:t>
-      </w:r>
-    </w:p>
-    <w:p>
-      <w:r>
-        <w:t>In einer kontroversen Entscheidung wirkt Transferaufgabe als Pruefpunkt fuer Ambivalenz. Ein Nutzen fuer eine Gruppe kann mit Risiken fuer andere Wirkungsempfaenger einhergehen. Das Skript verlangt deshalb, positive und negative Zustandsveraenderungen getrennt zu fuehren, bevor von positiver Netto-Wirkung gesprochen wird.</w:t>
-      </w:r>
-    </w:p>
-    <w:p>
-      <w:r>
-        <w:t>Kontrollfrage. Welche Entscheidung waere falsch, wenn Transferaufgabe in WC-V1 missverstanden wird? Die Antwort muss mindestens eine Daten- oder Quellenannahme, eine betroffene Gruppe oder Schutzdimension, eine moegliche Nebenwirkung und einen Rueckkopplungsschritt nennen. Richtig ist nicht die lauteste Bewertung, sondern diejenige, die Begriff, Beleg und Steuerungsfolge zusammenhaelt.</w:t>
-      </w:r>
-    </w:p>
-    <w:p>
-      <w:r>
-        <w:t>Steuerung und Rueckkopplung. In Impact-Controlling wird Praxisbeispiel erst steuerungsfaehig, wenn daraus eine Entscheidung folgt. Kennzahlen muessen Entscheidungen verbessern, nicht nur Berichte fuellen. Ohne diese Rueckkopplung bleibt Reporting eine Beschreibung. Mit Rueckkopplung wird aus Bewertung eine veraenderte Routine: ein anderer Prozess, ein geaenderter Anreiz, eine bessere Datenpflicht, eine korrigierte Kommunikation oder eine neue Priorisierung.</w:t>
-      </w:r>
-    </w:p>
-    <w:p>
-      <w:r>
-        <w:t>Die typische Fehlstelle bei Von KPI zu KII und der Kennzahlen-Stack liegt darin, Messbarkeit als Wahrheit zu behandeln. Bei Praxisbeispiel wird diese Fehlstelle konkret: Ein scheinbar plausibler Befund darf nicht zur Abkuerzung werden. Quellen, Systemgrenzen, Unsicherheit und Rueckkopplung bleiben sichtbar.</w:t>
-      </w:r>
-    </w:p>
-    <w:p>
-      <w:r>
-        <w:t>Pruefungsnahe Anwendung. Die Grenze gegen Scheingenauigkeit verlaeuft bei Wirkungsökonomische Vertiefung nicht zwischen Optimismus und Pessimismus. Sie verlaeuft zwischen offengelegter Unsicherheit und rhetorischer Sicherheit. Wer Von KPI zu KII und der Kennzahlen-Stack belastbar anwenden will, benennt Systemgrenze, Zeitraum, Vergleichspunkt und offene Gegenhypothese. Gerade dadurch bleibt das Skript anschlussfaehig fuer Forschung, Praxis und spaetere Revision.</w:t>
-      </w:r>
-    </w:p>
-    <w:p>
-      <w:r>
-        <w:t>Fuer die Pruefung ist Wirkungsökonomische Vertiefung dann verstanden, wenn daraus eine belastbare Fallantwort entsteht. Eine gute Antwort unterscheidet Beobachtung, Kausalannahme, Bewertung und Steuerungsfolge. Sie bewertet keine Menschen, sondern Wirkpfade, Zustandsveraenderungen, Risiken und institutionelle Bedingungen.</w:t>
-      </w:r>
-    </w:p>
-    <w:p>
-      <w:r>
-        <w:t>Rueckfluss. Fuer den WOE-Korpus bedeutet das: Begriffe aus Von KPI zu KII und der Kennzahlen-Stack sollten dort geschaerft werden, wo sie in Glossar, Werkzeugen, Journal oder Readern doppeldeutig bleiben. Offene Forschungsfragen werden nicht versteckt. Sie markieren die Stelle, an der spaetere Evidenz, ein besserer Datensatz oder eine praezisere Fallstudie die Bewertung veraendern kann.</w:t>
-      </w:r>
-    </w:p>
-    <w:p>
-      <w:r>
-        <w:t>Transfer in den WOE-Korpus. Begriffliche Präzision zeigt, warum Von KPI zu KII und der Kennzahlen-Stack mehr ist als ein Schlagwort im Feld Datenqualitaet, Bewertungsprofile, Scorecards und rueckgekoppelte Steuerung. Die wirkungsoekonomische Frage lautet: Welche reale Veraenderung wird moeglich, welche bleibt nur Potenzial und wo entsteht ein Wirkungsrisiko? Diese Unterscheidung schuetzt vor Impact-Washing, weil sie Absicht, Aktivitaet, Reichweite und Wirkung auseinanderhaelt.</w:t>
-      </w:r>
-    </w:p>
-    <w:p>
-      <w:r>
-        <w:t>Eine Kommune, ein Unternehmen oder eine Bildungsorganisation will Von KPI zu KII und der Kennzahlen-Stack praktisch anwenden. Der erste Schritt ist nicht die Auswahl eines Instruments, sondern die Klaerung der Zustandsveraenderung. Bei Begriffliche Präzision muss deshalb benannt werden, wer betroffen ist, welcher Zustand sich veraendert, welche Frist gilt und welche Gegenbeobachtung die Annahme widerlegen wuerde. Erst danach entsteht eine begruendete Entscheidung im Feld Indikator, Scorecard, Benchmark, Auditpfad, Portfolioentscheidung oder CAPEX/OPEX-Priorisierung.</w:t>
-      </w:r>
-    </w:p>
-    <w:p>
-      <w:r>
-        <w:t>Grenzen der Aussage. In WC-V1 muss Wirkpfad immer mit Empfaengern gelesen werden. Wirkung entsteht nicht beim Sender, sondern an veraenderten Zustaenden von Menschen, Oekosystemen, Institutionen, Oeffentlichkeit oder kuenftigen Handlungsspielraeumen. Darum reicht es nicht, interne Aktivitaeten zu dokumentieren. Entscheidend ist, ob sich ein Zustand nachvollziehbar veraendert und ob diese Veraenderung im Referenzrahmen Mensch, Planet, Demokratie, SDGs, Agenda 2030 und SDG+ tragfaehig bewertet werden kann.</w:t>
-      </w:r>
-    </w:p>
-    <w:p>
-      <w:r>
-        <w:t>Ein Bericht behauptet, die Massnahme zu Von KPI zu KII und der Kennzahlen-Stack sei erfolgreich. Die WOE-Lesart fragt bei Wirkpfad nach belastbaren Nachweisen: Datenquelle, Systemgrenze, Erhebungslogik, Unsicherheit, Aktualitaet und Auditspur. Wenn diese Nachweise fehlen, bleibt die Aussage Wirkungspotenzial oder Kommunikationsbehauptung. Sie kann wichtig sein, aber sie ist noch keine belegte Wirkung.</w:t>
-      </w:r>
-    </w:p>
-    <w:p>
-      <w:r>
-        <w:t>Kontrollfrage. Welche Entscheidung waere falsch, wenn Wirkpfad in WC-V1 missverstanden wird? Die Antwort muss mindestens eine Daten- oder Quellenannahme, eine betroffene Gruppe oder Schutzdimension, eine moegliche Nebenwirkung und einen Rueckkopplungsschritt nennen. Richtig ist nicht die lauteste Bewertung, sondern diejenige, die Begriff, Beleg und Steuerungsfolge zusammenhaelt.</w:t>
+        <w:t>Vertiefungsrunde 4: Anschluss an Praxis und Forschung</w:t>
+      </w:r>
+    </w:p>
+    <w:p>
+      <w:r>
+        <w:t>Diese Runde wechselt den Blickwinkel, damit der Schlussblock nicht nur wiederholt, sondern Leseentscheidungen vorbereitet: Was ist belegt, was bleibt Potenzial, welche Nebenwirkung ist relevant und welche Steuerungsfolge wird daraus abgeleitet?</w:t>
+      </w:r>
+    </w:p>
+    <w:p>
+      <w:r>
+        <w:t>Evidenzfenster. In Impact-Controlling wird Scorecards im Management erst steuerungsfaehig, wenn daraus eine Entscheidung folgt. Kennzahlen muessen Entscheidungen verbessern, nicht nur Berichte fuellen. Ohne diese Rueckkopplung bleibt Reporting eine Beschreibung. Mit Rueckkopplung wird aus Bewertung eine veraenderte Routine: ein anderer Prozess, ein geaenderter Anreiz, eine bessere Datenpflicht, eine korrigierte Kommunikation oder eine neue Priorisierung.</w:t>
+      </w:r>
+    </w:p>
+    <w:p>
+      <w:r>
+        <w:t>Die typische Fehlstelle bei Von KPI zu KII und der Kennzahlen-Stack liegt darin, Messbarkeit als Wahrheit zu behandeln. Bei Scorecards im Management wird diese Fehlstelle konkret: Ein scheinbar plausibler Befund darf nicht zur Abkuerzung werden. Quellen, Systemgrenzen, Unsicherheit und Rueckkopplung bleiben sichtbar.</w:t>
+      </w:r>
+    </w:p>
+    <w:p>
+      <w:r>
+        <w:t>Fallpruefung. Wenn ein Controlling-Team einen Indikator, eine Scorecard oder einen Auditpfad auf Entscheidungsrelevanz pruefen will, beginnt die Analyse bei Empfaengern, Wirkraum, Zeitraum und Datenquelle. Bei Scorecards im Management muss dann geklaert werden, ob Datenqualitaet, Systemgrenze, Unsicherheit und Nichtkompensation fuer eine Steuerungsentscheidung ausreichen. Eine tragfaehige Antwort benennt mindestens eine Quelle, eine offene Unsicherheit, eine moegliche Gegenbeobachtung und die Entscheidung, die nach der Bewertung geaendert wird.</w:t>
+      </w:r>
+    </w:p>
+    <w:p>
+      <w:r>
+        <w:t>Bewertungsgrenze. Die Grenze gegen Scheingenauigkeit verlaeuft bei NWI, IOI und T-SROI im Impact-Controlling nicht zwischen Optimismus und Pessimismus. Sie verlaeuft zwischen offengelegter Unsicherheit und rhetorischer Sicherheit. Wer Von KPI zu KII und der Kennzahlen-Stack belastbar anwenden will, benennt Systemgrenze, Zeitraum, Vergleichspunkt und offene Gegenhypothese. Gerade dadurch bleibt das Skript anschlussfaehig fuer Forschung, Praxis und spaetere Revision.</w:t>
+      </w:r>
+    </w:p>
+    <w:p>
+      <w:r>
+        <w:t>Fuer die Pruefung ist NWI, IOI und T-SROI im Impact-Controlling dann verstanden, wenn daraus eine belastbare Fallantwort entsteht. Eine gute Antwort unterscheidet Beobachtung, Kausalannahme, Bewertung und Steuerungsfolge. Sie bewertet keine Menschen, sondern Wirkpfade, Zustandsveraenderungen, Risiken und institutionelle Bedingungen.</w:t>
+      </w:r>
+    </w:p>
+    <w:p>
+      <w:r>
+        <w:t>Fallpruefung. Wenn ein Controlling-Team einen Indikator, eine Scorecard oder einen Auditpfad auf Entscheidungsrelevanz pruefen will, beginnt die Analyse bei Empfaengern, Wirkraum, Zeitraum und Datenquelle. Bei NWI, IOI und T-SROI im Impact-Controlling muss dann geklaert werden, ob Datenqualitaet, Systemgrenze, Unsicherheit und Nichtkompensation fuer eine Steuerungsentscheidung ausreichen. Eine tragfaehige Antwort benennt mindestens eine Quelle, eine offene Unsicherheit, eine moegliche Gegenbeobachtung und die Entscheidung, die nach der Bewertung geaendert wird.</w:t>
+      </w:r>
+    </w:p>
+    <w:p>
+      <w:r>
+        <w:t>Fuer die Bewertung reicht kein Summenscore, der zentrale Schaeden mit bequemen Pluspunkten verrechnet. Nichtkompensation und Reverse Merit Order markieren, wo rote Linien, demokratische Grundbedingungen oder planetare Grenzen Vorrang vor Durchschnittslogik haben. So bleibt positive Netto-Wirkung eine anspruchsvolle Zielgroesse und wird nicht zur dekorativen Formel.</w:t>
+      </w:r>
+    </w:p>
+    <w:p>
+      <w:r>
+        <w:t>Steuerungsfolge. Rückkopplung in Entscheidungen zeigt, warum Von KPI zu KII und der Kennzahlen-Stack mehr ist als ein Schlagwort im Feld Datenqualitaet, Bewertungsprofile, Scorecards und rueckgekoppelte Steuerung. Die wirkungsoekonomische Frage lautet: Welche reale Veraenderung wird moeglich, welche bleibt nur Potenzial und wo entsteht ein Wirkungsrisiko? Diese Unterscheidung schuetzt vor Impact-Washing, weil sie Absicht, Aktivitaet, Reichweite und Wirkung auseinanderhaelt.</w:t>
+      </w:r>
+    </w:p>
+    <w:p>
+      <w:r>
+        <w:t>Eine Kommune, ein Unternehmen oder eine Bildungsorganisation will Von KPI zu KII und der Kennzahlen-Stack praktisch anwenden. Der erste Schritt ist nicht die Auswahl eines Instruments, sondern die Klaerung der Zustandsveraenderung. Bei Rückkopplung in Entscheidungen muss deshalb benannt werden, wer betroffen ist, welcher Zustand sich veraendert, welche Frist gilt und welche Gegenbeobachtung die Annahme widerlegen wuerde. Erst danach entsteht eine begruendete Entscheidung im Feld Indikator, Scorecard, Benchmark, Auditpfad, Portfolioentscheidung oder CAPEX/OPEX-Priorisierung.</w:t>
+      </w:r>
+    </w:p>
+    <w:p>
+      <w:r>
+        <w:t>Fallpruefung. Wenn ein Controlling-Team einen Indikator, eine Scorecard oder einen Auditpfad auf Entscheidungsrelevanz pruefen will, beginnt die Analyse bei Empfaengern, Wirkraum, Zeitraum und Datenquelle. Bei Rückkopplung in Entscheidungen muss dann geklaert werden, ob Datenqualitaet, Systemgrenze, Unsicherheit und Nichtkompensation fuer eine Steuerungsentscheidung ausreichen. Eine tragfaehige Antwort benennt mindestens eine Quelle, eine offene Unsicherheit, eine moegliche Gegenbeobachtung und die Entscheidung, die nach der Bewertung geaendert wird.</w:t>
+      </w:r>
+    </w:p>
+    <w:p>
+      <w:r>
+        <w:t>Der Rueckfluss in den WOE-Korpus liegt hier in klaren Begriffen, sauber verlinkten Quellen und benannten Forschungsfragen. Wo Glossar, Werkzeuge, Journal oder Reader noch doppeldeutig bleiben, sollte Von KPI zu KII und der Kennzahlen-Stack nicht als fertige Gewissheit auftreten, sondern als pruefbarer Lernstand mit Korrekturpfad.</w:t>
+      </w:r>
+    </w:p>
+    <w:p>
+      <w:r>
+        <w:t>Transferhinweis. In WC-V1 muss Konsequenzen für die WÖk-Architektur immer mit Empfaengern gelesen werden. Wirkung entsteht nicht beim Sender, sondern an veraenderten Zustaenden von Menschen, Oekosystemen, Institutionen, Oeffentlichkeit oder kuenftigen Handlungsspielraeumen. Darum reicht es nicht, interne Aktivitaeten zu dokumentieren. Entscheidend ist, ob sich ein Zustand nachvollziehbar veraendert und ob diese Veraenderung im Referenzrahmen Mensch, Planet, Demokratie, SDGs, Agenda 2030 und SDG+ tragfaehig bewertet werden kann.</w:t>
+      </w:r>
+    </w:p>
+    <w:p>
+      <w:r>
+        <w:t>Ein Bericht behauptet, die Massnahme zu Von KPI zu KII und der Kennzahlen-Stack sei erfolgreich. Die WOE-Lesart fragt bei Konsequenzen für die WÖk-Architektur nach belastbaren Nachweisen: Datenquelle, Systemgrenze, Erhebungslogik, Unsicherheit, Aktualitaet und Auditspur. Wenn diese Nachweise fehlen, bleibt die Aussage Wirkungspotenzial oder Kommunikationsbehauptung. Sie kann wichtig sein, aber sie ist noch keine belegte Wirkung.</w:t>
+      </w:r>
+    </w:p>
+    <w:p>
+      <w:r>
+        <w:t>Fallpruefung. Wenn ein Controlling-Team einen Indikator, eine Scorecard oder einen Auditpfad auf Entscheidungsrelevanz pruefen will, beginnt die Analyse bei Empfaengern, Wirkraum, Zeitraum und Datenquelle. Bei Konsequenzen für die WÖk-Architektur muss dann geklaert werden, ob Datenqualitaet, Systemgrenze, Unsicherheit und Nichtkompensation fuer eine Steuerungsentscheidung ausreichen. Eine tragfaehige Antwort benennt mindestens eine Quelle, eine offene Unsicherheit, eine moegliche Gegenbeobachtung und die Entscheidung, die nach der Bewertung geaendert wird.</w:t>
+      </w:r>
+    </w:p>
+    <w:p>
+      <w:r>
+        <w:t>Rueckflussnotiz. Wissenschaftliche Anschlussfaehigkeit entsteht hier durch Quellenklarheit. Bei Einleitung / Wirkungsfrage werden interne WOE-Begriffe nicht als Ersatz fuer Belege benutzt, sondern mit WOE-IDs, Benchmarks, Auditlogik, Datenqualitaetsstufen und externe Reportingrahmen verbunden. Wo die Datenlage offen bleibt, wird das offengelegt. Wo eine Aussage nur plausibel ist, bleibt sie als Wirkungspotenzial markiert. Wo ein Schaden eine rote Linie beruehrt, greift Nichtkompensation vor Durchschnittslogik.</w:t>
+      </w:r>
+    </w:p>
+    <w:p>
+      <w:r>
+        <w:t>In einer kontroversen Entscheidung wirkt Einleitung / Wirkungsfrage als Pruefpunkt fuer Ambivalenz. Ein Nutzen fuer eine Gruppe kann mit Risiken fuer andere Wirkungsempfaenger einhergehen. Das Skript verlangt deshalb, positive und negative Zustandsveraenderungen getrennt zu fuehren, bevor von positiver Netto-Wirkung gesprochen wird.</w:t>
+      </w:r>
+    </w:p>
+    <w:p>
+      <w:r>
+        <w:t>Fallpruefung. Wenn ein Controlling-Team einen Indikator, eine Scorecard oder einen Auditpfad auf Entscheidungsrelevanz pruefen will, beginnt die Analyse bei Empfaengern, Wirkraum, Zeitraum und Datenquelle. Bei Einleitung / Wirkungsfrage muss dann geklaert werden, ob Datenqualitaet, Systemgrenze, Unsicherheit und Nichtkompensation fuer eine Steuerungsentscheidung ausreichen. Eine tragfaehige Antwort benennt mindestens eine Quelle, eine offene Unsicherheit, eine moegliche Gegenbeobachtung und die Entscheidung, die nach der Bewertung geaendert wird.</w:t>
+      </w:r>
+    </w:p>
+    <w:p>
+      <w:r>
+        <w:t>Fuer die Bewertung reicht kein Summenscore, der zentrale Schaeden mit bequemen Pluspunkten verrechnet. Nichtkompensation und Reverse Merit Order markieren, wo rote Linien, demokratische Grundbedingungen oder planetare Grenzen Vorrang vor Durchschnittslogik haben. So bleibt positive Netto-Wirkung eine anspruchsvolle Zielgroesse und wird nicht zur dekorativen Formel.</w:t>
+      </w:r>
+    </w:p>
+    <w:p>
+      <w:r>
+        <w:t>Pruefungsimpuls. In Impact-Controlling wird Kernaussage erst steuerungsfaehig, wenn daraus eine Entscheidung folgt. Kennzahlen muessen Entscheidungen verbessern, nicht nur Berichte fuellen. Ohne diese Rueckkopplung bleibt Reporting eine Beschreibung. Mit Rueckkopplung wird aus Bewertung eine veraenderte Routine: ein anderer Prozess, ein geaenderter Anreiz, eine bessere Datenpflicht, eine korrigierte Kommunikation oder eine neue Priorisierung.</w:t>
+      </w:r>
+    </w:p>
+    <w:p>
+      <w:r>
+        <w:t>Die typische Fehlstelle bei Von KPI zu KII und der Kennzahlen-Stack liegt darin, Messbarkeit als Wahrheit zu behandeln. Bei Kernaussage wird diese Fehlstelle konkret: Ein scheinbar plausibler Befund darf nicht zur Abkuerzung werden. Quellen, Systemgrenzen, Unsicherheit und Rueckkopplung bleiben sichtbar.</w:t>
+      </w:r>
+    </w:p>
+    <w:p>
+      <w:r>
+        <w:t>Fallpruefung. Wenn ein Controlling-Team einen Indikator, eine Scorecard oder einen Auditpfad auf Entscheidungsrelevanz pruefen will, beginnt die Analyse bei Empfaengern, Wirkraum, Zeitraum und Datenquelle. Bei Kernaussage muss dann geklaert werden, ob Datenqualitaet, Systemgrenze, Unsicherheit und Nichtkompensation fuer eine Steuerungsentscheidung ausreichen. Eine tragfaehige Antwort benennt mindestens eine Quelle, eine offene Unsicherheit, eine moegliche Gegenbeobachtung und die Entscheidung, die nach der Bewertung geaendert wird.</w:t>
+      </w:r>
+    </w:p>
+    <w:p>
+      <w:r>
+        <w:t>Der Rueckfluss in den WOE-Korpus liegt hier in klaren Begriffen, sauber verlinkten Quellen und benannten Forschungsfragen. Wo Glossar, Werkzeuge, Journal oder Reader noch doppeldeutig bleiben, sollte Von KPI zu KII und der Kennzahlen-Stack nicht als fertige Gewissheit auftreten, sondern als pruefbarer Lernstand mit Korrekturpfad.</w:t>
       </w:r>
     </w:p>
     <w:p>
@@ -4623,107 +4678,122 @@
         <w:pStyle w:val="Heading3"/>
       </w:pPr>
       <w:r>
-        <w:t>Schlussvertiefung 5: Von KPI zu KII und der Kennzahlen-Stack im Anwendungsfall</w:t>
-      </w:r>
-    </w:p>
-    <w:p>
-      <w:r>
-        <w:t>Die folgenden Abschnitte sind keine neue Pruefungsloesung. Sie verdichten die vorhandenen Kapitel zu einer Lesart, mit der Studierende einen Fall selbststaendig analysieren koennen. Im Mittelpunkt stehen Datenqualitaet, Bewertungsprofile, Scorecards und rueckgekoppelte Steuerung, nicht moralische Personenbewertung.</w:t>
-      </w:r>
-    </w:p>
-    <w:p>
-      <w:r>
-        <w:t>Begriffliche Schlussklaerung. Wissenschaftliche Anschlussfaehigkeit entsteht hier durch Quellenklarheit. Bei Leitthese werden interne WOE-Begriffe nicht als Ersatz fuer Belege benutzt, sondern mit WOE-IDs, Benchmarks, Auditlogik, Datenqualitaetsstufen und externe Reportingrahmen verbunden. Wo die Datenlage offen bleibt, wird das offengelegt. Wo eine Aussage nur plausibel ist, bleibt sie als Wirkungspotenzial markiert. Wo ein Schaden eine rote Linie beruehrt, greift Nichtkompensation vor Durchschnittslogik.</w:t>
-      </w:r>
-    </w:p>
-    <w:p>
-      <w:r>
-        <w:t>In einer kontroversen Entscheidung wirkt Leitthese als Pruefpunkt fuer Ambivalenz. Ein Nutzen fuer eine Gruppe kann mit Risiken fuer andere Wirkungsempfaenger einhergehen. Das Skript verlangt deshalb, positive und negative Zustandsveraenderungen getrennt zu fuehren, bevor von positiver Netto-Wirkung gesprochen wird.</w:t>
-      </w:r>
-    </w:p>
-    <w:p>
-      <w:r>
-        <w:t>Wirkpfad und Empfaenger. In Impact-Controlling wird Didaktische Einordnung im Studiengang erst steuerungsfaehig, wenn daraus eine Entscheidung folgt. Kennzahlen muessen Entscheidungen verbessern, nicht nur Berichte fuellen. Ohne diese Rueckkopplung bleibt Reporting eine Beschreibung. Mit Rueckkopplung wird aus Bewertung eine veraenderte Routine: ein anderer Prozess, ein geaenderter Anreiz, eine bessere Datenpflicht, eine korrigierte Kommunikation oder eine neue Priorisierung.</w:t>
-      </w:r>
-    </w:p>
-    <w:p>
-      <w:r>
-        <w:t>Die typische Fehlstelle bei Von KPI zu KII und der Kennzahlen-Stack liegt darin, Messbarkeit als Wahrheit zu behandeln. Bei Didaktische Einordnung im Studiengang wird diese Fehlstelle konkret: Ein scheinbar plausibler Befund darf nicht zur Abkuerzung werden. Quellen, Systemgrenzen, Unsicherheit und Rueckkopplung bleiben sichtbar.</w:t>
-      </w:r>
-    </w:p>
-    <w:p>
-      <w:r>
-        <w:t>Daten, Quellen und Evidenz. Die Grenze gegen Scheingenauigkeit verlaeuft bei Analysemodell nicht zwischen Optimismus und Pessimismus. Sie verlaeuft zwischen offengelegter Unsicherheit und rhetorischer Sicherheit. Wer Von KPI zu KII und der Kennzahlen-Stack belastbar anwenden will, benennt Systemgrenze, Zeitraum, Vergleichspunkt und offene Gegenhypothese. Gerade dadurch bleibt das Skript anschlussfaehig fuer Forschung, Praxis und spaetere Revision.</w:t>
-      </w:r>
-    </w:p>
-    <w:p>
-      <w:r>
-        <w:t>Fuer die Pruefung ist Analysemodell dann verstanden, wenn daraus eine belastbare Fallantwort entsteht. Eine gute Antwort unterscheidet Beobachtung, Kausalannahme, Bewertung und Steuerungsfolge. Sie bewertet keine Menschen, sondern Wirkpfade, Zustandsveraenderungen, Risiken und institutionelle Bedingungen.</w:t>
-      </w:r>
-    </w:p>
-    <w:p>
-      <w:r>
-        <w:t>Bewertung und rote Linien. Modellformel zeigt, warum Von KPI zu KII und der Kennzahlen-Stack mehr ist als ein Schlagwort im Feld Datenqualitaet, Bewertungsprofile, Scorecards und rueckgekoppelte Steuerung. Die wirkungsoekonomische Frage lautet: Welche reale Veraenderung wird moeglich, welche bleibt nur Potenzial und wo entsteht ein Wirkungsrisiko? Diese Unterscheidung schuetzt vor Impact-Washing, weil sie Absicht, Aktivitaet, Reichweite und Wirkung auseinanderhaelt.</w:t>
-      </w:r>
-    </w:p>
-    <w:p>
-      <w:r>
-        <w:t>Eine Kommune, ein Unternehmen oder eine Bildungsorganisation will Von KPI zu KII und der Kennzahlen-Stack praktisch anwenden. Der erste Schritt ist nicht die Auswahl eines Instruments, sondern die Klaerung der Zustandsveraenderung. Bei Modellformel muss deshalb benannt werden, wer betroffen ist, welcher Zustand sich veraendert, welche Frist gilt und welche Gegenbeobachtung die Annahme widerlegen wuerde. Erst danach entsteht eine begruendete Entscheidung im Feld Indikator, Scorecard, Benchmark, Auditpfad, Portfolioentscheidung oder CAPEX/OPEX-Priorisierung.</w:t>
-      </w:r>
-    </w:p>
-    <w:p>
-      <w:r>
-        <w:t>Kontrollfrage. Welche Entscheidung waere falsch, wenn Modellformel in WC-V1 missverstanden wird? Die Antwort muss mindestens eine Daten- oder Quellenannahme, eine betroffene Gruppe oder Schutzdimension, eine moegliche Nebenwirkung und einen Rueckkopplungsschritt nennen. Richtig ist nicht die lauteste Bewertung, sondern diejenige, die Begriff, Beleg und Steuerungsfolge zusammenhaelt.</w:t>
-      </w:r>
-    </w:p>
-    <w:p>
-      <w:r>
-        <w:t>Rueckfluss. Fuer den WOE-Korpus bedeutet das: Begriffe aus Von KPI zu KII und der Kennzahlen-Stack sollten dort geschaerft werden, wo sie in Glossar, Werkzeugen, Journal oder Readern doppeldeutig bleiben. Offene Forschungsfragen werden nicht versteckt. Sie markieren die Stelle, an der spaetere Evidenz, ein besserer Datensatz oder eine praezisere Fallstudie die Bewertung veraendern kann.</w:t>
-      </w:r>
-    </w:p>
-    <w:p>
-      <w:r>
-        <w:t>Steuerung und Rueckkopplung. In WC-V1 muss Fallfenster immer mit Empfaengern gelesen werden. Wirkung entsteht nicht beim Sender, sondern an veraenderten Zustaenden von Menschen, Oekosystemen, Institutionen, Oeffentlichkeit oder kuenftigen Handlungsspielraeumen. Darum reicht es nicht, interne Aktivitaeten zu dokumentieren. Entscheidend ist, ob sich ein Zustand nachvollziehbar veraendert und ob diese Veraenderung im Referenzrahmen Mensch, Planet, Demokratie, SDGs, Agenda 2030 und SDG+ tragfaehig bewertet werden kann.</w:t>
-      </w:r>
-    </w:p>
-    <w:p>
-      <w:r>
-        <w:t>Ein Bericht behauptet, die Massnahme zu Von KPI zu KII und der Kennzahlen-Stack sei erfolgreich. Die WOE-Lesart fragt bei Fallfenster nach belastbaren Nachweisen: Datenquelle, Systemgrenze, Erhebungslogik, Unsicherheit, Aktualitaet und Auditspur. Wenn diese Nachweise fehlen, bleibt die Aussage Wirkungspotenzial oder Kommunikationsbehauptung. Sie kann wichtig sein, aber sie ist noch keine belegte Wirkung.</w:t>
-      </w:r>
-    </w:p>
-    <w:p>
-      <w:r>
-        <w:t>Pruefungsnahe Anwendung. Wissenschaftliche Anschlussfaehigkeit entsteht hier durch Quellenklarheit. Bei Prüfungsnahe Fallfragen ohne geschützte Antwortlogik werden interne WOE-Begriffe nicht als Ersatz fuer Belege benutzt, sondern mit WOE-IDs, Benchmarks, Auditlogik, Datenqualitaetsstufen und externe Reportingrahmen verbunden. Wo die Datenlage offen bleibt, wird das offengelegt. Wo eine Aussage nur plausibel ist, bleibt sie als Wirkungspotenzial markiert. Wo ein Schaden eine rote Linie beruehrt, greift Nichtkompensation vor Durchschnittslogik.</w:t>
-      </w:r>
-    </w:p>
-    <w:p>
-      <w:r>
-        <w:t>In einer kontroversen Entscheidung wirkt Prüfungsnahe Fallfragen ohne geschützte Antwortlogik als Pruefpunkt fuer Ambivalenz. Ein Nutzen fuer eine Gruppe kann mit Risiken fuer andere Wirkungsempfaenger einhergehen. Das Skript verlangt deshalb, positive und negative Zustandsveraenderungen getrennt zu fuehren, bevor von positiver Netto-Wirkung gesprochen wird.</w:t>
-      </w:r>
-    </w:p>
-    <w:p>
-      <w:r>
-        <w:t>Transfer in den WOE-Korpus. In Impact-Controlling wird Auswertung aus der lebenden Website-Referenz erst steuerungsfaehig, wenn daraus eine Entscheidung folgt. Kennzahlen muessen Entscheidungen verbessern, nicht nur Berichte fuellen. Ohne diese Rueckkopplung bleibt Reporting eine Beschreibung. Mit Rueckkopplung wird aus Bewertung eine veraenderte Routine: ein anderer Prozess, ein geaenderter Anreiz, eine bessere Datenpflicht, eine korrigierte Kommunikation oder eine neue Priorisierung.</w:t>
-      </w:r>
-    </w:p>
-    <w:p>
-      <w:r>
-        <w:t>Die typische Fehlstelle bei Von KPI zu KII und der Kennzahlen-Stack liegt darin, Messbarkeit als Wahrheit zu behandeln. Bei Auswertung aus der lebenden Website-Referenz wird diese Fehlstelle konkret: Ein scheinbar plausibler Befund darf nicht zur Abkuerzung werden. Quellen, Systemgrenzen, Unsicherheit und Rueckkopplung bleiben sichtbar.</w:t>
-      </w:r>
-    </w:p>
-    <w:p>
-      <w:r>
-        <w:t>Grenzen der Aussage. Die Grenze gegen Scheingenauigkeit verlaeuft bei KPI versus KII nicht zwischen Optimismus und Pessimismus. Sie verlaeuft zwischen offengelegter Unsicherheit und rhetorischer Sicherheit. Wer Von KPI zu KII und der Kennzahlen-Stack belastbar anwenden will, benennt Systemgrenze, Zeitraum, Vergleichspunkt und offene Gegenhypothese. Gerade dadurch bleibt das Skript anschlussfaehig fuer Forschung, Praxis und spaetere Revision.</w:t>
-      </w:r>
-    </w:p>
-    <w:p>
-      <w:r>
-        <w:t>Fuer die Pruefung ist KPI versus KII dann verstanden, wenn daraus eine belastbare Fallantwort entsteht. Eine gute Antwort unterscheidet Beobachtung, Kausalannahme, Bewertung und Steuerungsfolge. Sie bewertet keine Menschen, sondern Wirkpfade, Zustandsveraenderungen, Risiken und institutionelle Bedingungen.</w:t>
-      </w:r>
-    </w:p>
-    <w:p>
-      <w:r>
-        <w:t>Kontrollfrage. Welche Entscheidung waere falsch, wenn KPI versus KII in WC-V1 missverstanden wird? Die Antwort muss mindestens eine Daten- oder Quellenannahme, eine betroffene Gruppe oder Schutzdimension, eine moegliche Nebenwirkung und einen Rueckkopplungsschritt nennen. Richtig ist nicht die lauteste Bewertung, sondern diejenige, die Begriff, Beleg und Steuerungsfolge zusammenhaelt.</w:t>
+        <w:t>Vertiefungsrunde 5: Anschluss an Praxis und Forschung</w:t>
+      </w:r>
+    </w:p>
+    <w:p>
+      <w:r>
+        <w:t>Diese Runde wechselt den Blickwinkel, damit der Schlussblock nicht nur wiederholt, sondern Leseentscheidungen vorbereitet: Was ist belegt, was bleibt Potenzial, welche Nebenwirkung ist relevant und welche Steuerungsfolge wird daraus abgeleitet?</w:t>
+      </w:r>
+    </w:p>
+    <w:p>
+      <w:r>
+        <w:t>Begriffliche Sicherung. Die Grenze gegen Scheingenauigkeit verlaeuft bei Quelltext und fachliche Grundlegung nicht zwischen Optimismus und Pessimismus. Sie verlaeuft zwischen offengelegter Unsicherheit und rhetorischer Sicherheit. Wer Von KPI zu KII und der Kennzahlen-Stack belastbar anwenden will, benennt Systemgrenze, Zeitraum, Vergleichspunkt und offene Gegenhypothese. Gerade dadurch bleibt das Skript anschlussfaehig fuer Forschung, Praxis und spaetere Revision.</w:t>
+      </w:r>
+    </w:p>
+    <w:p>
+      <w:r>
+        <w:t>Fuer die Pruefung ist Quelltext und fachliche Grundlegung dann verstanden, wenn daraus eine belastbare Fallantwort entsteht. Eine gute Antwort unterscheidet Beobachtung, Kausalannahme, Bewertung und Steuerungsfolge. Sie bewertet keine Menschen, sondern Wirkpfade, Zustandsveraenderungen, Risiken und institutionelle Bedingungen.</w:t>
+      </w:r>
+    </w:p>
+    <w:p>
+      <w:r>
+        <w:t>Fallpruefung. Wenn ein Controlling-Team einen Indikator, eine Scorecard oder einen Auditpfad auf Entscheidungsrelevanz pruefen will, beginnt die Analyse bei Empfaengern, Wirkraum, Zeitraum und Datenquelle. Bei Quelltext und fachliche Grundlegung muss dann geklaert werden, ob Datenqualitaet, Systemgrenze, Unsicherheit und Nichtkompensation fuer eine Steuerungsentscheidung ausreichen. Eine tragfaehige Antwort benennt mindestens eine Quelle, eine offene Unsicherheit, eine moegliche Gegenbeobachtung und die Entscheidung, die nach der Bewertung geaendert wird.</w:t>
+      </w:r>
+    </w:p>
+    <w:p>
+      <w:r>
+        <w:t>Wirkpfadpruefung. Einstieg / Wirkungsfrage zeigt, warum Von KPI zu KII und der Kennzahlen-Stack mehr ist als ein Schlagwort im Feld Datenqualitaet, Bewertungsprofile, Scorecards und rueckgekoppelte Steuerung. Die wirkungsoekonomische Frage lautet: Welche reale Veraenderung wird moeglich, welche bleibt nur Potenzial und wo entsteht ein Wirkungsrisiko? Diese Unterscheidung schuetzt vor Impact-Washing, weil sie Absicht, Aktivitaet, Reichweite und Wirkung auseinanderhaelt.</w:t>
+      </w:r>
+    </w:p>
+    <w:p>
+      <w:r>
+        <w:t>Eine Kommune, ein Unternehmen oder eine Bildungsorganisation will Von KPI zu KII und der Kennzahlen-Stack praktisch anwenden. Der erste Schritt ist nicht die Auswahl eines Instruments, sondern die Klaerung der Zustandsveraenderung. Bei Einstieg / Wirkungsfrage muss deshalb benannt werden, wer betroffen ist, welcher Zustand sich veraendert, welche Frist gilt und welche Gegenbeobachtung die Annahme widerlegen wuerde. Erst danach entsteht eine begruendete Entscheidung im Feld Indikator, Scorecard, Benchmark, Auditpfad, Portfolioentscheidung oder CAPEX/OPEX-Priorisierung.</w:t>
+      </w:r>
+    </w:p>
+    <w:p>
+      <w:r>
+        <w:t>Fallpruefung. Wenn ein Controlling-Team einen Indikator, eine Scorecard oder einen Auditpfad auf Entscheidungsrelevanz pruefen will, beginnt die Analyse bei Empfaengern, Wirkraum, Zeitraum und Datenquelle. Bei Einstieg / Wirkungsfrage muss dann geklaert werden, ob Datenqualitaet, Systemgrenze, Unsicherheit und Nichtkompensation fuer eine Steuerungsentscheidung ausreichen. Eine tragfaehige Antwort benennt mindestens eine Quelle, eine offene Unsicherheit, eine moegliche Gegenbeobachtung und die Entscheidung, die nach der Bewertung geaendert wird.</w:t>
+      </w:r>
+    </w:p>
+    <w:p>
+      <w:r>
+        <w:t>Fuer die Bewertung reicht kein Summenscore, der zentrale Schaeden mit bequemen Pluspunkten verrechnet. Nichtkompensation und Reverse Merit Order markieren, wo rote Linien, demokratische Grundbedingungen oder planetare Grenzen Vorrang vor Durchschnittslogik haben. So bleibt positive Netto-Wirkung eine anspruchsvolle Zielgroesse und wird nicht zur dekorativen Formel.</w:t>
+      </w:r>
+    </w:p>
+    <w:p>
+      <w:r>
+        <w:t>Evidenzfenster. In WC-V1 muss Skript / Folien (Lernseite) immer mit Empfaengern gelesen werden. Wirkung entsteht nicht beim Sender, sondern an veraenderten Zustaenden von Menschen, Oekosystemen, Institutionen, Oeffentlichkeit oder kuenftigen Handlungsspielraeumen. Darum reicht es nicht, interne Aktivitaeten zu dokumentieren. Entscheidend ist, ob sich ein Zustand nachvollziehbar veraendert und ob diese Veraenderung im Referenzrahmen Mensch, Planet, Demokratie, SDGs, Agenda 2030 und SDG+ tragfaehig bewertet werden kann.</w:t>
+      </w:r>
+    </w:p>
+    <w:p>
+      <w:r>
+        <w:t>Ein Bericht behauptet, die Massnahme zu Von KPI zu KII und der Kennzahlen-Stack sei erfolgreich. Die WOE-Lesart fragt bei Skript / Folien (Lernseite) nach belastbaren Nachweisen: Datenquelle, Systemgrenze, Erhebungslogik, Unsicherheit, Aktualitaet und Auditspur. Wenn diese Nachweise fehlen, bleibt die Aussage Wirkungspotenzial oder Kommunikationsbehauptung. Sie kann wichtig sein, aber sie ist noch keine belegte Wirkung.</w:t>
+      </w:r>
+    </w:p>
+    <w:p>
+      <w:r>
+        <w:t>Fallpruefung. Wenn ein Controlling-Team einen Indikator, eine Scorecard oder einen Auditpfad auf Entscheidungsrelevanz pruefen will, beginnt die Analyse bei Empfaengern, Wirkraum, Zeitraum und Datenquelle. Bei Skript / Folien (Lernseite) muss dann geklaert werden, ob Datenqualitaet, Systemgrenze, Unsicherheit und Nichtkompensation fuer eine Steuerungsentscheidung ausreichen. Eine tragfaehige Antwort benennt mindestens eine Quelle, eine offene Unsicherheit, eine moegliche Gegenbeobachtung und die Entscheidung, die nach der Bewertung geaendert wird.</w:t>
+      </w:r>
+    </w:p>
+    <w:p>
+      <w:r>
+        <w:t>Der Rueckfluss in den WOE-Korpus liegt hier in klaren Begriffen, sauber verlinkten Quellen und benannten Forschungsfragen. Wo Glossar, Werkzeuge, Journal oder Reader noch doppeldeutig bleiben, sollte Von KPI zu KII und der Kennzahlen-Stack nicht als fertige Gewissheit auftreten, sondern als pruefbarer Lernstand mit Korrekturpfad.</w:t>
+      </w:r>
+    </w:p>
+    <w:p>
+      <w:r>
+        <w:t>Bewertungsgrenze. Wissenschaftliche Anschlussfaehigkeit entsteht hier durch Quellenklarheit. Bei Transferaufgabe werden interne WOE-Begriffe nicht als Ersatz fuer Belege benutzt, sondern mit WOE-IDs, Benchmarks, Auditlogik, Datenqualitaetsstufen und externe Reportingrahmen verbunden. Wo die Datenlage offen bleibt, wird das offengelegt. Wo eine Aussage nur plausibel ist, bleibt sie als Wirkungspotenzial markiert. Wo ein Schaden eine rote Linie beruehrt, greift Nichtkompensation vor Durchschnittslogik.</w:t>
+      </w:r>
+    </w:p>
+    <w:p>
+      <w:r>
+        <w:t>In einer kontroversen Entscheidung wirkt Transferaufgabe als Pruefpunkt fuer Ambivalenz. Ein Nutzen fuer eine Gruppe kann mit Risiken fuer andere Wirkungsempfaenger einhergehen. Das Skript verlangt deshalb, positive und negative Zustandsveraenderungen getrennt zu fuehren, bevor von positiver Netto-Wirkung gesprochen wird.</w:t>
+      </w:r>
+    </w:p>
+    <w:p>
+      <w:r>
+        <w:t>Fallpruefung. Wenn ein Controlling-Team einen Indikator, eine Scorecard oder einen Auditpfad auf Entscheidungsrelevanz pruefen will, beginnt die Analyse bei Empfaengern, Wirkraum, Zeitraum und Datenquelle. Bei Transferaufgabe muss dann geklaert werden, ob Datenqualitaet, Systemgrenze, Unsicherheit und Nichtkompensation fuer eine Steuerungsentscheidung ausreichen. Eine tragfaehige Antwort benennt mindestens eine Quelle, eine offene Unsicherheit, eine moegliche Gegenbeobachtung und die Entscheidung, die nach der Bewertung geaendert wird.</w:t>
+      </w:r>
+    </w:p>
+    <w:p>
+      <w:r>
+        <w:t>Steuerungsfolge. In Impact-Controlling wird Praxisbeispiel erst steuerungsfaehig, wenn daraus eine Entscheidung folgt. Kennzahlen muessen Entscheidungen verbessern, nicht nur Berichte fuellen. Ohne diese Rueckkopplung bleibt Reporting eine Beschreibung. Mit Rueckkopplung wird aus Bewertung eine veraenderte Routine: ein anderer Prozess, ein geaenderter Anreiz, eine bessere Datenpflicht, eine korrigierte Kommunikation oder eine neue Priorisierung.</w:t>
+      </w:r>
+    </w:p>
+    <w:p>
+      <w:r>
+        <w:t>Die typische Fehlstelle bei Von KPI zu KII und der Kennzahlen-Stack liegt darin, Messbarkeit als Wahrheit zu behandeln. Bei Praxisbeispiel wird diese Fehlstelle konkret: Ein scheinbar plausibler Befund darf nicht zur Abkuerzung werden. Quellen, Systemgrenzen, Unsicherheit und Rueckkopplung bleiben sichtbar.</w:t>
+      </w:r>
+    </w:p>
+    <w:p>
+      <w:r>
+        <w:t>Fallpruefung. Wenn ein Controlling-Team einen Indikator, eine Scorecard oder einen Auditpfad auf Entscheidungsrelevanz pruefen will, beginnt die Analyse bei Empfaengern, Wirkraum, Zeitraum und Datenquelle. Bei Praxisbeispiel muss dann geklaert werden, ob Datenqualitaet, Systemgrenze, Unsicherheit und Nichtkompensation fuer eine Steuerungsentscheidung ausreichen. Eine tragfaehige Antwort benennt mindestens eine Quelle, eine offene Unsicherheit, eine moegliche Gegenbeobachtung und die Entscheidung, die nach der Bewertung geaendert wird.</w:t>
+      </w:r>
+    </w:p>
+    <w:p>
+      <w:r>
+        <w:t>Fuer die Bewertung reicht kein Summenscore, der zentrale Schaeden mit bequemen Pluspunkten verrechnet. Nichtkompensation und Reverse Merit Order markieren, wo rote Linien, demokratische Grundbedingungen oder planetare Grenzen Vorrang vor Durchschnittslogik haben. So bleibt positive Netto-Wirkung eine anspruchsvolle Zielgroesse und wird nicht zur dekorativen Formel.</w:t>
+      </w:r>
+    </w:p>
+    <w:p>
+      <w:r>
+        <w:t>Transferhinweis. Die Grenze gegen Scheingenauigkeit verlaeuft bei Wirkungsökonomische Vertiefung nicht zwischen Optimismus und Pessimismus. Sie verlaeuft zwischen offengelegter Unsicherheit und rhetorischer Sicherheit. Wer Von KPI zu KII und der Kennzahlen-Stack belastbar anwenden will, benennt Systemgrenze, Zeitraum, Vergleichspunkt und offene Gegenhypothese. Gerade dadurch bleibt das Skript anschlussfaehig fuer Forschung, Praxis und spaetere Revision.</w:t>
+      </w:r>
+    </w:p>
+    <w:p>
+      <w:r>
+        <w:t>Fuer die Pruefung ist Wirkungsökonomische Vertiefung dann verstanden, wenn daraus eine belastbare Fallantwort entsteht. Eine gute Antwort unterscheidet Beobachtung, Kausalannahme, Bewertung und Steuerungsfolge. Sie bewertet keine Menschen, sondern Wirkpfade, Zustandsveraenderungen, Risiken und institutionelle Bedingungen.</w:t>
+      </w:r>
+    </w:p>
+    <w:p>
+      <w:r>
+        <w:t>Fallpruefung. Wenn ein Controlling-Team einen Indikator, eine Scorecard oder einen Auditpfad auf Entscheidungsrelevanz pruefen will, beginnt die Analyse bei Empfaengern, Wirkraum, Zeitraum und Datenquelle. Bei Wirkungsökonomische Vertiefung muss dann geklaert werden, ob Datenqualitaet, Systemgrenze, Unsicherheit und Nichtkompensation fuer eine Steuerungsentscheidung ausreichen. Eine tragfaehige Antwort benennt mindestens eine Quelle, eine offene Unsicherheit, eine moegliche Gegenbeobachtung und die Entscheidung, die nach der Bewertung geaendert wird.</w:t>
+      </w:r>
+    </w:p>
+    <w:p>
+      <w:r>
+        <w:t>Der Rueckfluss in den WOE-Korpus liegt hier in klaren Begriffen, sauber verlinkten Quellen und benannten Forschungsfragen. Wo Glossar, Werkzeuge, Journal oder Reader noch doppeldeutig bleiben, sollte Von KPI zu KII und der Kennzahlen-Stack nicht als fertige Gewissheit auftreten, sondern als pruefbarer Lernstand mit Korrekturpfad.</w:t>
       </w:r>
     </w:p>
     <w:p>
@@ -4731,112 +4801,122 @@
         <w:pStyle w:val="Heading3"/>
       </w:pPr>
       <w:r>
-        <w:t>Schlussvertiefung 6: Von KPI zu KII und der Kennzahlen-Stack im Anwendungsfall</w:t>
-      </w:r>
-    </w:p>
-    <w:p>
-      <w:r>
-        <w:t>Die folgenden Abschnitte sind keine neue Pruefungsloesung. Sie verdichten die vorhandenen Kapitel zu einer Lesart, mit der Studierende einen Fall selbststaendig analysieren koennen. Im Mittelpunkt stehen Datenqualitaet, Bewertungsprofile, Scorecards und rueckgekoppelte Steuerung, nicht moralische Personenbewertung.</w:t>
-      </w:r>
-    </w:p>
-    <w:p>
-      <w:r>
-        <w:t>Begriffliche Schlussklaerung. Scorecards im Management zeigt, warum Von KPI zu KII und der Kennzahlen-Stack mehr ist als ein Schlagwort im Feld Datenqualitaet, Bewertungsprofile, Scorecards und rueckgekoppelte Steuerung. Die wirkungsoekonomische Frage lautet: Welche reale Veraenderung wird moeglich, welche bleibt nur Potenzial und wo entsteht ein Wirkungsrisiko? Diese Unterscheidung schuetzt vor Impact-Washing, weil sie Absicht, Aktivitaet, Reichweite und Wirkung auseinanderhaelt.</w:t>
-      </w:r>
-    </w:p>
-    <w:p>
-      <w:r>
-        <w:t>Eine Kommune, ein Unternehmen oder eine Bildungsorganisation will Von KPI zu KII und der Kennzahlen-Stack praktisch anwenden. Der erste Schritt ist nicht die Auswahl eines Instruments, sondern die Klaerung der Zustandsveraenderung. Bei Scorecards im Management muss deshalb benannt werden, wer betroffen ist, welcher Zustand sich veraendert, welche Frist gilt und welche Gegenbeobachtung die Annahme widerlegen wuerde. Erst danach entsteht eine begruendete Entscheidung im Feld Indikator, Scorecard, Benchmark, Auditpfad, Portfolioentscheidung oder CAPEX/OPEX-Priorisierung.</w:t>
-      </w:r>
-    </w:p>
-    <w:p>
-      <w:r>
-        <w:t>Wirkpfad und Empfaenger. In WC-V1 muss NWI, IOI und T-SROI im Impact-Controlling immer mit Empfaengern gelesen werden. Wirkung entsteht nicht beim Sender, sondern an veraenderten Zustaenden von Menschen, Oekosystemen, Institutionen, Oeffentlichkeit oder kuenftigen Handlungsspielraeumen. Darum reicht es nicht, interne Aktivitaeten zu dokumentieren. Entscheidend ist, ob sich ein Zustand nachvollziehbar veraendert und ob diese Veraenderung im Referenzrahmen Mensch, Planet, Demokratie, SDGs, Agenda 2030 und SDG+ tragfaehig bewertet werden kann.</w:t>
-      </w:r>
-    </w:p>
-    <w:p>
-      <w:r>
-        <w:t>Ein Bericht behauptet, die Massnahme zu Von KPI zu KII und der Kennzahlen-Stack sei erfolgreich. Die WOE-Lesart fragt bei NWI, IOI und T-SROI im Impact-Controlling nach belastbaren Nachweisen: Datenquelle, Systemgrenze, Erhebungslogik, Unsicherheit, Aktualitaet und Auditspur. Wenn diese Nachweise fehlen, bleibt die Aussage Wirkungspotenzial oder Kommunikationsbehauptung. Sie kann wichtig sein, aber sie ist noch keine belegte Wirkung.</w:t>
-      </w:r>
-    </w:p>
-    <w:p>
-      <w:r>
-        <w:t>Rueckfluss. Fuer den WOE-Korpus bedeutet das: Begriffe aus Von KPI zu KII und der Kennzahlen-Stack sollten dort geschaerft werden, wo sie in Glossar, Werkzeugen, Journal oder Readern doppeldeutig bleiben. Offene Forschungsfragen werden nicht versteckt. Sie markieren die Stelle, an der spaetere Evidenz, ein besserer Datensatz oder eine praezisere Fallstudie die Bewertung veraendern kann.</w:t>
-      </w:r>
-    </w:p>
-    <w:p>
-      <w:r>
-        <w:t>Daten, Quellen und Evidenz. Wissenschaftliche Anschlussfaehigkeit entsteht hier durch Quellenklarheit. Bei Rückkopplung in Entscheidungen werden interne WOE-Begriffe nicht als Ersatz fuer Belege benutzt, sondern mit WOE-IDs, Benchmarks, Auditlogik, Datenqualitaetsstufen und externe Reportingrahmen verbunden. Wo die Datenlage offen bleibt, wird das offengelegt. Wo eine Aussage nur plausibel ist, bleibt sie als Wirkungspotenzial markiert. Wo ein Schaden eine rote Linie beruehrt, greift Nichtkompensation vor Durchschnittslogik.</w:t>
-      </w:r>
-    </w:p>
-    <w:p>
-      <w:r>
-        <w:t>In einer kontroversen Entscheidung wirkt Rückkopplung in Entscheidungen als Pruefpunkt fuer Ambivalenz. Ein Nutzen fuer eine Gruppe kann mit Risiken fuer andere Wirkungsempfaenger einhergehen. Das Skript verlangt deshalb, positive und negative Zustandsveraenderungen getrennt zu fuehren, bevor von positiver Netto-Wirkung gesprochen wird.</w:t>
-      </w:r>
-    </w:p>
-    <w:p>
-      <w:r>
-        <w:t>Bewertung und rote Linien. In Impact-Controlling wird Konsequenzen für die WÖk-Architektur erst steuerungsfaehig, wenn daraus eine Entscheidung folgt. Kennzahlen muessen Entscheidungen verbessern, nicht nur Berichte fuellen. Ohne diese Rueckkopplung bleibt Reporting eine Beschreibung. Mit Rueckkopplung wird aus Bewertung eine veraenderte Routine: ein anderer Prozess, ein geaenderter Anreiz, eine bessere Datenpflicht, eine korrigierte Kommunikation oder eine neue Priorisierung.</w:t>
-      </w:r>
-    </w:p>
-    <w:p>
-      <w:r>
-        <w:t>Die typische Fehlstelle bei Von KPI zu KII und der Kennzahlen-Stack liegt darin, Messbarkeit als Wahrheit zu behandeln. Bei Konsequenzen für die WÖk-Architektur wird diese Fehlstelle konkret: Ein scheinbar plausibler Befund darf nicht zur Abkuerzung werden. Quellen, Systemgrenzen, Unsicherheit und Rueckkopplung bleiben sichtbar.</w:t>
-      </w:r>
-    </w:p>
-    <w:p>
-      <w:r>
-        <w:t>Kontrollfrage. Welche Entscheidung waere falsch, wenn Konsequenzen für die WÖk-Architektur in WC-V1 missverstanden wird? Die Antwort muss mindestens eine Daten- oder Quellenannahme, eine betroffene Gruppe oder Schutzdimension, eine moegliche Nebenwirkung und einen Rueckkopplungsschritt nennen. Richtig ist nicht die lauteste Bewertung, sondern diejenige, die Begriff, Beleg und Steuerungsfolge zusammenhaelt.</w:t>
-      </w:r>
-    </w:p>
-    <w:p>
-      <w:r>
-        <w:t>Steuerung und Rueckkopplung. Die Grenze gegen Scheingenauigkeit verlaeuft bei Einleitung / Wirkungsfrage nicht zwischen Optimismus und Pessimismus. Sie verlaeuft zwischen offengelegter Unsicherheit und rhetorischer Sicherheit. Wer Von KPI zu KII und der Kennzahlen-Stack belastbar anwenden will, benennt Systemgrenze, Zeitraum, Vergleichspunkt und offene Gegenhypothese. Gerade dadurch bleibt das Skript anschlussfaehig fuer Forschung, Praxis und spaetere Revision.</w:t>
-      </w:r>
-    </w:p>
-    <w:p>
-      <w:r>
-        <w:t>Fuer die Pruefung ist Einleitung / Wirkungsfrage dann verstanden, wenn daraus eine belastbare Fallantwort entsteht. Eine gute Antwort unterscheidet Beobachtung, Kausalannahme, Bewertung und Steuerungsfolge. Sie bewertet keine Menschen, sondern Wirkpfade, Zustandsveraenderungen, Risiken und institutionelle Bedingungen.</w:t>
-      </w:r>
-    </w:p>
-    <w:p>
-      <w:r>
-        <w:t>Pruefungsnahe Anwendung. Kernaussage zeigt, warum Von KPI zu KII und der Kennzahlen-Stack mehr ist als ein Schlagwort im Feld Datenqualitaet, Bewertungsprofile, Scorecards und rueckgekoppelte Steuerung. Die wirkungsoekonomische Frage lautet: Welche reale Veraenderung wird moeglich, welche bleibt nur Potenzial und wo entsteht ein Wirkungsrisiko? Diese Unterscheidung schuetzt vor Impact-Washing, weil sie Absicht, Aktivitaet, Reichweite und Wirkung auseinanderhaelt.</w:t>
-      </w:r>
-    </w:p>
-    <w:p>
-      <w:r>
-        <w:t>Eine Kommune, ein Unternehmen oder eine Bildungsorganisation will Von KPI zu KII und der Kennzahlen-Stack praktisch anwenden. Der erste Schritt ist nicht die Auswahl eines Instruments, sondern die Klaerung der Zustandsveraenderung. Bei Kernaussage muss deshalb benannt werden, wer betroffen ist, welcher Zustand sich veraendert, welche Frist gilt und welche Gegenbeobachtung die Annahme widerlegen wuerde. Erst danach entsteht eine begruendete Entscheidung im Feld Indikator, Scorecard, Benchmark, Auditpfad, Portfolioentscheidung oder CAPEX/OPEX-Priorisierung.</w:t>
-      </w:r>
-    </w:p>
-    <w:p>
-      <w:r>
-        <w:t>Transfer in den WOE-Korpus. In WC-V1 muss Quelltext und fachliche Grundlegung immer mit Empfaengern gelesen werden. Wirkung entsteht nicht beim Sender, sondern an veraenderten Zustaenden von Menschen, Oekosystemen, Institutionen, Oeffentlichkeit oder kuenftigen Handlungsspielraeumen. Darum reicht es nicht, interne Aktivitaeten zu dokumentieren. Entscheidend ist, ob sich ein Zustand nachvollziehbar veraendert und ob diese Veraenderung im Referenzrahmen Mensch, Planet, Demokratie, SDGs, Agenda 2030 und SDG+ tragfaehig bewertet werden kann.</w:t>
-      </w:r>
-    </w:p>
-    <w:p>
-      <w:r>
-        <w:t>Ein Bericht behauptet, die Massnahme zu Von KPI zu KII und der Kennzahlen-Stack sei erfolgreich. Die WOE-Lesart fragt bei Quelltext und fachliche Grundlegung nach belastbaren Nachweisen: Datenquelle, Systemgrenze, Erhebungslogik, Unsicherheit, Aktualitaet und Auditspur. Wenn diese Nachweise fehlen, bleibt die Aussage Wirkungspotenzial oder Kommunikationsbehauptung. Sie kann wichtig sein, aber sie ist noch keine belegte Wirkung.</w:t>
-      </w:r>
-    </w:p>
-    <w:p>
-      <w:r>
-        <w:t>Grenzen der Aussage. Wissenschaftliche Anschlussfaehigkeit entsteht hier durch Quellenklarheit. Bei Einstieg / Wirkungsfrage werden interne WOE-Begriffe nicht als Ersatz fuer Belege benutzt, sondern mit WOE-IDs, Benchmarks, Auditlogik, Datenqualitaetsstufen und externe Reportingrahmen verbunden. Wo die Datenlage offen bleibt, wird das offengelegt. Wo eine Aussage nur plausibel ist, bleibt sie als Wirkungspotenzial markiert. Wo ein Schaden eine rote Linie beruehrt, greift Nichtkompensation vor Durchschnittslogik.</w:t>
-      </w:r>
-    </w:p>
-    <w:p>
-      <w:r>
-        <w:t>In einer kontroversen Entscheidung wirkt Einstieg / Wirkungsfrage als Pruefpunkt fuer Ambivalenz. Ein Nutzen fuer eine Gruppe kann mit Risiken fuer andere Wirkungsempfaenger einhergehen. Das Skript verlangt deshalb, positive und negative Zustandsveraenderungen getrennt zu fuehren, bevor von positiver Netto-Wirkung gesprochen wird.</w:t>
-      </w:r>
-    </w:p>
-    <w:p>
-      <w:r>
-        <w:t>Kontrollfrage. Welche Entscheidung waere falsch, wenn Einstieg / Wirkungsfrage in WC-V1 missverstanden wird? Die Antwort muss mindestens eine Daten- oder Quellenannahme, eine betroffene Gruppe oder Schutzdimension, eine moegliche Nebenwirkung und einen Rueckkopplungsschritt nennen. Richtig ist nicht die lauteste Bewertung, sondern diejenige, die Begriff, Beleg und Steuerungsfolge zusammenhaelt.</w:t>
-      </w:r>
-    </w:p>
-    <w:p>
-      <w:r>
-        <w:t>Rueckfluss. Fuer den WOE-Korpus bedeutet das: Begriffe aus Von KPI zu KII und der Kennzahlen-Stack sollten dort geschaerft werden, wo sie in Glossar, Werkzeugen, Journal oder Readern doppeldeutig bleiben. Offene Forschungsfragen werden nicht versteckt. Sie markieren die Stelle, an der spaetere Evidenz, ein besserer Datensatz oder eine praezisere Fallstudie die Bewertung veraendern kann.</w:t>
+        <w:t>Vertiefungsrunde 6: Anschluss an Praxis und Forschung</w:t>
+      </w:r>
+    </w:p>
+    <w:p>
+      <w:r>
+        <w:t>Diese Runde wechselt den Blickwinkel, damit der Schlussblock nicht nur wiederholt, sondern Leseentscheidungen vorbereitet: Was ist belegt, was bleibt Potenzial, welche Nebenwirkung ist relevant und welche Steuerungsfolge wird daraus abgeleitet?</w:t>
+      </w:r>
+    </w:p>
+    <w:p>
+      <w:r>
+        <w:t>Rueckflussnotiz. Begriffliche Präzision zeigt, warum Von KPI zu KII und der Kennzahlen-Stack mehr ist als ein Schlagwort im Feld Datenqualitaet, Bewertungsprofile, Scorecards und rueckgekoppelte Steuerung. Die wirkungsoekonomische Frage lautet: Welche reale Veraenderung wird moeglich, welche bleibt nur Potenzial und wo entsteht ein Wirkungsrisiko? Diese Unterscheidung schuetzt vor Impact-Washing, weil sie Absicht, Aktivitaet, Reichweite und Wirkung auseinanderhaelt.</w:t>
+      </w:r>
+    </w:p>
+    <w:p>
+      <w:r>
+        <w:t>Eine Kommune, ein Unternehmen oder eine Bildungsorganisation will Von KPI zu KII und der Kennzahlen-Stack praktisch anwenden. Der erste Schritt ist nicht die Auswahl eines Instruments, sondern die Klaerung der Zustandsveraenderung. Bei Begriffliche Präzision muss deshalb benannt werden, wer betroffen ist, welcher Zustand sich veraendert, welche Frist gilt und welche Gegenbeobachtung die Annahme widerlegen wuerde. Erst danach entsteht eine begruendete Entscheidung im Feld Indikator, Scorecard, Benchmark, Auditpfad, Portfolioentscheidung oder CAPEX/OPEX-Priorisierung.</w:t>
+      </w:r>
+    </w:p>
+    <w:p>
+      <w:r>
+        <w:t>Fallpruefung. Wenn ein Controlling-Team einen Indikator, eine Scorecard oder einen Auditpfad auf Entscheidungsrelevanz pruefen will, beginnt die Analyse bei Empfaengern, Wirkraum, Zeitraum und Datenquelle. Bei Begriffliche Präzision muss dann geklaert werden, ob Datenqualitaet, Systemgrenze, Unsicherheit und Nichtkompensation fuer eine Steuerungsentscheidung ausreichen. Eine tragfaehige Antwort benennt mindestens eine Quelle, eine offene Unsicherheit, eine moegliche Gegenbeobachtung und die Entscheidung, die nach der Bewertung geaendert wird.</w:t>
+      </w:r>
+    </w:p>
+    <w:p>
+      <w:r>
+        <w:t>Pruefungsimpuls. In WC-V1 muss Wirkpfad immer mit Empfaengern gelesen werden. Wirkung entsteht nicht beim Sender, sondern an veraenderten Zustaenden von Menschen, Oekosystemen, Institutionen, Oeffentlichkeit oder kuenftigen Handlungsspielraeumen. Darum reicht es nicht, interne Aktivitaeten zu dokumentieren. Entscheidend ist, ob sich ein Zustand nachvollziehbar veraendert und ob diese Veraenderung im Referenzrahmen Mensch, Planet, Demokratie, SDGs, Agenda 2030 und SDG+ tragfaehig bewertet werden kann.</w:t>
+      </w:r>
+    </w:p>
+    <w:p>
+      <w:r>
+        <w:t>Ein Bericht behauptet, die Massnahme zu Von KPI zu KII und der Kennzahlen-Stack sei erfolgreich. Die WOE-Lesart fragt bei Wirkpfad nach belastbaren Nachweisen: Datenquelle, Systemgrenze, Erhebungslogik, Unsicherheit, Aktualitaet und Auditspur. Wenn diese Nachweise fehlen, bleibt die Aussage Wirkungspotenzial oder Kommunikationsbehauptung. Sie kann wichtig sein, aber sie ist noch keine belegte Wirkung.</w:t>
+      </w:r>
+    </w:p>
+    <w:p>
+      <w:r>
+        <w:t>Fallpruefung. Wenn ein Controlling-Team einen Indikator, eine Scorecard oder einen Auditpfad auf Entscheidungsrelevanz pruefen will, beginnt die Analyse bei Empfaengern, Wirkraum, Zeitraum und Datenquelle. Bei Wirkpfad muss dann geklaert werden, ob Datenqualitaet, Systemgrenze, Unsicherheit und Nichtkompensation fuer eine Steuerungsentscheidung ausreichen. Eine tragfaehige Antwort benennt mindestens eine Quelle, eine offene Unsicherheit, eine moegliche Gegenbeobachtung und die Entscheidung, die nach der Bewertung geaendert wird.</w:t>
+      </w:r>
+    </w:p>
+    <w:p>
+      <w:r>
+        <w:t>Fuer die Bewertung reicht kein Summenscore, der zentrale Schaeden mit bequemen Pluspunkten verrechnet. Nichtkompensation und Reverse Merit Order markieren, wo rote Linien, demokratische Grundbedingungen oder planetare Grenzen Vorrang vor Durchschnittslogik haben. So bleibt positive Netto-Wirkung eine anspruchsvolle Zielgroesse und wird nicht zur dekorativen Formel.</w:t>
+      </w:r>
+    </w:p>
+    <w:p>
+      <w:r>
+        <w:t>Begriffliche Sicherung. Wissenschaftliche Anschlussfaehigkeit entsteht hier durch Quellenklarheit. Bei Leitthese werden interne WOE-Begriffe nicht als Ersatz fuer Belege benutzt, sondern mit WOE-IDs, Benchmarks, Auditlogik, Datenqualitaetsstufen und externe Reportingrahmen verbunden. Wo die Datenlage offen bleibt, wird das offengelegt. Wo eine Aussage nur plausibel ist, bleibt sie als Wirkungspotenzial markiert. Wo ein Schaden eine rote Linie beruehrt, greift Nichtkompensation vor Durchschnittslogik.</w:t>
+      </w:r>
+    </w:p>
+    <w:p>
+      <w:r>
+        <w:t>In einer kontroversen Entscheidung wirkt Leitthese als Pruefpunkt fuer Ambivalenz. Ein Nutzen fuer eine Gruppe kann mit Risiken fuer andere Wirkungsempfaenger einhergehen. Das Skript verlangt deshalb, positive und negative Zustandsveraenderungen getrennt zu fuehren, bevor von positiver Netto-Wirkung gesprochen wird.</w:t>
+      </w:r>
+    </w:p>
+    <w:p>
+      <w:r>
+        <w:t>Fallpruefung. Wenn ein Controlling-Team einen Indikator, eine Scorecard oder einen Auditpfad auf Entscheidungsrelevanz pruefen will, beginnt die Analyse bei Empfaengern, Wirkraum, Zeitraum und Datenquelle. Bei Leitthese muss dann geklaert werden, ob Datenqualitaet, Systemgrenze, Unsicherheit und Nichtkompensation fuer eine Steuerungsentscheidung ausreichen. Eine tragfaehige Antwort benennt mindestens eine Quelle, eine offene Unsicherheit, eine moegliche Gegenbeobachtung und die Entscheidung, die nach der Bewertung geaendert wird.</w:t>
+      </w:r>
+    </w:p>
+    <w:p>
+      <w:r>
+        <w:t>Der Rueckfluss in den WOE-Korpus liegt hier in klaren Begriffen, sauber verlinkten Quellen und benannten Forschungsfragen. Wo Glossar, Werkzeuge, Journal oder Reader noch doppeldeutig bleiben, sollte Von KPI zu KII und der Kennzahlen-Stack nicht als fertige Gewissheit auftreten, sondern als pruefbarer Lernstand mit Korrekturpfad.</w:t>
+      </w:r>
+    </w:p>
+    <w:p>
+      <w:r>
+        <w:t>Wirkpfadpruefung. In Impact-Controlling wird Didaktische Einordnung im Studiengang erst steuerungsfaehig, wenn daraus eine Entscheidung folgt. Kennzahlen muessen Entscheidungen verbessern, nicht nur Berichte fuellen. Ohne diese Rueckkopplung bleibt Reporting eine Beschreibung. Mit Rueckkopplung wird aus Bewertung eine veraenderte Routine: ein anderer Prozess, ein geaenderter Anreiz, eine bessere Datenpflicht, eine korrigierte Kommunikation oder eine neue Priorisierung.</w:t>
+      </w:r>
+    </w:p>
+    <w:p>
+      <w:r>
+        <w:t>Die typische Fehlstelle bei Von KPI zu KII und der Kennzahlen-Stack liegt darin, Messbarkeit als Wahrheit zu behandeln. Bei Didaktische Einordnung im Studiengang wird diese Fehlstelle konkret: Ein scheinbar plausibler Befund darf nicht zur Abkuerzung werden. Quellen, Systemgrenzen, Unsicherheit und Rueckkopplung bleiben sichtbar.</w:t>
+      </w:r>
+    </w:p>
+    <w:p>
+      <w:r>
+        <w:t>Fallpruefung. Wenn ein Controlling-Team einen Indikator, eine Scorecard oder einen Auditpfad auf Entscheidungsrelevanz pruefen will, beginnt die Analyse bei Empfaengern, Wirkraum, Zeitraum und Datenquelle. Bei Didaktische Einordnung im Studiengang muss dann geklaert werden, ob Datenqualitaet, Systemgrenze, Unsicherheit und Nichtkompensation fuer eine Steuerungsentscheidung ausreichen. Eine tragfaehige Antwort benennt mindestens eine Quelle, eine offene Unsicherheit, eine moegliche Gegenbeobachtung und die Entscheidung, die nach der Bewertung geaendert wird.</w:t>
+      </w:r>
+    </w:p>
+    <w:p>
+      <w:r>
+        <w:t>Evidenzfenster. Die Grenze gegen Scheingenauigkeit verlaeuft bei Analysemodell nicht zwischen Optimismus und Pessimismus. Sie verlaeuft zwischen offengelegter Unsicherheit und rhetorischer Sicherheit. Wer Von KPI zu KII und der Kennzahlen-Stack belastbar anwenden will, benennt Systemgrenze, Zeitraum, Vergleichspunkt und offene Gegenhypothese. Gerade dadurch bleibt das Skript anschlussfaehig fuer Forschung, Praxis und spaetere Revision.</w:t>
+      </w:r>
+    </w:p>
+    <w:p>
+      <w:r>
+        <w:t>Fuer die Pruefung ist Analysemodell dann verstanden, wenn daraus eine belastbare Fallantwort entsteht. Eine gute Antwort unterscheidet Beobachtung, Kausalannahme, Bewertung und Steuerungsfolge. Sie bewertet keine Menschen, sondern Wirkpfade, Zustandsveraenderungen, Risiken und institutionelle Bedingungen.</w:t>
+      </w:r>
+    </w:p>
+    <w:p>
+      <w:r>
+        <w:t>Fallpruefung. Wenn ein Controlling-Team einen Indikator, eine Scorecard oder einen Auditpfad auf Entscheidungsrelevanz pruefen will, beginnt die Analyse bei Empfaengern, Wirkraum, Zeitraum und Datenquelle. Bei Analysemodell muss dann geklaert werden, ob Datenqualitaet, Systemgrenze, Unsicherheit und Nichtkompensation fuer eine Steuerungsentscheidung ausreichen. Eine tragfaehige Antwort benennt mindestens eine Quelle, eine offene Unsicherheit, eine moegliche Gegenbeobachtung und die Entscheidung, die nach der Bewertung geaendert wird.</w:t>
+      </w:r>
+    </w:p>
+    <w:p>
+      <w:r>
+        <w:t>Fuer die Bewertung reicht kein Summenscore, der zentrale Schaeden mit bequemen Pluspunkten verrechnet. Nichtkompensation und Reverse Merit Order markieren, wo rote Linien, demokratische Grundbedingungen oder planetare Grenzen Vorrang vor Durchschnittslogik haben. So bleibt positive Netto-Wirkung eine anspruchsvolle Zielgroesse und wird nicht zur dekorativen Formel.</w:t>
+      </w:r>
+    </w:p>
+    <w:p>
+      <w:r>
+        <w:t>Bewertungsgrenze. Modellformel zeigt, warum Von KPI zu KII und der Kennzahlen-Stack mehr ist als ein Schlagwort im Feld Datenqualitaet, Bewertungsprofile, Scorecards und rueckgekoppelte Steuerung. Die wirkungsoekonomische Frage lautet: Welche reale Veraenderung wird moeglich, welche bleibt nur Potenzial und wo entsteht ein Wirkungsrisiko? Diese Unterscheidung schuetzt vor Impact-Washing, weil sie Absicht, Aktivitaet, Reichweite und Wirkung auseinanderhaelt.</w:t>
+      </w:r>
+    </w:p>
+    <w:p>
+      <w:r>
+        <w:t>Eine Kommune, ein Unternehmen oder eine Bildungsorganisation will Von KPI zu KII und der Kennzahlen-Stack praktisch anwenden. Der erste Schritt ist nicht die Auswahl eines Instruments, sondern die Klaerung der Zustandsveraenderung. Bei Modellformel muss deshalb benannt werden, wer betroffen ist, welcher Zustand sich veraendert, welche Frist gilt und welche Gegenbeobachtung die Annahme widerlegen wuerde. Erst danach entsteht eine begruendete Entscheidung im Feld Indikator, Scorecard, Benchmark, Auditpfad, Portfolioentscheidung oder CAPEX/OPEX-Priorisierung.</w:t>
+      </w:r>
+    </w:p>
+    <w:p>
+      <w:r>
+        <w:t>Fallpruefung. Wenn ein Controlling-Team einen Indikator, eine Scorecard oder einen Auditpfad auf Entscheidungsrelevanz pruefen will, beginnt die Analyse bei Empfaengern, Wirkraum, Zeitraum und Datenquelle. Bei Modellformel muss dann geklaert werden, ob Datenqualitaet, Systemgrenze, Unsicherheit und Nichtkompensation fuer eine Steuerungsentscheidung ausreichen. Eine tragfaehige Antwort benennt mindestens eine Quelle, eine offene Unsicherheit, eine moegliche Gegenbeobachtung und die Entscheidung, die nach der Bewertung geaendert wird.</w:t>
+      </w:r>
+    </w:p>
+    <w:p>
+      <w:r>
+        <w:t>Der Rueckfluss in den WOE-Korpus liegt hier in klaren Begriffen, sauber verlinkten Quellen und benannten Forschungsfragen. Wo Glossar, Werkzeuge, Journal oder Reader noch doppeldeutig bleiben, sollte Von KPI zu KII und der Kennzahlen-Stack nicht als fertige Gewissheit auftreten, sondern als pruefbarer Lernstand mit Korrekturpfad.</w:t>
       </w:r>
     </w:p>
     <w:p>
@@ -4844,190 +4924,102 @@
         <w:pStyle w:val="Heading3"/>
       </w:pPr>
       <w:r>
-        <w:t>Schlussvertiefung 7: Von KPI zu KII und der Kennzahlen-Stack im Anwendungsfall</w:t>
-      </w:r>
-    </w:p>
-    <w:p>
-      <w:r>
-        <w:t>Die folgenden Abschnitte sind keine neue Pruefungsloesung. Sie verdichten die vorhandenen Kapitel zu einer Lesart, mit der Studierende einen Fall selbststaendig analysieren koennen. Im Mittelpunkt stehen Datenqualitaet, Bewertungsprofile, Scorecards und rueckgekoppelte Steuerung, nicht moralische Personenbewertung.</w:t>
-      </w:r>
-    </w:p>
-    <w:p>
-      <w:r>
-        <w:t>Begriffliche Schlussklaerung. In Impact-Controlling wird Skript / Folien (Lernseite) erst steuerungsfaehig, wenn daraus eine Entscheidung folgt. Kennzahlen muessen Entscheidungen verbessern, nicht nur Berichte fuellen. Ohne diese Rueckkopplung bleibt Reporting eine Beschreibung. Mit Rueckkopplung wird aus Bewertung eine veraenderte Routine: ein anderer Prozess, ein geaenderter Anreiz, eine bessere Datenpflicht, eine korrigierte Kommunikation oder eine neue Priorisierung.</w:t>
-      </w:r>
-    </w:p>
-    <w:p>
-      <w:r>
-        <w:t>Die typische Fehlstelle bei Von KPI zu KII und der Kennzahlen-Stack liegt darin, Messbarkeit als Wahrheit zu behandeln. Bei Skript / Folien (Lernseite) wird diese Fehlstelle konkret: Ein scheinbar plausibler Befund darf nicht zur Abkuerzung werden. Quellen, Systemgrenzen, Unsicherheit und Rueckkopplung bleiben sichtbar.</w:t>
-      </w:r>
-    </w:p>
-    <w:p>
-      <w:r>
-        <w:t>Wirkpfad und Empfaenger. Die Grenze gegen Scheingenauigkeit verlaeuft bei Transferaufgabe nicht zwischen Optimismus und Pessimismus. Sie verlaeuft zwischen offengelegter Unsicherheit und rhetorischer Sicherheit. Wer Von KPI zu KII und der Kennzahlen-Stack belastbar anwenden will, benennt Systemgrenze, Zeitraum, Vergleichspunkt und offene Gegenhypothese. Gerade dadurch bleibt das Skript anschlussfaehig fuer Forschung, Praxis und spaetere Revision.</w:t>
-      </w:r>
-    </w:p>
-    <w:p>
-      <w:r>
-        <w:t>Fuer die Pruefung ist Transferaufgabe dann verstanden, wenn daraus eine belastbare Fallantwort entsteht. Eine gute Antwort unterscheidet Beobachtung, Kausalannahme, Bewertung und Steuerungsfolge. Sie bewertet keine Menschen, sondern Wirkpfade, Zustandsveraenderungen, Risiken und institutionelle Bedingungen.</w:t>
-      </w:r>
-    </w:p>
-    <w:p>
-      <w:r>
-        <w:t>Daten, Quellen und Evidenz. Praxisbeispiel zeigt, warum Von KPI zu KII und der Kennzahlen-Stack mehr ist als ein Schlagwort im Feld Datenqualitaet, Bewertungsprofile, Scorecards und rueckgekoppelte Steuerung. Die wirkungsoekonomische Frage lautet: Welche reale Veraenderung wird moeglich, welche bleibt nur Potenzial und wo entsteht ein Wirkungsrisiko? Diese Unterscheidung schuetzt vor Impact-Washing, weil sie Absicht, Aktivitaet, Reichweite und Wirkung auseinanderhaelt.</w:t>
-      </w:r>
-    </w:p>
-    <w:p>
-      <w:r>
-        <w:t>Eine Kommune, ein Unternehmen oder eine Bildungsorganisation will Von KPI zu KII und der Kennzahlen-Stack praktisch anwenden. Der erste Schritt ist nicht die Auswahl eines Instruments, sondern die Klaerung der Zustandsveraenderung. Bei Praxisbeispiel muss deshalb benannt werden, wer betroffen ist, welcher Zustand sich veraendert, welche Frist gilt und welche Gegenbeobachtung die Annahme widerlegen wuerde. Erst danach entsteht eine begruendete Entscheidung im Feld Indikator, Scorecard, Benchmark, Auditpfad, Portfolioentscheidung oder CAPEX/OPEX-Priorisierung.</w:t>
-      </w:r>
-    </w:p>
-    <w:p>
-      <w:r>
-        <w:t>Bewertung und rote Linien. In WC-V1 muss Wirkungsökonomische Vertiefung immer mit Empfaengern gelesen werden. Wirkung entsteht nicht beim Sender, sondern an veraenderten Zustaenden von Menschen, Oekosystemen, Institutionen, Oeffentlichkeit oder kuenftigen Handlungsspielraeumen. Darum reicht es nicht, interne Aktivitaeten zu dokumentieren. Entscheidend ist, ob sich ein Zustand nachvollziehbar veraendert und ob diese Veraenderung im Referenzrahmen Mensch, Planet, Demokratie, SDGs, Agenda 2030 und SDG+ tragfaehig bewertet werden kann.</w:t>
-      </w:r>
-    </w:p>
-    <w:p>
-      <w:r>
-        <w:t>Ein Bericht behauptet, die Massnahme zu Von KPI zu KII und der Kennzahlen-Stack sei erfolgreich. Die WOE-Lesart fragt bei Wirkungsökonomische Vertiefung nach belastbaren Nachweisen: Datenquelle, Systemgrenze, Erhebungslogik, Unsicherheit, Aktualitaet und Auditspur. Wenn diese Nachweise fehlen, bleibt die Aussage Wirkungspotenzial oder Kommunikationsbehauptung. Sie kann wichtig sein, aber sie ist noch keine belegte Wirkung.</w:t>
-      </w:r>
-    </w:p>
-    <w:p>
-      <w:r>
-        <w:t>Kontrollfrage. Welche Entscheidung waere falsch, wenn Wirkungsökonomische Vertiefung in WC-V1 missverstanden wird? Die Antwort muss mindestens eine Daten- oder Quellenannahme, eine betroffene Gruppe oder Schutzdimension, eine moegliche Nebenwirkung und einen Rueckkopplungsschritt nennen. Richtig ist nicht die lauteste Bewertung, sondern diejenige, die Begriff, Beleg und Steuerungsfolge zusammenhaelt.</w:t>
-      </w:r>
-    </w:p>
-    <w:p>
-      <w:r>
-        <w:t>Steuerung und Rueckkopplung. Wissenschaftliche Anschlussfaehigkeit entsteht hier durch Quellenklarheit. Bei Begriffliche Präzision werden interne WOE-Begriffe nicht als Ersatz fuer Belege benutzt, sondern mit WOE-IDs, Benchmarks, Auditlogik, Datenqualitaetsstufen und externe Reportingrahmen verbunden. Wo die Datenlage offen bleibt, wird das offengelegt. Wo eine Aussage nur plausibel ist, bleibt sie als Wirkungspotenzial markiert. Wo ein Schaden eine rote Linie beruehrt, greift Nichtkompensation vor Durchschnittslogik.</w:t>
-      </w:r>
-    </w:p>
-    <w:p>
-      <w:r>
-        <w:t>In einer kontroversen Entscheidung wirkt Begriffliche Präzision als Pruefpunkt fuer Ambivalenz. Ein Nutzen fuer eine Gruppe kann mit Risiken fuer andere Wirkungsempfaenger einhergehen. Das Skript verlangt deshalb, positive und negative Zustandsveraenderungen getrennt zu fuehren, bevor von positiver Netto-Wirkung gesprochen wird.</w:t>
-      </w:r>
-    </w:p>
-    <w:p>
-      <w:r>
-        <w:t>Pruefungsnahe Anwendung. In Impact-Controlling wird Wirkpfad erst steuerungsfaehig, wenn daraus eine Entscheidung folgt. Kennzahlen muessen Entscheidungen verbessern, nicht nur Berichte fuellen. Ohne diese Rueckkopplung bleibt Reporting eine Beschreibung. Mit Rueckkopplung wird aus Bewertung eine veraenderte Routine: ein anderer Prozess, ein geaenderter Anreiz, eine bessere Datenpflicht, eine korrigierte Kommunikation oder eine neue Priorisierung.</w:t>
-      </w:r>
-    </w:p>
-    <w:p>
-      <w:r>
-        <w:t>Die typische Fehlstelle bei Von KPI zu KII und der Kennzahlen-Stack liegt darin, Messbarkeit als Wahrheit zu behandeln. Bei Wirkpfad wird diese Fehlstelle konkret: Ein scheinbar plausibler Befund darf nicht zur Abkuerzung werden. Quellen, Systemgrenzen, Unsicherheit und Rueckkopplung bleiben sichtbar.</w:t>
-      </w:r>
-    </w:p>
-    <w:p>
-      <w:r>
-        <w:t>Rueckfluss. Fuer den WOE-Korpus bedeutet das: Begriffe aus Von KPI zu KII und der Kennzahlen-Stack sollten dort geschaerft werden, wo sie in Glossar, Werkzeugen, Journal oder Readern doppeldeutig bleiben. Offene Forschungsfragen werden nicht versteckt. Sie markieren die Stelle, an der spaetere Evidenz, ein besserer Datensatz oder eine praezisere Fallstudie die Bewertung veraendern kann.</w:t>
-      </w:r>
-    </w:p>
-    <w:p>
-      <w:r>
-        <w:t>Transfer in den WOE-Korpus. Die Grenze gegen Scheingenauigkeit verlaeuft bei Leitthese nicht zwischen Optimismus und Pessimismus. Sie verlaeuft zwischen offengelegter Unsicherheit und rhetorischer Sicherheit. Wer Von KPI zu KII und der Kennzahlen-Stack belastbar anwenden will, benennt Systemgrenze, Zeitraum, Vergleichspunkt und offene Gegenhypothese. Gerade dadurch bleibt das Skript anschlussfaehig fuer Forschung, Praxis und spaetere Revision.</w:t>
-      </w:r>
-    </w:p>
-    <w:p>
-      <w:r>
-        <w:t>Fuer die Pruefung ist Leitthese dann verstanden, wenn daraus eine belastbare Fallantwort entsteht. Eine gute Antwort unterscheidet Beobachtung, Kausalannahme, Bewertung und Steuerungsfolge. Sie bewertet keine Menschen, sondern Wirkpfade, Zustandsveraenderungen, Risiken und institutionelle Bedingungen.</w:t>
-      </w:r>
-    </w:p>
-    <w:p>
-      <w:r>
-        <w:t>Grenzen der Aussage. Didaktische Einordnung im Studiengang zeigt, warum Von KPI zu KII und der Kennzahlen-Stack mehr ist als ein Schlagwort im Feld Datenqualitaet, Bewertungsprofile, Scorecards und rueckgekoppelte Steuerung. Die wirkungsoekonomische Frage lautet: Welche reale Veraenderung wird moeglich, welche bleibt nur Potenzial und wo entsteht ein Wirkungsrisiko? Diese Unterscheidung schuetzt vor Impact-Washing, weil sie Absicht, Aktivitaet, Reichweite und Wirkung auseinanderhaelt.</w:t>
-      </w:r>
-    </w:p>
-    <w:p>
-      <w:r>
-        <w:t>Eine Kommune, ein Unternehmen oder eine Bildungsorganisation will Von KPI zu KII und der Kennzahlen-Stack praktisch anwenden. Der erste Schritt ist nicht die Auswahl eines Instruments, sondern die Klaerung der Zustandsveraenderung. Bei Didaktische Einordnung im Studiengang muss deshalb benannt werden, wer betroffen ist, welcher Zustand sich veraendert, welche Frist gilt und welche Gegenbeobachtung die Annahme widerlegen wuerde. Erst danach entsteht eine begruendete Entscheidung im Feld Indikator, Scorecard, Benchmark, Auditpfad, Portfolioentscheidung oder CAPEX/OPEX-Priorisierung.</w:t>
-      </w:r>
-    </w:p>
-    <w:p>
-      <w:r>
-        <w:t>Kontrollfrage. Welche Entscheidung waere falsch, wenn Didaktische Einordnung im Studiengang in WC-V1 missverstanden wird? Die Antwort muss mindestens eine Daten- oder Quellenannahme, eine betroffene Gruppe oder Schutzdimension, eine moegliche Nebenwirkung und einen Rueckkopplungsschritt nennen. Richtig ist nicht die lauteste Bewertung, sondern diejenige, die Begriff, Beleg und Steuerungsfolge zusammenhaelt.</w:t>
-      </w:r>
-    </w:p>
-    <w:p>
-      <w:pPr>
-        <w:pStyle w:val="Heading3"/>
-      </w:pPr>
-      <w:r>
-        <w:t>Schlussvertiefung 8: Von KPI zu KII und der Kennzahlen-Stack im Anwendungsfall</w:t>
-      </w:r>
-    </w:p>
-    <w:p>
-      <w:r>
-        <w:t>Die folgenden Abschnitte sind keine neue Pruefungsloesung. Sie verdichten die vorhandenen Kapitel zu einer Lesart, mit der Studierende einen Fall selbststaendig analysieren koennen. Im Mittelpunkt stehen Datenqualitaet, Bewertungsprofile, Scorecards und rueckgekoppelte Steuerung, nicht moralische Personenbewertung.</w:t>
-      </w:r>
-    </w:p>
-    <w:p>
-      <w:r>
-        <w:t>Begriffliche Schlussklaerung. In WC-V1 muss Analysemodell immer mit Empfaengern gelesen werden. Wirkung entsteht nicht beim Sender, sondern an veraenderten Zustaenden von Menschen, Oekosystemen, Institutionen, Oeffentlichkeit oder kuenftigen Handlungsspielraeumen. Darum reicht es nicht, interne Aktivitaeten zu dokumentieren. Entscheidend ist, ob sich ein Zustand nachvollziehbar veraendert und ob diese Veraenderung im Referenzrahmen Mensch, Planet, Demokratie, SDGs, Agenda 2030 und SDG+ tragfaehig bewertet werden kann.</w:t>
-      </w:r>
-    </w:p>
-    <w:p>
-      <w:r>
-        <w:t>Ein Bericht behauptet, die Massnahme zu Von KPI zu KII und der Kennzahlen-Stack sei erfolgreich. Die WOE-Lesart fragt bei Analysemodell nach belastbaren Nachweisen: Datenquelle, Systemgrenze, Erhebungslogik, Unsicherheit, Aktualitaet und Auditspur. Wenn diese Nachweise fehlen, bleibt die Aussage Wirkungspotenzial oder Kommunikationsbehauptung. Sie kann wichtig sein, aber sie ist noch keine belegte Wirkung.</w:t>
-      </w:r>
-    </w:p>
-    <w:p>
-      <w:r>
-        <w:t>Wirkpfad und Empfaenger. Wissenschaftliche Anschlussfaehigkeit entsteht hier durch Quellenklarheit. Bei Modellformel werden interne WOE-Begriffe nicht als Ersatz fuer Belege benutzt, sondern mit WOE-IDs, Benchmarks, Auditlogik, Datenqualitaetsstufen und externe Reportingrahmen verbunden. Wo die Datenlage offen bleibt, wird das offengelegt. Wo eine Aussage nur plausibel ist, bleibt sie als Wirkungspotenzial markiert. Wo ein Schaden eine rote Linie beruehrt, greift Nichtkompensation vor Durchschnittslogik.</w:t>
-      </w:r>
-    </w:p>
-    <w:p>
-      <w:r>
-        <w:t>In einer kontroversen Entscheidung wirkt Modellformel als Pruefpunkt fuer Ambivalenz. Ein Nutzen fuer eine Gruppe kann mit Risiken fuer andere Wirkungsempfaenger einhergehen. Das Skript verlangt deshalb, positive und negative Zustandsveraenderungen getrennt zu fuehren, bevor von positiver Netto-Wirkung gesprochen wird.</w:t>
-      </w:r>
-    </w:p>
-    <w:p>
-      <w:r>
-        <w:t>Daten, Quellen und Evidenz. In Impact-Controlling wird Fallfenster erst steuerungsfaehig, wenn daraus eine Entscheidung folgt. Kennzahlen muessen Entscheidungen verbessern, nicht nur Berichte fuellen. Ohne diese Rueckkopplung bleibt Reporting eine Beschreibung. Mit Rueckkopplung wird aus Bewertung eine veraenderte Routine: ein anderer Prozess, ein geaenderter Anreiz, eine bessere Datenpflicht, eine korrigierte Kommunikation oder eine neue Priorisierung.</w:t>
-      </w:r>
-    </w:p>
-    <w:p>
-      <w:r>
-        <w:t>Die typische Fehlstelle bei Von KPI zu KII und der Kennzahlen-Stack liegt darin, Messbarkeit als Wahrheit zu behandeln. Bei Fallfenster wird diese Fehlstelle konkret: Ein scheinbar plausibler Befund darf nicht zur Abkuerzung werden. Quellen, Systemgrenzen, Unsicherheit und Rueckkopplung bleiben sichtbar.</w:t>
-      </w:r>
-    </w:p>
-    <w:p>
-      <w:r>
-        <w:t>Bewertung und rote Linien. Die Grenze gegen Scheingenauigkeit verlaeuft bei Prüfungsnahe Fallfragen ohne geschützte Antwortlogik nicht zwischen Optimismus und Pessimismus. Sie verlaeuft zwischen offengelegter Unsicherheit und rhetorischer Sicherheit. Wer Von KPI zu KII und der Kennzahlen-Stack belastbar anwenden will, benennt Systemgrenze, Zeitraum, Vergleichspunkt und offene Gegenhypothese. Gerade dadurch bleibt das Skript anschlussfaehig fuer Forschung, Praxis und spaetere Revision.</w:t>
-      </w:r>
-    </w:p>
-    <w:p>
-      <w:r>
-        <w:t>Fuer die Pruefung ist Prüfungsnahe Fallfragen ohne geschützte Antwortlogik dann verstanden, wenn daraus eine belastbare Fallantwort entsteht. Eine gute Antwort unterscheidet Beobachtung, Kausalannahme, Bewertung und Steuerungsfolge. Sie bewertet keine Menschen, sondern Wirkpfade, Zustandsveraenderungen, Risiken und institutionelle Bedingungen.</w:t>
-      </w:r>
-    </w:p>
-    <w:p>
-      <w:r>
-        <w:t>Kontrollfrage. Welche Entscheidung waere falsch, wenn Prüfungsnahe Fallfragen ohne geschützte Antwortlogik in WC-V1 missverstanden wird? Die Antwort muss mindestens eine Daten- oder Quellenannahme, eine betroffene Gruppe oder Schutzdimension, eine moegliche Nebenwirkung und einen Rueckkopplungsschritt nennen. Richtig ist nicht die lauteste Bewertung, sondern diejenige, die Begriff, Beleg und Steuerungsfolge zusammenhaelt.</w:t>
-      </w:r>
-    </w:p>
-    <w:p>
-      <w:r>
-        <w:t>Rueckfluss. Fuer den WOE-Korpus bedeutet das: Begriffe aus Von KPI zu KII und der Kennzahlen-Stack sollten dort geschaerft werden, wo sie in Glossar, Werkzeugen, Journal oder Readern doppeldeutig bleiben. Offene Forschungsfragen werden nicht versteckt. Sie markieren die Stelle, an der spaetere Evidenz, ein besserer Datensatz oder eine praezisere Fallstudie die Bewertung veraendern kann.</w:t>
-      </w:r>
-    </w:p>
-    <w:p>
-      <w:r>
-        <w:t>Steuerung und Rueckkopplung. Auswertung aus der lebenden Website-Referenz zeigt, warum Von KPI zu KII und der Kennzahlen-Stack mehr ist als ein Schlagwort im Feld Datenqualitaet, Bewertungsprofile, Scorecards und rueckgekoppelte Steuerung. Die wirkungsoekonomische Frage lautet: Welche reale Veraenderung wird moeglich, welche bleibt nur Potenzial und wo entsteht ein Wirkungsrisiko? Diese Unterscheidung schuetzt vor Impact-Washing, weil sie Absicht, Aktivitaet, Reichweite und Wirkung auseinanderhaelt.</w:t>
-      </w:r>
-    </w:p>
-    <w:p>
-      <w:r>
-        <w:t>Eine Kommune, ein Unternehmen oder eine Bildungsorganisation will Von KPI zu KII und der Kennzahlen-Stack praktisch anwenden. Der erste Schritt ist nicht die Auswahl eines Instruments, sondern die Klaerung der Zustandsveraenderung. Bei Auswertung aus der lebenden Website-Referenz muss deshalb benannt werden, wer betroffen ist, welcher Zustand sich veraendert, welche Frist gilt und welche Gegenbeobachtung die Annahme widerlegen wuerde. Erst danach entsteht eine begruendete Entscheidung im Feld Indikator, Scorecard, Benchmark, Auditpfad, Portfolioentscheidung oder CAPEX/OPEX-Priorisierung.</w:t>
-      </w:r>
-    </w:p>
-    <w:p>
-      <w:r>
-        <w:t>Pruefungsnahe Anwendung. In WC-V1 muss KPI versus KII immer mit Empfaengern gelesen werden. Wirkung entsteht nicht beim Sender, sondern an veraenderten Zustaenden von Menschen, Oekosystemen, Institutionen, Oeffentlichkeit oder kuenftigen Handlungsspielraeumen. Darum reicht es nicht, interne Aktivitaeten zu dokumentieren. Entscheidend ist, ob sich ein Zustand nachvollziehbar veraendert und ob diese Veraenderung im Referenzrahmen Mensch, Planet, Demokratie, SDGs, Agenda 2030 und SDG+ tragfaehig bewertet werden kann.</w:t>
-      </w:r>
-    </w:p>
-    <w:p>
-      <w:r>
-        <w:t>Ein Bericht behauptet, die Massnahme zu Von KPI zu KII und der Kennzahlen-Stack sei erfolgreich. Die WOE-Lesart fragt bei KPI versus KII nach belastbaren Nachweisen: Datenquelle, Systemgrenze, Erhebungslogik, Unsicherheit, Aktualitaet und Auditspur. Wenn diese Nachweise fehlen, bleibt die Aussage Wirkungspotenzial oder Kommunikationsbehauptung. Sie kann wichtig sein, aber sie ist noch keine belegte Wirkung.</w:t>
+        <w:t>Vertiefungsrunde 7: Anschluss an Praxis und Forschung</w:t>
+      </w:r>
+    </w:p>
+    <w:p>
+      <w:r>
+        <w:t>Diese Runde wechselt den Blickwinkel, damit der Schlussblock nicht nur wiederholt, sondern Leseentscheidungen vorbereitet: Was ist belegt, was bleibt Potenzial, welche Nebenwirkung ist relevant und welche Steuerungsfolge wird daraus abgeleitet?</w:t>
+      </w:r>
+    </w:p>
+    <w:p>
+      <w:r>
+        <w:t>Steuerungsfolge. In WC-V1 muss Fallfenster immer mit Empfaengern gelesen werden. Wirkung entsteht nicht beim Sender, sondern an veraenderten Zustaenden von Menschen, Oekosystemen, Institutionen, Oeffentlichkeit oder kuenftigen Handlungsspielraeumen. Darum reicht es nicht, interne Aktivitaeten zu dokumentieren. Entscheidend ist, ob sich ein Zustand nachvollziehbar veraendert und ob diese Veraenderung im Referenzrahmen Mensch, Planet, Demokratie, SDGs, Agenda 2030 und SDG+ tragfaehig bewertet werden kann.</w:t>
+      </w:r>
+    </w:p>
+    <w:p>
+      <w:r>
+        <w:t>Ein Bericht behauptet, die Massnahme zu Von KPI zu KII und der Kennzahlen-Stack sei erfolgreich. Die WOE-Lesart fragt bei Fallfenster nach belastbaren Nachweisen: Datenquelle, Systemgrenze, Erhebungslogik, Unsicherheit, Aktualitaet und Auditspur. Wenn diese Nachweise fehlen, bleibt die Aussage Wirkungspotenzial oder Kommunikationsbehauptung. Sie kann wichtig sein, aber sie ist noch keine belegte Wirkung.</w:t>
+      </w:r>
+    </w:p>
+    <w:p>
+      <w:r>
+        <w:t>Fallpruefung. Wenn ein Controlling-Team einen Indikator, eine Scorecard oder einen Auditpfad auf Entscheidungsrelevanz pruefen will, beginnt die Analyse bei Empfaengern, Wirkraum, Zeitraum und Datenquelle. Bei Fallfenster muss dann geklaert werden, ob Datenqualitaet, Systemgrenze, Unsicherheit und Nichtkompensation fuer eine Steuerungsentscheidung ausreichen. Eine tragfaehige Antwort benennt mindestens eine Quelle, eine offene Unsicherheit, eine moegliche Gegenbeobachtung und die Entscheidung, die nach der Bewertung geaendert wird.</w:t>
+      </w:r>
+    </w:p>
+    <w:p>
+      <w:r>
+        <w:t>Transferhinweis. Wissenschaftliche Anschlussfaehigkeit entsteht hier durch Quellenklarheit. Bei Prüfungsnahe Fallfragen ohne geschützte Antwortlogik werden interne WOE-Begriffe nicht als Ersatz fuer Belege benutzt, sondern mit WOE-IDs, Benchmarks, Auditlogik, Datenqualitaetsstufen und externe Reportingrahmen verbunden. Wo die Datenlage offen bleibt, wird das offengelegt. Wo eine Aussage nur plausibel ist, bleibt sie als Wirkungspotenzial markiert. Wo ein Schaden eine rote Linie beruehrt, greift Nichtkompensation vor Durchschnittslogik.</w:t>
+      </w:r>
+    </w:p>
+    <w:p>
+      <w:r>
+        <w:t>In einer kontroversen Entscheidung wirkt Prüfungsnahe Fallfragen ohne geschützte Antwortlogik als Pruefpunkt fuer Ambivalenz. Ein Nutzen fuer eine Gruppe kann mit Risiken fuer andere Wirkungsempfaenger einhergehen. Das Skript verlangt deshalb, positive und negative Zustandsveraenderungen getrennt zu fuehren, bevor von positiver Netto-Wirkung gesprochen wird.</w:t>
+      </w:r>
+    </w:p>
+    <w:p>
+      <w:r>
+        <w:t>Fallpruefung. Wenn ein Controlling-Team einen Indikator, eine Scorecard oder einen Auditpfad auf Entscheidungsrelevanz pruefen will, beginnt die Analyse bei Empfaengern, Wirkraum, Zeitraum und Datenquelle. Bei Prüfungsnahe Fallfragen ohne geschützte Antwortlogik muss dann geklaert werden, ob Datenqualitaet, Systemgrenze, Unsicherheit und Nichtkompensation fuer eine Steuerungsentscheidung ausreichen. Eine tragfaehige Antwort benennt mindestens eine Quelle, eine offene Unsicherheit, eine moegliche Gegenbeobachtung und die Entscheidung, die nach der Bewertung geaendert wird.</w:t>
+      </w:r>
+    </w:p>
+    <w:p>
+      <w:r>
+        <w:t>Fuer die Bewertung reicht kein Summenscore, der zentrale Schaeden mit bequemen Pluspunkten verrechnet. Nichtkompensation und Reverse Merit Order markieren, wo rote Linien, demokratische Grundbedingungen oder planetare Grenzen Vorrang vor Durchschnittslogik haben. So bleibt positive Netto-Wirkung eine anspruchsvolle Zielgroesse und wird nicht zur dekorativen Formel.</w:t>
+      </w:r>
+    </w:p>
+    <w:p>
+      <w:r>
+        <w:t>Rueckflussnotiz. In Impact-Controlling wird Auswertung aus der lebenden Website-Referenz erst steuerungsfaehig, wenn daraus eine Entscheidung folgt. Kennzahlen muessen Entscheidungen verbessern, nicht nur Berichte fuellen. Ohne diese Rueckkopplung bleibt Reporting eine Beschreibung. Mit Rueckkopplung wird aus Bewertung eine veraenderte Routine: ein anderer Prozess, ein geaenderter Anreiz, eine bessere Datenpflicht, eine korrigierte Kommunikation oder eine neue Priorisierung.</w:t>
+      </w:r>
+    </w:p>
+    <w:p>
+      <w:r>
+        <w:t>Die typische Fehlstelle bei Von KPI zu KII und der Kennzahlen-Stack liegt darin, Messbarkeit als Wahrheit zu behandeln. Bei Auswertung aus der lebenden Website-Referenz wird diese Fehlstelle konkret: Ein scheinbar plausibler Befund darf nicht zur Abkuerzung werden. Quellen, Systemgrenzen, Unsicherheit und Rueckkopplung bleiben sichtbar.</w:t>
+      </w:r>
+    </w:p>
+    <w:p>
+      <w:r>
+        <w:t>Fallpruefung. Wenn ein Controlling-Team einen Indikator, eine Scorecard oder einen Auditpfad auf Entscheidungsrelevanz pruefen will, beginnt die Analyse bei Empfaengern, Wirkraum, Zeitraum und Datenquelle. Bei Auswertung aus der lebenden Website-Referenz muss dann geklaert werden, ob Datenqualitaet, Systemgrenze, Unsicherheit und Nichtkompensation fuer eine Steuerungsentscheidung ausreichen. Eine tragfaehige Antwort benennt mindestens eine Quelle, eine offene Unsicherheit, eine moegliche Gegenbeobachtung und die Entscheidung, die nach der Bewertung geaendert wird.</w:t>
+      </w:r>
+    </w:p>
+    <w:p>
+      <w:r>
+        <w:t>Der Rueckfluss in den WOE-Korpus liegt hier in klaren Begriffen, sauber verlinkten Quellen und benannten Forschungsfragen. Wo Glossar, Werkzeuge, Journal oder Reader noch doppeldeutig bleiben, sollte Von KPI zu KII und der Kennzahlen-Stack nicht als fertige Gewissheit auftreten, sondern als pruefbarer Lernstand mit Korrekturpfad.</w:t>
+      </w:r>
+    </w:p>
+    <w:p>
+      <w:r>
+        <w:t>Pruefungsimpuls. Die Grenze gegen Scheingenauigkeit verlaeuft bei KPI versus KII nicht zwischen Optimismus und Pessimismus. Sie verlaeuft zwischen offengelegter Unsicherheit und rhetorischer Sicherheit. Wer Von KPI zu KII und der Kennzahlen-Stack belastbar anwenden will, benennt Systemgrenze, Zeitraum, Vergleichspunkt und offene Gegenhypothese. Gerade dadurch bleibt das Skript anschlussfaehig fuer Forschung, Praxis und spaetere Revision.</w:t>
+      </w:r>
+    </w:p>
+    <w:p>
+      <w:r>
+        <w:t>Fuer die Pruefung ist KPI versus KII dann verstanden, wenn daraus eine belastbare Fallantwort entsteht. Eine gute Antwort unterscheidet Beobachtung, Kausalannahme, Bewertung und Steuerungsfolge. Sie bewertet keine Menschen, sondern Wirkpfade, Zustandsveraenderungen, Risiken und institutionelle Bedingungen.</w:t>
+      </w:r>
+    </w:p>
+    <w:p>
+      <w:r>
+        <w:t>Fallpruefung. Wenn ein Controlling-Team einen Indikator, eine Scorecard oder einen Auditpfad auf Entscheidungsrelevanz pruefen will, beginnt die Analyse bei Empfaengern, Wirkraum, Zeitraum und Datenquelle. Bei KPI versus KII muss dann geklaert werden, ob Datenqualitaet, Systemgrenze, Unsicherheit und Nichtkompensation fuer eine Steuerungsentscheidung ausreichen. Eine tragfaehige Antwort benennt mindestens eine Quelle, eine offene Unsicherheit, eine moegliche Gegenbeobachtung und die Entscheidung, die nach der Bewertung geaendert wird.</w:t>
+      </w:r>
+    </w:p>
+    <w:p>
+      <w:r>
+        <w:t>Begriffliche Sicherung. Scorecards im Management zeigt, warum Von KPI zu KII und der Kennzahlen-Stack mehr ist als ein Schlagwort im Feld Datenqualitaet, Bewertungsprofile, Scorecards und rueckgekoppelte Steuerung. Die wirkungsoekonomische Frage lautet: Welche reale Veraenderung wird moeglich, welche bleibt nur Potenzial und wo entsteht ein Wirkungsrisiko? Diese Unterscheidung schuetzt vor Impact-Washing, weil sie Absicht, Aktivitaet, Reichweite und Wirkung auseinanderhaelt.</w:t>
+      </w:r>
+    </w:p>
+    <w:p>
+      <w:r>
+        <w:t>Eine Kommune, ein Unternehmen oder eine Bildungsorganisation will Von KPI zu KII und der Kennzahlen-Stack praktisch anwenden. Der erste Schritt ist nicht die Auswahl eines Instruments, sondern die Klaerung der Zustandsveraenderung. Bei Scorecards im Management muss deshalb benannt werden, wer betroffen ist, welcher Zustand sich veraendert, welche Frist gilt und welche Gegenbeobachtung die Annahme widerlegen wuerde. Erst danach entsteht eine begruendete Entscheidung im Feld Indikator, Scorecard, Benchmark, Auditpfad, Portfolioentscheidung oder CAPEX/OPEX-Priorisierung.</w:t>
+      </w:r>
+    </w:p>
+    <w:p>
+      <w:r>
+        <w:t>Fallpruefung. Wenn ein Controlling-Team einen Indikator, eine Scorecard oder einen Auditpfad auf Entscheidungsrelevanz pruefen will, beginnt die Analyse bei Empfaengern, Wirkraum, Zeitraum und Datenquelle. Bei Scorecards im Management muss dann geklaert werden, ob Datenqualitaet, Systemgrenze, Unsicherheit und Nichtkompensation fuer eine Steuerungsentscheidung ausreichen. Eine tragfaehige Antwort benennt mindestens eine Quelle, eine offene Unsicherheit, eine moegliche Gegenbeobachtung und die Entscheidung, die nach der Bewertung geaendert wird.</w:t>
+      </w:r>
+    </w:p>
+    <w:p>
+      <w:r>
+        <w:t>Fuer die Bewertung reicht kein Summenscore, der zentrale Schaeden mit bequemen Pluspunkten verrechnet. Nichtkompensation und Reverse Merit Order markieren, wo rote Linien, demokratische Grundbedingungen oder planetare Grenzen Vorrang vor Durchschnittslogik haben. So bleibt positive Netto-Wirkung eine anspruchsvolle Zielgroesse und wird nicht zur dekorativen Formel.</w:t>
       </w:r>
     </w:p>
     <w:p>

</xml_diff>

<commit_message>
Refine study script final blocks
</commit_message>
<xml_diff>
--- a/docs/studienskripte/word-rohfassungen/wirkungscontrolling-wc-v1.docx
+++ b/docs/studienskripte/word-rohfassungen/wirkungscontrolling-wc-v1.docx
@@ -4196,7 +4196,7 @@
     </w:p>
     <w:p>
       <w:r>
-        <w:t>Begriffliche Sicherung. Einleitung / Wirkungsfrage zeigt, warum Von KPI zu KII und der Kennzahlen-Stack mehr ist als ein Schlagwort im Feld Datenqualitaet, Bewertungsprofile, Scorecards und rueckgekoppelte Steuerung. Die wirkungsoekonomische Frage lautet: Welche reale Veraenderung wird moeglich, welche bleibt nur Potenzial und wo entsteht ein Wirkungsrisiko? Diese Unterscheidung schuetzt vor Impact-Washing, weil sie Absicht, Aktivitaet, Reichweite und Wirkung auseinanderhaelt.</w:t>
+        <w:t>Begriffliche Sicherung. Bei Einleitung / Wirkungsfrage wird Von KPI zu KII und der Kennzahlen-Stack als Arbeitsfrage im Feld Datenqualitaet, Bewertungsprofile, Scorecards und rueckgekoppelte Steuerung lesbar. Die wirkungsoekonomische Frage lautet: Welche reale Veraenderung wird moeglich, welche bleibt nur Potenzial und wo entsteht ein Wirkungsrisiko? Diese Unterscheidung schuetzt vor Impact-Washing, weil sie Absicht, Aktivitaet, Reichweite und Wirkung auseinanderhaelt.</w:t>
       </w:r>
     </w:p>
     <w:p>
@@ -4286,7 +4286,7 @@
     </w:p>
     <w:p>
       <w:r>
-        <w:t>Transferhinweis. Transferaufgabe zeigt, warum Von KPI zu KII und der Kennzahlen-Stack mehr ist als ein Schlagwort im Feld Datenqualitaet, Bewertungsprofile, Scorecards und rueckgekoppelte Steuerung. Die wirkungsoekonomische Frage lautet: Welche reale Veraenderung wird moeglich, welche bleibt nur Potenzial und wo entsteht ein Wirkungsrisiko? Diese Unterscheidung schuetzt vor Impact-Washing, weil sie Absicht, Aktivitaet, Reichweite und Wirkung auseinanderhaelt.</w:t>
+        <w:t>Transferhinweis. Bei Transferaufgabe wird Von KPI zu KII und der Kennzahlen-Stack als Arbeitsfrage im Feld Datenqualitaet, Bewertungsprofile, Scorecards und rueckgekoppelte Steuerung lesbar. Die wirkungsoekonomische Frage lautet: Welche reale Veraenderung wird moeglich, welche bleibt nur Potenzial und wo entsteht ein Wirkungsrisiko? Diese Unterscheidung schuetzt vor Impact-Washing, weil sie Absicht, Aktivitaet, Reichweite und Wirkung auseinanderhaelt.</w:t>
       </w:r>
     </w:p>
     <w:p>
@@ -4389,7 +4389,7 @@
     </w:p>
     <w:p>
       <w:r>
-        <w:t>Evidenzfenster. Leitthese zeigt, warum Von KPI zu KII und der Kennzahlen-Stack mehr ist als ein Schlagwort im Feld Datenqualitaet, Bewertungsprofile, Scorecards und rueckgekoppelte Steuerung. Die wirkungsoekonomische Frage lautet: Welche reale Veraenderung wird moeglich, welche bleibt nur Potenzial und wo entsteht ein Wirkungsrisiko? Diese Unterscheidung schuetzt vor Impact-Washing, weil sie Absicht, Aktivitaet, Reichweite und Wirkung auseinanderhaelt.</w:t>
+        <w:t>Evidenzfenster. Bei Leitthese wird Von KPI zu KII und der Kennzahlen-Stack als Arbeitsfrage im Feld Datenqualitaet, Bewertungsprofile, Scorecards und rueckgekoppelte Steuerung lesbar. Die wirkungsoekonomische Frage lautet: Welche reale Veraenderung wird moeglich, welche bleibt nur Potenzial und wo entsteht ein Wirkungsrisiko? Diese Unterscheidung schuetzt vor Impact-Washing, weil sie Absicht, Aktivitaet, Reichweite und Wirkung auseinanderhaelt.</w:t>
       </w:r>
     </w:p>
     <w:p>
@@ -4497,7 +4497,7 @@
     </w:p>
     <w:p>
       <w:r>
-        <w:t>Pruefungsimpuls. Prüfungsnahe Fallfragen ohne geschützte Antwortlogik zeigt, warum Von KPI zu KII und der Kennzahlen-Stack mehr ist als ein Schlagwort im Feld Datenqualitaet, Bewertungsprofile, Scorecards und rueckgekoppelte Steuerung. Die wirkungsoekonomische Frage lautet: Welche reale Veraenderung wird moeglich, welche bleibt nur Potenzial und wo entsteht ein Wirkungsrisiko? Diese Unterscheidung schuetzt vor Impact-Washing, weil sie Absicht, Aktivitaet, Reichweite und Wirkung auseinanderhaelt.</w:t>
+        <w:t>Pruefungsimpuls. Bei Prüfungsnahe Fallfragen ohne geschützte Antwortlogik wird Von KPI zu KII und der Kennzahlen-Stack als Arbeitsfrage im Feld Datenqualitaet, Bewertungsprofile, Scorecards und rueckgekoppelte Steuerung lesbar. Die wirkungsoekonomische Frage lautet: Welche reale Veraenderung wird moeglich, welche bleibt nur Potenzial und wo entsteht ein Wirkungsrisiko? Diese Unterscheidung schuetzt vor Impact-Washing, weil sie Absicht, Aktivitaet, Reichweite und Wirkung auseinanderhaelt.</w:t>
       </w:r>
     </w:p>
     <w:p>
@@ -4600,7 +4600,7 @@
     </w:p>
     <w:p>
       <w:r>
-        <w:t>Steuerungsfolge. Rückkopplung in Entscheidungen zeigt, warum Von KPI zu KII und der Kennzahlen-Stack mehr ist als ein Schlagwort im Feld Datenqualitaet, Bewertungsprofile, Scorecards und rueckgekoppelte Steuerung. Die wirkungsoekonomische Frage lautet: Welche reale Veraenderung wird moeglich, welche bleibt nur Potenzial und wo entsteht ein Wirkungsrisiko? Diese Unterscheidung schuetzt vor Impact-Washing, weil sie Absicht, Aktivitaet, Reichweite und Wirkung auseinanderhaelt.</w:t>
+        <w:t>Steuerungsfolge. Bei Rückkopplung in Entscheidungen wird Von KPI zu KII und der Kennzahlen-Stack als Arbeitsfrage im Feld Datenqualitaet, Bewertungsprofile, Scorecards und rueckgekoppelte Steuerung lesbar. Die wirkungsoekonomische Frage lautet: Welche reale Veraenderung wird moeglich, welche bleibt nur Potenzial und wo entsteht ein Wirkungsrisiko? Diese Unterscheidung schuetzt vor Impact-Washing, weil sie Absicht, Aktivitaet, Reichweite und Wirkung auseinanderhaelt.</w:t>
       </w:r>
     </w:p>
     <w:p>
@@ -4703,7 +4703,7 @@
     </w:p>
     <w:p>
       <w:r>
-        <w:t>Wirkpfadpruefung. Einstieg / Wirkungsfrage zeigt, warum Von KPI zu KII und der Kennzahlen-Stack mehr ist als ein Schlagwort im Feld Datenqualitaet, Bewertungsprofile, Scorecards und rueckgekoppelte Steuerung. Die wirkungsoekonomische Frage lautet: Welche reale Veraenderung wird moeglich, welche bleibt nur Potenzial und wo entsteht ein Wirkungsrisiko? Diese Unterscheidung schuetzt vor Impact-Washing, weil sie Absicht, Aktivitaet, Reichweite und Wirkung auseinanderhaelt.</w:t>
+        <w:t>Wirkpfadpruefung. Bei Einstieg / Wirkungsfrage wird Von KPI zu KII und der Kennzahlen-Stack als Arbeitsfrage im Feld Datenqualitaet, Bewertungsprofile, Scorecards und rueckgekoppelte Steuerung lesbar. Die wirkungsoekonomische Frage lautet: Welche reale Veraenderung wird moeglich, welche bleibt nur Potenzial und wo entsteht ein Wirkungsrisiko? Diese Unterscheidung schuetzt vor Impact-Washing, weil sie Absicht, Aktivitaet, Reichweite und Wirkung auseinanderhaelt.</w:t>
       </w:r>
     </w:p>
     <w:p>
@@ -4811,7 +4811,7 @@
     </w:p>
     <w:p>
       <w:r>
-        <w:t>Rueckflussnotiz. Begriffliche Präzision zeigt, warum Von KPI zu KII und der Kennzahlen-Stack mehr ist als ein Schlagwort im Feld Datenqualitaet, Bewertungsprofile, Scorecards und rueckgekoppelte Steuerung. Die wirkungsoekonomische Frage lautet: Welche reale Veraenderung wird moeglich, welche bleibt nur Potenzial und wo entsteht ein Wirkungsrisiko? Diese Unterscheidung schuetzt vor Impact-Washing, weil sie Absicht, Aktivitaet, Reichweite und Wirkung auseinanderhaelt.</w:t>
+        <w:t>Rueckflussnotiz. Bei Begriffliche Präzision wird Von KPI zu KII und der Kennzahlen-Stack als Arbeitsfrage im Feld Datenqualitaet, Bewertungsprofile, Scorecards und rueckgekoppelte Steuerung lesbar. Die wirkungsoekonomische Frage lautet: Welche reale Veraenderung wird moeglich, welche bleibt nur Potenzial und wo entsteht ein Wirkungsrisiko? Diese Unterscheidung schuetzt vor Impact-Washing, weil sie Absicht, Aktivitaet, Reichweite und Wirkung auseinanderhaelt.</w:t>
       </w:r>
     </w:p>
     <w:p>
@@ -4901,7 +4901,7 @@
     </w:p>
     <w:p>
       <w:r>
-        <w:t>Bewertungsgrenze. Modellformel zeigt, warum Von KPI zu KII und der Kennzahlen-Stack mehr ist als ein Schlagwort im Feld Datenqualitaet, Bewertungsprofile, Scorecards und rueckgekoppelte Steuerung. Die wirkungsoekonomische Frage lautet: Welche reale Veraenderung wird moeglich, welche bleibt nur Potenzial und wo entsteht ein Wirkungsrisiko? Diese Unterscheidung schuetzt vor Impact-Washing, weil sie Absicht, Aktivitaet, Reichweite und Wirkung auseinanderhaelt.</w:t>
+        <w:t>Bewertungsgrenze. Bei Modellformel wird Von KPI zu KII und der Kennzahlen-Stack als Arbeitsfrage im Feld Datenqualitaet, Bewertungsprofile, Scorecards und rueckgekoppelte Steuerung lesbar. Die wirkungsoekonomische Frage lautet: Welche reale Veraenderung wird moeglich, welche bleibt nur Potenzial und wo entsteht ein Wirkungsrisiko? Diese Unterscheidung schuetzt vor Impact-Washing, weil sie Absicht, Aktivitaet, Reichweite und Wirkung auseinanderhaelt.</w:t>
       </w:r>
     </w:p>
     <w:p>
@@ -5004,7 +5004,7 @@
     </w:p>
     <w:p>
       <w:r>
-        <w:t>Begriffliche Sicherung. Scorecards im Management zeigt, warum Von KPI zu KII und der Kennzahlen-Stack mehr ist als ein Schlagwort im Feld Datenqualitaet, Bewertungsprofile, Scorecards und rueckgekoppelte Steuerung. Die wirkungsoekonomische Frage lautet: Welche reale Veraenderung wird moeglich, welche bleibt nur Potenzial und wo entsteht ein Wirkungsrisiko? Diese Unterscheidung schuetzt vor Impact-Washing, weil sie Absicht, Aktivitaet, Reichweite und Wirkung auseinanderhaelt.</w:t>
+        <w:t>Begriffliche Sicherung. Bei Scorecards im Management wird Von KPI zu KII und der Kennzahlen-Stack als Arbeitsfrage im Feld Datenqualitaet, Bewertungsprofile, Scorecards und rueckgekoppelte Steuerung lesbar. Die wirkungsoekonomische Frage lautet: Welche reale Veraenderung wird moeglich, welche bleibt nur Potenzial und wo entsteht ein Wirkungsrisiko? Diese Unterscheidung schuetzt vor Impact-Washing, weil sie Absicht, Aktivitaet, Reichweite und Wirkung auseinanderhaelt.</w:t>
       </w:r>
     </w:p>
     <w:p>
@@ -5020,6 +5020,26 @@
     <w:p>
       <w:r>
         <w:t>Fuer die Bewertung reicht kein Summenscore, der zentrale Schaeden mit bequemen Pluspunkten verrechnet. Nichtkompensation und Reverse Merit Order markieren, wo rote Linien, demokratische Grundbedingungen oder planetare Grenzen Vorrang vor Durchschnittslogik haben. So bleibt positive Netto-Wirkung eine anspruchsvolle Zielgroesse und wird nicht zur dekorativen Formel.</w:t>
+      </w:r>
+    </w:p>
+    <w:p>
+      <w:r>
+        <w:t>Wirkpfadpruefung. In WC-V1 muss NWI, IOI und T-SROI im Impact-Controlling immer mit Empfaengern gelesen werden. Wirkung entsteht nicht beim Sender, sondern an veraenderten Zustaenden von Menschen, Oekosystemen, Institutionen, Oeffentlichkeit oder kuenftigen Handlungsspielraeumen. Darum reicht es nicht, interne Aktivitaeten zu dokumentieren. Entscheidend ist, ob sich ein Zustand nachvollziehbar veraendert und ob diese Veraenderung im Referenzrahmen Mensch, Planet, Demokratie, SDGs, Agenda 2030 und SDG+ tragfaehig bewertet werden kann.</w:t>
+      </w:r>
+    </w:p>
+    <w:p>
+      <w:r>
+        <w:t>Ein Bericht behauptet, die Massnahme zu Von KPI zu KII und der Kennzahlen-Stack sei erfolgreich. Die WOE-Lesart fragt bei NWI, IOI und T-SROI im Impact-Controlling nach belastbaren Nachweisen: Datenquelle, Systemgrenze, Erhebungslogik, Unsicherheit, Aktualitaet und Auditspur. Wenn diese Nachweise fehlen, bleibt die Aussage Wirkungspotenzial oder Kommunikationsbehauptung. Sie kann wichtig sein, aber sie ist noch keine belegte Wirkung.</w:t>
+      </w:r>
+    </w:p>
+    <w:p>
+      <w:r>
+        <w:t>Fallpruefung. Wenn ein Controlling-Team einen Indikator, eine Scorecard oder einen Auditpfad auf Entscheidungsrelevanz pruefen will, beginnt die Analyse bei Empfaengern, Wirkraum, Zeitraum und Datenquelle. Bei NWI, IOI und T-SROI im Impact-Controlling muss dann geklaert werden, ob Datenqualitaet, Systemgrenze, Unsicherheit und Nichtkompensation fuer eine Steuerungsentscheidung ausreichen. Eine tragfaehige Antwort benennt mindestens eine Quelle, eine offene Unsicherheit, eine moegliche Gegenbeobachtung und die Entscheidung, die nach der Bewertung geaendert wird.</w:t>
+      </w:r>
+    </w:p>
+    <w:p>
+      <w:r>
+        <w:t>Der Rueckfluss in den WOE-Korpus liegt hier in klaren Begriffen, sauber verlinkten Quellen und benannten Forschungsfragen. Wo Glossar, Werkzeuge, Journal oder Reader noch doppeldeutig bleiben, sollte Von KPI zu KII und der Kennzahlen-Stack nicht als fertige Gewissheit auftreten, sondern als pruefbarer Lernstand mit Korrekturpfad.</w:t>
       </w:r>
     </w:p>
     <w:p>

</xml_diff>

<commit_message>
fix: sanitize publication text and metadata with verified original archives
</commit_message>
<xml_diff>
--- a/docs/studienskripte/word-rohfassungen/wirkungscontrolling-wc-v1.docx
+++ b/docs/studienskripte/word-rohfassungen/wirkungscontrolling-wc-v1.docx
@@ -16,20 +16,7 @@
     </w:p>
     <w:p>
       <w:r>
-        <w:rPr>
-          <w:i/>
-        </w:rPr>
-        <w:t>Rohfassung fuer Claude / CI-CD-Finalisierung</w:t>
-      </w:r>
-    </w:p>
-    <w:p>
-      <w:r>
-        <w:t>Quelle: /Users/hagen/Documents/New project/content/studienskripte/wirkungscontrolling-wc-v1.md</w:t>
-      </w:r>
-    </w:p>
-    <w:p>
-      <w:r>
-        <w:t>Track: Impact-Controlling Kurscode: wirkungscontrolling Vorlesungscode: WC-V1 Modul/Abschnitt: WC Titel: Von KPI zu KII und der Kennzahlen-Stack Status: Studienskript V1 · fachlich finale Codex-Fassung, Claude-CI/CD-Satzfreigabe offen Quelle: woek-akademie-app/docs/lehrgaenge/wirkungscontrolling-v1-kpi-zu-kii-kennzahlenstack.md Ablage: Markdown-Master in content/studienskripte/wirkungscontrolling-wc-v1.md, Word-Rohfassung in docs/studienskripte/word-rohfassungen/wirkungscontrolling-wc-v1.docx Wissensbasis: aktuelles Grundlagenwerk, Website-Korpus inklusive Journal, Akademie-Quelltexte, Glossar, interne Dossiers und externe Fachquellen</w:t>
+        <w:t>Track: Impact-Controlling Kurscode: wirkungscontrolling Vorlesungscode: WC-V1 Modul/Abschnitt: WC Titel: Von KPI zu KII und der Kennzahlen-Stack Status: Studienskript V1. Wissensbasis: aktuelles Grundlagenwerk, Website-Korpus inklusive Journal, Akademie-Quelltexte, Glossar, interne Dossiers und externe Fachquellen</w:t>
       </w:r>
     </w:p>
     <w:p>
@@ -99,11 +86,6 @@
       </w:r>
     </w:p>
     <w:p>
-      <w:r>
-        <w:t>Dieses Studienskript ist die fachlich finale Codex-V1-Fassung fuer den Akademie-Reader und die oeffentliche Bibliothek. Claude uebernimmt danach Satz, CI/CD, PDF/Reader-Freigabe und die abschliessende Lektoratsabnahme.</w:t>
-      </w:r>
-    </w:p>
-    <w:p>
       <w:pPr>
         <w:pStyle w:val="Heading2"/>
       </w:pPr>
@@ -149,7 +131,7 @@
     </w:p>
     <w:p>
       <w:r>
-        <w:t>Ein Dashboard voller grüner KPIs – und trotzdem weiß niemand, ob echte positive Netto-Wirkung entsteht. Warum reichen klassische Kennzahlen nicht, und welche Kennzahlen macht Wirkung wirklich steuerbar?</w:t>
+        <w:t>Ein Dashboard voller grüner KPIs - und trotzdem weiß niemand, ob echte positive Netto-Wirkung entsteht. Warum reichen klassische Kennzahlen nicht, und welche Kennzahlen macht Wirkung wirklich steuerbar?</w:t>
       </w:r>
     </w:p>
     <w:p>
@@ -165,7 +147,7 @@
         <w:pStyle w:val="ListBullet"/>
       </w:pPr>
       <w:r>
-        <w:t>Titel: Von KPI zu KII – die Kennzahlenordnung der Wirkungsökonomie</w:t>
+        <w:t>Titel: Von KPI zu KII - die Kennzahlenordnung der Wirkungsökonomie</w:t>
       </w:r>
     </w:p>
     <w:p>
@@ -202,27 +184,27 @@
     </w:p>
     <w:p>
       <w:r>
-        <w:t>Abschnitt A – Das KPI-Problem. Klassische KPIs messen Einsatz und Aktivität (Umsatz, Output, Reichweite). Sie sagen nicht, welche Veränderung von Zuständen entsteht. Reichweite ist nicht Wirkung.</w:t>
-      </w:r>
-    </w:p>
-    <w:p>
-      <w:r>
-        <w:t>Abschnitt B – KII: Key Impact Indicators. KIIs messen tatsächliche Wirkung bei Wirkungsempfängern, bezogen auf den Referenzrahmen – nicht Aktivität.</w:t>
-      </w:r>
-    </w:p>
-    <w:p>
-      <w:r>
-        <w:t>Abschnitt C – Vier Kennzahlen sauber trennen. Das T-SROI-Whitepaper trennt bewusst: Bewertung (Scorecard), Verdichtung (FinalScore), operative Netto-Wirkung (NWI) und Transformationswirkung (T-SROI). Dazu die einfache Steuerungskennzahl IoI.</w:t>
-      </w:r>
-    </w:p>
-    <w:p>
-      <w:r>
-        <w:t>Abschnitt D – Reihenfolge. Aus Daten → Scorecard → Netto-Wirkung/Wirkungsklasse → Steuerungsentscheidung. Kennzahlen ohne Datenqualität und ohne Reverse Merit Order sind wertlos.</w:t>
-      </w:r>
-    </w:p>
-    <w:p>
-      <w:r>
-        <w:t>Abschnitt E – Kein Scheingenauigkeit. Kennzahlen bilden Wirkung als überprüfbares Profil ab, nicht als vermeintlich exakte Einzelzahl.</w:t>
+        <w:t>Abschnitt A - Das KPI-Problem. Klassische KPIs messen Einsatz und Aktivität (Umsatz, Output, Reichweite). Sie sagen nicht, welche Veränderung von Zuständen entsteht. Reichweite ist nicht Wirkung.</w:t>
+      </w:r>
+    </w:p>
+    <w:p>
+      <w:r>
+        <w:t>Abschnitt B - KII: Key Impact Indicators. KIIs messen tatsächliche Wirkung bei Wirkungsempfängern, bezogen auf den Referenzrahmen - nicht Aktivität.</w:t>
+      </w:r>
+    </w:p>
+    <w:p>
+      <w:r>
+        <w:t>Abschnitt C - Vier Kennzahlen sauber trennen. Das T-SROI-Whitepaper trennt bewusst: Bewertung (Scorecard), Verdichtung (FinalScore), operative Netto-Wirkung (NWI) und Transformationswirkung (T-SROI). Dazu die einfache Steuerungskennzahl IoI.</w:t>
+      </w:r>
+    </w:p>
+    <w:p>
+      <w:r>
+        <w:t>Abschnitt D - Reihenfolge. Aus Daten → Scorecard → Netto-Wirkung/Wirkungsklasse → Steuerungsentscheidung. Kennzahlen ohne Datenqualität und ohne Reverse Merit Order sind wertlos.</w:t>
+      </w:r>
+    </w:p>
+    <w:p>
+      <w:r>
+        <w:t>Abschnitt E - Kein Scheingenauigkeit. Kennzahlen bilden Wirkung als überprüfbares Profil ab, nicht als vermeintlich exakte Einzelzahl.</w:t>
       </w:r>
     </w:p>
     <w:p>
@@ -235,7 +217,7 @@
     </w:p>
     <w:p>
       <w:r>
-        <w:t>KPI misst Aktivität, KII misst Wirkung. Ein KPI (Key Performance Indicator) beantwortet „Wie viel haben wir getan?" – Umsatz, Output, Reichweite. Ein KII (Key Impact Indicator) beantwortet „Welche tatsächliche Veränderung ist bei den Wirkungsempfängern entstanden?", bezogen auf SDGs/SDG+. Der Wechsel von KPI zu KII ist der Kern des Wirkungscontrollings.</w:t>
+        <w:t>KPI misst Aktivität, KII misst Wirkung. Ein KPI (Key Performance Indicator) beantwortet „Wie viel haben wir getan?" - Umsatz, Output, Reichweite. Ein KII (Key Impact Indicator) beantwortet „Welche tatsächliche Veränderung ist bei den Wirkungsempfängern entstanden?", bezogen auf SDGs/SDG+. Der Wechsel von KPI zu KII ist der Kern des Wirkungscontrollings.</w:t>
       </w:r>
     </w:p>
     <w:p>
@@ -478,12 +460,12 @@
     <w:p/>
     <w:p>
       <w:r>
-        <w:t>Die Reihenfolge ist verbindlich. Aus Daten entsteht zunächst eine Scorecard, daraus eine Netto-Wirkung und Wirkungsklasse – und erst daraus eine Steuerungsentscheidung. Voraussetzung für alles: Datenqualität, WÖk-IDs, Scorecards und die Reverse Merit Order, damit schlechte Werte nicht durch gute Teilwerte verdeckt werden.</w:t>
-      </w:r>
-    </w:p>
-    <w:p>
-      <w:r>
-        <w:t>Kein Kennzahlen-Fetisch. Auch der beste FinalScore/NWI bleibt der Nichtkompensation unterworfen und ersetzt kein Urteil. Wirkungscontrolling liefert ein Profil, das Entscheidungen begründet – keine Scheingenauigkeit. Die folgenden Vorlesungen füllen jede Stufe operativ: Rahmenwerke (V2), WÖk-IDs (V3), Scorecards (V4), Reverse Merit Order (V5), Monitoring (V6), T-SROI/IoI (V7).</w:t>
+        <w:t>Die Reihenfolge ist verbindlich. Aus Daten entsteht zunächst eine Scorecard, daraus eine Netto-Wirkung und Wirkungsklasse - und erst daraus eine Steuerungsentscheidung. Voraussetzung für alles: Datenqualität, WÖk-IDs, Scorecards und die Reverse Merit Order, damit schlechte Werte nicht durch gute Teilwerte verdeckt werden.</w:t>
+      </w:r>
+    </w:p>
+    <w:p>
+      <w:r>
+        <w:t>Kein Kennzahlen-Fetisch. Auch der beste FinalScore/NWI bleibt der Nichtkompensation unterworfen und ersetzt kein Urteil. Wirkungscontrolling liefert ein Profil, das Entscheidungen begründet - keine Scheingenauigkeit. Die folgenden Vorlesungen füllen jede Stufe operativ: Rahmenwerke (V2), WÖk-IDs (V3), Scorecards (V4), Reverse Merit Order (V5), Monitoring (V6), T-SROI/IoI (V7).</w:t>
       </w:r>
     </w:p>
     <w:p>
@@ -952,11 +934,6 @@
       </w:r>
     </w:p>
     <w:p>
-      <w:r>
-        <w:t>Dieses Studienskript ist die fachlich finale Codex-V1-Fassung fuer den Akademie-Reader und die oeffentliche Bibliothek. Claude uebernimmt danach Satz, CI/CD, PDF/Reader-Freigabe und die abschliessende Lektoratsabnahme.</w:t>
-      </w:r>
-    </w:p>
-    <w:p>
       <w:pPr>
         <w:pStyle w:val="Heading3"/>
       </w:pPr>
@@ -1664,11 +1641,6 @@
       </w:r>
     </w:p>
     <w:p>
-      <w:r>
-        <w:t>Diese Finalisierung schliesst die Codex-Inhaltsproduktion fuer WC-V1. Offen bleibt nicht der fachliche Kern des Skripts, sondern der naechste Produktionsschritt: Claude setzt daraus die CI/CD-konforme Reader- und PDF-Fassung, prueft Satz, Umbrueche, Medienintegration und Lektorat und markiert erst danach die veroeffentlichte Fassung als freigegeben.</w:t>
-      </w:r>
-    </w:p>
-    <w:p>
       <w:pPr>
         <w:pStyle w:val="Heading2"/>
       </w:pPr>
@@ -1681,7 +1653,7 @@
         <w:pStyle w:val="ListBullet"/>
       </w:pPr>
       <w:r>
-        <w:t>docs/whitepaper/T-SROI_v2.0_Transformationswirkung.md – Teil 2 „Vier Kennzahlen sauber trennen"</w:t>
+        <w:t>docs/whitepaper/T-SROI_v2.0_Transformationswirkung.md - Teil 2 „Vier Kennzahlen sauber trennen"</w:t>
       </w:r>
     </w:p>
     <w:p>
@@ -1689,7 +1661,7 @@
         <w:pStyle w:val="ListBullet"/>
       </w:pPr>
       <w:r>
-        <w:t>docs/grundlagen/Wirkungsoekonomie_Kurzfassung_v1.1.md – „Instrumente"</w:t>
+        <w:t>docs/grundlagen/Wirkungsoekonomie_Kurzfassung_v1.1.md - „Instrumente"</w:t>
       </w:r>
     </w:p>
     <w:p>
@@ -2564,11 +2536,6 @@
       </w:r>
     </w:p>
     <w:p>
-      <w:r>
-        <w:t>Status dieser Erweiterung: V1-finalisierte Codex-Erweiterung fuer Markdown-Master, Word-Rohfassung und Reader-Spiegel. Satz, Medienintegration, Lektorat und PDF-Freigabe bleiben der Claude-CI/CD-Lane vorbehalten.</w:t>
-      </w:r>
-    </w:p>
-    <w:p>
       <w:pPr>
         <w:pStyle w:val="Heading3"/>
       </w:pPr>
@@ -3986,7 +3953,7 @@
     </w:p>
     <w:p>
       <w:r>
-        <w:t>Weber, Natalie / Wirkungsökonomie (2026): Wirkungscontrolling – Detailkonzept-Dossier. Planung, Messung, Bewertung, Steuerung und Rückkopplung von Wirkung für Mensch, Planet und Demokratie. Version 1.0, 01. Juni 2026.</w:t>
+        <w:t>Weber, Natalie / Wirkungsökonomie (2026): Wirkungscontrolling - Detailkonzept-Dossier. Planung, Messung, Bewertung, Steuerung und Rückkopplung von Wirkung für Mensch, Planet und Demokratie. Version 1.0, 01. Juni 2026.</w:t>
       </w:r>
     </w:p>
     <w:p>
@@ -4556,7 +4523,7 @@
         <w:pStyle w:val="ListBullet"/>
       </w:pPr>
       <w:r>
-        <w:t>woek-akademie-app/docs/lehrgaenge/wirkungscontrolling-v1-kpi-zu-kii-kennzahlenstack.md — unmittelbarer Akademie-Quelltext dieser V1-Fassung.</w:t>
+        <w:t>woek-akademie-app/docs/lehrgaenge/wirkungscontrolling-v1-kpi-zu-kii-kennzahlenstack.md - unmittelbarer Akademie-Quelltext dieser V1-Fassung.</w:t>
       </w:r>
     </w:p>
     <w:p>
@@ -4564,7 +4531,7 @@
         <w:pStyle w:val="ListBullet"/>
       </w:pPr>
       <w:r>
-        <w:t>assets/pdf/die-neue-ordnung-des-wohlstands.pdf und buch.html — aktuelles Grundlagenwerk.</w:t>
+        <w:t>assets/pdf/die-neue-ordnung-des-wohlstands.pdf und buch.html - aktuelles Grundlagenwerk.</w:t>
       </w:r>
     </w:p>
     <w:p>
@@ -4573,22 +4540,6 @@
       </w:pPr>
       <w:r>
         <w:t>Website-Korpus: Referenz, Wirkungsfelder, Werkzeuge, Glossar, Bibliothek und Journal.</w:t>
-      </w:r>
-    </w:p>
-    <w:p>
-      <w:pPr>
-        <w:pStyle w:val="ListBullet"/>
-      </w:pPr>
-      <w:r>
-        <w:t>docs/CODEX-HANDOFF-studienskripte.md — Produktionsstandard.</w:t>
-      </w:r>
-    </w:p>
-    <w:p>
-      <w:pPr>
-        <w:pStyle w:val="ListBullet"/>
-      </w:pPr>
-      <w:r>
-        <w:t>docs/CODEX-HANDOFF-pruefungen.md — geschützte Prüfungs- und Antwortlogik.</w:t>
       </w:r>
     </w:p>
     <w:p>

</xml_diff>

<commit_message>
chore: Oracle Wirkungsticker wake-up 2026-09-06T14:50:09Z
</commit_message>
<xml_diff>
--- a/docs/studienskripte/word-rohfassungen/wirkungscontrolling-wc-v1.docx
+++ b/docs/studienskripte/word-rohfassungen/wirkungscontrolling-wc-v1.docx
@@ -16,20 +16,7 @@
     </w:p>
     <w:p>
       <w:r>
-        <w:rPr>
-          <w:i/>
-        </w:rPr>
-        <w:t>Rohfassung fuer Claude / CI-CD-Finalisierung</w:t>
-      </w:r>
-    </w:p>
-    <w:p>
-      <w:r>
-        <w:t>Quelle: /Users/hagen/Documents/New project/content/studienskripte/wirkungscontrolling-wc-v1.md</w:t>
-      </w:r>
-    </w:p>
-    <w:p>
-      <w:r>
-        <w:t>Track: Impact-Controlling Kurscode: wirkungscontrolling Vorlesungscode: WC-V1 Modul/Abschnitt: WC Titel: Von KPI zu KII und der Kennzahlen-Stack Status: Studienskript V1 · fachlich finale Codex-Fassung, Claude-CI/CD-Satzfreigabe offen Quelle: woek-akademie-app/docs/lehrgaenge/wirkungscontrolling-v1-kpi-zu-kii-kennzahlenstack.md Ablage: Markdown-Master in content/studienskripte/wirkungscontrolling-wc-v1.md, Word-Rohfassung in docs/studienskripte/word-rohfassungen/wirkungscontrolling-wc-v1.docx Wissensbasis: aktuelles Grundlagenwerk, Website-Korpus inklusive Journal, Akademie-Quelltexte, Glossar, interne Dossiers und externe Fachquellen</w:t>
+        <w:t>Track: Impact-Controlling Kurscode: wirkungscontrolling Vorlesungscode: WC-V1 Modul/Abschnitt: WC Titel: Von KPI zu KII und der Kennzahlen-Stack Status: Studienskript V1. Wissensbasis: aktuelles Grundlagenwerk, Website-Korpus inklusive Journal, Akademie-Quelltexte, Glossar, interne Dossiers und externe Fachquellen</w:t>
       </w:r>
     </w:p>
     <w:p>
@@ -99,11 +86,6 @@
       </w:r>
     </w:p>
     <w:p>
-      <w:r>
-        <w:t>Dieses Studienskript ist die fachlich finale Codex-V1-Fassung fuer den Akademie-Reader und die oeffentliche Bibliothek. Claude uebernimmt danach Satz, CI/CD, PDF/Reader-Freigabe und die abschliessende Lektoratsabnahme.</w:t>
-      </w:r>
-    </w:p>
-    <w:p>
       <w:pPr>
         <w:pStyle w:val="Heading2"/>
       </w:pPr>
@@ -149,7 +131,7 @@
     </w:p>
     <w:p>
       <w:r>
-        <w:t>Ein Dashboard voller grüner KPIs – und trotzdem weiß niemand, ob echte positive Netto-Wirkung entsteht. Warum reichen klassische Kennzahlen nicht, und welche Kennzahlen macht Wirkung wirklich steuerbar?</w:t>
+        <w:t>Ein Dashboard voller grüner KPIs - und trotzdem weiß niemand, ob echte positive Netto-Wirkung entsteht. Warum reichen klassische Kennzahlen nicht, und welche Kennzahlen macht Wirkung wirklich steuerbar?</w:t>
       </w:r>
     </w:p>
     <w:p>
@@ -165,7 +147,7 @@
         <w:pStyle w:val="ListBullet"/>
       </w:pPr>
       <w:r>
-        <w:t>Titel: Von KPI zu KII – die Kennzahlenordnung der Wirkungsökonomie</w:t>
+        <w:t>Titel: Von KPI zu KII - die Kennzahlenordnung der Wirkungsökonomie</w:t>
       </w:r>
     </w:p>
     <w:p>
@@ -202,27 +184,27 @@
     </w:p>
     <w:p>
       <w:r>
-        <w:t>Abschnitt A – Das KPI-Problem. Klassische KPIs messen Einsatz und Aktivität (Umsatz, Output, Reichweite). Sie sagen nicht, welche Veränderung von Zuständen entsteht. Reichweite ist nicht Wirkung.</w:t>
-      </w:r>
-    </w:p>
-    <w:p>
-      <w:r>
-        <w:t>Abschnitt B – KII: Key Impact Indicators. KIIs messen tatsächliche Wirkung bei Wirkungsempfängern, bezogen auf den Referenzrahmen – nicht Aktivität.</w:t>
-      </w:r>
-    </w:p>
-    <w:p>
-      <w:r>
-        <w:t>Abschnitt C – Vier Kennzahlen sauber trennen. Das T-SROI-Whitepaper trennt bewusst: Bewertung (Scorecard), Verdichtung (FinalScore), operative Netto-Wirkung (NWI) und Transformationswirkung (T-SROI). Dazu die einfache Steuerungskennzahl IoI.</w:t>
-      </w:r>
-    </w:p>
-    <w:p>
-      <w:r>
-        <w:t>Abschnitt D – Reihenfolge. Aus Daten → Scorecard → Netto-Wirkung/Wirkungsklasse → Steuerungsentscheidung. Kennzahlen ohne Datenqualität und ohne Reverse Merit Order sind wertlos.</w:t>
-      </w:r>
-    </w:p>
-    <w:p>
-      <w:r>
-        <w:t>Abschnitt E – Kein Scheingenauigkeit. Kennzahlen bilden Wirkung als überprüfbares Profil ab, nicht als vermeintlich exakte Einzelzahl.</w:t>
+        <w:t>Abschnitt A - Das KPI-Problem. Klassische KPIs messen Einsatz und Aktivität (Umsatz, Output, Reichweite). Sie sagen nicht, welche Veränderung von Zuständen entsteht. Reichweite ist nicht Wirkung.</w:t>
+      </w:r>
+    </w:p>
+    <w:p>
+      <w:r>
+        <w:t>Abschnitt B - KII: Key Impact Indicators. KIIs messen tatsächliche Wirkung bei Wirkungsempfängern, bezogen auf den Referenzrahmen - nicht Aktivität.</w:t>
+      </w:r>
+    </w:p>
+    <w:p>
+      <w:r>
+        <w:t>Abschnitt C - Vier Kennzahlen sauber trennen. Das T-SROI-Whitepaper trennt bewusst: Bewertung (Scorecard), Verdichtung (FinalScore), operative Netto-Wirkung (NWI) und Transformationswirkung (T-SROI). Dazu die einfache Steuerungskennzahl IoI.</w:t>
+      </w:r>
+    </w:p>
+    <w:p>
+      <w:r>
+        <w:t>Abschnitt D - Reihenfolge. Aus Daten → Scorecard → Netto-Wirkung/Wirkungsklasse → Steuerungsentscheidung. Kennzahlen ohne Datenqualität und ohne Reverse Merit Order sind wertlos.</w:t>
+      </w:r>
+    </w:p>
+    <w:p>
+      <w:r>
+        <w:t>Abschnitt E - Kein Scheingenauigkeit. Kennzahlen bilden Wirkung als überprüfbares Profil ab, nicht als vermeintlich exakte Einzelzahl.</w:t>
       </w:r>
     </w:p>
     <w:p>
@@ -235,7 +217,7 @@
     </w:p>
     <w:p>
       <w:r>
-        <w:t>KPI misst Aktivität, KII misst Wirkung. Ein KPI (Key Performance Indicator) beantwortet „Wie viel haben wir getan?" – Umsatz, Output, Reichweite. Ein KII (Key Impact Indicator) beantwortet „Welche tatsächliche Veränderung ist bei den Wirkungsempfängern entstanden?", bezogen auf SDGs/SDG+. Der Wechsel von KPI zu KII ist der Kern des Wirkungscontrollings.</w:t>
+        <w:t>KPI misst Aktivität, KII misst Wirkung. Ein KPI (Key Performance Indicator) beantwortet „Wie viel haben wir getan?" - Umsatz, Output, Reichweite. Ein KII (Key Impact Indicator) beantwortet „Welche tatsächliche Veränderung ist bei den Wirkungsempfängern entstanden?", bezogen auf SDGs/SDG+. Der Wechsel von KPI zu KII ist der Kern des Wirkungscontrollings.</w:t>
       </w:r>
     </w:p>
     <w:p>
@@ -478,12 +460,12 @@
     <w:p/>
     <w:p>
       <w:r>
-        <w:t>Die Reihenfolge ist verbindlich. Aus Daten entsteht zunächst eine Scorecard, daraus eine Netto-Wirkung und Wirkungsklasse – und erst daraus eine Steuerungsentscheidung. Voraussetzung für alles: Datenqualität, WÖk-IDs, Scorecards und die Reverse Merit Order, damit schlechte Werte nicht durch gute Teilwerte verdeckt werden.</w:t>
-      </w:r>
-    </w:p>
-    <w:p>
-      <w:r>
-        <w:t>Kein Kennzahlen-Fetisch. Auch der beste FinalScore/NWI bleibt der Nichtkompensation unterworfen und ersetzt kein Urteil. Wirkungscontrolling liefert ein Profil, das Entscheidungen begründet – keine Scheingenauigkeit. Die folgenden Vorlesungen füllen jede Stufe operativ: Rahmenwerke (V2), WÖk-IDs (V3), Scorecards (V4), Reverse Merit Order (V5), Monitoring (V6), T-SROI/IoI (V7).</w:t>
+        <w:t>Die Reihenfolge ist verbindlich. Aus Daten entsteht zunächst eine Scorecard, daraus eine Netto-Wirkung und Wirkungsklasse - und erst daraus eine Steuerungsentscheidung. Voraussetzung für alles: Datenqualität, WÖk-IDs, Scorecards und die Reverse Merit Order, damit schlechte Werte nicht durch gute Teilwerte verdeckt werden.</w:t>
+      </w:r>
+    </w:p>
+    <w:p>
+      <w:r>
+        <w:t>Kein Kennzahlen-Fetisch. Auch der beste FinalScore/NWI bleibt der Nichtkompensation unterworfen und ersetzt kein Urteil. Wirkungscontrolling liefert ein Profil, das Entscheidungen begründet - keine Scheingenauigkeit. Die folgenden Vorlesungen füllen jede Stufe operativ: Rahmenwerke (V2), WÖk-IDs (V3), Scorecards (V4), Reverse Merit Order (V5), Monitoring (V6), T-SROI/IoI (V7).</w:t>
       </w:r>
     </w:p>
     <w:p>
@@ -952,11 +934,6 @@
       </w:r>
     </w:p>
     <w:p>
-      <w:r>
-        <w:t>Dieses Studienskript ist die fachlich finale Codex-V1-Fassung fuer den Akademie-Reader und die oeffentliche Bibliothek. Claude uebernimmt danach Satz, CI/CD, PDF/Reader-Freigabe und die abschliessende Lektoratsabnahme.</w:t>
-      </w:r>
-    </w:p>
-    <w:p>
       <w:pPr>
         <w:pStyle w:val="Heading3"/>
       </w:pPr>
@@ -1664,11 +1641,6 @@
       </w:r>
     </w:p>
     <w:p>
-      <w:r>
-        <w:t>Diese Finalisierung schliesst die Codex-Inhaltsproduktion fuer WC-V1. Offen bleibt nicht der fachliche Kern des Skripts, sondern der naechste Produktionsschritt: Claude setzt daraus die CI/CD-konforme Reader- und PDF-Fassung, prueft Satz, Umbrueche, Medienintegration und Lektorat und markiert erst danach die veroeffentlichte Fassung als freigegeben.</w:t>
-      </w:r>
-    </w:p>
-    <w:p>
       <w:pPr>
         <w:pStyle w:val="Heading2"/>
       </w:pPr>
@@ -1681,7 +1653,7 @@
         <w:pStyle w:val="ListBullet"/>
       </w:pPr>
       <w:r>
-        <w:t>docs/whitepaper/T-SROI_v2.0_Transformationswirkung.md – Teil 2 „Vier Kennzahlen sauber trennen"</w:t>
+        <w:t>docs/whitepaper/T-SROI_v2.0_Transformationswirkung.md - Teil 2 „Vier Kennzahlen sauber trennen"</w:t>
       </w:r>
     </w:p>
     <w:p>
@@ -1689,7 +1661,7 @@
         <w:pStyle w:val="ListBullet"/>
       </w:pPr>
       <w:r>
-        <w:t>docs/grundlagen/Wirkungsoekonomie_Kurzfassung_v1.1.md – „Instrumente"</w:t>
+        <w:t>docs/grundlagen/Wirkungsoekonomie_Kurzfassung_v1.1.md - „Instrumente"</w:t>
       </w:r>
     </w:p>
     <w:p>
@@ -2564,11 +2536,6 @@
       </w:r>
     </w:p>
     <w:p>
-      <w:r>
-        <w:t>Status dieser Erweiterung: V1-finalisierte Codex-Erweiterung fuer Markdown-Master, Word-Rohfassung und Reader-Spiegel. Satz, Medienintegration, Lektorat und PDF-Freigabe bleiben der Claude-CI/CD-Lane vorbehalten.</w:t>
-      </w:r>
-    </w:p>
-    <w:p>
       <w:pPr>
         <w:pStyle w:val="Heading3"/>
       </w:pPr>
@@ -3986,7 +3953,7 @@
     </w:p>
     <w:p>
       <w:r>
-        <w:t>Weber, Natalie / Wirkungsökonomie (2026): Wirkungscontrolling – Detailkonzept-Dossier. Planung, Messung, Bewertung, Steuerung und Rückkopplung von Wirkung für Mensch, Planet und Demokratie. Version 1.0, 01. Juni 2026.</w:t>
+        <w:t>Weber, Natalie / Wirkungsökonomie (2026): Wirkungscontrolling - Detailkonzept-Dossier. Planung, Messung, Bewertung, Steuerung und Rückkopplung von Wirkung für Mensch, Planet und Demokratie. Version 1.0, 01. Juni 2026.</w:t>
       </w:r>
     </w:p>
     <w:p>
@@ -4556,7 +4523,7 @@
         <w:pStyle w:val="ListBullet"/>
       </w:pPr>
       <w:r>
-        <w:t>woek-akademie-app/docs/lehrgaenge/wirkungscontrolling-v1-kpi-zu-kii-kennzahlenstack.md — unmittelbarer Akademie-Quelltext dieser V1-Fassung.</w:t>
+        <w:t>woek-akademie-app/docs/lehrgaenge/wirkungscontrolling-v1-kpi-zu-kii-kennzahlenstack.md - unmittelbarer Akademie-Quelltext dieser V1-Fassung.</w:t>
       </w:r>
     </w:p>
     <w:p>
@@ -4564,7 +4531,7 @@
         <w:pStyle w:val="ListBullet"/>
       </w:pPr>
       <w:r>
-        <w:t>assets/pdf/die-neue-ordnung-des-wohlstands.pdf und buch.html — aktuelles Grundlagenwerk.</w:t>
+        <w:t>assets/pdf/die-neue-ordnung-des-wohlstands.pdf und buch.html - aktuelles Grundlagenwerk.</w:t>
       </w:r>
     </w:p>
     <w:p>
@@ -4573,22 +4540,6 @@
       </w:pPr>
       <w:r>
         <w:t>Website-Korpus: Referenz, Wirkungsfelder, Werkzeuge, Glossar, Bibliothek und Journal.</w:t>
-      </w:r>
-    </w:p>
-    <w:p>
-      <w:pPr>
-        <w:pStyle w:val="ListBullet"/>
-      </w:pPr>
-      <w:r>
-        <w:t>docs/CODEX-HANDOFF-studienskripte.md — Produktionsstandard.</w:t>
-      </w:r>
-    </w:p>
-    <w:p>
-      <w:pPr>
-        <w:pStyle w:val="ListBullet"/>
-      </w:pPr>
-      <w:r>
-        <w:t>docs/CODEX-HANDOFF-pruefungen.md — geschützte Prüfungs- und Antwortlogik.</w:t>
       </w:r>
     </w:p>
     <w:p>

</xml_diff>

<commit_message>
chore: Oracle Wirkungsticker wake-up 2026-09-06T18:05:27Z
</commit_message>
<xml_diff>
--- a/docs/studienskripte/word-rohfassungen/wirkungscontrolling-wc-v1.docx
+++ b/docs/studienskripte/word-rohfassungen/wirkungscontrolling-wc-v1.docx
@@ -16,20 +16,7 @@
     </w:p>
     <w:p>
       <w:r>
-        <w:rPr>
-          <w:i/>
-        </w:rPr>
-        <w:t>Rohfassung fuer Claude / CI-CD-Finalisierung</w:t>
-      </w:r>
-    </w:p>
-    <w:p>
-      <w:r>
-        <w:t>Quelle: /Users/hagen/Documents/New project/content/studienskripte/wirkungscontrolling-wc-v1.md</w:t>
-      </w:r>
-    </w:p>
-    <w:p>
-      <w:r>
-        <w:t>Track: Impact-Controlling Kurscode: wirkungscontrolling Vorlesungscode: WC-V1 Modul/Abschnitt: WC Titel: Von KPI zu KII und der Kennzahlen-Stack Status: Studienskript V1 · fachlich finale Codex-Fassung, Claude-CI/CD-Satzfreigabe offen Quelle: woek-akademie-app/docs/lehrgaenge/wirkungscontrolling-v1-kpi-zu-kii-kennzahlenstack.md Ablage: Markdown-Master in content/studienskripte/wirkungscontrolling-wc-v1.md, Word-Rohfassung in docs/studienskripte/word-rohfassungen/wirkungscontrolling-wc-v1.docx Wissensbasis: aktuelles Grundlagenwerk, Website-Korpus inklusive Journal, Akademie-Quelltexte, Glossar, interne Dossiers und externe Fachquellen</w:t>
+        <w:t>Track: Impact-Controlling Kurscode: wirkungscontrolling Vorlesungscode: WC-V1 Modul/Abschnitt: WC Titel: Von KPI zu KII und der Kennzahlen-Stack Status: Studienskript V1. Wissensbasis: aktuelles Grundlagenwerk, Website-Korpus inklusive Journal, Akademie-Quelltexte, Glossar, interne Dossiers und externe Fachquellen</w:t>
       </w:r>
     </w:p>
     <w:p>
@@ -99,11 +86,6 @@
       </w:r>
     </w:p>
     <w:p>
-      <w:r>
-        <w:t>Dieses Studienskript ist die fachlich finale Codex-V1-Fassung fuer den Akademie-Reader und die oeffentliche Bibliothek. Claude uebernimmt danach Satz, CI/CD, PDF/Reader-Freigabe und die abschliessende Lektoratsabnahme.</w:t>
-      </w:r>
-    </w:p>
-    <w:p>
       <w:pPr>
         <w:pStyle w:val="Heading2"/>
       </w:pPr>
@@ -149,7 +131,7 @@
     </w:p>
     <w:p>
       <w:r>
-        <w:t>Ein Dashboard voller grüner KPIs – und trotzdem weiß niemand, ob echte positive Netto-Wirkung entsteht. Warum reichen klassische Kennzahlen nicht, und welche Kennzahlen macht Wirkung wirklich steuerbar?</w:t>
+        <w:t>Ein Dashboard voller grüner KPIs - und trotzdem weiß niemand, ob echte positive Netto-Wirkung entsteht. Warum reichen klassische Kennzahlen nicht, und welche Kennzahlen macht Wirkung wirklich steuerbar?</w:t>
       </w:r>
     </w:p>
     <w:p>
@@ -165,7 +147,7 @@
         <w:pStyle w:val="ListBullet"/>
       </w:pPr>
       <w:r>
-        <w:t>Titel: Von KPI zu KII – die Kennzahlenordnung der Wirkungsökonomie</w:t>
+        <w:t>Titel: Von KPI zu KII - die Kennzahlenordnung der Wirkungsökonomie</w:t>
       </w:r>
     </w:p>
     <w:p>
@@ -202,27 +184,27 @@
     </w:p>
     <w:p>
       <w:r>
-        <w:t>Abschnitt A – Das KPI-Problem. Klassische KPIs messen Einsatz und Aktivität (Umsatz, Output, Reichweite). Sie sagen nicht, welche Veränderung von Zuständen entsteht. Reichweite ist nicht Wirkung.</w:t>
-      </w:r>
-    </w:p>
-    <w:p>
-      <w:r>
-        <w:t>Abschnitt B – KII: Key Impact Indicators. KIIs messen tatsächliche Wirkung bei Wirkungsempfängern, bezogen auf den Referenzrahmen – nicht Aktivität.</w:t>
-      </w:r>
-    </w:p>
-    <w:p>
-      <w:r>
-        <w:t>Abschnitt C – Vier Kennzahlen sauber trennen. Das T-SROI-Whitepaper trennt bewusst: Bewertung (Scorecard), Verdichtung (FinalScore), operative Netto-Wirkung (NWI) und Transformationswirkung (T-SROI). Dazu die einfache Steuerungskennzahl IoI.</w:t>
-      </w:r>
-    </w:p>
-    <w:p>
-      <w:r>
-        <w:t>Abschnitt D – Reihenfolge. Aus Daten → Scorecard → Netto-Wirkung/Wirkungsklasse → Steuerungsentscheidung. Kennzahlen ohne Datenqualität und ohne Reverse Merit Order sind wertlos.</w:t>
-      </w:r>
-    </w:p>
-    <w:p>
-      <w:r>
-        <w:t>Abschnitt E – Kein Scheingenauigkeit. Kennzahlen bilden Wirkung als überprüfbares Profil ab, nicht als vermeintlich exakte Einzelzahl.</w:t>
+        <w:t>Abschnitt A - Das KPI-Problem. Klassische KPIs messen Einsatz und Aktivität (Umsatz, Output, Reichweite). Sie sagen nicht, welche Veränderung von Zuständen entsteht. Reichweite ist nicht Wirkung.</w:t>
+      </w:r>
+    </w:p>
+    <w:p>
+      <w:r>
+        <w:t>Abschnitt B - KII: Key Impact Indicators. KIIs messen tatsächliche Wirkung bei Wirkungsempfängern, bezogen auf den Referenzrahmen - nicht Aktivität.</w:t>
+      </w:r>
+    </w:p>
+    <w:p>
+      <w:r>
+        <w:t>Abschnitt C - Vier Kennzahlen sauber trennen. Das T-SROI-Whitepaper trennt bewusst: Bewertung (Scorecard), Verdichtung (FinalScore), operative Netto-Wirkung (NWI) und Transformationswirkung (T-SROI). Dazu die einfache Steuerungskennzahl IoI.</w:t>
+      </w:r>
+    </w:p>
+    <w:p>
+      <w:r>
+        <w:t>Abschnitt D - Reihenfolge. Aus Daten → Scorecard → Netto-Wirkung/Wirkungsklasse → Steuerungsentscheidung. Kennzahlen ohne Datenqualität und ohne Reverse Merit Order sind wertlos.</w:t>
+      </w:r>
+    </w:p>
+    <w:p>
+      <w:r>
+        <w:t>Abschnitt E - Kein Scheingenauigkeit. Kennzahlen bilden Wirkung als überprüfbares Profil ab, nicht als vermeintlich exakte Einzelzahl.</w:t>
       </w:r>
     </w:p>
     <w:p>
@@ -235,7 +217,7 @@
     </w:p>
     <w:p>
       <w:r>
-        <w:t>KPI misst Aktivität, KII misst Wirkung. Ein KPI (Key Performance Indicator) beantwortet „Wie viel haben wir getan?" – Umsatz, Output, Reichweite. Ein KII (Key Impact Indicator) beantwortet „Welche tatsächliche Veränderung ist bei den Wirkungsempfängern entstanden?", bezogen auf SDGs/SDG+. Der Wechsel von KPI zu KII ist der Kern des Wirkungscontrollings.</w:t>
+        <w:t>KPI misst Aktivität, KII misst Wirkung. Ein KPI (Key Performance Indicator) beantwortet „Wie viel haben wir getan?" - Umsatz, Output, Reichweite. Ein KII (Key Impact Indicator) beantwortet „Welche tatsächliche Veränderung ist bei den Wirkungsempfängern entstanden?", bezogen auf SDGs/SDG+. Der Wechsel von KPI zu KII ist der Kern des Wirkungscontrollings.</w:t>
       </w:r>
     </w:p>
     <w:p>
@@ -478,12 +460,12 @@
     <w:p/>
     <w:p>
       <w:r>
-        <w:t>Die Reihenfolge ist verbindlich. Aus Daten entsteht zunächst eine Scorecard, daraus eine Netto-Wirkung und Wirkungsklasse – und erst daraus eine Steuerungsentscheidung. Voraussetzung für alles: Datenqualität, WÖk-IDs, Scorecards und die Reverse Merit Order, damit schlechte Werte nicht durch gute Teilwerte verdeckt werden.</w:t>
-      </w:r>
-    </w:p>
-    <w:p>
-      <w:r>
-        <w:t>Kein Kennzahlen-Fetisch. Auch der beste FinalScore/NWI bleibt der Nichtkompensation unterworfen und ersetzt kein Urteil. Wirkungscontrolling liefert ein Profil, das Entscheidungen begründet – keine Scheingenauigkeit. Die folgenden Vorlesungen füllen jede Stufe operativ: Rahmenwerke (V2), WÖk-IDs (V3), Scorecards (V4), Reverse Merit Order (V5), Monitoring (V6), T-SROI/IoI (V7).</w:t>
+        <w:t>Die Reihenfolge ist verbindlich. Aus Daten entsteht zunächst eine Scorecard, daraus eine Netto-Wirkung und Wirkungsklasse - und erst daraus eine Steuerungsentscheidung. Voraussetzung für alles: Datenqualität, WÖk-IDs, Scorecards und die Reverse Merit Order, damit schlechte Werte nicht durch gute Teilwerte verdeckt werden.</w:t>
+      </w:r>
+    </w:p>
+    <w:p>
+      <w:r>
+        <w:t>Kein Kennzahlen-Fetisch. Auch der beste FinalScore/NWI bleibt der Nichtkompensation unterworfen und ersetzt kein Urteil. Wirkungscontrolling liefert ein Profil, das Entscheidungen begründet - keine Scheingenauigkeit. Die folgenden Vorlesungen füllen jede Stufe operativ: Rahmenwerke (V2), WÖk-IDs (V3), Scorecards (V4), Reverse Merit Order (V5), Monitoring (V6), T-SROI/IoI (V7).</w:t>
       </w:r>
     </w:p>
     <w:p>
@@ -952,11 +934,6 @@
       </w:r>
     </w:p>
     <w:p>
-      <w:r>
-        <w:t>Dieses Studienskript ist die fachlich finale Codex-V1-Fassung fuer den Akademie-Reader und die oeffentliche Bibliothek. Claude uebernimmt danach Satz, CI/CD, PDF/Reader-Freigabe und die abschliessende Lektoratsabnahme.</w:t>
-      </w:r>
-    </w:p>
-    <w:p>
       <w:pPr>
         <w:pStyle w:val="Heading3"/>
       </w:pPr>
@@ -1664,11 +1641,6 @@
       </w:r>
     </w:p>
     <w:p>
-      <w:r>
-        <w:t>Diese Finalisierung schliesst die Codex-Inhaltsproduktion fuer WC-V1. Offen bleibt nicht der fachliche Kern des Skripts, sondern der naechste Produktionsschritt: Claude setzt daraus die CI/CD-konforme Reader- und PDF-Fassung, prueft Satz, Umbrueche, Medienintegration und Lektorat und markiert erst danach die veroeffentlichte Fassung als freigegeben.</w:t>
-      </w:r>
-    </w:p>
-    <w:p>
       <w:pPr>
         <w:pStyle w:val="Heading2"/>
       </w:pPr>
@@ -1681,7 +1653,7 @@
         <w:pStyle w:val="ListBullet"/>
       </w:pPr>
       <w:r>
-        <w:t>docs/whitepaper/T-SROI_v2.0_Transformationswirkung.md – Teil 2 „Vier Kennzahlen sauber trennen"</w:t>
+        <w:t>docs/whitepaper/T-SROI_v2.0_Transformationswirkung.md - Teil 2 „Vier Kennzahlen sauber trennen"</w:t>
       </w:r>
     </w:p>
     <w:p>
@@ -1689,7 +1661,7 @@
         <w:pStyle w:val="ListBullet"/>
       </w:pPr>
       <w:r>
-        <w:t>docs/grundlagen/Wirkungsoekonomie_Kurzfassung_v1.1.md – „Instrumente"</w:t>
+        <w:t>docs/grundlagen/Wirkungsoekonomie_Kurzfassung_v1.1.md - „Instrumente"</w:t>
       </w:r>
     </w:p>
     <w:p>
@@ -2564,11 +2536,6 @@
       </w:r>
     </w:p>
     <w:p>
-      <w:r>
-        <w:t>Status dieser Erweiterung: V1-finalisierte Codex-Erweiterung fuer Markdown-Master, Word-Rohfassung und Reader-Spiegel. Satz, Medienintegration, Lektorat und PDF-Freigabe bleiben der Claude-CI/CD-Lane vorbehalten.</w:t>
-      </w:r>
-    </w:p>
-    <w:p>
       <w:pPr>
         <w:pStyle w:val="Heading3"/>
       </w:pPr>
@@ -3986,7 +3953,7 @@
     </w:p>
     <w:p>
       <w:r>
-        <w:t>Weber, Natalie / Wirkungsökonomie (2026): Wirkungscontrolling – Detailkonzept-Dossier. Planung, Messung, Bewertung, Steuerung und Rückkopplung von Wirkung für Mensch, Planet und Demokratie. Version 1.0, 01. Juni 2026.</w:t>
+        <w:t>Weber, Natalie / Wirkungsökonomie (2026): Wirkungscontrolling - Detailkonzept-Dossier. Planung, Messung, Bewertung, Steuerung und Rückkopplung von Wirkung für Mensch, Planet und Demokratie. Version 1.0, 01. Juni 2026.</w:t>
       </w:r>
     </w:p>
     <w:p>
@@ -4556,7 +4523,7 @@
         <w:pStyle w:val="ListBullet"/>
       </w:pPr>
       <w:r>
-        <w:t>woek-akademie-app/docs/lehrgaenge/wirkungscontrolling-v1-kpi-zu-kii-kennzahlenstack.md — unmittelbarer Akademie-Quelltext dieser V1-Fassung.</w:t>
+        <w:t>woek-akademie-app/docs/lehrgaenge/wirkungscontrolling-v1-kpi-zu-kii-kennzahlenstack.md - unmittelbarer Akademie-Quelltext dieser V1-Fassung.</w:t>
       </w:r>
     </w:p>
     <w:p>
@@ -4564,7 +4531,7 @@
         <w:pStyle w:val="ListBullet"/>
       </w:pPr>
       <w:r>
-        <w:t>assets/pdf/die-neue-ordnung-des-wohlstands.pdf und buch.html — aktuelles Grundlagenwerk.</w:t>
+        <w:t>assets/pdf/die-neue-ordnung-des-wohlstands.pdf und buch.html - aktuelles Grundlagenwerk.</w:t>
       </w:r>
     </w:p>
     <w:p>
@@ -4573,22 +4540,6 @@
       </w:pPr>
       <w:r>
         <w:t>Website-Korpus: Referenz, Wirkungsfelder, Werkzeuge, Glossar, Bibliothek und Journal.</w:t>
-      </w:r>
-    </w:p>
-    <w:p>
-      <w:pPr>
-        <w:pStyle w:val="ListBullet"/>
-      </w:pPr>
-      <w:r>
-        <w:t>docs/CODEX-HANDOFF-studienskripte.md — Produktionsstandard.</w:t>
-      </w:r>
-    </w:p>
-    <w:p>
-      <w:pPr>
-        <w:pStyle w:val="ListBullet"/>
-      </w:pPr>
-      <w:r>
-        <w:t>docs/CODEX-HANDOFF-pruefungen.md — geschützte Prüfungs- und Antwortlogik.</w:t>
       </w:r>
     </w:p>
     <w:p>

</xml_diff>